<commit_message>
Add first tool: rocprof-sys CPU hotspots launcher + extractor
Wraps rocprof-sys-sample with sane first-run defaults and extracts a short
CPU-side hotspots.txt (with GPU-API/launch-overhead split out) from its
timemory text output, since that output only ever contains host-side timing.
</commit_message>
<xml_diff>
--- a/docs/DEVELOPMENT_HISTORY.docx
+++ b/docs/DEVELOPMENT_HISTORY.docx
@@ -10,7 +10,7 @@
         <w:t xml:space="preserve">Development History</w:t>
       </w:r>
     </w:p>
-    <w:bookmarkStart w:id="21" w:name="development-history"/>
+    <w:bookmarkStart w:id="23" w:name="development-history"/>
     <w:p>
       <w:pPr>
         <w:pStyle w:val="Heading1"/>
@@ -100,6 +100,32 @@
           </w:p>
         </w:tc>
       </w:tr>
+      <w:tr>
+        <w:tc>
+          <w:tcPr/>
+          <w:p>
+            <w:pPr>
+              <w:pStyle w:val="Compact"/>
+              <w:jc w:val="left"/>
+            </w:pPr>
+            <w:r>
+              <w:t xml:space="preserve">2026-07-30</w:t>
+            </w:r>
+          </w:p>
+        </w:tc>
+        <w:tc>
+          <w:tcPr/>
+          <w:p>
+            <w:pPr>
+              <w:pStyle w:val="Compact"/>
+              <w:jc w:val="left"/>
+            </w:pPr>
+            <w:r>
+              <w:t xml:space="preserve">First tool: rocprof-sys CPU hotspots launcher + extractor</w:t>
+            </w:r>
+          </w:p>
+        </w:tc>
+      </w:tr>
     </w:tbl>
     <w:bookmarkStart w:id="20" w:name="project-scaffolding-and-rules"/>
     <w:p>
@@ -376,7 +402,479 @@
       </w:r>
     </w:p>
     <w:bookmarkEnd w:id="20"/>
-    <w:bookmarkEnd w:id="21"/>
+    <w:bookmarkStart w:id="22" w:name="first-tool-rocprof-sys-cpu-hotspots"/>
+    <w:p>
+      <w:pPr>
+        <w:pStyle w:val="Heading2"/>
+      </w:pPr>
+      <w:r>
+        <w:t xml:space="preserve">2026-07-30 — First tool: rocprof-sys CPU hotspots</w:t>
+      </w:r>
+    </w:p>
+    <w:p>
+      <w:pPr>
+        <w:pStyle w:val="FirstParagraph"/>
+      </w:pPr>
+      <w:r>
+        <w:t xml:space="preserve">Implemented the first tool per the approved plan in</w:t>
+      </w:r>
+      <w:r>
+        <w:t xml:space="preserve"> </w:t>
+      </w:r>
+      <w:hyperlink r:id="rId21">
+        <w:r>
+          <w:rPr>
+            <w:rStyle w:val="Hyperlink"/>
+          </w:rPr>
+          <w:t xml:space="preserve">docs/plans/01-rocprof-sys-hotspots.md</w:t>
+        </w:r>
+      </w:hyperlink>
+      <w:r>
+        <w:t xml:space="preserve">: a quick</w:t>
+      </w:r>
+      <w:r>
+        <w:t xml:space="preserve"> </w:t>
+      </w:r>
+      <w:r>
+        <w:t xml:space="preserve">“</w:t>
+      </w:r>
+      <w:r>
+        <w:t xml:space="preserve">where’s the time going, and what’s still on the CPU</w:t>
+      </w:r>
+      <w:r>
+        <w:t xml:space="preserve">”</w:t>
+      </w:r>
+      <w:r>
+        <w:t xml:space="preserve"> </w:t>
+      </w:r>
+      <w:r>
+        <w:t xml:space="preserve">report for a first</w:t>
+      </w:r>
+      <w:r>
+        <w:t xml:space="preserve"> </w:t>
+      </w:r>
+      <w:r>
+        <w:rPr>
+          <w:rStyle w:val="VerbatimChar"/>
+        </w:rPr>
+        <w:t xml:space="preserve">rocprof-sys</w:t>
+      </w:r>
+      <w:r>
+        <w:t xml:space="preserve"> </w:t>
+      </w:r>
+      <w:r>
+        <w:t xml:space="preserve">profiling run, without needing the full Perfetto trace viewer.</w:t>
+      </w:r>
+    </w:p>
+    <w:p>
+      <w:pPr>
+        <w:pStyle w:val="BodyText"/>
+      </w:pPr>
+      <w:r>
+        <w:t xml:space="preserve">Research into</w:t>
+      </w:r>
+      <w:r>
+        <w:t xml:space="preserve"> </w:t>
+      </w:r>
+      <w:r>
+        <w:rPr>
+          <w:rStyle w:val="VerbatimChar"/>
+        </w:rPr>
+        <w:t xml:space="preserve">rocprof-sys</w:t>
+      </w:r>
+      <w:r>
+        <w:t xml:space="preserve"> </w:t>
+      </w:r>
+      <w:r>
+        <w:t xml:space="preserve">(rocprofiler-systems, ex-Omnitrace) established that its text/JSON output only captures</w:t>
+      </w:r>
+      <w:r>
+        <w:t xml:space="preserve"> </w:t>
+      </w:r>
+      <w:r>
+        <w:rPr>
+          <w:bCs/>
+          <w:b/>
+        </w:rPr>
+        <w:t xml:space="preserve">host-side</w:t>
+      </w:r>
+      <w:r>
+        <w:t xml:space="preserve"> </w:t>
+      </w:r>
+      <w:r>
+        <w:t xml:space="preserve">timing — even rows that look like GPU work (</w:t>
+      </w:r>
+      <w:r>
+        <w:rPr>
+          <w:rStyle w:val="VerbatimChar"/>
+        </w:rPr>
+        <w:t xml:space="preserve">hipLaunchKernel</w:t>
+      </w:r>
+      <w:r>
+        <w:t xml:space="preserve">, etc.) are launch/API overhead, not real device execution time. True GPU kernel hotspots need a different tool (</w:t>
+      </w:r>
+      <w:r>
+        <w:rPr>
+          <w:rStyle w:val="VerbatimChar"/>
+        </w:rPr>
+        <w:t xml:space="preserve">rocprofv3 --stats --kernel-trace --summary</w:t>
+      </w:r>
+      <w:r>
+        <w:t xml:space="preserve">, already stable since ROCm 7.0.2) or Perfetto/rocpd trace parsing (rocpd itself isn’t available before ROCm 7.1, so out of our 7.0.2 compatibility scope). Given that, this first tool deliberately scopes itself to CPU-side hotspots only — a GPU-only tool (built on</w:t>
+      </w:r>
+      <w:r>
+        <w:t xml:space="preserve"> </w:t>
+      </w:r>
+      <w:r>
+        <w:rPr>
+          <w:rStyle w:val="VerbatimChar"/>
+        </w:rPr>
+        <w:t xml:space="preserve">rocprofv3</w:t>
+      </w:r>
+      <w:r>
+        <w:t xml:space="preserve">) and a combined tool are planned as separate, later work.</w:t>
+      </w:r>
+    </w:p>
+    <w:p>
+      <w:pPr>
+        <w:pStyle w:val="BodyText"/>
+      </w:pPr>
+      <w:r>
+        <w:t xml:space="preserve">Two pieces:</w:t>
+      </w:r>
+      <w:r>
+        <w:t xml:space="preserve"> </w:t>
+      </w:r>
+      <w:r>
+        <w:t xml:space="preserve">-</w:t>
+      </w:r>
+      <w:r>
+        <w:t xml:space="preserve"> </w:t>
+      </w:r>
+      <w:r>
+        <w:rPr>
+          <w:rStyle w:val="VerbatimChar"/>
+        </w:rPr>
+        <w:t xml:space="preserve">postprocess/rocprof_sys_hotspots.py</w:t>
+      </w:r>
+      <w:r>
+        <w:t xml:space="preserve"> </w:t>
+      </w:r>
+      <w:r>
+        <w:t xml:space="preserve">— standalone Python 3 (stdlib only) extractor. Parses rocprof-sys’s pipe-delimited</w:t>
+      </w:r>
+      <w:r>
+        <w:t xml:space="preserve"> </w:t>
+      </w:r>
+      <w:r>
+        <w:t xml:space="preserve">“</w:t>
+      </w:r>
+      <w:r>
+        <w:t xml:space="preserve">timemory</w:t>
+      </w:r>
+      <w:r>
+        <w:t xml:space="preserve">”</w:t>
+      </w:r>
+      <w:r>
+        <w:t xml:space="preserve"> </w:t>
+      </w:r>
+      <w:r>
+        <w:t xml:space="preserve">text tables (e.g. </w:t>
+      </w:r>
+      <w:r>
+        <w:rPr>
+          <w:rStyle w:val="VerbatimChar"/>
+        </w:rPr>
+        <w:t xml:space="preserve">wall_clock-&lt;pid&gt;.txt</w:t>
+      </w:r>
+      <w:r>
+        <w:t xml:space="preserve">), aggregates by function name across however many files it finds (handles multiple MPI-rank files transparently), buckets entries into</w:t>
+      </w:r>
+      <w:r>
+        <w:t xml:space="preserve"> </w:t>
+      </w:r>
+      <w:r>
+        <w:t xml:space="preserve">“</w:t>
+      </w:r>
+      <w:r>
+        <w:t xml:space="preserve">CPU compute (offload candidates)</w:t>
+      </w:r>
+      <w:r>
+        <w:t xml:space="preserve">”</w:t>
+      </w:r>
+      <w:r>
+        <w:t xml:space="preserve"> </w:t>
+      </w:r>
+      <w:r>
+        <w:t xml:space="preserve">vs</w:t>
+      </w:r>
+      <w:r>
+        <w:t xml:space="preserve"> </w:t>
+      </w:r>
+      <w:r>
+        <w:t xml:space="preserve">“</w:t>
+      </w:r>
+      <w:r>
+        <w:t xml:space="preserve">GPU API/launch overhead</w:t>
+      </w:r>
+      <w:r>
+        <w:t xml:space="preserve">”</w:t>
+      </w:r>
+      <w:r>
+        <w:t xml:space="preserve"> </w:t>
+      </w:r>
+      <w:r>
+        <w:t xml:space="preserve">by name prefix, and writes a short</w:t>
+      </w:r>
+      <w:r>
+        <w:t xml:space="preserve"> </w:t>
+      </w:r>
+      <w:r>
+        <w:rPr>
+          <w:rStyle w:val="VerbatimChar"/>
+        </w:rPr>
+        <w:t xml:space="preserve">hotspots.txt</w:t>
+      </w:r>
+      <w:r>
+        <w:t xml:space="preserve">. Notable implementation detail: rocprof-sys’s own docs describe the MPI row-prefix format as</w:t>
+      </w:r>
+      <w:r>
+        <w:t xml:space="preserve"> </w:t>
+      </w:r>
+      <w:r>
+        <w:rPr>
+          <w:rStyle w:val="VerbatimChar"/>
+        </w:rPr>
+        <w:t xml:space="preserve">|MM|NN&gt;&gt;&gt;label</w:t>
+      </w:r>
+      <w:r>
+        <w:t xml:space="preserve">, which embeds an extra</w:t>
+      </w:r>
+      <w:r>
+        <w:t xml:space="preserve"> </w:t>
+      </w:r>
+      <w:r>
+        <w:rPr>
+          <w:rStyle w:val="VerbatimChar"/>
+        </w:rPr>
+        <w:t xml:space="preserve">|</w:t>
+      </w:r>
+      <w:r>
+        <w:t xml:space="preserve"> </w:t>
+      </w:r>
+      <w:r>
+        <w:t xml:space="preserve">inside what’s conceptually one field — the parser handles this (and the similar case of hierarchy-indentation markers) generically by taking the last 11 pipe-delimited fields as the fixed numeric columns and treating everything before that as the label, rather than assuming a fixed field count.</w:t>
+      </w:r>
+      <w:r>
+        <w:t xml:space="preserve"> </w:t>
+      </w:r>
+      <w:r>
+        <w:t xml:space="preserve">-</w:t>
+      </w:r>
+      <w:r>
+        <w:t xml:space="preserve"> </w:t>
+      </w:r>
+      <w:r>
+        <w:rPr>
+          <w:rStyle w:val="VerbatimChar"/>
+        </w:rPr>
+        <w:t xml:space="preserve">scripts/rocprof_sys_profile.sh</w:t>
+      </w:r>
+      <w:r>
+        <w:t xml:space="preserve"> </w:t>
+      </w:r>
+      <w:r>
+        <w:t xml:space="preserve">— bash launcher wrapping</w:t>
+      </w:r>
+      <w:r>
+        <w:t xml:space="preserve"> </w:t>
+      </w:r>
+      <w:r>
+        <w:rPr>
+          <w:rStyle w:val="VerbatimChar"/>
+        </w:rPr>
+        <w:t xml:space="preserve">rocprof-sys-sample</w:t>
+      </w:r>
+      <w:r>
+        <w:t xml:space="preserve"> </w:t>
+      </w:r>
+      <w:r>
+        <w:t xml:space="preserve">(lightweight call-stack sampling, no binary instrumentation) with sane first-run defaults (flat profile, text+JSON output, Perfetto tracing off), and auto-invoking the extractor afterwards. Since</w:t>
+      </w:r>
+      <w:r>
+        <w:t xml:space="preserve"> </w:t>
+      </w:r>
+      <w:r>
+        <w:rPr>
+          <w:rStyle w:val="VerbatimChar"/>
+        </w:rPr>
+        <w:t xml:space="preserve">rocprof-sys-sample</w:t>
+      </w:r>
+      <w:r>
+        <w:t xml:space="preserve"> </w:t>
+      </w:r>
+      <w:r>
+        <w:t xml:space="preserve">wraps a single process, MPI usage is</w:t>
+      </w:r>
+      <w:r>
+        <w:t xml:space="preserve"> </w:t>
+      </w:r>
+      <w:r>
+        <w:rPr>
+          <w:rStyle w:val="VerbatimChar"/>
+        </w:rPr>
+        <w:t xml:space="preserve">mpirun -np N scripts/rocprof_sys_profile.sh -- ./app</w:t>
+      </w:r>
+      <w:r>
+        <w:t xml:space="preserve"> </w:t>
+      </w:r>
+      <w:r>
+        <w:t xml:space="preserve">(mpirun/srun goes</w:t>
+      </w:r>
+      <w:r>
+        <w:t xml:space="preserve"> </w:t>
+      </w:r>
+      <w:r>
+        <w:rPr>
+          <w:iCs/>
+          <w:i/>
+        </w:rPr>
+        <w:t xml:space="preserve">before</w:t>
+      </w:r>
+      <w:r>
+        <w:t xml:space="preserve"> </w:t>
+      </w:r>
+      <w:r>
+        <w:t xml:space="preserve">the script, not inside it) — the script detects</w:t>
+      </w:r>
+      <w:r>
+        <w:t xml:space="preserve"> </w:t>
+      </w:r>
+      <w:r>
+        <w:rPr>
+          <w:rStyle w:val="VerbatimChar"/>
+        </w:rPr>
+        <w:t xml:space="preserve">OMPI_COMM_WORLD_RANK</w:t>
+      </w:r>
+      <w:r>
+        <w:t xml:space="preserve">/</w:t>
+      </w:r>
+      <w:r>
+        <w:rPr>
+          <w:rStyle w:val="VerbatimChar"/>
+        </w:rPr>
+        <w:t xml:space="preserve">PMI_RANK</w:t>
+      </w:r>
+      <w:r>
+        <w:t xml:space="preserve">/</w:t>
+      </w:r>
+      <w:r>
+        <w:rPr>
+          <w:rStyle w:val="VerbatimChar"/>
+        </w:rPr>
+        <w:t xml:space="preserve">SLURM_PROCID</w:t>
+      </w:r>
+      <w:r>
+        <w:t xml:space="preserve"> </w:t>
+      </w:r>
+      <w:r>
+        <w:t xml:space="preserve">so only rank 0 runs the extractor against the shared output directory.</w:t>
+      </w:r>
+    </w:p>
+    <w:p>
+      <w:pPr>
+        <w:pStyle w:val="BodyText"/>
+      </w:pPr>
+      <w:r>
+        <w:t xml:space="preserve">Verified locally (no ROCm/GPU available on this dev machine, per</w:t>
+      </w:r>
+      <w:r>
+        <w:t xml:space="preserve"> </w:t>
+      </w:r>
+      <w:r>
+        <w:rPr>
+          <w:rStyle w:val="VerbatimChar"/>
+        </w:rPr>
+        <w:t xml:space="preserve">CLAUDE.md</w:t>
+      </w:r>
+      <w:r>
+        <w:t xml:space="preserve">’s environment constraints):</w:t>
+      </w:r>
+      <w:r>
+        <w:t xml:space="preserve"> </w:t>
+      </w:r>
+      <w:r>
+        <w:rPr>
+          <w:rStyle w:val="VerbatimChar"/>
+        </w:rPr>
+        <w:t xml:space="preserve">python3 -m unittest</w:t>
+      </w:r>
+      <w:r>
+        <w:t xml:space="preserve"> </w:t>
+      </w:r>
+      <w:r>
+        <w:t xml:space="preserve">against hand-crafted fixtures under</w:t>
+      </w:r>
+      <w:r>
+        <w:t xml:space="preserve"> </w:t>
+      </w:r>
+      <w:r>
+        <w:rPr>
+          <w:rStyle w:val="VerbatimChar"/>
+        </w:rPr>
+        <w:t xml:space="preserve">postprocess/tests/fixtures/</w:t>
+      </w:r>
+      <w:r>
+        <w:t xml:space="preserve"> </w:t>
+      </w:r>
+      <w:r>
+        <w:t xml:space="preserve">(18 tests covering label-cleaning, table parsing, cross-file aggregation, GPU/CPU bucketing, and end-to-end report generation),</w:t>
+      </w:r>
+      <w:r>
+        <w:t xml:space="preserve"> </w:t>
+      </w:r>
+      <w:r>
+        <w:rPr>
+          <w:rStyle w:val="VerbatimChar"/>
+        </w:rPr>
+        <w:t xml:space="preserve">bash -n</w:t>
+      </w:r>
+      <w:r>
+        <w:t xml:space="preserve"> </w:t>
+      </w:r>
+      <w:r>
+        <w:t xml:space="preserve">on the launcher (shellcheck not installed in this environment, so that check was skipped), and manual dry-run / stubbed-</w:t>
+      </w:r>
+      <w:r>
+        <w:rPr>
+          <w:rStyle w:val="VerbatimChar"/>
+        </w:rPr>
+        <w:t xml:space="preserve">rocprof-sys-sample</w:t>
+      </w:r>
+      <w:r>
+        <w:t xml:space="preserve"> </w:t>
+      </w:r>
+      <w:r>
+        <w:t xml:space="preserve">runs exercising flag parsing, env var construction, and the rank-0-only summary gating. Real end-to-end validation against actual</w:t>
+      </w:r>
+      <w:r>
+        <w:t xml:space="preserve"> </w:t>
+      </w:r>
+      <w:r>
+        <w:rPr>
+          <w:rStyle w:val="VerbatimChar"/>
+        </w:rPr>
+        <w:t xml:space="preserve">rocprof-sys</w:t>
+      </w:r>
+      <w:r>
+        <w:t xml:space="preserve"> </w:t>
+      </w:r>
+      <w:r>
+        <w:t xml:space="preserve">output is left to the user on the HPC system.</w:t>
+      </w:r>
+    </w:p>
+    <w:bookmarkEnd w:id="22"/>
+    <w:bookmarkEnd w:id="23"/>
     <w:sectPr/>
   </w:body>
 </w:document>

</xml_diff>

<commit_message>
rocprof-sys hotspots: %-of-total column, selectable output, header metadata
- Add a %total column computed from timemory data alone (each file's largest
  SUM as a root-scope proxy, summed across files as the denominator).
- Replace the fixed top-20 cutoff with a mutually-exclusive --top/--threshold/
  --all choice, forwarded through the launcher unchanged.
- Best-effort executable/run-datetime/total-runtime/MPI-rank-count header,
  read from the output directory's metadata.json (never the timemory files),
  falling back to blank -- never an error -- when a field can't be found.
</commit_message>
<xml_diff>
--- a/docs/DEVELOPMENT_HISTORY.docx
+++ b/docs/DEVELOPMENT_HISTORY.docx
@@ -10,7 +10,7 @@
         <w:t xml:space="preserve">Development History</w:t>
       </w:r>
     </w:p>
-    <w:bookmarkStart w:id="23" w:name="development-history"/>
+    <w:bookmarkStart w:id="24" w:name="development-history"/>
     <w:p>
       <w:pPr>
         <w:pStyle w:val="Heading1"/>
@@ -126,6 +126,32 @@
           </w:p>
         </w:tc>
       </w:tr>
+      <w:tr>
+        <w:tc>
+          <w:tcPr/>
+          <w:p>
+            <w:pPr>
+              <w:pStyle w:val="Compact"/>
+              <w:jc w:val="left"/>
+            </w:pPr>
+            <w:r>
+              <w:t xml:space="preserve">2026-07-30</w:t>
+            </w:r>
+          </w:p>
+        </w:tc>
+        <w:tc>
+          <w:tcPr/>
+          <w:p>
+            <w:pPr>
+              <w:pStyle w:val="Compact"/>
+              <w:jc w:val="left"/>
+            </w:pPr>
+            <w:r>
+              <w:t xml:space="preserve">rocprof-sys hotspots: %-of-total column, selectable output, header metadata</w:t>
+            </w:r>
+          </w:p>
+        </w:tc>
+      </w:tr>
     </w:tbl>
     <w:bookmarkStart w:id="20" w:name="project-scaffolding-and-rules"/>
     <w:p>
@@ -874,7 +900,375 @@
       </w:r>
     </w:p>
     <w:bookmarkEnd w:id="22"/>
+    <w:bookmarkStart w:id="23" w:name="Xef70b3b2081d2ed2aca49c6f1da7dcc897d4451"/>
+    <w:p>
+      <w:pPr>
+        <w:pStyle w:val="Heading2"/>
+      </w:pPr>
+      <w:r>
+        <w:t xml:space="preserve">2026-07-30 — rocprof-sys hotspots: %-of-total column, selectable output, header metadata</w:t>
+      </w:r>
+    </w:p>
+    <w:p>
+      <w:pPr>
+        <w:pStyle w:val="FirstParagraph"/>
+      </w:pPr>
+      <w:r>
+        <w:t xml:space="preserve">Extended the CPU hotspots tool with three follow-up requests:</w:t>
+      </w:r>
+    </w:p>
+    <w:p>
+      <w:pPr>
+        <w:numPr>
+          <w:ilvl w:val="0"/>
+          <w:numId w:val="1001"/>
+        </w:numPr>
+        <w:pStyle w:val="Compact"/>
+      </w:pPr>
+      <w:r>
+        <w:rPr>
+          <w:rStyle w:val="VerbatimChar"/>
+          <w:bCs/>
+          <w:b/>
+        </w:rPr>
+        <w:t xml:space="preserve">%total</w:t>
+      </w:r>
+      <w:r>
+        <w:rPr>
+          <w:bCs/>
+          <w:b/>
+        </w:rPr>
+        <w:t xml:space="preserve"> </w:t>
+      </w:r>
+      <w:r>
+        <w:rPr>
+          <w:bCs/>
+          <w:b/>
+        </w:rPr>
+        <w:t xml:space="preserve">column</w:t>
+      </w:r>
+      <w:r>
+        <w:t xml:space="preserve">, computed purely from timemory data: each aggregated entry’s share of a</w:t>
+      </w:r>
+      <w:r>
+        <w:t xml:space="preserve"> </w:t>
+      </w:r>
+      <w:r>
+        <w:rPr>
+          <w:rStyle w:val="VerbatimChar"/>
+        </w:rPr>
+        <w:t xml:space="preserve">total_runtime</w:t>
+      </w:r>
+      <w:r>
+        <w:t xml:space="preserve"> </w:t>
+      </w:r>
+      <w:r>
+        <w:t xml:space="preserve">denominator, itself the sum, across all scanned files, of that file’s own single largest</w:t>
+      </w:r>
+      <w:r>
+        <w:t xml:space="preserve"> </w:t>
+      </w:r>
+      <w:r>
+        <w:rPr>
+          <w:rStyle w:val="VerbatimChar"/>
+        </w:rPr>
+        <w:t xml:space="preserve">SUM</w:t>
+      </w:r>
+      <w:r>
+        <w:t xml:space="preserve"> </w:t>
+      </w:r>
+      <w:r>
+        <w:t xml:space="preserve">value. A file’s largest</w:t>
+      </w:r>
+      <w:r>
+        <w:t xml:space="preserve"> </w:t>
+      </w:r>
+      <w:r>
+        <w:rPr>
+          <w:rStyle w:val="VerbatimChar"/>
+        </w:rPr>
+        <w:t xml:space="preserve">SUM</w:t>
+      </w:r>
+      <w:r>
+        <w:t xml:space="preserve"> </w:t>
+      </w:r>
+      <w:r>
+        <w:t xml:space="preserve">is — barring unusual instrumentation — its outermost/root scope, since inclusive time only grows going up the call stack; this holds whether the file is a hierarchical or an already-flattened profile, without needing to guess the entry-point function’s name (which the target codebase’s language/build system might vary, e.g. Fortran’s</w:t>
+      </w:r>
+      <w:r>
+        <w:t xml:space="preserve"> </w:t>
+      </w:r>
+      <w:r>
+        <w:rPr>
+          <w:rStyle w:val="VerbatimChar"/>
+        </w:rPr>
+        <w:t xml:space="preserve">MAIN__</w:t>
+      </w:r>
+      <w:r>
+        <w:t xml:space="preserve"> </w:t>
+      </w:r>
+      <w:r>
+        <w:t xml:space="preserve">vs C’s</w:t>
+      </w:r>
+      <w:r>
+        <w:t xml:space="preserve"> </w:t>
+      </w:r>
+      <w:r>
+        <w:rPr>
+          <w:rStyle w:val="VerbatimChar"/>
+        </w:rPr>
+        <w:t xml:space="preserve">main</w:t>
+      </w:r>
+      <w:r>
+        <w:t xml:space="preserve">).</w:t>
+      </w:r>
+    </w:p>
+    <w:p>
+      <w:pPr>
+        <w:numPr>
+          <w:ilvl w:val="0"/>
+          <w:numId w:val="1001"/>
+        </w:numPr>
+        <w:pStyle w:val="Compact"/>
+      </w:pPr>
+      <w:r>
+        <w:rPr>
+          <w:bCs/>
+          <w:b/>
+        </w:rPr>
+        <w:t xml:space="preserve">Selectable output</w:t>
+      </w:r>
+      <w:r>
+        <w:t xml:space="preserve">:</w:t>
+      </w:r>
+      <w:r>
+        <w:t xml:space="preserve"> </w:t>
+      </w:r>
+      <w:r>
+        <w:rPr>
+          <w:rStyle w:val="VerbatimChar"/>
+        </w:rPr>
+        <w:t xml:space="preserve">-n/--top N</w:t>
+      </w:r>
+      <w:r>
+        <w:t xml:space="preserve"> </w:t>
+      </w:r>
+      <w:r>
+        <w:t xml:space="preserve">(unchanged default of 20), plus new</w:t>
+      </w:r>
+      <w:r>
+        <w:t xml:space="preserve"> </w:t>
+      </w:r>
+      <w:r>
+        <w:rPr>
+          <w:rStyle w:val="VerbatimChar"/>
+        </w:rPr>
+        <w:t xml:space="preserve">--threshold PCT</w:t>
+      </w:r>
+      <w:r>
+        <w:t xml:space="preserve"> </w:t>
+      </w:r>
+      <w:r>
+        <w:t xml:space="preserve">(only entries at/above PCT% of total runtime — falls back to showing everything, with a note, if total runtime couldn’t be computed) and</w:t>
+      </w:r>
+      <w:r>
+        <w:t xml:space="preserve"> </w:t>
+      </w:r>
+      <w:r>
+        <w:rPr>
+          <w:rStyle w:val="VerbatimChar"/>
+        </w:rPr>
+        <w:t xml:space="preserve">--all</w:t>
+      </w:r>
+      <w:r>
+        <w:t xml:space="preserve"> </w:t>
+      </w:r>
+      <w:r>
+        <w:t xml:space="preserve">(no truncation), as a mutually-exclusive argparse group.</w:t>
+      </w:r>
+      <w:r>
+        <w:t xml:space="preserve"> </w:t>
+      </w:r>
+      <w:r>
+        <w:rPr>
+          <w:rStyle w:val="VerbatimChar"/>
+        </w:rPr>
+        <w:t xml:space="preserve">scripts/rocprof_sys_profile.sh</w:t>
+      </w:r>
+      <w:r>
+        <w:t xml:space="preserve"> </w:t>
+      </w:r>
+      <w:r>
+        <w:t xml:space="preserve">forwards whichever of the three the user passed through to the extractor unchanged.</w:t>
+      </w:r>
+    </w:p>
+    <w:p>
+      <w:pPr>
+        <w:numPr>
+          <w:ilvl w:val="0"/>
+          <w:numId w:val="1001"/>
+        </w:numPr>
+        <w:pStyle w:val="Compact"/>
+      </w:pPr>
+      <w:r>
+        <w:rPr>
+          <w:bCs/>
+          <w:b/>
+        </w:rPr>
+        <w:t xml:space="preserve">Best-effort header metadata</w:t>
+      </w:r>
+      <w:r>
+        <w:t xml:space="preserve"> </w:t>
+      </w:r>
+      <w:r>
+        <w:t xml:space="preserve">— executable name, run date/time, total runtime, and MPI rank count — read from</w:t>
+      </w:r>
+      <w:r>
+        <w:t xml:space="preserve"> </w:t>
+      </w:r>
+      <w:r>
+        <w:rPr>
+          <w:rStyle w:val="VerbatimChar"/>
+        </w:rPr>
+        <w:t xml:space="preserve">metadata.json</w:t>
+      </w:r>
+      <w:r>
+        <w:t xml:space="preserve"> </w:t>
+      </w:r>
+      <w:r>
+        <w:t xml:space="preserve">in the rocprof-sys output directory (never from the timemory files themselves, per the request). Since</w:t>
+      </w:r>
+      <w:r>
+        <w:t xml:space="preserve"> </w:t>
+      </w:r>
+      <w:r>
+        <w:rPr>
+          <w:rStyle w:val="VerbatimChar"/>
+        </w:rPr>
+        <w:t xml:space="preserve">metadata.json</w:t>
+      </w:r>
+      <w:r>
+        <w:t xml:space="preserve">’s schema isn’t documented anywhere found during research, field lookup is a best-effort, case-insensitive search over several plausible key names (one level of nested dicts deep), with two concrete fallbacks grounded in documented rocprof-sys behavior rather than guesswork: run date/time falls back to rocprof-sys’s own default output-subdirectory naming pattern (</w:t>
+      </w:r>
+      <w:r>
+        <w:rPr>
+          <w:rStyle w:val="VerbatimChar"/>
+        </w:rPr>
+        <w:t xml:space="preserve">%F_%H.%M</w:t>
+      </w:r>
+      <w:r>
+        <w:t xml:space="preserve">, e.g. </w:t>
+      </w:r>
+      <w:r>
+        <w:rPr>
+          <w:rStyle w:val="VerbatimChar"/>
+        </w:rPr>
+        <w:t xml:space="preserve">2025-01-21_07.40</w:t>
+      </w:r>
+      <w:r>
+        <w:t xml:space="preserve">) if present in the path, and rank count falls back to the number of distinct PIDs among the scanned</w:t>
+      </w:r>
+      <w:r>
+        <w:t xml:space="preserve"> </w:t>
+      </w:r>
+      <w:r>
+        <w:rPr>
+          <w:rStyle w:val="VerbatimChar"/>
+        </w:rPr>
+        <w:t xml:space="preserve">&lt;component&gt;-&lt;pid&gt;.txt</w:t>
+      </w:r>
+      <w:r>
+        <w:t xml:space="preserve"> </w:t>
+      </w:r>
+      <w:r>
+        <w:t xml:space="preserve">filenames. Any field that still can’t be determined is left blank — never an error, per the request.</w:t>
+      </w:r>
+    </w:p>
+    <w:p>
+      <w:pPr>
+        <w:pStyle w:val="FirstParagraph"/>
+      </w:pPr>
+      <w:r>
+        <w:t xml:space="preserve">Extended</w:t>
+      </w:r>
+      <w:r>
+        <w:t xml:space="preserve"> </w:t>
+      </w:r>
+      <w:r>
+        <w:rPr>
+          <w:rStyle w:val="VerbatimChar"/>
+        </w:rPr>
+        <w:t xml:space="preserve">postprocess/tests/fixtures/mpi_2rank/</w:t>
+      </w:r>
+      <w:r>
+        <w:t xml:space="preserve"> </w:t>
+      </w:r>
+      <w:r>
+        <w:t xml:space="preserve">with a</w:t>
+      </w:r>
+      <w:r>
+        <w:t xml:space="preserve"> </w:t>
+      </w:r>
+      <w:r>
+        <w:rPr>
+          <w:rStyle w:val="VerbatimChar"/>
+        </w:rPr>
+        <w:t xml:space="preserve">metadata.json</w:t>
+      </w:r>
+      <w:r>
+        <w:t xml:space="preserve"> </w:t>
+      </w:r>
+      <w:r>
+        <w:t xml:space="preserve">fixture (exercising both a direct top-level key and one nested under a</w:t>
+      </w:r>
+      <w:r>
+        <w:t xml:space="preserve"> </w:t>
+      </w:r>
+      <w:r>
+        <w:rPr>
+          <w:rStyle w:val="VerbatimChar"/>
+        </w:rPr>
+        <w:t xml:space="preserve">settings</w:t>
+      </w:r>
+      <w:r>
+        <w:t xml:space="preserve"> </w:t>
+      </w:r>
+      <w:r>
+        <w:t xml:space="preserve">object) and left</w:t>
+      </w:r>
+      <w:r>
+        <w:t xml:space="preserve"> </w:t>
+      </w:r>
+      <w:r>
+        <w:rPr>
+          <w:rStyle w:val="VerbatimChar"/>
+        </w:rPr>
+        <w:t xml:space="preserve">single_rank/</w:t>
+      </w:r>
+      <w:r>
+        <w:t xml:space="preserve"> </w:t>
+      </w:r>
+      <w:r>
+        <w:t xml:space="preserve">without one, to test the all-fields-blank-plus-PID-fallback path. Added 15 new tests (33 total) covering the total-runtime computation, all three selection modes (including the threshold/unknown-total-runtime fallback), and metadata guessing with and without</w:t>
+      </w:r>
+      <w:r>
+        <w:t xml:space="preserve"> </w:t>
+      </w:r>
+      <w:r>
+        <w:rPr>
+          <w:rStyle w:val="VerbatimChar"/>
+        </w:rPr>
+        <w:t xml:space="preserve">metadata.json</w:t>
+      </w:r>
+      <w:r>
+        <w:t xml:space="preserve"> </w:t>
+      </w:r>
+      <w:r>
+        <w:t xml:space="preserve">present.</w:t>
+      </w:r>
+    </w:p>
     <w:bookmarkEnd w:id="23"/>
+    <w:bookmarkEnd w:id="24"/>
     <w:sectPr/>
   </w:body>
 </w:document>
@@ -981,8 +1375,123 @@
       </w:pPr>
     </w:lvl>
   </w:abstractNum>
+  <w:abstractNum w:abstractNumId="99411">
+    <w:nsid w:val="A99411"/>
+    <w:multiLevelType w:val="multilevel"/>
+    <w:lvl w:ilvl="0">
+      <w:start w:val="1"/>
+      <w:numFmt w:val="decimal"/>
+      <w:lvlText w:val="%1."/>
+      <w:lvlJc w:val="left"/>
+      <w:pPr>
+        <w:ind w:left="720" w:hanging="480"/>
+      </w:pPr>
+    </w:lvl>
+    <w:lvl w:ilvl="1">
+      <w:start w:val="1"/>
+      <w:numFmt w:val="decimal"/>
+      <w:lvlText w:val="%2."/>
+      <w:lvlJc w:val="left"/>
+      <w:pPr>
+        <w:ind w:left="1440" w:hanging="480"/>
+      </w:pPr>
+    </w:lvl>
+    <w:lvl w:ilvl="2">
+      <w:start w:val="1"/>
+      <w:numFmt w:val="decimal"/>
+      <w:lvlText w:val="%3."/>
+      <w:lvlJc w:val="left"/>
+      <w:pPr>
+        <w:ind w:left="2160" w:hanging="480"/>
+      </w:pPr>
+    </w:lvl>
+    <w:lvl w:ilvl="3">
+      <w:start w:val="1"/>
+      <w:numFmt w:val="decimal"/>
+      <w:lvlText w:val="%4."/>
+      <w:lvlJc w:val="left"/>
+      <w:pPr>
+        <w:ind w:left="2880" w:hanging="480"/>
+      </w:pPr>
+    </w:lvl>
+    <w:lvl w:ilvl="4">
+      <w:start w:val="1"/>
+      <w:numFmt w:val="decimal"/>
+      <w:lvlText w:val="%5."/>
+      <w:lvlJc w:val="left"/>
+      <w:pPr>
+        <w:ind w:left="3600" w:hanging="480"/>
+      </w:pPr>
+    </w:lvl>
+    <w:lvl w:ilvl="5">
+      <w:start w:val="1"/>
+      <w:numFmt w:val="decimal"/>
+      <w:lvlText w:val="%6."/>
+      <w:lvlJc w:val="left"/>
+      <w:pPr>
+        <w:ind w:left="4320" w:hanging="480"/>
+      </w:pPr>
+    </w:lvl>
+    <w:lvl w:ilvl="6">
+      <w:start w:val="1"/>
+      <w:numFmt w:val="decimal"/>
+      <w:lvlText w:val="%7."/>
+      <w:lvlJc w:val="left"/>
+      <w:pPr>
+        <w:ind w:left="5040" w:hanging="480"/>
+      </w:pPr>
+    </w:lvl>
+    <w:lvl w:ilvl="7">
+      <w:start w:val="1"/>
+      <w:numFmt w:val="decimal"/>
+      <w:lvlText w:val="%8."/>
+      <w:lvlJc w:val="left"/>
+      <w:pPr>
+        <w:ind w:left="5760" w:hanging="480"/>
+      </w:pPr>
+    </w:lvl>
+    <w:lvl w:ilvl="8">
+      <w:start w:val="1"/>
+      <w:numFmt w:val="decimal"/>
+      <w:lvlText w:val="%9."/>
+      <w:lvlJc w:val="left"/>
+      <w:pPr>
+        <w:ind w:left="6480" w:hanging="480"/>
+      </w:pPr>
+    </w:lvl>
+  </w:abstractNum>
   <w:num w:numId="1000">
     <w:abstractNumId w:val="990"/>
+  </w:num>
+  <w:num w:numId="1001">
+    <w:abstractNumId w:val="99411"/>
+    <w:lvlOverride w:ilvl="0">
+      <w:startOverride w:val="1"/>
+    </w:lvlOverride>
+    <w:lvlOverride w:ilvl="1">
+      <w:startOverride w:val="1"/>
+    </w:lvlOverride>
+    <w:lvlOverride w:ilvl="2">
+      <w:startOverride w:val="1"/>
+    </w:lvlOverride>
+    <w:lvlOverride w:ilvl="3">
+      <w:startOverride w:val="1"/>
+    </w:lvlOverride>
+    <w:lvlOverride w:ilvl="4">
+      <w:startOverride w:val="1"/>
+    </w:lvlOverride>
+    <w:lvlOverride w:ilvl="5">
+      <w:startOverride w:val="1"/>
+    </w:lvlOverride>
+    <w:lvlOverride w:ilvl="6">
+      <w:startOverride w:val="1"/>
+    </w:lvlOverride>
+    <w:lvlOverride w:ilvl="7">
+      <w:startOverride w:val="1"/>
+    </w:lvlOverride>
+    <w:lvlOverride w:ilvl="8">
+      <w:startOverride w:val="1"/>
+    </w:lvlOverride>
   </w:num>
 </w:numbering>
 </file>

</xml_diff>

<commit_message>
Add second tool: rocprofv3 GPU kernel hotspots launcher + extractor
Completes the roadmap item from tool 1: rocprof-sys never has real GPU
device execution time, only host-side timing. rocprofv3's kernel_stats.csv
does, is simpler to work with (documented schema, auto-aggregated by kernel
name, native --output-format csv), and needs no instrumentation step.

Mirrors tool 1's shape (launcher + standalone extractor, same --top/
--threshold/--all selection, same best-effort/blank-on-missing header
metadata) for a consistent tool family. Also points tool 1's footer note
at the new scripts/rocprofv3_profile.sh instead of a raw command line.
</commit_message>
<xml_diff>
--- a/docs/DEVELOPMENT_HISTORY.docx
+++ b/docs/DEVELOPMENT_HISTORY.docx
@@ -10,7 +10,7 @@
         <w:t xml:space="preserve">Development History</w:t>
       </w:r>
     </w:p>
-    <w:bookmarkStart w:id="24" w:name="development-history"/>
+    <w:bookmarkStart w:id="26" w:name="development-history"/>
     <w:p>
       <w:pPr>
         <w:pStyle w:val="Heading1"/>
@@ -152,6 +152,32 @@
           </w:p>
         </w:tc>
       </w:tr>
+      <w:tr>
+        <w:tc>
+          <w:tcPr/>
+          <w:p>
+            <w:pPr>
+              <w:pStyle w:val="Compact"/>
+              <w:jc w:val="left"/>
+            </w:pPr>
+            <w:r>
+              <w:t xml:space="preserve">2026-07-31</w:t>
+            </w:r>
+          </w:p>
+        </w:tc>
+        <w:tc>
+          <w:tcPr/>
+          <w:p>
+            <w:pPr>
+              <w:pStyle w:val="Compact"/>
+              <w:jc w:val="left"/>
+            </w:pPr>
+            <w:r>
+              <w:t xml:space="preserve">Second tool: rocprofv3 GPU kernel hotspots launcher + extractor</w:t>
+            </w:r>
+          </w:p>
+        </w:tc>
+      </w:tr>
     </w:tbl>
     <w:bookmarkStart w:id="20" w:name="project-scaffolding-and-rules"/>
     <w:p>
@@ -1268,7 +1294,713 @@
       </w:r>
     </w:p>
     <w:bookmarkEnd w:id="23"/>
-    <w:bookmarkEnd w:id="24"/>
+    <w:bookmarkStart w:id="25" w:name="Xff7c7e3edb3ab1a5eaafc92edfaa75b900b6563"/>
+    <w:p>
+      <w:pPr>
+        <w:pStyle w:val="Heading2"/>
+      </w:pPr>
+      <w:r>
+        <w:t xml:space="preserve">2026-07-31 — Second tool: rocprofv3 GPU kernel hotspots</w:t>
+      </w:r>
+    </w:p>
+    <w:p>
+      <w:pPr>
+        <w:pStyle w:val="FirstParagraph"/>
+      </w:pPr>
+      <w:r>
+        <w:t xml:space="preserve">Implemented the second tool per the approved plan in</w:t>
+      </w:r>
+      <w:r>
+        <w:t xml:space="preserve"> </w:t>
+      </w:r>
+      <w:hyperlink r:id="rId24">
+        <w:r>
+          <w:rPr>
+            <w:rStyle w:val="Hyperlink"/>
+          </w:rPr>
+          <w:t xml:space="preserve">docs/plans/02-rocprofv3-gpu-hotspots.md</w:t>
+        </w:r>
+      </w:hyperlink>
+      <w:r>
+        <w:t xml:space="preserve">: the GPU-kernel-only counterpart to the first tool, completing the roadmap item flagged when tool 1 was built (</w:t>
+      </w:r>
+      <w:r>
+        <w:rPr>
+          <w:rStyle w:val="VerbatimChar"/>
+        </w:rPr>
+        <w:t xml:space="preserve">rocprof-sys</w:t>
+      </w:r>
+      <w:r>
+        <w:t xml:space="preserve"> </w:t>
+      </w:r>
+      <w:r>
+        <w:t xml:space="preserve">never has real device execution time;</w:t>
+      </w:r>
+      <w:r>
+        <w:t xml:space="preserve"> </w:t>
+      </w:r>
+      <w:r>
+        <w:rPr>
+          <w:rStyle w:val="VerbatimChar"/>
+        </w:rPr>
+        <w:t xml:space="preserve">rocprofv3</w:t>
+      </w:r>
+      <w:r>
+        <w:t xml:space="preserve"> </w:t>
+      </w:r>
+      <w:r>
+        <w:t xml:space="preserve">does).</w:t>
+      </w:r>
+    </w:p>
+    <w:p>
+      <w:pPr>
+        <w:pStyle w:val="BodyText"/>
+      </w:pPr>
+      <w:r>
+        <w:t xml:space="preserve">Research into</w:t>
+      </w:r>
+      <w:r>
+        <w:t xml:space="preserve"> </w:t>
+      </w:r>
+      <w:r>
+        <w:rPr>
+          <w:rStyle w:val="VerbatimChar"/>
+        </w:rPr>
+        <w:t xml:space="preserve">rocprofv3</w:t>
+      </w:r>
+      <w:r>
+        <w:t xml:space="preserve"> </w:t>
+      </w:r>
+      <w:r>
+        <w:t xml:space="preserve">(rocprofiler-sdk), cross-checked against the ROCm 7.0.2-tagged docs and the tool’s own source on GitHub, found it considerably more straightforward to build on than</w:t>
+      </w:r>
+      <w:r>
+        <w:t xml:space="preserve"> </w:t>
+      </w:r>
+      <w:r>
+        <w:rPr>
+          <w:rStyle w:val="VerbatimChar"/>
+        </w:rPr>
+        <w:t xml:space="preserve">rocprof-sys</w:t>
+      </w:r>
+      <w:r>
+        <w:t xml:space="preserve">:</w:t>
+      </w:r>
+      <w:r>
+        <w:t xml:space="preserve"> </w:t>
+      </w:r>
+      <w:r>
+        <w:t xml:space="preserve">-</w:t>
+      </w:r>
+      <w:r>
+        <w:t xml:space="preserve"> </w:t>
+      </w:r>
+      <w:r>
+        <w:rPr>
+          <w:rStyle w:val="VerbatimChar"/>
+        </w:rPr>
+        <w:t xml:space="preserve">rocprofv3 --kernel-trace --stats --output-format csv -- &lt;app&gt;</w:t>
+      </w:r>
+      <w:r>
+        <w:t xml:space="preserve"> </w:t>
+      </w:r>
+      <w:r>
+        <w:t xml:space="preserve">needs no instrumentation/rebuild step, and writes a</w:t>
+      </w:r>
+      <w:r>
+        <w:t xml:space="preserve"> </w:t>
+      </w:r>
+      <w:r>
+        <w:rPr>
+          <w:rStyle w:val="VerbatimChar"/>
+        </w:rPr>
+        <w:t xml:space="preserve">kernel_stats.csv</w:t>
+      </w:r>
+      <w:r>
+        <w:t xml:space="preserve"> </w:t>
+      </w:r>
+      <w:r>
+        <w:t xml:space="preserve">whose schema was confirmed directly from the tool’s source (</w:t>
+      </w:r>
+      <w:r>
+        <w:rPr>
+          <w:rStyle w:val="VerbatimChar"/>
+        </w:rPr>
+        <w:t xml:space="preserve">generateCSV.cpp</w:t>
+      </w:r>
+      <w:r>
+        <w:t xml:space="preserve">,</w:t>
+      </w:r>
+      <w:r>
+        <w:t xml:space="preserve"> </w:t>
+      </w:r>
+      <w:r>
+        <w:rPr>
+          <w:rStyle w:val="VerbatimChar"/>
+        </w:rPr>
+        <w:t xml:space="preserve">statistics.cpp</w:t>
+      </w:r>
+      <w:r>
+        <w:t xml:space="preserve">):</w:t>
+      </w:r>
+      <w:r>
+        <w:t xml:space="preserve"> </w:t>
+      </w:r>
+      <w:r>
+        <w:rPr>
+          <w:rStyle w:val="VerbatimChar"/>
+        </w:rPr>
+        <w:t xml:space="preserve">Name,Calls,TotalDurationNs,AverageNs,Percentage,MinNs,MaxNs,StdDev</w:t>
+      </w:r>
+      <w:r>
+        <w:t xml:space="preserve">. rocprofv3 also already aggregates by kernel name internally (confirmed in</w:t>
+      </w:r>
+      <w:r>
+        <w:t xml:space="preserve"> </w:t>
+      </w:r>
+      <w:r>
+        <w:rPr>
+          <w:rStyle w:val="VerbatimChar"/>
+        </w:rPr>
+        <w:t xml:space="preserve">generateStats.cpp</w:t>
+      </w:r>
+      <w:r>
+        <w:t xml:space="preserve">) — no per-file dedup needed on our end, unlike</w:t>
+      </w:r>
+      <w:r>
+        <w:t xml:space="preserve"> </w:t>
+      </w:r>
+      <w:r>
+        <w:rPr>
+          <w:rStyle w:val="VerbatimChar"/>
+        </w:rPr>
+        <w:t xml:space="preserve">rocprof-sys</w:t>
+      </w:r>
+      <w:r>
+        <w:t xml:space="preserve">’s hierarchical text tables.</w:t>
+      </w:r>
+      <w:r>
+        <w:t xml:space="preserve"> </w:t>
+      </w:r>
+      <w:r>
+        <w:t xml:space="preserve">- Its own default output format is</w:t>
+      </w:r>
+      <w:r>
+        <w:t xml:space="preserve"> </w:t>
+      </w:r>
+      <w:r>
+        <w:rPr>
+          <w:rStyle w:val="VerbatimChar"/>
+        </w:rPr>
+        <w:t xml:space="preserve">rocpd</w:t>
+      </w:r>
+      <w:r>
+        <w:t xml:space="preserve"> </w:t>
+      </w:r>
+      <w:r>
+        <w:t xml:space="preserve">(SQLite), not CSV —</w:t>
+      </w:r>
+      <w:r>
+        <w:t xml:space="preserve"> </w:t>
+      </w:r>
+      <w:r>
+        <w:rPr>
+          <w:rStyle w:val="VerbatimChar"/>
+        </w:rPr>
+        <w:t xml:space="preserve">--output-format csv</w:t>
+      </w:r>
+      <w:r>
+        <w:t xml:space="preserve"> </w:t>
+      </w:r>
+      <w:r>
+        <w:t xml:space="preserve">must always be passed explicitly, so the launcher hardcodes it rather than exposing it as an option.</w:t>
+      </w:r>
+      <w:r>
+        <w:t xml:space="preserve"> </w:t>
+      </w:r>
+      <w:r>
+        <w:t xml:space="preserve">- Default output path is</w:t>
+      </w:r>
+      <w:r>
+        <w:t xml:space="preserve"> </w:t>
+      </w:r>
+      <w:r>
+        <w:rPr>
+          <w:rStyle w:val="VerbatimChar"/>
+        </w:rPr>
+        <w:t xml:space="preserve">&lt;output_dir&gt;/&lt;hostname&gt;/&lt;pid&gt;_kernel_stats.csv</w:t>
+      </w:r>
+      <w:r>
+        <w:t xml:space="preserve"> </w:t>
+      </w:r>
+      <w:r>
+        <w:t xml:space="preserve">(PID-based naming avoids MPI-rank collisions the same way</w:t>
+      </w:r>
+      <w:r>
+        <w:t xml:space="preserve"> </w:t>
+      </w:r>
+      <w:r>
+        <w:rPr>
+          <w:rStyle w:val="VerbatimChar"/>
+        </w:rPr>
+        <w:t xml:space="preserve">rocprof-sys</w:t>
+      </w:r>
+      <w:r>
+        <w:t xml:space="preserve"> </w:t>
+      </w:r>
+      <w:r>
+        <w:t xml:space="preserve">does) — the extractor globs recursively (</w:t>
+      </w:r>
+      <w:r>
+        <w:rPr>
+          <w:rStyle w:val="VerbatimChar"/>
+        </w:rPr>
+        <w:t xml:space="preserve">&lt;output_dir&gt;/**/*_kernel_stats.csv</w:t>
+      </w:r>
+      <w:r>
+        <w:t xml:space="preserve">) to find these one level down.</w:t>
+      </w:r>
+      <w:r>
+        <w:t xml:space="preserve"> </w:t>
+      </w:r>
+      <w:r>
+        <w:t xml:space="preserve">- No</w:t>
+      </w:r>
+      <w:r>
+        <w:t xml:space="preserve"> </w:t>
+      </w:r>
+      <w:r>
+        <w:rPr>
+          <w:rStyle w:val="VerbatimChar"/>
+        </w:rPr>
+        <w:t xml:space="preserve">metadata.json</w:t>
+      </w:r>
+      <w:r>
+        <w:t xml:space="preserve">-equivalent exists for ROCm 7.0.2 — the one candidate (</w:t>
+      </w:r>
+      <w:r>
+        <w:rPr>
+          <w:rStyle w:val="VerbatimChar"/>
+        </w:rPr>
+        <w:t xml:space="preserve">--output-config</w:t>
+      </w:r>
+      <w:r>
+        <w:t xml:space="preserve"> </w:t>
+      </w:r>
+      <w:r>
+        <w:t xml:space="preserve">→</w:t>
+      </w:r>
+      <w:r>
+        <w:t xml:space="preserve"> </w:t>
+      </w:r>
+      <w:r>
+        <w:rPr>
+          <w:rStyle w:val="VerbatimChar"/>
+        </w:rPr>
+        <w:t xml:space="preserve">&lt;pid&gt;_config.json</w:t>
+      </w:r>
+      <w:r>
+        <w:t xml:space="preserve">) is a post-7.0.2 addition, confirmed absent from the 7.0.2-tagged docs. The header’s executable/run-datetime/total-runtime fields therefore stay blank on 7.0.2 in practice; only the MPI-rank-count fallback (distinct PIDs among scanned filenames) is reliable regardless of version.</w:t>
+      </w:r>
+    </w:p>
+    <w:p>
+      <w:pPr>
+        <w:pStyle w:val="BodyText"/>
+      </w:pPr>
+      <w:r>
+        <w:t xml:space="preserve">Two pieces, mirroring tool 1’s shape for a consistent tool family:</w:t>
+      </w:r>
+      <w:r>
+        <w:t xml:space="preserve"> </w:t>
+      </w:r>
+      <w:r>
+        <w:t xml:space="preserve">-</w:t>
+      </w:r>
+      <w:r>
+        <w:t xml:space="preserve"> </w:t>
+      </w:r>
+      <w:r>
+        <w:rPr>
+          <w:rStyle w:val="VerbatimChar"/>
+        </w:rPr>
+        <w:t xml:space="preserve">postprocess/rocprofv3_hotspots.py</w:t>
+      </w:r>
+      <w:r>
+        <w:t xml:space="preserve"> </w:t>
+      </w:r>
+      <w:r>
+        <w:t xml:space="preserve">— standalone Python 3 (stdlib only) extractor. Recursively finds</w:t>
+      </w:r>
+      <w:r>
+        <w:t xml:space="preserve"> </w:t>
+      </w:r>
+      <w:r>
+        <w:rPr>
+          <w:rStyle w:val="VerbatimChar"/>
+        </w:rPr>
+        <w:t xml:space="preserve">*_kernel_stats.csv</w:t>
+      </w:r>
+      <w:r>
+        <w:t xml:space="preserve">, aggregates by kernel name across however many files it finds, recomputes a global</w:t>
+      </w:r>
+      <w:r>
+        <w:t xml:space="preserve"> </w:t>
+      </w:r>
+      <w:r>
+        <w:rPr>
+          <w:rStyle w:val="VerbatimChar"/>
+        </w:rPr>
+        <w:t xml:space="preserve">%total</w:t>
+      </w:r>
+      <w:r>
+        <w:t xml:space="preserve"> </w:t>
+      </w:r>
+      <w:r>
+        <w:t xml:space="preserve">(sum of that kernel’s</w:t>
+      </w:r>
+      <w:r>
+        <w:t xml:space="preserve"> </w:t>
+      </w:r>
+      <w:r>
+        <w:rPr>
+          <w:rStyle w:val="VerbatimChar"/>
+        </w:rPr>
+        <w:t xml:space="preserve">TotalDurationNs</w:t>
+      </w:r>
+      <w:r>
+        <w:t xml:space="preserve"> </w:t>
+      </w:r>
+      <w:r>
+        <w:t xml:space="preserve">across files, divided by the sum of every row’s</w:t>
+      </w:r>
+      <w:r>
+        <w:t xml:space="preserve"> </w:t>
+      </w:r>
+      <w:r>
+        <w:rPr>
+          <w:rStyle w:val="VerbatimChar"/>
+        </w:rPr>
+        <w:t xml:space="preserve">TotalDurationNs</w:t>
+      </w:r>
+      <w:r>
+        <w:t xml:space="preserve"> </w:t>
+      </w:r>
+      <w:r>
+        <w:t xml:space="preserve">across every file — no root-detection ambiguity here, since</w:t>
+      </w:r>
+      <w:r>
+        <w:t xml:space="preserve"> </w:t>
+      </w:r>
+      <w:r>
+        <w:rPr>
+          <w:rStyle w:val="VerbatimChar"/>
+        </w:rPr>
+        <w:t xml:space="preserve">kernel_stats.csv</w:t>
+      </w:r>
+      <w:r>
+        <w:t xml:space="preserve"> </w:t>
+      </w:r>
+      <w:r>
+        <w:t xml:space="preserve">has no call-stack hierarchy at all) and a recomputed per-call average, and writes a single-table</w:t>
+      </w:r>
+      <w:r>
+        <w:t xml:space="preserve"> </w:t>
+      </w:r>
+      <w:r>
+        <w:rPr>
+          <w:rStyle w:val="VerbatimChar"/>
+        </w:rPr>
+        <w:t xml:space="preserve">hotspots.txt</w:t>
+      </w:r>
+      <w:r>
+        <w:t xml:space="preserve"> </w:t>
+      </w:r>
+      <w:r>
+        <w:t xml:space="preserve">(no CPU/GPU split needed — this tool is GPU-kernel-only by design). Same</w:t>
+      </w:r>
+      <w:r>
+        <w:t xml:space="preserve"> </w:t>
+      </w:r>
+      <w:r>
+        <w:rPr>
+          <w:rStyle w:val="VerbatimChar"/>
+        </w:rPr>
+        <w:t xml:space="preserve">-n/--top | --threshold | --all</w:t>
+      </w:r>
+      <w:r>
+        <w:t xml:space="preserve"> </w:t>
+      </w:r>
+      <w:r>
+        <w:t xml:space="preserve">selection modes as tool 1, duplicated rather than shared, since each extractor is meant to stand alone.</w:t>
+      </w:r>
+      <w:r>
+        <w:t xml:space="preserve"> </w:t>
+      </w:r>
+      <w:r>
+        <w:t xml:space="preserve">-</w:t>
+      </w:r>
+      <w:r>
+        <w:t xml:space="preserve"> </w:t>
+      </w:r>
+      <w:r>
+        <w:rPr>
+          <w:rStyle w:val="VerbatimChar"/>
+        </w:rPr>
+        <w:t xml:space="preserve">scripts/rocprofv3_profile.sh</w:t>
+      </w:r>
+      <w:r>
+        <w:t xml:space="preserve"> </w:t>
+      </w:r>
+      <w:r>
+        <w:t xml:space="preserve">— bash launcher wrapping</w:t>
+      </w:r>
+      <w:r>
+        <w:t xml:space="preserve"> </w:t>
+      </w:r>
+      <w:r>
+        <w:rPr>
+          <w:rStyle w:val="VerbatimChar"/>
+        </w:rPr>
+        <w:t xml:space="preserve">rocprofv3</w:t>
+      </w:r>
+      <w:r>
+        <w:t xml:space="preserve"> </w:t>
+      </w:r>
+      <w:r>
+        <w:t xml:space="preserve">with</w:t>
+      </w:r>
+      <w:r>
+        <w:t xml:space="preserve"> </w:t>
+      </w:r>
+      <w:r>
+        <w:rPr>
+          <w:rStyle w:val="VerbatimChar"/>
+        </w:rPr>
+        <w:t xml:space="preserve">--kernel-trace --stats --summary --truncate-kernels --output-format csv</w:t>
+      </w:r>
+      <w:r>
+        <w:t xml:space="preserve"> </w:t>
+      </w:r>
+      <w:r>
+        <w:t xml:space="preserve">and auto-invoking the extractor afterward, using the same MPI pattern and rank-0-only summary gating as tool 1’s launcher.</w:t>
+      </w:r>
+    </w:p>
+    <w:p>
+      <w:pPr>
+        <w:pStyle w:val="BodyText"/>
+      </w:pPr>
+      <w:r>
+        <w:t xml:space="preserve">Also updated tool 1’s footer note (</w:t>
+      </w:r>
+      <w:r>
+        <w:rPr>
+          <w:rStyle w:val="VerbatimChar"/>
+        </w:rPr>
+        <w:t xml:space="preserve">postprocess/rocprof_sys_hotspots.py</w:t>
+      </w:r>
+      <w:r>
+        <w:t xml:space="preserve">, plus its checked-in sample</w:t>
+      </w:r>
+      <w:r>
+        <w:t xml:space="preserve"> </w:t>
+      </w:r>
+      <w:r>
+        <w:rPr>
+          <w:rStyle w:val="VerbatimChar"/>
+        </w:rPr>
+        <w:t xml:space="preserve">hotspots.txt</w:t>
+      </w:r>
+      <w:r>
+        <w:t xml:space="preserve"> </w:t>
+      </w:r>
+      <w:r>
+        <w:t xml:space="preserve">fixtures and the corresponding test assertion) to point at</w:t>
+      </w:r>
+      <w:r>
+        <w:t xml:space="preserve"> </w:t>
+      </w:r>
+      <w:r>
+        <w:rPr>
+          <w:rStyle w:val="VerbatimChar"/>
+        </w:rPr>
+        <w:t xml:space="preserve">scripts/rocprofv3_profile.sh</w:t>
+      </w:r>
+      <w:r>
+        <w:t xml:space="preserve"> </w:t>
+      </w:r>
+      <w:r>
+        <w:t xml:space="preserve">now that it exists, instead of a raw</w:t>
+      </w:r>
+      <w:r>
+        <w:t xml:space="preserve"> </w:t>
+      </w:r>
+      <w:r>
+        <w:rPr>
+          <w:rStyle w:val="VerbatimChar"/>
+        </w:rPr>
+        <w:t xml:space="preserve">rocprofv3</w:t>
+      </w:r>
+      <w:r>
+        <w:t xml:space="preserve"> </w:t>
+      </w:r>
+      <w:r>
+        <w:t xml:space="preserve">command line.</w:t>
+      </w:r>
+    </w:p>
+    <w:p>
+      <w:pPr>
+        <w:pStyle w:val="BodyText"/>
+      </w:pPr>
+      <w:r>
+        <w:t xml:space="preserve">Verified locally (no ROCm/GPU available, same constraint as tool 1):</w:t>
+      </w:r>
+      <w:r>
+        <w:t xml:space="preserve"> </w:t>
+      </w:r>
+      <w:r>
+        <w:rPr>
+          <w:rStyle w:val="VerbatimChar"/>
+        </w:rPr>
+        <w:t xml:space="preserve">python3 -m unittest</w:t>
+      </w:r>
+      <w:r>
+        <w:t xml:space="preserve"> </w:t>
+      </w:r>
+      <w:r>
+        <w:t xml:space="preserve">against new hand-crafted fixtures under</w:t>
+      </w:r>
+      <w:r>
+        <w:t xml:space="preserve"> </w:t>
+      </w:r>
+      <w:r>
+        <w:rPr>
+          <w:rStyle w:val="VerbatimChar"/>
+        </w:rPr>
+        <w:t xml:space="preserve">postprocess/tests/fixtures/rocprofv3_*</w:t>
+      </w:r>
+      <w:r>
+        <w:t xml:space="preserve"> </w:t>
+      </w:r>
+      <w:r>
+        <w:t xml:space="preserve">(22 new tests; 55 total across both tools), including one row with scientific-notation values to exercise float parsing, and a</w:t>
+      </w:r>
+      <w:r>
+        <w:t xml:space="preserve"> </w:t>
+      </w:r>
+      <w:r>
+        <w:rPr>
+          <w:rStyle w:val="VerbatimChar"/>
+        </w:rPr>
+        <w:t xml:space="preserve">&lt;pid&gt;_config.json</w:t>
+      </w:r>
+      <w:r>
+        <w:t xml:space="preserve"> </w:t>
+      </w:r>
+      <w:r>
+        <w:t xml:space="preserve">fixture (with one directly-keyed and one nested-under-an-object field) to test the header-guessing path.</w:t>
+      </w:r>
+      <w:r>
+        <w:t xml:space="preserve"> </w:t>
+      </w:r>
+      <w:r>
+        <w:rPr>
+          <w:rStyle w:val="VerbatimChar"/>
+        </w:rPr>
+        <w:t xml:space="preserve">bash -n</w:t>
+      </w:r>
+      <w:r>
+        <w:t xml:space="preserve"> </w:t>
+      </w:r>
+      <w:r>
+        <w:t xml:space="preserve">on the launcher (shellcheck still not installed here). Manual verification used a stubbed</w:t>
+      </w:r>
+      <w:r>
+        <w:t xml:space="preserve"> </w:t>
+      </w:r>
+      <w:r>
+        <w:rPr>
+          <w:rStyle w:val="VerbatimChar"/>
+        </w:rPr>
+        <w:t xml:space="preserve">rocprofv3</w:t>
+      </w:r>
+      <w:r>
+        <w:t xml:space="preserve"> </w:t>
+      </w:r>
+      <w:r>
+        <w:t xml:space="preserve">on</w:t>
+      </w:r>
+      <w:r>
+        <w:t xml:space="preserve"> </w:t>
+      </w:r>
+      <w:r>
+        <w:rPr>
+          <w:rStyle w:val="VerbatimChar"/>
+        </w:rPr>
+        <w:t xml:space="preserve">PATH</w:t>
+      </w:r>
+      <w:r>
+        <w:t xml:space="preserve"> </w:t>
+      </w:r>
+      <w:r>
+        <w:t xml:space="preserve">(same technique as tool 1) to confirm the missing-dependency error, dry-run command construction (</w:t>
+      </w:r>
+      <w:r>
+        <w:rPr>
+          <w:rStyle w:val="VerbatimChar"/>
+        </w:rPr>
+        <w:t xml:space="preserve">--output-format csv</w:t>
+      </w:r>
+      <w:r>
+        <w:t xml:space="preserve"> </w:t>
+      </w:r>
+      <w:r>
+        <w:t xml:space="preserve">always present), a full run producing a real</w:t>
+      </w:r>
+      <w:r>
+        <w:t xml:space="preserve"> </w:t>
+      </w:r>
+      <w:r>
+        <w:rPr>
+          <w:rStyle w:val="VerbatimChar"/>
+        </w:rPr>
+        <w:t xml:space="preserve">hotspots.txt</w:t>
+      </w:r>
+      <w:r>
+        <w:t xml:space="preserve"> </w:t>
+      </w:r>
+      <w:r>
+        <w:t xml:space="preserve">from copied fixture data, and rank-0-only summary gating under a simulated</w:t>
+      </w:r>
+      <w:r>
+        <w:t xml:space="preserve"> </w:t>
+      </w:r>
+      <w:r>
+        <w:rPr>
+          <w:rStyle w:val="VerbatimChar"/>
+        </w:rPr>
+        <w:t xml:space="preserve">OMPI_COMM_WORLD_RANK=1</w:t>
+      </w:r>
+      <w:r>
+        <w:t xml:space="preserve">. Real end-to-end validation against actual</w:t>
+      </w:r>
+      <w:r>
+        <w:t xml:space="preserve"> </w:t>
+      </w:r>
+      <w:r>
+        <w:rPr>
+          <w:rStyle w:val="VerbatimChar"/>
+        </w:rPr>
+        <w:t xml:space="preserve">rocprofv3</w:t>
+      </w:r>
+      <w:r>
+        <w:t xml:space="preserve"> </w:t>
+      </w:r>
+      <w:r>
+        <w:t xml:space="preserve">output is left to the user on the HPC system.</w:t>
+      </w:r>
+    </w:p>
+    <w:bookmarkEnd w:id="25"/>
+    <w:bookmarkEnd w:id="26"/>
     <w:sectPr/>
   </w:body>
 </w:document>

</xml_diff>

<commit_message>
Rename tools to beginner-friendly names, add plain-language -h/--help
Names now describe what each tool does, not which AMD tool sits behind it
(that stays in code comments): rocprof_sys_profile.sh -> profile_CPU_hotspots.sh,
rocprofv3_profile.sh -> profile_GPU_hotspots.sh, rocprof_combined_profile.sh ->
profile_hotspots.sh, and the matching postprocess/extract_*.py + test files.

-h/--help on every tool now leads with a short, jargon-free explanation of
its purpose and main limitation, written for someone who's never heard of
rocprof-sys/rocprofv3, ahead of the existing options table.
</commit_message>
<xml_diff>
--- a/docs/DEVELOPMENT_HISTORY.docx
+++ b/docs/DEVELOPMENT_HISTORY.docx
@@ -10,7 +10,7 @@
         <w:t xml:space="preserve">Development History</w:t>
       </w:r>
     </w:p>
-    <w:bookmarkStart w:id="28" w:name="development-history"/>
+    <w:bookmarkStart w:id="29" w:name="development-history"/>
     <w:p>
       <w:pPr>
         <w:pStyle w:val="Heading1"/>
@@ -204,6 +204,32 @@
           </w:p>
         </w:tc>
       </w:tr>
+      <w:tr>
+        <w:tc>
+          <w:tcPr/>
+          <w:p>
+            <w:pPr>
+              <w:pStyle w:val="Compact"/>
+              <w:jc w:val="left"/>
+            </w:pPr>
+            <w:r>
+              <w:t xml:space="preserve">2026-07-31</w:t>
+            </w:r>
+          </w:p>
+        </w:tc>
+        <w:tc>
+          <w:tcPr/>
+          <w:p>
+            <w:pPr>
+              <w:pStyle w:val="Compact"/>
+              <w:jc w:val="left"/>
+            </w:pPr>
+            <w:r>
+              <w:t xml:space="preserve">Renamed all six tools to beginner-friendly names; added plain-language -h/–help text</w:t>
+            </w:r>
+          </w:p>
+        </w:tc>
+      </w:tr>
     </w:tbl>
     <w:bookmarkStart w:id="20" w:name="project-scaffolding-and-rules"/>
     <w:p>
@@ -2918,7 +2944,566 @@
       </w:r>
     </w:p>
     <w:bookmarkEnd w:id="27"/>
+    <w:bookmarkStart w:id="28" w:name="X7e06147c8b016c16dbe9f3a1131e3ec37dda633"/>
+    <w:p>
+      <w:pPr>
+        <w:pStyle w:val="Heading2"/>
+      </w:pPr>
+      <w:r>
+        <w:t xml:space="preserve">2026-07-31 — Renamed all six tools to beginner-friendly names; plain-language help text</w:t>
+      </w:r>
+    </w:p>
+    <w:p>
+      <w:pPr>
+        <w:pStyle w:val="FirstParagraph"/>
+      </w:pPr>
+      <w:r>
+        <w:t xml:space="preserve">Two small follow-up requests, no plan needed:</w:t>
+      </w:r>
+    </w:p>
+    <w:p>
+      <w:pPr>
+        <w:numPr>
+          <w:ilvl w:val="0"/>
+          <w:numId w:val="1003"/>
+        </w:numPr>
+        <w:pStyle w:val="Compact"/>
+      </w:pPr>
+      <w:r>
+        <w:rPr>
+          <w:bCs/>
+          <w:b/>
+        </w:rPr>
+        <w:t xml:space="preserve">Renamed every tool file so its name describes what it does, not which AMD tool sits behind it</w:t>
+      </w:r>
+      <w:r>
+        <w:t xml:space="preserve"> </w:t>
+      </w:r>
+      <w:r>
+        <w:t xml:space="preserve">(the AMD tool name stays in code comments, not in the name or the user-facing output):</w:t>
+      </w:r>
+      <w:r>
+        <w:t xml:space="preserve"> </w:t>
+      </w:r>
+      <w:r>
+        <w:rPr>
+          <w:rStyle w:val="VerbatimChar"/>
+        </w:rPr>
+        <w:t xml:space="preserve">rocprof_sys_profile.sh</w:t>
+      </w:r>
+      <w:r>
+        <w:t xml:space="preserve"> </w:t>
+      </w:r>
+      <w:r>
+        <w:t xml:space="preserve">→</w:t>
+      </w:r>
+      <w:r>
+        <w:t xml:space="preserve"> </w:t>
+      </w:r>
+      <w:r>
+        <w:rPr>
+          <w:rStyle w:val="VerbatimChar"/>
+        </w:rPr>
+        <w:t xml:space="preserve">scripts/profile_CPU_hotspots.sh</w:t>
+      </w:r>
+      <w:r>
+        <w:t xml:space="preserve">,</w:t>
+      </w:r>
+      <w:r>
+        <w:t xml:space="preserve"> </w:t>
+      </w:r>
+      <w:r>
+        <w:rPr>
+          <w:rStyle w:val="VerbatimChar"/>
+        </w:rPr>
+        <w:t xml:space="preserve">rocprofv3_profile.sh</w:t>
+      </w:r>
+      <w:r>
+        <w:t xml:space="preserve"> </w:t>
+      </w:r>
+      <w:r>
+        <w:t xml:space="preserve">→</w:t>
+      </w:r>
+      <w:r>
+        <w:t xml:space="preserve"> </w:t>
+      </w:r>
+      <w:r>
+        <w:rPr>
+          <w:rStyle w:val="VerbatimChar"/>
+        </w:rPr>
+        <w:t xml:space="preserve">scripts/profile_GPU_hotspots.sh</w:t>
+      </w:r>
+      <w:r>
+        <w:t xml:space="preserve">,</w:t>
+      </w:r>
+      <w:r>
+        <w:t xml:space="preserve"> </w:t>
+      </w:r>
+      <w:r>
+        <w:rPr>
+          <w:rStyle w:val="VerbatimChar"/>
+        </w:rPr>
+        <w:t xml:space="preserve">rocprof_combined_profile.sh</w:t>
+      </w:r>
+      <w:r>
+        <w:t xml:space="preserve"> </w:t>
+      </w:r>
+      <w:r>
+        <w:t xml:space="preserve">→</w:t>
+      </w:r>
+      <w:r>
+        <w:t xml:space="preserve"> </w:t>
+      </w:r>
+      <w:r>
+        <w:rPr>
+          <w:rStyle w:val="VerbatimChar"/>
+        </w:rPr>
+        <w:t xml:space="preserve">scripts/profile_hotspots.sh</w:t>
+      </w:r>
+      <w:r>
+        <w:t xml:space="preserve">,</w:t>
+      </w:r>
+      <w:r>
+        <w:t xml:space="preserve"> </w:t>
+      </w:r>
+      <w:r>
+        <w:rPr>
+          <w:rStyle w:val="VerbatimChar"/>
+        </w:rPr>
+        <w:t xml:space="preserve">rocprof_sys_hotspots.py</w:t>
+      </w:r>
+      <w:r>
+        <w:t xml:space="preserve"> </w:t>
+      </w:r>
+      <w:r>
+        <w:t xml:space="preserve">→</w:t>
+      </w:r>
+      <w:r>
+        <w:t xml:space="preserve"> </w:t>
+      </w:r>
+      <w:r>
+        <w:rPr>
+          <w:rStyle w:val="VerbatimChar"/>
+        </w:rPr>
+        <w:t xml:space="preserve">postprocess/extract_CPU_hotspots.py</w:t>
+      </w:r>
+      <w:r>
+        <w:t xml:space="preserve">,</w:t>
+      </w:r>
+      <w:r>
+        <w:t xml:space="preserve"> </w:t>
+      </w:r>
+      <w:r>
+        <w:rPr>
+          <w:rStyle w:val="VerbatimChar"/>
+        </w:rPr>
+        <w:t xml:space="preserve">rocprofv3_hotspots.py</w:t>
+      </w:r>
+      <w:r>
+        <w:t xml:space="preserve"> </w:t>
+      </w:r>
+      <w:r>
+        <w:t xml:space="preserve">→</w:t>
+      </w:r>
+      <w:r>
+        <w:t xml:space="preserve"> </w:t>
+      </w:r>
+      <w:r>
+        <w:rPr>
+          <w:rStyle w:val="VerbatimChar"/>
+        </w:rPr>
+        <w:t xml:space="preserve">postprocess/extract_GPU_hotspots.py</w:t>
+      </w:r>
+      <w:r>
+        <w:t xml:space="preserve">,</w:t>
+      </w:r>
+      <w:r>
+        <w:t xml:space="preserve"> </w:t>
+      </w:r>
+      <w:r>
+        <w:rPr>
+          <w:rStyle w:val="VerbatimChar"/>
+        </w:rPr>
+        <w:t xml:space="preserve">rocprof_combined_hotspots.py</w:t>
+      </w:r>
+      <w:r>
+        <w:t xml:space="preserve"> </w:t>
+      </w:r>
+      <w:r>
+        <w:t xml:space="preserve">→</w:t>
+      </w:r>
+      <w:r>
+        <w:t xml:space="preserve"> </w:t>
+      </w:r>
+      <w:r>
+        <w:rPr>
+          <w:rStyle w:val="VerbatimChar"/>
+        </w:rPr>
+        <w:t xml:space="preserve">postprocess/extract_hotspots.py</w:t>
+      </w:r>
+      <w:r>
+        <w:t xml:space="preserve"> </w:t>
+      </w:r>
+      <w:r>
+        <w:t xml:space="preserve">(plus the matching</w:t>
+      </w:r>
+      <w:r>
+        <w:t xml:space="preserve"> </w:t>
+      </w:r>
+      <w:r>
+        <w:rPr>
+          <w:rStyle w:val="VerbatimChar"/>
+        </w:rPr>
+        <w:t xml:space="preserve">test_*.py</w:t>
+      </w:r>
+      <w:r>
+        <w:t xml:space="preserve"> </w:t>
+      </w:r>
+      <w:r>
+        <w:t xml:space="preserve">files). Every internal cross-reference was updated to match:</w:t>
+      </w:r>
+      <w:r>
+        <w:t xml:space="preserve"> </w:t>
+      </w:r>
+      <w:r>
+        <w:rPr>
+          <w:rStyle w:val="VerbatimChar"/>
+        </w:rPr>
+        <w:t xml:space="preserve">EXTRACTOR</w:t>
+      </w:r>
+      <w:r>
+        <w:t xml:space="preserve">/</w:t>
+      </w:r>
+      <w:r>
+        <w:rPr>
+          <w:rStyle w:val="VerbatimChar"/>
+        </w:rPr>
+        <w:t xml:space="preserve">CPU_LAUNCHER</w:t>
+      </w:r>
+      <w:r>
+        <w:t xml:space="preserve">/</w:t>
+      </w:r>
+      <w:r>
+        <w:rPr>
+          <w:rStyle w:val="VerbatimChar"/>
+        </w:rPr>
+        <w:t xml:space="preserve">GPU_LAUNCHER</w:t>
+      </w:r>
+      <w:r>
+        <w:t xml:space="preserve"> </w:t>
+      </w:r>
+      <w:r>
+        <w:t xml:space="preserve">path variables in the shell scripts, the combined extractor’s</w:t>
+      </w:r>
+      <w:r>
+        <w:t xml:space="preserve"> </w:t>
+      </w:r>
+      <w:r>
+        <w:rPr>
+          <w:rStyle w:val="VerbatimChar"/>
+        </w:rPr>
+        <w:t xml:space="preserve">import extract_CPU_hotspots as cpu_tool</w:t>
+      </w:r>
+      <w:r>
+        <w:t xml:space="preserve">/</w:t>
+      </w:r>
+      <w:r>
+        <w:rPr>
+          <w:rStyle w:val="VerbatimChar"/>
+        </w:rPr>
+        <w:t xml:space="preserve">import extract_GPU_hotspots as gpu_tool</w:t>
+      </w:r>
+      <w:r>
+        <w:t xml:space="preserve"> </w:t>
+      </w:r>
+      <w:r>
+        <w:t xml:space="preserve">(previously</w:t>
+      </w:r>
+      <w:r>
+        <w:t xml:space="preserve"> </w:t>
+      </w:r>
+      <w:r>
+        <w:rPr>
+          <w:rStyle w:val="VerbatimChar"/>
+        </w:rPr>
+        <w:t xml:space="preserve">rocprof_sys_hotspots</w:t>
+      </w:r>
+      <w:r>
+        <w:t xml:space="preserve">/</w:t>
+      </w:r>
+      <w:r>
+        <w:rPr>
+          <w:rStyle w:val="VerbatimChar"/>
+        </w:rPr>
+        <w:t xml:space="preserve">rocprofv3_hotspots</w:t>
+      </w:r>
+      <w:r>
+        <w:t xml:space="preserve">), footer cross-references between the CPU and GPU tools, and the four already-committed sample</w:t>
+      </w:r>
+      <w:r>
+        <w:t xml:space="preserve"> </w:t>
+      </w:r>
+      <w:r>
+        <w:rPr>
+          <w:rStyle w:val="VerbatimChar"/>
+        </w:rPr>
+        <w:t xml:space="preserve">hotspots.txt</w:t>
+      </w:r>
+      <w:r>
+        <w:t xml:space="preserve"> </w:t>
+      </w:r>
+      <w:r>
+        <w:t xml:space="preserve">fixtures (regenerated so their footer text matches the renamed scripts they now point at).</w:t>
+      </w:r>
+      <w:r>
+        <w:t xml:space="preserve"> </w:t>
+      </w:r>
+      <w:r>
+        <w:rPr>
+          <w:rStyle w:val="VerbatimChar"/>
+        </w:rPr>
+        <w:t xml:space="preserve">docs/plans/01-03</w:t>
+      </w:r>
+      <w:r>
+        <w:t xml:space="preserve"> </w:t>
+      </w:r>
+      <w:r>
+        <w:t xml:space="preserve">and earlier</w:t>
+      </w:r>
+      <w:r>
+        <w:t xml:space="preserve"> </w:t>
+      </w:r>
+      <w:r>
+        <w:rPr>
+          <w:rStyle w:val="VerbatimChar"/>
+        </w:rPr>
+        <w:t xml:space="preserve">DEVELOPMENT_HISTORY.md</w:t>
+      </w:r>
+      <w:r>
+        <w:t xml:space="preserve"> </w:t>
+      </w:r>
+      <w:r>
+        <w:t xml:space="preserve">entries above were deliberately left untouched — they’re historical records of what the tools were named at the time, not living documentation.</w:t>
+      </w:r>
+    </w:p>
+    <w:p>
+      <w:pPr>
+        <w:numPr>
+          <w:ilvl w:val="0"/>
+          <w:numId w:val="1003"/>
+        </w:numPr>
+        <w:pStyle w:val="Compact"/>
+      </w:pPr>
+      <w:r>
+        <w:rPr>
+          <w:rStyle w:val="VerbatimChar"/>
+          <w:bCs/>
+          <w:b/>
+        </w:rPr>
+        <w:t xml:space="preserve">-h</w:t>
+      </w:r>
+      <w:r>
+        <w:rPr>
+          <w:bCs/>
+          <w:b/>
+        </w:rPr>
+        <w:t xml:space="preserve">/</w:t>
+      </w:r>
+      <w:r>
+        <w:rPr>
+          <w:rStyle w:val="VerbatimChar"/>
+          <w:bCs/>
+          <w:b/>
+        </w:rPr>
+        <w:t xml:space="preserve">--help</w:t>
+      </w:r>
+      <w:r>
+        <w:rPr>
+          <w:bCs/>
+          <w:b/>
+        </w:rPr>
+        <w:t xml:space="preserve"> </w:t>
+      </w:r>
+      <w:r>
+        <w:rPr>
+          <w:bCs/>
+          <w:b/>
+        </w:rPr>
+        <w:t xml:space="preserve">on every tool now leads with a short (~10-15 line), jargon-free explanation</w:t>
+      </w:r>
+      <w:r>
+        <w:t xml:space="preserve"> </w:t>
+      </w:r>
+      <w:r>
+        <w:t xml:space="preserve">of what it does and its main limitation, written for someone who’s never heard of</w:t>
+      </w:r>
+      <w:r>
+        <w:t xml:space="preserve"> </w:t>
+      </w:r>
+      <w:r>
+        <w:rPr>
+          <w:rStyle w:val="VerbatimChar"/>
+        </w:rPr>
+        <w:t xml:space="preserve">rocprof-sys</w:t>
+      </w:r>
+      <w:r>
+        <w:t xml:space="preserve">/</w:t>
+      </w:r>
+      <w:r>
+        <w:rPr>
+          <w:rStyle w:val="VerbatimChar"/>
+        </w:rPr>
+        <w:t xml:space="preserve">rocprofv3</w:t>
+      </w:r>
+      <w:r>
+        <w:t xml:space="preserve"> </w:t>
+      </w:r>
+      <w:r>
+        <w:t xml:space="preserve">— before the existing options table, which is unchanged. For the three bash launchers this is a new paragraph prepended to their existing</w:t>
+      </w:r>
+      <w:r>
+        <w:t xml:space="preserve"> </w:t>
+      </w:r>
+      <w:r>
+        <w:rPr>
+          <w:rStyle w:val="VerbatimChar"/>
+        </w:rPr>
+        <w:t xml:space="preserve">usage()</w:t>
+      </w:r>
+      <w:r>
+        <w:t xml:space="preserve"> </w:t>
+      </w:r>
+      <w:r>
+        <w:t xml:space="preserve">heredoc. For the three Python extractors, added a new</w:t>
+      </w:r>
+      <w:r>
+        <w:t xml:space="preserve"> </w:t>
+      </w:r>
+      <w:r>
+        <w:rPr>
+          <w:rStyle w:val="VerbatimChar"/>
+        </w:rPr>
+        <w:t xml:space="preserve">HELP_BLURB</w:t>
+      </w:r>
+      <w:r>
+        <w:t xml:space="preserve"> </w:t>
+      </w:r>
+      <w:r>
+        <w:t xml:space="preserve">module constant passed as argparse’s</w:t>
+      </w:r>
+      <w:r>
+        <w:t xml:space="preserve"> </w:t>
+      </w:r>
+      <w:r>
+        <w:rPr>
+          <w:rStyle w:val="VerbatimChar"/>
+        </w:rPr>
+        <w:t xml:space="preserve">description</w:t>
+      </w:r>
+      <w:r>
+        <w:t xml:space="preserve"> </w:t>
+      </w:r>
+      <w:r>
+        <w:t xml:space="preserve">(with</w:t>
+      </w:r>
+      <w:r>
+        <w:t xml:space="preserve"> </w:t>
+      </w:r>
+      <w:r>
+        <w:rPr>
+          <w:rStyle w:val="VerbatimChar"/>
+        </w:rPr>
+        <w:t xml:space="preserve">formatter_class=argparse.RawDescriptionHelpFormatter</w:t>
+      </w:r>
+      <w:r>
+        <w:t xml:space="preserve"> </w:t>
+      </w:r>
+      <w:r>
+        <w:t xml:space="preserve">so its line breaks render as written) instead of reusing the module docstring — the original, more technical docstring stays in place as a code comment for future maintainers, per the same</w:t>
+      </w:r>
+      <w:r>
+        <w:t xml:space="preserve"> </w:t>
+      </w:r>
+      <w:r>
+        <w:t xml:space="preserve">“</w:t>
+      </w:r>
+      <w:r>
+        <w:t xml:space="preserve">AMD/technical detail stays in comments, not user-facing text</w:t>
+      </w:r>
+      <w:r>
+        <w:t xml:space="preserve">”</w:t>
+      </w:r>
+      <w:r>
+        <w:t xml:space="preserve"> </w:t>
+      </w:r>
+      <w:r>
+        <w:t xml:space="preserve">principle as the renaming above.</w:t>
+      </w:r>
+    </w:p>
+    <w:p>
+      <w:pPr>
+        <w:pStyle w:val="FirstParagraph"/>
+      </w:pPr>
+      <w:r>
+        <w:t xml:space="preserve">Verified: full existing test suite (68 tests, unchanged) still passes after the rename;</w:t>
+      </w:r>
+      <w:r>
+        <w:t xml:space="preserve"> </w:t>
+      </w:r>
+      <w:r>
+        <w:rPr>
+          <w:rStyle w:val="VerbatimChar"/>
+        </w:rPr>
+        <w:t xml:space="preserve">bash -n</w:t>
+      </w:r>
+      <w:r>
+        <w:t xml:space="preserve"> </w:t>
+      </w:r>
+      <w:r>
+        <w:t xml:space="preserve">on all three renamed launchers; manually rendered all six tools’</w:t>
+      </w:r>
+      <w:r>
+        <w:t xml:space="preserve"> </w:t>
+      </w:r>
+      <w:r>
+        <w:rPr>
+          <w:rStyle w:val="VerbatimChar"/>
+        </w:rPr>
+        <w:t xml:space="preserve">-h</w:t>
+      </w:r>
+      <w:r>
+        <w:t xml:space="preserve">/</w:t>
+      </w:r>
+      <w:r>
+        <w:rPr>
+          <w:rStyle w:val="VerbatimChar"/>
+        </w:rPr>
+        <w:t xml:space="preserve">--help</w:t>
+      </w:r>
+      <w:r>
+        <w:t xml:space="preserve"> </w:t>
+      </w:r>
+      <w:r>
+        <w:t xml:space="preserve">output and read them as a first-time user would; re-ran the same stubbed-tool dry-run/full-run/abort/rank-gating checks used for tools 1-3 against the renamed</w:t>
+      </w:r>
+      <w:r>
+        <w:t xml:space="preserve"> </w:t>
+      </w:r>
+      <w:r>
+        <w:rPr>
+          <w:rStyle w:val="VerbatimChar"/>
+        </w:rPr>
+        <w:t xml:space="preserve">profile_hotspots.sh</w:t>
+      </w:r>
+      <w:r>
+        <w:t xml:space="preserve"> </w:t>
+      </w:r>
+      <w:r>
+        <w:t xml:space="preserve">to confirm the rename didn’t silently break the sub-launcher call chain; grepped the whole repo for leftover old filenames outside the historical docs (none found after regenerating the four sample fixtures).</w:t>
+      </w:r>
+    </w:p>
     <w:bookmarkEnd w:id="28"/>
+    <w:bookmarkEnd w:id="29"/>
     <w:sectPr/>
   </w:body>
 </w:document>
@@ -3144,6 +3729,36 @@
     </w:lvlOverride>
   </w:num>
   <w:num w:numId="1002">
+    <w:abstractNumId w:val="99411"/>
+    <w:lvlOverride w:ilvl="0">
+      <w:startOverride w:val="1"/>
+    </w:lvlOverride>
+    <w:lvlOverride w:ilvl="1">
+      <w:startOverride w:val="1"/>
+    </w:lvlOverride>
+    <w:lvlOverride w:ilvl="2">
+      <w:startOverride w:val="1"/>
+    </w:lvlOverride>
+    <w:lvlOverride w:ilvl="3">
+      <w:startOverride w:val="1"/>
+    </w:lvlOverride>
+    <w:lvlOverride w:ilvl="4">
+      <w:startOverride w:val="1"/>
+    </w:lvlOverride>
+    <w:lvlOverride w:ilvl="5">
+      <w:startOverride w:val="1"/>
+    </w:lvlOverride>
+    <w:lvlOverride w:ilvl="6">
+      <w:startOverride w:val="1"/>
+    </w:lvlOverride>
+    <w:lvlOverride w:ilvl="7">
+      <w:startOverride w:val="1"/>
+    </w:lvlOverride>
+    <w:lvlOverride w:ilvl="8">
+      <w:startOverride w:val="1"/>
+    </w:lvlOverride>
+  </w:num>
+  <w:num w:numId="1003">
     <w:abstractNumId w:val="99411"/>
     <w:lvlOverride w:ilvl="0">
       <w:startOverride w:val="1"/>

</xml_diff>

<commit_message>
-h/--help now names the underlying AMD tool with a documentation link
Each tool's help blurb ends with "under the hood, this uses AMD's <tool>"
plus a link to that tool's official ROCm docs, so a curious user can go
straight to the source instead of digging through this project's code.
</commit_message>
<xml_diff>
--- a/docs/DEVELOPMENT_HISTORY.docx
+++ b/docs/DEVELOPMENT_HISTORY.docx
@@ -10,7 +10,7 @@
         <w:t xml:space="preserve">Development History</w:t>
       </w:r>
     </w:p>
-    <w:bookmarkStart w:id="29" w:name="development-history"/>
+    <w:bookmarkStart w:id="30" w:name="development-history"/>
     <w:p>
       <w:pPr>
         <w:pStyle w:val="Heading1"/>
@@ -230,6 +230,32 @@
           </w:p>
         </w:tc>
       </w:tr>
+      <w:tr>
+        <w:tc>
+          <w:tcPr/>
+          <w:p>
+            <w:pPr>
+              <w:pStyle w:val="Compact"/>
+              <w:jc w:val="left"/>
+            </w:pPr>
+            <w:r>
+              <w:t xml:space="preserve">2026-07-31</w:t>
+            </w:r>
+          </w:p>
+        </w:tc>
+        <w:tc>
+          <w:tcPr/>
+          <w:p>
+            <w:pPr>
+              <w:pStyle w:val="Compact"/>
+              <w:jc w:val="left"/>
+            </w:pPr>
+            <w:r>
+              <w:t xml:space="preserve">-h/–help now names the underlying AMD tool with a documentation link</w:t>
+            </w:r>
+          </w:p>
+        </w:tc>
+      </w:tr>
     </w:tbl>
     <w:bookmarkStart w:id="20" w:name="project-scaffolding-and-rules"/>
     <w:p>
@@ -3503,7 +3529,203 @@
       </w:r>
     </w:p>
     <w:bookmarkEnd w:id="28"/>
+    <w:bookmarkStart w:id="29" w:name="X936ff1f5b4a75a73dd2bbcd75ed5368dafc5126"/>
+    <w:p>
+      <w:pPr>
+        <w:pStyle w:val="Heading2"/>
+      </w:pPr>
+      <w:r>
+        <w:t xml:space="preserve">2026-07-31 — -h/–help now names the underlying AMD tool with a documentation link</w:t>
+      </w:r>
+    </w:p>
+    <w:p>
+      <w:pPr>
+        <w:pStyle w:val="FirstParagraph"/>
+      </w:pPr>
+      <w:r>
+        <w:t xml:space="preserve">Small follow-up to the beginner-friendly renaming: each tool’s</w:t>
+      </w:r>
+      <w:r>
+        <w:t xml:space="preserve"> </w:t>
+      </w:r>
+      <w:r>
+        <w:rPr>
+          <w:rStyle w:val="VerbatimChar"/>
+        </w:rPr>
+        <w:t xml:space="preserve">-h</w:t>
+      </w:r>
+      <w:r>
+        <w:t xml:space="preserve">/</w:t>
+      </w:r>
+      <w:r>
+        <w:rPr>
+          <w:rStyle w:val="VerbatimChar"/>
+        </w:rPr>
+        <w:t xml:space="preserve">--help</w:t>
+      </w:r>
+      <w:r>
+        <w:t xml:space="preserve"> </w:t>
+      </w:r>
+      <w:r>
+        <w:t xml:space="preserve">blurb now ends with a one-line</w:t>
+      </w:r>
+      <w:r>
+        <w:t xml:space="preserve"> </w:t>
+      </w:r>
+      <w:r>
+        <w:t xml:space="preserve">“</w:t>
+      </w:r>
+      <w:r>
+        <w:t xml:space="preserve">under the hood, this uses AMD’s</w:t>
+      </w:r>
+      <w:r>
+        <w:t xml:space="preserve"> </w:t>
+      </w:r>
+      <w:r>
+        <w:rPr>
+          <w:rStyle w:val="VerbatimChar"/>
+        </w:rPr>
+        <w:t xml:space="preserve">&lt;tool&gt;</w:t>
+      </w:r>
+      <w:r>
+        <w:t xml:space="preserve">”</w:t>
+      </w:r>
+      <w:r>
+        <w:t xml:space="preserve"> </w:t>
+      </w:r>
+      <w:r>
+        <w:t xml:space="preserve">note plus a link to that tool’s official ROCm documentation, so a curious user can go straight to the authoritative source instead of having to dig through this project’s code or commit history to find out what’s actually running.</w:t>
+      </w:r>
+    </w:p>
+    <w:p>
+      <w:pPr>
+        <w:pStyle w:val="BodyText"/>
+      </w:pPr>
+      <w:r>
+        <w:t xml:space="preserve">Added to all six tools’ existing help blurb (right before the options table for the three bash launchers, at the end of</w:t>
+      </w:r>
+      <w:r>
+        <w:t xml:space="preserve"> </w:t>
+      </w:r>
+      <w:r>
+        <w:rPr>
+          <w:rStyle w:val="VerbatimChar"/>
+        </w:rPr>
+        <w:t xml:space="preserve">HELP_BLURB</w:t>
+      </w:r>
+      <w:r>
+        <w:t xml:space="preserve"> </w:t>
+      </w:r>
+      <w:r>
+        <w:t xml:space="preserve">for the three Python extractors):</w:t>
+      </w:r>
+      <w:r>
+        <w:t xml:space="preserve"> </w:t>
+      </w:r>
+      <w:r>
+        <w:rPr>
+          <w:rStyle w:val="VerbatimChar"/>
+        </w:rPr>
+        <w:t xml:space="preserve">profile_CPU_hotspots.sh</w:t>
+      </w:r>
+      <w:r>
+        <w:t xml:space="preserve">/</w:t>
+      </w:r>
+      <w:r>
+        <w:rPr>
+          <w:rStyle w:val="VerbatimChar"/>
+        </w:rPr>
+        <w:t xml:space="preserve">extract_CPU_hotspots.py</w:t>
+      </w:r>
+      <w:r>
+        <w:t xml:space="preserve"> </w:t>
+      </w:r>
+      <w:r>
+        <w:t xml:space="preserve">name rocprof-sys with a link to https://rocm.docs.amd.com/projects/rocprofiler-systems/en/latest/;</w:t>
+      </w:r>
+      <w:r>
+        <w:t xml:space="preserve"> </w:t>
+      </w:r>
+      <w:r>
+        <w:rPr>
+          <w:rStyle w:val="VerbatimChar"/>
+        </w:rPr>
+        <w:t xml:space="preserve">profile_GPU_hotspots.sh</w:t>
+      </w:r>
+      <w:r>
+        <w:t xml:space="preserve">/</w:t>
+      </w:r>
+      <w:r>
+        <w:rPr>
+          <w:rStyle w:val="VerbatimChar"/>
+        </w:rPr>
+        <w:t xml:space="preserve">extract_GPU_hotspots.py</w:t>
+      </w:r>
+      <w:r>
+        <w:t xml:space="preserve"> </w:t>
+      </w:r>
+      <w:r>
+        <w:t xml:space="preserve">name rocprofv3 with a link to https://rocm.docs.amd.com/projects/rocprofiler-sdk/en/latest/how-to/using-rocprofv3.html;</w:t>
+      </w:r>
+      <w:r>
+        <w:t xml:space="preserve"> </w:t>
+      </w:r>
+      <w:r>
+        <w:rPr>
+          <w:rStyle w:val="VerbatimChar"/>
+        </w:rPr>
+        <w:t xml:space="preserve">profile_hotspots.sh</w:t>
+      </w:r>
+      <w:r>
+        <w:t xml:space="preserve">/</w:t>
+      </w:r>
+      <w:r>
+        <w:rPr>
+          <w:rStyle w:val="VerbatimChar"/>
+        </w:rPr>
+        <w:t xml:space="preserve">extract_hotspots.py</w:t>
+      </w:r>
+      <w:r>
+        <w:t xml:space="preserve"> </w:t>
+      </w:r>
+      <w:r>
+        <w:t xml:space="preserve">name and link both, since they use both tools.</w:t>
+      </w:r>
+    </w:p>
+    <w:p>
+      <w:pPr>
+        <w:pStyle w:val="BodyText"/>
+      </w:pPr>
+      <w:r>
+        <w:t xml:space="preserve">Verified: full test suite (68 tests) still passes; manually rendered all six</w:t>
+      </w:r>
+      <w:r>
+        <w:t xml:space="preserve"> </w:t>
+      </w:r>
+      <w:r>
+        <w:rPr>
+          <w:rStyle w:val="VerbatimChar"/>
+        </w:rPr>
+        <w:t xml:space="preserve">-h</w:t>
+      </w:r>
+      <w:r>
+        <w:t xml:space="preserve">/</w:t>
+      </w:r>
+      <w:r>
+        <w:rPr>
+          <w:rStyle w:val="VerbatimChar"/>
+        </w:rPr>
+        <w:t xml:space="preserve">--help</w:t>
+      </w:r>
+      <w:r>
+        <w:t xml:space="preserve"> </w:t>
+      </w:r>
+      <w:r>
+        <w:t xml:space="preserve">outputs to confirm the note reads correctly and the options table underneath is unaffected.</w:t>
+      </w:r>
+    </w:p>
     <w:bookmarkEnd w:id="29"/>
+    <w:bookmarkEnd w:id="30"/>
     <w:sectPr/>
   </w:body>
 </w:document>

</xml_diff>

<commit_message>
CLAUDE.md: codify naming and -h/--help conventions for future tools
The beginner-friendly naming (profile_*/extract_*, AMD tool name stays out
of the name) and the -h/--help requirement (plain-language purpose blurb
+ a link to the underlying AMD tool's docs) just applied to all six
existing tools are meant to hold for every future one too.
</commit_message>
<xml_diff>
--- a/docs/DEVELOPMENT_HISTORY.docx
+++ b/docs/DEVELOPMENT_HISTORY.docx
@@ -10,7 +10,7 @@
         <w:t xml:space="preserve">Development History</w:t>
       </w:r>
     </w:p>
-    <w:bookmarkStart w:id="30" w:name="development-history"/>
+    <w:bookmarkStart w:id="32" w:name="development-history"/>
     <w:p>
       <w:pPr>
         <w:pStyle w:val="Heading1"/>
@@ -256,6 +256,32 @@
           </w:p>
         </w:tc>
       </w:tr>
+      <w:tr>
+        <w:tc>
+          <w:tcPr/>
+          <w:p>
+            <w:pPr>
+              <w:pStyle w:val="Compact"/>
+              <w:jc w:val="left"/>
+            </w:pPr>
+            <w:r>
+              <w:t xml:space="preserve">2026-07-31</w:t>
+            </w:r>
+          </w:p>
+        </w:tc>
+        <w:tc>
+          <w:tcPr/>
+          <w:p>
+            <w:pPr>
+              <w:pStyle w:val="Compact"/>
+              <w:jc w:val="left"/>
+            </w:pPr>
+            <w:r>
+              <w:t xml:space="preserve">CLAUDE.md codifies naming and -h/–help conventions for future tools</w:t>
+            </w:r>
+          </w:p>
+        </w:tc>
+      </w:tr>
     </w:tbl>
     <w:bookmarkStart w:id="20" w:name="project-scaffolding-and-rules"/>
     <w:p>
@@ -3725,7 +3751,233 @@
       </w:r>
     </w:p>
     <w:bookmarkEnd w:id="29"/>
-    <w:bookmarkEnd w:id="30"/>
+    <w:bookmarkStart w:id="31" w:name="X2867fc6bfa71fa508f88ee16b879e87295f89ba"/>
+    <w:p>
+      <w:pPr>
+        <w:pStyle w:val="Heading2"/>
+      </w:pPr>
+      <w:r>
+        <w:t xml:space="preserve">2026-07-31 — CLAUDE.md codifies naming and -h/–help conventions for future tools</w:t>
+      </w:r>
+    </w:p>
+    <w:p>
+      <w:pPr>
+        <w:pStyle w:val="FirstParagraph"/>
+      </w:pPr>
+      <w:r>
+        <w:t xml:space="preserve">The two conventions just applied to all six existing tools (beginner-friendly naming, and a plain-language</w:t>
+      </w:r>
+      <w:r>
+        <w:t xml:space="preserve"> </w:t>
+      </w:r>
+      <w:r>
+        <w:rPr>
+          <w:rStyle w:val="VerbatimChar"/>
+        </w:rPr>
+        <w:t xml:space="preserve">-h</w:t>
+      </w:r>
+      <w:r>
+        <w:t xml:space="preserve">/</w:t>
+      </w:r>
+      <w:r>
+        <w:rPr>
+          <w:rStyle w:val="VerbatimChar"/>
+        </w:rPr>
+        <w:t xml:space="preserve">--help</w:t>
+      </w:r>
+      <w:r>
+        <w:t xml:space="preserve"> </w:t>
+      </w:r>
+      <w:r>
+        <w:t xml:space="preserve">blurb naming the underlying AMD tool with a doc link) are meant to hold for every future tool in this project, not just a one-time cleanup — so they’re now written into</w:t>
+      </w:r>
+      <w:r>
+        <w:t xml:space="preserve"> </w:t>
+      </w:r>
+      <w:hyperlink r:id="rId30">
+        <w:r>
+          <w:rPr>
+            <w:rStyle w:val="Hyperlink"/>
+          </w:rPr>
+          <w:t xml:space="preserve">CLAUDE.md</w:t>
+        </w:r>
+      </w:hyperlink>
+      <w:r>
+        <w:t xml:space="preserve"> </w:t>
+      </w:r>
+      <w:r>
+        <w:t xml:space="preserve">as a standing rule (new</w:t>
+      </w:r>
+      <w:r>
+        <w:t xml:space="preserve"> </w:t>
+      </w:r>
+      <w:r>
+        <w:t xml:space="preserve">“</w:t>
+      </w:r>
+      <w:r>
+        <w:t xml:space="preserve">User-facing conventions</w:t>
+      </w:r>
+      <w:r>
+        <w:t xml:space="preserve">”</w:t>
+      </w:r>
+      <w:r>
+        <w:t xml:space="preserve"> </w:t>
+      </w:r>
+      <w:r>
+        <w:t xml:space="preserve">section), rather than living only in this history file or in the code itself.</w:t>
+      </w:r>
+    </w:p>
+    <w:p>
+      <w:pPr>
+        <w:pStyle w:val="BodyText"/>
+      </w:pPr>
+      <w:r>
+        <w:t xml:space="preserve">Codified: (1) tools are named after what they do, not the AMD tool behind them —</w:t>
+      </w:r>
+      <w:r>
+        <w:t xml:space="preserve"> </w:t>
+      </w:r>
+      <w:r>
+        <w:rPr>
+          <w:rStyle w:val="VerbatimChar"/>
+        </w:rPr>
+        <w:t xml:space="preserve">scripts/</w:t>
+      </w:r>
+      <w:r>
+        <w:t xml:space="preserve"> </w:t>
+      </w:r>
+      <w:r>
+        <w:t xml:space="preserve">launchers as</w:t>
+      </w:r>
+      <w:r>
+        <w:t xml:space="preserve"> </w:t>
+      </w:r>
+      <w:r>
+        <w:rPr>
+          <w:rStyle w:val="VerbatimChar"/>
+        </w:rPr>
+        <w:t xml:space="preserve">profile_&lt;what&gt;</w:t>
+      </w:r>
+      <w:r>
+        <w:t xml:space="preserve">,</w:t>
+      </w:r>
+      <w:r>
+        <w:t xml:space="preserve"> </w:t>
+      </w:r>
+      <w:r>
+        <w:rPr>
+          <w:rStyle w:val="VerbatimChar"/>
+        </w:rPr>
+        <w:t xml:space="preserve">postprocess/</w:t>
+      </w:r>
+      <w:r>
+        <w:t xml:space="preserve"> </w:t>
+      </w:r>
+      <w:r>
+        <w:t xml:space="preserve">tools as</w:t>
+      </w:r>
+      <w:r>
+        <w:t xml:space="preserve"> </w:t>
+      </w:r>
+      <w:r>
+        <w:rPr>
+          <w:rStyle w:val="VerbatimChar"/>
+        </w:rPr>
+        <w:t xml:space="preserve">extract_&lt;what&gt;</w:t>
+      </w:r>
+      <w:r>
+        <w:t xml:space="preserve">, following the pattern already established by</w:t>
+      </w:r>
+      <w:r>
+        <w:t xml:space="preserve"> </w:t>
+      </w:r>
+      <w:r>
+        <w:rPr>
+          <w:rStyle w:val="VerbatimChar"/>
+        </w:rPr>
+        <w:t xml:space="preserve">profile_CPU_hotspots.sh</w:t>
+      </w:r>
+      <w:r>
+        <w:t xml:space="preserve">/</w:t>
+      </w:r>
+      <w:r>
+        <w:rPr>
+          <w:rStyle w:val="VerbatimChar"/>
+        </w:rPr>
+        <w:t xml:space="preserve">profile_GPU_hotspots.sh</w:t>
+      </w:r>
+      <w:r>
+        <w:t xml:space="preserve">/</w:t>
+      </w:r>
+      <w:r>
+        <w:rPr>
+          <w:rStyle w:val="VerbatimChar"/>
+        </w:rPr>
+        <w:t xml:space="preserve">profile_hotspots.sh</w:t>
+      </w:r>
+      <w:r>
+        <w:t xml:space="preserve"> </w:t>
+      </w:r>
+      <w:r>
+        <w:t xml:space="preserve">and</w:t>
+      </w:r>
+      <w:r>
+        <w:t xml:space="preserve"> </w:t>
+      </w:r>
+      <w:r>
+        <w:rPr>
+          <w:rStyle w:val="VerbatimChar"/>
+        </w:rPr>
+        <w:t xml:space="preserve">extract_CPU_hotspots.py</w:t>
+      </w:r>
+      <w:r>
+        <w:t xml:space="preserve">/</w:t>
+      </w:r>
+      <w:r>
+        <w:rPr>
+          <w:rStyle w:val="VerbatimChar"/>
+        </w:rPr>
+        <w:t xml:space="preserve">extract_GPU_hotspots.py</w:t>
+      </w:r>
+      <w:r>
+        <w:t xml:space="preserve">/</w:t>
+      </w:r>
+      <w:r>
+        <w:rPr>
+          <w:rStyle w:val="VerbatimChar"/>
+        </w:rPr>
+        <w:t xml:space="preserve">extract_hotspots.py</w:t>
+      </w:r>
+      <w:r>
+        <w:t xml:space="preserve">; (2)</w:t>
+      </w:r>
+      <w:r>
+        <w:t xml:space="preserve"> </w:t>
+      </w:r>
+      <w:r>
+        <w:rPr>
+          <w:rStyle w:val="VerbatimChar"/>
+        </w:rPr>
+        <w:t xml:space="preserve">-h</w:t>
+      </w:r>
+      <w:r>
+        <w:t xml:space="preserve">/</w:t>
+      </w:r>
+      <w:r>
+        <w:rPr>
+          <w:rStyle w:val="VerbatimChar"/>
+        </w:rPr>
+        <w:t xml:space="preserve">--help</w:t>
+      </w:r>
+      <w:r>
+        <w:t xml:space="preserve"> </w:t>
+      </w:r>
+      <w:r>
+        <w:t xml:space="preserve">must lead with a short (~10-15 line), jargon-free purpose-and-limitation explanation ahead of the options table, ending with a line naming the specific AMD tool used and a link to its official documentation.</w:t>
+      </w:r>
+    </w:p>
+    <w:bookmarkEnd w:id="31"/>
+    <w:bookmarkEnd w:id="32"/>
     <w:sectPr/>
   </w:body>
 </w:document>

</xml_diff>

<commit_message>
Fourth tool: selective instrumentation helper (instrument/trace)
Adds scripts/instrument_hotspots.sh and postprocess/select_hotspot_functions.py:
build a rocprof-sys-instrument binary rewrite covering only the functions
profile_hotspots.sh already flagged as hotspots, then optionally run it to
produce a full trace with kernel/OpenMP/MPI activity captured too. MPI is
driven by the script itself via --mpi rather than by wrapping it in
mpirun/srun, since the binary rewrite must happen exactly once, not once
per rank.

Co-Authored-By: Claude Sonnet 5 <noreply@anthropic.com>
</commit_message>
<xml_diff>
--- a/docs/DEVELOPMENT_HISTORY.docx
+++ b/docs/DEVELOPMENT_HISTORY.docx
@@ -10,7 +10,7 @@
         <w:t xml:space="preserve">Development History</w:t>
       </w:r>
     </w:p>
-    <w:bookmarkStart w:id="32" w:name="development-history"/>
+    <w:bookmarkStart w:id="34" w:name="development-history"/>
     <w:p>
       <w:pPr>
         <w:pStyle w:val="Heading1"/>
@@ -282,6 +282,32 @@
           </w:p>
         </w:tc>
       </w:tr>
+      <w:tr>
+        <w:tc>
+          <w:tcPr/>
+          <w:p>
+            <w:pPr>
+              <w:pStyle w:val="Compact"/>
+              <w:jc w:val="left"/>
+            </w:pPr>
+            <w:r>
+              <w:t xml:space="preserve">2026-07-31</w:t>
+            </w:r>
+          </w:p>
+        </w:tc>
+        <w:tc>
+          <w:tcPr/>
+          <w:p>
+            <w:pPr>
+              <w:pStyle w:val="Compact"/>
+              <w:jc w:val="left"/>
+            </w:pPr>
+            <w:r>
+              <w:t xml:space="preserve">Fourth tool: selective instrumentation helper (instrument/trace)</w:t>
+            </w:r>
+          </w:p>
+        </w:tc>
+      </w:tr>
     </w:tbl>
     <w:bookmarkStart w:id="20" w:name="project-scaffolding-and-rules"/>
     <w:p>
@@ -3977,7 +4003,1137 @@
       </w:r>
     </w:p>
     <w:bookmarkEnd w:id="31"/>
-    <w:bookmarkEnd w:id="32"/>
+    <w:bookmarkStart w:id="33" w:name="Xc6ed22f3e5085f5309e80e1767d6cb006b24cdc"/>
+    <w:p>
+      <w:pPr>
+        <w:pStyle w:val="Heading2"/>
+      </w:pPr>
+      <w:r>
+        <w:t xml:space="preserve">2026-07-31 — Fourth tool: selective instrumentation helper</w:t>
+      </w:r>
+    </w:p>
+    <w:p>
+      <w:pPr>
+        <w:pStyle w:val="FirstParagraph"/>
+      </w:pPr>
+      <w:r>
+        <w:t xml:space="preserve">Implemented the fourth tool per the approved plan in</w:t>
+      </w:r>
+      <w:r>
+        <w:t xml:space="preserve"> </w:t>
+      </w:r>
+      <w:hyperlink r:id="rId32">
+        <w:r>
+          <w:rPr>
+            <w:rStyle w:val="Hyperlink"/>
+          </w:rPr>
+          <w:t xml:space="preserve">docs/plans/04-selective-instrumentation.md</w:t>
+        </w:r>
+      </w:hyperlink>
+      <w:r>
+        <w:t xml:space="preserve">: once</w:t>
+      </w:r>
+      <w:r>
+        <w:t xml:space="preserve"> </w:t>
+      </w:r>
+      <w:r>
+        <w:rPr>
+          <w:rStyle w:val="VerbatimChar"/>
+        </w:rPr>
+        <w:t xml:space="preserve">profile_hotspots.sh</w:t>
+      </w:r>
+      <w:r>
+        <w:t xml:space="preserve"> </w:t>
+      </w:r>
+      <w:r>
+        <w:t xml:space="preserve">has already identified hotspots, this tool builds a</w:t>
+      </w:r>
+      <w:r>
+        <w:t xml:space="preserve"> </w:t>
+      </w:r>
+      <w:r>
+        <w:rPr>
+          <w:rStyle w:val="VerbatimChar"/>
+        </w:rPr>
+        <w:t xml:space="preserve">rocprof-sys-instrument</w:t>
+      </w:r>
+      <w:r>
+        <w:t xml:space="preserve"> </w:t>
+      </w:r>
+      <w:r>
+        <w:t xml:space="preserve">binary rewrite covering</w:t>
+      </w:r>
+      <w:r>
+        <w:t xml:space="preserve"> </w:t>
+      </w:r>
+      <w:r>
+        <w:rPr>
+          <w:iCs/>
+          <w:i/>
+        </w:rPr>
+        <w:t xml:space="preserve">only</w:t>
+      </w:r>
+      <w:r>
+        <w:t xml:space="preserve"> </w:t>
+      </w:r>
+      <w:r>
+        <w:t xml:space="preserve">those functions — much lower overhead than instrumenting every function in the binary — and can also run the result to produce a full trace.</w:t>
+      </w:r>
+    </w:p>
+    <w:p>
+      <w:pPr>
+        <w:pStyle w:val="BodyText"/>
+      </w:pPr>
+      <w:r>
+        <w:t xml:space="preserve">Research into</w:t>
+      </w:r>
+      <w:r>
+        <w:t xml:space="preserve"> </w:t>
+      </w:r>
+      <w:r>
+        <w:rPr>
+          <w:rStyle w:val="VerbatimChar"/>
+        </w:rPr>
+        <w:t xml:space="preserve">rocprof-sys-instrument</w:t>
+      </w:r>
+      <w:r>
+        <w:t xml:space="preserve"> </w:t>
+      </w:r>
+      <w:r>
+        <w:t xml:space="preserve">(cross-checked against ROCm 7.0.2-tagged docs and the tool’s own source,</w:t>
+      </w:r>
+      <w:r>
+        <w:t xml:space="preserve"> </w:t>
+      </w:r>
+      <w:r>
+        <w:rPr>
+          <w:rStyle w:val="VerbatimChar"/>
+        </w:rPr>
+        <w:t xml:space="preserve">module_function.cpp</w:t>
+      </w:r>
+      <w:r>
+        <w:t xml:space="preserve">/</w:t>
+      </w:r>
+      <w:r>
+        <w:rPr>
+          <w:rStyle w:val="VerbatimChar"/>
+        </w:rPr>
+        <w:t xml:space="preserve">details.cpp</w:t>
+      </w:r>
+      <w:r>
+        <w:t xml:space="preserve">/</w:t>
+      </w:r>
+      <w:r>
+        <w:rPr>
+          <w:rStyle w:val="VerbatimChar"/>
+        </w:rPr>
+        <w:t xml:space="preserve">function_signature.cpp</w:t>
+      </w:r>
+      <w:r>
+        <w:t xml:space="preserve">) established several facts the design depends on directly: binary-rewrite mode (</w:t>
+      </w:r>
+      <w:r>
+        <w:rPr>
+          <w:rStyle w:val="VerbatimChar"/>
+        </w:rPr>
+        <w:t xml:space="preserve">-o &lt;new-exe&gt;</w:t>
+      </w:r>
+      <w:r>
+        <w:t xml:space="preserve">) is the documented/recommended mode for MPI apps, since runtime/dynamic mode’s fork+ptrace is explicitly incompatible with MPI process spawning;</w:t>
+      </w:r>
+      <w:r>
+        <w:t xml:space="preserve"> </w:t>
+      </w:r>
+      <w:r>
+        <w:rPr>
+          <w:rStyle w:val="VerbatimChar"/>
+        </w:rPr>
+        <w:t xml:space="preserve">-R/--function-restrict &lt;regex&gt;</w:t>
+      </w:r>
+      <w:r>
+        <w:t xml:space="preserve"> </w:t>
+      </w:r>
+      <w:r>
+        <w:t xml:space="preserve">is an exclusive allow-list matched via</w:t>
+      </w:r>
+      <w:r>
+        <w:t xml:space="preserve"> </w:t>
+      </w:r>
+      <w:r>
+        <w:rPr>
+          <w:rStyle w:val="VerbatimChar"/>
+        </w:rPr>
+        <w:t xml:space="preserve">std::regex_search</w:t>
+      </w:r>
+      <w:r>
+        <w:t xml:space="preserve"> </w:t>
+      </w:r>
+      <w:r>
+        <w:t xml:space="preserve">against demangled names, so a plain function name only needs its regex metacharacters escaped, not full-signature matching;</w:t>
+      </w:r>
+      <w:r>
+        <w:t xml:space="preserve"> </w:t>
+      </w:r>
+      <w:r>
+        <w:t xml:space="preserve">“</w:t>
+      </w:r>
+      <w:r>
+        <w:t xml:space="preserve">instrument</w:t>
+      </w:r>
+      <w:r>
+        <w:t xml:space="preserve">”</w:t>
+      </w:r>
+      <w:r>
+        <w:t xml:space="preserve"> </w:t>
+      </w:r>
+      <w:r>
+        <w:t xml:space="preserve">vs. </w:t>
+      </w:r>
+      <w:r>
+        <w:t xml:space="preserve">“</w:t>
+      </w:r>
+      <w:r>
+        <w:t xml:space="preserve">trace</w:t>
+      </w:r>
+      <w:r>
+        <w:t xml:space="preserve">”</w:t>
+      </w:r>
+      <w:r>
+        <w:t xml:space="preserve"> </w:t>
+      </w:r>
+      <w:r>
+        <w:t xml:space="preserve">is the</w:t>
+      </w:r>
+      <w:r>
+        <w:t xml:space="preserve"> </w:t>
+      </w:r>
+      <w:r>
+        <w:rPr>
+          <w:iCs/>
+          <w:i/>
+        </w:rPr>
+        <w:t xml:space="preserve">same</w:t>
+      </w:r>
+      <w:r>
+        <w:t xml:space="preserve"> </w:t>
+      </w:r>
+      <w:r>
+        <w:t xml:space="preserve">rewritten binary, differing only in runtime env vars (</w:t>
+      </w:r>
+      <w:r>
+        <w:rPr>
+          <w:rStyle w:val="VerbatimChar"/>
+        </w:rPr>
+        <w:t xml:space="preserve">ROCPROFSYS_TRACE=1</w:t>
+      </w:r>
+      <w:r>
+        <w:t xml:space="preserve"> </w:t>
+      </w:r>
+      <w:r>
+        <w:t xml:space="preserve">for the full perfetto backend); and the rewrite step unconditionally writes</w:t>
+      </w:r>
+      <w:r>
+        <w:t xml:space="preserve"> </w:t>
+      </w:r>
+      <w:r>
+        <w:rPr>
+          <w:rStyle w:val="VerbatimChar"/>
+        </w:rPr>
+        <w:t xml:space="preserve">instrumented.json</w:t>
+      </w:r>
+      <w:r>
+        <w:t xml:space="preserve">, the authoritative post-filter list of what actually got instrumented — used here to detect</w:t>
+      </w:r>
+      <w:r>
+        <w:t xml:space="preserve"> </w:t>
+      </w:r>
+      <w:r>
+        <w:t xml:space="preserve">“</w:t>
+      </w:r>
+      <w:r>
+        <w:t xml:space="preserve">lost</w:t>
+      </w:r>
+      <w:r>
+        <w:t xml:space="preserve">”</w:t>
+      </w:r>
+      <w:r>
+        <w:t xml:space="preserve"> </w:t>
+      </w:r>
+      <w:r>
+        <w:t xml:space="preserve">functions instead of an independent heuristic like</w:t>
+      </w:r>
+      <w:r>
+        <w:t xml:space="preserve"> </w:t>
+      </w:r>
+      <w:r>
+        <w:rPr>
+          <w:rStyle w:val="VerbatimChar"/>
+        </w:rPr>
+        <w:t xml:space="preserve">nm</w:t>
+      </w:r>
+      <w:r>
+        <w:t xml:space="preserve">.</w:t>
+      </w:r>
+    </w:p>
+    <w:p>
+      <w:pPr>
+        <w:pStyle w:val="BodyText"/>
+      </w:pPr>
+      <w:r>
+        <w:t xml:space="preserve">Two design points came directly from the user during planning, both changing the shape of the tool from an early draft:</w:t>
+      </w:r>
+      <w:r>
+        <w:t xml:space="preserve"> </w:t>
+      </w:r>
+      <w:r>
+        <w:t xml:space="preserve">-</w:t>
+      </w:r>
+      <w:r>
+        <w:t xml:space="preserve"> </w:t>
+      </w:r>
+      <w:r>
+        <w:rPr>
+          <w:bCs/>
+          <w:b/>
+        </w:rPr>
+        <w:t xml:space="preserve">MPI is driven by the script itself, not by wrapping it in</w:t>
+      </w:r>
+      <w:r>
+        <w:rPr>
+          <w:bCs/>
+          <w:b/>
+        </w:rPr>
+        <w:t xml:space="preserve"> </w:t>
+      </w:r>
+      <w:r>
+        <w:rPr>
+          <w:rStyle w:val="VerbatimChar"/>
+          <w:bCs/>
+          <w:b/>
+        </w:rPr>
+        <w:t xml:space="preserve">mpirun</w:t>
+      </w:r>
+      <w:r>
+        <w:rPr>
+          <w:bCs/>
+          <w:b/>
+        </w:rPr>
+        <w:t xml:space="preserve">/</w:t>
+      </w:r>
+      <w:r>
+        <w:rPr>
+          <w:rStyle w:val="VerbatimChar"/>
+          <w:bCs/>
+          <w:b/>
+        </w:rPr>
+        <w:t xml:space="preserve">srun</w:t>
+      </w:r>
+      <w:r>
+        <w:rPr>
+          <w:bCs/>
+          <w:b/>
+        </w:rPr>
+        <w:t xml:space="preserve">.</w:t>
+      </w:r>
+      <w:r>
+        <w:t xml:space="preserve"> </w:t>
+      </w:r>
+      <w:r>
+        <w:t xml:space="preserve">The other three tools rely on</w:t>
+      </w:r>
+      <w:r>
+        <w:t xml:space="preserve"> </w:t>
+      </w:r>
+      <w:r>
+        <w:t xml:space="preserve">“</w:t>
+      </w:r>
+      <w:r>
+        <w:rPr>
+          <w:rStyle w:val="VerbatimChar"/>
+        </w:rPr>
+        <w:t xml:space="preserve">mpirun</w:t>
+      </w:r>
+      <w:r>
+        <w:t xml:space="preserve"> </w:t>
+      </w:r>
+      <w:r>
+        <w:t xml:space="preserve">wraps the whole script, once per rank, self-detected via env vars</w:t>
+      </w:r>
+      <w:r>
+        <w:t xml:space="preserve">”</w:t>
+      </w:r>
+      <w:r>
+        <w:t xml:space="preserve"> </w:t>
+      </w:r>
+      <w:r>
+        <w:t xml:space="preserve">— wrong here, since the binary rewrite must happen exactly once, never once per rank. Per the user’s direction (citing the pattern used by HPE’s</w:t>
+      </w:r>
+      <w:r>
+        <w:t xml:space="preserve"> </w:t>
+      </w:r>
+      <w:r>
+        <w:rPr>
+          <w:rStyle w:val="VerbatimChar"/>
+        </w:rPr>
+        <w:t xml:space="preserve">gbb4hpc</w:t>
+      </w:r>
+      <w:r>
+        <w:t xml:space="preserve">-style tools), this script instead takes the MPI launch command as data via</w:t>
+      </w:r>
+      <w:r>
+        <w:t xml:space="preserve"> </w:t>
+      </w:r>
+      <w:r>
+        <w:rPr>
+          <w:rStyle w:val="VerbatimChar"/>
+        </w:rPr>
+        <w:t xml:space="preserve">--mpi "&lt;launch command&gt;"</w:t>
+      </w:r>
+      <w:r>
+        <w:t xml:space="preserve"> </w:t>
+      </w:r>
+      <w:r>
+        <w:t xml:space="preserve">and applies it only where it’s actually needed (the auto-profiling run, and</w:t>
+      </w:r>
+      <w:r>
+        <w:t xml:space="preserve"> </w:t>
+      </w:r>
+      <w:r>
+        <w:rPr>
+          <w:rStyle w:val="VerbatimChar"/>
+        </w:rPr>
+        <w:t xml:space="preserve">trace</w:t>
+      </w:r>
+      <w:r>
+        <w:t xml:space="preserve"> </w:t>
+      </w:r>
+      <w:r>
+        <w:t xml:space="preserve">mode’s final run) — never to the rewrite step itself, which doesn’t execute the target program at all. This is a deliberate, scoped exception to the other three tools’ convention, not a change to theirs.</w:t>
+      </w:r>
+      <w:r>
+        <w:t xml:space="preserve"> </w:t>
+      </w:r>
+      <w:r>
+        <w:t xml:space="preserve">-</w:t>
+      </w:r>
+      <w:r>
+        <w:t xml:space="preserve"> </w:t>
+      </w:r>
+      <w:r>
+        <w:rPr>
+          <w:rStyle w:val="VerbatimChar"/>
+          <w:bCs/>
+          <w:b/>
+        </w:rPr>
+        <w:t xml:space="preserve">trace</w:t>
+      </w:r>
+      <w:r>
+        <w:rPr>
+          <w:bCs/>
+          <w:b/>
+        </w:rPr>
+        <w:t xml:space="preserve"> </w:t>
+      </w:r>
+      <w:r>
+        <w:rPr>
+          <w:bCs/>
+          <w:b/>
+        </w:rPr>
+        <w:t xml:space="preserve">mode runs every step</w:t>
+      </w:r>
+      <w:r>
+        <w:rPr>
+          <w:bCs/>
+          <w:b/>
+        </w:rPr>
+        <w:t xml:space="preserve"> </w:t>
+      </w:r>
+      <w:r>
+        <w:rPr>
+          <w:rStyle w:val="VerbatimChar"/>
+          <w:bCs/>
+          <w:b/>
+        </w:rPr>
+        <w:t xml:space="preserve">instrument</w:t>
+      </w:r>
+      <w:r>
+        <w:rPr>
+          <w:bCs/>
+          <w:b/>
+        </w:rPr>
+        <w:t xml:space="preserve"> </w:t>
+      </w:r>
+      <w:r>
+        <w:rPr>
+          <w:bCs/>
+          <w:b/>
+        </w:rPr>
+        <w:t xml:space="preserve">mode runs, then continues one step further</w:t>
+      </w:r>
+      <w:r>
+        <w:t xml:space="preserve"> </w:t>
+      </w:r>
+      <w:r>
+        <w:t xml:space="preserve">— not a second pipeline that consumes a prior</w:t>
+      </w:r>
+      <w:r>
+        <w:t xml:space="preserve"> </w:t>
+      </w:r>
+      <w:r>
+        <w:rPr>
+          <w:rStyle w:val="VerbatimChar"/>
+        </w:rPr>
+        <w:t xml:space="preserve">instrument</w:t>
+      </w:r>
+      <w:r>
+        <w:t xml:space="preserve"> </w:t>
+      </w:r>
+      <w:r>
+        <w:t xml:space="preserve">invocation’s output. Every</w:t>
+      </w:r>
+      <w:r>
+        <w:t xml:space="preserve"> </w:t>
+      </w:r>
+      <w:r>
+        <w:rPr>
+          <w:rStyle w:val="VerbatimChar"/>
+        </w:rPr>
+        <w:t xml:space="preserve">trace</w:t>
+      </w:r>
+      <w:r>
+        <w:t xml:space="preserve"> </w:t>
+      </w:r>
+      <w:r>
+        <w:t xml:space="preserve">call builds its own instrumented binary; there is no</w:t>
+      </w:r>
+      <w:r>
+        <w:t xml:space="preserve"> </w:t>
+      </w:r>
+      <w:r>
+        <w:t xml:space="preserve">“</w:t>
+      </w:r>
+      <w:r>
+        <w:t xml:space="preserve">run</w:t>
+      </w:r>
+      <w:r>
+        <w:t xml:space="preserve"> </w:t>
+      </w:r>
+      <w:r>
+        <w:rPr>
+          <w:rStyle w:val="VerbatimChar"/>
+        </w:rPr>
+        <w:t xml:space="preserve">instrument</w:t>
+      </w:r>
+      <w:r>
+        <w:t xml:space="preserve"> </w:t>
+      </w:r>
+      <w:r>
+        <w:t xml:space="preserve">first, then</w:t>
+      </w:r>
+      <w:r>
+        <w:t xml:space="preserve"> </w:t>
+      </w:r>
+      <w:r>
+        <w:rPr>
+          <w:rStyle w:val="VerbatimChar"/>
+        </w:rPr>
+        <w:t xml:space="preserve">trace</w:t>
+      </w:r>
+      <w:r>
+        <w:t xml:space="preserve">”</w:t>
+      </w:r>
+      <w:r>
+        <w:t xml:space="preserve"> </w:t>
+      </w:r>
+      <w:r>
+        <w:t xml:space="preserve">required workflow. Both modes end by printing a ready-to-paste command for producing/reproducing a trace (</w:t>
+      </w:r>
+      <w:r>
+        <w:rPr>
+          <w:rStyle w:val="VerbatimChar"/>
+        </w:rPr>
+        <w:t xml:space="preserve">instrument</w:t>
+      </w:r>
+      <w:r>
+        <w:t xml:space="preserve"> </w:t>
+      </w:r>
+      <w:r>
+        <w:t xml:space="preserve">suggests the</w:t>
+      </w:r>
+      <w:r>
+        <w:t xml:space="preserve"> </w:t>
+      </w:r>
+      <w:r>
+        <w:rPr>
+          <w:rStyle w:val="VerbatimChar"/>
+        </w:rPr>
+        <w:t xml:space="preserve">trace</w:t>
+      </w:r>
+      <w:r>
+        <w:t xml:space="preserve"> </w:t>
+      </w:r>
+      <w:r>
+        <w:t xml:space="preserve">invocation that would use what it just built;</w:t>
+      </w:r>
+      <w:r>
+        <w:t xml:space="preserve"> </w:t>
+      </w:r>
+      <w:r>
+        <w:rPr>
+          <w:rStyle w:val="VerbatimChar"/>
+        </w:rPr>
+        <w:t xml:space="preserve">trace</w:t>
+      </w:r>
+      <w:r>
+        <w:t xml:space="preserve"> </w:t>
+      </w:r>
+      <w:r>
+        <w:t xml:space="preserve">echoes back the exact invocation it itself just ran).</w:t>
+      </w:r>
+      <w:r>
+        <w:t xml:space="preserve"> </w:t>
+      </w:r>
+      <w:r>
+        <w:t xml:space="preserve">- Also per explicit user direction:</w:t>
+      </w:r>
+      <w:r>
+        <w:t xml:space="preserve"> </w:t>
+      </w:r>
+      <w:r>
+        <w:rPr>
+          <w:rStyle w:val="VerbatimChar"/>
+        </w:rPr>
+        <w:t xml:space="preserve">trace</w:t>
+      </w:r>
+      <w:r>
+        <w:t xml:space="preserve"> </w:t>
+      </w:r>
+      <w:r>
+        <w:t xml:space="preserve">mode always exports</w:t>
+      </w:r>
+      <w:r>
+        <w:t xml:space="preserve"> </w:t>
+      </w:r>
+      <w:r>
+        <w:rPr>
+          <w:rStyle w:val="VerbatimChar"/>
+        </w:rPr>
+        <w:t xml:space="preserve">ROCPROFSYS_USE_ROCM=1</w:t>
+      </w:r>
+      <w:r>
+        <w:t xml:space="preserve">/</w:t>
+      </w:r>
+      <w:r>
+        <w:rPr>
+          <w:rStyle w:val="VerbatimChar"/>
+        </w:rPr>
+        <w:t xml:space="preserve">ROCPROFSYS_USE_OMPT=1</w:t>
+      </w:r>
+      <w:r>
+        <w:t xml:space="preserve">/</w:t>
+      </w:r>
+      <w:r>
+        <w:rPr>
+          <w:rStyle w:val="VerbatimChar"/>
+        </w:rPr>
+        <w:t xml:space="preserve">ROCPROFSYS_USE_MPIP=1</w:t>
+      </w:r>
+      <w:r>
+        <w:t xml:space="preserve"> </w:t>
+      </w:r>
+      <w:r>
+        <w:t xml:space="preserve">alongside</w:t>
+      </w:r>
+      <w:r>
+        <w:t xml:space="preserve"> </w:t>
+      </w:r>
+      <w:r>
+        <w:rPr>
+          <w:rStyle w:val="VerbatimChar"/>
+        </w:rPr>
+        <w:t xml:space="preserve">ROCPROFSYS_TRACE=1</w:t>
+      </w:r>
+      <w:r>
+        <w:t xml:space="preserve">, regardless of their own defaults, so the trace captures GPU kernels, OpenMP regions, and MPI calls automatically — not just the selectively-instrumented hotspot functions — since these are separate, lightweight runtime interceptors unrelated to the Dyninst rewrite itself.</w:t>
+      </w:r>
+    </w:p>
+    <w:p>
+      <w:pPr>
+        <w:pStyle w:val="BodyText"/>
+      </w:pPr>
+      <w:r>
+        <w:t xml:space="preserve">Two pieces:</w:t>
+      </w:r>
+      <w:r>
+        <w:t xml:space="preserve"> </w:t>
+      </w:r>
+      <w:r>
+        <w:t xml:space="preserve">-</w:t>
+      </w:r>
+      <w:r>
+        <w:t xml:space="preserve"> </w:t>
+      </w:r>
+      <w:r>
+        <w:rPr>
+          <w:rStyle w:val="VerbatimChar"/>
+        </w:rPr>
+        <w:t xml:space="preserve">postprocess/select_hotspot_functions.py</w:t>
+      </w:r>
+      <w:r>
+        <w:t xml:space="preserve"> </w:t>
+      </w:r>
+      <w:r>
+        <w:t xml:space="preserve">—</w:t>
+      </w:r>
+      <w:r>
+        <w:t xml:space="preserve"> </w:t>
+      </w:r>
+      <w:r>
+        <w:rPr>
+          <w:rStyle w:val="VerbatimChar"/>
+        </w:rPr>
+        <w:t xml:space="preserve">labels_from_report()</w:t>
+      </w:r>
+      <w:r>
+        <w:t xml:space="preserve">/</w:t>
+      </w:r>
+      <w:r>
+        <w:rPr>
+          <w:rStyle w:val="VerbatimChar"/>
+        </w:rPr>
+        <w:t xml:space="preserve">labels_from_output_dir()</w:t>
+      </w:r>
+      <w:r>
+        <w:t xml:space="preserve"> </w:t>
+      </w:r>
+      <w:r>
+        <w:t xml:space="preserve">resolve a hotspot function list from either a saved</w:t>
+      </w:r>
+      <w:r>
+        <w:t xml:space="preserve"> </w:t>
+      </w:r>
+      <w:r>
+        <w:rPr>
+          <w:rStyle w:val="VerbatimChar"/>
+        </w:rPr>
+        <w:t xml:space="preserve">hotspots.txt</w:t>
+      </w:r>
+      <w:r>
+        <w:t xml:space="preserve"> </w:t>
+      </w:r>
+      <w:r>
+        <w:t xml:space="preserve">(reusing</w:t>
+      </w:r>
+      <w:r>
+        <w:t xml:space="preserve"> </w:t>
+      </w:r>
+      <w:r>
+        <w:rPr>
+          <w:rStyle w:val="VerbatimChar"/>
+        </w:rPr>
+        <w:t xml:space="preserve">extract_CPU_hotspots.py</w:t>
+      </w:r>
+      <w:r>
+        <w:t xml:space="preserve">’s exact table format) or a live rocprof-sys output directory (reusing</w:t>
+      </w:r>
+      <w:r>
+        <w:t xml:space="preserve"> </w:t>
+      </w:r>
+      <w:r>
+        <w:rPr>
+          <w:rStyle w:val="VerbatimChar"/>
+        </w:rPr>
+        <w:t xml:space="preserve">extract_CPU_hotspots.aggregate()</w:t>
+      </w:r>
+      <w:r>
+        <w:t xml:space="preserve">/</w:t>
+      </w:r>
+      <w:r>
+        <w:rPr>
+          <w:rStyle w:val="VerbatimChar"/>
+        </w:rPr>
+        <w:t xml:space="preserve">select_entries()</w:t>
+      </w:r>
+      <w:r>
+        <w:t xml:space="preserve"> </w:t>
+      </w:r>
+      <w:r>
+        <w:t xml:space="preserve">directly);</w:t>
+      </w:r>
+      <w:r>
+        <w:t xml:space="preserve"> </w:t>
+      </w:r>
+      <w:r>
+        <w:rPr>
+          <w:rStyle w:val="VerbatimChar"/>
+        </w:rPr>
+        <w:t xml:space="preserve">escape_for_instrument_regex()</w:t>
+      </w:r>
+      <w:r>
+        <w:t xml:space="preserve"> </w:t>
+      </w:r>
+      <w:r>
+        <w:t xml:space="preserve">builds a safe unanchored substring regex per label;</w:t>
+      </w:r>
+      <w:r>
+        <w:t xml:space="preserve"> </w:t>
+      </w:r>
+      <w:r>
+        <w:rPr>
+          <w:rStyle w:val="VerbatimChar"/>
+        </w:rPr>
+        <w:t xml:space="preserve">find_lost_functions()</w:t>
+      </w:r>
+      <w:r>
+        <w:t xml:space="preserve"> </w:t>
+      </w:r>
+      <w:r>
+        <w:t xml:space="preserve">diffs the resolved labels against</w:t>
+      </w:r>
+      <w:r>
+        <w:t xml:space="preserve"> </w:t>
+      </w:r>
+      <w:r>
+        <w:rPr>
+          <w:rStyle w:val="VerbatimChar"/>
+        </w:rPr>
+        <w:t xml:space="preserve">rocprof-sys-instrument</w:t>
+      </w:r>
+      <w:r>
+        <w:t xml:space="preserve">’s own</w:t>
+      </w:r>
+      <w:r>
+        <w:t xml:space="preserve"> </w:t>
+      </w:r>
+      <w:r>
+        <w:rPr>
+          <w:rStyle w:val="VerbatimChar"/>
+        </w:rPr>
+        <w:t xml:space="preserve">instrumented.json</w:t>
+      </w:r>
+      <w:r>
+        <w:t xml:space="preserve">; a</w:t>
+      </w:r>
+      <w:r>
+        <w:t xml:space="preserve"> </w:t>
+      </w:r>
+      <w:r>
+        <w:rPr>
+          <w:rStyle w:val="VerbatimChar"/>
+        </w:rPr>
+        <w:t xml:space="preserve">--check-instrumented</w:t>
+      </w:r>
+      <w:r>
+        <w:t xml:space="preserve"> </w:t>
+      </w:r>
+      <w:r>
+        <w:t xml:space="preserve">CLI mode reads labels from stdin and always exits 0, since a lost function is a warning, never a failure.</w:t>
+      </w:r>
+      <w:r>
+        <w:t xml:space="preserve"> </w:t>
+      </w:r>
+      <w:r>
+        <w:t xml:space="preserve">-</w:t>
+      </w:r>
+      <w:r>
+        <w:t xml:space="preserve"> </w:t>
+      </w:r>
+      <w:r>
+        <w:rPr>
+          <w:rStyle w:val="VerbatimChar"/>
+        </w:rPr>
+        <w:t xml:space="preserve">scripts/instrument_hotspots.sh</w:t>
+      </w:r>
+      <w:r>
+        <w:t xml:space="preserve"> </w:t>
+      </w:r>
+      <w:r>
+        <w:t xml:space="preserve">— one script,</w:t>
+      </w:r>
+      <w:r>
+        <w:t xml:space="preserve"> </w:t>
+      </w:r>
+      <w:r>
+        <w:rPr>
+          <w:rStyle w:val="VerbatimChar"/>
+        </w:rPr>
+        <w:t xml:space="preserve">instrument</w:t>
+      </w:r>
+      <w:r>
+        <w:t xml:space="preserve">/</w:t>
+      </w:r>
+      <w:r>
+        <w:rPr>
+          <w:rStyle w:val="VerbatimChar"/>
+        </w:rPr>
+        <w:t xml:space="preserve">trace</w:t>
+      </w:r>
+      <w:r>
+        <w:t xml:space="preserve"> </w:t>
+      </w:r>
+      <w:r>
+        <w:t xml:space="preserve">subcommands sharing the same build pipeline (auto-profile or</w:t>
+      </w:r>
+      <w:r>
+        <w:t xml:space="preserve"> </w:t>
+      </w:r>
+      <w:r>
+        <w:rPr>
+          <w:rStyle w:val="VerbatimChar"/>
+        </w:rPr>
+        <w:t xml:space="preserve">--report</w:t>
+      </w:r>
+      <w:r>
+        <w:t xml:space="preserve"> </w:t>
+      </w:r>
+      <w:r>
+        <w:t xml:space="preserve">→ resolve labels → rewrite → lost-function check), with</w:t>
+      </w:r>
+      <w:r>
+        <w:t xml:space="preserve"> </w:t>
+      </w:r>
+      <w:r>
+        <w:rPr>
+          <w:rStyle w:val="VerbatimChar"/>
+        </w:rPr>
+        <w:t xml:space="preserve">trace</w:t>
+      </w:r>
+      <w:r>
+        <w:t xml:space="preserve"> </w:t>
+      </w:r>
+      <w:r>
+        <w:t xml:space="preserve">continuing into a final</w:t>
+      </w:r>
+      <w:r>
+        <w:t xml:space="preserve"> </w:t>
+      </w:r>
+      <w:r>
+        <w:rPr>
+          <w:rStyle w:val="VerbatimChar"/>
+        </w:rPr>
+        <w:t xml:space="preserve">rocprof-sys-run</w:t>
+      </w:r>
+      <w:r>
+        <w:t xml:space="preserve"> </w:t>
+      </w:r>
+      <w:r>
+        <w:t xml:space="preserve">step the other mode never reaches.</w:t>
+      </w:r>
+    </w:p>
+    <w:p>
+      <w:pPr>
+        <w:pStyle w:val="BodyText"/>
+      </w:pPr>
+      <w:r>
+        <w:t xml:space="preserve">Verified locally (no ROCm/GPU available, same constraint as tools 1-3):</w:t>
+      </w:r>
+      <w:r>
+        <w:t xml:space="preserve"> </w:t>
+      </w:r>
+      <w:r>
+        <w:rPr>
+          <w:rStyle w:val="VerbatimChar"/>
+        </w:rPr>
+        <w:t xml:space="preserve">python3 -m unittest</w:t>
+      </w:r>
+      <w:r>
+        <w:t xml:space="preserve"> </w:t>
+      </w:r>
+      <w:r>
+        <w:t xml:space="preserve">added 25 new tests (93 total across all four tools) covering the regex escaper, both label-resolution paths against existing fixtures (including a combined report generated fresh at test time, to stay in sync with the real generator rather than a fixture that could drift),</w:t>
+      </w:r>
+      <w:r>
+        <w:t xml:space="preserve"> </w:t>
+      </w:r>
+      <w:r>
+        <w:rPr>
+          <w:rStyle w:val="VerbatimChar"/>
+        </w:rPr>
+        <w:t xml:space="preserve">find_lost_functions</w:t>
+      </w:r>
+      <w:r>
+        <w:t xml:space="preserve"> </w:t>
+      </w:r>
+      <w:r>
+        <w:t xml:space="preserve">against a hand-crafted</w:t>
+      </w:r>
+      <w:r>
+        <w:t xml:space="preserve"> </w:t>
+      </w:r>
+      <w:r>
+        <w:rPr>
+          <w:rStyle w:val="VerbatimChar"/>
+        </w:rPr>
+        <w:t xml:space="preserve">instrumented.json</w:t>
+      </w:r>
+      <w:r>
+        <w:t xml:space="preserve"> </w:t>
+      </w:r>
+      <w:r>
+        <w:t xml:space="preserve">matching the confirmed schema, and both CLI modes.</w:t>
+      </w:r>
+      <w:r>
+        <w:t xml:space="preserve"> </w:t>
+      </w:r>
+      <w:r>
+        <w:rPr>
+          <w:rStyle w:val="VerbatimChar"/>
+        </w:rPr>
+        <w:t xml:space="preserve">bash -n</w:t>
+      </w:r>
+      <w:r>
+        <w:t xml:space="preserve"> </w:t>
+      </w:r>
+      <w:r>
+        <w:t xml:space="preserve">on the launcher (shellcheck still not installed here). Manual verification used stubbed</w:t>
+      </w:r>
+      <w:r>
+        <w:t xml:space="preserve"> </w:t>
+      </w:r>
+      <w:r>
+        <w:rPr>
+          <w:rStyle w:val="VerbatimChar"/>
+        </w:rPr>
+        <w:t xml:space="preserve">rocprof-sys-instrument</w:t>
+      </w:r>
+      <w:r>
+        <w:t xml:space="preserve">/</w:t>
+      </w:r>
+      <w:r>
+        <w:rPr>
+          <w:rStyle w:val="VerbatimChar"/>
+        </w:rPr>
+        <w:t xml:space="preserve">rocprof-sys-run</w:t>
+      </w:r>
+      <w:r>
+        <w:t xml:space="preserve">/</w:t>
+      </w:r>
+      <w:r>
+        <w:rPr>
+          <w:rStyle w:val="VerbatimChar"/>
+        </w:rPr>
+        <w:t xml:space="preserve">rocprof-sys-sample</w:t>
+      </w:r>
+      <w:r>
+        <w:t xml:space="preserve">/</w:t>
+      </w:r>
+      <w:r>
+        <w:rPr>
+          <w:rStyle w:val="VerbatimChar"/>
+        </w:rPr>
+        <w:t xml:space="preserve">rocprofv3</w:t>
+      </w:r>
+      <w:r>
+        <w:t xml:space="preserve"> </w:t>
+      </w:r>
+      <w:r>
+        <w:t xml:space="preserve">on</w:t>
+      </w:r>
+      <w:r>
+        <w:t xml:space="preserve"> </w:t>
+      </w:r>
+      <w:r>
+        <w:rPr>
+          <w:rStyle w:val="VerbatimChar"/>
+        </w:rPr>
+        <w:t xml:space="preserve">PATH</w:t>
+      </w:r>
+      <w:r>
+        <w:t xml:space="preserve">: confirmed</w:t>
+      </w:r>
+      <w:r>
+        <w:t xml:space="preserve"> </w:t>
+      </w:r>
+      <w:r>
+        <w:rPr>
+          <w:rStyle w:val="VerbatimChar"/>
+        </w:rPr>
+        <w:t xml:space="preserve">--mpi</w:t>
+      </w:r>
+      <w:r>
+        <w:t xml:space="preserve"> </w:t>
+      </w:r>
+      <w:r>
+        <w:t xml:space="preserve">is applied to the auto-profiling and final-run commands but never to the rewrite command in the same</w:t>
+      </w:r>
+      <w:r>
+        <w:t xml:space="preserve"> </w:t>
+      </w:r>
+      <w:r>
+        <w:rPr>
+          <w:rStyle w:val="VerbatimChar"/>
+        </w:rPr>
+        <w:t xml:space="preserve">--dry-run</w:t>
+      </w:r>
+      <w:r>
+        <w:t xml:space="preserve"> </w:t>
+      </w:r>
+      <w:r>
+        <w:t xml:space="preserve">output; a full</w:t>
+      </w:r>
+      <w:r>
+        <w:t xml:space="preserve"> </w:t>
+      </w:r>
+      <w:r>
+        <w:rPr>
+          <w:rStyle w:val="VerbatimChar"/>
+        </w:rPr>
+        <w:t xml:space="preserve">instrument</w:t>
+      </w:r>
+      <w:r>
+        <w:t xml:space="preserve"> </w:t>
+      </w:r>
+      <w:r>
+        <w:t xml:space="preserve">run building a real (stubbed) instrumented binary and correctly warning about one deliberately-dropped function; a full</w:t>
+      </w:r>
+      <w:r>
+        <w:t xml:space="preserve"> </w:t>
+      </w:r>
+      <w:r>
+        <w:rPr>
+          <w:rStyle w:val="VerbatimChar"/>
+        </w:rPr>
+        <w:t xml:space="preserve">trace</w:t>
+      </w:r>
+      <w:r>
+        <w:t xml:space="preserve"> </w:t>
+      </w:r>
+      <w:r>
+        <w:t xml:space="preserve">run continuing straight into a produced trace file;</w:t>
+      </w:r>
+      <w:r>
+        <w:t xml:space="preserve"> </w:t>
+      </w:r>
+      <w:r>
+        <w:rPr>
+          <w:rStyle w:val="VerbatimChar"/>
+        </w:rPr>
+        <w:t xml:space="preserve">--report</w:t>
+      </w:r>
+      <w:r>
+        <w:t xml:space="preserve"> </w:t>
+      </w:r>
+      <w:r>
+        <w:t xml:space="preserve">short-circuiting auto-profiling entirely, with and without</w:t>
+      </w:r>
+      <w:r>
+        <w:t xml:space="preserve"> </w:t>
+      </w:r>
+      <w:r>
+        <w:rPr>
+          <w:rStyle w:val="VerbatimChar"/>
+        </w:rPr>
+        <w:t xml:space="preserve">--mpi</w:t>
+      </w:r>
+      <w:r>
+        <w:t xml:space="preserve"> </w:t>
+      </w:r>
+      <w:r>
+        <w:t xml:space="preserve">(which has no effect on that path); missing-dependency and non-existent/non-executable-binary errors for both modes. Real end-to-end validation against actual ROCm output is left to the user on the HPC system.</w:t>
+      </w:r>
+    </w:p>
+    <w:bookmarkEnd w:id="33"/>
+    <w:bookmarkEnd w:id="34"/>
     <w:sectPr/>
   </w:body>
 </w:document>

</xml_diff>

<commit_message>
Add load-imbalance tables to tools 1, 2, and 3
Each output file is already one MPI rank's own data, so this needed no
rebuild/instrumentation -- just a new aggregate_per_rank()/
compute_load_imbalance()/format_table_load_imbalance() trio in
extract_CPU_hotspots.py and extract_GPU_hotspots.py, wired into their own
write_report() and reused directly by extract_hotspots.py for tables 5/6.
Ranked independently by std_dev (not the hotspots table's selection), with
--threshold reinterpreted as coefficient of variation for this table.

Co-Authored-By: Claude Sonnet 5 <noreply@anthropic.com>
</commit_message>
<xml_diff>
--- a/docs/DEVELOPMENT_HISTORY.docx
+++ b/docs/DEVELOPMENT_HISTORY.docx
@@ -10,7 +10,7 @@
         <w:t xml:space="preserve">Development History</w:t>
       </w:r>
     </w:p>
-    <w:bookmarkStart w:id="34" w:name="development-history"/>
+    <w:bookmarkStart w:id="36" w:name="development-history"/>
     <w:p>
       <w:pPr>
         <w:pStyle w:val="Heading1"/>
@@ -308,6 +308,32 @@
           </w:p>
         </w:tc>
       </w:tr>
+      <w:tr>
+        <w:tc>
+          <w:tcPr/>
+          <w:p>
+            <w:pPr>
+              <w:pStyle w:val="Compact"/>
+              <w:jc w:val="left"/>
+            </w:pPr>
+            <w:r>
+              <w:t xml:space="preserve">2026-08-03</w:t>
+            </w:r>
+          </w:p>
+        </w:tc>
+        <w:tc>
+          <w:tcPr/>
+          <w:p>
+            <w:pPr>
+              <w:pStyle w:val="Compact"/>
+              <w:jc w:val="left"/>
+            </w:pPr>
+            <w:r>
+              <w:t xml:space="preserve">Load-imbalance tables added to tools 1, 2, and 3</w:t>
+            </w:r>
+          </w:p>
+        </w:tc>
+      </w:tr>
     </w:tbl>
     <w:bookmarkStart w:id="20" w:name="project-scaffolding-and-rules"/>
     <w:p>
@@ -5133,7 +5159,865 @@
       </w:r>
     </w:p>
     <w:bookmarkEnd w:id="33"/>
-    <w:bookmarkEnd w:id="34"/>
+    <w:bookmarkStart w:id="35" w:name="X1324686d0265ad5d63bc275bf93c9ecb0d2ba53"/>
+    <w:p>
+      <w:pPr>
+        <w:pStyle w:val="Heading2"/>
+      </w:pPr>
+      <w:r>
+        <w:t xml:space="preserve">2026-08-03 — Load-imbalance tables added to tools 1, 2, and 3</w:t>
+      </w:r>
+    </w:p>
+    <w:p>
+      <w:pPr>
+        <w:pStyle w:val="FirstParagraph"/>
+      </w:pPr>
+      <w:r>
+        <w:t xml:space="preserve">The user ran</w:t>
+      </w:r>
+      <w:r>
+        <w:t xml:space="preserve"> </w:t>
+      </w:r>
+      <w:r>
+        <w:rPr>
+          <w:rStyle w:val="VerbatimChar"/>
+        </w:rPr>
+        <w:t xml:space="preserve">profile_CPU_hotspots.sh</w:t>
+      </w:r>
+      <w:r>
+        <w:t xml:space="preserve"> </w:t>
+      </w:r>
+      <w:r>
+        <w:t xml:space="preserve">on the real HPC system and confirmed it already captures</w:t>
+      </w:r>
+      <w:r>
+        <w:t xml:space="preserve"> </w:t>
+      </w:r>
+      <w:r>
+        <w:rPr>
+          <w:rStyle w:val="VerbatimChar"/>
+        </w:rPr>
+        <w:t xml:space="preserve">MPI_*</w:t>
+      </w:r>
+      <w:r>
+        <w:t xml:space="preserve"> </w:t>
+      </w:r>
+      <w:r>
+        <w:t xml:space="preserve">function calls even without the launcher setting</w:t>
+      </w:r>
+      <w:r>
+        <w:t xml:space="preserve"> </w:t>
+      </w:r>
+      <w:r>
+        <w:rPr>
+          <w:rStyle w:val="VerbatimChar"/>
+        </w:rPr>
+        <w:t xml:space="preserve">ROCPROFSYS_USE_MPIP</w:t>
+      </w:r>
+      <w:r>
+        <w:t xml:space="preserve"> </w:t>
+      </w:r>
+      <w:r>
+        <w:t xml:space="preserve">explicitly — that variable defaults to</w:t>
+      </w:r>
+      <w:r>
+        <w:t xml:space="preserve"> </w:t>
+      </w:r>
+      <w:r>
+        <w:rPr>
+          <w:rStyle w:val="VerbatimChar"/>
+        </w:rPr>
+        <w:t xml:space="preserve">true</w:t>
+      </w:r>
+      <w:r>
+        <w:t xml:space="preserve"> </w:t>
+      </w:r>
+      <w:r>
+        <w:t xml:space="preserve">in rocprof-sys itself, confirming the target system’s rocprof-sys build has full MPI support compiled in. Combined with an already-established fact — rocprof-sys’s raw label format is</w:t>
+      </w:r>
+      <w:r>
+        <w:t xml:space="preserve"> </w:t>
+      </w:r>
+      <w:r>
+        <w:rPr>
+          <w:rStyle w:val="VerbatimChar"/>
+        </w:rPr>
+        <w:t xml:space="preserve">|MM|NN&gt;&gt;&gt;label</w:t>
+      </w:r>
+      <w:r>
+        <w:t xml:space="preserve"> </w:t>
+      </w:r>
+      <w:r>
+        <w:t xml:space="preserve">(MM = rank, NN = thread) and every</w:t>
+      </w:r>
+      <w:r>
+        <w:t xml:space="preserve"> </w:t>
+      </w:r>
+      <w:r>
+        <w:rPr>
+          <w:rStyle w:val="VerbatimChar"/>
+        </w:rPr>
+        <w:t xml:space="preserve">wall_clock-&lt;PID&gt;.txt</w:t>
+      </w:r>
+      <w:r>
+        <w:t xml:space="preserve"> </w:t>
+      </w:r>
+      <w:r>
+        <w:t xml:space="preserve">file is already one-file-per-process — this meant a per-rank load-imbalance analysis needed no rebuild or instrumentation (tool 4’s mechanism): the data was already present in tools 1-3’s normal sampling output. Implemented per the approved plan in</w:t>
+      </w:r>
+      <w:r>
+        <w:t xml:space="preserve"> </w:t>
+      </w:r>
+      <w:hyperlink r:id="rId34">
+        <w:r>
+          <w:rPr>
+            <w:rStyle w:val="Hyperlink"/>
+          </w:rPr>
+          <w:t xml:space="preserve">docs/plans/05-load-imbalance.md</w:t>
+        </w:r>
+      </w:hyperlink>
+      <w:r>
+        <w:t xml:space="preserve">.</w:t>
+      </w:r>
+    </w:p>
+    <w:p>
+      <w:pPr>
+        <w:pStyle w:val="BodyText"/>
+      </w:pPr>
+      <w:r>
+        <w:t xml:space="preserve">Design decisions, made explicit during planning:</w:t>
+      </w:r>
+      <w:r>
+        <w:t xml:space="preserve"> </w:t>
+      </w:r>
+      <w:r>
+        <w:t xml:space="preserve">-</w:t>
+      </w:r>
+      <w:r>
+        <w:t xml:space="preserve"> </w:t>
+      </w:r>
+      <w:r>
+        <w:rPr>
+          <w:bCs/>
+          <w:b/>
+        </w:rPr>
+        <w:t xml:space="preserve">Rank = scanned file, not the raw</w:t>
+      </w:r>
+      <w:r>
+        <w:rPr>
+          <w:bCs/>
+          <w:b/>
+        </w:rPr>
+        <w:t xml:space="preserve"> </w:t>
+      </w:r>
+      <w:r>
+        <w:rPr>
+          <w:rStyle w:val="VerbatimChar"/>
+          <w:bCs/>
+          <w:b/>
+        </w:rPr>
+        <w:t xml:space="preserve">MM</w:t>
+      </w:r>
+      <w:r>
+        <w:rPr>
+          <w:bCs/>
+          <w:b/>
+        </w:rPr>
+        <w:t xml:space="preserve"> </w:t>
+      </w:r>
+      <w:r>
+        <w:rPr>
+          <w:bCs/>
+          <w:b/>
+        </w:rPr>
+        <w:t xml:space="preserve">digit.</w:t>
+      </w:r>
+      <w:r>
+        <w:t xml:space="preserve"> </w:t>
+      </w:r>
+      <w:r>
+        <w:t xml:space="preserve">Grouping by which output file a row came from (the same assumption</w:t>
+      </w:r>
+      <w:r>
+        <w:t xml:space="preserve"> </w:t>
+      </w:r>
+      <w:r>
+        <w:rPr>
+          <w:rStyle w:val="VerbatimChar"/>
+        </w:rPr>
+        <w:t xml:space="preserve">guess_num_ranks()</w:t>
+      </w:r>
+      <w:r>
+        <w:t xml:space="preserve"> </w:t>
+      </w:r>
+      <w:r>
+        <w:t xml:space="preserve">already relies on) is simpler and more robust than re-parsing</w:t>
+      </w:r>
+      <w:r>
+        <w:t xml:space="preserve"> </w:t>
+      </w:r>
+      <w:r>
+        <w:rPr>
+          <w:rStyle w:val="VerbatimChar"/>
+        </w:rPr>
+        <w:t xml:space="preserve">MM</w:t>
+      </w:r>
+      <w:r>
+        <w:t xml:space="preserve"> </w:t>
+      </w:r>
+      <w:r>
+        <w:t xml:space="preserve">out of every raw label, and needed zero changes to</w:t>
+      </w:r>
+      <w:r>
+        <w:t xml:space="preserve"> </w:t>
+      </w:r>
+      <w:r>
+        <w:rPr>
+          <w:rStyle w:val="VerbatimChar"/>
+        </w:rPr>
+        <w:t xml:space="preserve">clean_label()</w:t>
+      </w:r>
+      <w:r>
+        <w:t xml:space="preserve">/the existing text-table parsing.</w:t>
+      </w:r>
+      <w:r>
+        <w:t xml:space="preserve"> </w:t>
+      </w:r>
+      <w:r>
+        <w:t xml:space="preserve">-</w:t>
+      </w:r>
+      <w:r>
+        <w:t xml:space="preserve"> </w:t>
+      </w:r>
+      <w:r>
+        <w:rPr>
+          <w:bCs/>
+          <w:b/>
+        </w:rPr>
+        <w:t xml:space="preserve">A rank missing a function scores 0.0 for that rank, not skipped.</w:t>
+      </w:r>
+      <w:r>
+        <w:t xml:space="preserve"> </w:t>
+      </w:r>
+      <w:r>
+        <w:t xml:space="preserve">A function that only runs on some ranks (rank-dependent branching) is real, extreme imbalance and should show up, not be hidden by only averaging over the ranks that happened to call it.</w:t>
+      </w:r>
+      <w:r>
+        <w:t xml:space="preserve"> </w:t>
+      </w:r>
+      <w:r>
+        <w:t xml:space="preserve">-</w:t>
+      </w:r>
+      <w:r>
+        <w:t xml:space="preserve"> </w:t>
+      </w:r>
+      <w:r>
+        <w:rPr>
+          <w:bCs/>
+          <w:b/>
+        </w:rPr>
+        <w:t xml:space="preserve">The new table is an independent ranking by</w:t>
+      </w:r>
+      <w:r>
+        <w:rPr>
+          <w:bCs/>
+          <w:b/>
+        </w:rPr>
+        <w:t xml:space="preserve"> </w:t>
+      </w:r>
+      <w:r>
+        <w:rPr>
+          <w:rStyle w:val="VerbatimChar"/>
+          <w:bCs/>
+          <w:b/>
+        </w:rPr>
+        <w:t xml:space="preserve">std_dev</w:t>
+      </w:r>
+      <w:r>
+        <w:t xml:space="preserve"> </w:t>
+      </w:r>
+      <w:r>
+        <w:t xml:space="preserve">(the user’s explicit choice over reusing the hotspots table’s already-selected entries) — a function small in total time but wildly imbalanced across ranks would otherwise never be visible. Uses the same</w:t>
+      </w:r>
+      <w:r>
+        <w:t xml:space="preserve"> </w:t>
+      </w:r>
+      <w:r>
+        <w:rPr>
+          <w:rStyle w:val="VerbatimChar"/>
+        </w:rPr>
+        <w:t xml:space="preserve">--top</w:t>
+      </w:r>
+      <w:r>
+        <w:t xml:space="preserve">/</w:t>
+      </w:r>
+      <w:r>
+        <w:rPr>
+          <w:rStyle w:val="VerbatimChar"/>
+        </w:rPr>
+        <w:t xml:space="preserve">--threshold</w:t>
+      </w:r>
+      <w:r>
+        <w:t xml:space="preserve">/</w:t>
+      </w:r>
+      <w:r>
+        <w:rPr>
+          <w:rStyle w:val="VerbatimChar"/>
+        </w:rPr>
+        <w:t xml:space="preserve">--all</w:t>
+      </w:r>
+      <w:r>
+        <w:t xml:space="preserve"> </w:t>
+      </w:r>
+      <w:r>
+        <w:t xml:space="preserve">flags already exposed by each tool;</w:t>
+      </w:r>
+      <w:r>
+        <w:t xml:space="preserve"> </w:t>
+      </w:r>
+      <w:r>
+        <w:rPr>
+          <w:rStyle w:val="VerbatimChar"/>
+        </w:rPr>
+        <w:t xml:space="preserve">--threshold PCT</w:t>
+      </w:r>
+      <w:r>
+        <w:t xml:space="preserve"> </w:t>
+      </w:r>
+      <w:r>
+        <w:t xml:space="preserve">is reinterpreted for this table only as</w:t>
+      </w:r>
+      <w:r>
+        <w:t xml:space="preserve"> </w:t>
+      </w:r>
+      <w:r>
+        <w:rPr>
+          <w:iCs/>
+          <w:i/>
+        </w:rPr>
+        <w:t xml:space="preserve">coefficient of variation</w:t>
+      </w:r>
+      <w:r>
+        <w:t xml:space="preserve"> </w:t>
+      </w:r>
+      <w:r>
+        <w:t xml:space="preserve">(</w:t>
+      </w:r>
+      <w:r>
+        <w:rPr>
+          <w:rStyle w:val="VerbatimChar"/>
+        </w:rPr>
+        <w:t xml:space="preserve">std_dev / avg &gt;= PCT%</w:t>
+      </w:r>
+      <w:r>
+        <w:t xml:space="preserve">), since</w:t>
+      </w:r>
+      <w:r>
+        <w:t xml:space="preserve"> </w:t>
+      </w:r>
+      <w:r>
+        <w:t xml:space="preserve">“</w:t>
+      </w:r>
+      <w:r>
+        <w:t xml:space="preserve">% of total runtime</w:t>
+      </w:r>
+      <w:r>
+        <w:t xml:space="preserve">”</w:t>
+      </w:r>
+      <w:r>
+        <w:t xml:space="preserve"> </w:t>
+      </w:r>
+      <w:r>
+        <w:t xml:space="preserve">has no equivalent meaning for a std_dev ranking.</w:t>
+      </w:r>
+      <w:r>
+        <w:t xml:space="preserve"> </w:t>
+      </w:r>
+      <w:r>
+        <w:t xml:space="preserve">-</w:t>
+      </w:r>
+      <w:r>
+        <w:t xml:space="preserve"> </w:t>
+      </w:r>
+      <w:r>
+        <w:rPr>
+          <w:bCs/>
+          <w:b/>
+        </w:rPr>
+        <w:t xml:space="preserve">Fewer than 2 ranks/files scanned → skip the table</w:t>
+      </w:r>
+      <w:r>
+        <w:t xml:space="preserve">, with a one-line note, rather than showing a table comparing one rank to itself.</w:t>
+      </w:r>
+    </w:p>
+    <w:p>
+      <w:pPr>
+        <w:pStyle w:val="BodyText"/>
+      </w:pPr>
+      <w:r>
+        <w:t xml:space="preserve">Implementation, in</w:t>
+      </w:r>
+      <w:r>
+        <w:t xml:space="preserve"> </w:t>
+      </w:r>
+      <w:r>
+        <w:rPr>
+          <w:rStyle w:val="VerbatimChar"/>
+        </w:rPr>
+        <w:t xml:space="preserve">postprocess/extract_CPU_hotspots.py</w:t>
+      </w:r>
+      <w:r>
+        <w:t xml:space="preserve"> </w:t>
+      </w:r>
+      <w:r>
+        <w:t xml:space="preserve">and</w:t>
+      </w:r>
+      <w:r>
+        <w:t xml:space="preserve"> </w:t>
+      </w:r>
+      <w:r>
+        <w:rPr>
+          <w:rStyle w:val="VerbatimChar"/>
+        </w:rPr>
+        <w:t xml:space="preserve">postprocess/extract_GPU_hotspots.py</w:t>
+      </w:r>
+      <w:r>
+        <w:t xml:space="preserve"> </w:t>
+      </w:r>
+      <w:r>
+        <w:t xml:space="preserve">(duplicated between the two, matching their existing stand-alone-by-design relationship):</w:t>
+      </w:r>
+      <w:r>
+        <w:t xml:space="preserve"> </w:t>
+      </w:r>
+      <w:r>
+        <w:rPr>
+          <w:rStyle w:val="VerbatimChar"/>
+        </w:rPr>
+        <w:t xml:space="preserve">aggregate_per_rank()</w:t>
+      </w:r>
+      <w:r>
+        <w:t xml:space="preserve"> </w:t>
+      </w:r>
+      <w:r>
+        <w:t xml:space="preserve">mirrors each module’s own</w:t>
+      </w:r>
+      <w:r>
+        <w:t xml:space="preserve"> </w:t>
+      </w:r>
+      <w:r>
+        <w:rPr>
+          <w:rStyle w:val="VerbatimChar"/>
+        </w:rPr>
+        <w:t xml:space="preserve">aggregate()</w:t>
+      </w:r>
+      <w:r>
+        <w:t xml:space="preserve"> </w:t>
+      </w:r>
+      <w:r>
+        <w:t xml:space="preserve">file-scanning loop but keeps each file’s per-label/per-kernel sums separate instead of merging across files;</w:t>
+      </w:r>
+      <w:r>
+        <w:t xml:space="preserve"> </w:t>
+      </w:r>
+      <w:r>
+        <w:rPr>
+          <w:rStyle w:val="VerbatimChar"/>
+        </w:rPr>
+        <w:t xml:space="preserve">compute_load_imbalance()</w:t>
+      </w:r>
+      <w:r>
+        <w:t xml:space="preserve"> </w:t>
+      </w:r>
+      <w:r>
+        <w:t xml:space="preserve">computes</w:t>
+      </w:r>
+      <w:r>
+        <w:t xml:space="preserve"> </w:t>
+      </w:r>
+      <w:r>
+        <w:rPr>
+          <w:rStyle w:val="VerbatimChar"/>
+        </w:rPr>
+        <w:t xml:space="preserve">avg</w:t>
+      </w:r>
+      <w:r>
+        <w:t xml:space="preserve">/</w:t>
+      </w:r>
+      <w:r>
+        <w:rPr>
+          <w:rStyle w:val="VerbatimChar"/>
+        </w:rPr>
+        <w:t xml:space="preserve">std_dev</w:t>
+      </w:r>
+      <w:r>
+        <w:t xml:space="preserve"> </w:t>
+      </w:r>
+      <w:r>
+        <w:t xml:space="preserve">(</w:t>
+      </w:r>
+      <w:r>
+        <w:rPr>
+          <w:rStyle w:val="VerbatimChar"/>
+        </w:rPr>
+        <w:t xml:space="preserve">statistics.mean</w:t>
+      </w:r>
+      <w:r>
+        <w:t xml:space="preserve">/</w:t>
+      </w:r>
+      <w:r>
+        <w:rPr>
+          <w:rStyle w:val="VerbatimChar"/>
+        </w:rPr>
+        <w:t xml:space="preserve">statistics.pstdev</w:t>
+      </w:r>
+      <w:r>
+        <w:t xml:space="preserve"> </w:t>
+      </w:r>
+      <w:r>
+        <w:t xml:space="preserve">— population, not sample, since every rank is captured, not a subset)/</w:t>
+      </w:r>
+      <w:r>
+        <w:rPr>
+          <w:rStyle w:val="VerbatimChar"/>
+        </w:rPr>
+        <w:t xml:space="preserve">min</w:t>
+      </w:r>
+      <w:r>
+        <w:t xml:space="preserve">/</w:t>
+      </w:r>
+      <w:r>
+        <w:rPr>
+          <w:rStyle w:val="VerbatimChar"/>
+        </w:rPr>
+        <w:t xml:space="preserve">max</w:t>
+      </w:r>
+      <w:r>
+        <w:t xml:space="preserve"> </w:t>
+      </w:r>
+      <w:r>
+        <w:t xml:space="preserve">per label across ranks (missing ranks scored 0.0) and applies the top/CV%-threshold/all selection described above;</w:t>
+      </w:r>
+      <w:r>
+        <w:t xml:space="preserve"> </w:t>
+      </w:r>
+      <w:r>
+        <w:rPr>
+          <w:rStyle w:val="VerbatimChar"/>
+        </w:rPr>
+        <w:t xml:space="preserve">format_table_load_imbalance()</w:t>
+      </w:r>
+      <w:r>
+        <w:t xml:space="preserve"> </w:t>
+      </w:r>
+      <w:r>
+        <w:t xml:space="preserve">renders</w:t>
+      </w:r>
+      <w:r>
+        <w:t xml:space="preserve"> </w:t>
+      </w:r>
+      <w:r>
+        <w:rPr>
+          <w:rStyle w:val="VerbatimChar"/>
+        </w:rPr>
+        <w:t xml:space="preserve">#, avg(s), std_dev, min(s), max(s), function|kernel</w:t>
+      </w:r>
+      <w:r>
+        <w:t xml:space="preserve">. Both modules’</w:t>
+      </w:r>
+      <w:r>
+        <w:t xml:space="preserve"> </w:t>
+      </w:r>
+      <w:r>
+        <w:rPr>
+          <w:rStyle w:val="VerbatimChar"/>
+        </w:rPr>
+        <w:t xml:space="preserve">write_report()</w:t>
+      </w:r>
+      <w:r>
+        <w:t xml:space="preserve"> </w:t>
+      </w:r>
+      <w:r>
+        <w:t xml:space="preserve">append the new table right after their existing hotspots table(s).</w:t>
+      </w:r>
+      <w:r>
+        <w:t xml:space="preserve"> </w:t>
+      </w:r>
+      <w:r>
+        <w:rPr>
+          <w:rStyle w:val="VerbatimChar"/>
+        </w:rPr>
+        <w:t xml:space="preserve">postprocess/extract_hotspots.py</w:t>
+      </w:r>
+      <w:r>
+        <w:t xml:space="preserve"> </w:t>
+      </w:r>
+      <w:r>
+        <w:t xml:space="preserve">(tool 3) adds tables 5 (CPU) and 6 (GPU) after the existing four, calling</w:t>
+      </w:r>
+      <w:r>
+        <w:t xml:space="preserve"> </w:t>
+      </w:r>
+      <w:r>
+        <w:rPr>
+          <w:rStyle w:val="VerbatimChar"/>
+        </w:rPr>
+        <w:t xml:space="preserve">cpu_tool</w:t>
+      </w:r>
+      <w:r>
+        <w:t xml:space="preserve">‘</w:t>
+      </w:r>
+      <w:r>
+        <w:t xml:space="preserve">s and</w:t>
+      </w:r>
+      <w:r>
+        <w:t xml:space="preserve"> </w:t>
+      </w:r>
+      <w:r>
+        <w:rPr>
+          <w:rStyle w:val="VerbatimChar"/>
+        </w:rPr>
+        <w:t xml:space="preserve">gpu_tool</w:t>
+      </w:r>
+      <w:r>
+        <w:t xml:space="preserve">’s new functions directly — exactly the</w:t>
+      </w:r>
+      <w:r>
+        <w:t xml:space="preserve"> </w:t>
+      </w:r>
+      <w:r>
+        <w:t xml:space="preserve">“</w:t>
+      </w:r>
+      <w:r>
+        <w:t xml:space="preserve">reuse tool 1 and 2’s new capabilities</w:t>
+      </w:r>
+      <w:r>
+        <w:t xml:space="preserve">”</w:t>
+      </w:r>
+      <w:r>
+        <w:t xml:space="preserve"> </w:t>
+      </w:r>
+      <w:r>
+        <w:t xml:space="preserve">the user anticipated, no new statistics logic of its own. All three launchers</w:t>
+      </w:r>
+      <w:r>
+        <w:t xml:space="preserve">’</w:t>
+      </w:r>
+      <w:r>
+        <w:t xml:space="preserve"> </w:t>
+      </w:r>
+      <w:r>
+        <w:rPr>
+          <w:rStyle w:val="VerbatimChar"/>
+        </w:rPr>
+        <w:t xml:space="preserve">-h</w:t>
+      </w:r>
+      <w:r>
+        <w:t xml:space="preserve">/</w:t>
+      </w:r>
+      <w:r>
+        <w:rPr>
+          <w:rStyle w:val="VerbatimChar"/>
+        </w:rPr>
+        <w:t xml:space="preserve">--help</w:t>
+      </w:r>
+      <w:r>
+        <w:t xml:space="preserve"> </w:t>
+      </w:r>
+      <w:r>
+        <w:t xml:space="preserve">text gained one sentence about the new table and a note on</w:t>
+      </w:r>
+      <w:r>
+        <w:t xml:space="preserve"> </w:t>
+      </w:r>
+      <w:r>
+        <w:rPr>
+          <w:rStyle w:val="VerbatimChar"/>
+        </w:rPr>
+        <w:t xml:space="preserve">--threshold</w:t>
+      </w:r>
+      <w:r>
+        <w:t xml:space="preserve">’s dual meaning; no new CLI flags were needed anywhere.</w:t>
+      </w:r>
+    </w:p>
+    <w:p>
+      <w:pPr>
+        <w:pStyle w:val="BodyText"/>
+      </w:pPr>
+      <w:r>
+        <w:t xml:space="preserve">Verified locally (no ROCm/GPU available, same constraint as the other four tools):</w:t>
+      </w:r>
+      <w:r>
+        <w:t xml:space="preserve"> </w:t>
+      </w:r>
+      <w:r>
+        <w:rPr>
+          <w:rStyle w:val="VerbatimChar"/>
+        </w:rPr>
+        <w:t xml:space="preserve">python3 -m unittest</w:t>
+      </w:r>
+      <w:r>
+        <w:t xml:space="preserve"> </w:t>
+      </w:r>
+      <w:r>
+        <w:t xml:space="preserve">added 26 new tests (119 total across all four tools) —</w:t>
+      </w:r>
+      <w:r>
+        <w:t xml:space="preserve"> </w:t>
+      </w:r>
+      <w:r>
+        <w:rPr>
+          <w:rStyle w:val="VerbatimChar"/>
+        </w:rPr>
+        <w:t xml:space="preserve">aggregate_per_rank</w:t>
+      </w:r>
+      <w:r>
+        <w:t xml:space="preserve"> </w:t>
+      </w:r>
+      <w:r>
+        <w:t xml:space="preserve">returning one dict per scanned file;</w:t>
+      </w:r>
+      <w:r>
+        <w:t xml:space="preserve"> </w:t>
+      </w:r>
+      <w:r>
+        <w:rPr>
+          <w:rStyle w:val="VerbatimChar"/>
+        </w:rPr>
+        <w:t xml:space="preserve">compute_load_imbalance</w:t>
+      </w:r>
+      <w:r>
+        <w:t xml:space="preserve">’s avg/std_dev/min/max matching independently-computed</w:t>
+      </w:r>
+      <w:r>
+        <w:t xml:space="preserve"> </w:t>
+      </w:r>
+      <w:r>
+        <w:rPr>
+          <w:rStyle w:val="VerbatimChar"/>
+        </w:rPr>
+        <w:t xml:space="preserve">statistics.mean</w:t>
+      </w:r>
+      <w:r>
+        <w:t xml:space="preserve">/</w:t>
+      </w:r>
+      <w:r>
+        <w:rPr>
+          <w:rStyle w:val="VerbatimChar"/>
+        </w:rPr>
+        <w:t xml:space="preserve">pstdev</w:t>
+      </w:r>
+      <w:r>
+        <w:t xml:space="preserve"> </w:t>
+      </w:r>
+      <w:r>
+        <w:t xml:space="preserve">on the same known fixture values (not hand-typed decimals); a label present on only one of several synthetic ranks scoring 0.0 for the others; the CV%-threshold and top-N-by-std_dev selections; single-rank fixtures producing the skip note instead of a table; the combined report’s tables 5/6 appearing after table 4 in order and matching</w:t>
+      </w:r>
+      <w:r>
+        <w:t xml:space="preserve"> </w:t>
+      </w:r>
+      <w:r>
+        <w:rPr>
+          <w:rStyle w:val="VerbatimChar"/>
+        </w:rPr>
+        <w:t xml:space="preserve">cpu_tool</w:t>
+      </w:r>
+      <w:r>
+        <w:t xml:space="preserve">/</w:t>
+      </w:r>
+      <w:r>
+        <w:rPr>
+          <w:rStyle w:val="VerbatimChar"/>
+        </w:rPr>
+        <w:t xml:space="preserve">gpu_tool</w:t>
+      </w:r>
+      <w:r>
+        <w:t xml:space="preserve">’s own functions called directly on the same fixtures.</w:t>
+      </w:r>
+      <w:r>
+        <w:t xml:space="preserve"> </w:t>
+      </w:r>
+      <w:r>
+        <w:rPr>
+          <w:rStyle w:val="VerbatimChar"/>
+        </w:rPr>
+        <w:t xml:space="preserve">bash -n</w:t>
+      </w:r>
+      <w:r>
+        <w:t xml:space="preserve"> </w:t>
+      </w:r>
+      <w:r>
+        <w:t xml:space="preserve">on all three launchers. Manual verification regenerated real reports from the</w:t>
+      </w:r>
+      <w:r>
+        <w:t xml:space="preserve"> </w:t>
+      </w:r>
+      <w:r>
+        <w:rPr>
+          <w:rStyle w:val="VerbatimChar"/>
+        </w:rPr>
+        <w:t xml:space="preserve">mpi_2rank</w:t>
+      </w:r>
+      <w:r>
+        <w:t xml:space="preserve">/</w:t>
+      </w:r>
+      <w:r>
+        <w:rPr>
+          <w:rStyle w:val="VerbatimChar"/>
+        </w:rPr>
+        <w:t xml:space="preserve">rocprofv3_mpi_2rank</w:t>
+      </w:r>
+      <w:r>
+        <w:t xml:space="preserve"> </w:t>
+      </w:r>
+      <w:r>
+        <w:t xml:space="preserve">fixtures through all three</w:t>
+      </w:r>
+      <w:r>
+        <w:t xml:space="preserve"> </w:t>
+      </w:r>
+      <w:r>
+        <w:rPr>
+          <w:rStyle w:val="VerbatimChar"/>
+        </w:rPr>
+        <w:t xml:space="preserve">write_report()</w:t>
+      </w:r>
+      <w:r>
+        <w:t xml:space="preserve">s and read the new tables directly —</w:t>
+      </w:r>
+      <w:r>
+        <w:t xml:space="preserve"> </w:t>
+      </w:r>
+      <w:r>
+        <w:rPr>
+          <w:rStyle w:val="VerbatimChar"/>
+        </w:rPr>
+        <w:t xml:space="preserve">compute_stencil</w:t>
+      </w:r>
+      <w:r>
+        <w:t xml:space="preserve"> </w:t>
+      </w:r>
+      <w:r>
+        <w:t xml:space="preserve">correctly outranked</w:t>
+      </w:r>
+      <w:r>
+        <w:t xml:space="preserve"> </w:t>
+      </w:r>
+      <w:r>
+        <w:rPr>
+          <w:rStyle w:val="VerbatimChar"/>
+        </w:rPr>
+        <w:t xml:space="preserve">main</w:t>
+      </w:r>
+      <w:r>
+        <w:t xml:space="preserve"> </w:t>
+      </w:r>
+      <w:r>
+        <w:t xml:space="preserve">by std_dev in the CPU table, and both the CPU and GPU skip-note paths were confirmed against the single-rank fixtures. Real end-to-end validation against actual ROCm output (including confirming the assumption that one output file per process really does correspond to one MPI rank on the target system) is left to the user on the HPC system.</w:t>
+      </w:r>
+    </w:p>
+    <w:bookmarkEnd w:id="35"/>
+    <w:bookmarkEnd w:id="36"/>
     <w:sectPr/>
   </w:body>
 </w:document>

</xml_diff>

<commit_message>
Fix nested-output-dir bug; unify --mpi invocation; rename default dirs
extract_CPU_hotspots.py only glob'd one directory level, so it missed
files rocprof-sys nests inside its own auto-generated timestamped output
subdirectory -- now recurses, matching extract_GPU_hotspots.py's existing
pattern (tools 3 and 4 inherit the fix automatically).

Tools 1-3 now take the MPI launch command as data via --mpi, the same
convention tool 4 already used, instead of expecting to be wrapped
externally by mpirun/srun -- one consistent invocation style across all
four tools, and it removes the old rank-0-only guard around each script's
summary step. Default output directories are renamed to match their
script names and now include a per-invocation timestamp, so re-running a
tool with no -o can no longer silently mix in a stale previous run.

Co-Authored-By: Claude Sonnet 5 <noreply@anthropic.com>
</commit_message>
<xml_diff>
--- a/docs/DEVELOPMENT_HISTORY.docx
+++ b/docs/DEVELOPMENT_HISTORY.docx
@@ -10,7 +10,7 @@
         <w:t xml:space="preserve">Development History</w:t>
       </w:r>
     </w:p>
-    <w:bookmarkStart w:id="36" w:name="development-history"/>
+    <w:bookmarkStart w:id="38" w:name="development-history"/>
     <w:p>
       <w:pPr>
         <w:pStyle w:val="Heading1"/>
@@ -334,6 +334,47 @@
           </w:p>
         </w:tc>
       </w:tr>
+      <w:tr>
+        <w:tc>
+          <w:tcPr/>
+          <w:p>
+            <w:pPr>
+              <w:pStyle w:val="Compact"/>
+              <w:jc w:val="left"/>
+            </w:pPr>
+            <w:r>
+              <w:t xml:space="preserve">2026-08-03</w:t>
+            </w:r>
+          </w:p>
+        </w:tc>
+        <w:tc>
+          <w:tcPr/>
+          <w:p>
+            <w:pPr>
+              <w:pStyle w:val="Compact"/>
+              <w:jc w:val="left"/>
+            </w:pPr>
+            <w:r>
+              <w:t xml:space="preserve">Fixed nested-output-dir bug; unified</w:t>
+            </w:r>
+            <w:r>
+              <w:t xml:space="preserve"> </w:t>
+            </w:r>
+            <w:r>
+              <w:rPr>
+                <w:rStyle w:val="VerbatimChar"/>
+              </w:rPr>
+              <w:t xml:space="preserve">--mpi</w:t>
+            </w:r>
+            <w:r>
+              <w:t xml:space="preserve"> </w:t>
+            </w:r>
+            <w:r>
+              <w:t xml:space="preserve">invocation across all four tools; renamed + timestamped default output directories</w:t>
+            </w:r>
+          </w:p>
+        </w:tc>
+      </w:tr>
     </w:tbl>
     <w:bookmarkStart w:id="20" w:name="project-scaffolding-and-rules"/>
     <w:p>
@@ -6017,7 +6058,1243 @@
       </w:r>
     </w:p>
     <w:bookmarkEnd w:id="35"/>
-    <w:bookmarkEnd w:id="36"/>
+    <w:bookmarkStart w:id="37" w:name="Xd48018049efd9d9b3ab5b634ff0b11e4c3496da"/>
+    <w:p>
+      <w:pPr>
+        <w:pStyle w:val="Heading2"/>
+      </w:pPr>
+      <w:r>
+        <w:t xml:space="preserve">2026-08-03 — Fixed nested-output-dir bug; unified</w:t>
+      </w:r>
+      <w:r>
+        <w:t xml:space="preserve"> </w:t>
+      </w:r>
+      <w:r>
+        <w:rPr>
+          <w:rStyle w:val="VerbatimChar"/>
+        </w:rPr>
+        <w:t xml:space="preserve">--mpi</w:t>
+      </w:r>
+      <w:r>
+        <w:t xml:space="preserve"> </w:t>
+      </w:r>
+      <w:r>
+        <w:t xml:space="preserve">invocation; renamed default directories</w:t>
+      </w:r>
+    </w:p>
+    <w:p>
+      <w:pPr>
+        <w:pStyle w:val="FirstParagraph"/>
+      </w:pPr>
+      <w:r>
+        <w:t xml:space="preserve">The user copied a real</w:t>
+      </w:r>
+      <w:r>
+        <w:t xml:space="preserve"> </w:t>
+      </w:r>
+      <w:r>
+        <w:rPr>
+          <w:rStyle w:val="VerbatimChar"/>
+        </w:rPr>
+        <w:t xml:space="preserve">rocprof-sys-sample</w:t>
+      </w:r>
+      <w:r>
+        <w:t xml:space="preserve"> </w:t>
+      </w:r>
+      <w:r>
+        <w:t xml:space="preserve">output directory from the HPC system into a local test case and ran tool 1’s extractor against it; it failed with</w:t>
+      </w:r>
+      <w:r>
+        <w:t xml:space="preserve"> </w:t>
+      </w:r>
+      <w:r>
+        <w:t xml:space="preserve">“</w:t>
+      </w:r>
+      <w:r>
+        <w:t xml:space="preserve">no rocprof-sys timemory text table found</w:t>
+      </w:r>
+      <w:r>
+        <w:t xml:space="preserve">”</w:t>
+      </w:r>
+      <w:r>
+        <w:t xml:space="preserve">. The real directory had every per-process file nested one level deeper than expected, inside an auto-generated</w:t>
+      </w:r>
+      <w:r>
+        <w:t xml:space="preserve"> </w:t>
+      </w:r>
+      <w:r>
+        <w:rPr>
+          <w:rStyle w:val="VerbatimChar"/>
+        </w:rPr>
+        <w:t xml:space="preserve">2026-08-03_09.24</w:t>
+      </w:r>
+      <w:r>
+        <w:t xml:space="preserve">-style timestamped subdirectory — rocprof-sys’s documented default</w:t>
+      </w:r>
+      <w:r>
+        <w:t xml:space="preserve"> </w:t>
+      </w:r>
+      <w:r>
+        <w:rPr>
+          <w:rStyle w:val="VerbatimChar"/>
+        </w:rPr>
+        <w:t xml:space="preserve">ROCPROFSYS_TIME_OUTPUT</w:t>
+      </w:r>
+      <w:r>
+        <w:t xml:space="preserve"> </w:t>
+      </w:r>
+      <w:r>
+        <w:t xml:space="preserve">behavior (</w:t>
+      </w:r>
+      <w:r>
+        <w:rPr>
+          <w:rStyle w:val="VerbatimChar"/>
+        </w:rPr>
+        <w:t xml:space="preserve">%F_%H.%M</w:t>
+      </w:r>
+      <w:r>
+        <w:t xml:space="preserve"> </w:t>
+      </w:r>
+      <w:r>
+        <w:t xml:space="preserve">strftime naming), already anticipated by this codebase’s</w:t>
+      </w:r>
+      <w:r>
+        <w:t xml:space="preserve"> </w:t>
+      </w:r>
+      <w:r>
+        <w:rPr>
+          <w:rStyle w:val="VerbatimChar"/>
+        </w:rPr>
+        <w:t xml:space="preserve">TIME_OUTPUT_DIR_RE</w:t>
+      </w:r>
+      <w:r>
+        <w:t xml:space="preserve"> </w:t>
+      </w:r>
+      <w:r>
+        <w:t xml:space="preserve">constant but never actually handled by the file-scanning code, which only</w:t>
+      </w:r>
+      <w:r>
+        <w:t xml:space="preserve"> </w:t>
+      </w:r>
+      <w:r>
+        <w:rPr>
+          <w:rStyle w:val="VerbatimChar"/>
+        </w:rPr>
+        <w:t xml:space="preserve">glob.glob()</w:t>
+      </w:r>
+      <w:r>
+        <w:t xml:space="preserve">’d one level deep. Implemented per the approved plan in</w:t>
+      </w:r>
+      <w:r>
+        <w:t xml:space="preserve"> </w:t>
+      </w:r>
+      <w:hyperlink r:id="rId36">
+        <w:r>
+          <w:rPr>
+            <w:rStyle w:val="Hyperlink"/>
+          </w:rPr>
+          <w:t xml:space="preserve">docs/plans/06-nested-dir-fix-mpi-unification-default-dirs.md</w:t>
+        </w:r>
+      </w:hyperlink>
+      <w:r>
+        <w:t xml:space="preserve">, which grew substantially in scope during planning as the user’s follow-up questions reframed the underlying design.</w:t>
+      </w:r>
+    </w:p>
+    <w:p>
+      <w:pPr>
+        <w:pStyle w:val="BodyText"/>
+      </w:pPr>
+      <w:r>
+        <w:rPr>
+          <w:bCs/>
+          <w:b/>
+        </w:rPr>
+        <w:t xml:space="preserve">Part A — the bug fix.</w:t>
+      </w:r>
+      <w:r>
+        <w:t xml:space="preserve"> </w:t>
+      </w:r>
+      <w:r>
+        <w:t xml:space="preserve">Every filesystem scan in</w:t>
+      </w:r>
+      <w:r>
+        <w:t xml:space="preserve"> </w:t>
+      </w:r>
+      <w:r>
+        <w:rPr>
+          <w:rStyle w:val="VerbatimChar"/>
+        </w:rPr>
+        <w:t xml:space="preserve">postprocess/extract_CPU_hotspots.py</w:t>
+      </w:r>
+      <w:r>
+        <w:t xml:space="preserve"> </w:t>
+      </w:r>
+      <w:r>
+        <w:t xml:space="preserve">(</w:t>
+      </w:r>
+      <w:r>
+        <w:rPr>
+          <w:rStyle w:val="VerbatimChar"/>
+        </w:rPr>
+        <w:t xml:space="preserve">aggregate()</w:t>
+      </w:r>
+      <w:r>
+        <w:t xml:space="preserve">,</w:t>
+      </w:r>
+      <w:r>
+        <w:t xml:space="preserve"> </w:t>
+      </w:r>
+      <w:r>
+        <w:rPr>
+          <w:rStyle w:val="VerbatimChar"/>
+        </w:rPr>
+        <w:t xml:space="preserve">aggregate_per_rank()</w:t>
+      </w:r>
+      <w:r>
+        <w:t xml:space="preserve">,</w:t>
+      </w:r>
+      <w:r>
+        <w:t xml:space="preserve"> </w:t>
+      </w:r>
+      <w:r>
+        <w:rPr>
+          <w:rStyle w:val="VerbatimChar"/>
+        </w:rPr>
+        <w:t xml:space="preserve">find_extra_artifacts()</w:t>
+      </w:r>
+      <w:r>
+        <w:t xml:space="preserve">,</w:t>
+      </w:r>
+      <w:r>
+        <w:t xml:space="preserve"> </w:t>
+      </w:r>
+      <w:r>
+        <w:rPr>
+          <w:rStyle w:val="VerbatimChar"/>
+        </w:rPr>
+        <w:t xml:space="preserve">load_metadata()</w:t>
+      </w:r>
+      <w:r>
+        <w:t xml:space="preserve">) now globs recursively, mirroring</w:t>
+      </w:r>
+      <w:r>
+        <w:t xml:space="preserve"> </w:t>
+      </w:r>
+      <w:r>
+        <w:rPr>
+          <w:rStyle w:val="VerbatimChar"/>
+        </w:rPr>
+        <w:t xml:space="preserve">extract_GPU_hotspots.py</w:t>
+      </w:r>
+      <w:r>
+        <w:t xml:space="preserve">’s existing pattern (that module never had this bug — rocprofv3 nests under a hostname directory and was already written to glob</w:t>
+      </w:r>
+      <w:r>
+        <w:t xml:space="preserve"> </w:t>
+      </w:r>
+      <w:r>
+        <w:rPr>
+          <w:rStyle w:val="VerbatimChar"/>
+        </w:rPr>
+        <w:t xml:space="preserve">**/*_kernel_stats.csv</w:t>
+      </w:r>
+      <w:r>
+        <w:t xml:space="preserve"> </w:t>
+      </w:r>
+      <w:r>
+        <w:t xml:space="preserve">recursively).</w:t>
+      </w:r>
+      <w:r>
+        <w:t xml:space="preserve"> </w:t>
+      </w:r>
+      <w:r>
+        <w:rPr>
+          <w:rStyle w:val="VerbatimChar"/>
+        </w:rPr>
+        <w:t xml:space="preserve">guess_run_datetime()</w:t>
+      </w:r>
+      <w:r>
+        <w:t xml:space="preserve"> </w:t>
+      </w:r>
+      <w:r>
+        <w:t xml:space="preserve">gained a</w:t>
+      </w:r>
+      <w:r>
+        <w:t xml:space="preserve"> </w:t>
+      </w:r>
+      <w:r>
+        <w:rPr>
+          <w:rStyle w:val="VerbatimChar"/>
+        </w:rPr>
+        <w:t xml:space="preserve">scanned_files</w:t>
+      </w:r>
+      <w:r>
+        <w:t xml:space="preserve"> </w:t>
+      </w:r>
+      <w:r>
+        <w:t xml:space="preserve">parameter: it still checks the literal</w:t>
+      </w:r>
+      <w:r>
+        <w:t xml:space="preserve"> </w:t>
+      </w:r>
+      <w:r>
+        <w:rPr>
+          <w:rStyle w:val="VerbatimChar"/>
+        </w:rPr>
+        <w:t xml:space="preserve">output_dir</w:t>
+      </w:r>
+      <w:r>
+        <w:t xml:space="preserve"> </w:t>
+      </w:r>
+      <w:r>
+        <w:t xml:space="preserve">string first (keeping existing behavior), but now falls back to searching each scanned file’s own directory name for the timestamp pattern, since that directory is now</w:t>
+      </w:r>
+      <w:r>
+        <w:t xml:space="preserve"> </w:t>
+      </w:r>
+      <w:r>
+        <w:rPr>
+          <w:iCs/>
+          <w:i/>
+        </w:rPr>
+        <w:t xml:space="preserve">discovered</w:t>
+      </w:r>
+      <w:r>
+        <w:t xml:space="preserve"> </w:t>
+      </w:r>
+      <w:r>
+        <w:t xml:space="preserve">via recursive glob rather than being part of the path passed in. Tools 3 and 4 both call</w:t>
+      </w:r>
+      <w:r>
+        <w:t xml:space="preserve"> </w:t>
+      </w:r>
+      <w:r>
+        <w:rPr>
+          <w:rStyle w:val="VerbatimChar"/>
+        </w:rPr>
+        <w:t xml:space="preserve">extract_CPU_hotspots.aggregate()</w:t>
+      </w:r>
+      <w:r>
+        <w:t xml:space="preserve"> </w:t>
+      </w:r>
+      <w:r>
+        <w:t xml:space="preserve">directly, so fixing it once there fixed all three. Added a new fixture,</w:t>
+      </w:r>
+      <w:r>
+        <w:t xml:space="preserve"> </w:t>
+      </w:r>
+      <w:r>
+        <w:rPr>
+          <w:rStyle w:val="VerbatimChar"/>
+        </w:rPr>
+        <w:t xml:space="preserve">mpi_2rank_dated_subdir</w:t>
+      </w:r>
+      <w:r>
+        <w:t xml:space="preserve">, reproducing the real bug’s directory layout (nested</w:t>
+      </w:r>
+      <w:r>
+        <w:t xml:space="preserve"> </w:t>
+      </w:r>
+      <w:r>
+        <w:rPr>
+          <w:rStyle w:val="VerbatimChar"/>
+        </w:rPr>
+        <w:t xml:space="preserve">wall_clock-*.txt</w:t>
+      </w:r>
+      <w:r>
+        <w:t xml:space="preserve"> </w:t>
+      </w:r>
+      <w:r>
+        <w:t xml:space="preserve">files, and — to exercise</w:t>
+      </w:r>
+      <w:r>
+        <w:t xml:space="preserve"> </w:t>
+      </w:r>
+      <w:r>
+        <w:rPr>
+          <w:rStyle w:val="VerbatimChar"/>
+        </w:rPr>
+        <w:t xml:space="preserve">load_metadata()</w:t>
+      </w:r>
+      <w:r>
+        <w:t xml:space="preserve">’s own recursive-glob fix and</w:t>
+      </w:r>
+      <w:r>
+        <w:t xml:space="preserve"> </w:t>
+      </w:r>
+      <w:r>
+        <w:rPr>
+          <w:rStyle w:val="VerbatimChar"/>
+        </w:rPr>
+        <w:t xml:space="preserve">guess_run_datetime()</w:t>
+      </w:r>
+      <w:r>
+        <w:t xml:space="preserve">’s new fallback path together — a</w:t>
+      </w:r>
+      <w:r>
+        <w:t xml:space="preserve"> </w:t>
+      </w:r>
+      <w:r>
+        <w:rPr>
+          <w:rStyle w:val="VerbatimChar"/>
+        </w:rPr>
+        <w:t xml:space="preserve">metadata.json</w:t>
+      </w:r>
+      <w:r>
+        <w:t xml:space="preserve"> </w:t>
+      </w:r>
+      <w:r>
+        <w:t xml:space="preserve">nested in the same subdirectory with no explicit timestamp field of its own).</w:t>
+      </w:r>
+    </w:p>
+    <w:p>
+      <w:pPr>
+        <w:pStyle w:val="BodyText"/>
+      </w:pPr>
+      <w:r>
+        <w:rPr>
+          <w:bCs/>
+          <w:b/>
+        </w:rPr>
+        <w:t xml:space="preserve">Part B — unifying the MPI invocation convention.</w:t>
+      </w:r>
+      <w:r>
+        <w:t xml:space="preserve"> </w:t>
+      </w:r>
+      <w:r>
+        <w:t xml:space="preserve">The user separately asked for every script’s default output directory to include a time value, so re-running a tool with no</w:t>
+      </w:r>
+      <w:r>
+        <w:t xml:space="preserve"> </w:t>
+      </w:r>
+      <w:r>
+        <w:rPr>
+          <w:rStyle w:val="VerbatimChar"/>
+        </w:rPr>
+        <w:t xml:space="preserve">-o</w:t>
+      </w:r>
+      <w:r>
+        <w:t xml:space="preserve"> </w:t>
+      </w:r>
+      <w:r>
+        <w:t xml:space="preserve">can’t silently mix a new run’s files with a stale run’s. A per-invocation</w:t>
+      </w:r>
+      <w:r>
+        <w:t xml:space="preserve"> </w:t>
+      </w:r>
+      <w:r>
+        <w:rPr>
+          <w:rStyle w:val="VerbatimChar"/>
+        </w:rPr>
+        <w:t xml:space="preserve">$(date ...)</w:t>
+      </w:r>
+      <w:r>
+        <w:t xml:space="preserve"> </w:t>
+      </w:r>
+      <w:r>
+        <w:t xml:space="preserve">default is unsafe for tools 1-3 as they existed at the time, because they were invoked as</w:t>
+      </w:r>
+      <w:r>
+        <w:t xml:space="preserve"> </w:t>
+      </w:r>
+      <w:r>
+        <w:rPr>
+          <w:rStyle w:val="VerbatimChar"/>
+        </w:rPr>
+        <w:t xml:space="preserve">mpirun -np N script.sh -- app</w:t>
+      </w:r>
+      <w:r>
+        <w:t xml:space="preserve"> </w:t>
+      </w:r>
+      <w:r>
+        <w:t xml:space="preserve">— N independent copies of the same bash script, all of which must agree on one shared output directory (rocprof-sys/rocprofv3 tell ranks apart by PID in the filename, not by directory); independent per-rank</w:t>
+      </w:r>
+      <w:r>
+        <w:t xml:space="preserve"> </w:t>
+      </w:r>
+      <w:r>
+        <w:rPr>
+          <w:rStyle w:val="VerbatimChar"/>
+        </w:rPr>
+        <w:t xml:space="preserve">date</w:t>
+      </w:r>
+      <w:r>
+        <w:t xml:space="preserve"> </w:t>
+      </w:r>
+      <w:r>
+        <w:t xml:space="preserve">calls could disagree across a second boundary and split one experiment across two directories. The user then asked whether all four tools could instead be invoked the way tool 4 already was: one call to the script, with the MPI launch command passed as data via</w:t>
+      </w:r>
+      <w:r>
+        <w:t xml:space="preserve"> </w:t>
+      </w:r>
+      <w:r>
+        <w:rPr>
+          <w:rStyle w:val="VerbatimChar"/>
+        </w:rPr>
+        <w:t xml:space="preserve">--mpi "mpirun -np 4"</w:t>
+      </w:r>
+      <w:r>
+        <w:t xml:space="preserve">, rather than the script being wrapped externally by</w:t>
+      </w:r>
+      <w:r>
+        <w:t xml:space="preserve"> </w:t>
+      </w:r>
+      <w:r>
+        <w:rPr>
+          <w:rStyle w:val="VerbatimChar"/>
+        </w:rPr>
+        <w:t xml:space="preserve">mpirun</w:t>
+      </w:r>
+      <w:r>
+        <w:t xml:space="preserve">. Checking why tool 4 needed that in the first place — its binary-rewrite step must run exactly once, never once per rank — showed the constraint was specific to that one step, not to profiling/tracing in general:</w:t>
+      </w:r>
+      <w:r>
+        <w:t xml:space="preserve"> </w:t>
+      </w:r>
+      <w:r>
+        <w:rPr>
+          <w:rStyle w:val="VerbatimChar"/>
+        </w:rPr>
+        <w:t xml:space="preserve">rocprof-sys-sample</w:t>
+      </w:r>
+      <w:r>
+        <w:t xml:space="preserve">/</w:t>
+      </w:r>
+      <w:r>
+        <w:rPr>
+          <w:rStyle w:val="VerbatimChar"/>
+        </w:rPr>
+        <w:t xml:space="preserve">rocprofv3</w:t>
+      </w:r>
+      <w:r>
+        <w:t xml:space="preserve"> </w:t>
+      </w:r>
+      <w:r>
+        <w:t xml:space="preserve">each wrap</w:t>
+      </w:r>
+      <w:r>
+        <w:t xml:space="preserve"> </w:t>
+      </w:r>
+      <w:r>
+        <w:t xml:space="preserve">“</w:t>
+      </w:r>
+      <w:r>
+        <w:t xml:space="preserve">exactly one process</w:t>
+      </w:r>
+      <w:r>
+        <w:t xml:space="preserve">”</w:t>
+      </w:r>
+      <w:r>
+        <w:t xml:space="preserve"> </w:t>
+      </w:r>
+      <w:r>
+        <w:t xml:space="preserve">the same way whether their immediate parent is bash or</w:t>
+      </w:r>
+      <w:r>
+        <w:t xml:space="preserve"> </w:t>
+      </w:r>
+      <w:r>
+        <w:rPr>
+          <w:rStyle w:val="VerbatimChar"/>
+        </w:rPr>
+        <w:t xml:space="preserve">mpirun</w:t>
+      </w:r>
+      <w:r>
+        <w:t xml:space="preserve"> </w:t>
+      </w:r>
+      <w:r>
+        <w:t xml:space="preserve">directly. So</w:t>
+      </w:r>
+      <w:r>
+        <w:t xml:space="preserve"> </w:t>
+      </w:r>
+      <w:r>
+        <w:rPr>
+          <w:rStyle w:val="VerbatimChar"/>
+        </w:rPr>
+        <w:t xml:space="preserve">profile_CPU_hotspots.sh</w:t>
+      </w:r>
+      <w:r>
+        <w:t xml:space="preserve">,</w:t>
+      </w:r>
+      <w:r>
+        <w:t xml:space="preserve"> </w:t>
+      </w:r>
+      <w:r>
+        <w:rPr>
+          <w:rStyle w:val="VerbatimChar"/>
+        </w:rPr>
+        <w:t xml:space="preserve">profile_GPU_hotspots.sh</w:t>
+      </w:r>
+      <w:r>
+        <w:t xml:space="preserve">, and</w:t>
+      </w:r>
+      <w:r>
+        <w:t xml:space="preserve"> </w:t>
+      </w:r>
+      <w:r>
+        <w:rPr>
+          <w:rStyle w:val="VerbatimChar"/>
+        </w:rPr>
+        <w:t xml:space="preserve">profile_hotspots.sh</w:t>
+      </w:r>
+      <w:r>
+        <w:t xml:space="preserve"> </w:t>
+      </w:r>
+      <w:r>
+        <w:t xml:space="preserve">all gained tool 4’s exact</w:t>
+      </w:r>
+      <w:r>
+        <w:t xml:space="preserve"> </w:t>
+      </w:r>
+      <w:r>
+        <w:rPr>
+          <w:rStyle w:val="VerbatimChar"/>
+        </w:rPr>
+        <w:t xml:space="preserve">--mpi "&lt;launch command&gt;"</w:t>
+      </w:r>
+      <w:r>
+        <w:t xml:space="preserve"> </w:t>
+      </w:r>
+      <w:r>
+        <w:t xml:space="preserve">convention, and the old</w:t>
+      </w:r>
+      <w:r>
+        <w:t xml:space="preserve"> </w:t>
+      </w:r>
+      <w:r>
+        <w:t xml:space="preserve">“</w:t>
+      </w:r>
+      <w:r>
+        <w:t xml:space="preserve">put mpirun/srun in front of this script</w:t>
+      </w:r>
+      <w:r>
+        <w:t xml:space="preserve">”</w:t>
+      </w:r>
+      <w:r>
+        <w:t xml:space="preserve"> </w:t>
+      </w:r>
+      <w:r>
+        <w:t xml:space="preserve">documented pattern was removed entirely —</w:t>
+      </w:r>
+      <w:r>
+        <w:t xml:space="preserve"> </w:t>
+      </w:r>
+      <w:r>
+        <w:rPr>
+          <w:bCs/>
+          <w:b/>
+        </w:rPr>
+        <w:t xml:space="preserve">this is a breaking change to how tools 1-3 are invoked under MPI.</w:t>
+      </w:r>
+      <w:r>
+        <w:t xml:space="preserve"> </w:t>
+      </w:r>
+      <w:r>
+        <w:t xml:space="preserve">A useful side effect: each script is now a single top-level driver process regardless of</w:t>
+      </w:r>
+      <w:r>
+        <w:t xml:space="preserve"> </w:t>
+      </w:r>
+      <w:r>
+        <w:rPr>
+          <w:rStyle w:val="VerbatimChar"/>
+        </w:rPr>
+        <w:t xml:space="preserve">-np</w:t>
+      </w:r>
+      <w:r>
+        <w:t xml:space="preserve">, so the old</w:t>
+      </w:r>
+      <w:r>
+        <w:t xml:space="preserve"> </w:t>
+      </w:r>
+      <w:r>
+        <w:rPr>
+          <w:rStyle w:val="VerbatimChar"/>
+        </w:rPr>
+        <w:t xml:space="preserve">RANK="${OMPI_COMM_WORLD_RANK:-${PMI_RANK:-${SLURM_PROCID:-0}}}"</w:t>
+      </w:r>
+      <w:r>
+        <w:t xml:space="preserve"> </w:t>
+      </w:r>
+      <w:r>
+        <w:t xml:space="preserve">guard (needed to make only</w:t>
+      </w:r>
+      <w:r>
+        <w:t xml:space="preserve"> </w:t>
+      </w:r>
+      <w:r>
+        <w:t xml:space="preserve">“</w:t>
+      </w:r>
+      <w:r>
+        <w:t xml:space="preserve">rank 0</w:t>
+      </w:r>
+      <w:r>
+        <w:t xml:space="preserve">”</w:t>
+      </w:r>
+      <w:r>
+        <w:t xml:space="preserve"> </w:t>
+      </w:r>
+      <w:r>
+        <w:t xml:space="preserve">run the summary extractor) was removed too — running the summary step is now simply unconditional.</w:t>
+      </w:r>
+      <w:r>
+        <w:t xml:space="preserve"> </w:t>
+      </w:r>
+      <w:r>
+        <w:rPr>
+          <w:rStyle w:val="VerbatimChar"/>
+        </w:rPr>
+        <w:t xml:space="preserve">instrument_hotspots.sh</w:t>
+      </w:r>
+      <w:r>
+        <w:t xml:space="preserve">’s own auto-profiling step, which used to wrap</w:t>
+      </w:r>
+      <w:r>
+        <w:t xml:space="preserve"> </w:t>
+      </w:r>
+      <w:r>
+        <w:rPr>
+          <w:rStyle w:val="VerbatimChar"/>
+        </w:rPr>
+        <w:t xml:space="preserve">mpirun</w:t>
+      </w:r>
+      <w:r>
+        <w:t xml:space="preserve"> </w:t>
+      </w:r>
+      <w:r>
+        <w:t xml:space="preserve">around</w:t>
+      </w:r>
+      <w:r>
+        <w:t xml:space="preserve"> </w:t>
+      </w:r>
+      <w:r>
+        <w:rPr>
+          <w:rStyle w:val="VerbatimChar"/>
+        </w:rPr>
+        <w:t xml:space="preserve">profile_hotspots.sh</w:t>
+      </w:r>
+      <w:r>
+        <w:t xml:space="preserve"> </w:t>
+      </w:r>
+      <w:r>
+        <w:t xml:space="preserve">itself (</w:t>
+      </w:r>
+      <w:r>
+        <w:rPr>
+          <w:rStyle w:val="VerbatimChar"/>
+        </w:rPr>
+        <w:t xml:space="preserve">PROFILE_CMD=("${MPI_ARR[@]}" "$HOTSPOTS_LAUNCHER" ...)</w:t>
+      </w:r>
+      <w:r>
+        <w:t xml:space="preserve">), was updated to forward</w:t>
+      </w:r>
+      <w:r>
+        <w:t xml:space="preserve"> </w:t>
+      </w:r>
+      <w:r>
+        <w:rPr>
+          <w:rStyle w:val="VerbatimChar"/>
+        </w:rPr>
+        <w:t xml:space="preserve">--mpi</w:t>
+      </w:r>
+      <w:r>
+        <w:t xml:space="preserve"> </w:t>
+      </w:r>
+      <w:r>
+        <w:t xml:space="preserve">to it instead (</w:t>
+      </w:r>
+      <w:r>
+        <w:rPr>
+          <w:rStyle w:val="VerbatimChar"/>
+        </w:rPr>
+        <w:t xml:space="preserve">PROFILE_CMD=("$HOTSPOTS_LAUNCHER" "${MPI_FORWARD[@]}" ...)</w:t>
+      </w:r>
+      <w:r>
+        <w:t xml:space="preserve">), since</w:t>
+      </w:r>
+      <w:r>
+        <w:t xml:space="preserve"> </w:t>
+      </w:r>
+      <w:r>
+        <w:rPr>
+          <w:rStyle w:val="VerbatimChar"/>
+        </w:rPr>
+        <w:t xml:space="preserve">profile_hotspots.sh</w:t>
+      </w:r>
+      <w:r>
+        <w:t xml:space="preserve"> </w:t>
+      </w:r>
+      <w:r>
+        <w:t xml:space="preserve">now handles that itself; its final trace run (</w:t>
+      </w:r>
+      <w:r>
+        <w:rPr>
+          <w:rStyle w:val="VerbatimChar"/>
+        </w:rPr>
+        <w:t xml:space="preserve">RUN_CMD=("${MPI_ARR[@]}" rocprof-sys-run -- ...)</w:t>
+      </w:r>
+      <w:r>
+        <w:t xml:space="preserve">) was already wrapping the raw AMD binary directly and needed no change.</w:t>
+      </w:r>
+    </w:p>
+    <w:p>
+      <w:pPr>
+        <w:pStyle w:val="BodyText"/>
+      </w:pPr>
+      <w:r>
+        <w:rPr>
+          <w:bCs/>
+          <w:b/>
+        </w:rPr>
+        <w:t xml:space="preserve">Part C — default directory renames.</w:t>
+      </w:r>
+      <w:r>
+        <w:t xml:space="preserve"> </w:t>
+      </w:r>
+      <w:r>
+        <w:t xml:space="preserve">With every tool now a single-process driver regardless of</w:t>
+      </w:r>
+      <w:r>
+        <w:t xml:space="preserve"> </w:t>
+      </w:r>
+      <w:r>
+        <w:rPr>
+          <w:rStyle w:val="VerbatimChar"/>
+        </w:rPr>
+        <w:t xml:space="preserve">-np</w:t>
+      </w:r>
+      <w:r>
+        <w:t xml:space="preserve"> </w:t>
+      </w:r>
+      <w:r>
+        <w:t xml:space="preserve">(Part B), a plain</w:t>
+      </w:r>
+      <w:r>
+        <w:t xml:space="preserve"> </w:t>
+      </w:r>
+      <w:r>
+        <w:rPr>
+          <w:rStyle w:val="VerbatimChar"/>
+        </w:rPr>
+        <w:t xml:space="preserve">$(date +%F_%H.%M.%S)</w:t>
+      </w:r>
+      <w:r>
+        <w:t xml:space="preserve"> </w:t>
+      </w:r>
+      <w:r>
+        <w:t xml:space="preserve">default has no cross-process race to worry about — no scheduler-job-id fallback needed. Default directory names, previously named after the underlying AMD tool (inconsistent with this project’s own naming rule — see</w:t>
+      </w:r>
+      <w:r>
+        <w:t xml:space="preserve"> </w:t>
+      </w:r>
+      <w:r>
+        <w:rPr>
+          <w:rStyle w:val="VerbatimChar"/>
+        </w:rPr>
+        <w:t xml:space="preserve">CLAUDE.md</w:t>
+      </w:r>
+      <w:r>
+        <w:t xml:space="preserve">), were also renamed to match their script names:</w:t>
+      </w:r>
+      <w:r>
+        <w:t xml:space="preserve"> </w:t>
+      </w:r>
+      <w:r>
+        <w:rPr>
+          <w:rStyle w:val="VerbatimChar"/>
+        </w:rPr>
+        <w:t xml:space="preserve">rocprof-sys-hotspots-output</w:t>
+      </w:r>
+      <w:r>
+        <w:t xml:space="preserve"> </w:t>
+      </w:r>
+      <w:r>
+        <w:t xml:space="preserve">→</w:t>
+      </w:r>
+      <w:r>
+        <w:t xml:space="preserve"> </w:t>
+      </w:r>
+      <w:r>
+        <w:rPr>
+          <w:rStyle w:val="VerbatimChar"/>
+        </w:rPr>
+        <w:t xml:space="preserve">profile_CPU_hotspots-output-&lt;timestamp&gt;</w:t>
+      </w:r>
+      <w:r>
+        <w:t xml:space="preserve">,</w:t>
+      </w:r>
+      <w:r>
+        <w:t xml:space="preserve"> </w:t>
+      </w:r>
+      <w:r>
+        <w:rPr>
+          <w:rStyle w:val="VerbatimChar"/>
+        </w:rPr>
+        <w:t xml:space="preserve">rocprofv3-hotspots-output</w:t>
+      </w:r>
+      <w:r>
+        <w:t xml:space="preserve"> </w:t>
+      </w:r>
+      <w:r>
+        <w:t xml:space="preserve">→</w:t>
+      </w:r>
+      <w:r>
+        <w:t xml:space="preserve"> </w:t>
+      </w:r>
+      <w:r>
+        <w:rPr>
+          <w:rStyle w:val="VerbatimChar"/>
+        </w:rPr>
+        <w:t xml:space="preserve">profile_GPU_hotspots-output-&lt;timestamp&gt;</w:t>
+      </w:r>
+      <w:r>
+        <w:t xml:space="preserve">,</w:t>
+      </w:r>
+      <w:r>
+        <w:t xml:space="preserve"> </w:t>
+      </w:r>
+      <w:r>
+        <w:rPr>
+          <w:rStyle w:val="VerbatimChar"/>
+        </w:rPr>
+        <w:t xml:space="preserve">rocprof-combined-hotspots-output</w:t>
+      </w:r>
+      <w:r>
+        <w:t xml:space="preserve"> </w:t>
+      </w:r>
+      <w:r>
+        <w:t xml:space="preserve">→</w:t>
+      </w:r>
+      <w:r>
+        <w:t xml:space="preserve"> </w:t>
+      </w:r>
+      <w:r>
+        <w:rPr>
+          <w:rStyle w:val="VerbatimChar"/>
+        </w:rPr>
+        <w:t xml:space="preserve">profile_hotspots-output-&lt;timestamp&gt;</w:t>
+      </w:r>
+      <w:r>
+        <w:t xml:space="preserve">, and tool 4’s two defaults (</w:t>
+      </w:r>
+      <w:r>
+        <w:rPr>
+          <w:rStyle w:val="VerbatimChar"/>
+        </w:rPr>
+        <w:t xml:space="preserve">rocprof-sys-instrument-scan</w:t>
+      </w:r>
+      <w:r>
+        <w:t xml:space="preserve">,</w:t>
+      </w:r>
+      <w:r>
+        <w:t xml:space="preserve"> </w:t>
+      </w:r>
+      <w:r>
+        <w:rPr>
+          <w:rStyle w:val="VerbatimChar"/>
+        </w:rPr>
+        <w:t xml:space="preserve">rocprof-sys-instrumented-trace-output</w:t>
+      </w:r>
+      <w:r>
+        <w:t xml:space="preserve">) →</w:t>
+      </w:r>
+      <w:r>
+        <w:t xml:space="preserve"> </w:t>
+      </w:r>
+      <w:r>
+        <w:rPr>
+          <w:rStyle w:val="VerbatimChar"/>
+        </w:rPr>
+        <w:t xml:space="preserve">instrument_hotspots-scan-&lt;timestamp&gt;</w:t>
+      </w:r>
+      <w:r>
+        <w:t xml:space="preserve">/</w:t>
+      </w:r>
+      <w:r>
+        <w:rPr>
+          <w:rStyle w:val="VerbatimChar"/>
+        </w:rPr>
+        <w:t xml:space="preserve">instrument_hotspots-trace-output-&lt;timestamp&gt;</w:t>
+      </w:r>
+      <w:r>
+        <w:t xml:space="preserve">, computed from one shared timestamp per invocation so both agree.</w:t>
+      </w:r>
+      <w:r>
+        <w:t xml:space="preserve"> </w:t>
+      </w:r>
+      <w:r>
+        <w:rPr>
+          <w:rStyle w:val="VerbatimChar"/>
+        </w:rPr>
+        <w:t xml:space="preserve">.gitignore</w:t>
+      </w:r>
+      <w:r>
+        <w:t xml:space="preserve">’s single</w:t>
+      </w:r>
+      <w:r>
+        <w:t xml:space="preserve"> </w:t>
+      </w:r>
+      <w:r>
+        <w:rPr>
+          <w:rStyle w:val="VerbatimChar"/>
+        </w:rPr>
+        <w:t xml:space="preserve">rocprof-sys-*-output/</w:t>
+      </w:r>
+      <w:r>
+        <w:t xml:space="preserve"> </w:t>
+      </w:r>
+      <w:r>
+        <w:t xml:space="preserve">pattern (which, checked against the actual default names in use, already missed</w:t>
+      </w:r>
+      <w:r>
+        <w:t xml:space="preserve"> </w:t>
+      </w:r>
+      <w:r>
+        <w:rPr>
+          <w:rStyle w:val="VerbatimChar"/>
+        </w:rPr>
+        <w:t xml:space="preserve">rocprofv3-hotspots-output</w:t>
+      </w:r>
+      <w:r>
+        <w:t xml:space="preserve"> </w:t>
+      </w:r>
+      <w:r>
+        <w:t xml:space="preserve">and</w:t>
+      </w:r>
+      <w:r>
+        <w:t xml:space="preserve"> </w:t>
+      </w:r>
+      <w:r>
+        <w:rPr>
+          <w:rStyle w:val="VerbatimChar"/>
+        </w:rPr>
+        <w:t xml:space="preserve">rocprof-combined-hotspots-output</w:t>
+      </w:r>
+      <w:r>
+        <w:t xml:space="preserve"> </w:t>
+      </w:r>
+      <w:r>
+        <w:t xml:space="preserve">even before this change) was replaced with one wildcard-suffixed pattern per tool.</w:t>
+      </w:r>
+    </w:p>
+    <w:p>
+      <w:pPr>
+        <w:pStyle w:val="BodyText"/>
+      </w:pPr>
+      <w:r>
+        <w:t xml:space="preserve">Verified locally (no ROCm/GPU available):</w:t>
+      </w:r>
+      <w:r>
+        <w:t xml:space="preserve"> </w:t>
+      </w:r>
+      <w:r>
+        <w:rPr>
+          <w:rStyle w:val="VerbatimChar"/>
+        </w:rPr>
+        <w:t xml:space="preserve">python3 -m unittest</w:t>
+      </w:r>
+      <w:r>
+        <w:t xml:space="preserve"> </w:t>
+      </w:r>
+      <w:r>
+        <w:t xml:space="preserve">added 7 new tests (126 total) exercising the nested-subdirectory fixture against</w:t>
+      </w:r>
+      <w:r>
+        <w:t xml:space="preserve"> </w:t>
+      </w:r>
+      <w:r>
+        <w:rPr>
+          <w:rStyle w:val="VerbatimChar"/>
+        </w:rPr>
+        <w:t xml:space="preserve">extract_CPU_hotspots.py</w:t>
+      </w:r>
+      <w:r>
+        <w:t xml:space="preserve"> </w:t>
+      </w:r>
+      <w:r>
+        <w:t xml:space="preserve">directly and end-to-end through tools 3 and 4.</w:t>
+      </w:r>
+      <w:r>
+        <w:t xml:space="preserve"> </w:t>
+      </w:r>
+      <w:r>
+        <w:rPr>
+          <w:rStyle w:val="VerbatimChar"/>
+        </w:rPr>
+        <w:t xml:space="preserve">bash -n</w:t>
+      </w:r>
+      <w:r>
+        <w:t xml:space="preserve"> </w:t>
+      </w:r>
+      <w:r>
+        <w:t xml:space="preserve">on all four scripts. Manual verification with stubbed AMD-tool binaries on</w:t>
+      </w:r>
+      <w:r>
+        <w:t xml:space="preserve"> </w:t>
+      </w:r>
+      <w:r>
+        <w:rPr>
+          <w:rStyle w:val="VerbatimChar"/>
+        </w:rPr>
+        <w:t xml:space="preserve">PATH</w:t>
+      </w:r>
+      <w:r>
+        <w:t xml:space="preserve">: ran the nested-fixture directory through</w:t>
+      </w:r>
+      <w:r>
+        <w:t xml:space="preserve"> </w:t>
+      </w:r>
+      <w:r>
+        <w:rPr>
+          <w:rStyle w:val="VerbatimChar"/>
+        </w:rPr>
+        <w:t xml:space="preserve">extract_CPU_hotspots.py</w:t>
+      </w:r>
+      <w:r>
+        <w:t xml:space="preserve">/</w:t>
+      </w:r>
+      <w:r>
+        <w:rPr>
+          <w:rStyle w:val="VerbatimChar"/>
+        </w:rPr>
+        <w:t xml:space="preserve">select_hotspot_functions.py</w:t>
+      </w:r>
+      <w:r>
+        <w:t xml:space="preserve"> </w:t>
+      </w:r>
+      <w:r>
+        <w:t xml:space="preserve">directly and confirmed both now succeed (previously</w:t>
+      </w:r>
+      <w:r>
+        <w:t xml:space="preserve"> </w:t>
+      </w:r>
+      <w:r>
+        <w:rPr>
+          <w:rStyle w:val="VerbatimChar"/>
+        </w:rPr>
+        <w:t xml:space="preserve">SystemExit</w:t>
+      </w:r>
+      <w:r>
+        <w:t xml:space="preserve">);</w:t>
+      </w:r>
+      <w:r>
+        <w:t xml:space="preserve"> </w:t>
+      </w:r>
+      <w:r>
+        <w:rPr>
+          <w:rStyle w:val="VerbatimChar"/>
+        </w:rPr>
+        <w:t xml:space="preserve">--dry-run</w:t>
+      </w:r>
+      <w:r>
+        <w:t xml:space="preserve">’d all four scripts with and without</w:t>
+      </w:r>
+      <w:r>
+        <w:t xml:space="preserve"> </w:t>
+      </w:r>
+      <w:r>
+        <w:rPr>
+          <w:rStyle w:val="VerbatimChar"/>
+        </w:rPr>
+        <w:t xml:space="preserve">--mpi</w:t>
+      </w:r>
+      <w:r>
+        <w:t xml:space="preserve">, confirming the launch command appears correctly prefixed on the profiling/run commands and never on tool 4’s one-time rewrite step; confirmed tool 4’s auto-profiling preview now shows</w:t>
+      </w:r>
+      <w:r>
+        <w:t xml:space="preserve"> </w:t>
+      </w:r>
+      <w:r>
+        <w:rPr>
+          <w:rStyle w:val="VerbatimChar"/>
+        </w:rPr>
+        <w:t xml:space="preserve">profile_hotspots.sh --mpi "mpirun -np 4" ...</w:t>
+      </w:r>
+      <w:r>
+        <w:t xml:space="preserve"> </w:t>
+      </w:r>
+      <w:r>
+        <w:t xml:space="preserve">(forwarded) rather than</w:t>
+      </w:r>
+      <w:r>
+        <w:t xml:space="preserve"> </w:t>
+      </w:r>
+      <w:r>
+        <w:rPr>
+          <w:rStyle w:val="VerbatimChar"/>
+        </w:rPr>
+        <w:t xml:space="preserve">mpirun -np 4 profile_hotspots.sh ...</w:t>
+      </w:r>
+      <w:r>
+        <w:t xml:space="preserve"> </w:t>
+      </w:r>
+      <w:r>
+        <w:t xml:space="preserve">(wrapped); confirmed</w:t>
+      </w:r>
+      <w:r>
+        <w:t xml:space="preserve"> </w:t>
+      </w:r>
+      <w:r>
+        <w:rPr>
+          <w:rStyle w:val="VerbatimChar"/>
+        </w:rPr>
+        <w:t xml:space="preserve">profile_hotspots.sh --dry-run --mpi "..."</w:t>
+      </w:r>
+      <w:r>
+        <w:t xml:space="preserve"> </w:t>
+      </w:r>
+      <w:r>
+        <w:t xml:space="preserve">shows</w:t>
+      </w:r>
+      <w:r>
+        <w:t xml:space="preserve"> </w:t>
+      </w:r>
+      <w:r>
+        <w:rPr>
+          <w:rStyle w:val="VerbatimChar"/>
+        </w:rPr>
+        <w:t xml:space="preserve">--mpi</w:t>
+      </w:r>
+      <w:r>
+        <w:t xml:space="preserve"> </w:t>
+      </w:r>
+      <w:r>
+        <w:t xml:space="preserve">forwarded to both its CPU and GPU sub-launcher preview lines; ran each script’s</w:t>
+      </w:r>
+      <w:r>
+        <w:t xml:space="preserve"> </w:t>
+      </w:r>
+      <w:r>
+        <w:rPr>
+          <w:rStyle w:val="VerbatimChar"/>
+        </w:rPr>
+        <w:t xml:space="preserve">--dry-run</w:t>
+      </w:r>
+      <w:r>
+        <w:t xml:space="preserve"> </w:t>
+      </w:r>
+      <w:r>
+        <w:t xml:space="preserve">twice in a row with no</w:t>
+      </w:r>
+      <w:r>
+        <w:t xml:space="preserve"> </w:t>
+      </w:r>
+      <w:r>
+        <w:rPr>
+          <w:rStyle w:val="VerbatimChar"/>
+        </w:rPr>
+        <w:t xml:space="preserve">-o</w:t>
+      </w:r>
+      <w:r>
+        <w:t xml:space="preserve"> </w:t>
+      </w:r>
+      <w:r>
+        <w:t xml:space="preserve">and confirmed the printed default directories differ between calls. Real end-to-end validation against actual ROCm output on the HPC system, including confirming the real nested-directory layout is fully handled, is left to the user.</w:t>
+      </w:r>
+    </w:p>
+    <w:bookmarkEnd w:id="37"/>
+    <w:bookmarkEnd w:id="38"/>
     <w:sectPr/>
   </w:body>
 </w:document>

</xml_diff>

<commit_message>
Write tool 3's combined hotspots.txt at the root of its output dir
profile_hotspots.sh split -o DIR into DIR/rocprof-sys and DIR/rocprofv3
for raw profiling data, but never told extract_hotspots.py where to
write the combined report, so it fell back to that tool's own default
and landed at DIR/rocprof-sys/hotspots.txt instead of DIR/hotspots.txt --
inconsistent with tools 1 and 2, which always write it directly under
the directory the user specified.

Co-Authored-By: Claude Sonnet 5 <noreply@anthropic.com>
</commit_message>
<xml_diff>
--- a/docs/DEVELOPMENT_HISTORY.docx
+++ b/docs/DEVELOPMENT_HISTORY.docx
@@ -10,7 +10,7 @@
         <w:t xml:space="preserve">Development History</w:t>
       </w:r>
     </w:p>
-    <w:bookmarkStart w:id="38" w:name="development-history"/>
+    <w:bookmarkStart w:id="39" w:name="development-history"/>
     <w:p>
       <w:pPr>
         <w:pStyle w:val="Heading1"/>
@@ -375,6 +375,47 @@
           </w:p>
         </w:tc>
       </w:tr>
+      <w:tr>
+        <w:tc>
+          <w:tcPr/>
+          <w:p>
+            <w:pPr>
+              <w:pStyle w:val="Compact"/>
+              <w:jc w:val="left"/>
+            </w:pPr>
+            <w:r>
+              <w:t xml:space="preserve">2026-08-03</w:t>
+            </w:r>
+          </w:p>
+        </w:tc>
+        <w:tc>
+          <w:tcPr/>
+          <w:p>
+            <w:pPr>
+              <w:pStyle w:val="Compact"/>
+              <w:jc w:val="left"/>
+            </w:pPr>
+            <w:r>
+              <w:t xml:space="preserve">Correction: tool 3’s combined</w:t>
+            </w:r>
+            <w:r>
+              <w:t xml:space="preserve"> </w:t>
+            </w:r>
+            <w:r>
+              <w:rPr>
+                <w:rStyle w:val="VerbatimChar"/>
+              </w:rPr>
+              <w:t xml:space="preserve">hotspots.txt</w:t>
+            </w:r>
+            <w:r>
+              <w:t xml:space="preserve"> </w:t>
+            </w:r>
+            <w:r>
+              <w:t xml:space="preserve">now written at the root of its output directory</w:t>
+            </w:r>
+          </w:p>
+        </w:tc>
+      </w:tr>
     </w:tbl>
     <w:bookmarkStart w:id="20" w:name="project-scaffolding-and-rules"/>
     <w:p>
@@ -7294,7 +7335,502 @@
       </w:r>
     </w:p>
     <w:bookmarkEnd w:id="37"/>
+    <w:bookmarkStart w:id="38" w:name="X49b1bae9c530e6f7a790aa283b36c4609e0252c"/>
+    <w:p>
+      <w:pPr>
+        <w:pStyle w:val="Heading2"/>
+      </w:pPr>
+      <w:r>
+        <w:t xml:space="preserve">2026-08-03 — Correction: tool 3’s</w:t>
+      </w:r>
+      <w:r>
+        <w:t xml:space="preserve"> </w:t>
+      </w:r>
+      <w:r>
+        <w:rPr>
+          <w:rStyle w:val="VerbatimChar"/>
+        </w:rPr>
+        <w:t xml:space="preserve">hotspots.txt</w:t>
+      </w:r>
+      <w:r>
+        <w:t xml:space="preserve"> </w:t>
+      </w:r>
+      <w:r>
+        <w:t xml:space="preserve">written at the root of its output directory</w:t>
+      </w:r>
+    </w:p>
+    <w:p>
+      <w:pPr>
+        <w:pStyle w:val="FirstParagraph"/>
+      </w:pPr>
+      <w:r>
+        <w:t xml:space="preserve">Follow-up correction to the work above, flagged by the user right after it landed.</w:t>
+      </w:r>
+      <w:r>
+        <w:t xml:space="preserve"> </w:t>
+      </w:r>
+      <w:r>
+        <w:rPr>
+          <w:rStyle w:val="VerbatimChar"/>
+        </w:rPr>
+        <w:t xml:space="preserve">profile_hotspots.sh</w:t>
+      </w:r>
+      <w:r>
+        <w:t xml:space="preserve"> </w:t>
+      </w:r>
+      <w:r>
+        <w:t xml:space="preserve">(tool 3) splits its</w:t>
+      </w:r>
+      <w:r>
+        <w:t xml:space="preserve"> </w:t>
+      </w:r>
+      <w:r>
+        <w:rPr>
+          <w:rStyle w:val="VerbatimChar"/>
+        </w:rPr>
+        <w:t xml:space="preserve">-o DIR</w:t>
+      </w:r>
+      <w:r>
+        <w:t xml:space="preserve"> </w:t>
+      </w:r>
+      <w:r>
+        <w:t xml:space="preserve">into</w:t>
+      </w:r>
+      <w:r>
+        <w:t xml:space="preserve"> </w:t>
+      </w:r>
+      <w:r>
+        <w:rPr>
+          <w:rStyle w:val="VerbatimChar"/>
+        </w:rPr>
+        <w:t xml:space="preserve">DIR/rocprof-sys</w:t>
+      </w:r>
+      <w:r>
+        <w:t xml:space="preserve"> </w:t>
+      </w:r>
+      <w:r>
+        <w:t xml:space="preserve">and</w:t>
+      </w:r>
+      <w:r>
+        <w:t xml:space="preserve"> </w:t>
+      </w:r>
+      <w:r>
+        <w:rPr>
+          <w:rStyle w:val="VerbatimChar"/>
+        </w:rPr>
+        <w:t xml:space="preserve">DIR/rocprofv3</w:t>
+      </w:r>
+      <w:r>
+        <w:t xml:space="preserve"> </w:t>
+      </w:r>
+      <w:r>
+        <w:t xml:space="preserve">for the two sub-launchers’ raw profiling data, but its final combined-report call to</w:t>
+      </w:r>
+      <w:r>
+        <w:t xml:space="preserve"> </w:t>
+      </w:r>
+      <w:r>
+        <w:rPr>
+          <w:rStyle w:val="VerbatimChar"/>
+        </w:rPr>
+        <w:t xml:space="preserve">extract_hotspots.py</w:t>
+      </w:r>
+      <w:r>
+        <w:t xml:space="preserve"> </w:t>
+      </w:r>
+      <w:r>
+        <w:t xml:space="preserve">never passed its own</w:t>
+      </w:r>
+      <w:r>
+        <w:t xml:space="preserve"> </w:t>
+      </w:r>
+      <w:r>
+        <w:rPr>
+          <w:rStyle w:val="VerbatimChar"/>
+        </w:rPr>
+        <w:t xml:space="preserve">-o</w:t>
+      </w:r>
+      <w:r>
+        <w:t xml:space="preserve">/</w:t>
+      </w:r>
+      <w:r>
+        <w:rPr>
+          <w:rStyle w:val="VerbatimChar"/>
+        </w:rPr>
+        <w:t xml:space="preserve">--output</w:t>
+      </w:r>
+      <w:r>
+        <w:t xml:space="preserve"> </w:t>
+      </w:r>
+      <w:r>
+        <w:t xml:space="preserve">— so the report fell back to that extractor’s own default,</w:t>
+      </w:r>
+      <w:r>
+        <w:t xml:space="preserve"> </w:t>
+      </w:r>
+      <w:r>
+        <w:rPr>
+          <w:rStyle w:val="VerbatimChar"/>
+        </w:rPr>
+        <w:t xml:space="preserve">args.rocprof_sys_dir/hotspots.txt</w:t>
+      </w:r>
+      <w:r>
+        <w:t xml:space="preserve">, landing at</w:t>
+      </w:r>
+      <w:r>
+        <w:t xml:space="preserve"> </w:t>
+      </w:r>
+      <w:r>
+        <w:rPr>
+          <w:rStyle w:val="VerbatimChar"/>
+        </w:rPr>
+        <w:t xml:space="preserve">DIR/rocprof-sys/hotspots.txt</w:t>
+      </w:r>
+      <w:r>
+        <w:t xml:space="preserve"> </w:t>
+      </w:r>
+      <w:r>
+        <w:t xml:space="preserve">rather than</w:t>
+      </w:r>
+      <w:r>
+        <w:t xml:space="preserve"> </w:t>
+      </w:r>
+      <w:r>
+        <w:rPr>
+          <w:rStyle w:val="VerbatimChar"/>
+        </w:rPr>
+        <w:t xml:space="preserve">DIR/hotspots.txt</w:t>
+      </w:r>
+      <w:r>
+        <w:t xml:space="preserve">. That’s inconsistent with tools 1 and 2, where</w:t>
+      </w:r>
+      <w:r>
+        <w:t xml:space="preserve"> </w:t>
+      </w:r>
+      <w:r>
+        <w:rPr>
+          <w:rStyle w:val="VerbatimChar"/>
+        </w:rPr>
+        <w:t xml:space="preserve">hotspots.txt</w:t>
+      </w:r>
+      <w:r>
+        <w:t xml:space="preserve"> </w:t>
+      </w:r>
+      <w:r>
+        <w:t xml:space="preserve">always lands directly under the</w:t>
+      </w:r>
+      <w:r>
+        <w:t xml:space="preserve"> </w:t>
+      </w:r>
+      <w:r>
+        <w:rPr>
+          <w:rStyle w:val="VerbatimChar"/>
+        </w:rPr>
+        <w:t xml:space="preserve">-o</w:t>
+      </w:r>
+      <w:r>
+        <w:t xml:space="preserve"> </w:t>
+      </w:r>
+      <w:r>
+        <w:t xml:space="preserve">directory the user specified, and it also affects what a user would naturally reach for when reusing that report with tool 4’s</w:t>
+      </w:r>
+      <w:r>
+        <w:t xml:space="preserve"> </w:t>
+      </w:r>
+      <w:r>
+        <w:rPr>
+          <w:rStyle w:val="VerbatimChar"/>
+        </w:rPr>
+        <w:t xml:space="preserve">--report</w:t>
+      </w:r>
+      <w:r>
+        <w:t xml:space="preserve"> </w:t>
+      </w:r>
+      <w:r>
+        <w:t xml:space="preserve">flag.</w:t>
+      </w:r>
+    </w:p>
+    <w:p>
+      <w:pPr>
+        <w:pStyle w:val="BodyText"/>
+      </w:pPr>
+      <w:r>
+        <w:t xml:space="preserve">Fixed in</w:t>
+      </w:r>
+      <w:r>
+        <w:t xml:space="preserve"> </w:t>
+      </w:r>
+      <w:r>
+        <w:rPr>
+          <w:rStyle w:val="VerbatimChar"/>
+        </w:rPr>
+        <w:t xml:space="preserve">scripts/profile_hotspots.sh</w:t>
+      </w:r>
+      <w:r>
+        <w:t xml:space="preserve"> </w:t>
+      </w:r>
+      <w:r>
+        <w:t xml:space="preserve">only — no Python changes needed, since</w:t>
+      </w:r>
+      <w:r>
+        <w:t xml:space="preserve"> </w:t>
+      </w:r>
+      <w:r>
+        <w:rPr>
+          <w:rStyle w:val="VerbatimChar"/>
+        </w:rPr>
+        <w:t xml:space="preserve">extract_hotspots.py</w:t>
+      </w:r>
+      <w:r>
+        <w:t xml:space="preserve">’s</w:t>
+      </w:r>
+      <w:r>
+        <w:t xml:space="preserve"> </w:t>
+      </w:r>
+      <w:r>
+        <w:rPr>
+          <w:rStyle w:val="VerbatimChar"/>
+        </w:rPr>
+        <w:t xml:space="preserve">write_report()</w:t>
+      </w:r>
+      <w:r>
+        <w:t xml:space="preserve"> </w:t>
+      </w:r>
+      <w:r>
+        <w:t xml:space="preserve">already takes an explicit</w:t>
+      </w:r>
+      <w:r>
+        <w:t xml:space="preserve"> </w:t>
+      </w:r>
+      <w:r>
+        <w:rPr>
+          <w:rStyle w:val="VerbatimChar"/>
+        </w:rPr>
+        <w:t xml:space="preserve">dest_path</w:t>
+      </w:r>
+      <w:r>
+        <w:t xml:space="preserve"> </w:t>
+      </w:r>
+      <w:r>
+        <w:t xml:space="preserve">parameter; the bash script just needed to pass it. Added</w:t>
+      </w:r>
+      <w:r>
+        <w:t xml:space="preserve"> </w:t>
+      </w:r>
+      <w:r>
+        <w:rPr>
+          <w:rStyle w:val="VerbatimChar"/>
+        </w:rPr>
+        <w:t xml:space="preserve">REPORT_DEST="$OUTPUT_DIR/hotspots.txt"</w:t>
+      </w:r>
+      <w:r>
+        <w:t xml:space="preserve"> </w:t>
+      </w:r>
+      <w:r>
+        <w:t xml:space="preserve">and pass</w:t>
+      </w:r>
+      <w:r>
+        <w:t xml:space="preserve"> </w:t>
+      </w:r>
+      <w:r>
+        <w:rPr>
+          <w:rStyle w:val="VerbatimChar"/>
+        </w:rPr>
+        <w:t xml:space="preserve">-o "$REPORT_DEST"</w:t>
+      </w:r>
+      <w:r>
+        <w:t xml:space="preserve"> </w:t>
+      </w:r>
+      <w:r>
+        <w:t xml:space="preserve">on both the</w:t>
+      </w:r>
+      <w:r>
+        <w:t xml:space="preserve"> </w:t>
+      </w:r>
+      <w:r>
+        <w:rPr>
+          <w:rStyle w:val="VerbatimChar"/>
+        </w:rPr>
+        <w:t xml:space="preserve">--dry-run</w:t>
+      </w:r>
+      <w:r>
+        <w:t xml:space="preserve"> </w:t>
+      </w:r>
+      <w:r>
+        <w:t xml:space="preserve">preview line and the real extractor invocation; updated the</w:t>
+      </w:r>
+      <w:r>
+        <w:t xml:space="preserve"> </w:t>
+      </w:r>
+      <w:r>
+        <w:rPr>
+          <w:rStyle w:val="VerbatimChar"/>
+        </w:rPr>
+        <w:t xml:space="preserve">--no-summary</w:t>
+      </w:r>
+      <w:r>
+        <w:t xml:space="preserve">-and-no-</w:t>
+      </w:r>
+      <w:r>
+        <w:rPr>
+          <w:rStyle w:val="VerbatimChar"/>
+        </w:rPr>
+        <w:t xml:space="preserve">python3</w:t>
+      </w:r>
+      <w:r>
+        <w:t xml:space="preserve"> </w:t>
+      </w:r>
+      <w:r>
+        <w:t xml:space="preserve">fallback message and the</w:t>
+      </w:r>
+      <w:r>
+        <w:t xml:space="preserve"> </w:t>
+      </w:r>
+      <w:r>
+        <w:rPr>
+          <w:rStyle w:val="VerbatimChar"/>
+        </w:rPr>
+        <w:t xml:space="preserve">-h</w:t>
+      </w:r>
+      <w:r>
+        <w:t xml:space="preserve">/</w:t>
+      </w:r>
+      <w:r>
+        <w:rPr>
+          <w:rStyle w:val="VerbatimChar"/>
+        </w:rPr>
+        <w:t xml:space="preserve">--help</w:t>
+      </w:r>
+      <w:r>
+        <w:t xml:space="preserve"> </w:t>
+      </w:r>
+      <w:r>
+        <w:t xml:space="preserve">text to match. A short header note pointing here was added to</w:t>
+      </w:r>
+      <w:r>
+        <w:t xml:space="preserve"> </w:t>
+      </w:r>
+      <w:hyperlink r:id="rId36">
+        <w:r>
+          <w:rPr>
+            <w:rStyle w:val="Hyperlink"/>
+          </w:rPr>
+          <w:t xml:space="preserve">docs/plans/06-nested-dir-fix-mpi-unification-default-dirs.md</w:t>
+        </w:r>
+      </w:hyperlink>
+      <w:r>
+        <w:t xml:space="preserve">, per</w:t>
+      </w:r>
+      <w:r>
+        <w:t xml:space="preserve"> </w:t>
+      </w:r>
+      <w:r>
+        <w:rPr>
+          <w:rStyle w:val="VerbatimChar"/>
+        </w:rPr>
+        <w:t xml:space="preserve">CLAUDE.md</w:t>
+      </w:r>
+      <w:r>
+        <w:t xml:space="preserve">’s divergence-tracking convention, rather than editing that plan’s already-approved body.</w:t>
+      </w:r>
+    </w:p>
+    <w:p>
+      <w:pPr>
+        <w:pStyle w:val="BodyText"/>
+      </w:pPr>
+      <w:r>
+        <w:t xml:space="preserve">Verified: full test suite still passes unchanged (126 tests — this was a bash-only fix, no Python behavior changed);</w:t>
+      </w:r>
+      <w:r>
+        <w:t xml:space="preserve"> </w:t>
+      </w:r>
+      <w:r>
+        <w:rPr>
+          <w:rStyle w:val="VerbatimChar"/>
+        </w:rPr>
+        <w:t xml:space="preserve">bash -n</w:t>
+      </w:r>
+      <w:r>
+        <w:t xml:space="preserve"> </w:t>
+      </w:r>
+      <w:r>
+        <w:t xml:space="preserve">on the modified script;</w:t>
+      </w:r>
+      <w:r>
+        <w:t xml:space="preserve"> </w:t>
+      </w:r>
+      <w:r>
+        <w:rPr>
+          <w:rStyle w:val="VerbatimChar"/>
+        </w:rPr>
+        <w:t xml:space="preserve">--dry-run</w:t>
+      </w:r>
+      <w:r>
+        <w:t xml:space="preserve"> </w:t>
+      </w:r>
+      <w:r>
+        <w:t xml:space="preserve">confirms the extractor command now includes</w:t>
+      </w:r>
+      <w:r>
+        <w:t xml:space="preserve"> </w:t>
+      </w:r>
+      <w:r>
+        <w:rPr>
+          <w:rStyle w:val="VerbatimChar"/>
+        </w:rPr>
+        <w:t xml:space="preserve">-o &lt;DIR&gt;/hotspots.txt</w:t>
+      </w:r>
+      <w:r>
+        <w:t xml:space="preserve">; a manual run of</w:t>
+      </w:r>
+      <w:r>
+        <w:t xml:space="preserve"> </w:t>
+      </w:r>
+      <w:r>
+        <w:rPr>
+          <w:rStyle w:val="VerbatimChar"/>
+        </w:rPr>
+        <w:t xml:space="preserve">extract_hotspots.py</w:t>
+      </w:r>
+      <w:r>
+        <w:t xml:space="preserve"> </w:t>
+      </w:r>
+      <w:r>
+        <w:t xml:space="preserve">against fixture data with an explicit</w:t>
+      </w:r>
+      <w:r>
+        <w:t xml:space="preserve"> </w:t>
+      </w:r>
+      <w:r>
+        <w:rPr>
+          <w:rStyle w:val="VerbatimChar"/>
+        </w:rPr>
+        <w:t xml:space="preserve">-o</w:t>
+      </w:r>
+      <w:r>
+        <w:t xml:space="preserve"> </w:t>
+      </w:r>
+      <w:r>
+        <w:t xml:space="preserve">into a directory whose parent already exists (matching how the real launcher always has</w:t>
+      </w:r>
+      <w:r>
+        <w:t xml:space="preserve"> </w:t>
+      </w:r>
+      <w:r>
+        <w:rPr>
+          <w:rStyle w:val="VerbatimChar"/>
+        </w:rPr>
+        <w:t xml:space="preserve">DIR</w:t>
+      </w:r>
+      <w:r>
+        <w:t xml:space="preserve"> </w:t>
+      </w:r>
+      <w:r>
+        <w:t xml:space="preserve">already created by the sub-launchers before this final step runs) confirms the file is written at the expected root path.</w:t>
+      </w:r>
+    </w:p>
     <w:bookmarkEnd w:id="38"/>
+    <w:bookmarkEnd w:id="39"/>
     <w:sectPr/>
   </w:body>
 </w:document>

</xml_diff>

<commit_message>
Rank CPU hotspots by self-time instead of inclusive time
profile_CPU_hotspots.sh was forcing ROCPROFSYS_FLAT_PROFILE=1, which merges
every call-stack occurrence of a symbol into one row and forces % SELF to
100 for everything -- so wrapper functions like main/start_thread/solver_run
dominated the CPU hotspots table purely by inclusive time, and the same MPI
call showed up 3-4 times under different internal names. rocprof-sys's own
default is flat=false; with it off, real self-time is available and used to
rank instead, which lets pass-through functions fall out of the ranking on
their own. --unfiltered restores the old inclusive-time view everywhere.

Co-Authored-By: Claude Sonnet 5 <noreply@anthropic.com>
</commit_message>
<xml_diff>
--- a/docs/DEVELOPMENT_HISTORY.docx
+++ b/docs/DEVELOPMENT_HISTORY.docx
@@ -10,7 +10,7 @@
         <w:t xml:space="preserve">Development History</w:t>
       </w:r>
     </w:p>
-    <w:bookmarkStart w:id="39" w:name="development-history"/>
+    <w:bookmarkStart w:id="41" w:name="development-history"/>
     <w:p>
       <w:pPr>
         <w:pStyle w:val="Heading1"/>
@@ -7830,7 +7830,1363 @@
       </w:r>
     </w:p>
     <w:bookmarkEnd w:id="38"/>
-    <w:bookmarkEnd w:id="39"/>
+    <w:bookmarkStart w:id="40" w:name="Xd1deb48272ea9fc9d4b88469f0043159c66b76e"/>
+    <w:p>
+      <w:pPr>
+        <w:pStyle w:val="Heading2"/>
+      </w:pPr>
+      <w:r>
+        <w:t xml:space="preserve">2026-08-03 — CPU hotspots now ranked by self-time, not inclusive time (branch</w:t>
+      </w:r>
+      <w:r>
+        <w:t xml:space="preserve"> </w:t>
+      </w:r>
+      <w:r>
+        <w:rPr>
+          <w:rStyle w:val="VerbatimChar"/>
+        </w:rPr>
+        <w:t xml:space="preserve">calltree</w:t>
+      </w:r>
+      <w:r>
+        <w:t xml:space="preserve">)</w:t>
+      </w:r>
+    </w:p>
+    <w:p>
+      <w:pPr>
+        <w:pStyle w:val="FirstParagraph"/>
+      </w:pPr>
+      <w:r>
+        <w:t xml:space="preserve">Follow-up to the nested-directory fix above: the user pointed out that even after that fix, tool 1’s</w:t>
+      </w:r>
+      <w:r>
+        <w:t xml:space="preserve"> </w:t>
+      </w:r>
+      <w:r>
+        <w:t xml:space="preserve">“</w:t>
+      </w:r>
+      <w:r>
+        <w:t xml:space="preserve">CPU compute hotspots</w:t>
+      </w:r>
+      <w:r>
+        <w:t xml:space="preserve">”</w:t>
+      </w:r>
+      <w:r>
+        <w:t xml:space="preserve"> </w:t>
+      </w:r>
+      <w:r>
+        <w:t xml:space="preserve">table was still dominated by functions that do nothing themselves except call the next thing down (</w:t>
+      </w:r>
+      <w:r>
+        <w:rPr>
+          <w:rStyle w:val="VerbatimChar"/>
+        </w:rPr>
+        <w:t xml:space="preserve">main</w:t>
+      </w:r>
+      <w:r>
+        <w:t xml:space="preserve">,</w:t>
+      </w:r>
+      <w:r>
+        <w:t xml:space="preserve"> </w:t>
+      </w:r>
+      <w:r>
+        <w:rPr>
+          <w:rStyle w:val="VerbatimChar"/>
+        </w:rPr>
+        <w:t xml:space="preserve">start_thread</w:t>
+      </w:r>
+      <w:r>
+        <w:t xml:space="preserve">,</w:t>
+      </w:r>
+      <w:r>
+        <w:t xml:space="preserve"> </w:t>
+      </w:r>
+      <w:r>
+        <w:rPr>
+          <w:rStyle w:val="VerbatimChar"/>
+        </w:rPr>
+        <w:t xml:space="preserve">__libc_start_call_main</w:t>
+      </w:r>
+      <w:r>
+        <w:t xml:space="preserve">,</w:t>
+      </w:r>
+      <w:r>
+        <w:t xml:space="preserve"> </w:t>
+      </w:r>
+      <w:r>
+        <w:rPr>
+          <w:rStyle w:val="VerbatimChar"/>
+        </w:rPr>
+        <w:t xml:space="preserve">rocprofsys_main</w:t>
+      </w:r>
+      <w:r>
+        <w:t xml:space="preserve">,</w:t>
+      </w:r>
+      <w:r>
+        <w:t xml:space="preserve"> </w:t>
+      </w:r>
+      <w:r>
+        <w:rPr>
+          <w:rStyle w:val="VerbatimChar"/>
+        </w:rPr>
+        <w:t xml:space="preserve">__libc_start_main</w:t>
+      </w:r>
+      <w:r>
+        <w:t xml:space="preserve">, and user wrapper functions like</w:t>
+      </w:r>
+      <w:r>
+        <w:t xml:space="preserve"> </w:t>
+      </w:r>
+      <w:r>
+        <w:rPr>
+          <w:rStyle w:val="VerbatimChar"/>
+        </w:rPr>
+        <w:t xml:space="preserve">solver_run</w:t>
+      </w:r>
+      <w:r>
+        <w:t xml:space="preserve">/</w:t>
+      </w:r>
+      <w:r>
+        <w:rPr>
+          <w:rStyle w:val="VerbatimChar"/>
+        </w:rPr>
+        <w:t xml:space="preserve">solver_step</w:t>
+      </w:r>
+      <w:r>
+        <w:t xml:space="preserve">/</w:t>
+      </w:r>
+      <w:r>
+        <w:rPr>
+          <w:rStyle w:val="VerbatimChar"/>
+        </w:rPr>
+        <w:t xml:space="preserve">convection_step</w:t>
+      </w:r>
+      <w:r>
+        <w:t xml:space="preserve">), plus the same MPI operation appearing 3-4 times under different internal names (</w:t>
+      </w:r>
+      <w:r>
+        <w:rPr>
+          <w:rStyle w:val="VerbatimChar"/>
+        </w:rPr>
+        <w:t xml:space="preserve">mpi_allreduce_f08ts_</w:t>
+      </w:r>
+      <w:r>
+        <w:t xml:space="preserve">,</w:t>
+      </w:r>
+      <w:r>
+        <w:t xml:space="preserve"> </w:t>
+      </w:r>
+      <w:r>
+        <w:rPr>
+          <w:rStyle w:val="VerbatimChar"/>
+        </w:rPr>
+        <w:t xml:space="preserve">MPIR_Allreduce_cdesc</w:t>
+      </w:r>
+      <w:r>
+        <w:t xml:space="preserve">,</w:t>
+      </w:r>
+      <w:r>
+        <w:t xml:space="preserve"> </w:t>
+      </w:r>
+      <w:r>
+        <w:rPr>
+          <w:rStyle w:val="VerbatimChar"/>
+        </w:rPr>
+        <w:t xml:space="preserve">PMPI_Allreduce</w:t>
+      </w:r>
+      <w:r>
+        <w:t xml:space="preserve">,</w:t>
+      </w:r>
+      <w:r>
+        <w:t xml:space="preserve"> </w:t>
+      </w:r>
+      <w:r>
+        <w:rPr>
+          <w:rStyle w:val="VerbatimChar"/>
+        </w:rPr>
+        <w:t xml:space="preserve">MPIR_CRAY_Allreduce</w:t>
+      </w:r>
+      <w:r>
+        <w:t xml:space="preserve">). Given the risk of this change (it alters what gets</w:t>
+      </w:r>
+      <w:r>
+        <w:t xml:space="preserve"> </w:t>
+      </w:r>
+      <w:r>
+        <w:rPr>
+          <w:iCs/>
+          <w:i/>
+        </w:rPr>
+        <w:t xml:space="preserve">captured</w:t>
+      </w:r>
+      <w:r>
+        <w:t xml:space="preserve">, not just how it’s reported, and can’t be validated against real ROCm hardware from this dev machine), the user asked for it to be done on a separate branch (</w:t>
+      </w:r>
+      <w:r>
+        <w:rPr>
+          <w:rStyle w:val="VerbatimChar"/>
+        </w:rPr>
+        <w:t xml:space="preserve">calltree</w:t>
+      </w:r>
+      <w:r>
+        <w:t xml:space="preserve">) rather than</w:t>
+      </w:r>
+      <w:r>
+        <w:t xml:space="preserve"> </w:t>
+      </w:r>
+      <w:r>
+        <w:rPr>
+          <w:rStyle w:val="VerbatimChar"/>
+        </w:rPr>
+        <w:t xml:space="preserve">master</w:t>
+      </w:r>
+      <w:r>
+        <w:t xml:space="preserve">.</w:t>
+      </w:r>
+    </w:p>
+    <w:p>
+      <w:pPr>
+        <w:pStyle w:val="BodyText"/>
+      </w:pPr>
+      <w:r>
+        <w:t xml:space="preserve">Root-cause research (a background agent fetched AMD’s</w:t>
+      </w:r>
+      <w:r>
+        <w:t xml:space="preserve"> </w:t>
+      </w:r>
+      <w:r>
+        <w:rPr>
+          <w:rStyle w:val="VerbatimChar"/>
+        </w:rPr>
+        <w:t xml:space="preserve">ROCm/rocprofiler-systems</w:t>
+      </w:r>
+      <w:r>
+        <w:t xml:space="preserve"> </w:t>
+      </w:r>
+      <w:r>
+        <w:t xml:space="preserve">docs directly from the</w:t>
+      </w:r>
+      <w:r>
+        <w:t xml:space="preserve"> </w:t>
+      </w:r>
+      <w:r>
+        <w:rPr>
+          <w:rStyle w:val="VerbatimChar"/>
+        </w:rPr>
+        <w:t xml:space="preserve">rocm-7.0.2</w:t>
+      </w:r>
+      <w:r>
+        <w:t xml:space="preserve"> </w:t>
+      </w:r>
+      <w:r>
+        <w:t xml:space="preserve">tag) found that</w:t>
+      </w:r>
+      <w:r>
+        <w:t xml:space="preserve"> </w:t>
+      </w:r>
+      <w:r>
+        <w:rPr>
+          <w:rStyle w:val="VerbatimChar"/>
+        </w:rPr>
+        <w:t xml:space="preserve">profile_CPU_hotspots.sh</w:t>
+      </w:r>
+      <w:r>
+        <w:t xml:space="preserve"> </w:t>
+      </w:r>
+      <w:r>
+        <w:t xml:space="preserve">was itself setting</w:t>
+      </w:r>
+      <w:r>
+        <w:t xml:space="preserve"> </w:t>
+      </w:r>
+      <w:r>
+        <w:rPr>
+          <w:rStyle w:val="VerbatimChar"/>
+        </w:rPr>
+        <w:t xml:space="preserve">ROCPROFSYS_FLAT_PROFILE=1</w:t>
+      </w:r>
+      <w:r>
+        <w:t xml:space="preserve"> </w:t>
+      </w:r>
+      <w:r>
+        <w:t xml:space="preserve">— a setting that</w:t>
+      </w:r>
+      <w:r>
+        <w:t xml:space="preserve"> </w:t>
+      </w:r>
+      <w:r>
+        <w:rPr>
+          <w:bCs/>
+          <w:b/>
+        </w:rPr>
+        <w:t xml:space="preserve">defaults to</w:t>
+      </w:r>
+      <w:r>
+        <w:rPr>
+          <w:bCs/>
+          <w:b/>
+        </w:rPr>
+        <w:t xml:space="preserve"> </w:t>
+      </w:r>
+      <w:r>
+        <w:rPr>
+          <w:rStyle w:val="VerbatimChar"/>
+          <w:bCs/>
+          <w:b/>
+        </w:rPr>
+        <w:t xml:space="preserve">false</w:t>
+      </w:r>
+      <w:r>
+        <w:t xml:space="preserve"> </w:t>
+      </w:r>
+      <w:r>
+        <w:t xml:space="preserve">in rocprof-sys itself. Flat mode forces every row’s DEPTH to 0 and merges all call-stack occurrences of a symbol into one row, which is why</w:t>
+      </w:r>
+      <w:r>
+        <w:t xml:space="preserve"> </w:t>
+      </w:r>
+      <w:r>
+        <w:rPr>
+          <w:rStyle w:val="VerbatimChar"/>
+        </w:rPr>
+        <w:t xml:space="preserve">% SELF</w:t>
+      </w:r>
+      <w:r>
+        <w:t xml:space="preserve"> </w:t>
+      </w:r>
+      <w:r>
+        <w:t xml:space="preserve">came out as</w:t>
+      </w:r>
+      <w:r>
+        <w:t xml:space="preserve"> </w:t>
+      </w:r>
+      <w:r>
+        <w:rPr>
+          <w:rStyle w:val="VerbatimChar"/>
+        </w:rPr>
+        <w:t xml:space="preserve">100.0</w:t>
+      </w:r>
+      <w:r>
+        <w:t xml:space="preserve"> </w:t>
+      </w:r>
+      <w:r>
+        <w:t xml:space="preserve">for literally every row in the real captured data: there’s no way to distinguish a real hotspot from a pass-through wrapper once the call tree has been flattened. With flat mode off, the same file format (</w:t>
+      </w:r>
+      <w:r>
+        <w:rPr>
+          <w:rStyle w:val="VerbatimChar"/>
+        </w:rPr>
+        <w:t xml:space="preserve">wall_clock-&lt;pid&gt;.txt</w:t>
+      </w:r>
+      <w:r>
+        <w:t xml:space="preserve">) carries genuine per-node DEPTH and a differentiated</w:t>
+      </w:r>
+      <w:r>
+        <w:t xml:space="preserve"> </w:t>
+      </w:r>
+      <w:r>
+        <w:rPr>
+          <w:rStyle w:val="VerbatimChar"/>
+        </w:rPr>
+        <w:t xml:space="preserve">% SELF</w:t>
+      </w:r>
+      <w:r>
+        <w:t xml:space="preserve">, confirmed against AMD’s own worked example. Given a choice between (a) keeping flat-profile capture and hiding pollution via a name-based block-list plus MPI-name canonicalization, (b) switching to self-time ranking on real hierarchical data, or (c) both, the user chose self-time ranking alone (b) — it fixes the</w:t>
+      </w:r>
+      <w:r>
+        <w:t xml:space="preserve"> </w:t>
+      </w:r>
+      <w:r>
+        <w:rPr>
+          <w:iCs/>
+          <w:i/>
+        </w:rPr>
+        <w:t xml:space="preserve">whole</w:t>
+      </w:r>
+      <w:r>
+        <w:t xml:space="preserve"> </w:t>
+      </w:r>
+      <w:r>
+        <w:t xml:space="preserve">problem (including the pass-through user-wrapper case a block-list can’t reach), not just the system-function slice, and the MPI-duplicate problem was expected to mostly resolve itself too (only the call-tree node doing the actual blocking/communication work keeps meaningful self-time; wrapper layers around it drop toward zero and fall out of the ranking).</w:t>
+      </w:r>
+    </w:p>
+    <w:p>
+      <w:pPr>
+        <w:pStyle w:val="BodyText"/>
+      </w:pPr>
+      <w:r>
+        <w:rPr>
+          <w:bCs/>
+          <w:b/>
+        </w:rPr>
+        <w:t xml:space="preserve">Capture side:</w:t>
+      </w:r>
+      <w:r>
+        <w:t xml:space="preserve"> </w:t>
+      </w:r>
+      <w:r>
+        <w:rPr>
+          <w:rStyle w:val="VerbatimChar"/>
+        </w:rPr>
+        <w:t xml:space="preserve">scripts/profile_CPU_hotspots.sh</w:t>
+      </w:r>
+      <w:r>
+        <w:t xml:space="preserve"> </w:t>
+      </w:r>
+      <w:r>
+        <w:t xml:space="preserve">now sets</w:t>
+      </w:r>
+      <w:r>
+        <w:t xml:space="preserve"> </w:t>
+      </w:r>
+      <w:r>
+        <w:rPr>
+          <w:rStyle w:val="VerbatimChar"/>
+        </w:rPr>
+        <w:t xml:space="preserve">ROCPROFSYS_FLAT_PROFILE=0</w:t>
+      </w:r>
+      <w:r>
+        <w:t xml:space="preserve"> </w:t>
+      </w:r>
+      <w:r>
+        <w:t xml:space="preserve">(was</w:t>
+      </w:r>
+      <w:r>
+        <w:t xml:space="preserve"> </w:t>
+      </w:r>
+      <w:r>
+        <w:rPr>
+          <w:rStyle w:val="VerbatimChar"/>
+        </w:rPr>
+        <w:t xml:space="preserve">1</w:t>
+      </w:r>
+      <w:r>
+        <w:t xml:space="preserve">) — real call-tree data, at the qualitative overhead cost AMD’s docs mention (</w:t>
+      </w:r>
+      <w:r>
+        <w:t xml:space="preserve">“</w:t>
+      </w:r>
+      <w:r>
+        <w:t xml:space="preserve">flat has less overhead than hierarchical</w:t>
+      </w:r>
+      <w:r>
+        <w:t xml:space="preserve">”</w:t>
+      </w:r>
+      <w:r>
+        <w:t xml:space="preserve">, no numbers given); a user who needs the lighter flat mode back for an overhead-sensitive run can still set the env var themselves before invoking the script.</w:t>
+      </w:r>
+    </w:p>
+    <w:p>
+      <w:pPr>
+        <w:pStyle w:val="BodyText"/>
+      </w:pPr>
+      <w:r>
+        <w:rPr>
+          <w:bCs/>
+          <w:b/>
+        </w:rPr>
+        <w:t xml:space="preserve">Core change</w:t>
+      </w:r>
+      <w:r>
+        <w:t xml:space="preserve">, in</w:t>
+      </w:r>
+      <w:r>
+        <w:t xml:space="preserve"> </w:t>
+      </w:r>
+      <w:r>
+        <w:rPr>
+          <w:rStyle w:val="VerbatimChar"/>
+        </w:rPr>
+        <w:t xml:space="preserve">postprocess/extract_CPU_hotspots.py</w:t>
+      </w:r>
+      <w:r>
+        <w:t xml:space="preserve">, the single module tools 1/3/4 all funnel through:</w:t>
+      </w:r>
+      <w:r>
+        <w:t xml:space="preserve"> </w:t>
+      </w:r>
+      <w:r>
+        <w:rPr>
+          <w:rStyle w:val="VerbatimChar"/>
+        </w:rPr>
+        <w:t xml:space="preserve">parse_table_file()</w:t>
+      </w:r>
+      <w:r>
+        <w:t xml:space="preserve"> </w:t>
+      </w:r>
+      <w:r>
+        <w:t xml:space="preserve">now converts each row’s</w:t>
+      </w:r>
+      <w:r>
+        <w:t xml:space="preserve"> </w:t>
+      </w:r>
+      <w:r>
+        <w:rPr>
+          <w:rStyle w:val="VerbatimChar"/>
+        </w:rPr>
+        <w:t xml:space="preserve">% SELF</w:t>
+      </w:r>
+      <w:r>
+        <w:t xml:space="preserve"> </w:t>
+      </w:r>
+      <w:r>
+        <w:t xml:space="preserve">into</w:t>
+      </w:r>
+      <w:r>
+        <w:t xml:space="preserve"> </w:t>
+      </w:r>
+      <w:r>
+        <w:rPr>
+          <w:rStyle w:val="VerbatimChar"/>
+        </w:rPr>
+        <w:t xml:space="preserve">self_sum</w:t>
+      </w:r>
+      <w:r>
+        <w:t xml:space="preserve"> </w:t>
+      </w:r>
+      <w:r>
+        <w:t xml:space="preserve">(seconds) instead of keeping the raw percentage;</w:t>
+      </w:r>
+      <w:r>
+        <w:t xml:space="preserve"> </w:t>
+      </w:r>
+      <w:r>
+        <w:rPr>
+          <w:rStyle w:val="VerbatimChar"/>
+        </w:rPr>
+        <w:t xml:space="preserve">aggregate()</w:t>
+      </w:r>
+      <w:r>
+        <w:t xml:space="preserve">/</w:t>
+      </w:r>
+      <w:r>
+        <w:rPr>
+          <w:rStyle w:val="VerbatimChar"/>
+        </w:rPr>
+        <w:t xml:space="preserve">aggregate_per_rank()</w:t>
+      </w:r>
+      <w:r>
+        <w:t xml:space="preserve"> </w:t>
+      </w:r>
+      <w:r>
+        <w:t xml:space="preserve">accumulate</w:t>
+      </w:r>
+      <w:r>
+        <w:t xml:space="preserve"> </w:t>
+      </w:r>
+      <w:r>
+        <w:rPr>
+          <w:rStyle w:val="VerbatimChar"/>
+        </w:rPr>
+        <w:t xml:space="preserve">self_sum</w:t>
+      </w:r>
+      <w:r>
+        <w:t xml:space="preserve"> </w:t>
+      </w:r>
+      <w:r>
+        <w:t xml:space="preserve">alongside the existing inclusive</w:t>
+      </w:r>
+      <w:r>
+        <w:t xml:space="preserve"> </w:t>
+      </w:r>
+      <w:r>
+        <w:rPr>
+          <w:rStyle w:val="VerbatimChar"/>
+        </w:rPr>
+        <w:t xml:space="preserve">sum</w:t>
+      </w:r>
+      <w:r>
+        <w:t xml:space="preserve"> </w:t>
+      </w:r>
+      <w:r>
+        <w:t xml:space="preserve">(no double-counting risk, since self-time at different tree nodes never overlaps even when the same symbol recurs at multiple call sites);</w:t>
+      </w:r>
+      <w:r>
+        <w:t xml:space="preserve"> </w:t>
+      </w:r>
+      <w:r>
+        <w:rPr>
+          <w:rStyle w:val="VerbatimChar"/>
+        </w:rPr>
+        <w:t xml:space="preserve">select_entries()</w:t>
+      </w:r>
+      <w:r>
+        <w:t xml:space="preserve"> </w:t>
+      </w:r>
+      <w:r>
+        <w:t xml:space="preserve">gained a</w:t>
+      </w:r>
+      <w:r>
+        <w:t xml:space="preserve"> </w:t>
+      </w:r>
+      <w:r>
+        <w:rPr>
+          <w:rStyle w:val="VerbatimChar"/>
+        </w:rPr>
+        <w:t xml:space="preserve">rank_by</w:t>
+      </w:r>
+      <w:r>
+        <w:t xml:space="preserve"> </w:t>
+      </w:r>
+      <w:r>
+        <w:t xml:space="preserve">parameter (</w:t>
+      </w:r>
+      <w:r>
+        <w:rPr>
+          <w:rStyle w:val="VerbatimChar"/>
+        </w:rPr>
+        <w:t xml:space="preserve">"self"</w:t>
+      </w:r>
+      <w:r>
+        <w:t xml:space="preserve"> </w:t>
+      </w:r>
+      <w:r>
+        <w:t xml:space="preserve">default,</w:t>
+      </w:r>
+      <w:r>
+        <w:t xml:space="preserve"> </w:t>
+      </w:r>
+      <w:r>
+        <w:rPr>
+          <w:rStyle w:val="VerbatimChar"/>
+        </w:rPr>
+        <w:t xml:space="preserve">"inclusive"</w:t>
+      </w:r>
+      <w:r>
+        <w:t xml:space="preserve"> </w:t>
+      </w:r>
+      <w:r>
+        <w:t xml:space="preserve">for</w:t>
+      </w:r>
+      <w:r>
+        <w:t xml:space="preserve"> </w:t>
+      </w:r>
+      <w:r>
+        <w:rPr>
+          <w:rStyle w:val="VerbatimChar"/>
+        </w:rPr>
+        <w:t xml:space="preserve">--unfiltered</w:t>
+      </w:r>
+      <w:r>
+        <w:t xml:space="preserve">) and now computes each entry’s</w:t>
+      </w:r>
+      <w:r>
+        <w:t xml:space="preserve"> </w:t>
+      </w:r>
+      <w:r>
+        <w:rPr>
+          <w:rStyle w:val="VerbatimChar"/>
+        </w:rPr>
+        <w:t xml:space="preserve">pct_total</w:t>
+      </w:r>
+      <w:r>
+        <w:t xml:space="preserve"> </w:t>
+      </w:r>
+      <w:r>
+        <w:t xml:space="preserve">against whichever metric is actually being ranked (moved out of</w:t>
+      </w:r>
+      <w:r>
+        <w:t xml:space="preserve"> </w:t>
+      </w:r>
+      <w:r>
+        <w:rPr>
+          <w:rStyle w:val="VerbatimChar"/>
+        </w:rPr>
+        <w:t xml:space="preserve">aggregate()</w:t>
+      </w:r>
+      <w:r>
+        <w:t xml:space="preserve">, which used to precompute it against inclusive time only);</w:t>
+      </w:r>
+      <w:r>
+        <w:t xml:space="preserve"> </w:t>
+      </w:r>
+      <w:r>
+        <w:rPr>
+          <w:rStyle w:val="VerbatimChar"/>
+        </w:rPr>
+        <w:t xml:space="preserve">format_table()</w:t>
+      </w:r>
+      <w:r>
+        <w:t xml:space="preserve"> </w:t>
+      </w:r>
+      <w:r>
+        <w:t xml:space="preserve">gained a</w:t>
+      </w:r>
+      <w:r>
+        <w:t xml:space="preserve"> </w:t>
+      </w:r>
+      <w:r>
+        <w:rPr>
+          <w:rStyle w:val="VerbatimChar"/>
+        </w:rPr>
+        <w:t xml:space="preserve">self(s)</w:t>
+      </w:r>
+      <w:r>
+        <w:t xml:space="preserve"> </w:t>
+      </w:r>
+      <w:r>
+        <w:t xml:space="preserve">column ahead of the existing</w:t>
+      </w:r>
+      <w:r>
+        <w:t xml:space="preserve"> </w:t>
+      </w:r>
+      <w:r>
+        <w:rPr>
+          <w:rStyle w:val="VerbatimChar"/>
+        </w:rPr>
+        <w:t xml:space="preserve">total(s)</w:t>
+      </w:r>
+      <w:r>
+        <w:t xml:space="preserve">. This also decluttered the</w:t>
+      </w:r>
+      <w:r>
+        <w:t xml:space="preserve"> </w:t>
+      </w:r>
+      <w:r>
+        <w:t xml:space="preserve">“</w:t>
+      </w:r>
+      <w:r>
+        <w:t xml:space="preserve">GPU API / launch overhead</w:t>
+      </w:r>
+      <w:r>
+        <w:t xml:space="preserve">”</w:t>
+      </w:r>
+      <w:r>
+        <w:t xml:space="preserve"> </w:t>
+      </w:r>
+      <w:r>
+        <w:t xml:space="preserve">table’s own nested-HIP-wrapper redundancy for free, without touching it directly.</w:t>
+      </w:r>
+    </w:p>
+    <w:p>
+      <w:pPr>
+        <w:pStyle w:val="BodyText"/>
+      </w:pPr>
+      <w:r>
+        <w:rPr>
+          <w:bCs/>
+          <w:b/>
+        </w:rPr>
+        <w:t xml:space="preserve">Propagated everywhere</w:t>
+      </w:r>
+      <w:r>
+        <w:t xml:space="preserve">, same</w:t>
+      </w:r>
+      <w:r>
+        <w:t xml:space="preserve"> </w:t>
+      </w:r>
+      <w:r>
+        <w:t xml:space="preserve">“</w:t>
+      </w:r>
+      <w:r>
+        <w:t xml:space="preserve">fix once in</w:t>
+      </w:r>
+      <w:r>
+        <w:t xml:space="preserve"> </w:t>
+      </w:r>
+      <w:r>
+        <w:rPr>
+          <w:rStyle w:val="VerbatimChar"/>
+        </w:rPr>
+        <w:t xml:space="preserve">extract_CPU_hotspots.py</w:t>
+      </w:r>
+      <w:r>
+        <w:t xml:space="preserve">, inherited everywhere</w:t>
+      </w:r>
+      <w:r>
+        <w:t xml:space="preserve">”</w:t>
+      </w:r>
+      <w:r>
+        <w:t xml:space="preserve"> </w:t>
+      </w:r>
+      <w:r>
+        <w:t xml:space="preserve">pattern as the earlier nested-directory fix:</w:t>
+      </w:r>
+      <w:r>
+        <w:t xml:space="preserve"> </w:t>
+      </w:r>
+      <w:r>
+        <w:rPr>
+          <w:rStyle w:val="VerbatimChar"/>
+        </w:rPr>
+        <w:t xml:space="preserve">extract_hotspots.py</w:t>
+      </w:r>
+      <w:r>
+        <w:t xml:space="preserve"> </w:t>
+      </w:r>
+      <w:r>
+        <w:t xml:space="preserve">(tool 3) threads</w:t>
+      </w:r>
+      <w:r>
+        <w:t xml:space="preserve"> </w:t>
+      </w:r>
+      <w:r>
+        <w:rPr>
+          <w:rStyle w:val="VerbatimChar"/>
+        </w:rPr>
+        <w:t xml:space="preserve">rank_by</w:t>
+      </w:r>
+      <w:r>
+        <w:t xml:space="preserve"> </w:t>
+      </w:r>
+      <w:r>
+        <w:t xml:space="preserve">through its own</w:t>
+      </w:r>
+      <w:r>
+        <w:t xml:space="preserve"> </w:t>
+      </w:r>
+      <w:r>
+        <w:rPr>
+          <w:rStyle w:val="VerbatimChar"/>
+        </w:rPr>
+        <w:t xml:space="preserve">select_entries()</w:t>
+      </w:r>
+      <w:r>
+        <w:t xml:space="preserve"> </w:t>
+      </w:r>
+      <w:r>
+        <w:t xml:space="preserve">calls and switches the fused CPU+GPU table’s CPU-side numerator to</w:t>
+      </w:r>
+      <w:r>
+        <w:t xml:space="preserve"> </w:t>
+      </w:r>
+      <w:r>
+        <w:rPr>
+          <w:rStyle w:val="VerbatimChar"/>
+        </w:rPr>
+        <w:t xml:space="preserve">self_sum</w:t>
+      </w:r>
+      <w:r>
+        <w:t xml:space="preserve"> </w:t>
+      </w:r>
+      <w:r>
+        <w:t xml:space="preserve">(GPU kernel entries are already self-equivalent, being leaf events);</w:t>
+      </w:r>
+      <w:r>
+        <w:t xml:space="preserve"> </w:t>
+      </w:r>
+      <w:r>
+        <w:rPr>
+          <w:rStyle w:val="VerbatimChar"/>
+        </w:rPr>
+        <w:t xml:space="preserve">select_hotspot_functions.py</w:t>
+      </w:r>
+      <w:r>
+        <w:t xml:space="preserve"> </w:t>
+      </w:r>
+      <w:r>
+        <w:t xml:space="preserve">(tool 4) now prefers real self-contained hotspot functions as instrumentation targets by default, and its</w:t>
+      </w:r>
+      <w:r>
+        <w:t xml:space="preserve"> </w:t>
+      </w:r>
+      <w:r>
+        <w:rPr>
+          <w:rStyle w:val="VerbatimChar"/>
+        </w:rPr>
+        <w:t xml:space="preserve">labels_from_report()</w:t>
+      </w:r>
+      <w:r>
+        <w:t xml:space="preserve"> </w:t>
+      </w:r>
+      <w:r>
+        <w:t xml:space="preserve">parser was fixed for the new 7-column report format (</w:t>
+      </w:r>
+      <w:r>
+        <w:rPr>
+          <w:rStyle w:val="VerbatimChar"/>
+        </w:rPr>
+        <w:t xml:space="preserve">line.split(maxsplit=6)</w:t>
+      </w:r>
+      <w:r>
+        <w:t xml:space="preserve">/</w:t>
+      </w:r>
+      <w:r>
+        <w:rPr>
+          <w:rStyle w:val="VerbatimChar"/>
+        </w:rPr>
+        <w:t xml:space="preserve">parts[6]</w:t>
+      </w:r>
+      <w:r>
+        <w:t xml:space="preserve">, was</w:t>
+      </w:r>
+      <w:r>
+        <w:t xml:space="preserve"> </w:t>
+      </w:r>
+      <w:r>
+        <w:rPr>
+          <w:rStyle w:val="VerbatimChar"/>
+        </w:rPr>
+        <w:t xml:space="preserve">maxsplit=5</w:t>
+      </w:r>
+      <w:r>
+        <w:t xml:space="preserve">/</w:t>
+      </w:r>
+      <w:r>
+        <w:rPr>
+          <w:rStyle w:val="VerbatimChar"/>
+        </w:rPr>
+        <w:t xml:space="preserve">parts[5]</w:t>
+      </w:r>
+      <w:r>
+        <w:t xml:space="preserve"> </w:t>
+      </w:r>
+      <w:r>
+        <w:t xml:space="preserve">— would have silently mis-parsed every function name otherwise).</w:t>
+      </w:r>
+      <w:r>
+        <w:t xml:space="preserve"> </w:t>
+      </w:r>
+      <w:r>
+        <w:rPr>
+          <w:rStyle w:val="VerbatimChar"/>
+        </w:rPr>
+        <w:t xml:space="preserve">--unfiltered</w:t>
+      </w:r>
+      <w:r>
+        <w:t xml:space="preserve"> </w:t>
+      </w:r>
+      <w:r>
+        <w:t xml:space="preserve">(reverting to the old inclusive-time ranking) was added to all three Python tools and forwarded through all four bash scripts (</w:t>
+      </w:r>
+      <w:r>
+        <w:rPr>
+          <w:rStyle w:val="VerbatimChar"/>
+        </w:rPr>
+        <w:t xml:space="preserve">profile_CPU_hotspots.sh</w:t>
+      </w:r>
+      <w:r>
+        <w:t xml:space="preserve">,</w:t>
+      </w:r>
+      <w:r>
+        <w:t xml:space="preserve"> </w:t>
+      </w:r>
+      <w:r>
+        <w:rPr>
+          <w:rStyle w:val="VerbatimChar"/>
+        </w:rPr>
+        <w:t xml:space="preserve">profile_GPU_hotspots.sh</w:t>
+      </w:r>
+      <w:r>
+        <w:t xml:space="preserve"> </w:t>
+      </w:r>
+      <w:r>
+        <w:t xml:space="preserve">needed no change,</w:t>
+      </w:r>
+      <w:r>
+        <w:t xml:space="preserve"> </w:t>
+      </w:r>
+      <w:r>
+        <w:rPr>
+          <w:rStyle w:val="VerbatimChar"/>
+        </w:rPr>
+        <w:t xml:space="preserve">profile_hotspots.sh</w:t>
+      </w:r>
+      <w:r>
+        <w:t xml:space="preserve">,</w:t>
+      </w:r>
+      <w:r>
+        <w:t xml:space="preserve"> </w:t>
+      </w:r>
+      <w:r>
+        <w:rPr>
+          <w:rStyle w:val="VerbatimChar"/>
+        </w:rPr>
+        <w:t xml:space="preserve">instrument_hotspots.sh</w:t>
+      </w:r>
+      <w:r>
+        <w:t xml:space="preserve">) the same way</w:t>
+      </w:r>
+      <w:r>
+        <w:t xml:space="preserve"> </w:t>
+      </w:r>
+      <w:r>
+        <w:rPr>
+          <w:rStyle w:val="VerbatimChar"/>
+        </w:rPr>
+        <w:t xml:space="preserve">--top</w:t>
+      </w:r>
+      <w:r>
+        <w:t xml:space="preserve">/</w:t>
+      </w:r>
+      <w:r>
+        <w:rPr>
+          <w:rStyle w:val="VerbatimChar"/>
+        </w:rPr>
+        <w:t xml:space="preserve">--threshold</w:t>
+      </w:r>
+      <w:r>
+        <w:t xml:space="preserve">/</w:t>
+      </w:r>
+      <w:r>
+        <w:rPr>
+          <w:rStyle w:val="VerbatimChar"/>
+        </w:rPr>
+        <w:t xml:space="preserve">--all</w:t>
+      </w:r>
+      <w:r>
+        <w:t xml:space="preserve"> </w:t>
+      </w:r>
+      <w:r>
+        <w:t xml:space="preserve">already are — including</w:t>
+      </w:r>
+      <w:r>
+        <w:t xml:space="preserve"> </w:t>
+      </w:r>
+      <w:r>
+        <w:rPr>
+          <w:rStyle w:val="VerbatimChar"/>
+        </w:rPr>
+        <w:t xml:space="preserve">profile_CPU_hotspots.sh</w:t>
+      </w:r>
+      <w:r>
+        <w:t xml:space="preserve">’s own forwarding to its extractor call, which the initial implementation missed and manual</w:t>
+      </w:r>
+      <w:r>
+        <w:t xml:space="preserve"> </w:t>
+      </w:r>
+      <w:r>
+        <w:rPr>
+          <w:rStyle w:val="VerbatimChar"/>
+        </w:rPr>
+        <w:t xml:space="preserve">--dry-run</w:t>
+      </w:r>
+      <w:r>
+        <w:t xml:space="preserve"> </w:t>
+      </w:r>
+      <w:r>
+        <w:t xml:space="preserve">verification caught (see the plan file’s post-implementation note).</w:t>
+      </w:r>
+    </w:p>
+    <w:p>
+      <w:pPr>
+        <w:pStyle w:val="BodyText"/>
+      </w:pPr>
+      <w:r>
+        <w:rPr>
+          <w:bCs/>
+          <w:b/>
+        </w:rPr>
+        <w:t xml:space="preserve">Out of scope, flagged for later:</w:t>
+      </w:r>
+      <w:r>
+        <w:t xml:space="preserve"> </w:t>
+      </w:r>
+      <w:r>
+        <w:t xml:space="preserve">while tracing the combined-pool arithmetic in</w:t>
+      </w:r>
+      <w:r>
+        <w:t xml:space="preserve"> </w:t>
+      </w:r>
+      <w:r>
+        <w:rPr>
+          <w:rStyle w:val="VerbatimChar"/>
+        </w:rPr>
+        <w:t xml:space="preserve">extract_hotspots.py</w:t>
+      </w:r>
+      <w:r>
+        <w:t xml:space="preserve">, found that</w:t>
+      </w:r>
+      <w:r>
+        <w:t xml:space="preserve"> </w:t>
+      </w:r>
+      <w:r>
+        <w:rPr>
+          <w:rStyle w:val="VerbatimChar"/>
+        </w:rPr>
+        <w:t xml:space="preserve">gpu_api_overhead_sec = sum(e["sum"] for e in cpu_gpu_api_entries)</w:t>
+      </w:r>
+      <w:r>
+        <w:t xml:space="preserve"> </w:t>
+      </w:r>
+      <w:r>
+        <w:t xml:space="preserve">sums inclusive time across every GPU-API-classified row, several of which are nested inside each other in the real sample data (e.g. </w:t>
+      </w:r>
+      <w:r>
+        <w:rPr>
+          <w:rStyle w:val="VerbatimChar"/>
+        </w:rPr>
+        <w:t xml:space="preserve">hip::hipStreamCreate</w:t>
+      </w:r>
+      <w:r>
+        <w:t xml:space="preserve">/</w:t>
+      </w:r>
+      <w:r>
+        <w:rPr>
+          <w:rStyle w:val="VerbatimChar"/>
+        </w:rPr>
+        <w:t xml:space="preserve">hip::ihipStreamCreate</w:t>
+      </w:r>
+      <w:r>
+        <w:t xml:space="preserve">/</w:t>
+      </w:r>
+      <w:r>
+        <w:rPr>
+          <w:rStyle w:val="VerbatimChar"/>
+        </w:rPr>
+        <w:t xml:space="preserve">hip::Stream::Stream</w:t>
+      </w:r>
+      <w:r>
+        <w:t xml:space="preserve"> </w:t>
+      </w:r>
+      <w:r>
+        <w:t xml:space="preserve">all show the identical total) — likely over-counting the real host-side GPU-blocking time subtracted from the combined pool. Pre-existing, unrelated to this change; flagged via</w:t>
+      </w:r>
+      <w:r>
+        <w:t xml:space="preserve"> </w:t>
+      </w:r>
+      <w:r>
+        <w:rPr>
+          <w:rStyle w:val="VerbatimChar"/>
+        </w:rPr>
+        <w:t xml:space="preserve">spawn_task</w:t>
+      </w:r>
+      <w:r>
+        <w:t xml:space="preserve"> </w:t>
+      </w:r>
+      <w:r>
+        <w:t xml:space="preserve">rather than fixed here.</w:t>
+      </w:r>
+    </w:p>
+    <w:p>
+      <w:pPr>
+        <w:pStyle w:val="BodyText"/>
+      </w:pPr>
+      <w:r>
+        <w:t xml:space="preserve">Implemented per the approved plan,</w:t>
+      </w:r>
+      <w:r>
+        <w:t xml:space="preserve"> </w:t>
+      </w:r>
+      <w:hyperlink r:id="rId39">
+        <w:r>
+          <w:rPr>
+            <w:rStyle w:val="Hyperlink"/>
+          </w:rPr>
+          <w:t xml:space="preserve">docs/plans/07-cpu-hotspots-self-time-ranking.md</w:t>
+        </w:r>
+      </w:hyperlink>
+      <w:r>
+        <w:t xml:space="preserve"> </w:t>
+      </w:r>
+      <w:r>
+        <w:t xml:space="preserve">(see its trailing post-implementation note for the</w:t>
+      </w:r>
+      <w:r>
+        <w:t xml:space="preserve"> </w:t>
+      </w:r>
+      <w:r>
+        <w:rPr>
+          <w:rStyle w:val="VerbatimChar"/>
+        </w:rPr>
+        <w:t xml:space="preserve">profile_CPU_hotspots.sh</w:t>
+      </w:r>
+      <w:r>
+        <w:t xml:space="preserve"> </w:t>
+      </w:r>
+      <w:r>
+        <w:t xml:space="preserve">gap and the fixture decision below).</w:t>
+      </w:r>
+    </w:p>
+    <w:p>
+      <w:pPr>
+        <w:pStyle w:val="BodyText"/>
+      </w:pPr>
+      <w:r>
+        <w:t xml:space="preserve">Verified locally (no ROCm/GPU available): existing fixtures (</w:t>
+      </w:r>
+      <w:r>
+        <w:rPr>
+          <w:rStyle w:val="VerbatimChar"/>
+        </w:rPr>
+        <w:t xml:space="preserve">single_rank</w:t>
+      </w:r>
+      <w:r>
+        <w:t xml:space="preserve">,</w:t>
+      </w:r>
+      <w:r>
+        <w:t xml:space="preserve"> </w:t>
+      </w:r>
+      <w:r>
+        <w:rPr>
+          <w:rStyle w:val="VerbatimChar"/>
+        </w:rPr>
+        <w:t xml:space="preserve">mpi_2rank</w:t>
+      </w:r>
+      <w:r>
+        <w:t xml:space="preserve">) turned out to already have realistic hierarchical</w:t>
+      </w:r>
+      <w:r>
+        <w:t xml:space="preserve"> </w:t>
+      </w:r>
+      <w:r>
+        <w:rPr>
+          <w:rStyle w:val="VerbatimChar"/>
+        </w:rPr>
+        <w:t xml:space="preserve">% SELF</w:t>
+      </w:r>
+      <w:r>
+        <w:t xml:space="preserve"> </w:t>
+      </w:r>
+      <w:r>
+        <w:t xml:space="preserve">variation rather than the uniform 100% a flat profile produces (e.g. </w:t>
+      </w:r>
+      <w:r>
+        <w:rPr>
+          <w:rStyle w:val="VerbatimChar"/>
+        </w:rPr>
+        <w:t xml:space="preserve">main</w:t>
+      </w:r>
+      <w:r>
+        <w:t xml:space="preserve"> </w:t>
+      </w:r>
+      <w:r>
+        <w:t xml:space="preserve">at 0.1% self,</w:t>
+      </w:r>
+      <w:r>
+        <w:t xml:space="preserve"> </w:t>
+      </w:r>
+      <w:r>
+        <w:rPr>
+          <w:rStyle w:val="VerbatimChar"/>
+        </w:rPr>
+        <w:t xml:space="preserve">compute_stencil</w:t>
+      </w:r>
+      <w:r>
+        <w:t xml:space="preserve"> </w:t>
+      </w:r>
+      <w:r>
+        <w:t xml:space="preserve">at ~94% self) — no new fixture was needed to exercise the self-time path; existing tests were extended in place instead (136 tests total, up from 126, all passing), including cases proving</w:t>
+      </w:r>
+      <w:r>
+        <w:t xml:space="preserve"> </w:t>
+      </w:r>
+      <w:r>
+        <w:rPr>
+          <w:rStyle w:val="VerbatimChar"/>
+        </w:rPr>
+        <w:t xml:space="preserve">main</w:t>
+      </w:r>
+      <w:r>
+        <w:t xml:space="preserve">’s huge inclusive time collapses to near-zero self-time, that</w:t>
+      </w:r>
+      <w:r>
+        <w:t xml:space="preserve"> </w:t>
+      </w:r>
+      <w:r>
+        <w:rPr>
+          <w:rStyle w:val="VerbatimChar"/>
+        </w:rPr>
+        <w:t xml:space="preserve">select_entries</w:t>
+      </w:r>
+      <w:r>
+        <w:t xml:space="preserve">’s</w:t>
+      </w:r>
+      <w:r>
+        <w:t xml:space="preserve"> </w:t>
+      </w:r>
+      <w:r>
+        <w:rPr>
+          <w:rStyle w:val="VerbatimChar"/>
+        </w:rPr>
+        <w:t xml:space="preserve">rank_by</w:t>
+      </w:r>
+      <w:r>
+        <w:t xml:space="preserve"> </w:t>
+      </w:r>
+      <w:r>
+        <w:t xml:space="preserve">genuinely reorders results, and a synthetic-report regression test for</w:t>
+      </w:r>
+      <w:r>
+        <w:t xml:space="preserve"> </w:t>
+      </w:r>
+      <w:r>
+        <w:rPr>
+          <w:rStyle w:val="VerbatimChar"/>
+        </w:rPr>
+        <w:t xml:space="preserve">labels_from_report()</w:t>
+      </w:r>
+      <w:r>
+        <w:t xml:space="preserve">’s new column count.</w:t>
+      </w:r>
+      <w:r>
+        <w:t xml:space="preserve"> </w:t>
+      </w:r>
+      <w:r>
+        <w:rPr>
+          <w:rStyle w:val="VerbatimChar"/>
+        </w:rPr>
+        <w:t xml:space="preserve">bash -n</w:t>
+      </w:r>
+      <w:r>
+        <w:t xml:space="preserve"> </w:t>
+      </w:r>
+      <w:r>
+        <w:t xml:space="preserve">on all three modified scripts.</w:t>
+      </w:r>
+      <w:r>
+        <w:t xml:space="preserve"> </w:t>
+      </w:r>
+      <w:r>
+        <w:rPr>
+          <w:rStyle w:val="VerbatimChar"/>
+        </w:rPr>
+        <w:t xml:space="preserve">--dry-run --unfiltered</w:t>
+      </w:r>
+      <w:r>
+        <w:t xml:space="preserve"> </w:t>
+      </w:r>
+      <w:r>
+        <w:t xml:space="preserve">on all three confirmed correct forwarding. Ran</w:t>
+      </w:r>
+      <w:r>
+        <w:t xml:space="preserve"> </w:t>
+      </w:r>
+      <w:r>
+        <w:rPr>
+          <w:rStyle w:val="VerbatimChar"/>
+        </w:rPr>
+        <w:t xml:space="preserve">extract_CPU_hotspots.py</w:t>
+      </w:r>
+      <w:r>
+        <w:t xml:space="preserve"> </w:t>
+      </w:r>
+      <w:r>
+        <w:t xml:space="preserve">against the real</w:t>
+      </w:r>
+      <w:r>
+        <w:t xml:space="preserve"> </w:t>
+      </w:r>
+      <w:r>
+        <w:rPr>
+          <w:rStyle w:val="VerbatimChar"/>
+        </w:rPr>
+        <w:t xml:space="preserve">Heat_Convection_Solver</w:t>
+      </w:r>
+      <w:r>
+        <w:t xml:space="preserve"> </w:t>
+      </w:r>
+      <w:r>
+        <w:t xml:space="preserve">sample directory (captured under the</w:t>
+      </w:r>
+      <w:r>
+        <w:t xml:space="preserve"> </w:t>
+      </w:r>
+      <w:r>
+        <w:rPr>
+          <w:iCs/>
+          <w:i/>
+        </w:rPr>
+        <w:t xml:space="preserve">old</w:t>
+      </w:r>
+      <w:r>
+        <w:t xml:space="preserve"> </w:t>
+      </w:r>
+      <w:r>
+        <w:t xml:space="preserve">flat-profile setting) and confirmed it reproduces the original, unchanged report — expected, since that data has no self/inclusive distinction to exploit; the actual decluttering effect can only be confirmed on a fresh run captured with the updated script, which is left to the user on the target HPC system.</w:t>
+      </w:r>
+    </w:p>
+    <w:bookmarkEnd w:id="40"/>
+    <w:bookmarkEnd w:id="41"/>
     <w:sectPr/>
   </w:body>
 </w:document>

</xml_diff>

<commit_message>
Fix double-counted GPU API overhead in combined hotspots tool
build_combined_view()'s gpu_api_overhead_sec summed inclusive time across
every GPU-API-classified row, but several of those rows are nested inside
each other (one call chain measured at every wrapper level, not independent
calls) -- confirmed against real Heat_Convection_Solver sample data where
hipStreamCreate/hip::hipStreamCreate/hip::ihipStreamCreate all show the
identical total. Switched to summing self_sum instead: self-time is disjoint
across every node regardless of nesting, so it can't double-count an overlap
the way inclusive time did. Only fixable now that self_sum exists (added by
the self-time-ranking change on this branch).

Co-Authored-By: Claude Sonnet 5 <noreply@anthropic.com>
</commit_message>
<xml_diff>
--- a/docs/DEVELOPMENT_HISTORY.docx
+++ b/docs/DEVELOPMENT_HISTORY.docx
@@ -10,7 +10,7 @@
         <w:t xml:space="preserve">Development History</w:t>
       </w:r>
     </w:p>
-    <w:bookmarkStart w:id="41" w:name="development-history"/>
+    <w:bookmarkStart w:id="42" w:name="development-history"/>
     <w:p>
       <w:pPr>
         <w:pStyle w:val="Heading1"/>
@@ -9186,7 +9186,422 @@
       </w:r>
     </w:p>
     <w:bookmarkEnd w:id="40"/>
+    <w:bookmarkStart w:id="41" w:name="X11749bf5b54c19732b03db698906ba2df4ff25f"/>
+    <w:p>
+      <w:pPr>
+        <w:pStyle w:val="Heading2"/>
+      </w:pPr>
+      <w:r>
+        <w:t xml:space="preserve">2026-08-03 — Fixed the flagged</w:t>
+      </w:r>
+      <w:r>
+        <w:t xml:space="preserve"> </w:t>
+      </w:r>
+      <w:r>
+        <w:rPr>
+          <w:rStyle w:val="VerbatimChar"/>
+        </w:rPr>
+        <w:t xml:space="preserve">gpu_api_overhead_sec</w:t>
+      </w:r>
+      <w:r>
+        <w:t xml:space="preserve"> </w:t>
+      </w:r>
+      <w:r>
+        <w:t xml:space="preserve">double-count (branch</w:t>
+      </w:r>
+      <w:r>
+        <w:t xml:space="preserve"> </w:t>
+      </w:r>
+      <w:r>
+        <w:rPr>
+          <w:rStyle w:val="VerbatimChar"/>
+        </w:rPr>
+        <w:t xml:space="preserve">calltree</w:t>
+      </w:r>
+      <w:r>
+        <w:t xml:space="preserve">)</w:t>
+      </w:r>
+    </w:p>
+    <w:p>
+      <w:pPr>
+        <w:pStyle w:val="FirstParagraph"/>
+      </w:pPr>
+      <w:r>
+        <w:t xml:space="preserve">Follow-up to the self-time-ranking work above: the user asked to fix the</w:t>
+      </w:r>
+      <w:r>
+        <w:t xml:space="preserve"> </w:t>
+      </w:r>
+      <w:r>
+        <w:rPr>
+          <w:rStyle w:val="VerbatimChar"/>
+        </w:rPr>
+        <w:t xml:space="preserve">gpu_api_overhead_sec</w:t>
+      </w:r>
+      <w:r>
+        <w:t xml:space="preserve"> </w:t>
+      </w:r>
+      <w:r>
+        <w:t xml:space="preserve">bug that had been flagged (via</w:t>
+      </w:r>
+      <w:r>
+        <w:t xml:space="preserve"> </w:t>
+      </w:r>
+      <w:r>
+        <w:rPr>
+          <w:rStyle w:val="VerbatimChar"/>
+        </w:rPr>
+        <w:t xml:space="preserve">spawn_task</w:t>
+      </w:r>
+      <w:r>
+        <w:t xml:space="preserve">) as a pre-existing, out-of-scope issue during that work, rather than spinning it off separately.</w:t>
+      </w:r>
+    </w:p>
+    <w:p>
+      <w:pPr>
+        <w:pStyle w:val="BodyText"/>
+      </w:pPr>
+      <w:r>
+        <w:rPr>
+          <w:rStyle w:val="VerbatimChar"/>
+        </w:rPr>
+        <w:t xml:space="preserve">extract_hotspots.py</w:t>
+      </w:r>
+      <w:r>
+        <w:t xml:space="preserve">’s</w:t>
+      </w:r>
+      <w:r>
+        <w:t xml:space="preserve"> </w:t>
+      </w:r>
+      <w:r>
+        <w:rPr>
+          <w:rStyle w:val="VerbatimChar"/>
+        </w:rPr>
+        <w:t xml:space="preserve">build_combined_view()</w:t>
+      </w:r>
+      <w:r>
+        <w:t xml:space="preserve"> </w:t>
+      </w:r>
+      <w:r>
+        <w:t xml:space="preserve">computes the CPU-side</w:t>
+      </w:r>
+      <w:r>
+        <w:t xml:space="preserve"> </w:t>
+      </w:r>
+      <w:r>
+        <w:t xml:space="preserve">“</w:t>
+      </w:r>
+      <w:r>
+        <w:t xml:space="preserve">double-counting fix</w:t>
+      </w:r>
+      <w:r>
+        <w:t xml:space="preserve">”</w:t>
+      </w:r>
+      <w:r>
+        <w:t xml:space="preserve"> </w:t>
+      </w:r>
+      <w:r>
+        <w:t xml:space="preserve">(subtracting time the CPU spent blocked inside</w:t>
+      </w:r>
+      <w:r>
+        <w:t xml:space="preserve"> </w:t>
+      </w:r>
+      <w:r>
+        <w:rPr>
+          <w:rStyle w:val="VerbatimChar"/>
+        </w:rPr>
+        <w:t xml:space="preserve">hipStreamSynchronize</w:t>
+      </w:r>
+      <w:r>
+        <w:t xml:space="preserve">/</w:t>
+      </w:r>
+      <w:r>
+        <w:rPr>
+          <w:rStyle w:val="VerbatimChar"/>
+        </w:rPr>
+        <w:t xml:space="preserve">hipMemcpy</w:t>
+      </w:r>
+      <w:r>
+        <w:t xml:space="preserve">/etc. from its total before adding the GPU run’s kernel total, to avoid counting that overlap twice) as</w:t>
+      </w:r>
+      <w:r>
+        <w:t xml:space="preserve"> </w:t>
+      </w:r>
+      <w:r>
+        <w:rPr>
+          <w:rStyle w:val="VerbatimChar"/>
+        </w:rPr>
+        <w:t xml:space="preserve">gpu_api_overhead_sec = sum(e["sum"] for e in cpu_gpu_api_entries)</w:t>
+      </w:r>
+      <w:r>
+        <w:t xml:space="preserve"> </w:t>
+      </w:r>
+      <w:r>
+        <w:t xml:space="preserve">— summing every GPU-API-classified row’s</w:t>
+      </w:r>
+      <w:r>
+        <w:t xml:space="preserve"> </w:t>
+      </w:r>
+      <w:r>
+        <w:rPr>
+          <w:iCs/>
+          <w:i/>
+        </w:rPr>
+        <w:t xml:space="preserve">inclusive</w:t>
+      </w:r>
+      <w:r>
+        <w:t xml:space="preserve"> </w:t>
+      </w:r>
+      <w:r>
+        <w:t xml:space="preserve">time. The bug: several of those rows are themselves nested inside each other (confirmed in the real</w:t>
+      </w:r>
+      <w:r>
+        <w:t xml:space="preserve"> </w:t>
+      </w:r>
+      <w:r>
+        <w:rPr>
+          <w:rStyle w:val="VerbatimChar"/>
+        </w:rPr>
+        <w:t xml:space="preserve">Heat_Convection_Solver</w:t>
+      </w:r>
+      <w:r>
+        <w:t xml:space="preserve"> </w:t>
+      </w:r>
+      <w:r>
+        <w:t xml:space="preserve">sample data —</w:t>
+      </w:r>
+      <w:r>
+        <w:t xml:space="preserve"> </w:t>
+      </w:r>
+      <w:r>
+        <w:rPr>
+          <w:rStyle w:val="VerbatimChar"/>
+        </w:rPr>
+        <w:t xml:space="preserve">hipStreamCreate</w:t>
+      </w:r>
+      <w:r>
+        <w:t xml:space="preserve">/</w:t>
+      </w:r>
+      <w:r>
+        <w:rPr>
+          <w:rStyle w:val="VerbatimChar"/>
+        </w:rPr>
+        <w:t xml:space="preserve">hip::hipStreamCreate(...)</w:t>
+      </w:r>
+      <w:r>
+        <w:t xml:space="preserve">/</w:t>
+      </w:r>
+      <w:r>
+        <w:rPr>
+          <w:rStyle w:val="VerbatimChar"/>
+        </w:rPr>
+        <w:t xml:space="preserve">hip::ihipStreamCreate(...)</w:t>
+      </w:r>
+      <w:r>
+        <w:t xml:space="preserve">/</w:t>
+      </w:r>
+      <w:r>
+        <w:rPr>
+          <w:rStyle w:val="VerbatimChar"/>
+        </w:rPr>
+        <w:t xml:space="preserve">hip::Stream::Stream(...)</w:t>
+      </w:r>
+      <w:r>
+        <w:t xml:space="preserve"> </w:t>
+      </w:r>
+      <w:r>
+        <w:t xml:space="preserve">all show the</w:t>
+      </w:r>
+      <w:r>
+        <w:t xml:space="preserve"> </w:t>
+      </w:r>
+      <w:r>
+        <w:rPr>
+          <w:iCs/>
+          <w:i/>
+        </w:rPr>
+        <w:t xml:space="preserve">identical</w:t>
+      </w:r>
+      <w:r>
+        <w:t xml:space="preserve"> </w:t>
+      </w:r>
+      <w:r>
+        <w:t xml:space="preserve">total, i.e. one call chain measured four times, not four independent calls), so summing inclusive time across the whole bucket counts that one overlapping wall-clock interval once per nesting level.</w:t>
+      </w:r>
+    </w:p>
+    <w:p>
+      <w:pPr>
+        <w:pStyle w:val="BodyText"/>
+      </w:pPr>
+      <w:r>
+        <w:t xml:space="preserve">Fixed by switching to</w:t>
+      </w:r>
+      <w:r>
+        <w:t xml:space="preserve"> </w:t>
+      </w:r>
+      <w:r>
+        <w:rPr>
+          <w:rStyle w:val="VerbatimChar"/>
+        </w:rPr>
+        <w:t xml:space="preserve">sum(e["self_sum"] for e in cpu_gpu_api_entries)</w:t>
+      </w:r>
+      <w:r>
+        <w:t xml:space="preserve"> </w:t>
+      </w:r>
+      <w:r>
+        <w:t xml:space="preserve">— self-time rather than inclusive time. This is correct by construction: every call-tree node’s self-time is disjoint from every other node’s (parent, child, GPU-API-classified or not), so summing self-time over any subset of nodes always recovers the real total wall-clock time spent inside that subset, regardless of how deep a matched chain nests — unlike inclusive time, which double/triple-counts exactly the overlap between a node and its also-matched ancestors.</w:t>
+      </w:r>
+      <w:r>
+        <w:t xml:space="preserve"> </w:t>
+      </w:r>
+      <w:r>
+        <w:rPr>
+          <w:rStyle w:val="VerbatimChar"/>
+        </w:rPr>
+        <w:t xml:space="preserve">self_sum</w:t>
+      </w:r>
+      <w:r>
+        <w:t xml:space="preserve"> </w:t>
+      </w:r>
+      <w:r>
+        <w:t xml:space="preserve">was only available to reach for here because of the self-time infrastructure the ranking change above just added to</w:t>
+      </w:r>
+      <w:r>
+        <w:t xml:space="preserve"> </w:t>
+      </w:r>
+      <w:r>
+        <w:rPr>
+          <w:rStyle w:val="VerbatimChar"/>
+        </w:rPr>
+        <w:t xml:space="preserve">extract_CPU_hotspots.py</w:t>
+      </w:r>
+      <w:r>
+        <w:t xml:space="preserve">’s</w:t>
+      </w:r>
+      <w:r>
+        <w:t xml:space="preserve"> </w:t>
+      </w:r>
+      <w:r>
+        <w:rPr>
+          <w:rStyle w:val="VerbatimChar"/>
+        </w:rPr>
+        <w:t xml:space="preserve">aggregate()</w:t>
+      </w:r>
+      <w:r>
+        <w:t xml:space="preserve">; this bug couldn’t have been fixed this way before that. Same caveat as the parent fix: this only actually changes anything once real hierarchical data exists — on old flat-profile-captured data (</w:t>
+      </w:r>
+      <w:r>
+        <w:rPr>
+          <w:rStyle w:val="VerbatimChar"/>
+        </w:rPr>
+        <w:t xml:space="preserve">% SELF</w:t>
+      </w:r>
+      <w:r>
+        <w:t xml:space="preserve"> </w:t>
+      </w:r>
+      <w:r>
+        <w:t xml:space="preserve">uniformly 100),</w:t>
+      </w:r>
+      <w:r>
+        <w:t xml:space="preserve"> </w:t>
+      </w:r>
+      <w:r>
+        <w:rPr>
+          <w:rStyle w:val="VerbatimChar"/>
+        </w:rPr>
+        <w:t xml:space="preserve">self_sum == sum</w:t>
+      </w:r>
+      <w:r>
+        <w:t xml:space="preserve"> </w:t>
+      </w:r>
+      <w:r>
+        <w:t xml:space="preserve">and the bucket total is unchanged, still exhibiting the original bug’s numbers.</w:t>
+      </w:r>
+    </w:p>
+    <w:p>
+      <w:pPr>
+        <w:pStyle w:val="BodyText"/>
+      </w:pPr>
+      <w:r>
+        <w:t xml:space="preserve">Added a new fixture,</w:t>
+      </w:r>
+      <w:r>
+        <w:t xml:space="preserve"> </w:t>
+      </w:r>
+      <w:r>
+        <w:rPr>
+          <w:rStyle w:val="VerbatimChar"/>
+        </w:rPr>
+        <w:t xml:space="preserve">postprocess/tests/fixtures/gpu_api_nested_chain/</w:t>
+      </w:r>
+      <w:r>
+        <w:t xml:space="preserve">, modeling exactly the reported shape (three nested HIP-stream-creation labels, each inclusive sum 1.0s, but only the innermost holding real self-time — the outer two are ~0.1%-self pass-through wrappers) so the fix is proven end-to-end rather than just by code inspection: the old (buggy) inclusive-sum formula gives 3.0s for this fixture; the fixed self-time formula gives the correct 1.0s.</w:t>
+      </w:r>
+      <w:r>
+        <w:t xml:space="preserve"> </w:t>
+      </w:r>
+      <w:r>
+        <w:rPr>
+          <w:rStyle w:val="VerbatimChar"/>
+        </w:rPr>
+        <w:t xml:space="preserve">test_subtraction_arithmetic_matches_documented_formula</w:t>
+      </w:r>
+      <w:r>
+        <w:t xml:space="preserve">’s own independent recomputation of the documented formula was updated to match (it happened to still pass numerically beforehand, since every pre-existing GPU-API fixture entry has</w:t>
+      </w:r>
+      <w:r>
+        <w:t xml:space="preserve"> </w:t>
+      </w:r>
+      <w:r>
+        <w:rPr>
+          <w:rStyle w:val="VerbatimChar"/>
+        </w:rPr>
+        <w:t xml:space="preserve">% SELF</w:t>
+      </w:r>
+      <w:r>
+        <w:t xml:space="preserve"> </w:t>
+      </w:r>
+      <w:r>
+        <w:t xml:space="preserve">= 100, but its own formula would otherwise have silently verified the wrong thing).</w:t>
+      </w:r>
+    </w:p>
+    <w:p>
+      <w:pPr>
+        <w:pStyle w:val="BodyText"/>
+      </w:pPr>
+      <w:r>
+        <w:t xml:space="preserve">Verified: full suite now 137 tests, all passing (136 → 137, the one new regression test).</w:t>
+      </w:r>
+      <w:r>
+        <w:t xml:space="preserve"> </w:t>
+      </w:r>
+      <w:r>
+        <w:rPr>
+          <w:rStyle w:val="VerbatimChar"/>
+        </w:rPr>
+        <w:t xml:space="preserve">bash -n</w:t>
+      </w:r>
+      <w:r>
+        <w:t xml:space="preserve"> </w:t>
+      </w:r>
+      <w:r>
+        <w:t xml:space="preserve">unaffected (Python-only change). No script/CLI changes needed — this was purely an arithmetic fix inside</w:t>
+      </w:r>
+      <w:r>
+        <w:t xml:space="preserve"> </w:t>
+      </w:r>
+      <w:r>
+        <w:rPr>
+          <w:rStyle w:val="VerbatimChar"/>
+        </w:rPr>
+        <w:t xml:space="preserve">extract_hotspots.py</w:t>
+      </w:r>
+      <w:r>
+        <w:t xml:space="preserve">.</w:t>
+      </w:r>
+    </w:p>
     <w:bookmarkEnd w:id="41"/>
+    <w:bookmarkEnd w:id="42"/>
     <w:sectPr/>
   </w:body>
 </w:document>

</xml_diff>

<commit_message>
Fifth tool: GPU kernel deep-dive via rocprof-compute
Finds the biggest GPU kernels (tool 2) then profiles only those in
hardware-counter detail with rocprof-compute -k, targeting each kernel's
2nd call (-d 2) to skip first-touch/page-fault-skewed first dispatches --
kernels called only once are excluded by default (--all-dispatches
overrides both, with a loud runtime-multiplication warning).

rocprof-compute's own multi-rank output isolation isn't confirmed present
in any publicly tagged version, so rather than assume, the script probes
the installed tool's own --help output at runtime and independently
determines the actual rank count before allowing --mpi to reach it,
refusing to run rather than risk concurrent ranks corrupting each other's
output.

Co-Authored-By: Claude Sonnet 5 <noreply@anthropic.com>
</commit_message>
<xml_diff>
--- a/docs/DEVELOPMENT_HISTORY.docx
+++ b/docs/DEVELOPMENT_HISTORY.docx
@@ -10,7 +10,7 @@
         <w:t xml:space="preserve">Development History</w:t>
       </w:r>
     </w:p>
-    <w:bookmarkStart w:id="42" w:name="development-history"/>
+    <w:bookmarkStart w:id="44" w:name="development-history"/>
     <w:p>
       <w:pPr>
         <w:pStyle w:val="Heading1"/>
@@ -416,6 +416,117 @@
           </w:p>
         </w:tc>
       </w:tr>
+      <w:tr>
+        <w:tc>
+          <w:tcPr/>
+          <w:p>
+            <w:pPr>
+              <w:pStyle w:val="Compact"/>
+              <w:jc w:val="left"/>
+            </w:pPr>
+            <w:r>
+              <w:t xml:space="preserve">2026-08-03</w:t>
+            </w:r>
+          </w:p>
+        </w:tc>
+        <w:tc>
+          <w:tcPr/>
+          <w:p>
+            <w:pPr>
+              <w:pStyle w:val="Compact"/>
+              <w:jc w:val="left"/>
+            </w:pPr>
+            <w:r>
+              <w:t xml:space="preserve">CPU hotspots now ranked by self-time instead of inclusive time (branch</w:t>
+            </w:r>
+            <w:r>
+              <w:t xml:space="preserve"> </w:t>
+            </w:r>
+            <w:r>
+              <w:rPr>
+                <w:rStyle w:val="VerbatimChar"/>
+              </w:rPr>
+              <w:t xml:space="preserve">calltree</w:t>
+            </w:r>
+            <w:r>
+              <w:t xml:space="preserve">)</w:t>
+            </w:r>
+          </w:p>
+        </w:tc>
+      </w:tr>
+      <w:tr>
+        <w:tc>
+          <w:tcPr/>
+          <w:p>
+            <w:pPr>
+              <w:pStyle w:val="Compact"/>
+              <w:jc w:val="left"/>
+            </w:pPr>
+            <w:r>
+              <w:t xml:space="preserve">2026-08-03</w:t>
+            </w:r>
+          </w:p>
+        </w:tc>
+        <w:tc>
+          <w:tcPr/>
+          <w:p>
+            <w:pPr>
+              <w:pStyle w:val="Compact"/>
+              <w:jc w:val="left"/>
+            </w:pPr>
+            <w:r>
+              <w:t xml:space="preserve">Fixed a pre-existing double-count in tool 3’s combined-pool GPU-API-overhead arithmetic (branch</w:t>
+            </w:r>
+            <w:r>
+              <w:t xml:space="preserve"> </w:t>
+            </w:r>
+            <w:r>
+              <w:rPr>
+                <w:rStyle w:val="VerbatimChar"/>
+              </w:rPr>
+              <w:t xml:space="preserve">calltree</w:t>
+            </w:r>
+            <w:r>
+              <w:t xml:space="preserve">)</w:t>
+            </w:r>
+          </w:p>
+        </w:tc>
+      </w:tr>
+      <w:tr>
+        <w:tc>
+          <w:tcPr/>
+          <w:p>
+            <w:pPr>
+              <w:pStyle w:val="Compact"/>
+              <w:jc w:val="left"/>
+            </w:pPr>
+            <w:r>
+              <w:t xml:space="preserve">2026-08-03</w:t>
+            </w:r>
+          </w:p>
+        </w:tc>
+        <w:tc>
+          <w:tcPr/>
+          <w:p>
+            <w:pPr>
+              <w:pStyle w:val="Compact"/>
+              <w:jc w:val="left"/>
+            </w:pPr>
+            <w:r>
+              <w:t xml:space="preserve">Fifth tool: GPU kernel deep-dive via rocprof-compute (</w:t>
+            </w:r>
+            <w:r>
+              <w:rPr>
+                <w:rStyle w:val="VerbatimChar"/>
+              </w:rPr>
+              <w:t xml:space="preserve">profile_hotspot_kernels.sh</w:t>
+            </w:r>
+            <w:r>
+              <w:t xml:space="preserve">)</w:t>
+            </w:r>
+          </w:p>
+        </w:tc>
+      </w:tr>
     </w:tbl>
     <w:bookmarkStart w:id="20" w:name="project-scaffolding-and-rules"/>
     <w:p>
@@ -9601,7 +9712,1393 @@
       </w:r>
     </w:p>
     <w:bookmarkEnd w:id="41"/>
-    <w:bookmarkEnd w:id="42"/>
+    <w:bookmarkStart w:id="43" w:name="Xc3489d0680caa834aa491344e44127290740065"/>
+    <w:p>
+      <w:pPr>
+        <w:pStyle w:val="Heading2"/>
+      </w:pPr>
+      <w:r>
+        <w:t xml:space="preserve">2026-08-03 — Fifth tool: GPU kernel deep-dive via rocprof-compute</w:t>
+      </w:r>
+    </w:p>
+    <w:p>
+      <w:pPr>
+        <w:pStyle w:val="FirstParagraph"/>
+      </w:pPr>
+      <w:r>
+        <w:t xml:space="preserve">The project’s own scope had always named</w:t>
+      </w:r>
+      <w:r>
+        <w:t xml:space="preserve"> </w:t>
+      </w:r>
+      <w:r>
+        <w:rPr>
+          <w:rStyle w:val="VerbatimChar"/>
+        </w:rPr>
+        <w:t xml:space="preserve">rocprof-compute</w:t>
+      </w:r>
+      <w:r>
+        <w:t xml:space="preserve"> </w:t>
+      </w:r>
+      <w:r>
+        <w:t xml:space="preserve">(ROCm’s rename of Omniperf) as a third AMD tool this suite would eventually wrap, alongside</w:t>
+      </w:r>
+      <w:r>
+        <w:t xml:space="preserve"> </w:t>
+      </w:r>
+      <w:r>
+        <w:rPr>
+          <w:rStyle w:val="VerbatimChar"/>
+        </w:rPr>
+        <w:t xml:space="preserve">rocprofv3</w:t>
+      </w:r>
+      <w:r>
+        <w:t xml:space="preserve">/</w:t>
+      </w:r>
+      <w:r>
+        <w:rPr>
+          <w:rStyle w:val="VerbatimChar"/>
+        </w:rPr>
+        <w:t xml:space="preserve">rocprof-sys</w:t>
+      </w:r>
+      <w:r>
+        <w:t xml:space="preserve"> </w:t>
+      </w:r>
+      <w:r>
+        <w:t xml:space="preserve">— this is its first concrete implementation. The user’s ask: reuse the</w:t>
+      </w:r>
+      <w:r>
+        <w:t xml:space="preserve"> </w:t>
+      </w:r>
+      <w:r>
+        <w:t xml:space="preserve">“</w:t>
+      </w:r>
+      <w:r>
+        <w:t xml:space="preserve">hotspots → instrument → trace</w:t>
+      </w:r>
+      <w:r>
+        <w:t xml:space="preserve">”</w:t>
+      </w:r>
+      <w:r>
+        <w:t xml:space="preserve"> </w:t>
+      </w:r>
+      <w:r>
+        <w:t xml:space="preserve">pipeline shape tool 4 established, but for GPU kernels — run tool 2 to find the biggest kernels, then build and run a</w:t>
+      </w:r>
+      <w:r>
+        <w:t xml:space="preserve"> </w:t>
+      </w:r>
+      <w:r>
+        <w:rPr>
+          <w:rStyle w:val="VerbatimChar"/>
+        </w:rPr>
+        <w:t xml:space="preserve">rocprof-compute</w:t>
+      </w:r>
+      <w:r>
+        <w:t xml:space="preserve"> </w:t>
+      </w:r>
+      <w:r>
+        <w:t xml:space="preserve">command restricted to just those, instead of profiling every kernel the application launches. Implemented per the approved plan in</w:t>
+      </w:r>
+      <w:r>
+        <w:t xml:space="preserve"> </w:t>
+      </w:r>
+      <w:hyperlink r:id="rId42">
+        <w:r>
+          <w:rPr>
+            <w:rStyle w:val="Hyperlink"/>
+          </w:rPr>
+          <w:t xml:space="preserve">docs/plans/08-gpu-kernel-deep-dive.md</w:t>
+        </w:r>
+      </w:hyperlink>
+      <w:r>
+        <w:t xml:space="preserve">.</w:t>
+      </w:r>
+    </w:p>
+    <w:p>
+      <w:pPr>
+        <w:pStyle w:val="BodyText"/>
+      </w:pPr>
+      <w:r>
+        <w:rPr>
+          <w:bCs/>
+          <w:b/>
+        </w:rPr>
+        <w:t xml:space="preserve">Not a two-subcommand tool like tool 4.</w:t>
+      </w:r>
+      <w:r>
+        <w:t xml:space="preserve"> </w:t>
+      </w:r>
+      <w:r>
+        <w:t xml:space="preserve">Tool 4 splits into</w:t>
+      </w:r>
+      <w:r>
+        <w:t xml:space="preserve"> </w:t>
+      </w:r>
+      <w:r>
+        <w:rPr>
+          <w:rStyle w:val="VerbatimChar"/>
+        </w:rPr>
+        <w:t xml:space="preserve">instrument</w:t>
+      </w:r>
+      <w:r>
+        <w:t xml:space="preserve"> </w:t>
+      </w:r>
+      <w:r>
+        <w:t xml:space="preserve">(build a rewritten binary, stop) and</w:t>
+      </w:r>
+      <w:r>
+        <w:t xml:space="preserve"> </w:t>
+      </w:r>
+      <w:r>
+        <w:rPr>
+          <w:rStyle w:val="VerbatimChar"/>
+        </w:rPr>
+        <w:t xml:space="preserve">trace</w:t>
+      </w:r>
+      <w:r>
+        <w:t xml:space="preserve"> </w:t>
+      </w:r>
+      <w:r>
+        <w:t xml:space="preserve">(build, then run) because the Dyninst rewrite is a separate, reusable, expensive artifact.</w:t>
+      </w:r>
+      <w:r>
+        <w:t xml:space="preserve"> </w:t>
+      </w:r>
+      <w:r>
+        <w:rPr>
+          <w:rStyle w:val="VerbatimChar"/>
+        </w:rPr>
+        <w:t xml:space="preserve">rocprof-compute</w:t>
+      </w:r>
+      <w:r>
+        <w:t xml:space="preserve"> </w:t>
+      </w:r>
+      <w:r>
+        <w:t xml:space="preserve">has no such build step —</w:t>
+      </w:r>
+      <w:r>
+        <w:t xml:space="preserve"> </w:t>
+      </w:r>
+      <w:r>
+        <w:rPr>
+          <w:rStyle w:val="VerbatimChar"/>
+        </w:rPr>
+        <w:t xml:space="preserve">rocprof-compute profile</w:t>
+      </w:r>
+      <w:r>
+        <w:t xml:space="preserve"> </w:t>
+      </w:r>
+      <w:r>
+        <w:rPr>
+          <w:iCs/>
+          <w:i/>
+        </w:rPr>
+        <w:t xml:space="preserve">is</w:t>
+      </w:r>
+      <w:r>
+        <w:t xml:space="preserve"> </w:t>
+      </w:r>
+      <w:r>
+        <w:t xml:space="preserve">the run — so per the user’s explicit choice, this is a single-mode script: find kernels → run a</w:t>
+      </w:r>
+      <w:r>
+        <w:t xml:space="preserve"> </w:t>
+      </w:r>
+      <w:r>
+        <w:rPr>
+          <w:rStyle w:val="VerbatimChar"/>
+        </w:rPr>
+        <w:t xml:space="preserve">-k</w:t>
+      </w:r>
+      <w:r>
+        <w:t xml:space="preserve">-filtered</w:t>
+      </w:r>
+      <w:r>
+        <w:t xml:space="preserve"> </w:t>
+      </w:r>
+      <w:r>
+        <w:rPr>
+          <w:rStyle w:val="VerbatimChar"/>
+        </w:rPr>
+        <w:t xml:space="preserve">rocprof-compute profile</w:t>
+      </w:r>
+      <w:r>
+        <w:t xml:space="preserve"> </w:t>
+      </w:r>
+      <w:r>
+        <w:t xml:space="preserve">→ auto-run</w:t>
+      </w:r>
+      <w:r>
+        <w:t xml:space="preserve"> </w:t>
+      </w:r>
+      <w:r>
+        <w:rPr>
+          <w:rStyle w:val="VerbatimChar"/>
+        </w:rPr>
+        <w:t xml:space="preserve">rocprof-compute analyze</w:t>
+      </w:r>
+      <w:r>
+        <w:t xml:space="preserve"> </w:t>
+      </w:r>
+      <w:r>
+        <w:t xml:space="preserve">and surface its own output verbatim (no custom parsing needed, unlike rocprof-sys’s raw text tables —</w:t>
+      </w:r>
+      <w:r>
+        <w:t xml:space="preserve"> </w:t>
+      </w:r>
+      <w:r>
+        <w:rPr>
+          <w:rStyle w:val="VerbatimChar"/>
+        </w:rPr>
+        <w:t xml:space="preserve">analyze</w:t>
+      </w:r>
+      <w:r>
+        <w:t xml:space="preserve"> </w:t>
+      </w:r>
+      <w:r>
+        <w:t xml:space="preserve">is already a human-facing summary tool).</w:t>
+      </w:r>
+    </w:p>
+    <w:p>
+      <w:pPr>
+        <w:pStyle w:val="BodyText"/>
+      </w:pPr>
+      <w:r>
+        <w:rPr>
+          <w:bCs/>
+          <w:b/>
+        </w:rPr>
+        <w:t xml:space="preserve">Skipping each kernel’s first call.</w:t>
+      </w:r>
+      <w:r>
+        <w:t xml:space="preserve"> </w:t>
+      </w:r>
+      <w:r>
+        <w:t xml:space="preserve">The user wanted to avoid re-profiling the same kernel across every one of its iterations (overhead, and 99% redundant data), and specifically wanted to skip each kernel’s</w:t>
+      </w:r>
+      <w:r>
+        <w:t xml:space="preserve"> </w:t>
+      </w:r>
+      <w:r>
+        <w:rPr>
+          <w:iCs/>
+          <w:i/>
+        </w:rPr>
+        <w:t xml:space="preserve">first</w:t>
+      </w:r>
+      <w:r>
+        <w:t xml:space="preserve"> </w:t>
+      </w:r>
+      <w:r>
+        <w:t xml:space="preserve">call (skewed by one-time first-touch/page-fault overhead, not representative of steady-state cost). This went through a real correction during research: ROCm 7.0.2’s own tagged docs state</w:t>
+      </w:r>
+      <w:r>
+        <w:t xml:space="preserve"> </w:t>
+      </w:r>
+      <w:r>
+        <w:t xml:space="preserve">“</w:t>
+      </w:r>
+      <w:r>
+        <w:t xml:space="preserve">dispatch filtering is based on the</w:t>
+      </w:r>
+      <w:r>
+        <w:t xml:space="preserve"> </w:t>
+      </w:r>
+      <w:r>
+        <w:rPr>
+          <w:iCs/>
+          <w:i/>
+        </w:rPr>
+        <w:t xml:space="preserve">global</w:t>
+      </w:r>
+      <w:r>
+        <w:t xml:space="preserve"> </w:t>
+      </w:r>
+      <w:r>
+        <w:t xml:space="preserve">dispatch index of kernels in a run</w:t>
+      </w:r>
+      <w:r>
+        <w:t xml:space="preserve">”</w:t>
+      </w:r>
+      <w:r>
+        <w:t xml:space="preserve"> </w:t>
+      </w:r>
+      <w:r>
+        <w:t xml:space="preserve">— which would have required parsing rocprofv3’s per-dispatch trace CSV and re-deriving global launch-order indices ourselves, a much larger and less certain feature. The user corrected this directly from their own repeated hands-on use:</w:t>
+      </w:r>
+      <w:r>
+        <w:t xml:space="preserve"> </w:t>
+      </w:r>
+      <w:r>
+        <w:rPr>
+          <w:rStyle w:val="VerbatimChar"/>
+        </w:rPr>
+        <w:t xml:space="preserve">-d</w:t>
+      </w:r>
+      <w:r>
+        <w:t xml:space="preserve">, combined with</w:t>
+      </w:r>
+      <w:r>
+        <w:t xml:space="preserve"> </w:t>
+      </w:r>
+      <w:r>
+        <w:rPr>
+          <w:rStyle w:val="VerbatimChar"/>
+        </w:rPr>
+        <w:t xml:space="preserve">-k</w:t>
+      </w:r>
+      <w:r>
+        <w:t xml:space="preserve">, actually selects the Nth occurrence</w:t>
+      </w:r>
+      <w:r>
+        <w:t xml:space="preserve"> </w:t>
+      </w:r>
+      <w:r>
+        <w:rPr>
+          <w:iCs/>
+          <w:i/>
+        </w:rPr>
+        <w:t xml:space="preserve">of each</w:t>
+      </w:r>
+      <w:r>
+        <w:rPr>
+          <w:iCs/>
+          <w:i/>
+        </w:rPr>
+        <w:t xml:space="preserve"> </w:t>
+      </w:r>
+      <w:r>
+        <w:rPr>
+          <w:rStyle w:val="VerbatimChar"/>
+          <w:iCs/>
+          <w:i/>
+        </w:rPr>
+        <w:t xml:space="preserve">-k</w:t>
+      </w:r>
+      <w:r>
+        <w:rPr>
+          <w:iCs/>
+          <w:i/>
+        </w:rPr>
+        <w:t xml:space="preserve">-matched kernel</w:t>
+      </w:r>
+      <w:r>
+        <w:t xml:space="preserve"> </w:t>
+      </w:r>
+      <w:r>
+        <w:t xml:space="preserve">(1-based), not a global index — docs can be stale/imprecise, direct usage wins. This collapsed the design back to its simplest form:</w:t>
+      </w:r>
+      <w:r>
+        <w:t xml:space="preserve"> </w:t>
+      </w:r>
+      <w:r>
+        <w:rPr>
+          <w:rStyle w:val="VerbatimChar"/>
+        </w:rPr>
+        <w:t xml:space="preserve">-k &lt;name1&gt; &lt;name2&gt; ...</w:t>
+      </w:r>
+      <w:r>
+        <w:t xml:space="preserve"> </w:t>
+      </w:r>
+      <w:r>
+        <w:t xml:space="preserve">(kernel names from tool 2, exactly as first designed) plus a fixed</w:t>
+      </w:r>
+      <w:r>
+        <w:t xml:space="preserve"> </w:t>
+      </w:r>
+      <w:r>
+        <w:rPr>
+          <w:rStyle w:val="VerbatimChar"/>
+        </w:rPr>
+        <w:t xml:space="preserve">-d 2</w:t>
+      </w:r>
+      <w:r>
+        <w:t xml:space="preserve">. Kernels dispatched only once (no second call to target) are excluded from selection entirely, per the user’s own call that they’re</w:t>
+      </w:r>
+      <w:r>
+        <w:t xml:space="preserve"> </w:t>
+      </w:r>
+      <w:r>
+        <w:t xml:space="preserve">“</w:t>
+      </w:r>
+      <w:r>
+        <w:t xml:space="preserve">irrelevant anyway in the optimization process</w:t>
+      </w:r>
+      <w:r>
+        <w:t xml:space="preserve">”</w:t>
+      </w:r>
+      <w:r>
+        <w:t xml:space="preserve"> </w:t>
+      </w:r>
+      <w:r>
+        <w:t xml:space="preserve">for a beginner tool.</w:t>
+      </w:r>
+      <w:r>
+        <w:t xml:space="preserve"> </w:t>
+      </w:r>
+      <w:r>
+        <w:rPr>
+          <w:rStyle w:val="VerbatimChar"/>
+        </w:rPr>
+        <w:t xml:space="preserve">--all-dispatches</w:t>
+      </w:r>
+      <w:r>
+        <w:t xml:space="preserve"> </w:t>
+      </w:r>
+      <w:r>
+        <w:t xml:space="preserve">is an escape hatch that drops</w:t>
+      </w:r>
+      <w:r>
+        <w:t xml:space="preserve"> </w:t>
+      </w:r>
+      <w:r>
+        <w:rPr>
+          <w:rStyle w:val="VerbatimChar"/>
+        </w:rPr>
+        <w:t xml:space="preserve">-d 2</w:t>
+      </w:r>
+      <w:r>
+        <w:t xml:space="preserve"> </w:t>
+      </w:r>
+      <w:r>
+        <w:t xml:space="preserve">and the single-call exclusion, printing a loud runtime-multiplication warning (a kernel called N times can multiply profiling time by roughly N) — intentionally not the default.</w:t>
+      </w:r>
+    </w:p>
+    <w:p>
+      <w:pPr>
+        <w:pStyle w:val="BodyText"/>
+      </w:pPr>
+      <w:r>
+        <w:rPr>
+          <w:bCs/>
+          <w:b/>
+        </w:rPr>
+        <w:t xml:space="preserve">MPI multi-rank safety.</w:t>
+      </w:r>
+      <w:r>
+        <w:t xml:space="preserve"> </w:t>
+      </w:r>
+      <w:r>
+        <w:rPr>
+          <w:rStyle w:val="VerbatimChar"/>
+        </w:rPr>
+        <w:t xml:space="preserve">rocprof-compute</w:t>
+      </w:r>
+      <w:r>
+        <w:t xml:space="preserve">‘</w:t>
+      </w:r>
+      <w:r>
+        <w:t xml:space="preserve">s own per-rank output isolation (</w:t>
+      </w:r>
+      <w:r>
+        <w:rPr>
+          <w:rStyle w:val="VerbatimChar"/>
+        </w:rPr>
+        <w:t xml:space="preserve">%rank%</w:t>
+      </w:r>
+      <w:r>
+        <w:t xml:space="preserve">/</w:t>
+      </w:r>
+      <w:r>
+        <w:rPr>
+          <w:rStyle w:val="VerbatimChar"/>
+        </w:rPr>
+        <w:t xml:space="preserve">%hostname%</w:t>
+      </w:r>
+      <w:r>
+        <w:t xml:space="preserve"> </w:t>
+      </w:r>
+      <w:r>
+        <w:t xml:space="preserve">path placeholders, so concurrent ranks don’t overwrite each other’s data) is a real feature in AMD’s current</w:t>
+      </w:r>
+      <w:r>
+        <w:t xml:space="preserve"> </w:t>
+      </w:r>
+      <w:r>
+        <w:t xml:space="preserve">“</w:t>
+      </w:r>
+      <w:r>
+        <w:t xml:space="preserve">latest</w:t>
+      </w:r>
+      <w:r>
+        <w:t xml:space="preserve">”</w:t>
+      </w:r>
+      <w:r>
+        <w:t xml:space="preserve"> </w:t>
+      </w:r>
+      <w:r>
+        <w:t xml:space="preserve">published docs, but research (checking</w:t>
+      </w:r>
+      <w:r>
+        <w:t xml:space="preserve"> </w:t>
+      </w:r>
+      <w:r>
+        <w:rPr>
+          <w:rStyle w:val="VerbatimChar"/>
+        </w:rPr>
+        <w:t xml:space="preserve">src/argparser.py</w:t>
+      </w:r>
+      <w:r>
+        <w:t xml:space="preserve"> </w:t>
+      </w:r>
+      <w:r>
+        <w:t xml:space="preserve">directly at every</w:t>
+      </w:r>
+      <w:r>
+        <w:t xml:space="preserve"> </w:t>
+      </w:r>
+      <w:r>
+        <w:rPr>
+          <w:rStyle w:val="VerbatimChar"/>
+        </w:rPr>
+        <w:t xml:space="preserve">rocm-7.x</w:t>
+      </w:r>
+      <w:r>
+        <w:t xml:space="preserve"> </w:t>
+      </w:r>
+      <w:r>
+        <w:t xml:space="preserve">git tag through</w:t>
+      </w:r>
+      <w:r>
+        <w:t xml:space="preserve"> </w:t>
+      </w:r>
+      <w:r>
+        <w:rPr>
+          <w:rStyle w:val="VerbatimChar"/>
+        </w:rPr>
+        <w:t xml:space="preserve">rocm-7.2.4</w:t>
+      </w:r>
+      <w:r>
+        <w:t xml:space="preserve">/rocprofiler-compute 3.4.0, plus the</w:t>
+      </w:r>
+      <w:r>
+        <w:t xml:space="preserve"> </w:t>
+      </w:r>
+      <w:r>
+        <w:rPr>
+          <w:rStyle w:val="VerbatimChar"/>
+        </w:rPr>
+        <w:t xml:space="preserve">develop</w:t>
+      </w:r>
+      <w:r>
+        <w:t xml:space="preserve">/</w:t>
+      </w:r>
+      <w:r>
+        <w:rPr>
+          <w:rStyle w:val="VerbatimChar"/>
+        </w:rPr>
+        <w:t xml:space="preserve">amd-staging</w:t>
+      </w:r>
+      <w:r>
+        <w:t xml:space="preserve"> </w:t>
+      </w:r>
+      <w:r>
+        <w:t xml:space="preserve">branches</w:t>
+      </w:r>
+      <w:r>
+        <w:t xml:space="preserve">’</w:t>
+      </w:r>
+      <w:r>
+        <w:t xml:space="preserve"> </w:t>
+      </w:r>
+      <w:r>
+        <w:t xml:space="preserve">current HEAD) confirmed it’s absent from every publicly tagged/branched version reachable from the public repo — newer than 3.4.0, with no exact</w:t>
+      </w:r>
+      <w:r>
+        <w:t xml:space="preserve"> </w:t>
+      </w:r>
+      <w:r>
+        <w:t xml:space="preserve">“</w:t>
+      </w:r>
+      <w:r>
+        <w:t xml:space="preserve">added in version X.Y.Z</w:t>
+      </w:r>
+      <w:r>
+        <w:t xml:space="preserve">”</w:t>
+      </w:r>
+      <w:r>
+        <w:t xml:space="preserve"> </w:t>
+      </w:r>
+      <w:r>
+        <w:t xml:space="preserve">pinnable from available sources. Rather than hardcode a version-number threshold this research couldn’t actually confirm, the script probes the installed tool’s own capability at runtime:</w:t>
+      </w:r>
+      <w:r>
+        <w:t xml:space="preserve"> </w:t>
+      </w:r>
+      <w:r>
+        <w:rPr>
+          <w:rStyle w:val="VerbatimChar"/>
+        </w:rPr>
+        <w:t xml:space="preserve">rocprof-compute -v</w:t>
+      </w:r>
+      <w:r>
+        <w:t xml:space="preserve"> </w:t>
+      </w:r>
+      <w:r>
+        <w:t xml:space="preserve">for display,</w:t>
+      </w:r>
+      <w:r>
+        <w:t xml:space="preserve"> </w:t>
+      </w:r>
+      <w:r>
+        <w:rPr>
+          <w:rStyle w:val="VerbatimChar"/>
+        </w:rPr>
+        <w:t xml:space="preserve">rocprof-compute profile --help | grep -q '%rank%'</w:t>
+      </w:r>
+      <w:r>
+        <w:t xml:space="preserve"> </w:t>
+      </w:r>
+      <w:r>
+        <w:t xml:space="preserve">as the capability signal, and (only when</w:t>
+      </w:r>
+      <w:r>
+        <w:t xml:space="preserve"> </w:t>
+      </w:r>
+      <w:r>
+        <w:rPr>
+          <w:rStyle w:val="VerbatimChar"/>
+        </w:rPr>
+        <w:t xml:space="preserve">--mpi</w:t>
+      </w:r>
+      <w:r>
+        <w:t xml:space="preserve"> </w:t>
+      </w:r>
+      <w:r>
+        <w:t xml:space="preserve">is given) a generic rank-count probe that works for any launcher — running the user’s own</w:t>
+      </w:r>
+      <w:r>
+        <w:t xml:space="preserve"> </w:t>
+      </w:r>
+      <w:r>
+        <w:rPr>
+          <w:rStyle w:val="VerbatimChar"/>
+        </w:rPr>
+        <w:t xml:space="preserve">--mpi</w:t>
+      </w:r>
+      <w:r>
+        <w:t xml:space="preserve"> </w:t>
+      </w:r>
+      <w:r>
+        <w:t xml:space="preserve">command against a trivial</w:t>
+      </w:r>
+      <w:r>
+        <w:t xml:space="preserve"> </w:t>
+      </w:r>
+      <w:r>
+        <w:rPr>
+          <w:rStyle w:val="VerbatimChar"/>
+        </w:rPr>
+        <w:t xml:space="preserve">echo</w:t>
+      </w:r>
+      <w:r>
+        <w:t xml:space="preserve"> </w:t>
+      </w:r>
+      <w:r>
+        <w:t xml:space="preserve">instead of the real app and counting how many copies come back, since any MPI launcher spawns N copies of whatever it’s given. More than one rank detected with no</w:t>
+      </w:r>
+      <w:r>
+        <w:t xml:space="preserve"> </w:t>
+      </w:r>
+      <w:r>
+        <w:rPr>
+          <w:rStyle w:val="VerbatimChar"/>
+        </w:rPr>
+        <w:t xml:space="preserve">%rank%</w:t>
+      </w:r>
+      <w:r>
+        <w:t xml:space="preserve"> </w:t>
+      </w:r>
+      <w:r>
+        <w:t xml:space="preserve">support found → hard error rather than risk silent data corruption from concurrent ranks writing into the same directory; a probe that produces no output at all also aborts rather than silently assuming one rank when the true count is unknown. This check runs early (before even calling into tool 2) and even under</w:t>
+      </w:r>
+      <w:r>
+        <w:t xml:space="preserve"> </w:t>
+      </w:r>
+      <w:r>
+        <w:rPr>
+          <w:rStyle w:val="VerbatimChar"/>
+        </w:rPr>
+        <w:t xml:space="preserve">--dry-run</w:t>
+      </w:r>
+      <w:r>
+        <w:t xml:space="preserve">, since both probes are cheap/side-effect-free relative to the real workload and a dry-run preview should reach the same go/no-go outcome a real run would.</w:t>
+      </w:r>
+    </w:p>
+    <w:p>
+      <w:pPr>
+        <w:pStyle w:val="BodyText"/>
+      </w:pPr>
+      <w:r>
+        <w:rPr>
+          <w:bCs/>
+          <w:b/>
+        </w:rPr>
+        <w:t xml:space="preserve">New files</w:t>
+      </w:r>
+      <w:r>
+        <w:t xml:space="preserve">:</w:t>
+      </w:r>
+      <w:r>
+        <w:t xml:space="preserve"> </w:t>
+      </w:r>
+      <w:r>
+        <w:rPr>
+          <w:rStyle w:val="VerbatimChar"/>
+        </w:rPr>
+        <w:t xml:space="preserve">postprocess/select_hotspot_kernels.py</w:t>
+      </w:r>
+      <w:r>
+        <w:t xml:space="preserve"> </w:t>
+      </w:r>
+      <w:r>
+        <w:t xml:space="preserve">(GPU-kernel analog of</w:t>
+      </w:r>
+      <w:r>
+        <w:t xml:space="preserve"> </w:t>
+      </w:r>
+      <w:r>
+        <w:rPr>
+          <w:rStyle w:val="VerbatimChar"/>
+        </w:rPr>
+        <w:t xml:space="preserve">select_hotspot_functions.py</w:t>
+      </w:r>
+      <w:r>
+        <w:t xml:space="preserve">, substantially simpler —</w:t>
+      </w:r>
+      <w:r>
+        <w:t xml:space="preserve"> </w:t>
+      </w:r>
+      <w:r>
+        <w:rPr>
+          <w:rStyle w:val="VerbatimChar"/>
+        </w:rPr>
+        <w:t xml:space="preserve">rocprof-compute -k</w:t>
+      </w:r>
+      <w:r>
+        <w:t xml:space="preserve"> </w:t>
+      </w:r>
+      <w:r>
+        <w:t xml:space="preserve">takes plain substrings, not a regex, so no escaping logic, and no</w:t>
+      </w:r>
+      <w:r>
+        <w:t xml:space="preserve"> </w:t>
+      </w:r>
+      <w:r>
+        <w:rPr>
+          <w:rStyle w:val="VerbatimChar"/>
+        </w:rPr>
+        <w:t xml:space="preserve">--check-instrumented</w:t>
+      </w:r>
+      <w:r>
+        <w:t xml:space="preserve">/ground-truth-JSON equivalent exists since there’s no rewrite step to verify against) and</w:t>
+      </w:r>
+      <w:r>
+        <w:t xml:space="preserve"> </w:t>
+      </w:r>
+      <w:r>
+        <w:rPr>
+          <w:rStyle w:val="VerbatimChar"/>
+        </w:rPr>
+        <w:t xml:space="preserve">scripts/profile_hotspot_kernels.sh</w:t>
+      </w:r>
+      <w:r>
+        <w:t xml:space="preserve">.</w:t>
+      </w:r>
+      <w:r>
+        <w:t xml:space="preserve"> </w:t>
+      </w:r>
+      <w:r>
+        <w:rPr>
+          <w:rStyle w:val="VerbatimChar"/>
+        </w:rPr>
+        <w:t xml:space="preserve">select_hotspot_kernels.py</w:t>
+      </w:r>
+      <w:r>
+        <w:t xml:space="preserve">’s</w:t>
+      </w:r>
+      <w:r>
+        <w:t xml:space="preserve"> </w:t>
+      </w:r>
+      <w:r>
+        <w:rPr>
+          <w:rStyle w:val="VerbatimChar"/>
+        </w:rPr>
+        <w:t xml:space="preserve">labels_from_output_dir()</w:t>
+      </w:r>
+      <w:r>
+        <w:t xml:space="preserve">/</w:t>
+      </w:r>
+      <w:r>
+        <w:rPr>
+          <w:rStyle w:val="VerbatimChar"/>
+        </w:rPr>
+        <w:t xml:space="preserve">labels_from_report()</w:t>
+      </w:r>
+      <w:r>
+        <w:t xml:space="preserve"> </w:t>
+      </w:r>
+      <w:r>
+        <w:t xml:space="preserve">both take a</w:t>
+      </w:r>
+      <w:r>
+        <w:t xml:space="preserve"> </w:t>
+      </w:r>
+      <w:r>
+        <w:rPr>
+          <w:rStyle w:val="VerbatimChar"/>
+        </w:rPr>
+        <w:t xml:space="preserve">require_multiple_calls</w:t>
+      </w:r>
+      <w:r>
+        <w:t xml:space="preserve"> </w:t>
+      </w:r>
+      <w:r>
+        <w:t xml:space="preserve">parameter (default</w:t>
+      </w:r>
+      <w:r>
+        <w:t xml:space="preserve"> </w:t>
+      </w:r>
+      <w:r>
+        <w:rPr>
+          <w:rStyle w:val="VerbatimChar"/>
+        </w:rPr>
+        <w:t xml:space="preserve">True</w:t>
+      </w:r>
+      <w:r>
+        <w:t xml:space="preserve">) implementing the single-call exclusion;</w:t>
+      </w:r>
+      <w:r>
+        <w:t xml:space="preserve"> </w:t>
+      </w:r>
+      <w:r>
+        <w:rPr>
+          <w:rStyle w:val="VerbatimChar"/>
+        </w:rPr>
+        <w:t xml:space="preserve">labels_from_report()</w:t>
+      </w:r>
+      <w:r>
+        <w:t xml:space="preserve"> </w:t>
+      </w:r>
+      <w:r>
+        <w:t xml:space="preserve">mirrors the CPU extractor’s report-parsing technique exactly but with</w:t>
+      </w:r>
+      <w:r>
+        <w:t xml:space="preserve"> </w:t>
+      </w:r>
+      <w:r>
+        <w:rPr>
+          <w:rStyle w:val="VerbatimChar"/>
+        </w:rPr>
+        <w:t xml:space="preserve">maxsplit=5</w:t>
+      </w:r>
+      <w:r>
+        <w:t xml:space="preserve">/</w:t>
+      </w:r>
+      <w:r>
+        <w:rPr>
+          <w:rStyle w:val="VerbatimChar"/>
+        </w:rPr>
+        <w:t xml:space="preserve">parts[5]</w:t>
+      </w:r>
+      <w:r>
+        <w:t xml:space="preserve"> </w:t>
+      </w:r>
+      <w:r>
+        <w:t xml:space="preserve">instead of</w:t>
+      </w:r>
+      <w:r>
+        <w:t xml:space="preserve"> </w:t>
+      </w:r>
+      <w:r>
+        <w:rPr>
+          <w:rStyle w:val="VerbatimChar"/>
+        </w:rPr>
+        <w:t xml:space="preserve">maxsplit=6</w:t>
+      </w:r>
+      <w:r>
+        <w:t xml:space="preserve">/</w:t>
+      </w:r>
+      <w:r>
+        <w:rPr>
+          <w:rStyle w:val="VerbatimChar"/>
+        </w:rPr>
+        <w:t xml:space="preserve">parts[6]</w:t>
+      </w:r>
+      <w:r>
+        <w:t xml:space="preserve">, since</w:t>
+      </w:r>
+      <w:r>
+        <w:t xml:space="preserve"> </w:t>
+      </w:r>
+      <w:r>
+        <w:rPr>
+          <w:rStyle w:val="VerbatimChar"/>
+        </w:rPr>
+        <w:t xml:space="preserve">extract_GPU_hotspots.format_table()</w:t>
+      </w:r>
+      <w:r>
+        <w:t xml:space="preserve">’s columns are one shorter (no self-time metric).</w:t>
+      </w:r>
+    </w:p>
+    <w:p>
+      <w:pPr>
+        <w:pStyle w:val="BodyText"/>
+      </w:pPr>
+      <w:r>
+        <w:rPr>
+          <w:bCs/>
+          <w:b/>
+        </w:rPr>
+        <w:t xml:space="preserve">Deliberately out of scope for v1</w:t>
+      </w:r>
+      <w:r>
+        <w:t xml:space="preserve">, called out rather than silently skipped: no cross-check confirming a requested kernel actually got profiled (tool 4’s equivalent works because</w:t>
+      </w:r>
+      <w:r>
+        <w:t xml:space="preserve"> </w:t>
+      </w:r>
+      <w:r>
+        <w:rPr>
+          <w:rStyle w:val="VerbatimChar"/>
+        </w:rPr>
+        <w:t xml:space="preserve">rocprof-sys-instrument</w:t>
+      </w:r>
+      <w:r>
+        <w:t xml:space="preserve"> </w:t>
+      </w:r>
+      <w:r>
+        <w:t xml:space="preserve">writes a ground-truth</w:t>
+      </w:r>
+      <w:r>
+        <w:t xml:space="preserve"> </w:t>
+      </w:r>
+      <w:r>
+        <w:rPr>
+          <w:rStyle w:val="VerbatimChar"/>
+        </w:rPr>
+        <w:t xml:space="preserve">instrumented.json</w:t>
+      </w:r>
+      <w:r>
+        <w:t xml:space="preserve">; rocprof-compute’s raw per-run output schema for this isn’t researched here); no custom parsing/reformatting of</w:t>
+      </w:r>
+      <w:r>
+        <w:t xml:space="preserve"> </w:t>
+      </w:r>
+      <w:r>
+        <w:rPr>
+          <w:rStyle w:val="VerbatimChar"/>
+        </w:rPr>
+        <w:t xml:space="preserve">analyze</w:t>
+      </w:r>
+      <w:r>
+        <w:t xml:space="preserve">’s own output.</w:t>
+      </w:r>
+    </w:p>
+    <w:p>
+      <w:pPr>
+        <w:pStyle w:val="BodyText"/>
+      </w:pPr>
+      <w:r>
+        <w:t xml:space="preserve">Verified locally (no ROCm/GPU available, same constraint as every prior tool):</w:t>
+      </w:r>
+      <w:r>
+        <w:t xml:space="preserve"> </w:t>
+      </w:r>
+      <w:r>
+        <w:rPr>
+          <w:rStyle w:val="VerbatimChar"/>
+        </w:rPr>
+        <w:t xml:space="preserve">python3 -m unittest</w:t>
+      </w:r>
+      <w:r>
+        <w:t xml:space="preserve"> </w:t>
+      </w:r>
+      <w:r>
+        <w:t xml:space="preserve">added 17 new tests (154 total) covering the default single-call exclusion and its</w:t>
+      </w:r>
+      <w:r>
+        <w:t xml:space="preserve"> </w:t>
+      </w:r>
+      <w:r>
+        <w:rPr>
+          <w:rStyle w:val="VerbatimChar"/>
+        </w:rPr>
+        <w:t xml:space="preserve">--all-dispatches</w:t>
+      </w:r>
+      <w:r>
+        <w:t xml:space="preserve"> </w:t>
+      </w:r>
+      <w:r>
+        <w:t xml:space="preserve">override (both against</w:t>
+      </w:r>
+      <w:r>
+        <w:t xml:space="preserve"> </w:t>
+      </w:r>
+      <w:r>
+        <w:rPr>
+          <w:rStyle w:val="VerbatimChar"/>
+        </w:rPr>
+        <w:t xml:space="preserve">rocprofv3_single_rank</w:t>
+      </w:r>
+      <w:r>
+        <w:t xml:space="preserve">’s real</w:t>
+      </w:r>
+      <w:r>
+        <w:t xml:space="preserve"> </w:t>
+      </w:r>
+      <w:r>
+        <w:rPr>
+          <w:rStyle w:val="VerbatimChar"/>
+        </w:rPr>
+        <w:t xml:space="preserve">__hipRegisterFatBinary</w:t>
+      </w:r>
+      <w:r>
+        <w:t xml:space="preserve"> </w:t>
+      </w:r>
+      <w:r>
+        <w:t xml:space="preserve">row,</w:t>
+      </w:r>
+      <w:r>
+        <w:t xml:space="preserve"> </w:t>
+      </w:r>
+      <w:r>
+        <w:rPr>
+          <w:rStyle w:val="VerbatimChar"/>
+        </w:rPr>
+        <w:t xml:space="preserve">Calls=1</w:t>
+      </w:r>
+      <w:r>
+        <w:t xml:space="preserve"> </w:t>
+      </w:r>
+      <w:r>
+        <w:t xml:space="preserve">— no new fixture needed), top-N/threshold selection, the dual-format (</w:t>
+      </w:r>
+      <w:r>
+        <w:rPr>
+          <w:rStyle w:val="VerbatimChar"/>
+        </w:rPr>
+        <w:t xml:space="preserve">labels_from_report</w:t>
+      </w:r>
+      <w:r>
+        <w:t xml:space="preserve"> </w:t>
+      </w:r>
+      <w:r>
+        <w:t xml:space="preserve">covering both tool 2’s own report and tool 3’s combined report) proof, and a</w:t>
+      </w:r>
+      <w:r>
+        <w:t xml:space="preserve"> </w:t>
+      </w:r>
+      <w:r>
+        <w:rPr>
+          <w:rStyle w:val="VerbatimChar"/>
+        </w:rPr>
+        <w:t xml:space="preserve">maxsplit=5</w:t>
+      </w:r>
+      <w:r>
+        <w:t xml:space="preserve"> </w:t>
+      </w:r>
+      <w:r>
+        <w:t xml:space="preserve">column-count regression test.</w:t>
+      </w:r>
+      <w:r>
+        <w:t xml:space="preserve"> </w:t>
+      </w:r>
+      <w:r>
+        <w:rPr>
+          <w:rStyle w:val="VerbatimChar"/>
+        </w:rPr>
+        <w:t xml:space="preserve">bash -n</w:t>
+      </w:r>
+      <w:r>
+        <w:t xml:space="preserve"> </w:t>
+      </w:r>
+      <w:r>
+        <w:t xml:space="preserve">on the new script. Manual verification with a stubbed</w:t>
+      </w:r>
+      <w:r>
+        <w:t xml:space="preserve"> </w:t>
+      </w:r>
+      <w:r>
+        <w:rPr>
+          <w:rStyle w:val="VerbatimChar"/>
+        </w:rPr>
+        <w:t xml:space="preserve">rocprof-compute</w:t>
+      </w:r>
+      <w:r>
+        <w:t xml:space="preserve"> </w:t>
+      </w:r>
+      <w:r>
+        <w:t xml:space="preserve">on</w:t>
+      </w:r>
+      <w:r>
+        <w:t xml:space="preserve"> </w:t>
+      </w:r>
+      <w:r>
+        <w:rPr>
+          <w:rStyle w:val="VerbatimChar"/>
+        </w:rPr>
+        <w:t xml:space="preserve">PATH</w:t>
+      </w:r>
+      <w:r>
+        <w:t xml:space="preserve"> </w:t>
+      </w:r>
+      <w:r>
+        <w:t xml:space="preserve">(stubbing</w:t>
+      </w:r>
+      <w:r>
+        <w:t xml:space="preserve"> </w:t>
+      </w:r>
+      <w:r>
+        <w:rPr>
+          <w:rStyle w:val="VerbatimChar"/>
+        </w:rPr>
+        <w:t xml:space="preserve">-v</w:t>
+      </w:r>
+      <w:r>
+        <w:t xml:space="preserve">,</w:t>
+      </w:r>
+      <w:r>
+        <w:t xml:space="preserve"> </w:t>
+      </w:r>
+      <w:r>
+        <w:rPr>
+          <w:rStyle w:val="VerbatimChar"/>
+        </w:rPr>
+        <w:t xml:space="preserve">profile --help</w:t>
+      </w:r>
+      <w:r>
+        <w:t xml:space="preserve"> </w:t>
+      </w:r>
+      <w:r>
+        <w:t xml:space="preserve">with/without a</w:t>
+      </w:r>
+      <w:r>
+        <w:t xml:space="preserve"> </w:t>
+      </w:r>
+      <w:r>
+        <w:rPr>
+          <w:rStyle w:val="VerbatimChar"/>
+        </w:rPr>
+        <w:t xml:space="preserve">%rank%</w:t>
+      </w:r>
+      <w:r>
+        <w:t xml:space="preserve"> </w:t>
+      </w:r>
+      <w:r>
+        <w:t xml:space="preserve">line, and</w:t>
+      </w:r>
+      <w:r>
+        <w:t xml:space="preserve"> </w:t>
+      </w:r>
+      <w:r>
+        <w:rPr>
+          <w:rStyle w:val="VerbatimChar"/>
+        </w:rPr>
+        <w:t xml:space="preserve">analyze</w:t>
+      </w:r>
+      <w:r>
+        <w:t xml:space="preserve">) exercised every branch of the MPI safety gate: single rank proceeds regardless of capability; multiple ranks proceed when the stub reports</w:t>
+      </w:r>
+      <w:r>
+        <w:t xml:space="preserve"> </w:t>
+      </w:r>
+      <w:r>
+        <w:rPr>
+          <w:rStyle w:val="VerbatimChar"/>
+        </w:rPr>
+        <w:t xml:space="preserve">%rank%</w:t>
+      </w:r>
+      <w:r>
+        <w:t xml:space="preserve"> </w:t>
+      </w:r>
+      <w:r>
+        <w:t xml:space="preserve">support and abort with the documented error when it doesn’t; a probe against a nonexistent launch command aborts rather than guessing (this last case caught a real bug during manual testing —</w:t>
+      </w:r>
+      <w:r>
+        <w:t xml:space="preserve"> </w:t>
+      </w:r>
+      <w:r>
+        <w:rPr>
+          <w:rStyle w:val="VerbatimChar"/>
+        </w:rPr>
+        <w:t xml:space="preserve">grep -c</w:t>
+      </w:r>
+      <w:r>
+        <w:t xml:space="preserve"> </w:t>
+      </w:r>
+      <w:r>
+        <w:t xml:space="preserve">on zero matches exits non-zero, which under</w:t>
+      </w:r>
+      <w:r>
+        <w:t xml:space="preserve"> </w:t>
+      </w:r>
+      <w:r>
+        <w:rPr>
+          <w:rStyle w:val="VerbatimChar"/>
+        </w:rPr>
+        <w:t xml:space="preserve">set -e</w:t>
+      </w:r>
+      <w:r>
+        <w:t xml:space="preserve"> </w:t>
+      </w:r>
+      <w:r>
+        <w:t xml:space="preserve">skipped the intended error message entirely and just exited silently; fixed with</w:t>
+      </w:r>
+      <w:r>
+        <w:t xml:space="preserve"> </w:t>
+      </w:r>
+      <w:r>
+        <w:rPr>
+          <w:rStyle w:val="VerbatimChar"/>
+        </w:rPr>
+        <w:t xml:space="preserve">|| true</w:t>
+      </w:r>
+      <w:r>
+        <w:t xml:space="preserve"> </w:t>
+      </w:r>
+      <w:r>
+        <w:t xml:space="preserve">on that assignment). Also confirmed:</w:t>
+      </w:r>
+      <w:r>
+        <w:t xml:space="preserve"> </w:t>
+      </w:r>
+      <w:r>
+        <w:rPr>
+          <w:rStyle w:val="VerbatimChar"/>
+        </w:rPr>
+        <w:t xml:space="preserve">--report</w:t>
+      </w:r>
+      <w:r>
+        <w:t xml:space="preserve"> </w:t>
+      </w:r>
+      <w:r>
+        <w:t xml:space="preserve">reuses real kernel names even under</w:t>
+      </w:r>
+      <w:r>
+        <w:t xml:space="preserve"> </w:t>
+      </w:r>
+      <w:r>
+        <w:rPr>
+          <w:rStyle w:val="VerbatimChar"/>
+        </w:rPr>
+        <w:t xml:space="preserve">--dry-run</w:t>
+      </w:r>
+      <w:r>
+        <w:t xml:space="preserve"> </w:t>
+      </w:r>
+      <w:r>
+        <w:t xml:space="preserve">while the no-</w:t>
+      </w:r>
+      <w:r>
+        <w:rPr>
+          <w:rStyle w:val="VerbatimChar"/>
+        </w:rPr>
+        <w:t xml:space="preserve">--report</w:t>
+      </w:r>
+      <w:r>
+        <w:t xml:space="preserve"> </w:t>
+      </w:r>
+      <w:r>
+        <w:t xml:space="preserve">path correctly shows a placeholder instead of real data it hasn’t collected yet;</w:t>
+      </w:r>
+      <w:r>
+        <w:t xml:space="preserve"> </w:t>
+      </w:r>
+      <w:r>
+        <w:rPr>
+          <w:rStyle w:val="VerbatimChar"/>
+        </w:rPr>
+        <w:t xml:space="preserve">--all-dispatches</w:t>
+      </w:r>
+      <w:r>
+        <w:t xml:space="preserve"> </w:t>
+      </w:r>
+      <w:r>
+        <w:t xml:space="preserve">removes</w:t>
+      </w:r>
+      <w:r>
+        <w:t xml:space="preserve"> </w:t>
+      </w:r>
+      <w:r>
+        <w:rPr>
+          <w:rStyle w:val="VerbatimChar"/>
+        </w:rPr>
+        <w:t xml:space="preserve">-d 2</w:t>
+      </w:r>
+      <w:r>
+        <w:t xml:space="preserve"> </w:t>
+      </w:r>
+      <w:r>
+        <w:t xml:space="preserve">from the printed command and restores the single-call kernel to</w:t>
+      </w:r>
+      <w:r>
+        <w:t xml:space="preserve"> </w:t>
+      </w:r>
+      <w:r>
+        <w:rPr>
+          <w:rStyle w:val="VerbatimChar"/>
+        </w:rPr>
+        <w:t xml:space="preserve">-k</w:t>
+      </w:r>
+      <w:r>
+        <w:t xml:space="preserve">; a real (non-dry-run) run against the stub, including a directory-creating variant of the stub to confirm the full</w:t>
+      </w:r>
+      <w:r>
+        <w:t xml:space="preserve"> </w:t>
+      </w:r>
+      <w:r>
+        <w:rPr>
+          <w:rStyle w:val="VerbatimChar"/>
+        </w:rPr>
+        <w:t xml:space="preserve">tee</w:t>
+      </w:r>
+      <w:r>
+        <w:t xml:space="preserve">-to-file-and-terminal</w:t>
+      </w:r>
+      <w:r>
+        <w:t xml:space="preserve"> </w:t>
+      </w:r>
+      <w:r>
+        <w:rPr>
+          <w:rStyle w:val="VerbatimChar"/>
+        </w:rPr>
+        <w:t xml:space="preserve">analyze</w:t>
+      </w:r>
+      <w:r>
+        <w:t xml:space="preserve"> </w:t>
+      </w:r>
+      <w:r>
+        <w:t xml:space="preserve">step, completed successfully end to end. Real end-to-end validation against actual ROCm/GPU hardware, including whether</w:t>
+      </w:r>
+      <w:r>
+        <w:t xml:space="preserve"> </w:t>
+      </w:r>
+      <w:r>
+        <w:rPr>
+          <w:rStyle w:val="VerbatimChar"/>
+        </w:rPr>
+        <w:t xml:space="preserve">-k</w:t>
+      </w:r>
+      <w:r>
+        <w:t xml:space="preserve">+</w:t>
+      </w:r>
+      <w:r>
+        <w:rPr>
+          <w:rStyle w:val="VerbatimChar"/>
+        </w:rPr>
+        <w:t xml:space="preserve">-d</w:t>
+      </w:r>
+      <w:r>
+        <w:t xml:space="preserve"> </w:t>
+      </w:r>
+      <w:r>
+        <w:t xml:space="preserve">combine exactly as described, is left to the user on the target system.</w:t>
+      </w:r>
+    </w:p>
+    <w:bookmarkEnd w:id="43"/>
+    <w:bookmarkEnd w:id="44"/>
     <w:sectPr/>
   </w:body>
 </w:document>

</xml_diff>

<commit_message>
Sixth tool: POP-inspired parallel efficiency metrics
Adds docs/pop_metrics_reference.md, mapping the POP Centre of Excellence
metric hierarchy onto what tools 1-4's rocprof-sys/rocprofv3 output can and
can't provide (Serialisation/Transfer Efficiency need Dimemas; Instruction/IPC
Scaling need PAPI counters, neither present today).

Adds postprocess/extract_pop_metrics.py, computing Load Balance, Communication
Efficiency, and Parallel Efficiency from a single output directory, plus
Computation Efficiency and Global Efficiency (strong or weak scaling) from
additional directories compared against the first as reference. Built on
existing self-time aggregation and combined CPU+GPU pool arithmetic rather
than a new parser. Verified against real 2-rank vs 4-rank strong-scaling data.

Co-Authored-By: Claude Sonnet 5 <noreply@anthropic.com>
</commit_message>
<xml_diff>
--- a/docs/DEVELOPMENT_HISTORY.docx
+++ b/docs/DEVELOPMENT_HISTORY.docx
@@ -10,7 +10,7 @@
         <w:t xml:space="preserve">Development History</w:t>
       </w:r>
     </w:p>
-    <w:bookmarkStart w:id="46" w:name="development-history"/>
+    <w:bookmarkStart w:id="48" w:name="development-history"/>
     <w:p>
       <w:pPr>
         <w:pStyle w:val="Heading1"/>
@@ -553,6 +553,82 @@
           </w:p>
         </w:tc>
       </w:tr>
+      <w:tr>
+        <w:tc>
+          <w:tcPr/>
+          <w:p>
+            <w:pPr>
+              <w:pStyle w:val="Compact"/>
+              <w:jc w:val="left"/>
+            </w:pPr>
+            <w:r>
+              <w:t xml:space="preserve">2026-08-10</w:t>
+            </w:r>
+          </w:p>
+        </w:tc>
+        <w:tc>
+          <w:tcPr/>
+          <w:p>
+            <w:pPr>
+              <w:pStyle w:val="Compact"/>
+              <w:jc w:val="left"/>
+            </w:pPr>
+            <w:r>
+              <w:t xml:space="preserve">Added</w:t>
+            </w:r>
+            <w:r>
+              <w:t xml:space="preserve"> </w:t>
+            </w:r>
+            <w:r>
+              <w:rPr>
+                <w:rStyle w:val="VerbatimChar"/>
+              </w:rPr>
+              <w:t xml:space="preserve">docs/pop_metrics_reference.md</w:t>
+            </w:r>
+            <w:r>
+              <w:t xml:space="preserve">, mapping POP parallel-efficiency metrics to what tools 1-4’s output can/can’t provide</w:t>
+            </w:r>
+          </w:p>
+        </w:tc>
+      </w:tr>
+      <w:tr>
+        <w:tc>
+          <w:tcPr/>
+          <w:p>
+            <w:pPr>
+              <w:pStyle w:val="Compact"/>
+              <w:jc w:val="left"/>
+            </w:pPr>
+            <w:r>
+              <w:t xml:space="preserve">2026-08-10</w:t>
+            </w:r>
+          </w:p>
+        </w:tc>
+        <w:tc>
+          <w:tcPr/>
+          <w:p>
+            <w:pPr>
+              <w:pStyle w:val="Compact"/>
+              <w:jc w:val="left"/>
+            </w:pPr>
+            <w:r>
+              <w:t xml:space="preserve">Sixth tool:</w:t>
+            </w:r>
+            <w:r>
+              <w:t xml:space="preserve"> </w:t>
+            </w:r>
+            <w:r>
+              <w:rPr>
+                <w:rStyle w:val="VerbatimChar"/>
+              </w:rPr>
+              <w:t xml:space="preserve">extract_pop_metrics.py</w:t>
+            </w:r>
+            <w:r>
+              <w:t xml:space="preserve">, computing POP-inspired Load Balance / Communication / Parallel / Computation / Global Efficiency from one or more output directories</w:t>
+            </w:r>
+          </w:p>
+        </w:tc>
+      </w:tr>
     </w:tbl>
     <w:bookmarkStart w:id="20" w:name="project-scaffolding-and-rules"/>
     <w:p>
@@ -12735,7 +12811,1206 @@
       </w:r>
     </w:p>
     <w:bookmarkEnd w:id="45"/>
-    <w:bookmarkEnd w:id="46"/>
+    <w:bookmarkStart w:id="47" w:name="X5d2c65a9bfc65297910177da3eb91582a117dfd"/>
+    <w:p>
+      <w:pPr>
+        <w:pStyle w:val="Heading2"/>
+      </w:pPr>
+      <w:r>
+        <w:t xml:space="preserve">2026-08-10 — POP metrics: reference doc, then the computation tool</w:t>
+      </w:r>
+    </w:p>
+    <w:p>
+      <w:pPr>
+        <w:pStyle w:val="FirstParagraph"/>
+      </w:pPr>
+      <w:r>
+        <w:t xml:space="preserve">The user wants to eventually judge parallel-efficiency quality (à la the POP Centre of</w:t>
+      </w:r>
+      <w:r>
+        <w:t xml:space="preserve"> </w:t>
+      </w:r>
+      <w:r>
+        <w:t xml:space="preserve">Excellence methodology, https://pop-coe.eu/node/69) from</w:t>
+      </w:r>
+      <w:r>
+        <w:t xml:space="preserve"> </w:t>
+      </w:r>
+      <w:r>
+        <w:rPr>
+          <w:rStyle w:val="VerbatimChar"/>
+        </w:rPr>
+        <w:t xml:space="preserve">rocprof-sys</w:t>
+      </w:r>
+      <w:r>
+        <w:t xml:space="preserve">/</w:t>
+      </w:r>
+      <w:r>
+        <w:rPr>
+          <w:rStyle w:val="VerbatimChar"/>
+        </w:rPr>
+        <w:t xml:space="preserve">rocprofv3</w:t>
+      </w:r>
+      <w:r>
+        <w:t xml:space="preserve"> </w:t>
+      </w:r>
+      <w:r>
+        <w:t xml:space="preserve">output.</w:t>
+      </w:r>
+      <w:r>
+        <w:t xml:space="preserve"> </w:t>
+      </w:r>
+      <w:r>
+        <w:t xml:space="preserve">Before writing any computation code, the first step was purely analytical: fetch POP’s own</w:t>
+      </w:r>
+      <w:r>
+        <w:t xml:space="preserve"> </w:t>
+      </w:r>
+      <w:r>
+        <w:t xml:space="preserve">metric hierarchy and formulas (Global Efficiency = Parallel Efficiency × Computation</w:t>
+      </w:r>
+      <w:r>
+        <w:t xml:space="preserve"> </w:t>
+      </w:r>
+      <w:r>
+        <w:t xml:space="preserve">Efficiency; Parallel Efficiency = Load Balance × Communication Efficiency; Communication</w:t>
+      </w:r>
+      <w:r>
+        <w:t xml:space="preserve"> </w:t>
+      </w:r>
+      <w:r>
+        <w:t xml:space="preserve">Efficiency = Serialisation Efficiency × Transfer Efficiency, the last two needing a</w:t>
+      </w:r>
+      <w:r>
+        <w:t xml:space="preserve"> </w:t>
+      </w:r>
+      <w:r>
+        <w:t xml:space="preserve">Dimemas-style ideal-network simulation), then check field-by-field, against real example output</w:t>
+      </w:r>
+      <w:r>
+        <w:t xml:space="preserve"> </w:t>
+      </w:r>
+      <w:r>
+        <w:t xml:space="preserve">in</w:t>
+      </w:r>
+      <w:r>
+        <w:t xml:space="preserve"> </w:t>
+      </w:r>
+      <w:r>
+        <w:rPr>
+          <w:rStyle w:val="VerbatimChar"/>
+        </w:rPr>
+        <w:t xml:space="preserve">Heat_Convection_Solver</w:t>
+      </w:r>
+      <w:r>
+        <w:t xml:space="preserve">, which of these are actually derivable from tools 1-4’s data.</w:t>
+      </w:r>
+      <w:r>
+        <w:t xml:space="preserve"> </w:t>
+      </w:r>
+      <w:r>
+        <w:t xml:space="preserve">Findings written up in</w:t>
+      </w:r>
+      <w:r>
+        <w:t xml:space="preserve"> </w:t>
+      </w:r>
+      <w:r>
+        <w:rPr>
+          <w:rStyle w:val="VerbatimChar"/>
+        </w:rPr>
+        <w:t xml:space="preserve">docs/pop_metrics_reference.md</w:t>
+      </w:r>
+      <w:r>
+        <w:t xml:space="preserve">: per-rank MPI-call timing is exact from</w:t>
+      </w:r>
+      <w:r>
+        <w:t xml:space="preserve"> </w:t>
+      </w:r>
+      <w:r>
+        <w:t xml:space="preserve">tool 4’s instrumented</w:t>
+      </w:r>
+      <w:r>
+        <w:t xml:space="preserve"> </w:t>
+      </w:r>
+      <w:r>
+        <w:rPr>
+          <w:rStyle w:val="VerbatimChar"/>
+        </w:rPr>
+        <w:t xml:space="preserve">wall_clock-N.json/txt</w:t>
+      </w:r>
+      <w:r>
+        <w:t xml:space="preserve"> </w:t>
+      </w:r>
+      <w:r>
+        <w:t xml:space="preserve">(</w:t>
+      </w:r>
+      <w:r>
+        <w:rPr>
+          <w:rStyle w:val="VerbatimChar"/>
+        </w:rPr>
+        <w:t xml:space="preserve">ROCPROFSYS_MPI_GOTCHA_ENABLED</w:t>
+      </w:r>
+      <w:r>
+        <w:t xml:space="preserve">) and only</w:t>
+      </w:r>
+      <w:r>
+        <w:t xml:space="preserve"> </w:t>
+      </w:r>
+      <w:r>
+        <w:t xml:space="preserve">statistically approximate from tools 1-3’s sampling; no PAPI/hardware-counter output exists in</w:t>
+      </w:r>
+      <w:r>
+        <w:t xml:space="preserve"> </w:t>
+      </w:r>
+      <w:r>
+        <w:t xml:space="preserve">any current run (the config flags are set, but no events are configured and no</w:t>
+      </w:r>
+      <w:r>
+        <w:t xml:space="preserve"> </w:t>
+      </w:r>
+      <w:r>
+        <w:rPr>
+          <w:rStyle w:val="VerbatimChar"/>
+        </w:rPr>
+        <w:t xml:space="preserve">papi_*</w:t>
+      </w:r>
+      <w:r>
+        <w:t xml:space="preserve"> </w:t>
+      </w:r>
+      <w:r>
+        <w:t xml:space="preserve">files</w:t>
+      </w:r>
+      <w:r>
+        <w:t xml:space="preserve"> </w:t>
+      </w:r>
+      <w:r>
+        <w:t xml:space="preserve">exist), so Instruction Scaling and IPC Scaling are flatly unavailable today; Dimemas isn’t part</w:t>
+      </w:r>
+      <w:r>
+        <w:t xml:space="preserve"> </w:t>
+      </w:r>
+      <w:r>
+        <w:t xml:space="preserve">of this toolchain, so Serialisation/Transfer Efficiency are unavailable too — but Communication</w:t>
+      </w:r>
+      <w:r>
+        <w:t xml:space="preserve"> </w:t>
+      </w:r>
+      <w:r>
+        <w:t xml:space="preserve">Efficiency’s own direct formula (</w:t>
+      </w:r>
+      <w:r>
+        <w:rPr>
+          <w:rStyle w:val="VerbatimChar"/>
+        </w:rPr>
+        <w:t xml:space="preserve">max useful compute time / max total elapsed time</w:t>
+      </w:r>
+      <w:r>
+        <w:t xml:space="preserve">, no Dimemas</w:t>
+      </w:r>
+      <w:r>
+        <w:t xml:space="preserve"> </w:t>
+      </w:r>
+      <w:r>
+        <w:t xml:space="preserve">needed) is still computable and worth reporting on its own.</w:t>
+      </w:r>
+    </w:p>
+    <w:p>
+      <w:pPr>
+        <w:pStyle w:val="BodyText"/>
+      </w:pPr>
+      <w:r>
+        <w:rPr>
+          <w:bCs/>
+          <w:b/>
+        </w:rPr>
+        <w:t xml:space="preserve">The tool.</w:t>
+      </w:r>
+      <w:r>
+        <w:t xml:space="preserve"> </w:t>
+      </w:r>
+      <w:r>
+        <w:rPr>
+          <w:rStyle w:val="VerbatimChar"/>
+        </w:rPr>
+        <w:t xml:space="preserve">postprocess/extract_pop_metrics.py</w:t>
+      </w:r>
+      <w:r>
+        <w:t xml:space="preserve"> </w:t>
+      </w:r>
+      <w:r>
+        <w:t xml:space="preserve">computes Load Balance, Communication</w:t>
+      </w:r>
+      <w:r>
+        <w:t xml:space="preserve"> </w:t>
+      </w:r>
+      <w:r>
+        <w:t xml:space="preserve">Efficiency, and Parallel Efficiency from a single output directory, and — given additional</w:t>
+      </w:r>
+      <w:r>
+        <w:t xml:space="preserve"> </w:t>
+      </w:r>
+      <w:r>
+        <w:t xml:space="preserve">directories from the same scaling study — Computation Efficiency and Global Efficiency relative</w:t>
+      </w:r>
+      <w:r>
+        <w:t xml:space="preserve"> </w:t>
+      </w:r>
+      <w:r>
+        <w:t xml:space="preserve">to the first directory as reference. Built entirely on existing building blocks rather than a</w:t>
+      </w:r>
+      <w:r>
+        <w:t xml:space="preserve"> </w:t>
+      </w:r>
+      <w:r>
+        <w:t xml:space="preserve">new parser:</w:t>
+      </w:r>
+      <w:r>
+        <w:t xml:space="preserve"> </w:t>
+      </w:r>
+      <w:r>
+        <w:rPr>
+          <w:rStyle w:val="VerbatimChar"/>
+        </w:rPr>
+        <w:t xml:space="preserve">extract_CPU_hotspots.py</w:t>
+      </w:r>
+      <w:r>
+        <w:t xml:space="preserve">’s</w:t>
+      </w:r>
+      <w:r>
+        <w:t xml:space="preserve"> </w:t>
+      </w:r>
+      <w:r>
+        <w:rPr>
+          <w:rStyle w:val="VerbatimChar"/>
+        </w:rPr>
+        <w:t xml:space="preserve">aggregate_per_rank()</w:t>
+      </w:r>
+      <w:r>
+        <w:t xml:space="preserve"> </w:t>
+      </w:r>
+      <w:r>
+        <w:t xml:space="preserve">self-time output sums cleanly</w:t>
+      </w:r>
+      <w:r>
+        <w:t xml:space="preserve"> </w:t>
+      </w:r>
+      <w:r>
+        <w:t xml:space="preserve">across every function matching a new</w:t>
+      </w:r>
+      <w:r>
+        <w:t xml:space="preserve"> </w:t>
+      </w:r>
+      <w:r>
+        <w:rPr>
+          <w:rStyle w:val="VerbatimChar"/>
+        </w:rPr>
+        <w:t xml:space="preserve">MPI_PREFIXES</w:t>
+      </w:r>
+      <w:r>
+        <w:t xml:space="preserve"> </w:t>
+      </w:r>
+      <w:r>
+        <w:t xml:space="preserve">prefix set (</w:t>
+      </w:r>
+      <w:r>
+        <w:rPr>
+          <w:rStyle w:val="VerbatimChar"/>
+        </w:rPr>
+        <w:t xml:space="preserve">MPI_</w:t>
+      </w:r>
+      <w:r>
+        <w:t xml:space="preserve">/</w:t>
+      </w:r>
+      <w:r>
+        <w:rPr>
+          <w:rStyle w:val="VerbatimChar"/>
+        </w:rPr>
+        <w:t xml:space="preserve">PMPI_</w:t>
+      </w:r>
+      <w:r>
+        <w:t xml:space="preserve">/</w:t>
+      </w:r>
+      <w:r>
+        <w:rPr>
+          <w:rStyle w:val="VerbatimChar"/>
+        </w:rPr>
+        <w:t xml:space="preserve">MPIR_</w:t>
+      </w:r>
+      <w:r>
+        <w:t xml:space="preserve">/</w:t>
+      </w:r>
+      <w:r>
+        <w:rPr>
+          <w:rStyle w:val="VerbatimChar"/>
+        </w:rPr>
+        <w:t xml:space="preserve">MPID_</w:t>
+      </w:r>
+      <w:r>
+        <w:t xml:space="preserve"> </w:t>
+      </w:r>
+      <w:r>
+        <w:t xml:space="preserve">—</w:t>
+      </w:r>
+      <w:r>
+        <w:t xml:space="preserve"> </w:t>
+      </w:r>
+      <w:r>
+        <w:t xml:space="preserve">MPICH/Cray-MPICH only, a documented limitation, not yet configurable per the user’s decision)</w:t>
+      </w:r>
+      <w:r>
+        <w:t xml:space="preserve"> </w:t>
+      </w:r>
+      <w:r>
+        <w:t xml:space="preserve">with no double-counting regardless of call-tree nesting, since self-time by construction</w:t>
+      </w:r>
+      <w:r>
+        <w:t xml:space="preserve"> </w:t>
+      </w:r>
+      <w:r>
+        <w:t xml:space="preserve">partitions a rank’s total time additively across every tree node. When a paired</w:t>
+      </w:r>
+      <w:r>
+        <w:t xml:space="preserve"> </w:t>
+      </w:r>
+      <w:r>
+        <w:rPr>
+          <w:rStyle w:val="VerbatimChar"/>
+        </w:rPr>
+        <w:t xml:space="preserve">rocprofv3/</w:t>
+      </w:r>
+      <w:r>
+        <w:t xml:space="preserve"> </w:t>
+      </w:r>
+      <w:r>
+        <w:t xml:space="preserve">directory is present (auto-detected per run directory, alongside a</w:t>
+      </w:r>
+      <w:r>
+        <w:t xml:space="preserve"> </w:t>
+      </w:r>
+      <w:r>
+        <w:rPr>
+          <w:rStyle w:val="VerbatimChar"/>
+        </w:rPr>
+        <w:t xml:space="preserve">rocprof-sys/</w:t>
+      </w:r>
+      <w:r>
+        <w:t xml:space="preserve"> </w:t>
+      </w:r>
+      <w:r>
+        <w:t xml:space="preserve">subdir — the</w:t>
+      </w:r>
+      <w:r>
+        <w:t xml:space="preserve"> </w:t>
+      </w:r>
+      <w:r>
+        <w:t xml:space="preserve">layout</w:t>
+      </w:r>
+      <w:r>
+        <w:t xml:space="preserve"> </w:t>
+      </w:r>
+      <w:r>
+        <w:rPr>
+          <w:rStyle w:val="VerbatimChar"/>
+        </w:rPr>
+        <w:t xml:space="preserve">profile_hotspots.sh</w:t>
+      </w:r>
+      <w:r>
+        <w:t xml:space="preserve">/</w:t>
+      </w:r>
+      <w:r>
+        <w:rPr>
+          <w:rStyle w:val="VerbatimChar"/>
+        </w:rPr>
+        <w:t xml:space="preserve">instrument_hotspots.sh</w:t>
+      </w:r>
+      <w:r>
+        <w:t xml:space="preserve"> </w:t>
+      </w:r>
+      <w:r>
+        <w:t xml:space="preserve">already produce), the same</w:t>
+      </w:r>
+      <w:r>
+        <w:t xml:space="preserve"> </w:t>
+      </w:r>
+      <w:r>
+        <w:t xml:space="preserve">CPU-total-minus-GPU-wait-plus-GPU-kernel-total arithmetic</w:t>
+      </w:r>
+      <w:r>
+        <w:t xml:space="preserve"> </w:t>
+      </w:r>
+      <w:r>
+        <w:rPr>
+          <w:rStyle w:val="VerbatimChar"/>
+        </w:rPr>
+        <w:t xml:space="preserve">extract_hotspots.py</w:t>
+      </w:r>
+      <w:r>
+        <w:t xml:space="preserve"> </w:t>
+      </w:r>
+      <w:r>
+        <w:t xml:space="preserve">already uses is</w:t>
+      </w:r>
+      <w:r>
+        <w:t xml:space="preserve"> </w:t>
+      </w:r>
+      <w:r>
+        <w:t xml:space="preserve">applied</w:t>
+      </w:r>
+      <w:r>
+        <w:t xml:space="preserve"> </w:t>
+      </w:r>
+      <w:r>
+        <w:rPr>
+          <w:bCs/>
+          <w:b/>
+        </w:rPr>
+        <w:t xml:space="preserve">per rank</w:t>
+      </w:r>
+      <w:r>
+        <w:t xml:space="preserve"> </w:t>
+      </w:r>
+      <w:r>
+        <w:t xml:space="preserve">instead of pooled across the whole run.</w:t>
+      </w:r>
+    </w:p>
+    <w:p>
+      <w:pPr>
+        <w:pStyle w:val="BodyText"/>
+      </w:pPr>
+      <w:r>
+        <w:t xml:space="preserve">One real bug caught before it reached the user: the per-rank GPU-sync-wait subtraction</w:t>
+      </w:r>
+      <w:r>
+        <w:t xml:space="preserve"> </w:t>
+      </w:r>
+      <w:r>
+        <w:t xml:space="preserve">(</w:t>
+      </w:r>
+      <w:r>
+        <w:rPr>
+          <w:rStyle w:val="VerbatimChar"/>
+        </w:rPr>
+        <w:t xml:space="preserve">hipStreamSynchronize</w:t>
+      </w:r>
+      <w:r>
+        <w:t xml:space="preserve">/</w:t>
+      </w:r>
+      <w:r>
+        <w:rPr>
+          <w:rStyle w:val="VerbatimChar"/>
+        </w:rPr>
+        <w:t xml:space="preserve">hipDeviceSynchronize</w:t>
+      </w:r>
+      <w:r>
+        <w:t xml:space="preserve">) initially read from</w:t>
+      </w:r>
+      <w:r>
+        <w:t xml:space="preserve"> </w:t>
+      </w:r>
+      <w:r>
+        <w:rPr>
+          <w:rStyle w:val="VerbatimChar"/>
+        </w:rPr>
+        <w:t xml:space="preserve">aggregate_per_rank()</w:t>
+      </w:r>
+      <w:r>
+        <w:t xml:space="preserve">’s own</w:t>
+      </w:r>
+      <w:r>
+        <w:t xml:space="preserve"> </w:t>
+      </w:r>
+      <w:r>
+        <w:t xml:space="preserve">output, which silently returned zero for it every time —</w:t>
+      </w:r>
+      <w:r>
+        <w:t xml:space="preserve"> </w:t>
+      </w:r>
+      <w:r>
+        <w:rPr>
+          <w:rStyle w:val="VerbatimChar"/>
+        </w:rPr>
+        <w:t xml:space="preserve">aggregate_per_rank()</w:t>
+      </w:r>
+      <w:r>
+        <w:t xml:space="preserve"> </w:t>
+      </w:r>
+      <w:r>
+        <w:t xml:space="preserve">only returns</w:t>
+      </w:r>
+      <w:r>
+        <w:t xml:space="preserve"> </w:t>
+      </w:r>
+      <w:r>
+        <w:t xml:space="preserve">CPU-classified rows, and both those labels start with</w:t>
+      </w:r>
+      <w:r>
+        <w:t xml:space="preserve"> </w:t>
+      </w:r>
+      <w:r>
+        <w:rPr>
+          <w:rStyle w:val="VerbatimChar"/>
+        </w:rPr>
+        <w:t xml:space="preserve">"hip"</w:t>
+      </w:r>
+      <w:r>
+        <w:t xml:space="preserve">, one of</w:t>
+      </w:r>
+      <w:r>
+        <w:t xml:space="preserve"> </w:t>
+      </w:r>
+      <w:r>
+        <w:rPr>
+          <w:rStyle w:val="VerbatimChar"/>
+        </w:rPr>
+        <w:t xml:space="preserve">extract_CPU_hotspots.py</w:t>
+      </w:r>
+      <w:r>
+        <w:t xml:space="preserve">’s</w:t>
+      </w:r>
+      <w:r>
+        <w:t xml:space="preserve"> </w:t>
+      </w:r>
+      <w:r>
+        <w:t xml:space="preserve">own</w:t>
+      </w:r>
+      <w:r>
+        <w:t xml:space="preserve"> </w:t>
+      </w:r>
+      <w:r>
+        <w:rPr>
+          <w:rStyle w:val="VerbatimChar"/>
+        </w:rPr>
+        <w:t xml:space="preserve">GPU_API_PREFIXES</w:t>
+      </w:r>
+      <w:r>
+        <w:t xml:space="preserve">, so</w:t>
+      </w:r>
+      <w:r>
+        <w:t xml:space="preserve"> </w:t>
+      </w:r>
+      <w:r>
+        <w:rPr>
+          <w:rStyle w:val="VerbatimChar"/>
+        </w:rPr>
+        <w:t xml:space="preserve">scan_ranks()</w:t>
+      </w:r>
+      <w:r>
+        <w:t xml:space="preserve"> </w:t>
+      </w:r>
+      <w:r>
+        <w:t xml:space="preserve">classifies them as GPU rows and</w:t>
+      </w:r>
+      <w:r>
+        <w:t xml:space="preserve"> </w:t>
+      </w:r>
+      <w:r>
+        <w:rPr>
+          <w:rStyle w:val="VerbatimChar"/>
+        </w:rPr>
+        <w:t xml:space="preserve">aggregate_per_rank()</w:t>
+      </w:r>
+      <w:r>
+        <w:t xml:space="preserve"> </w:t>
+      </w:r>
+      <w:r>
+        <w:t xml:space="preserve">drops them before they’re ever visible. Fixed with a small dedicated helper,</w:t>
+      </w:r>
+      <w:r>
+        <w:t xml:space="preserve"> </w:t>
+      </w:r>
+      <w:r>
+        <w:rPr>
+          <w:rStyle w:val="VerbatimChar"/>
+        </w:rPr>
+        <w:t xml:space="preserve">gpu_sync_wait_per_rank()</w:t>
+      </w:r>
+      <w:r>
+        <w:t xml:space="preserve">, that goes one level lower to</w:t>
+      </w:r>
+      <w:r>
+        <w:t xml:space="preserve"> </w:t>
+      </w:r>
+      <w:r>
+        <w:rPr>
+          <w:rStyle w:val="VerbatimChar"/>
+        </w:rPr>
+        <w:t xml:space="preserve">scan_ranks()</w:t>
+      </w:r>
+      <w:r>
+        <w:t xml:space="preserve"> </w:t>
+      </w:r>
+      <w:r>
+        <w:t xml:space="preserve">directly. Caught by the</w:t>
+      </w:r>
+      <w:r>
+        <w:t xml:space="preserve"> </w:t>
+      </w:r>
+      <w:r>
+        <w:t xml:space="preserve">new</w:t>
+      </w:r>
+      <w:r>
+        <w:t xml:space="preserve"> </w:t>
+      </w:r>
+      <w:r>
+        <w:rPr>
+          <w:rStyle w:val="VerbatimChar"/>
+        </w:rPr>
+        <w:t xml:space="preserve">pop_combined_2rank</w:t>
+      </w:r>
+      <w:r>
+        <w:t xml:space="preserve"> </w:t>
+      </w:r>
+      <w:r>
+        <w:t xml:space="preserve">fixture’s test (expected value off by exactly the sync-wait subtraction</w:t>
+      </w:r>
+      <w:r>
+        <w:t xml:space="preserve"> </w:t>
+      </w:r>
+      <w:r>
+        <w:t xml:space="preserve">amount) before any real-data run.</w:t>
+      </w:r>
+    </w:p>
+    <w:p>
+      <w:pPr>
+        <w:pStyle w:val="BodyText"/>
+      </w:pPr>
+      <w:r>
+        <w:rPr>
+          <w:bCs/>
+          <w:b/>
+        </w:rPr>
+        <w:t xml:space="preserve">Divergence from the approved plan:</w:t>
+      </w:r>
+      <w:r>
+        <w:t xml:space="preserve"> </w:t>
+      </w:r>
+      <w:r>
+        <w:t xml:space="preserve">the plan stated</w:t>
+      </w:r>
+      <w:r>
+        <w:t xml:space="preserve"> </w:t>
+      </w:r>
+      <w:r>
+        <w:t xml:space="preserve">“</w:t>
+      </w:r>
+      <w:r>
+        <w:t xml:space="preserve">for the reference run itself, CompE =</w:t>
+      </w:r>
+      <w:r>
+        <w:t xml:space="preserve"> </w:t>
+      </w:r>
+      <w:r>
+        <w:t xml:space="preserve">GE = 1 by definition.</w:t>
+      </w:r>
+      <w:r>
+        <w:t xml:space="preserve">”</w:t>
+      </w:r>
+      <w:r>
+        <w:t xml:space="preserve"> </w:t>
+      </w:r>
+      <w:r>
+        <w:t xml:space="preserve">Only</w:t>
+      </w:r>
+      <w:r>
+        <w:t xml:space="preserve"> </w:t>
+      </w:r>
+      <w:r>
+        <w:rPr>
+          <w:rStyle w:val="VerbatimChar"/>
+        </w:rPr>
+        <w:t xml:space="preserve">CompE_ref = 1</w:t>
+      </w:r>
+      <w:r>
+        <w:t xml:space="preserve"> </w:t>
+      </w:r>
+      <w:r>
+        <w:t xml:space="preserve">is actually trivially true (a self-ratio);</w:t>
+      </w:r>
+      <w:r>
+        <w:t xml:space="preserve"> </w:t>
+      </w:r>
+      <w:r>
+        <w:rPr>
+          <w:rStyle w:val="VerbatimChar"/>
+        </w:rPr>
+        <w:t xml:space="preserve">GE_ref = PE_ref × 1 = PE_ref</w:t>
+      </w:r>
+      <w:r>
+        <w:t xml:space="preserve">, i.e. the reference run’s Global Efficiency correctly equals its own real</w:t>
+      </w:r>
+      <w:r>
+        <w:t xml:space="preserve"> </w:t>
+      </w:r>
+      <w:r>
+        <w:t xml:space="preserve">Parallel Efficiency, not a hardcoded 1 — implemented that way, with a header note added to</w:t>
+      </w:r>
+      <w:r>
+        <w:t xml:space="preserve"> </w:t>
+      </w:r>
+      <w:hyperlink r:id="rId46">
+        <w:r>
+          <w:rPr>
+            <w:rStyle w:val="Hyperlink"/>
+          </w:rPr>
+          <w:t xml:space="preserve">docs/plans/11-pop-metrics-tool.md</w:t>
+        </w:r>
+      </w:hyperlink>
+      <w:r>
+        <w:t xml:space="preserve"> </w:t>
+      </w:r>
+      <w:r>
+        <w:t xml:space="preserve">pointing here.</w:t>
+      </w:r>
+    </w:p>
+    <w:p>
+      <w:pPr>
+        <w:pStyle w:val="BodyText"/>
+      </w:pPr>
+      <w:r>
+        <w:t xml:space="preserve">New fixtures:</w:t>
+      </w:r>
+      <w:r>
+        <w:t xml:space="preserve"> </w:t>
+      </w:r>
+      <w:r>
+        <w:rPr>
+          <w:rStyle w:val="VerbatimChar"/>
+        </w:rPr>
+        <w:t xml:space="preserve">pop_ref_2rank</w:t>
+      </w:r>
+      <w:r>
+        <w:t xml:space="preserve">/</w:t>
+      </w:r>
+      <w:r>
+        <w:rPr>
+          <w:rStyle w:val="VerbatimChar"/>
+        </w:rPr>
+        <w:t xml:space="preserve">pop_scaled_4rank</w:t>
+      </w:r>
+      <w:r>
+        <w:t xml:space="preserve"> </w:t>
+      </w:r>
+      <w:r>
+        <w:t xml:space="preserve">(hand-computed MPI self-time and load-imbalance</w:t>
+      </w:r>
+      <w:r>
+        <w:t xml:space="preserve"> </w:t>
+      </w:r>
+      <w:r>
+        <w:t xml:space="preserve">numbers, cross-checked in tests via</w:t>
+      </w:r>
+      <w:r>
+        <w:t xml:space="preserve"> </w:t>
+      </w:r>
+      <w:r>
+        <w:rPr>
+          <w:rStyle w:val="VerbatimChar"/>
+        </w:rPr>
+        <w:t xml:space="preserve">statistics.mean</w:t>
+      </w:r>
+      <w:r>
+        <w:t xml:space="preserve"> </w:t>
+      </w:r>
+      <w:r>
+        <w:t xml:space="preserve">rather than hand-typed ratios, matching</w:t>
+      </w:r>
+      <w:r>
+        <w:t xml:space="preserve"> </w:t>
+      </w:r>
+      <w:r>
+        <w:t xml:space="preserve">this repo’s existing test style),</w:t>
+      </w:r>
+      <w:r>
+        <w:t xml:space="preserve"> </w:t>
+      </w:r>
+      <w:r>
+        <w:rPr>
+          <w:rStyle w:val="VerbatimChar"/>
+        </w:rPr>
+        <w:t xml:space="preserve">pop_combined_2rank</w:t>
+      </w:r>
+      <w:r>
+        <w:t xml:space="preserve">/</w:t>
+      </w:r>
+      <w:r>
+        <w:rPr>
+          <w:rStyle w:val="VerbatimChar"/>
+        </w:rPr>
+        <w:t xml:space="preserve">pop_combined_mismatch</w:t>
+      </w:r>
+      <w:r>
+        <w:t xml:space="preserve"> </w:t>
+      </w:r>
+      <w:r>
+        <w:t xml:space="preserve">(paired</w:t>
+      </w:r>
+      <w:r>
+        <w:t xml:space="preserve"> </w:t>
+      </w:r>
+      <w:r>
+        <w:rPr>
+          <w:rStyle w:val="VerbatimChar"/>
+        </w:rPr>
+        <w:t xml:space="preserve">rocprof-sys/</w:t>
+      </w:r>
+      <w:r>
+        <w:t xml:space="preserve">+</w:t>
+      </w:r>
+      <w:r>
+        <w:rPr>
+          <w:rStyle w:val="VerbatimChar"/>
+        </w:rPr>
+        <w:t xml:space="preserve">rocprofv3/</w:t>
+      </w:r>
+      <w:r>
+        <w:t xml:space="preserve"> </w:t>
+      </w:r>
+      <w:r>
+        <w:t xml:space="preserve">layout, including the rank-count-mismatch fallback-to-CPU-only</w:t>
+      </w:r>
+      <w:r>
+        <w:t xml:space="preserve"> </w:t>
+      </w:r>
+      <w:r>
+        <w:t xml:space="preserve">path),</w:t>
+      </w:r>
+      <w:r>
+        <w:t xml:space="preserve"> </w:t>
+      </w:r>
+      <w:r>
+        <w:rPr>
+          <w:rStyle w:val="VerbatimChar"/>
+        </w:rPr>
+        <w:t xml:space="preserve">pop_gpu_only</w:t>
+      </w:r>
+      <w:r>
+        <w:t xml:space="preserve"> </w:t>
+      </w:r>
+      <w:r>
+        <w:t xml:space="preserve">(the clear-error case: GPU kernel data with no CPU-side timing at all).</w:t>
+      </w:r>
+      <w:r>
+        <w:t xml:space="preserve"> </w:t>
+      </w:r>
+      <w:r>
+        <w:t xml:space="preserve">20 new tests, full suite green at 193. Also verified end-to-end against real HPC data at the</w:t>
+      </w:r>
+      <w:r>
+        <w:t xml:space="preserve"> </w:t>
+      </w:r>
+      <w:r>
+        <w:t xml:space="preserve">user’s request: the two real</w:t>
+      </w:r>
+      <w:r>
+        <w:t xml:space="preserve"> </w:t>
+      </w:r>
+      <w:r>
+        <w:rPr>
+          <w:rStyle w:val="VerbatimChar"/>
+        </w:rPr>
+        <w:t xml:space="preserve">Heat_Convection_Solver/profile_hotspots-output-2026-08-10-*</w:t>
+      </w:r>
+      <w:r>
+        <w:t xml:space="preserve"> </w:t>
+      </w:r>
+      <w:r>
+        <w:t xml:space="preserve">directories (2 ranks and 4 ranks, same problem — a genuine strong-scaling pair) via</w:t>
+      </w:r>
+      <w:r>
+        <w:t xml:space="preserve"> </w:t>
+      </w:r>
+      <w:r>
+        <w:rPr>
+          <w:rStyle w:val="VerbatimChar"/>
+        </w:rPr>
+        <w:t xml:space="preserve">--scaling strong</w:t>
+      </w:r>
+      <w:r>
+        <w:t xml:space="preserve">. Results were plausible for a stencil/halo-exchange MPI code: Communication</w:t>
+      </w:r>
+      <w:r>
+        <w:t xml:space="preserve"> </w:t>
+      </w:r>
+      <w:r>
+        <w:t xml:space="preserve">Efficiency dropped sharply from 0.808 (2 ranks) to 0.352 (4 ranks) as communication overhead grew</w:t>
+      </w:r>
+      <w:r>
+        <w:t xml:space="preserve"> </w:t>
+      </w:r>
+      <w:r>
+        <w:t xml:space="preserve">relative to compute, Computation Efficiency came out to 1.449 (total useful compute time</w:t>
+      </w:r>
+      <w:r>
+        <w:t xml:space="preserve"> </w:t>
+      </w:r>
+      <w:r>
+        <w:rPr>
+          <w:iCs/>
+          <w:i/>
+        </w:rPr>
+        <w:t xml:space="preserve">decreased</w:t>
+      </w:r>
+      <w:r>
+        <w:t xml:space="preserve"> </w:t>
+      </w:r>
+      <w:r>
+        <w:t xml:space="preserve">going from 2 to 4 ranks — a real toolchain, not fixture data, so no independent</w:t>
+      </w:r>
+      <w:r>
+        <w:t xml:space="preserve"> </w:t>
+      </w:r>
+      <w:r>
+        <w:t xml:space="preserve">ground truth to compare against, but every value landed in its mathematically valid range and</w:t>
+      </w:r>
+      <w:r>
+        <w:t xml:space="preserve"> </w:t>
+      </w:r>
+      <w:r>
+        <w:t xml:space="preserve">the direction of each shift matches what strong scaling on a real halo-exchange code should look</w:t>
+      </w:r>
+      <w:r>
+        <w:t xml:space="preserve"> </w:t>
+      </w:r>
+      <w:r>
+        <w:t xml:space="preserve">like). Real end-to-end validation against a proper scaling study and ROCm/GPU hardware is left</w:t>
+      </w:r>
+      <w:r>
+        <w:t xml:space="preserve"> </w:t>
+      </w:r>
+      <w:r>
+        <w:t xml:space="preserve">to the user, as with every prior tool.</w:t>
+      </w:r>
+    </w:p>
+    <w:p>
+      <w:pPr>
+        <w:pStyle w:val="BodyText"/>
+      </w:pPr>
+      <w:r>
+        <w:rPr>
+          <w:bCs/>
+          <w:b/>
+        </w:rPr>
+        <w:t xml:space="preserve">Report-layout follow-ups</w:t>
+      </w:r>
+      <w:r>
+        <w:t xml:space="preserve">, requested after seeing the real-data output: the originally</w:t>
+      </w:r>
+      <w:r>
+        <w:t xml:space="preserve"> </w:t>
+      </w:r>
+      <w:r>
+        <w:t xml:space="preserve">separate</w:t>
+      </w:r>
+      <w:r>
+        <w:t xml:space="preserve"> </w:t>
+      </w:r>
+      <w:r>
+        <w:t xml:space="preserve">“</w:t>
+      </w:r>
+      <w:r>
+        <w:t xml:space="preserve">Per-run metrics</w:t>
+      </w:r>
+      <w:r>
+        <w:t xml:space="preserve">”</w:t>
+      </w:r>
+      <w:r>
+        <w:t xml:space="preserve"> </w:t>
+      </w:r>
+      <w:r>
+        <w:t xml:space="preserve">and</w:t>
+      </w:r>
+      <w:r>
+        <w:t xml:space="preserve"> </w:t>
+      </w:r>
+      <w:r>
+        <w:t xml:space="preserve">“</w:t>
+      </w:r>
+      <w:r>
+        <w:t xml:space="preserve">Scaling comparison</w:t>
+      </w:r>
+      <w:r>
+        <w:t xml:space="preserve">”</w:t>
+      </w:r>
+      <w:r>
+        <w:t xml:space="preserve"> </w:t>
+      </w:r>
+      <w:r>
+        <w:t xml:space="preserve">tables were merged into one, with</w:t>
+      </w:r>
+      <w:r>
+        <w:t xml:space="preserve"> </w:t>
+      </w:r>
+      <w:r>
+        <w:rPr>
+          <w:rStyle w:val="VerbatimChar"/>
+        </w:rPr>
+        <w:t xml:space="preserve">CompE</w:t>
+      </w:r>
+      <w:r>
+        <w:t xml:space="preserve">/</w:t>
+      </w:r>
+      <w:r>
+        <w:rPr>
+          <w:rStyle w:val="VerbatimChar"/>
+        </w:rPr>
+        <w:t xml:space="preserve">GE</w:t>
+      </w:r>
+      <w:r>
+        <w:t xml:space="preserve"> </w:t>
+      </w:r>
+      <w:r>
+        <w:t xml:space="preserve">columns only appearing when 2+ directories are given (so a single-run report shows a plain</w:t>
+      </w:r>
+      <w:r>
+        <w:t xml:space="preserve"> </w:t>
+      </w:r>
+      <w:r>
+        <w:t xml:space="preserve">5-column table, no half-empty scaling columns) — the run-label column width is computed from the</w:t>
+      </w:r>
+      <w:r>
+        <w:t xml:space="preserve"> </w:t>
+      </w:r>
+      <w:r>
+        <w:t xml:space="preserve">actual longest label rather than a fixed width, since real directory names easily exceed a</w:t>
+      </w:r>
+      <w:r>
+        <w:t xml:space="preserve"> </w:t>
+      </w:r>
+      <w:r>
+        <w:t xml:space="preserve">hardcoded guess and threw off alignment once everything shared one table. The metric-formula</w:t>
+      </w:r>
+      <w:r>
+        <w:t xml:space="preserve"> </w:t>
+      </w:r>
+      <w:r>
+        <w:t xml:space="preserve">footer was reworked from dense wrapped paragraphs into one bulleted line per metric (</w:t>
+      </w:r>
+      <w:r>
+        <w:rPr>
+          <w:rStyle w:val="VerbatimChar"/>
+        </w:rPr>
+        <w:t xml:space="preserve">LB</w:t>
+      </w:r>
+      <w:r>
+        <w:t xml:space="preserve">,</w:t>
+      </w:r>
+      <w:r>
+        <w:t xml:space="preserve"> </w:t>
+      </w:r>
+      <w:r>
+        <w:rPr>
+          <w:rStyle w:val="VerbatimChar"/>
+        </w:rPr>
+        <w:t xml:space="preserve">CommE</w:t>
+      </w:r>
+      <w:r>
+        <w:t xml:space="preserve">,</w:t>
+      </w:r>
+      <w:r>
+        <w:t xml:space="preserve"> </w:t>
+      </w:r>
+      <w:r>
+        <w:rPr>
+          <w:rStyle w:val="VerbatimChar"/>
+        </w:rPr>
+        <w:t xml:space="preserve">PE</w:t>
+      </w:r>
+      <w:r>
+        <w:t xml:space="preserve">, and — multi-run only —</w:t>
+      </w:r>
+      <w:r>
+        <w:t xml:space="preserve"> </w:t>
+      </w:r>
+      <w:r>
+        <w:rPr>
+          <w:rStyle w:val="VerbatimChar"/>
+        </w:rPr>
+        <w:t xml:space="preserve">CompE</w:t>
+      </w:r>
+      <w:r>
+        <w:t xml:space="preserve">,</w:t>
+      </w:r>
+      <w:r>
+        <w:t xml:space="preserve"> </w:t>
+      </w:r>
+      <w:r>
+        <w:rPr>
+          <w:rStyle w:val="VerbatimChar"/>
+        </w:rPr>
+        <w:t xml:space="preserve">GE</w:t>
+      </w:r>
+      <w:r>
+        <w:t xml:space="preserve">), under a</w:t>
+      </w:r>
+      <w:r>
+        <w:t xml:space="preserve"> </w:t>
+      </w:r>
+      <w:r>
+        <w:t xml:space="preserve">“</w:t>
+      </w:r>
+      <w:r>
+        <w:t xml:space="preserve">Metric explanation:</w:t>
+      </w:r>
+      <w:r>
+        <w:t xml:space="preserve">”</w:t>
+      </w:r>
+      <w:r>
+        <w:t xml:space="preserve"> </w:t>
+      </w:r>
+      <w:r>
+        <w:t xml:space="preserve">title,</w:t>
+      </w:r>
+      <w:r>
+        <w:t xml:space="preserve"> </w:t>
+      </w:r>
+      <w:r>
+        <w:t xml:space="preserve">matching the existing</w:t>
+      </w:r>
+      <w:r>
+        <w:t xml:space="preserve"> </w:t>
+      </w:r>
+      <w:r>
+        <w:t xml:space="preserve">“</w:t>
+      </w:r>
+      <w:r>
+        <w:t xml:space="preserve">Not computed</w:t>
+      </w:r>
+      <w:r>
+        <w:t xml:space="preserve">”</w:t>
+      </w:r>
+      <w:r>
+        <w:t xml:space="preserve">/</w:t>
+      </w:r>
+      <w:r>
+        <w:t xml:space="preserve">“</w:t>
+      </w:r>
+      <w:r>
+        <w:t xml:space="preserve">Caveats</w:t>
+      </w:r>
+      <w:r>
+        <w:t xml:space="preserve">”</w:t>
+      </w:r>
+      <w:r>
+        <w:t xml:space="preserve"> </w:t>
+      </w:r>
+      <w:r>
+        <w:t xml:space="preserve">sections’ own bullet style. Full suite (193 tests)</w:t>
+      </w:r>
+      <w:r>
+        <w:t xml:space="preserve"> </w:t>
+      </w:r>
+      <w:r>
+        <w:t xml:space="preserve">re-verified green after each change, and the real 2-vs-4-rank report was regenerated and</w:t>
+      </w:r>
+      <w:r>
+        <w:t xml:space="preserve"> </w:t>
+      </w:r>
+      <w:r>
+        <w:t xml:space="preserve">re-inspected after every layout tweak.</w:t>
+      </w:r>
+    </w:p>
+    <w:bookmarkEnd w:id="47"/>
+    <w:bookmarkEnd w:id="48"/>
     <w:sectPr/>
   </w:body>
 </w:document>

</xml_diff>

<commit_message>
Split calltree into sampling/traced variants, aggregate across ranks
extract_calltree.py is now a sampling-based tool (real call depth, four
noise-filter tiers) while the original wall_clock-preferred tool is renamed
to extract_calltree_traced.py; both share kernel-attribution and rendering
math in the new calltree_common.py.

GPU kernels now attach by matching the compiler-embedded owner subroutine in
the kernel name against the CPU tree, instead of a purely structural nearest-
launch-anchor guess. Both tools now merge every rank into one aggregated call
tree with avg/std_dev/min/max load-balance columns (matching the hotspots
tools' own load-imbalance convention) instead of printing one tree per rank;
the short-lived WALL(s) wall-clock cross-reference column was removed after
review showed it added little value on real data.

Co-Authored-By: Claude Sonnet 5 <noreply@anthropic.com>
</commit_message>
<xml_diff>
--- a/docs/DEVELOPMENT_HISTORY.docx
+++ b/docs/DEVELOPMENT_HISTORY.docx
@@ -10,7 +10,7 @@
         <w:t xml:space="preserve">Development History</w:t>
       </w:r>
     </w:p>
-    <w:bookmarkStart w:id="52" w:name="development-history"/>
+    <w:bookmarkStart w:id="54" w:name="development-history"/>
     <w:p>
       <w:pPr>
         <w:pStyle w:val="Heading1"/>
@@ -723,6 +723,124 @@
           </w:p>
         </w:tc>
       </w:tr>
+      <w:tr>
+        <w:tc>
+          <w:tcPr/>
+          <w:p>
+            <w:pPr>
+              <w:pStyle w:val="Compact"/>
+              <w:jc w:val="left"/>
+            </w:pPr>
+            <w:r>
+              <w:t xml:space="preserve">2026-08-11</w:t>
+            </w:r>
+          </w:p>
+        </w:tc>
+        <w:tc>
+          <w:tcPr/>
+          <w:p>
+            <w:pPr>
+              <w:pStyle w:val="Compact"/>
+              <w:jc w:val="left"/>
+            </w:pPr>
+            <w:r>
+              <w:t xml:space="preserve">Split the calltree tool in two:</w:t>
+            </w:r>
+            <w:r>
+              <w:t xml:space="preserve"> </w:t>
+            </w:r>
+            <w:r>
+              <w:rPr>
+                <w:rStyle w:val="VerbatimChar"/>
+              </w:rPr>
+              <w:t xml:space="preserve">extract_calltree.py</w:t>
+            </w:r>
+            <w:r>
+              <w:t xml:space="preserve"> </w:t>
+            </w:r>
+            <w:r>
+              <w:t xml:space="preserve">reassigned to a new sampling-based variant with real call depth, four noise-filter tiers, and a</w:t>
+            </w:r>
+            <w:r>
+              <w:t xml:space="preserve"> </w:t>
+            </w:r>
+            <w:r>
+              <w:rPr>
+                <w:rStyle w:val="VerbatimChar"/>
+              </w:rPr>
+              <w:t xml:space="preserve">WALL(s)</w:t>
+            </w:r>
+            <w:r>
+              <w:t xml:space="preserve"> </w:t>
+            </w:r>
+            <w:r>
+              <w:t xml:space="preserve">cross-reference column; the original wall_clock-based tool renamed to</w:t>
+            </w:r>
+            <w:r>
+              <w:t xml:space="preserve"> </w:t>
+            </w:r>
+            <w:r>
+              <w:rPr>
+                <w:rStyle w:val="VerbatimChar"/>
+              </w:rPr>
+              <w:t xml:space="preserve">extract_calltree_traced.py</w:t>
+            </w:r>
+            <w:r>
+              <w:t xml:space="preserve">; shared math moved to new</w:t>
+            </w:r>
+            <w:r>
+              <w:t xml:space="preserve"> </w:t>
+            </w:r>
+            <w:r>
+              <w:rPr>
+                <w:rStyle w:val="VerbatimChar"/>
+              </w:rPr>
+              <w:t xml:space="preserve">calltree_common.py</w:t>
+            </w:r>
+          </w:p>
+        </w:tc>
+      </w:tr>
+      <w:tr>
+        <w:tc>
+          <w:tcPr/>
+          <w:p>
+            <w:pPr>
+              <w:pStyle w:val="Compact"/>
+              <w:jc w:val="left"/>
+            </w:pPr>
+            <w:r>
+              <w:t xml:space="preserve">2026-08-11</w:t>
+            </w:r>
+          </w:p>
+        </w:tc>
+        <w:tc>
+          <w:tcPr/>
+          <w:p>
+            <w:pPr>
+              <w:pStyle w:val="Compact"/>
+              <w:jc w:val="left"/>
+            </w:pPr>
+            <w:r>
+              <w:t xml:space="preserve">Reworked GPU kernel attachment to match by the kernel’s compiler-embedded owner subroutine; both calltree tools now aggregate every rank into one merged tree with avg/std_dev/min/max load-balance columns instead of one tree per rank; removed the</w:t>
+            </w:r>
+            <w:r>
+              <w:t xml:space="preserve"> </w:t>
+            </w:r>
+            <w:r>
+              <w:rPr>
+                <w:rStyle w:val="VerbatimChar"/>
+              </w:rPr>
+              <w:t xml:space="preserve">WALL(s)</w:t>
+            </w:r>
+            <w:r>
+              <w:t xml:space="preserve"> </w:t>
+            </w:r>
+            <w:r>
+              <w:t xml:space="preserve">column (found mostly empty, not worth it once the other tool already covers exact timing)</w:t>
+            </w:r>
+          </w:p>
+        </w:tc>
+      </w:tr>
     </w:tbl>
     <w:bookmarkStart w:id="20" w:name="project-scaffolding-and-rules"/>
     <w:p>
@@ -16431,7 +16549,3507 @@
       </w:r>
     </w:p>
     <w:bookmarkEnd w:id="51"/>
+    <w:bookmarkStart w:id="52" w:name="X0e0050f572c9c8da26692fee7fd22d026072834"/>
+    <w:p>
+      <w:pPr>
+        <w:pStyle w:val="Heading2"/>
+      </w:pPr>
+      <w:r>
+        <w:t xml:space="preserve">2026-08-11 — Calltree split in two: sampling-based</w:t>
+      </w:r>
+      <w:r>
+        <w:t xml:space="preserve"> </w:t>
+      </w:r>
+      <w:r>
+        <w:rPr>
+          <w:rStyle w:val="VerbatimChar"/>
+        </w:rPr>
+        <w:t xml:space="preserve">calltree</w:t>
+      </w:r>
+      <w:r>
+        <w:t xml:space="preserve"> </w:t>
+      </w:r>
+      <w:r>
+        <w:t xml:space="preserve">+</w:t>
+      </w:r>
+      <w:r>
+        <w:t xml:space="preserve"> </w:t>
+      </w:r>
+      <w:r>
+        <w:rPr>
+          <w:rStyle w:val="VerbatimChar"/>
+        </w:rPr>
+        <w:t xml:space="preserve">calltree_traced</w:t>
+      </w:r>
+    </w:p>
+    <w:p>
+      <w:pPr>
+        <w:pStyle w:val="FirstParagraph"/>
+      </w:pPr>
+      <w:r>
+        <w:t xml:space="preserve">Real-data inspection of the (then-only) calltree tool against</w:t>
+      </w:r>
+      <w:r>
+        <w:t xml:space="preserve"> </w:t>
+      </w:r>
+      <w:r>
+        <w:rPr>
+          <w:rStyle w:val="VerbatimChar"/>
+        </w:rPr>
+        <w:t xml:space="preserve">Heat_Convection_Solver</w:t>
+      </w:r>
+      <w:r>
+        <w:t xml:space="preserve"> </w:t>
+      </w:r>
+      <w:r>
+        <w:t xml:space="preserve">surfaced a</w:t>
+      </w:r>
+      <w:r>
+        <w:t xml:space="preserve"> </w:t>
+      </w:r>
+      <w:r>
+        <w:t xml:space="preserve">genuine limitation:</w:t>
+      </w:r>
+      <w:r>
+        <w:t xml:space="preserve"> </w:t>
+      </w:r>
+      <w:r>
+        <w:rPr>
+          <w:rStyle w:val="VerbatimChar"/>
+        </w:rPr>
+        <w:t xml:space="preserve">wall_clock</w:t>
+      </w:r>
+      <w:r>
+        <w:t xml:space="preserve">’s DEPTH numbers only reflect</w:t>
+      </w:r>
+      <w:r>
+        <w:t xml:space="preserve"> </w:t>
+      </w:r>
+      <w:r>
+        <w:rPr>
+          <w:iCs/>
+          <w:i/>
+        </w:rPr>
+        <w:t xml:space="preserve">instrumented</w:t>
+      </w:r>
+      <w:r>
+        <w:t xml:space="preserve"> </w:t>
+      </w:r>
+      <w:r>
+        <w:t xml:space="preserve">call-tree depth, so a</w:t>
+      </w:r>
+      <w:r>
+        <w:t xml:space="preserve"> </w:t>
+      </w:r>
+      <w:r>
+        <w:t xml:space="preserve">real but never-instrumented intermediate frame is invisible — GPU kernel launches appeared to hang</w:t>
+      </w:r>
+      <w:r>
+        <w:t xml:space="preserve"> </w:t>
+      </w:r>
+      <w:r>
+        <w:t xml:space="preserve">directly off</w:t>
+      </w:r>
+      <w:r>
+        <w:t xml:space="preserve"> </w:t>
+      </w:r>
+      <w:r>
+        <w:rPr>
+          <w:rStyle w:val="VerbatimChar"/>
+        </w:rPr>
+        <w:t xml:space="preserve">main</w:t>
+      </w:r>
+      <w:r>
+        <w:t xml:space="preserve"> </w:t>
+      </w:r>
+      <w:r>
+        <w:t xml:space="preserve">(sibling of</w:t>
+      </w:r>
+      <w:r>
+        <w:t xml:space="preserve"> </w:t>
+      </w:r>
+      <w:r>
+        <w:rPr>
+          <w:rStyle w:val="VerbatimChar"/>
+        </w:rPr>
+        <w:t xml:space="preserve">MPI_Allreduce</w:t>
+      </w:r>
+      <w:r>
+        <w:t xml:space="preserve">), when the true call chain runs through several</w:t>
+      </w:r>
+      <w:r>
+        <w:t xml:space="preserve"> </w:t>
+      </w:r>
+      <w:r>
+        <w:t xml:space="preserve">real Cray OpenACC/HIP-offload runtime frames and Fortran subroutines. Two throwaway experiments</w:t>
+      </w:r>
+      <w:r>
+        <w:t xml:space="preserve"> </w:t>
+      </w:r>
+      <w:r>
+        <w:t xml:space="preserve">this session confirmed</w:t>
+      </w:r>
+      <w:r>
+        <w:t xml:space="preserve"> </w:t>
+      </w:r>
+      <w:r>
+        <w:rPr>
+          <w:rStyle w:val="VerbatimChar"/>
+        </w:rPr>
+        <w:t xml:space="preserve">sampling_wall_clock</w:t>
+      </w:r>
+      <w:r>
+        <w:t xml:space="preserve"> </w:t>
+      </w:r>
+      <w:r>
+        <w:t xml:space="preserve">(which captures every real unwound stack frame,</w:t>
+      </w:r>
+      <w:r>
+        <w:t xml:space="preserve"> </w:t>
+      </w:r>
+      <w:r>
+        <w:t xml:space="preserve">regardless of instrumentation) shows the true structure — at the cost of an unusably noisy raw</w:t>
+      </w:r>
+      <w:r>
+        <w:t xml:space="preserve"> </w:t>
+      </w:r>
+      <w:r>
+        <w:t xml:space="preserve">tree (5027 lines for one rank, dominated by rocprof-sys’s own instrumentation/dynamic-linker</w:t>
+      </w:r>
+      <w:r>
+        <w:t xml:space="preserve"> </w:t>
+      </w:r>
+      <w:r>
+        <w:t xml:space="preserve">internals) until targeted filtering cut it to 227 lines of genuine application structure. The user</w:t>
+      </w:r>
+      <w:r>
+        <w:t xml:space="preserve"> </w:t>
+      </w:r>
+      <w:r>
+        <w:t xml:space="preserve">asked for this built properly as the new default</w:t>
+      </w:r>
+      <w:r>
+        <w:t xml:space="preserve"> </w:t>
+      </w:r>
+      <w:r>
+        <w:rPr>
+          <w:rStyle w:val="VerbatimChar"/>
+        </w:rPr>
+        <w:t xml:space="preserve">calltree</w:t>
+      </w:r>
+      <w:r>
+        <w:t xml:space="preserve"> </w:t>
+      </w:r>
+      <w:r>
+        <w:t xml:space="preserve">tool, plus a</w:t>
+      </w:r>
+      <w:r>
+        <w:t xml:space="preserve"> </w:t>
+      </w:r>
+      <w:r>
+        <w:rPr>
+          <w:rStyle w:val="VerbatimChar"/>
+        </w:rPr>
+        <w:t xml:space="preserve">wall_clock</w:t>
+      </w:r>
+      <w:r>
+        <w:t xml:space="preserve"> </w:t>
+      </w:r>
+      <w:r>
+        <w:t xml:space="preserve">timing</w:t>
+      </w:r>
+      <w:r>
+        <w:t xml:space="preserve"> </w:t>
+      </w:r>
+      <w:r>
+        <w:t xml:space="preserve">cross-reference column and the existing GPU-kernel-attachment feature carried over.</w:t>
+      </w:r>
+    </w:p>
+    <w:p>
+      <w:pPr>
+        <w:pStyle w:val="BodyText"/>
+      </w:pPr>
+      <w:r>
+        <w:rPr>
+          <w:bCs/>
+          <w:b/>
+        </w:rPr>
+        <w:t xml:space="preserve">Kept both tools</w:t>
+      </w:r>
+      <w:r>
+        <w:t xml:space="preserve"> </w:t>
+      </w:r>
+      <w:r>
+        <w:t xml:space="preserve">rather than replacing one: the original wall_clock-preferred tool is fast,</w:t>
+      </w:r>
+      <w:r>
+        <w:t xml:space="preserve"> </w:t>
+      </w:r>
+      <w:r>
+        <w:t xml:space="preserve">exact where instrumented, and needs no noise-filtering judgment calls — renamed</w:t>
+      </w:r>
+      <w:r>
+        <w:t xml:space="preserve"> </w:t>
+      </w:r>
+      <w:r>
+        <w:rPr>
+          <w:rStyle w:val="VerbatimChar"/>
+        </w:rPr>
+        <w:t xml:space="preserve">extract_calltree_traced.py</w:t>
+      </w:r>
+      <w:r>
+        <w:t xml:space="preserve"> </w:t>
+      </w:r>
+      <w:r>
+        <w:t xml:space="preserve">(default output</w:t>
+      </w:r>
+      <w:r>
+        <w:t xml:space="preserve"> </w:t>
+      </w:r>
+      <w:r>
+        <w:rPr>
+          <w:rStyle w:val="VerbatimChar"/>
+        </w:rPr>
+        <w:t xml:space="preserve">calltree_traced.txt</w:t>
+      </w:r>
+      <w:r>
+        <w:t xml:space="preserve">). The name</w:t>
+      </w:r>
+      <w:r>
+        <w:t xml:space="preserve"> </w:t>
+      </w:r>
+      <w:r>
+        <w:rPr>
+          <w:rStyle w:val="VerbatimChar"/>
+        </w:rPr>
+        <w:t xml:space="preserve">extract_calltree.py</w:t>
+      </w:r>
+      <w:r>
+        <w:t xml:space="preserve"> </w:t>
+      </w:r>
+      <w:r>
+        <w:t xml:space="preserve">was reassigned to the new sampling-based tool (default output</w:t>
+      </w:r>
+      <w:r>
+        <w:t xml:space="preserve"> </w:t>
+      </w:r>
+      <w:r>
+        <w:rPr>
+          <w:rStyle w:val="VerbatimChar"/>
+        </w:rPr>
+        <w:t xml:space="preserve">calltree.txt</w:t>
+      </w:r>
+      <w:r>
+        <w:t xml:space="preserve">, reclaiming the</w:t>
+      </w:r>
+      <w:r>
+        <w:t xml:space="preserve"> </w:t>
+      </w:r>
+      <w:r>
+        <w:t xml:space="preserve">original name since it’s now the recommended default).</w:t>
+      </w:r>
+    </w:p>
+    <w:p>
+      <w:pPr>
+        <w:pStyle w:val="BodyText"/>
+      </w:pPr>
+      <w:r>
+        <w:rPr>
+          <w:bCs/>
+          <w:b/>
+        </w:rPr>
+        <w:t xml:space="preserve">New shared module</w:t>
+      </w:r>
+      <w:r>
+        <w:rPr>
+          <w:bCs/>
+          <w:b/>
+        </w:rPr>
+        <w:t xml:space="preserve"> </w:t>
+      </w:r>
+      <w:r>
+        <w:rPr>
+          <w:rStyle w:val="VerbatimChar"/>
+          <w:bCs/>
+          <w:b/>
+        </w:rPr>
+        <w:t xml:space="preserve">calltree_common.py</w:t>
+      </w:r>
+      <w:r>
+        <w:t xml:space="preserve">: the kernel-anchor-placement math</w:t>
+      </w:r>
+      <w:r>
+        <w:t xml:space="preserve"> </w:t>
+      </w:r>
+      <w:r>
+        <w:t xml:space="preserve">(</w:t>
+      </w:r>
+      <w:r>
+        <w:rPr>
+          <w:rStyle w:val="VerbatimChar"/>
+        </w:rPr>
+        <w:t xml:space="preserve">find_kernel_anchors</w:t>
+      </w:r>
+      <w:r>
+        <w:t xml:space="preserve">/</w:t>
+      </w:r>
+      <w:r>
+        <w:rPr>
+          <w:rStyle w:val="VerbatimChar"/>
+        </w:rPr>
+        <w:t xml:space="preserve">attach_kernel_summaries</w:t>
+      </w:r>
+      <w:r>
+        <w:t xml:space="preserve">/</w:t>
+      </w:r>
+      <w:r>
+        <w:rPr>
+          <w:rStyle w:val="VerbatimChar"/>
+        </w:rPr>
+        <w:t xml:space="preserve">make_kernel_node</w:t>
+      </w:r>
+      <w:r>
+        <w:t xml:space="preserve">), rendering</w:t>
+      </w:r>
+      <w:r>
+        <w:t xml:space="preserve"> </w:t>
+      </w:r>
+      <w:r>
+        <w:t xml:space="preserve">(</w:t>
+      </w:r>
+      <w:r>
+        <w:rPr>
+          <w:rStyle w:val="VerbatimChar"/>
+        </w:rPr>
+        <w:t xml:space="preserve">render_node</w:t>
+      </w:r>
+      <w:r>
+        <w:t xml:space="preserve">/</w:t>
+      </w:r>
+      <w:r>
+        <w:rPr>
+          <w:rStyle w:val="VerbatimChar"/>
+        </w:rPr>
+        <w:t xml:space="preserve">render_forest</w:t>
+      </w:r>
+      <w:r>
+        <w:t xml:space="preserve">/</w:t>
+      </w:r>
+      <w:r>
+        <w:rPr>
+          <w:rStyle w:val="VerbatimChar"/>
+        </w:rPr>
+        <w:t xml:space="preserve">build_children_map</w:t>
+      </w:r>
+      <w:r>
+        <w:t xml:space="preserve">/</w:t>
+      </w:r>
+      <w:r>
+        <w:rPr>
+          <w:rStyle w:val="VerbatimChar"/>
+        </w:rPr>
+        <w:t xml:space="preserve">format_aligned_rows</w:t>
+      </w:r>
+      <w:r>
+        <w:t xml:space="preserve">), and</w:t>
+      </w:r>
+      <w:r>
+        <w:t xml:space="preserve"> </w:t>
+      </w:r>
+      <w:r>
+        <w:rPr>
+          <w:rStyle w:val="VerbatimChar"/>
+        </w:rPr>
+        <w:t xml:space="preserve">resolve_run_dirs</w:t>
+      </w:r>
+      <w:r>
+        <w:t xml:space="preserve"> </w:t>
+      </w:r>
+      <w:r>
+        <w:t xml:space="preserve">moved here, imported by both tools — a deliberate departure from this codebase’s usual</w:t>
+      </w:r>
+      <w:r>
+        <w:t xml:space="preserve"> </w:t>
+      </w:r>
+      <w:r>
+        <w:t xml:space="preserve">“</w:t>
+      </w:r>
+      <w:r>
+        <w:t xml:space="preserve">standalone tools duplicate small constants</w:t>
+      </w:r>
+      <w:r>
+        <w:t xml:space="preserve">”</w:t>
+      </w:r>
+      <w:r>
+        <w:t xml:space="preserve"> </w:t>
+      </w:r>
+      <w:r>
+        <w:t xml:space="preserve">convention, since duplicating ~150 lines of</w:t>
+      </w:r>
+      <w:r>
+        <w:t xml:space="preserve"> </w:t>
+      </w:r>
+      <w:r>
+        <w:t xml:space="preserve">load-bearing proportional-split math risked the two tools silently drifting apart. Every function</w:t>
+      </w:r>
+      <w:r>
+        <w:t xml:space="preserve"> </w:t>
+      </w:r>
+      <w:r>
+        <w:t xml:space="preserve">is parameterized by small callables (</w:t>
+      </w:r>
+      <w:r>
+        <w:rPr>
+          <w:rStyle w:val="VerbatimChar"/>
+        </w:rPr>
+        <w:t xml:space="preserve">is_pruned</w:t>
+      </w:r>
+      <w:r>
+        <w:t xml:space="preserve">,</w:t>
+      </w:r>
+      <w:r>
+        <w:t xml:space="preserve"> </w:t>
+      </w:r>
+      <w:r>
+        <w:rPr>
+          <w:rStyle w:val="VerbatimChar"/>
+        </w:rPr>
+        <w:t xml:space="preserve">node_values</w:t>
+      </w:r>
+      <w:r>
+        <w:t xml:space="preserve">,</w:t>
+      </w:r>
+      <w:r>
+        <w:t xml:space="preserve"> </w:t>
+      </w:r>
+      <w:r>
+        <w:rPr>
+          <w:rStyle w:val="VerbatimChar"/>
+        </w:rPr>
+        <w:t xml:space="preserve">collapses_children</w:t>
+      </w:r>
+      <w:r>
+        <w:t xml:space="preserve">) rather than</w:t>
+      </w:r>
+      <w:r>
+        <w:t xml:space="preserve"> </w:t>
+      </w:r>
+      <w:r>
+        <w:t xml:space="preserve">a single</w:t>
+      </w:r>
+      <w:r>
+        <w:t xml:space="preserve"> </w:t>
+      </w:r>
+      <w:r>
+        <w:rPr>
+          <w:rStyle w:val="VerbatimChar"/>
+        </w:rPr>
+        <w:t xml:space="preserve">show_gpu_api</w:t>
+      </w:r>
+      <w:r>
+        <w:t xml:space="preserve"> </w:t>
+      </w:r>
+      <w:r>
+        <w:t xml:space="preserve">bool, so each tool’s own filtering rules plug in without the shared module</w:t>
+      </w:r>
+      <w:r>
+        <w:t xml:space="preserve"> </w:t>
+      </w:r>
+      <w:r>
+        <w:t xml:space="preserve">needing any opinion on them.</w:t>
+      </w:r>
+      <w:r>
+        <w:t xml:space="preserve"> </w:t>
+      </w:r>
+      <w:r>
+        <w:rPr>
+          <w:rStyle w:val="VerbatimChar"/>
+        </w:rPr>
+        <w:t xml:space="preserve">extract_calltree_traced.py</w:t>
+      </w:r>
+      <w:r>
+        <w:t xml:space="preserve"> </w:t>
+      </w:r>
+      <w:r>
+        <w:t xml:space="preserve">was refactored to import the same</w:t>
+      </w:r>
+      <w:r>
+        <w:t xml:space="preserve"> </w:t>
+      </w:r>
+      <w:r>
+        <w:t xml:space="preserve">primitives; regenerating its report against the same real directory confirmed byte-identical</w:t>
+      </w:r>
+      <w:r>
+        <w:t xml:space="preserve"> </w:t>
+      </w:r>
+      <w:r>
+        <w:t xml:space="preserve">output (modulo the header text update), proving the refactor didn’t change its behavior.</w:t>
+      </w:r>
+    </w:p>
+    <w:p>
+      <w:pPr>
+        <w:pStyle w:val="BodyText"/>
+      </w:pPr>
+      <w:r>
+        <w:rPr>
+          <w:bCs/>
+          <w:b/>
+        </w:rPr>
+        <w:t xml:space="preserve">Four independent, real-data-confirmed noise tiers</w:t>
+      </w:r>
+      <w:r>
+        <w:t xml:space="preserve"> </w:t>
+      </w:r>
+      <w:r>
+        <w:t xml:space="preserve">in the new</w:t>
+      </w:r>
+      <w:r>
+        <w:t xml:space="preserve"> </w:t>
+      </w:r>
+      <w:r>
+        <w:rPr>
+          <w:rStyle w:val="VerbatimChar"/>
+        </w:rPr>
+        <w:t xml:space="preserve">extract_calltree.py</w:t>
+      </w:r>
+      <w:r>
+        <w:t xml:space="preserve">, each</w:t>
+      </w:r>
+      <w:r>
+        <w:t xml:space="preserve"> </w:t>
+      </w:r>
+      <w:r>
+        <w:t xml:space="preserve">hidden by default behind its own flag (</w:t>
+      </w:r>
+      <w:r>
+        <w:rPr>
+          <w:rStyle w:val="VerbatimChar"/>
+        </w:rPr>
+        <w:t xml:space="preserve">--show-all-internals</w:t>
+      </w:r>
+      <w:r>
+        <w:t xml:space="preserve"> </w:t>
+      </w:r>
+      <w:r>
+        <w:t xml:space="preserve">for all four at once):</w:t>
+      </w:r>
+      <w:r>
+        <w:t xml:space="preserve"> </w:t>
+      </w:r>
+      <w:r>
+        <w:t xml:space="preserve">GPU/offload-runtime noise (broadened from</w:t>
+      </w:r>
+      <w:r>
+        <w:t xml:space="preserve"> </w:t>
+      </w:r>
+      <w:r>
+        <w:rPr>
+          <w:rStyle w:val="VerbatimChar"/>
+        </w:rPr>
+        <w:t xml:space="preserve">startswith</w:t>
+      </w:r>
+      <w:r>
+        <w:t xml:space="preserve"> </w:t>
+      </w:r>
+      <w:r>
+        <w:t xml:space="preserve">to substring matching, plus new substrings</w:t>
+      </w:r>
+      <w:r>
+        <w:t xml:space="preserve"> </w:t>
+      </w:r>
+      <w:r>
+        <w:rPr>
+          <w:rStyle w:val="VerbatimChar"/>
+        </w:rPr>
+        <w:t xml:space="preserve">cray_acc</w:t>
+      </w:r>
+      <w:r>
+        <w:t xml:space="preserve">/</w:t>
+      </w:r>
+      <w:r>
+        <w:rPr>
+          <w:rStyle w:val="VerbatimChar"/>
+        </w:rPr>
+        <w:t xml:space="preserve">hiphardwaredevice</w:t>
+      </w:r>
+      <w:r>
+        <w:t xml:space="preserve">/</w:t>
+      </w:r>
+      <w:r>
+        <w:rPr>
+          <w:rStyle w:val="VerbatimChar"/>
+        </w:rPr>
+        <w:t xml:space="preserve">present_table</w:t>
+      </w:r>
+      <w:r>
+        <w:t xml:space="preserve"> </w:t>
+      </w:r>
+      <w:r>
+        <w:t xml:space="preserve">—</w:t>
+      </w:r>
+      <w:r>
+        <w:t xml:space="preserve"> </w:t>
+      </w:r>
+      <w:r>
+        <w:rPr>
+          <w:bCs/>
+          <w:b/>
+        </w:rPr>
+        <w:t xml:space="preserve">pruned</w:t>
+      </w:r>
+      <w:r>
+        <w:t xml:space="preserve">), rocprof-sys’s own</w:t>
+      </w:r>
+      <w:r>
+        <w:t xml:space="preserve"> </w:t>
+      </w:r>
+      <w:r>
+        <w:t xml:space="preserve">instrumentation/GOTCHA/dynamic-linker frames (</w:t>
+      </w:r>
+      <w:r>
+        <w:rPr>
+          <w:bCs/>
+          <w:b/>
+        </w:rPr>
+        <w:t xml:space="preserve">spliced</w:t>
+      </w:r>
+      <w:r>
+        <w:t xml:space="preserve"> </w:t>
+      </w:r>
+      <w:r>
+        <w:t xml:space="preserve">— the node is removed but its children</w:t>
+      </w:r>
+      <w:r>
+        <w:t xml:space="preserve"> </w:t>
+      </w:r>
+      <w:r>
+        <w:t xml:space="preserve">reparented to its own parent, since real code sits</w:t>
+      </w:r>
+      <w:r>
+        <w:t xml:space="preserve"> </w:t>
+      </w:r>
+      <w:r>
+        <w:rPr>
+          <w:iCs/>
+          <w:i/>
+        </w:rPr>
+        <w:t xml:space="preserve">inside</w:t>
+      </w:r>
+      <w:r>
+        <w:t xml:space="preserve"> </w:t>
+      </w:r>
+      <w:r>
+        <w:t xml:space="preserve">these wrappers; the first, buggy pass</w:t>
+      </w:r>
+      <w:r>
+        <w:t xml:space="preserve"> </w:t>
+      </w:r>
+      <w:r>
+        <w:t xml:space="preserve">of the underlying experiment pruned them instead and deleted the whole program along with them),</w:t>
+      </w:r>
+      <w:r>
+        <w:t xml:space="preserve"> </w:t>
+      </w:r>
+      <w:r>
+        <w:t xml:space="preserve">MPI library internals (</w:t>
+      </w:r>
+      <w:r>
+        <w:rPr>
+          <w:bCs/>
+          <w:b/>
+        </w:rPr>
+        <w:t xml:space="preserve">collapsed</w:t>
+      </w:r>
+      <w:r>
+        <w:t xml:space="preserve"> </w:t>
+      </w:r>
+      <w:r>
+        <w:t xml:space="preserve">— the first real MPI frame is shown, its own implementation</w:t>
+      </w:r>
+      <w:r>
+        <w:t xml:space="preserve"> </w:t>
+      </w:r>
+      <w:r>
+        <w:t xml:space="preserve">internals are not), and compiler-runtime allocator/intrinsic helpers observed on Cray’s Fortran</w:t>
+      </w:r>
+      <w:r>
+        <w:t xml:space="preserve"> </w:t>
+      </w:r>
+      <w:r>
+        <w:t xml:space="preserve">runtime specifically (</w:t>
+      </w:r>
+      <w:r>
+        <w:rPr>
+          <w:bCs/>
+          <w:b/>
+        </w:rPr>
+        <w:t xml:space="preserve">pruned</w:t>
+      </w:r>
+      <w:r>
+        <w:t xml:space="preserve">, documented as the least universal tier). Kernel-launch anchor</w:t>
+      </w:r>
+      <w:r>
+        <w:t xml:space="preserve"> </w:t>
+      </w:r>
+      <w:r>
+        <w:t xml:space="preserve">detection was broadened the same way, plus</w:t>
+      </w:r>
+      <w:r>
+        <w:t xml:space="preserve"> </w:t>
+      </w:r>
+      <w:r>
+        <w:rPr>
+          <w:rStyle w:val="VerbatimChar"/>
+        </w:rPr>
+        <w:t xml:space="preserve">__cray_start_acc_kernel</w:t>
+      </w:r>
+      <w:r>
+        <w:t xml:space="preserve"> </w:t>
+      </w:r>
+      <w:r>
+        <w:t xml:space="preserve">(Cray’s compiler-generated</w:t>
+      </w:r>
+      <w:r>
+        <w:t xml:space="preserve"> </w:t>
+      </w:r>
+      <w:r>
+        <w:t xml:space="preserve">OpenACC/offload launch entry point) as a new recognized entry point — with real call depth now</w:t>
+      </w:r>
+      <w:r>
+        <w:t xml:space="preserve"> </w:t>
+      </w:r>
+      <w:r>
+        <w:t xml:space="preserve">visible, the proportional-split multi-anchor logic engages far more often and far more usefully</w:t>
+      </w:r>
+      <w:r>
+        <w:t xml:space="preserve"> </w:t>
+      </w:r>
+      <w:r>
+        <w:t xml:space="preserve">than it did against the traced tool’s shallower trees.</w:t>
+      </w:r>
+    </w:p>
+    <w:p>
+      <w:pPr>
+        <w:pStyle w:val="BodyText"/>
+      </w:pPr>
+      <w:r>
+        <w:rPr>
+          <w:rStyle w:val="VerbatimChar"/>
+          <w:bCs/>
+          <w:b/>
+        </w:rPr>
+        <w:t xml:space="preserve">WALL(s)</w:t>
+      </w:r>
+      <w:r>
+        <w:rPr>
+          <w:bCs/>
+          <w:b/>
+        </w:rPr>
+        <w:t xml:space="preserve"> </w:t>
+      </w:r>
+      <w:r>
+        <w:rPr>
+          <w:bCs/>
+          <w:b/>
+        </w:rPr>
+        <w:t xml:space="preserve">cross-reference column</w:t>
+      </w:r>
+      <w:r>
+        <w:t xml:space="preserve">: each rendered line’s exact</w:t>
+      </w:r>
+      <w:r>
+        <w:t xml:space="preserve"> </w:t>
+      </w:r>
+      <w:r>
+        <w:rPr>
+          <w:rStyle w:val="VerbatimChar"/>
+        </w:rPr>
+        <w:t xml:space="preserve">wall_clock</w:t>
+      </w:r>
+      <w:r>
+        <w:t xml:space="preserve"> </w:t>
+      </w:r>
+      <w:r>
+        <w:t xml:space="preserve">self-time for that</w:t>
+      </w:r>
+      <w:r>
+        <w:t xml:space="preserve"> </w:t>
+      </w:r>
+      <w:r>
+        <w:t xml:space="preserve">label, built from a dedicated</w:t>
+      </w:r>
+      <w:r>
+        <w:t xml:space="preserve"> </w:t>
+      </w:r>
+      <w:r>
+        <w:rPr>
+          <w:rStyle w:val="VerbatimChar"/>
+        </w:rPr>
+        <w:t xml:space="preserve">wall_clock_self_by_rank()</w:t>
+      </w:r>
+      <w:r>
+        <w:t xml:space="preserve"> </w:t>
+      </w:r>
+      <w:r>
+        <w:t xml:space="preserve">(summed across every occurrence of that</w:t>
+      </w:r>
+      <w:r>
+        <w:t xml:space="preserve"> </w:t>
+      </w:r>
+      <w:r>
+        <w:t xml:space="preserve">label in the rank’s</w:t>
+      </w:r>
+      <w:r>
+        <w:t xml:space="preserve"> </w:t>
+      </w:r>
+      <w:r>
+        <w:rPr>
+          <w:rStyle w:val="VerbatimChar"/>
+        </w:rPr>
+        <w:t xml:space="preserve">wall_clock</w:t>
+      </w:r>
+      <w:r>
+        <w:t xml:space="preserve"> </w:t>
+      </w:r>
+      <w:r>
+        <w:t xml:space="preserve">file, not</w:t>
+      </w:r>
+      <w:r>
+        <w:t xml:space="preserve"> </w:t>
+      </w:r>
+      <w:r>
+        <w:rPr>
+          <w:rStyle w:val="VerbatimChar"/>
+        </w:rPr>
+        <w:t xml:space="preserve">scan_ranks()</w:t>
+      </w:r>
+      <w:r>
+        <w:t xml:space="preserve">’s merged/sampling-fallback rows, so a</w:t>
+      </w:r>
+      <w:r>
+        <w:t xml:space="preserve"> </w:t>
+      </w:r>
+      <w:r>
+        <w:t xml:space="preserve">label truly absent from</w:t>
+      </w:r>
+      <w:r>
+        <w:t xml:space="preserve"> </w:t>
+      </w:r>
+      <w:r>
+        <w:rPr>
+          <w:rStyle w:val="VerbatimChar"/>
+        </w:rPr>
+        <w:t xml:space="preserve">wall_clock</w:t>
+      </w:r>
+      <w:r>
+        <w:t xml:space="preserve"> </w:t>
+      </w:r>
+      <w:r>
+        <w:t xml:space="preserve">shows</w:t>
+      </w:r>
+      <w:r>
+        <w:t xml:space="preserve"> </w:t>
+      </w:r>
+      <w:r>
+        <w:rPr>
+          <w:rStyle w:val="VerbatimChar"/>
+        </w:rPr>
+        <w:t xml:space="preserve">-</w:t>
+      </w:r>
+      <w:r>
+        <w:t xml:space="preserve"> </w:t>
+      </w:r>
+      <w:r>
+        <w:t xml:space="preserve">instead of silently substituting a sampled number).</w:t>
+      </w:r>
+      <w:r>
+        <w:t xml:space="preserve"> </w:t>
+      </w:r>
+      <w:r>
+        <w:t xml:space="preserve">Real-data testing found this column is</w:t>
+      </w:r>
+      <w:r>
+        <w:t xml:space="preserve"> </w:t>
+      </w:r>
+      <w:r>
+        <w:rPr>
+          <w:rStyle w:val="VerbatimChar"/>
+        </w:rPr>
+        <w:t xml:space="preserve">-</w:t>
+      </w:r>
+      <w:r>
+        <w:t xml:space="preserve"> </w:t>
+      </w:r>
+      <w:r>
+        <w:t xml:space="preserve">for nearly every row by design, not by bug: GOTCHA</w:t>
+      </w:r>
+      <w:r>
+        <w:t xml:space="preserve"> </w:t>
+      </w:r>
+      <w:r>
+        <w:t xml:space="preserve">hooks the library-level C symbol (e.g. </w:t>
+      </w:r>
+      <w:r>
+        <w:rPr>
+          <w:rStyle w:val="VerbatimChar"/>
+        </w:rPr>
+        <w:t xml:space="preserve">MPI_Isend</w:t>
+      </w:r>
+      <w:r>
+        <w:t xml:space="preserve">) while sampling unwinds through the</w:t>
+      </w:r>
+      <w:r>
+        <w:t xml:space="preserve"> </w:t>
+      </w:r>
+      <w:r>
+        <w:t xml:space="preserve">compiler-generated wrapper that calls it (e.g. </w:t>
+      </w:r>
+      <w:r>
+        <w:rPr>
+          <w:rStyle w:val="VerbatimChar"/>
+        </w:rPr>
+        <w:t xml:space="preserve">mpi_isend_f08ts_</w:t>
+      </w:r>
+      <w:r>
+        <w:t xml:space="preserve">) — confirmed by checking overlap</w:t>
+      </w:r>
+      <w:r>
+        <w:t xml:space="preserve"> </w:t>
+      </w:r>
+      <w:r>
+        <w:t xml:space="preserve">between one rank’s</w:t>
+      </w:r>
+      <w:r>
+        <w:t xml:space="preserve"> </w:t>
+      </w:r>
+      <w:r>
+        <w:rPr>
+          <w:rStyle w:val="VerbatimChar"/>
+        </w:rPr>
+        <w:t xml:space="preserve">wall_clock</w:t>
+      </w:r>
+      <w:r>
+        <w:t xml:space="preserve">/</w:t>
+      </w:r>
+      <w:r>
+        <w:rPr>
+          <w:rStyle w:val="VerbatimChar"/>
+        </w:rPr>
+        <w:t xml:space="preserve">sampling_wall_clock</w:t>
+      </w:r>
+      <w:r>
+        <w:t xml:space="preserve"> </w:t>
+      </w:r>
+      <w:r>
+        <w:t xml:space="preserve">label sets directly (63 vs. 394 labels, only</w:t>
+      </w:r>
+      <w:r>
+        <w:t xml:space="preserve"> </w:t>
+      </w:r>
+      <w:r>
+        <w:t xml:space="preserve">3 in common). Also documented a real subtlety found via the same check: since a label can recur at</w:t>
+      </w:r>
+      <w:r>
+        <w:t xml:space="preserve"> </w:t>
+      </w:r>
+      <w:r>
+        <w:t xml:space="preserve">multiple tree positions (e.g. one</w:t>
+      </w:r>
+      <w:r>
+        <w:t xml:space="preserve"> </w:t>
+      </w:r>
+      <w:r>
+        <w:rPr>
+          <w:rStyle w:val="VerbatimChar"/>
+        </w:rPr>
+        <w:t xml:space="preserve">start_thread</w:t>
+      </w:r>
+      <w:r>
+        <w:t xml:space="preserve"> </w:t>
+      </w:r>
+      <w:r>
+        <w:t xml:space="preserve">row per spawned worker thread), the column shows</w:t>
+      </w:r>
+      <w:r>
+        <w:t xml:space="preserve"> </w:t>
+      </w:r>
+      <w:r>
+        <w:t xml:space="preserve">the</w:t>
+      </w:r>
+      <w:r>
+        <w:t xml:space="preserve"> </w:t>
+      </w:r>
+      <w:r>
+        <w:rPr>
+          <w:iCs/>
+          <w:i/>
+        </w:rPr>
+        <w:t xml:space="preserve">same</w:t>
+      </w:r>
+      <w:r>
+        <w:t xml:space="preserve"> </w:t>
+      </w:r>
+      <w:r>
+        <w:t xml:space="preserve">rank-wide total on every occurrence, not a per-node-exact match — the two trees are</w:t>
+      </w:r>
+      <w:r>
+        <w:t xml:space="preserve"> </w:t>
+      </w:r>
+      <w:r>
+        <w:t xml:space="preserve">reconstructed independently and can’t be correlated node-by-node.</w:t>
+      </w:r>
+    </w:p>
+    <w:p>
+      <w:pPr>
+        <w:pStyle w:val="BodyText"/>
+      </w:pPr>
+      <w:r>
+        <w:t xml:space="preserve">Verified: full suite grew to 261 tests (19 new for</w:t>
+      </w:r>
+      <w:r>
+        <w:t xml:space="preserve"> </w:t>
+      </w:r>
+      <w:r>
+        <w:rPr>
+          <w:rStyle w:val="VerbatimChar"/>
+        </w:rPr>
+        <w:t xml:space="preserve">extract_calltree.py</w:t>
+      </w:r>
+      <w:r>
+        <w:t xml:space="preserve">’s filter tiers/splice/MPI</w:t>
+      </w:r>
+      <w:r>
+        <w:t xml:space="preserve"> </w:t>
+      </w:r>
+      <w:r>
+        <w:t xml:space="preserve">collapse/wall-clock cross-reference/kernel-anchor-broadening/sampling-fallback behavior, 15 new for</w:t>
+      </w:r>
+      <w:r>
+        <w:t xml:space="preserve"> </w:t>
+      </w:r>
+      <w:r>
+        <w:rPr>
+          <w:rStyle w:val="VerbatimChar"/>
+        </w:rPr>
+        <w:t xml:space="preserve">calltree_common.py</w:t>
+      </w:r>
+      <w:r>
+        <w:t xml:space="preserve">’s shared math directly, using hand-built in-memory trees rather than fixture</w:t>
+      </w:r>
+      <w:r>
+        <w:t xml:space="preserve"> </w:t>
+      </w:r>
+      <w:r>
+        <w:t xml:space="preserve">files), all green; the renamed traced tool’s existing 23 tests re-verified green unchanged.</w:t>
+      </w:r>
+      <w:r>
+        <w:t xml:space="preserve"> </w:t>
+      </w:r>
+      <w:r>
+        <w:rPr>
+          <w:rStyle w:val="VerbatimChar"/>
+        </w:rPr>
+        <w:t xml:space="preserve">bash -n</w:t>
+      </w:r>
+      <w:r>
+        <w:t xml:space="preserve"> </w:t>
+      </w:r>
+      <w:r>
+        <w:t xml:space="preserve">plus stubbed-binary tracing on all three launcher scripts confirmed the four new</w:t>
+      </w:r>
+      <w:r>
+        <w:t xml:space="preserve"> </w:t>
+      </w:r>
+      <w:r>
+        <w:rPr>
+          <w:rStyle w:val="VerbatimChar"/>
+        </w:rPr>
+        <w:t xml:space="preserve">--show-*</w:t>
+      </w:r>
+      <w:r>
+        <w:t xml:space="preserve"> </w:t>
+      </w:r>
+      <w:r>
+        <w:t xml:space="preserve">flags reach the extractor invocation correctly. Real end-to-end validation: regenerated</w:t>
+      </w:r>
+      <w:r>
+        <w:t xml:space="preserve"> </w:t>
+      </w:r>
+      <w:r>
+        <w:rPr>
+          <w:rStyle w:val="VerbatimChar"/>
+        </w:rPr>
+        <w:t xml:space="preserve">calltree.txt</w:t>
+      </w:r>
+      <w:r>
+        <w:t xml:space="preserve"> </w:t>
+      </w:r>
+      <w:r>
+        <w:t xml:space="preserve">and</w:t>
+      </w:r>
+      <w:r>
+        <w:t xml:space="preserve"> </w:t>
+      </w:r>
+      <w:r>
+        <w:rPr>
+          <w:rStyle w:val="VerbatimChar"/>
+        </w:rPr>
+        <w:t xml:space="preserve">calltree_traced.txt</w:t>
+      </w:r>
+      <w:r>
+        <w:t xml:space="preserve"> </w:t>
+      </w:r>
+      <w:r>
+        <w:t xml:space="preserve">against both existing</w:t>
+      </w:r>
+      <w:r>
+        <w:t xml:space="preserve"> </w:t>
+      </w:r>
+      <w:r>
+        <w:rPr>
+          <w:rStyle w:val="VerbatimChar"/>
+        </w:rPr>
+        <w:t xml:space="preserve">Heat_Convection_Solver</w:t>
+      </w:r>
+      <w:r>
+        <w:t xml:space="preserve"> </w:t>
+      </w:r>
+      <w:r>
+        <w:t xml:space="preserve">directories</w:t>
+      </w:r>
+      <w:r>
+        <w:t xml:space="preserve"> </w:t>
+      </w:r>
+      <w:r>
+        <w:t xml:space="preserve">(a tool-3 combined output and the tool-4 scan directory), delivered for direct review — the new</w:t>
+      </w:r>
+      <w:r>
+        <w:t xml:space="preserve"> </w:t>
+      </w:r>
+      <w:r>
+        <w:t xml:space="preserve">tool’s kernel integration engaging at over a dozen real per-subroutine anchors per rank (vs. the</w:t>
+      </w:r>
+      <w:r>
+        <w:t xml:space="preserve"> </w:t>
+      </w:r>
+      <w:r>
+        <w:t xml:space="preserve">traced tool’s single collision point near</w:t>
+      </w:r>
+      <w:r>
+        <w:t xml:space="preserve"> </w:t>
+      </w:r>
+      <w:r>
+        <w:rPr>
+          <w:rStyle w:val="VerbatimChar"/>
+        </w:rPr>
+        <w:t xml:space="preserve">main</w:t>
+      </w:r>
+      <w:r>
+        <w:t xml:space="preserve">) confirmed the whole point of this round’s work in</w:t>
+      </w:r>
+      <w:r>
+        <w:t xml:space="preserve"> </w:t>
+      </w:r>
+      <w:r>
+        <w:t xml:space="preserve">practice, not just in theory.</w:t>
+      </w:r>
+    </w:p>
+    <w:p>
+      <w:pPr>
+        <w:pStyle w:val="BodyText"/>
+      </w:pPr>
+      <w:r>
+        <w:rPr>
+          <w:bCs/>
+          <w:b/>
+        </w:rPr>
+        <w:t xml:space="preserve">Fourth real-data-driven fix, found immediately after delivery</w:t>
+      </w:r>
+      <w:r>
+        <w:t xml:space="preserve">: the user spotted a</w:t>
+      </w:r>
+      <w:r>
+        <w:t xml:space="preserve"> </w:t>
+      </w:r>
+      <w:r>
+        <w:rPr>
+          <w:rStyle w:val="VerbatimChar"/>
+        </w:rPr>
+        <w:t xml:space="preserve">start_thread</w:t>
+      </w:r>
+      <w:r>
+        <w:t xml:space="preserve"> </w:t>
+      </w:r>
+      <w:r>
+        <w:t xml:space="preserve">root in</w:t>
+      </w:r>
+      <w:r>
+        <w:t xml:space="preserve"> </w:t>
+      </w:r>
+      <w:r>
+        <w:rPr>
+          <w:rStyle w:val="VerbatimChar"/>
+        </w:rPr>
+        <w:t xml:space="preserve">calltree.txt</w:t>
+      </w:r>
+      <w:r>
+        <w:t xml:space="preserve"> </w:t>
+      </w:r>
+      <w:r>
+        <w:t xml:space="preserve">carrying ~88s of unfiltered self/total time per rank, despite this exact</w:t>
+      </w:r>
+      <w:r>
+        <w:t xml:space="preserve"> </w:t>
+      </w:r>
+      <w:r>
+        <w:t xml:space="preserve">class of noise having already been ruled out for removal (the 2026-08-04</w:t>
+      </w:r>
+      <w:r>
+        <w:t xml:space="preserve"> </w:t>
+      </w:r>
+      <w:r>
+        <w:t xml:space="preserve">“</w:t>
+      </w:r>
+      <w:r>
+        <w:t xml:space="preserve">call-tree-ancestry thread</w:t>
+      </w:r>
+      <w:r>
+        <w:t xml:space="preserve"> </w:t>
+      </w:r>
+      <w:r>
+        <w:t xml:space="preserve">reclassification</w:t>
+      </w:r>
+      <w:r>
+        <w:t xml:space="preserve">”</w:t>
+      </w:r>
+      <w:r>
+        <w:t xml:space="preserve"> </w:t>
+      </w:r>
+      <w:r>
+        <w:t xml:space="preserve">fix, for the</w:t>
+      </w:r>
+      <w:r>
+        <w:t xml:space="preserve"> </w:t>
+      </w:r>
+      <w:r>
+        <w:rPr>
+          <w:iCs/>
+          <w:i/>
+        </w:rPr>
+        <w:t xml:space="preserve">other</w:t>
+      </w:r>
+      <w:r>
+        <w:t xml:space="preserve"> </w:t>
+      </w:r>
+      <w:r>
+        <w:t xml:space="preserve">tool). Traced to a real, previously-anticipated data-shape</w:t>
+      </w:r>
+      <w:r>
+        <w:t xml:space="preserve"> </w:t>
+      </w:r>
+      <w:r>
+        <w:t xml:space="preserve">gap:</w:t>
+      </w:r>
+      <w:r>
+        <w:t xml:space="preserve"> </w:t>
+      </w:r>
+      <w:r>
+        <w:rPr>
+          <w:rStyle w:val="VerbatimChar"/>
+        </w:rPr>
+        <w:t xml:space="preserve">classify_gpu_broad()</w:t>
+      </w:r>
+      <w:r>
+        <w:t xml:space="preserve">’s ancestor-walk (same idea as</w:t>
+      </w:r>
+      <w:r>
+        <w:t xml:space="preserve"> </w:t>
+      </w:r>
+      <w:r>
+        <w:rPr>
+          <w:rStyle w:val="VerbatimChar"/>
+        </w:rPr>
+        <w:t xml:space="preserve">extract_CPU_hotspots.classify_gpu()</w:t>
+      </w:r>
+      <w:r>
+        <w:t xml:space="preserve">)</w:t>
+      </w:r>
+      <w:r>
+        <w:t xml:space="preserve"> </w:t>
+      </w:r>
+      <w:r>
+        <w:t xml:space="preserve">only works when a thread-root row still has a real parent link to walk up through. In</w:t>
+      </w:r>
+      <w:r>
+        <w:t xml:space="preserve"> </w:t>
+      </w:r>
+      <w:r>
+        <w:rPr>
+          <w:rStyle w:val="VerbatimChar"/>
+        </w:rPr>
+        <w:t xml:space="preserve">sampling_wall_clock</w:t>
+      </w:r>
+      <w:r>
+        <w:t xml:space="preserve">, a background HIP/ROCr event-loop thread’s samples reset DEPTH to 0 for its</w:t>
+      </w:r>
+      <w:r>
+        <w:t xml:space="preserve"> </w:t>
+      </w:r>
+      <w:r>
+        <w:t xml:space="preserve">own OS thread —</w:t>
+      </w:r>
+      <w:r>
+        <w:t xml:space="preserve"> </w:t>
+      </w:r>
+      <w:r>
+        <w:rPr>
+          <w:rStyle w:val="VerbatimChar"/>
+        </w:rPr>
+        <w:t xml:space="preserve">attach_ancestry()</w:t>
+      </w:r>
+      <w:r>
+        <w:t xml:space="preserve"> </w:t>
+      </w:r>
+      <w:r>
+        <w:t xml:space="preserve">correctly gives it</w:t>
+      </w:r>
+      <w:r>
+        <w:t xml:space="preserve"> </w:t>
+      </w:r>
+      <w:r>
+        <w:rPr>
+          <w:rStyle w:val="VerbatimChar"/>
+        </w:rPr>
+        <w:t xml:space="preserve">parent=None</w:t>
+      </w:r>
+      <w:r>
+        <w:t xml:space="preserve">, same as a genuine</w:t>
+      </w:r>
+      <w:r>
+        <w:t xml:space="preserve"> </w:t>
+      </w:r>
+      <w:r>
+        <w:t xml:space="preserve">application-spawned root, so there’s no ancestor to walk at all. Confirmed directly against the raw</w:t>
+      </w:r>
+      <w:r>
+        <w:t xml:space="preserve"> </w:t>
+      </w:r>
+      <w:r>
+        <w:t xml:space="preserve">file:</w:t>
+      </w:r>
+      <w:r>
+        <w:t xml:space="preserve"> </w:t>
+      </w:r>
+      <w:r>
+        <w:rPr>
+          <w:rStyle w:val="VerbatimChar"/>
+        </w:rPr>
+        <w:t xml:space="preserve">start_thread</w:t>
+      </w:r>
+      <w:r>
+        <w:t xml:space="preserve"> </w:t>
+      </w:r>
+      <w:r>
+        <w:t xml:space="preserve">(thread 3) sits at DEPTH 0, its only child is rocprof-sys’s own</w:t>
+      </w:r>
+      <w:r>
+        <w:t xml:space="preserve"> </w:t>
+      </w:r>
+      <w:r>
+        <w:rPr>
+          <w:rStyle w:val="VerbatimChar"/>
+        </w:rPr>
+        <w:t xml:space="preserve">pthread_create_gotcha</w:t>
+      </w:r>
+      <w:r>
+        <w:t xml:space="preserve"> </w:t>
+      </w:r>
+      <w:r>
+        <w:t xml:space="preserve">wrapper hop, and</w:t>
+      </w:r>
+      <w:r>
+        <w:t xml:space="preserve"> </w:t>
+      </w:r>
+      <w:r>
+        <w:rPr>
+          <w:iCs/>
+          <w:i/>
+        </w:rPr>
+        <w:t xml:space="preserve">that</w:t>
+      </w:r>
+      <w:r>
+        <w:t xml:space="preserve"> </w:t>
+      </w:r>
+      <w:r>
+        <w:t xml:space="preserve">leads straight into</w:t>
+      </w:r>
+      <w:r>
+        <w:t xml:space="preserve"> </w:t>
+      </w:r>
+      <w:r>
+        <w:rPr>
+          <w:rStyle w:val="VerbatimChar"/>
+        </w:rPr>
+        <w:t xml:space="preserve">rocr::os::ThreadTrampoline</w:t>
+      </w:r>
+      <w:r>
+        <w:t xml:space="preserve"> </w:t>
+      </w:r>
+      <w:r>
+        <w:t xml:space="preserve">and</w:t>
+      </w:r>
+      <w:r>
+        <w:t xml:space="preserve"> </w:t>
+      </w:r>
+      <w:r>
+        <w:t xml:space="preserve">deeper ROCm-runtime internals — exactly the pattern</w:t>
+      </w:r>
+      <w:r>
+        <w:t xml:space="preserve"> </w:t>
+      </w:r>
+      <w:r>
+        <w:rPr>
+          <w:rStyle w:val="VerbatimChar"/>
+        </w:rPr>
+        <w:t xml:space="preserve">GPU_API_PREFIXES</w:t>
+      </w:r>
+      <w:r>
+        <w:t xml:space="preserve">’s own</w:t>
+      </w:r>
+      <w:r>
+        <w:t xml:space="preserve"> </w:t>
+      </w:r>
+      <w:r>
+        <w:rPr>
+          <w:rStyle w:val="VerbatimChar"/>
+        </w:rPr>
+        <w:t xml:space="preserve">rocr</w:t>
+      </w:r>
+      <w:r>
+        <w:t xml:space="preserve"> </w:t>
+      </w:r>
+      <w:r>
+        <w:t xml:space="preserve">entry was added</w:t>
+      </w:r>
+      <w:r>
+        <w:t xml:space="preserve"> </w:t>
+      </w:r>
+      <w:r>
+        <w:t xml:space="preserve">for, just unreachable by upward-ancestry alone this time. Fixed with a new downward counterpart,</w:t>
+      </w:r>
+      <w:r>
+        <w:t xml:space="preserve"> </w:t>
+      </w:r>
+      <w:r>
+        <w:rPr>
+          <w:rStyle w:val="VerbatimChar"/>
+        </w:rPr>
+        <w:t xml:space="preserve">propagate_gpu_to_untethered_thread_roots()</w:t>
+      </w:r>
+      <w:r>
+        <w:t xml:space="preserve">: an untethered root (no parent, not already</w:t>
+      </w:r>
+      <w:r>
+        <w:t xml:space="preserve"> </w:t>
+      </w:r>
+      <w:r>
+        <w:t xml:space="preserve">GPU-classified) walks down through any wrapper hop to its first real content, and inherits GPU</w:t>
+      </w:r>
+      <w:r>
+        <w:t xml:space="preserve"> </w:t>
+      </w:r>
+      <w:r>
+        <w:t xml:space="preserve">classification if that’s GPU/ROCm-runtime noise — deliberately independent of</w:t>
+      </w:r>
+      <w:r>
+        <w:t xml:space="preserve"> </w:t>
+      </w:r>
+      <w:r>
+        <w:rPr>
+          <w:rStyle w:val="VerbatimChar"/>
+        </w:rPr>
+        <w:t xml:space="preserve">--show-rocprofsys-internals</w:t>
+      </w:r>
+      <w:r>
+        <w:t xml:space="preserve">, so this subtree stays gated by</w:t>
+      </w:r>
+      <w:r>
+        <w:t xml:space="preserve"> </w:t>
+      </w:r>
+      <w:r>
+        <w:rPr>
+          <w:rStyle w:val="VerbatimChar"/>
+        </w:rPr>
+        <w:t xml:space="preserve">--show-gpu-api</w:t>
+      </w:r>
+      <w:r>
+        <w:t xml:space="preserve"> </w:t>
+      </w:r>
+      <w:r>
+        <w:t xml:space="preserve">alone, consistent</w:t>
+      </w:r>
+      <w:r>
+        <w:t xml:space="preserve"> </w:t>
+      </w:r>
+      <w:r>
+        <w:t xml:space="preserve">with every other GPU-noise block. New fixture data (a second, unrelated thread-3 root reproducing</w:t>
+      </w:r>
+      <w:r>
+        <w:t xml:space="preserve"> </w:t>
+      </w:r>
+      <w:r>
+        <w:t xml:space="preserve">the exact real shape) added to</w:t>
+      </w:r>
+      <w:r>
+        <w:t xml:space="preserve"> </w:t>
+      </w:r>
+      <w:r>
+        <w:rPr>
+          <w:rStyle w:val="VerbatimChar"/>
+        </w:rPr>
+        <w:t xml:space="preserve">calltree_sampling_filters</w:t>
+      </w:r>
+      <w:r>
+        <w:t xml:space="preserve">; suite grew to 264 tests. Re-verified</w:t>
+      </w:r>
+      <w:r>
+        <w:t xml:space="preserve"> </w:t>
+      </w:r>
+      <w:r>
+        <w:t xml:space="preserve">against both real directories:</w:t>
+      </w:r>
+      <w:r>
+        <w:t xml:space="preserve"> </w:t>
+      </w:r>
+      <w:r>
+        <w:rPr>
+          <w:rStyle w:val="VerbatimChar"/>
+        </w:rPr>
+        <w:t xml:space="preserve">start_thread</w:t>
+      </w:r>
+      <w:r>
+        <w:t xml:space="preserve"> </w:t>
+      </w:r>
+      <w:r>
+        <w:t xml:space="preserve">no longer appears by default, reappears correctly</w:t>
+      </w:r>
+      <w:r>
+        <w:t xml:space="preserve"> </w:t>
+      </w:r>
+      <w:r>
+        <w:t xml:space="preserve">under</w:t>
+      </w:r>
+      <w:r>
+        <w:t xml:space="preserve"> </w:t>
+      </w:r>
+      <w:r>
+        <w:rPr>
+          <w:rStyle w:val="VerbatimChar"/>
+        </w:rPr>
+        <w:t xml:space="preserve">--show-gpu-api</w:t>
+      </w:r>
+      <w:r>
+        <w:t xml:space="preserve">.</w:t>
+      </w:r>
+    </w:p>
+    <w:p>
+      <w:pPr>
+        <w:pStyle w:val="BodyText"/>
+      </w:pPr>
+      <w:r>
+        <w:rPr>
+          <w:bCs/>
+          <w:b/>
+        </w:rPr>
+        <w:t xml:space="preserve">Fifth and sixth real-data-driven fixes, both raised by the user after reviewing the delivered</w:t>
+      </w:r>
+      <w:r>
+        <w:rPr>
+          <w:bCs/>
+          <w:b/>
+        </w:rPr>
+        <w:t xml:space="preserve"> </w:t>
+      </w:r>
+      <w:r>
+        <w:rPr>
+          <w:rStyle w:val="VerbatimChar"/>
+          <w:bCs/>
+          <w:b/>
+        </w:rPr>
+        <w:t xml:space="preserve">calltree.txt</w:t>
+      </w:r>
+      <w:r>
+        <w:rPr>
+          <w:bCs/>
+          <w:b/>
+        </w:rPr>
+        <w:t xml:space="preserve">.</w:t>
+      </w:r>
+      <w:r>
+        <w:t xml:space="preserve"> </w:t>
+      </w:r>
+      <w:r>
+        <w:t xml:space="preserve">(5) GPU kernel data was landing at the</w:t>
+      </w:r>
+      <w:r>
+        <w:t xml:space="preserve"> </w:t>
+      </w:r>
+      <w:r>
+        <w:rPr>
+          <w:iCs/>
+          <w:i/>
+        </w:rPr>
+        <w:t xml:space="preserve">nearest launch-call ancestor</w:t>
+      </w:r>
+      <w:r>
+        <w:t xml:space="preserve"> </w:t>
+      </w:r>
+      <w:r>
+        <w:t xml:space="preserve">— a purely</w:t>
+      </w:r>
+      <w:r>
+        <w:t xml:space="preserve"> </w:t>
+      </w:r>
+      <w:r>
+        <w:t xml:space="preserve">structural guess — even though the compiler had already told this tool exactly which subroutine</w:t>
+      </w:r>
+      <w:r>
+        <w:t xml:space="preserve"> </w:t>
+      </w:r>
+      <w:r>
+        <w:t xml:space="preserve">each kernel came from: Cray’s OpenACC/HIP-offload kernel naming embeds the enclosing subroutine</w:t>
+      </w:r>
+      <w:r>
+        <w:t xml:space="preserve"> </w:t>
+      </w:r>
+      <w:r>
+        <w:t xml:space="preserve">directly in the kernel name (</w:t>
+      </w:r>
+      <w:r>
+        <w:rPr>
+          <w:rStyle w:val="VerbatimChar"/>
+        </w:rPr>
+        <w:t xml:space="preserve">&lt;subroutine&gt;$&lt;module&gt;_mod_$ck_L&lt;line&gt;_&lt;n&gt;[...]</w:t>
+      </w:r>
+      <w:r>
+        <w:t xml:space="preserve">). Checked against</w:t>
+      </w:r>
+      <w:r>
+        <w:t xml:space="preserve"> </w:t>
+      </w:r>
+      <w:r>
+        <w:t xml:space="preserve">real</w:t>
+      </w:r>
+      <w:r>
+        <w:t xml:space="preserve"> </w:t>
+      </w:r>
+      <w:r>
+        <w:rPr>
+          <w:rStyle w:val="VerbatimChar"/>
+        </w:rPr>
+        <w:t xml:space="preserve">rocprofv3</w:t>
+      </w:r>
+      <w:r>
+        <w:t xml:space="preserve"> </w:t>
+      </w:r>
+      <w:r>
+        <w:t xml:space="preserve">kernel names and the real CPU tree:</w:t>
+      </w:r>
+      <w:r>
+        <w:t xml:space="preserve"> </w:t>
+      </w:r>
+      <w:r>
+        <w:rPr>
+          <w:bCs/>
+          <w:b/>
+        </w:rPr>
+        <w:t xml:space="preserve">every</w:t>
+      </w:r>
+      <w:r>
+        <w:t xml:space="preserve"> </w:t>
+      </w:r>
+      <w:r>
+        <w:t xml:space="preserve">kernel’s owner subroutine showed up</w:t>
+      </w:r>
+      <w:r>
+        <w:t xml:space="preserve"> </w:t>
+      </w:r>
+      <w:r>
+        <w:t xml:space="preserve">as its own sampled CPU node (10/10 checked). The old proportional-split logic was scattering every</w:t>
+      </w:r>
+      <w:r>
+        <w:t xml:space="preserve"> </w:t>
+      </w:r>
+      <w:r>
+        <w:t xml:space="preserve">kernel across every launch-call anchor in the whole rank, weighted by call count, regardless of</w:t>
+      </w:r>
+      <w:r>
+        <w:t xml:space="preserve"> </w:t>
+      </w:r>
+      <w:r>
+        <w:t xml:space="preserve">which subroutine actually contained it — real output showed</w:t>
+      </w:r>
+      <w:r>
+        <w:t xml:space="preserve"> </w:t>
+      </w:r>
+      <w:r>
+        <w:rPr>
+          <w:rStyle w:val="VerbatimChar"/>
+        </w:rPr>
+        <w:t xml:space="preserve">jacobi_sweep</w:t>
+      </w:r>
+      <w:r>
+        <w:t xml:space="preserve">’s kernel duplicated</w:t>
+      </w:r>
+      <w:r>
+        <w:t xml:space="preserve"> </w:t>
+      </w:r>
+      <w:r>
+        <w:t xml:space="preserve">under</w:t>
+      </w:r>
+      <w:r>
+        <w:t xml:space="preserve"> </w:t>
+      </w:r>
+      <w:r>
+        <w:rPr>
+          <w:rStyle w:val="VerbatimChar"/>
+        </w:rPr>
+        <w:t xml:space="preserve">convection_stable_dt</w:t>
+      </w:r>
+      <w:r>
+        <w:t xml:space="preserve">,</w:t>
+      </w:r>
+      <w:r>
+        <w:t xml:space="preserve"> </w:t>
+      </w:r>
+      <w:r>
+        <w:rPr>
+          <w:rStyle w:val="VerbatimChar"/>
+        </w:rPr>
+        <w:t xml:space="preserve">compute_momentum_rhs</w:t>
+      </w:r>
+      <w:r>
+        <w:t xml:space="preserve">, and every other unrelated anchor at once,</w:t>
+      </w:r>
+      <w:r>
+        <w:t xml:space="preserve"> </w:t>
+      </w:r>
+      <w:r>
+        <w:t xml:space="preserve">each copy scaled down and labeled</w:t>
+      </w:r>
+      <w:r>
+        <w:t xml:space="preserve"> </w:t>
+      </w:r>
+      <w:r>
+        <w:t xml:space="preserve">“</w:t>
+      </w:r>
+      <w:r>
+        <w:t xml:space="preserve">~N% estimate.</w:t>
+      </w:r>
+      <w:r>
+        <w:t xml:space="preserve">”</w:t>
+      </w:r>
+      <w:r>
+        <w:t xml:space="preserve"> </w:t>
+      </w:r>
+      <w:r>
+        <w:t xml:space="preserve">Fixed by adding</w:t>
+      </w:r>
+      <w:r>
+        <w:t xml:space="preserve"> </w:t>
+      </w:r>
+      <w:r>
+        <w:rPr>
+          <w:rStyle w:val="VerbatimChar"/>
+        </w:rPr>
+        <w:t xml:space="preserve">kernel_owner_label()</w:t>
+      </w:r>
+      <w:r>
+        <w:t xml:space="preserve"> </w:t>
+      </w:r>
+      <w:r>
+        <w:t xml:space="preserve">to</w:t>
+      </w:r>
+      <w:r>
+        <w:t xml:space="preserve"> </w:t>
+      </w:r>
+      <w:r>
+        <w:rPr>
+          <w:rStyle w:val="VerbatimChar"/>
+        </w:rPr>
+        <w:t xml:space="preserve">calltree_common.py</w:t>
+      </w:r>
+      <w:r>
+        <w:t xml:space="preserve"> </w:t>
+      </w:r>
+      <w:r>
+        <w:t xml:space="preserve">and rewriting</w:t>
+      </w:r>
+      <w:r>
+        <w:t xml:space="preserve"> </w:t>
+      </w:r>
+      <w:r>
+        <w:rPr>
+          <w:rStyle w:val="VerbatimChar"/>
+        </w:rPr>
+        <w:t xml:space="preserve">attach_kernel_summaries()</w:t>
+      </w:r>
+      <w:r>
+        <w:t xml:space="preserve"> </w:t>
+      </w:r>
+      <w:r>
+        <w:t xml:space="preserve">to try an</w:t>
+      </w:r>
+      <w:r>
+        <w:t xml:space="preserve"> </w:t>
+      </w:r>
+      <w:r>
+        <w:rPr>
+          <w:bCs/>
+          <w:b/>
+        </w:rPr>
+        <w:t xml:space="preserve">exact label match</w:t>
+      </w:r>
+      <w:r>
+        <w:t xml:space="preserve"> </w:t>
+      </w:r>
+      <w:r>
+        <w:t xml:space="preserve">against the kernel’s compiler-embedded owner first, falling back to the old nearest-launch-anchor</w:t>
+      </w:r>
+      <w:r>
+        <w:t xml:space="preserve"> </w:t>
+      </w:r>
+      <w:r>
+        <w:t xml:space="preserve">heuristic only for a kernel that doesn’t name-match anything (no Cray-style naming, or its owner</w:t>
+      </w:r>
+      <w:r>
+        <w:t xml:space="preserve"> </w:t>
+      </w:r>
+      <w:r>
+        <w:t xml:space="preserve">subroutine wasn’t sampled as its own frame this rank). Return contract changed from an</w:t>
+      </w:r>
+      <w:r>
+        <w:t xml:space="preserve"> </w:t>
+      </w:r>
+      <w:r>
+        <w:t xml:space="preserve">all-or-nothing</w:t>
+      </w:r>
+      <w:r>
+        <w:t xml:space="preserve"> </w:t>
+      </w:r>
+      <w:r>
+        <w:t xml:space="preserve">“</w:t>
+      </w:r>
+      <w:r>
+        <w:t xml:space="preserve">found an anchor</w:t>
+      </w:r>
+      <w:r>
+        <w:t xml:space="preserve">”</w:t>
+      </w:r>
+      <w:r>
+        <w:t xml:space="preserve"> </w:t>
+      </w:r>
+      <w:r>
+        <w:t xml:space="preserve">boolean to the actual subset of kernels that couldn’t be placed</w:t>
+      </w:r>
+      <w:r>
+        <w:t xml:space="preserve"> </w:t>
+      </w:r>
+      <w:r>
+        <w:t xml:space="preserve">anywhere, so a partial name-match doesn’t dump the rest into the top-level fallback section</w:t>
+      </w:r>
+      <w:r>
+        <w:t xml:space="preserve"> </w:t>
+      </w:r>
+      <w:r>
+        <w:t xml:space="preserve">needlessly. On the real</w:t>
+      </w:r>
+      <w:r>
+        <w:t xml:space="preserve"> </w:t>
+      </w:r>
+      <w:r>
+        <w:rPr>
+          <w:rStyle w:val="VerbatimChar"/>
+        </w:rPr>
+        <w:t xml:space="preserve">Heat_Convection_Solver</w:t>
+      </w:r>
+      <w:r>
+        <w:t xml:space="preserve"> </w:t>
+      </w:r>
+      <w:r>
+        <w:t xml:space="preserve">data this cut</w:t>
+      </w:r>
+      <w:r>
+        <w:t xml:space="preserve"> </w:t>
+      </w:r>
+      <w:r>
+        <w:rPr>
+          <w:rStyle w:val="VerbatimChar"/>
+        </w:rPr>
+        <w:t xml:space="preserve">calltree.txt</w:t>
+      </w:r>
+      <w:r>
+        <w:t xml:space="preserve"> </w:t>
+      </w:r>
+      <w:r>
+        <w:t xml:space="preserve">from 1618 to 370</w:t>
+      </w:r>
+      <w:r>
+        <w:t xml:space="preserve"> </w:t>
+      </w:r>
+      <w:r>
+        <w:t xml:space="preserve">lines — not from hiding anything, but from no longer duplicating the same real kernels across</w:t>
+      </w:r>
+      <w:r>
+        <w:t xml:space="preserve"> </w:t>
+      </w:r>
+      <w:r>
+        <w:t xml:space="preserve">every plausible anchor.</w:t>
+      </w:r>
+    </w:p>
+    <w:p>
+      <w:pPr>
+        <w:numPr>
+          <w:ilvl w:val="0"/>
+          <w:numId w:val="1006"/>
+        </w:numPr>
+        <w:pStyle w:val="Compact"/>
+      </w:pPr>
+      <w:r>
+        <w:t xml:space="preserve">The</w:t>
+      </w:r>
+      <w:r>
+        <w:t xml:space="preserve"> </w:t>
+      </w:r>
+      <w:r>
+        <w:rPr>
+          <w:rStyle w:val="VerbatimChar"/>
+        </w:rPr>
+        <w:t xml:space="preserve">WALL(s)</w:t>
+      </w:r>
+      <w:r>
+        <w:t xml:space="preserve"> </w:t>
+      </w:r>
+      <w:r>
+        <w:t xml:space="preserve">cross-reference column was</w:t>
+      </w:r>
+      <w:r>
+        <w:t xml:space="preserve"> </w:t>
+      </w:r>
+      <w:r>
+        <w:t xml:space="preserve">“</w:t>
+      </w:r>
+      <w:r>
+        <w:t xml:space="preserve">-</w:t>
+      </w:r>
+      <w:r>
+        <w:t xml:space="preserve">”</w:t>
+      </w:r>
+      <w:r>
+        <w:t xml:space="preserve"> </w:t>
+      </w:r>
+      <w:r>
+        <w:t xml:space="preserve">almost everywhere, which the user correctly</w:t>
+      </w:r>
+      <w:r>
+        <w:t xml:space="preserve"> </w:t>
+      </w:r>
+      <w:r>
+        <w:t xml:space="preserve">suspected was because visible nodes were being looked up by their own exact label only, while the</w:t>
+      </w:r>
+      <w:r>
+        <w:t xml:space="preserve"> </w:t>
+      </w:r>
+      <w:r>
+        <w:t xml:space="preserve">real wall_clock-measured time for the same underlying call often sits on a</w:t>
+      </w:r>
+      <w:r>
+        <w:t xml:space="preserve"> </w:t>
+      </w:r>
+      <w:r>
+        <w:rPr>
+          <w:iCs/>
+          <w:i/>
+        </w:rPr>
+        <w:t xml:space="preserve">different, hidden</w:t>
+      </w:r>
+      <w:r>
+        <w:t xml:space="preserve"> </w:t>
+      </w:r>
+      <w:r>
+        <w:t xml:space="preserve">node just beneath it (rocprof-sys’s own instrumentation hides the wall_clock-matching label behind</w:t>
+      </w:r>
+      <w:r>
+        <w:t xml:space="preserve"> </w:t>
+      </w:r>
+      <w:r>
+        <w:t xml:space="preserve">whichever filter tier applies — MPI internals collapsed, GPU-API pruned, etc.). The user’s own fix:</w:t>
+      </w:r>
+      <w:r>
+        <w:t xml:space="preserve"> </w:t>
+      </w:r>
+      <w:r>
+        <w:t xml:space="preserve">compute the wall value before filtering, and when a line is filtered, fold its value into its</w:t>
+      </w:r>
+      <w:r>
+        <w:t xml:space="preserve"> </w:t>
+      </w:r>
+      <w:r>
+        <w:t xml:space="preserve">direct parent’s. Implemented as a two-pass system in</w:t>
+      </w:r>
+      <w:r>
+        <w:t xml:space="preserve"> </w:t>
+      </w:r>
+      <w:r>
+        <w:rPr>
+          <w:rStyle w:val="VerbatimChar"/>
+        </w:rPr>
+        <w:t xml:space="preserve">extract_calltree.py</w:t>
+      </w:r>
+      <w:r>
+        <w:t xml:space="preserve">:</w:t>
+      </w:r>
+      <w:r>
+        <w:t xml:space="preserve"> </w:t>
+      </w:r>
+      <w:r>
+        <w:rPr>
+          <w:rStyle w:val="VerbatimChar"/>
+        </w:rPr>
+        <w:t xml:space="preserve">compute_hidden_flags()</w:t>
+      </w:r>
+      <w:r>
+        <w:t xml:space="preserve"> </w:t>
+      </w:r>
+      <w:r>
+        <w:t xml:space="preserve">(a forward, pre-order pass) tags every row with whether it will render at all under the current</w:t>
+      </w:r>
+      <w:r>
+        <w:t xml:space="preserve"> </w:t>
+      </w:r>
+      <w:r>
+        <w:t xml:space="preserve">flags, and separately whether it hides its</w:t>
+      </w:r>
+      <w:r>
+        <w:t xml:space="preserve"> </w:t>
+      </w:r>
+      <w:r>
+        <w:rPr>
+          <w:iCs/>
+          <w:i/>
+        </w:rPr>
+        <w:t xml:space="preserve">entire</w:t>
+      </w:r>
+      <w:r>
+        <w:t xml:space="preserve"> </w:t>
+      </w:r>
+      <w:r>
+        <w:t xml:space="preserve">subtree — true for PRUNE and MPI-COLLAPSE, but</w:t>
+      </w:r>
+      <w:r>
+        <w:t xml:space="preserve"> </w:t>
+      </w:r>
+      <w:r>
+        <w:t xml:space="preserve">deliberately false for SPLICE, since a spliced wrapper’s children are reparented and shown</w:t>
+      </w:r>
+      <w:r>
+        <w:t xml:space="preserve"> </w:t>
+      </w:r>
+      <w:r>
+        <w:t xml:space="preserve">normally, not hidden along with it.</w:t>
+      </w:r>
+      <w:r>
+        <w:t xml:space="preserve"> </w:t>
+      </w:r>
+      <w:r>
+        <w:rPr>
+          <w:rStyle w:val="VerbatimChar"/>
+        </w:rPr>
+        <w:t xml:space="preserve">fold_hidden_wall_values()</w:t>
+      </w:r>
+      <w:r>
+        <w:t xml:space="preserve"> </w:t>
+      </w:r>
+      <w:r>
+        <w:t xml:space="preserve">(a reverse-order pass, exploiting</w:t>
+      </w:r>
+      <w:r>
+        <w:t xml:space="preserve"> </w:t>
+      </w:r>
+      <w:r>
+        <w:t xml:space="preserve">that every descendant precedes its ancestor in a pre-order list) then adds each hidden row’s</w:t>
+      </w:r>
+      <w:r>
+        <w:t xml:space="preserve"> </w:t>
+      </w:r>
+      <w:r>
+        <w:rPr>
+          <w:rStyle w:val="VerbatimChar"/>
+        </w:rPr>
+        <w:t xml:space="preserve">WALL(s)</w:t>
+      </w:r>
+      <w:r>
+        <w:t xml:space="preserve"> </w:t>
+      </w:r>
+      <w:r>
+        <w:t xml:space="preserve">value into its direct parent’s and clears it, cascading correctly through an arbitrarily</w:t>
+      </w:r>
+      <w:r>
+        <w:t xml:space="preserve"> </w:t>
+      </w:r>
+      <w:r>
+        <w:t xml:space="preserve">deep hidden chain to whichever ancestor actually renders. Confirmed against real data:</w:t>
+      </w:r>
+      <w:r>
+        <w:t xml:space="preserve"> </w:t>
+      </w:r>
+      <w:r>
+        <w:rPr>
+          <w:rStyle w:val="VerbatimChar"/>
+        </w:rPr>
+        <w:t xml:space="preserve">MPI_Isend</w:t>
+      </w:r>
+      <w:r>
+        <w:t xml:space="preserve"> </w:t>
+      </w:r>
+      <w:r>
+        <w:t xml:space="preserve">GOTCHA-hooked self-time (10.580366s in</w:t>
+      </w:r>
+      <w:r>
+        <w:t xml:space="preserve"> </w:t>
+      </w:r>
+      <w:r>
+        <w:rPr>
+          <w:rStyle w:val="VerbatimChar"/>
+        </w:rPr>
+        <w:t xml:space="preserve">wall_clock</w:t>
+      </w:r>
+      <w:r>
+        <w:t xml:space="preserve">) now surfaces correctly on the visible</w:t>
+      </w:r>
+      <w:r>
+        <w:t xml:space="preserve"> </w:t>
+      </w:r>
+      <w:r>
+        <w:rPr>
+          <w:rStyle w:val="VerbatimChar"/>
+        </w:rPr>
+        <w:t xml:space="preserve">mpi_isend_f08ts_</w:t>
+      </w:r>
+      <w:r>
+        <w:t xml:space="preserve"> </w:t>
+      </w:r>
+      <w:r>
+        <w:t xml:space="preserve">node — the Fortran binding shim sampling shows instead — despite the two labels</w:t>
+      </w:r>
+      <w:r>
+        <w:t xml:space="preserve"> </w:t>
+      </w:r>
+      <w:r>
+        <w:t xml:space="preserve">never matching directly.</w:t>
+      </w:r>
+    </w:p>
+    <w:p>
+      <w:pPr>
+        <w:pStyle w:val="FirstParagraph"/>
+      </w:pPr>
+      <w:r>
+        <w:t xml:space="preserve">New fixtures</w:t>
+      </w:r>
+      <w:r>
+        <w:t xml:space="preserve"> </w:t>
+      </w:r>
+      <w:r>
+        <w:rPr>
+          <w:rStyle w:val="VerbatimChar"/>
+        </w:rPr>
+        <w:t xml:space="preserve">calltree_sampling_mpi_cascade</w:t>
+      </w:r>
+      <w:r>
+        <w:t xml:space="preserve"> </w:t>
+      </w:r>
+      <w:r>
+        <w:t xml:space="preserve">(a 3-level MPI-collapsed chain with a real wall_clock</w:t>
+      </w:r>
+      <w:r>
+        <w:t xml:space="preserve"> </w:t>
+      </w:r>
+      <w:r>
+        <w:t xml:space="preserve">value at the bottom, pinning the cascade) plus kernel-owner-matching cases added directly to</w:t>
+      </w:r>
+      <w:r>
+        <w:t xml:space="preserve"> </w:t>
+      </w:r>
+      <w:r>
+        <w:rPr>
+          <w:rStyle w:val="VerbatimChar"/>
+        </w:rPr>
+        <w:t xml:space="preserve">test_calltree_common.py</w:t>
+      </w:r>
+      <w:r>
+        <w:t xml:space="preserve">; suite grew to 271 tests, all green; the two existing fixture-based WALL</w:t>
+      </w:r>
+      <w:r>
+        <w:t xml:space="preserve"> </w:t>
+      </w:r>
+      <w:r>
+        <w:t xml:space="preserve">tests were updated for the new fold-inclusive expected values (the assertions changed, not just</w:t>
+      </w:r>
+      <w:r>
+        <w:t xml:space="preserve"> </w:t>
+      </w:r>
+      <w:r>
+        <w:t xml:space="preserve">grew, since the column’s meaning materially changed). Re-verified against both real directories.</w:t>
+      </w:r>
+    </w:p>
     <w:bookmarkEnd w:id="52"/>
+    <w:bookmarkStart w:id="53" w:name="Xa9050fea7499e5ad94d249579bbd1715c94a71d"/>
+    <w:p>
+      <w:pPr>
+        <w:pStyle w:val="Heading2"/>
+      </w:pPr>
+      <w:r>
+        <w:t xml:space="preserve">2026-08-11 — Cross-rank aggregation for both calltree tools; dropped</w:t>
+      </w:r>
+      <w:r>
+        <w:t xml:space="preserve"> </w:t>
+      </w:r>
+      <w:r>
+        <w:rPr>
+          <w:rStyle w:val="VerbatimChar"/>
+        </w:rPr>
+        <w:t xml:space="preserve">WALL(s)</w:t>
+      </w:r>
+    </w:p>
+    <w:p>
+      <w:pPr>
+        <w:pStyle w:val="FirstParagraph"/>
+      </w:pPr>
+      <w:r>
+        <w:t xml:space="preserve">Two follow-up requests after the user reviewed the delivered</w:t>
+      </w:r>
+      <w:r>
+        <w:t xml:space="preserve"> </w:t>
+      </w:r>
+      <w:r>
+        <w:rPr>
+          <w:rStyle w:val="VerbatimChar"/>
+        </w:rPr>
+        <w:t xml:space="preserve">calltree.txt</w:t>
+      </w:r>
+      <w:r>
+        <w:t xml:space="preserve"> </w:t>
+      </w:r>
+      <w:r>
+        <w:t xml:space="preserve">from the kernel-name-</w:t>
+      </w:r>
+      <w:r>
+        <w:t xml:space="preserve"> </w:t>
+      </w:r>
+      <w:r>
+        <w:t xml:space="preserve">matching/</w:t>
+      </w:r>
+      <w:r>
+        <w:rPr>
+          <w:rStyle w:val="VerbatimChar"/>
+        </w:rPr>
+        <w:t xml:space="preserve">WALL(s)</w:t>
+      </w:r>
+      <w:r>
+        <w:t xml:space="preserve">-fold round above. First:</w:t>
+      </w:r>
+      <w:r>
+        <w:t xml:space="preserve"> </w:t>
+      </w:r>
+      <w:r>
+        <w:rPr>
+          <w:rStyle w:val="VerbatimChar"/>
+          <w:bCs/>
+          <w:b/>
+        </w:rPr>
+        <w:t xml:space="preserve">WALL(s)</w:t>
+      </w:r>
+      <w:r>
+        <w:rPr>
+          <w:bCs/>
+          <w:b/>
+        </w:rPr>
+        <w:t xml:space="preserve"> </w:t>
+      </w:r>
+      <w:r>
+        <w:rPr>
+          <w:bCs/>
+          <w:b/>
+        </w:rPr>
+        <w:t xml:space="preserve">wasn’t worth keeping</w:t>
+      </w:r>
+      <w:r>
+        <w:t xml:space="preserve"> </w:t>
+      </w:r>
+      <w:r>
+        <w:t xml:space="preserve">— even with the</w:t>
+      </w:r>
+      <w:r>
+        <w:t xml:space="preserve"> </w:t>
+      </w:r>
+      <w:r>
+        <w:t xml:space="preserve">fold-up fix, it stayed mostly</w:t>
+      </w:r>
+      <w:r>
+        <w:t xml:space="preserve"> </w:t>
+      </w:r>
+      <w:r>
+        <w:rPr>
+          <w:rStyle w:val="VerbatimChar"/>
+        </w:rPr>
+        <w:t xml:space="preserve">-</w:t>
+      </w:r>
+      <w:r>
+        <w:t xml:space="preserve"> </w:t>
+      </w:r>
+      <w:r>
+        <w:t xml:space="preserve">on real data (GOTCHA-hooked C symbols and the compiler-generated</w:t>
+      </w:r>
+      <w:r>
+        <w:t xml:space="preserve"> </w:t>
+      </w:r>
+      <w:r>
+        <w:t xml:space="preserve">wrapper names sampling shows rarely coincide), and</w:t>
+      </w:r>
+      <w:r>
+        <w:t xml:space="preserve"> </w:t>
+      </w:r>
+      <w:r>
+        <w:rPr>
+          <w:rStyle w:val="VerbatimChar"/>
+        </w:rPr>
+        <w:t xml:space="preserve">extract_calltree_traced.py</w:t>
+      </w:r>
+      <w:r>
+        <w:t xml:space="preserve"> </w:t>
+      </w:r>
+      <w:r>
+        <w:t xml:space="preserve">already provides</w:t>
+      </w:r>
+      <w:r>
+        <w:t xml:space="preserve"> </w:t>
+      </w:r>
+      <w:r>
+        <w:t xml:space="preserve">exact wall-clock timing as its own dedicated tool. Removed entirely from</w:t>
+      </w:r>
+      <w:r>
+        <w:t xml:space="preserve"> </w:t>
+      </w:r>
+      <w:r>
+        <w:rPr>
+          <w:rStyle w:val="VerbatimChar"/>
+        </w:rPr>
+        <w:t xml:space="preserve">extract_calltree.py</w:t>
+      </w:r>
+      <w:r>
+        <w:t xml:space="preserve">:</w:t>
+      </w:r>
+      <w:r>
+        <w:t xml:space="preserve"> </w:t>
+      </w:r>
+      <w:r>
+        <w:rPr>
+          <w:rStyle w:val="VerbatimChar"/>
+        </w:rPr>
+        <w:t xml:space="preserve">wall_clock_self_by_rank()</w:t>
+      </w:r>
+      <w:r>
+        <w:t xml:space="preserve">,</w:t>
+      </w:r>
+      <w:r>
+        <w:t xml:space="preserve"> </w:t>
+      </w:r>
+      <w:r>
+        <w:rPr>
+          <w:rStyle w:val="VerbatimChar"/>
+        </w:rPr>
+        <w:t xml:space="preserve">compute_hidden_flags()</w:t>
+      </w:r>
+      <w:r>
+        <w:t xml:space="preserve">,</w:t>
+      </w:r>
+      <w:r>
+        <w:t xml:space="preserve"> </w:t>
+      </w:r>
+      <w:r>
+        <w:rPr>
+          <w:rStyle w:val="VerbatimChar"/>
+        </w:rPr>
+        <w:t xml:space="preserve">fold_hidden_wall_values()</w:t>
+      </w:r>
+      <w:r>
+        <w:t xml:space="preserve">, the 4th report</w:t>
+      </w:r>
+      <w:r>
+        <w:t xml:space="preserve"> </w:t>
+      </w:r>
+      <w:r>
+        <w:t xml:space="preserve">column, and every related caveat/help-text paragraph.</w:t>
+      </w:r>
+    </w:p>
+    <w:p>
+      <w:pPr>
+        <w:pStyle w:val="BodyText"/>
+      </w:pPr>
+      <w:r>
+        <w:t xml:space="preserve">Second, and larger:</w:t>
+      </w:r>
+      <w:r>
+        <w:t xml:space="preserve"> </w:t>
+      </w:r>
+      <w:r>
+        <w:rPr>
+          <w:bCs/>
+          <w:b/>
+        </w:rPr>
+        <w:t xml:space="preserve">aggregate every rank into one call tree, with load-balance columns, instead</w:t>
+      </w:r>
+      <w:r>
+        <w:rPr>
+          <w:bCs/>
+          <w:b/>
+        </w:rPr>
+        <w:t xml:space="preserve"> </w:t>
+      </w:r>
+      <w:r>
+        <w:rPr>
+          <w:bCs/>
+          <w:b/>
+        </w:rPr>
+        <w:t xml:space="preserve">of printing one call tree per rank</w:t>
+      </w:r>
+      <w:r>
+        <w:t xml:space="preserve"> </w:t>
+      </w:r>
+      <w:r>
+        <w:t xml:space="preserve">— for both tools. Implemented as new shared machinery in</w:t>
+      </w:r>
+      <w:r>
+        <w:t xml:space="preserve"> </w:t>
+      </w:r>
+      <w:r>
+        <w:rPr>
+          <w:rStyle w:val="VerbatimChar"/>
+        </w:rPr>
+        <w:t xml:space="preserve">calltree_common.py</w:t>
+      </w:r>
+      <w:r>
+        <w:t xml:space="preserve">:</w:t>
+      </w:r>
+    </w:p>
+    <w:p>
+      <w:pPr>
+        <w:numPr>
+          <w:ilvl w:val="0"/>
+          <w:numId w:val="1007"/>
+        </w:numPr>
+        <w:pStyle w:val="Compact"/>
+      </w:pPr>
+      <w:r>
+        <w:rPr>
+          <w:rStyle w:val="VerbatimChar"/>
+        </w:rPr>
+        <w:t xml:space="preserve">merge_rank_trees(ranks)</w:t>
+      </w:r>
+      <w:r>
+        <w:t xml:space="preserve"> </w:t>
+      </w:r>
+      <w:r>
+        <w:t xml:space="preserve">— merges N independent per-rank trees (each rank’s rows are separate</w:t>
+      </w:r>
+      <w:r>
+        <w:t xml:space="preserve"> </w:t>
+      </w:r>
+      <w:r>
+        <w:t xml:space="preserve">Python objects, parsed from separate files, never the same object) into one, by walking every</w:t>
+      </w:r>
+      <w:r>
+        <w:t xml:space="preserve"> </w:t>
+      </w:r>
+      <w:r>
+        <w:t xml:space="preserve">rank’s tree top-down and matching children by LABEL under the already-matched merged parent —</w:t>
+      </w:r>
+      <w:r>
+        <w:t xml:space="preserve"> </w:t>
+      </w:r>
+      <w:r>
+        <w:t xml:space="preserve">reliable because the same binary produces the same call structure on every rank, even though</w:t>
+      </w:r>
+      <w:r>
+        <w:t xml:space="preserve"> </w:t>
+      </w:r>
+      <w:r>
+        <w:t xml:space="preserve">there’s no object identity to match by. Each merged node keeps a</w:t>
+      </w:r>
+      <w:r>
+        <w:t xml:space="preserve"> </w:t>
+      </w:r>
+      <w:r>
+        <w:rPr>
+          <w:rStyle w:val="VerbatimChar"/>
+        </w:rPr>
+        <w:t xml:space="preserve">per_rank</w:t>
+      </w:r>
+      <w:r>
+        <w:t xml:space="preserve"> </w:t>
+      </w:r>
+      <w:r>
+        <w:t xml:space="preserve">dict</w:t>
+      </w:r>
+      <w:r>
+        <w:t xml:space="preserve"> </w:t>
+      </w:r>
+      <w:r>
+        <w:t xml:space="preserve">(</w:t>
+      </w:r>
+      <w:r>
+        <w:rPr>
+          <w:rStyle w:val="VerbatimChar"/>
+        </w:rPr>
+        <w:t xml:space="preserve">{rank_key: {count, self_sum, sum}}</w:t>
+      </w:r>
+      <w:r>
+        <w:t xml:space="preserve">) instead of flat fields, plus a real</w:t>
+      </w:r>
+      <w:r>
+        <w:t xml:space="preserve"> </w:t>
+      </w:r>
+      <w:r>
+        <w:rPr>
+          <w:rStyle w:val="VerbatimChar"/>
+        </w:rPr>
+        <w:t xml:space="preserve">parent</w:t>
+      </w:r>
+      <w:r>
+        <w:t xml:space="preserve"> </w:t>
+      </w:r>
+      <w:r>
+        <w:t xml:space="preserve">pointer (so</w:t>
+      </w:r>
+      <w:r>
+        <w:t xml:space="preserve"> </w:t>
+      </w:r>
+      <w:r>
+        <w:rPr>
+          <w:rStyle w:val="VerbatimChar"/>
+        </w:rPr>
+        <w:t xml:space="preserve">nearest_visible_ancestor()</w:t>
+      </w:r>
+      <w:r>
+        <w:t xml:space="preserve"> </w:t>
+      </w:r>
+      <w:r>
+        <w:t xml:space="preserve">and friends work completely unchanged against merged nodes) and</w:t>
+      </w:r>
+      <w:r>
+        <w:t xml:space="preserve"> </w:t>
+      </w:r>
+      <w:r>
+        <w:rPr>
+          <w:rStyle w:val="VerbatimChar"/>
+        </w:rPr>
+        <w:t xml:space="preserve">gpu</w:t>
+      </w:r>
+      <w:r>
+        <w:t xml:space="preserve">/</w:t>
+      </w:r>
+      <w:r>
+        <w:rPr>
+          <w:rStyle w:val="VerbatimChar"/>
+        </w:rPr>
+        <w:t xml:space="preserve">compiler_runtime</w:t>
+      </w:r>
+      <w:r>
+        <w:t xml:space="preserve">/</w:t>
+      </w:r>
+      <w:r>
+        <w:rPr>
+          <w:rStyle w:val="VerbatimChar"/>
+        </w:rPr>
+        <w:t xml:space="preserve">mpi_territory</w:t>
+      </w:r>
+      <w:r>
+        <w:t xml:space="preserve"> </w:t>
+      </w:r>
+      <w:r>
+        <w:t xml:space="preserve">OR’d across every contributing rank.</w:t>
+      </w:r>
+    </w:p>
+    <w:p>
+      <w:pPr>
+        <w:numPr>
+          <w:ilvl w:val="0"/>
+          <w:numId w:val="1007"/>
+        </w:numPr>
+        <w:pStyle w:val="Compact"/>
+      </w:pPr>
+      <w:r>
+        <w:rPr>
+          <w:rStyle w:val="VerbatimChar"/>
+        </w:rPr>
+        <w:t xml:space="preserve">aggregate_node_stats(per_rank, rank_keys)</w:t>
+      </w:r>
+      <w:r>
+        <w:t xml:space="preserve"> </w:t>
+      </w:r>
+      <w:r>
+        <w:t xml:space="preserve">—</w:t>
+      </w:r>
+      <w:r>
+        <w:t xml:space="preserve"> </w:t>
+      </w:r>
+      <w:r>
+        <w:rPr>
+          <w:rStyle w:val="VerbatimChar"/>
+        </w:rPr>
+        <w:t xml:space="preserve">{calls_avg, self_avg, self_std, self_min,   self_max, total_avg}</w:t>
+      </w:r>
+      <w:r>
+        <w:t xml:space="preserve"> </w:t>
+      </w:r>
+      <w:r>
+        <w:t xml:space="preserve">for one node across every rank, treating a rank missing from</w:t>
+      </w:r>
+      <w:r>
+        <w:t xml:space="preserve"> </w:t>
+      </w:r>
+      <w:r>
+        <w:rPr>
+          <w:rStyle w:val="VerbatimChar"/>
+        </w:rPr>
+        <w:t xml:space="preserve">per_rank</w:t>
+      </w:r>
+      <w:r>
+        <w:t xml:space="preserve"> </w:t>
+      </w:r>
+      <w:r>
+        <w:t xml:space="preserve">as</w:t>
+      </w:r>
+      <w:r>
+        <w:t xml:space="preserve"> </w:t>
+      </w:r>
+      <w:r>
+        <w:t xml:space="preserve">a genuine</w:t>
+      </w:r>
+      <w:r>
+        <w:t xml:space="preserve"> </w:t>
+      </w:r>
+      <w:r>
+        <w:rPr>
+          <w:rStyle w:val="VerbatimChar"/>
+        </w:rPr>
+        <w:t xml:space="preserve">0</w:t>
+      </w:r>
+      <w:r>
+        <w:t xml:space="preserve"> </w:t>
+      </w:r>
+      <w:r>
+        <w:t xml:space="preserve">(not omitted) — the same</w:t>
+      </w:r>
+      <w:r>
+        <w:t xml:space="preserve"> </w:t>
+      </w:r>
+      <w:r>
+        <w:t xml:space="preserve">“</w:t>
+      </w:r>
+      <w:r>
+        <w:t xml:space="preserve">missing is real, not skipped</w:t>
+      </w:r>
+      <w:r>
+        <w:t xml:space="preserve">”</w:t>
+      </w:r>
+      <w:r>
+        <w:t xml:space="preserve"> </w:t>
+      </w:r>
+      <w:r>
+        <w:t xml:space="preserve">rule</w:t>
+      </w:r>
+      <w:r>
+        <w:t xml:space="preserve"> </w:t>
+      </w:r>
+      <w:r>
+        <w:rPr>
+          <w:rStyle w:val="VerbatimChar"/>
+        </w:rPr>
+        <w:t xml:space="preserve">extract_CPU_hotspots.compute_load_imbalance()</w:t>
+      </w:r>
+      <w:r>
+        <w:t xml:space="preserve"> </w:t>
+      </w:r>
+      <w:r>
+        <w:t xml:space="preserve">already established for its own load-imbalance</w:t>
+      </w:r>
+      <w:r>
+        <w:t xml:space="preserve"> </w:t>
+      </w:r>
+      <w:r>
+        <w:t xml:space="preserve">tables, reused here rather than reinvented.</w:t>
+      </w:r>
+      <w:r>
+        <w:t xml:space="preserve"> </w:t>
+      </w:r>
+      <w:r>
+        <w:rPr>
+          <w:rStyle w:val="VerbatimChar"/>
+        </w:rPr>
+        <w:t xml:space="preserve">SELF</w:t>
+      </w:r>
+      <w:r>
+        <w:t xml:space="preserve"> </w:t>
+      </w:r>
+      <w:r>
+        <w:t xml:space="preserve">gets the full avg/std_dev/min/max breakdown</w:t>
+      </w:r>
+      <w:r>
+        <w:t xml:space="preserve"> </w:t>
+      </w:r>
+      <w:r>
+        <w:t xml:space="preserve">(matching that same precedent, which only ever does this for self-time, not inclusive time);</w:t>
+      </w:r>
+      <w:r>
+        <w:t xml:space="preserve"> </w:t>
+      </w:r>
+      <w:r>
+        <w:rPr>
+          <w:rStyle w:val="VerbatimChar"/>
+        </w:rPr>
+        <w:t xml:space="preserve">CALLS</w:t>
+      </w:r>
+      <w:r>
+        <w:t xml:space="preserve">/</w:t>
+      </w:r>
+      <w:r>
+        <w:rPr>
+          <w:rStyle w:val="VerbatimChar"/>
+        </w:rPr>
+        <w:t xml:space="preserve">TOTAL</w:t>
+      </w:r>
+      <w:r>
+        <w:t xml:space="preserve"> </w:t>
+      </w:r>
+      <w:r>
+        <w:t xml:space="preserve">are plain averages — a second full breakdown for inclusive time would mostly</w:t>
+      </w:r>
+      <w:r>
+        <w:t xml:space="preserve"> </w:t>
+      </w:r>
+      <w:r>
+        <w:t xml:space="preserve">restate whatever a node’s own children already show individually.</w:t>
+      </w:r>
+    </w:p>
+    <w:p>
+      <w:pPr>
+        <w:numPr>
+          <w:ilvl w:val="0"/>
+          <w:numId w:val="1007"/>
+        </w:numPr>
+        <w:pStyle w:val="Compact"/>
+      </w:pPr>
+      <w:r>
+        <w:rPr>
+          <w:rStyle w:val="VerbatimChar"/>
+        </w:rPr>
+        <w:t xml:space="preserve">flatten_tree(roots)</w:t>
+      </w:r>
+      <w:r>
+        <w:t xml:space="preserve"> </w:t>
+      </w:r>
+      <w:r>
+        <w:t xml:space="preserve">— turns the merged tree back into the same flat, parent-linked row list</w:t>
+      </w:r>
+      <w:r>
+        <w:t xml:space="preserve"> </w:t>
+      </w:r>
+      <w:r>
+        <w:t xml:space="preserve">shape</w:t>
+      </w:r>
+      <w:r>
+        <w:t xml:space="preserve"> </w:t>
+      </w:r>
+      <w:r>
+        <w:rPr>
+          <w:rStyle w:val="VerbatimChar"/>
+        </w:rPr>
+        <w:t xml:space="preserve">render_node()</w:t>
+      </w:r>
+      <w:r>
+        <w:t xml:space="preserve">/</w:t>
+      </w:r>
+      <w:r>
+        <w:rPr>
+          <w:rStyle w:val="VerbatimChar"/>
+        </w:rPr>
+        <w:t xml:space="preserve">build_children_map()</w:t>
+      </w:r>
+      <w:r>
+        <w:t xml:space="preserve">/</w:t>
+      </w:r>
+      <w:r>
+        <w:rPr>
+          <w:rStyle w:val="VerbatimChar"/>
+        </w:rPr>
+        <w:t xml:space="preserve">find_kernel_anchors()</w:t>
+      </w:r>
+      <w:r>
+        <w:t xml:space="preserve"> </w:t>
+      </w:r>
+      <w:r>
+        <w:t xml:space="preserve">already expect, so none of</w:t>
+      </w:r>
+      <w:r>
+        <w:t xml:space="preserve"> </w:t>
+      </w:r>
+      <w:r>
+        <w:t xml:space="preserve">those rendering primitives needed to change at all.</w:t>
+      </w:r>
+    </w:p>
+    <w:p>
+      <w:pPr>
+        <w:numPr>
+          <w:ilvl w:val="0"/>
+          <w:numId w:val="1007"/>
+        </w:numPr>
+        <w:pStyle w:val="Compact"/>
+      </w:pPr>
+      <w:r>
+        <w:t xml:space="preserve">GPU kernel attachment (</w:t>
+      </w:r>
+      <w:r>
+        <w:rPr>
+          <w:rStyle w:val="VerbatimChar"/>
+        </w:rPr>
+        <w:t xml:space="preserve">attach_kernel_summaries()</w:t>
+      </w:r>
+      <w:r>
+        <w:t xml:space="preserve">) reworked to accept</w:t>
+      </w:r>
+      <w:r>
+        <w:t xml:space="preserve"> </w:t>
+      </w:r>
+      <w:r>
+        <w:rPr>
+          <w:rStyle w:val="VerbatimChar"/>
+        </w:rPr>
+        <w:t xml:space="preserve">{rank_key: {kernel_name:   (count, total_seconds)}}</w:t>
+      </w:r>
+      <w:r>
+        <w:t xml:space="preserve"> </w:t>
+      </w:r>
+      <w:r>
+        <w:t xml:space="preserve">instead of one pre-combined dict, so synthetic kernel nodes keep a real</w:t>
+      </w:r>
+      <w:r>
+        <w:t xml:space="preserve"> </w:t>
+      </w:r>
+      <w:r>
+        <w:t xml:space="preserve">per-rank breakdown too and get proper load-balance columns instead of a single averaged number.</w:t>
+      </w:r>
+      <w:r>
+        <w:t xml:space="preserve"> </w:t>
+      </w:r>
+      <w:r>
+        <w:t xml:space="preserve">Its return contract changed from an all-or-nothing</w:t>
+      </w:r>
+      <w:r>
+        <w:t xml:space="preserve"> </w:t>
+      </w:r>
+      <w:r>
+        <w:t xml:space="preserve">“</w:t>
+      </w:r>
+      <w:r>
+        <w:t xml:space="preserve">found an anchor</w:t>
+      </w:r>
+      <w:r>
+        <w:t xml:space="preserve">”</w:t>
+      </w:r>
+      <w:r>
+        <w:t xml:space="preserve"> </w:t>
+      </w:r>
+      <w:r>
+        <w:t xml:space="preserve">boolean (already changed</w:t>
+      </w:r>
+      <w:r>
+        <w:t xml:space="preserve"> </w:t>
+      </w:r>
+      <w:r>
+        <w:t xml:space="preserve">once, in the previous round) to the set of kernel</w:t>
+      </w:r>
+      <w:r>
+        <w:t xml:space="preserve"> </w:t>
+      </w:r>
+      <w:r>
+        <w:rPr>
+          <w:iCs/>
+          <w:i/>
+        </w:rPr>
+        <w:t xml:space="preserve">names</w:t>
+      </w:r>
+      <w:r>
+        <w:t xml:space="preserve"> </w:t>
+      </w:r>
+      <w:r>
+        <w:t xml:space="preserve">that couldn’t be placed anywhere,</w:t>
+      </w:r>
+      <w:r>
+        <w:t xml:space="preserve"> </w:t>
+      </w:r>
+      <w:r>
+        <w:t xml:space="preserve">since</w:t>
+      </w:r>
+      <w:r>
+        <w:t xml:space="preserve"> </w:t>
+      </w:r>
+      <w:r>
+        <w:t xml:space="preserve">“</w:t>
+      </w:r>
+      <w:r>
+        <w:t xml:space="preserve">per rank</w:t>
+      </w:r>
+      <w:r>
+        <w:t xml:space="preserve">”</w:t>
+      </w:r>
+      <w:r>
+        <w:t xml:space="preserve"> </w:t>
+      </w:r>
+      <w:r>
+        <w:t xml:space="preserve">no longer makes sense once there’s only one merged tree.</w:t>
+      </w:r>
+    </w:p>
+    <w:p>
+      <w:pPr>
+        <w:pStyle w:val="FirstParagraph"/>
+      </w:pPr>
+      <w:r>
+        <w:t xml:space="preserve">Both</w:t>
+      </w:r>
+      <w:r>
+        <w:t xml:space="preserve"> </w:t>
+      </w:r>
+      <w:r>
+        <w:rPr>
+          <w:rStyle w:val="VerbatimChar"/>
+        </w:rPr>
+        <w:t xml:space="preserve">extract_calltree.py</w:t>
+      </w:r>
+      <w:r>
+        <w:t xml:space="preserve"> </w:t>
+      </w:r>
+      <w:r>
+        <w:t xml:space="preserve">and</w:t>
+      </w:r>
+      <w:r>
+        <w:t xml:space="preserve"> </w:t>
+      </w:r>
+      <w:r>
+        <w:rPr>
+          <w:rStyle w:val="VerbatimChar"/>
+        </w:rPr>
+        <w:t xml:space="preserve">extract_calltree_traced.py</w:t>
+      </w:r>
+      <w:r>
+        <w:t xml:space="preserve">’s</w:t>
+      </w:r>
+      <w:r>
+        <w:t xml:space="preserve"> </w:t>
+      </w:r>
+      <w:r>
+        <w:rPr>
+          <w:rStyle w:val="VerbatimChar"/>
+        </w:rPr>
+        <w:t xml:space="preserve">write_report()</w:t>
+      </w:r>
+      <w:r>
+        <w:t xml:space="preserve"> </w:t>
+      </w:r>
+      <w:r>
+        <w:t xml:space="preserve">were restructured</w:t>
+      </w:r>
+      <w:r>
+        <w:t xml:space="preserve"> </w:t>
+      </w:r>
+      <w:r>
+        <w:t xml:space="preserve">around this:</w:t>
+      </w:r>
+      <w:r>
+        <w:t xml:space="preserve"> </w:t>
+      </w:r>
+      <w:r>
+        <w:rPr>
+          <w:rStyle w:val="VerbatimChar"/>
+        </w:rPr>
+        <w:t xml:space="preserve">load_rank_trees()</w:t>
+      </w:r>
+      <w:r>
+        <w:t xml:space="preserve"> </w:t>
+      </w:r>
+      <w:r>
+        <w:t xml:space="preserve">(and, for the sampling tool, all four filter-tier tagging) is</w:t>
+      </w:r>
+      <w:r>
+        <w:t xml:space="preserve"> </w:t>
+      </w:r>
+      <w:r>
+        <w:t xml:space="preserve">unchanged and still runs per rank, but the old per-rank render loop is gone —</w:t>
+      </w:r>
+      <w:r>
+        <w:t xml:space="preserve"> </w:t>
+      </w:r>
+      <w:r>
+        <w:rPr>
+          <w:rStyle w:val="VerbatimChar"/>
+        </w:rPr>
+        <w:t xml:space="preserve">merge_rank_trees()</w:t>
+      </w:r>
+      <w:r>
+        <w:t xml:space="preserve"> </w:t>
+      </w:r>
+      <w:r>
+        <w:t xml:space="preserve">runs once,</w:t>
+      </w:r>
+      <w:r>
+        <w:t xml:space="preserve"> </w:t>
+      </w:r>
+      <w:r>
+        <w:rPr>
+          <w:rStyle w:val="VerbatimChar"/>
+        </w:rPr>
+        <w:t xml:space="preserve">flatten_tree()</w:t>
+      </w:r>
+      <w:r>
+        <w:t xml:space="preserve"> </w:t>
+      </w:r>
+      <w:r>
+        <w:t xml:space="preserve">once, and rendering happens once against the merged tree. The report</w:t>
+      </w:r>
+      <w:r>
+        <w:t xml:space="preserve"> </w:t>
+      </w:r>
+      <w:r>
+        <w:t xml:space="preserve">header now states</w:t>
+      </w:r>
+      <w:r>
+        <w:t xml:space="preserve"> </w:t>
+      </w:r>
+      <w:r>
+        <w:rPr>
+          <w:rStyle w:val="VerbatimChar"/>
+        </w:rPr>
+        <w:t xml:space="preserve">ranks aggregated: N (rank keys: ...)</w:t>
+      </w:r>
+      <w:r>
+        <w:t xml:space="preserve"> </w:t>
+      </w:r>
+      <w:r>
+        <w:t xml:space="preserve">instead of repeating</w:t>
+      </w:r>
+      <w:r>
+        <w:t xml:space="preserve"> </w:t>
+      </w:r>
+      <w:r>
+        <w:rPr>
+          <w:rStyle w:val="VerbatimChar"/>
+        </w:rPr>
+        <w:t xml:space="preserve">=== Rank X ===</w:t>
+      </w:r>
+      <w:r>
+        <w:t xml:space="preserve"> </w:t>
+      </w:r>
+      <w:r>
+        <w:t xml:space="preserve">per rank.</w:t>
+      </w:r>
+      <w:r>
+        <w:t xml:space="preserve"> </w:t>
+      </w:r>
+      <w:r>
+        <w:rPr>
+          <w:rStyle w:val="VerbatimChar"/>
+        </w:rPr>
+        <w:t xml:space="preserve">REPORT_HEADERS</w:t>
+      </w:r>
+      <w:r>
+        <w:t xml:space="preserve"> </w:t>
+      </w:r>
+      <w:r>
+        <w:t xml:space="preserve">(</w:t>
+      </w:r>
+      <w:r>
+        <w:rPr>
+          <w:rStyle w:val="VerbatimChar"/>
+        </w:rPr>
+        <w:t xml:space="preserve">CALLS</w:t>
+      </w:r>
+      <w:r>
+        <w:t xml:space="preserve">,</w:t>
+      </w:r>
+      <w:r>
+        <w:t xml:space="preserve"> </w:t>
+      </w:r>
+      <w:r>
+        <w:rPr>
+          <w:rStyle w:val="VerbatimChar"/>
+        </w:rPr>
+        <w:t xml:space="preserve">SELF-AVG(s)</w:t>
+      </w:r>
+      <w:r>
+        <w:t xml:space="preserve">,</w:t>
+      </w:r>
+      <w:r>
+        <w:t xml:space="preserve"> </w:t>
+      </w:r>
+      <w:r>
+        <w:rPr>
+          <w:rStyle w:val="VerbatimChar"/>
+        </w:rPr>
+        <w:t xml:space="preserve">SELF-STD(s)</w:t>
+      </w:r>
+      <w:r>
+        <w:t xml:space="preserve">,</w:t>
+      </w:r>
+      <w:r>
+        <w:t xml:space="preserve"> </w:t>
+      </w:r>
+      <w:r>
+        <w:rPr>
+          <w:rStyle w:val="VerbatimChar"/>
+        </w:rPr>
+        <w:t xml:space="preserve">SELF-MIN(s)</w:t>
+      </w:r>
+      <w:r>
+        <w:t xml:space="preserve">,</w:t>
+      </w:r>
+      <w:r>
+        <w:t xml:space="preserve"> </w:t>
+      </w:r>
+      <w:r>
+        <w:rPr>
+          <w:rStyle w:val="VerbatimChar"/>
+        </w:rPr>
+        <w:t xml:space="preserve">SELF-MAX(s)</w:t>
+      </w:r>
+      <w:r>
+        <w:t xml:space="preserve">,</w:t>
+      </w:r>
+      <w:r>
+        <w:t xml:space="preserve"> </w:t>
+      </w:r>
+      <w:r>
+        <w:rPr>
+          <w:rStyle w:val="VerbatimChar"/>
+        </w:rPr>
+        <w:t xml:space="preserve">TOTAL-AVG(s)</w:t>
+      </w:r>
+      <w:r>
+        <w:t xml:space="preserve">) and a</w:t>
+      </w:r>
+      <w:r>
+        <w:t xml:space="preserve"> </w:t>
+      </w:r>
+      <w:r>
+        <w:rPr>
+          <w:rStyle w:val="VerbatimChar"/>
+        </w:rPr>
+        <w:t xml:space="preserve">make_node_values(rank_keys)</w:t>
+      </w:r>
+      <w:r>
+        <w:t xml:space="preserve"> </w:t>
+      </w:r>
+      <w:r>
+        <w:t xml:space="preserve">factory are now shared in</w:t>
+      </w:r>
+      <w:r>
+        <w:t xml:space="preserve"> </w:t>
+      </w:r>
+      <w:r>
+        <w:rPr>
+          <w:rStyle w:val="VerbatimChar"/>
+        </w:rPr>
+        <w:t xml:space="preserve">calltree_common.py</w:t>
+      </w:r>
+      <w:r>
+        <w:t xml:space="preserve"> </w:t>
+      </w:r>
+      <w:r>
+        <w:t xml:space="preserve">too, used identically by both tools — a further DRY win beyond what either tool needed alone.</w:t>
+      </w:r>
+    </w:p>
+    <w:p>
+      <w:pPr>
+        <w:pStyle w:val="BodyText"/>
+      </w:pPr>
+      <w:r>
+        <w:t xml:space="preserve">One bug caught before it reached the user: an early caveats-text draft for the traced tool still</w:t>
+      </w:r>
+      <w:r>
+        <w:t xml:space="preserve"> </w:t>
+      </w:r>
+      <w:r>
+        <w:t xml:space="preserve">said</w:t>
+      </w:r>
+      <w:r>
+        <w:t xml:space="preserve"> </w:t>
+      </w:r>
+      <w:r>
+        <w:t xml:space="preserve">“</w:t>
+      </w:r>
+      <w:r>
+        <w:t xml:space="preserve">SELF(s)</w:t>
+      </w:r>
+      <w:r>
+        <w:t xml:space="preserve">”</w:t>
+      </w:r>
+      <w:r>
+        <w:t xml:space="preserve">/</w:t>
+      </w:r>
+      <w:r>
+        <w:t xml:space="preserve">“</w:t>
+      </w:r>
+      <w:r>
+        <w:t xml:space="preserve">TOTAL(s)</w:t>
+      </w:r>
+      <w:r>
+        <w:t xml:space="preserve">”</w:t>
+      </w:r>
+      <w:r>
+        <w:t xml:space="preserve"> </w:t>
+      </w:r>
+      <w:r>
+        <w:t xml:space="preserve">in prose (copy-pasted from an earlier version), which happened to make a</w:t>
+      </w:r>
+      <w:r>
+        <w:t xml:space="preserve"> </w:t>
+      </w:r>
+      <w:r>
+        <w:t xml:space="preserve">stale test assertion pass for the wrong reason — the test was matching the CAVEATS PARAGRAPH’s own</w:t>
+      </w:r>
+      <w:r>
+        <w:t xml:space="preserve"> </w:t>
+      </w:r>
+      <w:r>
+        <w:t xml:space="preserve">words, not the actual rendered column header (</w:t>
+      </w:r>
+      <w:r>
+        <w:rPr>
+          <w:rStyle w:val="VerbatimChar"/>
+        </w:rPr>
+        <w:t xml:space="preserve">SELF-AVG(s)</w:t>
+      </w:r>
+      <w:r>
+        <w:t xml:space="preserve">/</w:t>
+      </w:r>
+      <w:r>
+        <w:rPr>
+          <w:rStyle w:val="VerbatimChar"/>
+        </w:rPr>
+        <w:t xml:space="preserve">TOTAL-AVG(s)</w:t>
+      </w:r>
+      <w:r>
+        <w:t xml:space="preserve">). Caught by inspecting</w:t>
+      </w:r>
+      <w:r>
+        <w:t xml:space="preserve"> </w:t>
+      </w:r>
+      <w:r>
+        <w:t xml:space="preserve">the test failure’s full report text rather than trusting a green run; fixed the caveats prose in</w:t>
+      </w:r>
+      <w:r>
+        <w:t xml:space="preserve"> </w:t>
+      </w:r>
+      <w:r>
+        <w:t xml:space="preserve">both tools to match the real header names, which promptly turned the test red for the right reason</w:t>
+      </w:r>
+      <w:r>
+        <w:t xml:space="preserve"> </w:t>
+      </w:r>
+      <w:r>
+        <w:t xml:space="preserve">until the assertion itself was updated too.</w:t>
+      </w:r>
+    </w:p>
+    <w:p>
+      <w:pPr>
+        <w:pStyle w:val="BodyText"/>
+      </w:pPr>
+      <w:r>
+        <w:t xml:space="preserve">New fixture</w:t>
+      </w:r>
+      <w:r>
+        <w:t xml:space="preserve"> </w:t>
+      </w:r>
+      <w:r>
+        <w:rPr>
+          <w:rStyle w:val="VerbatimChar"/>
+        </w:rPr>
+        <w:t xml:space="preserve">calltree_sampling_multi_rank</w:t>
+      </w:r>
+      <w:r>
+        <w:t xml:space="preserve"> </w:t>
+      </w:r>
+      <w:r>
+        <w:t xml:space="preserve">(three ranks sharing one real structure with different</w:t>
+      </w:r>
+      <w:r>
+        <w:t xml:space="preserve"> </w:t>
+      </w:r>
+      <w:r>
+        <w:t xml:space="preserve">self-times, plus a</w:t>
+      </w:r>
+      <w:r>
+        <w:t xml:space="preserve"> </w:t>
+      </w:r>
+      <w:r>
+        <w:rPr>
+          <w:rStyle w:val="VerbatimChar"/>
+        </w:rPr>
+        <w:t xml:space="preserve">rare_error_path</w:t>
+      </w:r>
+      <w:r>
+        <w:t xml:space="preserve"> </w:t>
+      </w:r>
+      <w:r>
+        <w:t xml:space="preserve">only one rank hits, to pin the</w:t>
+      </w:r>
+      <w:r>
+        <w:t xml:space="preserve"> </w:t>
+      </w:r>
+      <w:r>
+        <w:t xml:space="preserve">“</w:t>
+      </w:r>
+      <w:r>
+        <w:t xml:space="preserve">missing rank counts as 0</w:t>
+      </w:r>
+      <w:r>
+        <w:t xml:space="preserve">”</w:t>
+      </w:r>
+      <w:r>
+        <w:t xml:space="preserve"> </w:t>
+      </w:r>
+      <w:r>
+        <w:t xml:space="preserve">rule) plus a</w:t>
+      </w:r>
+      <w:r>
+        <w:t xml:space="preserve"> </w:t>
+      </w:r>
+      <w:r>
+        <w:rPr>
+          <w:rStyle w:val="VerbatimChar"/>
+        </w:rPr>
+        <w:t xml:space="preserve">MergeRankTreesTests</w:t>
+      </w:r>
+      <w:r>
+        <w:t xml:space="preserve">/</w:t>
+      </w:r>
+      <w:r>
+        <w:rPr>
+          <w:rStyle w:val="VerbatimChar"/>
+        </w:rPr>
+        <w:t xml:space="preserve">AggregateNodeStatsTests</w:t>
+      </w:r>
+      <w:r>
+        <w:t xml:space="preserve"> </w:t>
+      </w:r>
+      <w:r>
+        <w:t xml:space="preserve">pair testing the shared math directly;</w:t>
+      </w:r>
+      <w:r>
+        <w:t xml:space="preserve"> </w:t>
+      </w:r>
+      <w:r>
+        <w:t xml:space="preserve">the now-defunct</w:t>
+      </w:r>
+      <w:r>
+        <w:t xml:space="preserve"> </w:t>
+      </w:r>
+      <w:r>
+        <w:rPr>
+          <w:rStyle w:val="VerbatimChar"/>
+        </w:rPr>
+        <w:t xml:space="preserve">calltree_sampling_mpi_cascade</w:t>
+      </w:r>
+      <w:r>
+        <w:t xml:space="preserve"> </w:t>
+      </w:r>
+      <w:r>
+        <w:t xml:space="preserve">WALL-cascade fixture was deleted rather than kept</w:t>
+      </w:r>
+      <w:r>
+        <w:t xml:space="preserve"> </w:t>
+      </w:r>
+      <w:r>
+        <w:t xml:space="preserve">around unused. Suite is at 279 tests, all green. Re-verified against both real</w:t>
+      </w:r>
+      <w:r>
+        <w:t xml:space="preserve"> </w:t>
+      </w:r>
+      <w:r>
+        <w:rPr>
+          <w:rStyle w:val="VerbatimChar"/>
+        </w:rPr>
+        <w:t xml:space="preserve">Heat_Convection_Solver</w:t>
+      </w:r>
+      <w:r>
+        <w:t xml:space="preserve"> </w:t>
+      </w:r>
+      <w:r>
+        <w:t xml:space="preserve">directories:</w:t>
+      </w:r>
+      <w:r>
+        <w:t xml:space="preserve"> </w:t>
+      </w:r>
+      <w:r>
+        <w:rPr>
+          <w:rStyle w:val="VerbatimChar"/>
+        </w:rPr>
+        <w:t xml:space="preserve">calltree.txt</w:t>
+      </w:r>
+      <w:r>
+        <w:t xml:space="preserve"> </w:t>
+      </w:r>
+      <w:r>
+        <w:t xml:space="preserve">shrank from 370 lines (one tree per rank) to</w:t>
+      </w:r>
+      <w:r>
+        <w:t xml:space="preserve"> </w:t>
+      </w:r>
+      <w:r>
+        <w:t xml:space="preserve">126 (one aggregated tree) on the same data, with real load-balance columns visible throughout (e.g.</w:t>
+      </w:r>
+      <w:r>
+        <w:t xml:space="preserve"> </w:t>
+      </w:r>
+      <w:r>
+        <w:rPr>
+          <w:rStyle w:val="VerbatimChar"/>
+        </w:rPr>
+        <w:t xml:space="preserve">PMPI_Waitall</w:t>
+      </w:r>
+      <w:r>
+        <w:t xml:space="preserve">’s self-time varies 15.4s–20.9s across the 4 real ranks in</w:t>
+      </w:r>
+      <w:r>
+        <w:t xml:space="preserve"> </w:t>
+      </w:r>
+      <w:r>
+        <w:rPr>
+          <w:rStyle w:val="VerbatimChar"/>
+        </w:rPr>
+        <w:t xml:space="preserve">calltree_traced.txt</w:t>
+      </w:r>
+      <w:r>
+        <w:t xml:space="preserve">) —</w:t>
+      </w:r>
+      <w:r>
+        <w:t xml:space="preserve"> </w:t>
+      </w:r>
+      <w:r>
+        <w:t xml:space="preserve">exactly the kind of imbalance signal a single flat number would have hidden.</w:t>
+      </w:r>
+    </w:p>
+    <w:bookmarkEnd w:id="53"/>
+    <w:bookmarkEnd w:id="54"/>
     <w:sectPr/>
   </w:body>
 </w:document>
@@ -16623,6 +20241,167 @@
       </w:pPr>
     </w:lvl>
   </w:abstractNum>
+  <w:abstractNum w:abstractNumId="99436">
+    <w:nsid w:val="A99436"/>
+    <w:multiLevelType w:val="multilevel"/>
+    <w:lvl w:ilvl="0">
+      <w:start w:val="6"/>
+      <w:numFmt w:val="decimal"/>
+      <w:lvlText w:val="(%1)"/>
+      <w:lvlJc w:val="left"/>
+      <w:pPr>
+        <w:ind w:left="720" w:hanging="480"/>
+      </w:pPr>
+    </w:lvl>
+    <w:lvl w:ilvl="1">
+      <w:start w:val="6"/>
+      <w:numFmt w:val="decimal"/>
+      <w:lvlText w:val="(%2)"/>
+      <w:lvlJc w:val="left"/>
+      <w:pPr>
+        <w:ind w:left="1440" w:hanging="480"/>
+      </w:pPr>
+    </w:lvl>
+    <w:lvl w:ilvl="2">
+      <w:start w:val="6"/>
+      <w:numFmt w:val="decimal"/>
+      <w:lvlText w:val="(%3)"/>
+      <w:lvlJc w:val="left"/>
+      <w:pPr>
+        <w:ind w:left="2160" w:hanging="480"/>
+      </w:pPr>
+    </w:lvl>
+    <w:lvl w:ilvl="3">
+      <w:start w:val="6"/>
+      <w:numFmt w:val="decimal"/>
+      <w:lvlText w:val="(%4)"/>
+      <w:lvlJc w:val="left"/>
+      <w:pPr>
+        <w:ind w:left="2880" w:hanging="480"/>
+      </w:pPr>
+    </w:lvl>
+    <w:lvl w:ilvl="4">
+      <w:start w:val="6"/>
+      <w:numFmt w:val="decimal"/>
+      <w:lvlText w:val="(%5)"/>
+      <w:lvlJc w:val="left"/>
+      <w:pPr>
+        <w:ind w:left="3600" w:hanging="480"/>
+      </w:pPr>
+    </w:lvl>
+    <w:lvl w:ilvl="5">
+      <w:start w:val="6"/>
+      <w:numFmt w:val="decimal"/>
+      <w:lvlText w:val="(%6)"/>
+      <w:lvlJc w:val="left"/>
+      <w:pPr>
+        <w:ind w:left="4320" w:hanging="480"/>
+      </w:pPr>
+    </w:lvl>
+    <w:lvl w:ilvl="6">
+      <w:start w:val="6"/>
+      <w:numFmt w:val="decimal"/>
+      <w:lvlText w:val="(%7)"/>
+      <w:lvlJc w:val="left"/>
+      <w:pPr>
+        <w:ind w:left="5040" w:hanging="480"/>
+      </w:pPr>
+    </w:lvl>
+    <w:lvl w:ilvl="7">
+      <w:start w:val="6"/>
+      <w:numFmt w:val="decimal"/>
+      <w:lvlText w:val="(%8)"/>
+      <w:lvlJc w:val="left"/>
+      <w:pPr>
+        <w:ind w:left="5760" w:hanging="480"/>
+      </w:pPr>
+    </w:lvl>
+    <w:lvl w:ilvl="8">
+      <w:start w:val="6"/>
+      <w:numFmt w:val="decimal"/>
+      <w:lvlText w:val="(%9)"/>
+      <w:lvlJc w:val="left"/>
+      <w:pPr>
+        <w:ind w:left="6480" w:hanging="480"/>
+      </w:pPr>
+    </w:lvl>
+  </w:abstractNum>
+  <w:abstractNum w:abstractNumId="991">
+    <w:nsid w:val="A991"/>
+    <w:multiLevelType w:val="multilevel"/>
+    <w:lvl w:ilvl="0">
+      <w:numFmt w:val="bullet"/>
+      <w:lvlText w:val="•"/>
+      <w:lvlJc w:val="left"/>
+      <w:pPr>
+        <w:ind w:left="720" w:hanging="480"/>
+      </w:pPr>
+    </w:lvl>
+    <w:lvl w:ilvl="1">
+      <w:numFmt w:val="bullet"/>
+      <w:lvlText w:val="–"/>
+      <w:lvlJc w:val="left"/>
+      <w:pPr>
+        <w:ind w:left="1440" w:hanging="480"/>
+      </w:pPr>
+    </w:lvl>
+    <w:lvl w:ilvl="2">
+      <w:numFmt w:val="bullet"/>
+      <w:lvlText w:val="•"/>
+      <w:lvlJc w:val="left"/>
+      <w:pPr>
+        <w:ind w:left="2160" w:hanging="480"/>
+      </w:pPr>
+    </w:lvl>
+    <w:lvl w:ilvl="3">
+      <w:numFmt w:val="bullet"/>
+      <w:lvlText w:val="–"/>
+      <w:lvlJc w:val="left"/>
+      <w:pPr>
+        <w:ind w:left="2880" w:hanging="480"/>
+      </w:pPr>
+    </w:lvl>
+    <w:lvl w:ilvl="4">
+      <w:numFmt w:val="bullet"/>
+      <w:lvlText w:val="•"/>
+      <w:lvlJc w:val="left"/>
+      <w:pPr>
+        <w:ind w:left="3600" w:hanging="480"/>
+      </w:pPr>
+    </w:lvl>
+    <w:lvl w:ilvl="5">
+      <w:numFmt w:val="bullet"/>
+      <w:lvlText w:val="–"/>
+      <w:lvlJc w:val="left"/>
+      <w:pPr>
+        <w:ind w:left="4320" w:hanging="480"/>
+      </w:pPr>
+    </w:lvl>
+    <w:lvl w:ilvl="6">
+      <w:numFmt w:val="bullet"/>
+      <w:lvlText w:val="•"/>
+      <w:lvlJc w:val="left"/>
+      <w:pPr>
+        <w:ind w:left="5040" w:hanging="480"/>
+      </w:pPr>
+    </w:lvl>
+    <w:lvl w:ilvl="7">
+      <w:numFmt w:val="bullet"/>
+      <w:lvlText w:val="–"/>
+      <w:lvlJc w:val="left"/>
+      <w:pPr>
+        <w:ind w:left="5760" w:hanging="480"/>
+      </w:pPr>
+    </w:lvl>
+    <w:lvl w:ilvl="8">
+      <w:numFmt w:val="bullet"/>
+      <w:lvlText w:val="•"/>
+      <w:lvlJc w:val="left"/>
+      <w:pPr>
+        <w:ind w:left="6480" w:hanging="480"/>
+      </w:pPr>
+    </w:lvl>
+  </w:abstractNum>
   <w:num w:numId="1000">
     <w:abstractNumId w:val="990"/>
   </w:num>
@@ -16775,6 +20554,39 @@
     <w:lvlOverride w:ilvl="8">
       <w:startOverride w:val="1"/>
     </w:lvlOverride>
+  </w:num>
+  <w:num w:numId="1006">
+    <w:abstractNumId w:val="99436"/>
+    <w:lvlOverride w:ilvl="0">
+      <w:startOverride w:val="6"/>
+    </w:lvlOverride>
+    <w:lvlOverride w:ilvl="1">
+      <w:startOverride w:val="6"/>
+    </w:lvlOverride>
+    <w:lvlOverride w:ilvl="2">
+      <w:startOverride w:val="6"/>
+    </w:lvlOverride>
+    <w:lvlOverride w:ilvl="3">
+      <w:startOverride w:val="6"/>
+    </w:lvlOverride>
+    <w:lvlOverride w:ilvl="4">
+      <w:startOverride w:val="6"/>
+    </w:lvlOverride>
+    <w:lvlOverride w:ilvl="5">
+      <w:startOverride w:val="6"/>
+    </w:lvlOverride>
+    <w:lvlOverride w:ilvl="6">
+      <w:startOverride w:val="6"/>
+    </w:lvlOverride>
+    <w:lvlOverride w:ilvl="7">
+      <w:startOverride w:val="6"/>
+    </w:lvlOverride>
+    <w:lvlOverride w:ilvl="8">
+      <w:startOverride w:val="6"/>
+    </w:lvlOverride>
+  </w:num>
+  <w:num w:numId="1007">
+    <w:abstractNumId w:val="991"/>
   </w:num>
 </w:numbering>
 </file>

</xml_diff>

<commit_message>
Plan 2.1: postprocess/ dependency audit, consolidation plan, and plan versioning
Full read-through of postprocess/ produced a dependency map, functional-pipeline
view, duplication findings, a target architecture organized by pipeline stage,
a stage-3 tag-then-act engine redesign, a report style guide, a test-suite
audit, and a 10-step implementation roadmap -- saved to
docs/plans/2.1-postprocess-consolidation-refactor.md.

Plan files renumbered to <major>.<minor>: 01-16 (the original tool suite)
became 1.1-1.16; this consolidation phase starts at 2.1. CLAUDE.md documents
the new scheme and adds a Code Comments convention (current behavior only,
no investigation history; every module gets a scope/functions/philosophy
docstring).

Co-Authored-By: Claude Sonnet 5 <noreply@anthropic.com>
</commit_message>
<xml_diff>
--- a/docs/DEVELOPMENT_HISTORY.docx
+++ b/docs/DEVELOPMENT_HISTORY.docx
@@ -10,7 +10,7 @@
         <w:t xml:space="preserve">Development History</w:t>
       </w:r>
     </w:p>
-    <w:bookmarkStart w:id="63" w:name="development-history"/>
+    <w:bookmarkStart w:id="64" w:name="development-history"/>
     <w:p>
       <w:pPr>
         <w:pStyle w:val="Heading1"/>
@@ -1461,6 +1461,107 @@
           </w:p>
         </w:tc>
       </w:tr>
+      <w:tr>
+        <w:tc>
+          <w:tcPr/>
+          <w:p>
+            <w:pPr>
+              <w:pStyle w:val="Compact"/>
+              <w:jc w:val="left"/>
+            </w:pPr>
+            <w:r>
+              <w:t xml:space="preserve">2026-08-13</w:t>
+            </w:r>
+          </w:p>
+        </w:tc>
+        <w:tc>
+          <w:tcPr/>
+          <w:p>
+            <w:pPr>
+              <w:pStyle w:val="Compact"/>
+              <w:jc w:val="left"/>
+            </w:pPr>
+            <w:r>
+              <w:t xml:space="preserve">Full</w:t>
+            </w:r>
+            <w:r>
+              <w:t xml:space="preserve"> </w:t>
+            </w:r>
+            <w:r>
+              <w:rPr>
+                <w:rStyle w:val="VerbatimChar"/>
+              </w:rPr>
+              <w:t xml:space="preserve">postprocess/</w:t>
+            </w:r>
+            <w:r>
+              <w:t xml:space="preserve"> </w:t>
+            </w:r>
+            <w:r>
+              <w:t xml:space="preserve">dependency audit and consolidation plan written (</w:t>
+            </w:r>
+            <w:r>
+              <w:rPr>
+                <w:rStyle w:val="VerbatimChar"/>
+              </w:rPr>
+              <w:t xml:space="preserve">docs/plans/2.1-postprocess-consolidation-refactor.md</w:t>
+            </w:r>
+            <w:r>
+              <w:t xml:space="preserve">); plan numbering versioned (</w:t>
+            </w:r>
+            <w:r>
+              <w:rPr>
+                <w:rStyle w:val="VerbatimChar"/>
+              </w:rPr>
+              <w:t xml:space="preserve">1.1</w:t>
+            </w:r>
+            <w:r>
+              <w:t xml:space="preserve">-</w:t>
+            </w:r>
+            <w:r>
+              <w:rPr>
+                <w:rStyle w:val="VerbatimChar"/>
+              </w:rPr>
+              <w:t xml:space="preserve">1.16</w:t>
+            </w:r>
+            <w:r>
+              <w:t xml:space="preserve"> </w:t>
+            </w:r>
+            <w:r>
+              <w:t xml:space="preserve">= original tool suite,</w:t>
+            </w:r>
+            <w:r>
+              <w:t xml:space="preserve"> </w:t>
+            </w:r>
+            <w:r>
+              <w:rPr>
+                <w:rStyle w:val="VerbatimChar"/>
+              </w:rPr>
+              <w:t xml:space="preserve">2.x</w:t>
+            </w:r>
+            <w:r>
+              <w:t xml:space="preserve"> </w:t>
+            </w:r>
+            <w:r>
+              <w:t xml:space="preserve">= this refactor);</w:t>
+            </w:r>
+            <w:r>
+              <w:t xml:space="preserve"> </w:t>
+            </w:r>
+            <w:r>
+              <w:rPr>
+                <w:rStyle w:val="VerbatimChar"/>
+              </w:rPr>
+              <w:t xml:space="preserve">CLAUDE.md</w:t>
+            </w:r>
+            <w:r>
+              <w:t xml:space="preserve"> </w:t>
+            </w:r>
+            <w:r>
+              <w:t xml:space="preserve">gains a Code Comments convention (describe current behavior, not history; every module gets a top-of-file scope/functions/philosophy docstring)</w:t>
+            </w:r>
+          </w:p>
+        </w:tc>
+      </w:tr>
     </w:tbl>
     <w:bookmarkStart w:id="20" w:name="project-scaffolding-and-rules"/>
     <w:p>
@@ -27771,7 +27872,419 @@
       </w:r>
     </w:p>
     <w:bookmarkEnd w:id="62"/>
+    <w:bookmarkStart w:id="63" w:name="Xffb7fe892306a8fc8c44643e0be7e9faebb8402"/>
+    <w:p>
+      <w:pPr>
+        <w:pStyle w:val="Heading2"/>
+      </w:pPr>
+      <w:r>
+        <w:t xml:space="preserve">2026-08-13 —</w:t>
+      </w:r>
+      <w:r>
+        <w:t xml:space="preserve"> </w:t>
+      </w:r>
+      <w:r>
+        <w:rPr>
+          <w:rStyle w:val="VerbatimChar"/>
+        </w:rPr>
+        <w:t xml:space="preserve">postprocess/</w:t>
+      </w:r>
+      <w:r>
+        <w:t xml:space="preserve"> </w:t>
+      </w:r>
+      <w:r>
+        <w:t xml:space="preserve">dependency audit, consolidation plan, and plan-numbering versioning</w:t>
+      </w:r>
+    </w:p>
+    <w:p>
+      <w:pPr>
+        <w:pStyle w:val="FirstParagraph"/>
+      </w:pPr>
+      <w:r>
+        <w:t xml:space="preserve">A full read-through of every file under</w:t>
+      </w:r>
+      <w:r>
+        <w:t xml:space="preserve"> </w:t>
+      </w:r>
+      <w:r>
+        <w:rPr>
+          <w:rStyle w:val="VerbatimChar"/>
+        </w:rPr>
+        <w:t xml:space="preserve">postprocess/</w:t>
+      </w:r>
+      <w:r>
+        <w:t xml:space="preserve"> </w:t>
+      </w:r>
+      <w:r>
+        <w:t xml:space="preserve">produced a dependency map (module graph,</w:t>
+      </w:r>
+      <w:r>
+        <w:t xml:space="preserve"> </w:t>
+      </w:r>
+      <w:r>
+        <w:t xml:space="preserve">cross-module function calls, a functional-pipeline view across all four hotspot/calltree tools,</w:t>
+      </w:r>
+      <w:r>
+        <w:t xml:space="preserve"> </w:t>
+      </w:r>
+      <w:r>
+        <w:t xml:space="preserve">duplication findings, and a move-list) and a target architecture organized by pipeline stage</w:t>
+      </w:r>
+      <w:r>
+        <w:t xml:space="preserve"> </w:t>
+      </w:r>
+      <w:r>
+        <w:t xml:space="preserve">(read profile / ancestry tree / filter noise / merge ranks+LB / create tables / report) instead of</w:t>
+      </w:r>
+      <w:r>
+        <w:t xml:space="preserve"> </w:t>
+      </w:r>
+      <w:r>
+        <w:t xml:space="preserve">by tool. On top of that: a tag-then-act redesign for stage 3’s noise filtering (replacing today’s</w:t>
+      </w:r>
+      <w:r>
+        <w:t xml:space="preserve"> </w:t>
+      </w:r>
+      <w:r>
+        <w:t xml:space="preserve">~15 bespoke, tool-specific predicate functions with one shared classification engine plus a small</w:t>
+      </w:r>
+      <w:r>
+        <w:t xml:space="preserve"> </w:t>
+      </w:r>
+      <w:r>
+        <w:t xml:space="preserve">per-tool action map), a report-formatting style guide (casing, section markers, blank-line/caveat</w:t>
+      </w:r>
+      <w:r>
+        <w:t xml:space="preserve"> </w:t>
+      </w:r>
+      <w:r>
+        <w:t xml:space="preserve">structure, long-name wrapping, a reproducibility-oriented</w:t>
+      </w:r>
+      <w:r>
+        <w:t xml:space="preserve"> </w:t>
+      </w:r>
+      <w:r>
+        <w:rPr>
+          <w:rStyle w:val="VerbatimChar"/>
+        </w:rPr>
+        <w:t xml:space="preserve">command:</w:t>
+      </w:r>
+      <w:r>
+        <w:t xml:space="preserve"> </w:t>
+      </w:r>
+      <w:r>
+        <w:t xml:space="preserve">header line), a test-suite</w:t>
+      </w:r>
+      <w:r>
+        <w:t xml:space="preserve"> </w:t>
+      </w:r>
+      <w:r>
+        <w:t xml:space="preserve">audit mapping all ~180 existing test methods against the new architecture, and a 10-step</w:t>
+      </w:r>
+      <w:r>
+        <w:t xml:space="preserve"> </w:t>
+      </w:r>
+      <w:r>
+        <w:t xml:space="preserve">implementation roadmap sequenced by actual dependency (not by section number). Written to</w:t>
+      </w:r>
+      <w:r>
+        <w:t xml:space="preserve"> </w:t>
+      </w:r>
+      <w:r>
+        <w:rPr>
+          <w:rStyle w:val="VerbatimChar"/>
+        </w:rPr>
+        <w:t xml:space="preserve">docs/plans/2.1-postprocess-consolidation-refactor.md</w:t>
+      </w:r>
+      <w:r>
+        <w:t xml:space="preserve">; a new branch,</w:t>
+      </w:r>
+      <w:r>
+        <w:t xml:space="preserve"> </w:t>
+      </w:r>
+      <w:r>
+        <w:rPr>
+          <w:rStyle w:val="VerbatimChar"/>
+        </w:rPr>
+        <w:t xml:space="preserve">postprocess-consolidation</w:t>
+      </w:r>
+      <w:r>
+        <w:t xml:space="preserve">,</w:t>
+      </w:r>
+      <w:r>
+        <w:t xml:space="preserve"> </w:t>
+      </w:r>
+      <w:r>
+        <w:t xml:space="preserve">was created for this work.</w:t>
+      </w:r>
+    </w:p>
+    <w:p>
+      <w:pPr>
+        <w:pStyle w:val="BodyText"/>
+      </w:pPr>
+      <w:r>
+        <w:t xml:space="preserve">Plan files were renumbered to a</w:t>
+      </w:r>
+      <w:r>
+        <w:t xml:space="preserve"> </w:t>
+      </w:r>
+      <w:r>
+        <w:rPr>
+          <w:rStyle w:val="VerbatimChar"/>
+        </w:rPr>
+        <w:t xml:space="preserve">&lt;major&gt;.&lt;minor&gt;</w:t>
+      </w:r>
+      <w:r>
+        <w:t xml:space="preserve"> </w:t>
+      </w:r>
+      <w:r>
+        <w:t xml:space="preserve">scheme:</w:t>
+      </w:r>
+      <w:r>
+        <w:t xml:space="preserve"> </w:t>
+      </w:r>
+      <w:r>
+        <w:rPr>
+          <w:rStyle w:val="VerbatimChar"/>
+        </w:rPr>
+        <w:t xml:space="preserve">docs/plans/01</w:t>
+      </w:r>
+      <w:r>
+        <w:t xml:space="preserve">-</w:t>
+      </w:r>
+      <w:r>
+        <w:rPr>
+          <w:rStyle w:val="VerbatimChar"/>
+        </w:rPr>
+        <w:t xml:space="preserve">16</w:t>
+      </w:r>
+      <w:r>
+        <w:t xml:space="preserve"> </w:t>
+      </w:r>
+      <w:r>
+        <w:t xml:space="preserve">(the original tool</w:t>
+      </w:r>
+      <w:r>
+        <w:t xml:space="preserve"> </w:t>
+      </w:r>
+      <w:r>
+        <w:t xml:space="preserve">suite, one plan per tool/feature) became</w:t>
+      </w:r>
+      <w:r>
+        <w:t xml:space="preserve"> </w:t>
+      </w:r>
+      <w:r>
+        <w:rPr>
+          <w:rStyle w:val="VerbatimChar"/>
+        </w:rPr>
+        <w:t xml:space="preserve">1.1</w:t>
+      </w:r>
+      <w:r>
+        <w:t xml:space="preserve">-</w:t>
+      </w:r>
+      <w:r>
+        <w:rPr>
+          <w:rStyle w:val="VerbatimChar"/>
+        </w:rPr>
+        <w:t xml:space="preserve">1.16</w:t>
+      </w:r>
+      <w:r>
+        <w:t xml:space="preserve">; this new consolidation plan is</w:t>
+      </w:r>
+      <w:r>
+        <w:t xml:space="preserve"> </w:t>
+      </w:r>
+      <w:r>
+        <w:rPr>
+          <w:rStyle w:val="VerbatimChar"/>
+        </w:rPr>
+        <w:t xml:space="preserve">2.1</w:t>
+      </w:r>
+      <w:r>
+        <w:t xml:space="preserve">, with</w:t>
+      </w:r>
+      <w:r>
+        <w:t xml:space="preserve"> </w:t>
+      </w:r>
+      <w:r>
+        <w:t xml:space="preserve">future plans in this phase continuing as</w:t>
+      </w:r>
+      <w:r>
+        <w:t xml:space="preserve"> </w:t>
+      </w:r>
+      <w:r>
+        <w:rPr>
+          <w:rStyle w:val="VerbatimChar"/>
+        </w:rPr>
+        <w:t xml:space="preserve">2.2</w:t>
+      </w:r>
+      <w:r>
+        <w:t xml:space="preserve">,</w:t>
+      </w:r>
+      <w:r>
+        <w:t xml:space="preserve"> </w:t>
+      </w:r>
+      <w:r>
+        <w:rPr>
+          <w:rStyle w:val="VerbatimChar"/>
+        </w:rPr>
+        <w:t xml:space="preserve">2.3</w:t>
+      </w:r>
+      <w:r>
+        <w:t xml:space="preserve">, etc.</w:t>
+      </w:r>
+      <w:r>
+        <w:t xml:space="preserve"> </w:t>
+      </w:r>
+      <w:r>
+        <w:rPr>
+          <w:rStyle w:val="VerbatimChar"/>
+        </w:rPr>
+        <w:t xml:space="preserve">CLAUDE.md</w:t>
+      </w:r>
+      <w:r>
+        <w:t xml:space="preserve">’s plan-documentation section</w:t>
+      </w:r>
+      <w:r>
+        <w:t xml:space="preserve"> </w:t>
+      </w:r>
+      <w:r>
+        <w:t xml:space="preserve">was updated to describe the new scheme. Per this project’s existing precedent for file renames</w:t>
+      </w:r>
+      <w:r>
+        <w:t xml:space="preserve"> </w:t>
+      </w:r>
+      <w:r>
+        <w:t xml:space="preserve">(the tool-renaming entry above left prior</w:t>
+      </w:r>
+      <w:r>
+        <w:t xml:space="preserve"> </w:t>
+      </w:r>
+      <w:r>
+        <w:rPr>
+          <w:rStyle w:val="VerbatimChar"/>
+        </w:rPr>
+        <w:t xml:space="preserve">DEVELOPMENT_HISTORY.md</w:t>
+      </w:r>
+      <w:r>
+        <w:t xml:space="preserve"> </w:t>
+      </w:r>
+      <w:r>
+        <w:t xml:space="preserve">entries referencing old names</w:t>
+      </w:r>
+      <w:r>
+        <w:t xml:space="preserve"> </w:t>
+      </w:r>
+      <w:r>
+        <w:t xml:space="preserve">untouched, as a historical record), this file’s own prior plan-number references were left as-is;</w:t>
+      </w:r>
+      <w:r>
+        <w:t xml:space="preserve"> </w:t>
+      </w:r>
+      <w:r>
+        <w:t xml:space="preserve">only the one live user-facing pointer in</w:t>
+      </w:r>
+      <w:r>
+        <w:t xml:space="preserve"> </w:t>
+      </w:r>
+      <w:r>
+        <w:rPr>
+          <w:rStyle w:val="VerbatimChar"/>
+        </w:rPr>
+        <w:t xml:space="preserve">README.md</w:t>
+      </w:r>
+      <w:r>
+        <w:t xml:space="preserve"> </w:t>
+      </w:r>
+      <w:r>
+        <w:t xml:space="preserve">and</w:t>
+      </w:r>
+      <w:r>
+        <w:t xml:space="preserve"> </w:t>
+      </w:r>
+      <w:r>
+        <w:rPr>
+          <w:rStyle w:val="VerbatimChar"/>
+        </w:rPr>
+        <w:t xml:space="preserve">CLAUDE.md</w:t>
+      </w:r>
+      <w:r>
+        <w:t xml:space="preserve">’s own convention text were</w:t>
+      </w:r>
+      <w:r>
+        <w:t xml:space="preserve"> </w:t>
+      </w:r>
+      <w:r>
+        <w:t xml:space="preserve">updated to the new filenames.</w:t>
+      </w:r>
+    </w:p>
+    <w:p>
+      <w:pPr>
+        <w:pStyle w:val="BodyText"/>
+      </w:pPr>
+      <w:r>
+        <w:rPr>
+          <w:rStyle w:val="VerbatimChar"/>
+        </w:rPr>
+        <w:t xml:space="preserve">CLAUDE.md</w:t>
+      </w:r>
+      <w:r>
+        <w:t xml:space="preserve"> </w:t>
+      </w:r>
+      <w:r>
+        <w:t xml:space="preserve">also gained a Code Comments section: comments should describe current behavior, not</w:t>
+      </w:r>
+      <w:r>
+        <w:t xml:space="preserve"> </w:t>
+      </w:r>
+      <w:r>
+        <w:t xml:space="preserve">the investigation history behind them (that belongs here, in</w:t>
+      </w:r>
+      <w:r>
+        <w:t xml:space="preserve"> </w:t>
+      </w:r>
+      <w:r>
+        <w:rPr>
+          <w:rStyle w:val="VerbatimChar"/>
+        </w:rPr>
+        <w:t xml:space="preserve">DEVELOPMENT_HISTORY.md</w:t>
+      </w:r>
+      <w:r>
+        <w:t xml:space="preserve">); write for a</w:t>
+      </w:r>
+      <w:r>
+        <w:t xml:space="preserve"> </w:t>
+      </w:r>
+      <w:r>
+        <w:t xml:space="preserve">new developer joining the project, not a project historian; and every module gets a top-of-file</w:t>
+      </w:r>
+      <w:r>
+        <w:t xml:space="preserve"> </w:t>
+      </w:r>
+      <w:r>
+        <w:t xml:space="preserve">docstring covering its scope, the functions it exposes, and its design philosophy. This applies</w:t>
+      </w:r>
+      <w:r>
+        <w:t xml:space="preserve"> </w:t>
+      </w:r>
+      <w:r>
+        <w:t xml:space="preserve">going forward as each piece of code is actually touched during the refactor, with a final sweep</w:t>
+      </w:r>
+      <w:r>
+        <w:t xml:space="preserve"> </w:t>
+      </w:r>
+      <w:r>
+        <w:t xml:space="preserve">(roadmap step 11) planned to catch anything left untouched by the time the rest of the refactor</w:t>
+      </w:r>
+      <w:r>
+        <w:t xml:space="preserve"> </w:t>
+      </w:r>
+      <w:r>
+        <w:t xml:space="preserve">lands.</w:t>
+      </w:r>
+    </w:p>
     <w:bookmarkEnd w:id="63"/>
+    <w:bookmarkEnd w:id="64"/>
     <w:sectPr/>
   </w:body>
 </w:document>

</xml_diff>

<commit_message>
Plan 2.4: split calltree_common.py (roadmap step 3)
Splits calltree_common.py into stage4_rocprofsys_tree.py (tree merge +
kernel attachment) and tree_render.py (rendering only). resolve_run_dirs()
gets its own stage1_run_dirs.py instead of tree_render.py's originally
planned "deliberate exception" slot, after checking its real callers
showed it serves three tools (not two) with zero rendering coupling --
also fixes extract_pop_metrics.py's independent duplicate copy in the
same step (§6 finding 1). Pure relocation, byte-identical real-data
output verified against all 6 test_apps/results/ directories.

Co-Authored-By: Claude Sonnet 5 <noreply@anthropic.com>
</commit_message>
<xml_diff>
--- a/docs/DEVELOPMENT_HISTORY.docx
+++ b/docs/DEVELOPMENT_HISTORY.docx
@@ -10,7 +10,7 @@
         <w:t xml:space="preserve">Development History</w:t>
       </w:r>
     </w:p>
-    <w:bookmarkStart w:id="66" w:name="development-history"/>
+    <w:bookmarkStart w:id="67" w:name="development-history"/>
     <w:p>
       <w:pPr>
         <w:pStyle w:val="Heading1"/>
@@ -1812,6 +1812,146 @@
           </w:p>
         </w:tc>
       </w:tr>
+      <w:tr>
+        <w:tc>
+          <w:tcPr/>
+          <w:p>
+            <w:pPr>
+              <w:pStyle w:val="Compact"/>
+              <w:jc w:val="left"/>
+            </w:pPr>
+            <w:r>
+              <w:t xml:space="preserve">2026-08-13</w:t>
+            </w:r>
+          </w:p>
+        </w:tc>
+        <w:tc>
+          <w:tcPr/>
+          <w:p>
+            <w:pPr>
+              <w:pStyle w:val="Compact"/>
+              <w:jc w:val="left"/>
+            </w:pPr>
+            <w:r>
+              <w:t xml:space="preserve">Plan 2.4: split</w:t>
+            </w:r>
+            <w:r>
+              <w:t xml:space="preserve"> </w:t>
+            </w:r>
+            <w:r>
+              <w:rPr>
+                <w:rStyle w:val="VerbatimChar"/>
+              </w:rPr>
+              <w:t xml:space="preserve">calltree_common.py</w:t>
+            </w:r>
+            <w:r>
+              <w:t xml:space="preserve"> </w:t>
+            </w:r>
+            <w:r>
+              <w:t xml:space="preserve">into</w:t>
+            </w:r>
+            <w:r>
+              <w:t xml:space="preserve"> </w:t>
+            </w:r>
+            <w:r>
+              <w:rPr>
+                <w:rStyle w:val="VerbatimChar"/>
+              </w:rPr>
+              <w:t xml:space="preserve">stage4_rocprofsys_tree.py</w:t>
+            </w:r>
+            <w:r>
+              <w:t xml:space="preserve"> </w:t>
+            </w:r>
+            <w:r>
+              <w:t xml:space="preserve">(tree merge + kernel attachment),</w:t>
+            </w:r>
+            <w:r>
+              <w:t xml:space="preserve"> </w:t>
+            </w:r>
+            <w:r>
+              <w:rPr>
+                <w:rStyle w:val="VerbatimChar"/>
+              </w:rPr>
+              <w:t xml:space="preserve">tree_render.py</w:t>
+            </w:r>
+            <w:r>
+              <w:t xml:space="preserve"> </w:t>
+            </w:r>
+            <w:r>
+              <w:t xml:space="preserve">(rendering), and a new</w:t>
+            </w:r>
+            <w:r>
+              <w:t xml:space="preserve"> </w:t>
+            </w:r>
+            <w:r>
+              <w:rPr>
+                <w:rStyle w:val="VerbatimChar"/>
+              </w:rPr>
+              <w:t xml:space="preserve">stage1_run_dirs.py</w:t>
+            </w:r>
+            <w:r>
+              <w:t xml:space="preserve"> </w:t>
+            </w:r>
+            <w:r>
+              <w:t xml:space="preserve">(</w:t>
+            </w:r>
+            <w:r>
+              <w:rPr>
+                <w:rStyle w:val="VerbatimChar"/>
+              </w:rPr>
+              <w:t xml:space="preserve">resolve_run_dirs()</w:t>
+            </w:r>
+            <w:r>
+              <w:t xml:space="preserve">, moved out of §8’s original</w:t>
+            </w:r>
+            <w:r>
+              <w:t xml:space="preserve"> </w:t>
+            </w:r>
+            <w:r>
+              <w:t xml:space="preserve">“</w:t>
+            </w:r>
+            <w:r>
+              <w:t xml:space="preserve">tree_render.py</w:t>
+            </w:r>
+            <w:r>
+              <w:t xml:space="preserve">”</w:t>
+            </w:r>
+            <w:r>
+              <w:t xml:space="preserve"> </w:t>
+            </w:r>
+            <w:r>
+              <w:t xml:space="preserve">placement after checking its real callers) – roadmap step 3; also fixed</w:t>
+            </w:r>
+            <w:r>
+              <w:t xml:space="preserve"> </w:t>
+            </w:r>
+            <w:r>
+              <w:rPr>
+                <w:rStyle w:val="VerbatimChar"/>
+              </w:rPr>
+              <w:t xml:space="preserve">extract_pop_metrics.py</w:t>
+            </w:r>
+            <w:r>
+              <w:t xml:space="preserve">’s independent duplicate copy of</w:t>
+            </w:r>
+            <w:r>
+              <w:t xml:space="preserve"> </w:t>
+            </w:r>
+            <w:r>
+              <w:rPr>
+                <w:rStyle w:val="VerbatimChar"/>
+              </w:rPr>
+              <w:t xml:space="preserve">resolve_run_dirs()</w:t>
+            </w:r>
+            <w:r>
+              <w:t xml:space="preserve"> </w:t>
+            </w:r>
+            <w:r>
+              <w:t xml:space="preserve">(§6 finding 1) in the same step</w:t>
+            </w:r>
+          </w:p>
+        </w:tc>
+      </w:tr>
     </w:tbl>
     <w:bookmarkStart w:id="20" w:name="project-scaffolding-and-rules"/>
     <w:p>
@@ -29796,7 +29936,986 @@
       </w:r>
     </w:p>
     <w:bookmarkEnd w:id="65"/>
+    <w:bookmarkStart w:id="66" w:name="X51ea8b56d3b635d6513978491c8eddba501d494"/>
+    <w:p>
+      <w:pPr>
+        <w:pStyle w:val="Heading2"/>
+      </w:pPr>
+      <w:r>
+        <w:t xml:space="preserve">2026-08-13 — Plan 2.4: split calltree_common.py (roadmap step 3)</w:t>
+      </w:r>
+    </w:p>
+    <w:p>
+      <w:pPr>
+        <w:pStyle w:val="FirstParagraph"/>
+      </w:pPr>
+      <w:r>
+        <w:t xml:space="preserve">Third implementation step of the consolidation plan:</w:t>
+      </w:r>
+      <w:r>
+        <w:t xml:space="preserve"> </w:t>
+      </w:r>
+      <w:r>
+        <w:rPr>
+          <w:rStyle w:val="VerbatimChar"/>
+        </w:rPr>
+        <w:t xml:space="preserve">calltree_common.py</w:t>
+      </w:r>
+      <w:r>
+        <w:t xml:space="preserve">’s 19 functions/constants</w:t>
+      </w:r>
+      <w:r>
+        <w:t xml:space="preserve"> </w:t>
+      </w:r>
+      <w:r>
+        <w:t xml:space="preserve">split into</w:t>
+      </w:r>
+      <w:r>
+        <w:t xml:space="preserve"> </w:t>
+      </w:r>
+      <w:r>
+        <w:rPr>
+          <w:rStyle w:val="VerbatimChar"/>
+        </w:rPr>
+        <w:t xml:space="preserve">stage4_rocprofsys_tree.py</w:t>
+      </w:r>
+      <w:r>
+        <w:t xml:space="preserve"> </w:t>
+      </w:r>
+      <w:r>
+        <w:t xml:space="preserve">(cross-rank tree merge + GPU kernel attachment –</w:t>
+      </w:r>
+      <w:r>
+        <w:t xml:space="preserve"> </w:t>
+      </w:r>
+      <w:r>
+        <w:rPr>
+          <w:rStyle w:val="VerbatimChar"/>
+        </w:rPr>
+        <w:t xml:space="preserve">merge_rank_trees()</w:t>
+      </w:r>
+      <w:r>
+        <w:t xml:space="preserve">,</w:t>
+      </w:r>
+      <w:r>
+        <w:t xml:space="preserve"> </w:t>
+      </w:r>
+      <w:r>
+        <w:rPr>
+          <w:rStyle w:val="VerbatimChar"/>
+        </w:rPr>
+        <w:t xml:space="preserve">flatten_tree()</w:t>
+      </w:r>
+      <w:r>
+        <w:t xml:space="preserve">,</w:t>
+      </w:r>
+      <w:r>
+        <w:t xml:space="preserve"> </w:t>
+      </w:r>
+      <w:r>
+        <w:rPr>
+          <w:rStyle w:val="VerbatimChar"/>
+        </w:rPr>
+        <w:t xml:space="preserve">aggregate_node_stats()</w:t>
+      </w:r>
+      <w:r>
+        <w:t xml:space="preserve">,</w:t>
+      </w:r>
+      <w:r>
+        <w:t xml:space="preserve"> </w:t>
+      </w:r>
+      <w:r>
+        <w:rPr>
+          <w:rStyle w:val="VerbatimChar"/>
+        </w:rPr>
+        <w:t xml:space="preserve">make_node_values()</w:t>
+      </w:r>
+      <w:r>
+        <w:t xml:space="preserve">,</w:t>
+      </w:r>
+      <w:r>
+        <w:t xml:space="preserve"> </w:t>
+      </w:r>
+      <w:r>
+        <w:rPr>
+          <w:rStyle w:val="VerbatimChar"/>
+        </w:rPr>
+        <w:t xml:space="preserve">attach_kernel_summaries()</w:t>
+      </w:r>
+      <w:r>
+        <w:t xml:space="preserve"> </w:t>
+      </w:r>
+      <w:r>
+        <w:t xml:space="preserve">and its helpers,</w:t>
+      </w:r>
+      <w:r>
+        <w:t xml:space="preserve"> </w:t>
+      </w:r>
+      <w:r>
+        <w:rPr>
+          <w:rStyle w:val="VerbatimChar"/>
+        </w:rPr>
+        <w:t xml:space="preserve">make_kernel_node()</w:t>
+      </w:r>
+      <w:r>
+        <w:t xml:space="preserve">,</w:t>
+      </w:r>
+      <w:r>
+        <w:t xml:space="preserve"> </w:t>
+      </w:r>
+      <w:r>
+        <w:rPr>
+          <w:rStyle w:val="VerbatimChar"/>
+        </w:rPr>
+        <w:t xml:space="preserve">is_kernel_launch()</w:t>
+      </w:r>
+      <w:r>
+        <w:t xml:space="preserve">) and</w:t>
+      </w:r>
+      <w:r>
+        <w:t xml:space="preserve"> </w:t>
+      </w:r>
+      <w:r>
+        <w:rPr>
+          <w:rStyle w:val="VerbatimChar"/>
+        </w:rPr>
+        <w:t xml:space="preserve">tree_render.py</w:t>
+      </w:r>
+      <w:r>
+        <w:t xml:space="preserve"> </w:t>
+      </w:r>
+      <w:r>
+        <w:t xml:space="preserve">(rendering only –</w:t>
+      </w:r>
+      <w:r>
+        <w:t xml:space="preserve"> </w:t>
+      </w:r>
+      <w:r>
+        <w:rPr>
+          <w:rStyle w:val="VerbatimChar"/>
+        </w:rPr>
+        <w:t xml:space="preserve">render_forest()</w:t>
+      </w:r>
+      <w:r>
+        <w:t xml:space="preserve">,</w:t>
+      </w:r>
+      <w:r>
+        <w:t xml:space="preserve"> </w:t>
+      </w:r>
+      <w:r>
+        <w:rPr>
+          <w:rStyle w:val="VerbatimChar"/>
+        </w:rPr>
+        <w:t xml:space="preserve">render_node()</w:t>
+      </w:r>
+      <w:r>
+        <w:t xml:space="preserve">,</w:t>
+      </w:r>
+      <w:r>
+        <w:t xml:space="preserve"> </w:t>
+      </w:r>
+      <w:r>
+        <w:rPr>
+          <w:rStyle w:val="VerbatimChar"/>
+        </w:rPr>
+        <w:t xml:space="preserve">get_children()</w:t>
+      </w:r>
+      <w:r>
+        <w:t xml:space="preserve">,</w:t>
+      </w:r>
+      <w:r>
+        <w:t xml:space="preserve"> </w:t>
+      </w:r>
+      <w:r>
+        <w:rPr>
+          <w:rStyle w:val="VerbatimChar"/>
+        </w:rPr>
+        <w:t xml:space="preserve">count_all_descendants()</w:t>
+      </w:r>
+      <w:r>
+        <w:t xml:space="preserve">,</w:t>
+      </w:r>
+      <w:r>
+        <w:t xml:space="preserve"> </w:t>
+      </w:r>
+      <w:r>
+        <w:rPr>
+          <w:rStyle w:val="VerbatimChar"/>
+        </w:rPr>
+        <w:t xml:space="preserve">build_children_map()</w:t>
+      </w:r>
+      <w:r>
+        <w:t xml:space="preserve">,</w:t>
+      </w:r>
+      <w:r>
+        <w:t xml:space="preserve"> </w:t>
+      </w:r>
+      <w:r>
+        <w:rPr>
+          <w:rStyle w:val="VerbatimChar"/>
+        </w:rPr>
+        <w:t xml:space="preserve">format_aligned_rows()</w:t>
+      </w:r>
+      <w:r>
+        <w:t xml:space="preserve">). Both candidate groups</w:t>
+      </w:r>
+      <w:r>
+        <w:t xml:space="preserve"> </w:t>
+      </w:r>
+      <w:r>
+        <w:t xml:space="preserve">were confirmed internally closed (no cross-calls between them) before writing the plan, so the</w:t>
+      </w:r>
+      <w:r>
+        <w:t xml:space="preserve"> </w:t>
+      </w:r>
+      <w:r>
+        <w:t xml:space="preserve">split changed only import surfaces, never logic.</w:t>
+      </w:r>
+    </w:p>
+    <w:p>
+      <w:pPr>
+        <w:pStyle w:val="BodyText"/>
+      </w:pPr>
+      <w:r>
+        <w:rPr>
+          <w:rStyle w:val="VerbatimChar"/>
+        </w:rPr>
+        <w:t xml:space="preserve">resolve_run_dirs()</w:t>
+      </w:r>
+      <w:r>
+        <w:t xml:space="preserve"> </w:t>
+      </w:r>
+      <w:r>
+        <w:t xml:space="preserve">didn’t land where</w:t>
+      </w:r>
+      <w:r>
+        <w:t xml:space="preserve"> </w:t>
+      </w:r>
+      <w:r>
+        <w:rPr>
+          <w:rStyle w:val="VerbatimChar"/>
+        </w:rPr>
+        <w:t xml:space="preserve">docs/plans/2.1-postprocess-consolidation-refactor.md</w:t>
+      </w:r>
+      <w:r>
+        <w:t xml:space="preserve"> </w:t>
+      </w:r>
+      <w:r>
+        <w:t xml:space="preserve">§8</w:t>
+      </w:r>
+      <w:r>
+        <w:t xml:space="preserve"> </w:t>
+      </w:r>
+      <w:r>
+        <w:t xml:space="preserve">originally said it would. Checking its actual call sites (rather than trusting the year-old design</w:t>
+      </w:r>
+      <w:r>
+        <w:t xml:space="preserve"> </w:t>
+      </w:r>
+      <w:r>
+        <w:t xml:space="preserve">doc) found it serves three tools, not two –</w:t>
+      </w:r>
+      <w:r>
+        <w:t xml:space="preserve"> </w:t>
+      </w:r>
+      <w:r>
+        <w:rPr>
+          <w:rStyle w:val="VerbatimChar"/>
+        </w:rPr>
+        <w:t xml:space="preserve">extract_pop_metrics.py</w:t>
+      </w:r>
+      <w:r>
+        <w:t xml:space="preserve"> </w:t>
+      </w:r>
+      <w:r>
+        <w:t xml:space="preserve">had its own fully</w:t>
+      </w:r>
+      <w:r>
+        <w:t xml:space="preserve"> </w:t>
+      </w:r>
+      <w:r>
+        <w:t xml:space="preserve">independent, byte-for-byte-identical copy that never imported from</w:t>
+      </w:r>
+      <w:r>
+        <w:t xml:space="preserve"> </w:t>
+      </w:r>
+      <w:r>
+        <w:rPr>
+          <w:rStyle w:val="VerbatimChar"/>
+        </w:rPr>
+        <w:t xml:space="preserve">calltree_common</w:t>
+      </w:r>
+      <w:r>
+        <w:t xml:space="preserve"> </w:t>
+      </w:r>
+      <w:r>
+        <w:t xml:space="preserve">at all (§6</w:t>
+      </w:r>
+      <w:r>
+        <w:t xml:space="preserve"> </w:t>
+      </w:r>
+      <w:r>
+        <w:t xml:space="preserve">finding 1, a duplication the master plan itself flagged as looking</w:t>
+      </w:r>
+      <w:r>
+        <w:t xml:space="preserve"> </w:t>
+      </w:r>
+      <w:r>
+        <w:t xml:space="preserve">“</w:t>
+      </w:r>
+      <w:r>
+        <w:t xml:space="preserve">accidental rather than</w:t>
+      </w:r>
+      <w:r>
+        <w:t xml:space="preserve"> </w:t>
+      </w:r>
+      <w:r>
+        <w:t xml:space="preserve">declared</w:t>
+      </w:r>
+      <w:r>
+        <w:t xml:space="preserve">”</w:t>
+      </w:r>
+      <w:r>
+        <w:t xml:space="preserve">). With zero coupling to rendering, trees, or merging, it got its own single-function</w:t>
+      </w:r>
+      <w:r>
+        <w:t xml:space="preserve"> </w:t>
+      </w:r>
+      <w:r>
+        <w:t xml:space="preserve">module,</w:t>
+      </w:r>
+      <w:r>
+        <w:t xml:space="preserve"> </w:t>
+      </w:r>
+      <w:r>
+        <w:rPr>
+          <w:rStyle w:val="VerbatimChar"/>
+        </w:rPr>
+        <w:t xml:space="preserve">stage1_run_dirs.py</w:t>
+      </w:r>
+      <w:r>
+        <w:t xml:space="preserve">, instead of</w:t>
+      </w:r>
+      <w:r>
+        <w:t xml:space="preserve"> </w:t>
+      </w:r>
+      <w:r>
+        <w:rPr>
+          <w:rStyle w:val="VerbatimChar"/>
+        </w:rPr>
+        <w:t xml:space="preserve">tree_render.py</w:t>
+      </w:r>
+      <w:r>
+        <w:t xml:space="preserve">’s</w:t>
+      </w:r>
+      <w:r>
+        <w:t xml:space="preserve"> </w:t>
+      </w:r>
+      <w:r>
+        <w:t xml:space="preserve">“</w:t>
+      </w:r>
+      <w:r>
+        <w:t xml:space="preserve">deliberate exception</w:t>
+      </w:r>
+      <w:r>
+        <w:t xml:space="preserve">”</w:t>
+      </w:r>
+      <w:r>
+        <w:t xml:space="preserve"> </w:t>
+      </w:r>
+      <w:r>
+        <w:t xml:space="preserve">slot – and since</w:t>
+      </w:r>
+      <w:r>
+        <w:t xml:space="preserve"> </w:t>
+      </w:r>
+      <w:r>
+        <w:t xml:space="preserve">its only remaining real copy was already being relocated,</w:t>
+      </w:r>
+      <w:r>
+        <w:t xml:space="preserve"> </w:t>
+      </w:r>
+      <w:r>
+        <w:rPr>
+          <w:rStyle w:val="VerbatimChar"/>
+        </w:rPr>
+        <w:t xml:space="preserve">extract_pop_metrics.py</w:t>
+      </w:r>
+      <w:r>
+        <w:t xml:space="preserve">’s duplicate was</w:t>
+      </w:r>
+      <w:r>
+        <w:t xml:space="preserve"> </w:t>
+      </w:r>
+      <w:r>
+        <w:t xml:space="preserve">deleted and pointed at the new module in the same step, closing §6 finding 1 rather than leaving it</w:t>
+      </w:r>
+      <w:r>
+        <w:t xml:space="preserve"> </w:t>
+      </w:r>
+      <w:r>
+        <w:t xml:space="preserve">for a future pass.</w:t>
+      </w:r>
+      <w:r>
+        <w:t xml:space="preserve"> </w:t>
+      </w:r>
+      <w:r>
+        <w:rPr>
+          <w:rStyle w:val="VerbatimChar"/>
+        </w:rPr>
+        <w:t xml:space="preserve">docs/plans/2.1-postprocess-consolidation-refactor.md</w:t>
+      </w:r>
+      <w:r>
+        <w:t xml:space="preserve"> </w:t>
+      </w:r>
+      <w:r>
+        <w:t xml:space="preserve">§8 got a short header</w:t>
+      </w:r>
+      <w:r>
+        <w:t xml:space="preserve"> </w:t>
+      </w:r>
+      <w:r>
+        <w:t xml:space="preserve">note recording this divergence, per</w:t>
+      </w:r>
+      <w:r>
+        <w:t xml:space="preserve"> </w:t>
+      </w:r>
+      <w:r>
+        <w:rPr>
+          <w:rStyle w:val="VerbatimChar"/>
+        </w:rPr>
+        <w:t xml:space="preserve">CLAUDE.md</w:t>
+      </w:r>
+      <w:r>
+        <w:t xml:space="preserve">’s divergence-tracking convention.</w:t>
+      </w:r>
+    </w:p>
+    <w:p>
+      <w:pPr>
+        <w:pStyle w:val="BodyText"/>
+      </w:pPr>
+      <w:r>
+        <w:t xml:space="preserve">Two split-induced docstring cross-references got module-name prefixes (</w:t>
+      </w:r>
+      <w:r>
+        <w:rPr>
+          <w:rStyle w:val="VerbatimChar"/>
+        </w:rPr>
+        <w:t xml:space="preserve">REPORT_HEADERS</w:t>
+      </w:r>
+      <w:r>
+        <w:t xml:space="preserve">’s comment</w:t>
+      </w:r>
+      <w:r>
+        <w:t xml:space="preserve"> </w:t>
+      </w:r>
+      <w:r>
+        <w:t xml:space="preserve">naming</w:t>
+      </w:r>
+      <w:r>
+        <w:t xml:space="preserve"> </w:t>
+      </w:r>
+      <w:r>
+        <w:rPr>
+          <w:rStyle w:val="VerbatimChar"/>
+        </w:rPr>
+        <w:t xml:space="preserve">merge_rank_trees()</w:t>
+      </w:r>
+      <w:r>
+        <w:t xml:space="preserve">/</w:t>
+      </w:r>
+      <w:r>
+        <w:rPr>
+          <w:rStyle w:val="VerbatimChar"/>
+        </w:rPr>
+        <w:t xml:space="preserve">aggregate_node_stats()</w:t>
+      </w:r>
+      <w:r>
+        <w:t xml:space="preserve">;</w:t>
+      </w:r>
+      <w:r>
+        <w:t xml:space="preserve"> </w:t>
+      </w:r>
+      <w:r>
+        <w:rPr>
+          <w:rStyle w:val="VerbatimChar"/>
+        </w:rPr>
+        <w:t xml:space="preserve">make_kernel_node()</w:t>
+      </w:r>
+      <w:r>
+        <w:t xml:space="preserve">’s docstring naming</w:t>
+      </w:r>
+      <w:r>
+        <w:t xml:space="preserve"> </w:t>
+      </w:r>
+      <w:r>
+        <w:rPr>
+          <w:rStyle w:val="VerbatimChar"/>
+        </w:rPr>
+        <w:t xml:space="preserve">render_node()</w:t>
+      </w:r>
+      <w:r>
+        <w:t xml:space="preserve">) now that the functions they describe live in a sibling file.</w:t>
+      </w:r>
+      <w:r>
+        <w:t xml:space="preserve"> </w:t>
+      </w:r>
+      <w:r>
+        <w:rPr>
+          <w:rStyle w:val="VerbatimChar"/>
+        </w:rPr>
+        <w:t xml:space="preserve">tree_render.py</w:t>
+      </w:r>
+      <w:r>
+        <w:t xml:space="preserve">’s</w:t>
+      </w:r>
+      <w:r>
+        <w:t xml:space="preserve"> </w:t>
+      </w:r>
+      <w:r>
+        <w:t xml:space="preserve">own docstring also notes a real but indirect data-shape coupling:</w:t>
+      </w:r>
+      <w:r>
+        <w:t xml:space="preserve"> </w:t>
+      </w:r>
+      <w:r>
+        <w:rPr>
+          <w:rStyle w:val="VerbatimChar"/>
+        </w:rPr>
+        <w:t xml:space="preserve">get_children()</w:t>
+      </w:r>
+      <w:r>
+        <w:t xml:space="preserve"> </w:t>
+      </w:r>
+      <w:r>
+        <w:t xml:space="preserve">reads a</w:t>
+      </w:r>
+      <w:r>
+        <w:t xml:space="preserve"> </w:t>
+      </w:r>
+      <w:r>
+        <w:rPr>
+          <w:rStyle w:val="VerbatimChar"/>
+        </w:rPr>
+        <w:t xml:space="preserve">"static_children"</w:t>
+      </w:r>
+      <w:r>
+        <w:t xml:space="preserve"> </w:t>
+      </w:r>
+      <w:r>
+        <w:t xml:space="preserve">list every node is expected to carry, populated by</w:t>
+      </w:r>
+      <w:r>
+        <w:t xml:space="preserve"> </w:t>
+      </w:r>
+      <w:r>
+        <w:rPr>
+          <w:rStyle w:val="VerbatimChar"/>
+        </w:rPr>
+        <w:t xml:space="preserve">stage4_rocprofsys_tree.py</w:t>
+      </w:r>
+      <w:r>
+        <w:t xml:space="preserve">’s</w:t>
+      </w:r>
+      <w:r>
+        <w:t xml:space="preserve"> </w:t>
+      </w:r>
+      <w:r>
+        <w:rPr>
+          <w:rStyle w:val="VerbatimChar"/>
+        </w:rPr>
+        <w:t xml:space="preserve">merge_rank_trees()</w:t>
+      </w:r>
+      <w:r>
+        <w:t xml:space="preserve">/</w:t>
+      </w:r>
+      <w:r>
+        <w:rPr>
+          <w:rStyle w:val="VerbatimChar"/>
+        </w:rPr>
+        <w:t xml:space="preserve">make_kernel_node()</w:t>
+      </w:r>
+      <w:r>
+        <w:t xml:space="preserve">/</w:t>
+      </w:r>
+      <w:r>
+        <w:rPr>
+          <w:rStyle w:val="VerbatimChar"/>
+        </w:rPr>
+        <w:t xml:space="preserve">_attach_kernel_group()</w:t>
+      </w:r>
+      <w:r>
+        <w:t xml:space="preserve">,</w:t>
+      </w:r>
+      <w:r>
+        <w:t xml:space="preserve"> </w:t>
+      </w:r>
+      <w:r>
+        <w:t xml:space="preserve">with no import needed either direction.</w:t>
+      </w:r>
+    </w:p>
+    <w:p>
+      <w:pPr>
+        <w:pStyle w:val="BodyText"/>
+      </w:pPr>
+      <w:r>
+        <w:t xml:space="preserve">Test classes split the same way tests were split for the two new source modules</w:t>
+      </w:r>
+      <w:r>
+        <w:t xml:space="preserve"> </w:t>
+      </w:r>
+      <w:r>
+        <w:t xml:space="preserve">(</w:t>
+      </w:r>
+      <w:r>
+        <w:rPr>
+          <w:rStyle w:val="VerbatimChar"/>
+        </w:rPr>
+        <w:t xml:space="preserve">test_stage4_rocprofsys_tree.py</w:t>
+      </w:r>
+      <w:r>
+        <w:t xml:space="preserve">,</w:t>
+      </w:r>
+      <w:r>
+        <w:t xml:space="preserve"> </w:t>
+      </w:r>
+      <w:r>
+        <w:rPr>
+          <w:rStyle w:val="VerbatimChar"/>
+        </w:rPr>
+        <w:t xml:space="preserve">test_tree_render.py</w:t>
+      </w:r>
+      <w:r>
+        <w:t xml:space="preserve">), plus a new</w:t>
+      </w:r>
+      <w:r>
+        <w:t xml:space="preserve"> </w:t>
+      </w:r>
+      <w:r>
+        <w:rPr>
+          <w:rStyle w:val="VerbatimChar"/>
+        </w:rPr>
+        <w:t xml:space="preserve">test_stage1_run_dirs.py</w:t>
+      </w:r>
+      <w:r>
+        <w:t xml:space="preserve">.</w:t>
+      </w:r>
+      <w:r>
+        <w:t xml:space="preserve"> </w:t>
+      </w:r>
+      <w:r>
+        <w:rPr>
+          <w:rStyle w:val="VerbatimChar"/>
+        </w:rPr>
+        <w:t xml:space="preserve">ResolveRunDirsTests</w:t>
+      </w:r>
+      <w:r>
+        <w:t xml:space="preserve"> </w:t>
+      </w:r>
+      <w:r>
+        <w:t xml:space="preserve">existed twice before this step too – one thin case in</w:t>
+      </w:r>
+      <w:r>
+        <w:t xml:space="preserve"> </w:t>
+      </w:r>
+      <w:r>
+        <w:rPr>
+          <w:rStyle w:val="VerbatimChar"/>
+        </w:rPr>
+        <w:t xml:space="preserve">test_calltree_common.py</w:t>
+      </w:r>
+      <w:r>
+        <w:t xml:space="preserve">, three fuller cases in</w:t>
+      </w:r>
+      <w:r>
+        <w:t xml:space="preserve"> </w:t>
+      </w:r>
+      <w:r>
+        <w:rPr>
+          <w:rStyle w:val="VerbatimChar"/>
+        </w:rPr>
+        <w:t xml:space="preserve">test_extract_pop_metrics.py</w:t>
+      </w:r>
+      <w:r>
+        <w:t xml:space="preserve"> </w:t>
+      </w:r>
+      <w:r>
+        <w:t xml:space="preserve">– consolidated into</w:t>
+      </w:r>
+      <w:r>
+        <w:t xml:space="preserve"> </w:t>
+      </w:r>
+      <w:r>
+        <w:t xml:space="preserve">the fuller three-case version in</w:t>
+      </w:r>
+      <w:r>
+        <w:t xml:space="preserve"> </w:t>
+      </w:r>
+      <w:r>
+        <w:rPr>
+          <w:rStyle w:val="VerbatimChar"/>
+        </w:rPr>
+        <w:t xml:space="preserve">test_stage1_run_dirs.py</w:t>
+      </w:r>
+      <w:r>
+        <w:t xml:space="preserve">, with the redundant thin copy dropped</w:t>
+      </w:r>
+      <w:r>
+        <w:t xml:space="preserve"> </w:t>
+      </w:r>
+      <w:r>
+        <w:t xml:space="preserve">and</w:t>
+      </w:r>
+      <w:r>
+        <w:t xml:space="preserve"> </w:t>
+      </w:r>
+      <w:r>
+        <w:rPr>
+          <w:rStyle w:val="VerbatimChar"/>
+        </w:rPr>
+        <w:t xml:space="preserve">test_extract_pop_metrics.py</w:t>
+      </w:r>
+      <w:r>
+        <w:t xml:space="preserve">’s copy removed now that it imports the function instead of</w:t>
+      </w:r>
+      <w:r>
+        <w:t xml:space="preserve"> </w:t>
+      </w:r>
+      <w:r>
+        <w:t xml:space="preserve">defining it. Full suite: 306 tests (net -1 from 307, all from that de-duplication), all passing.</w:t>
+      </w:r>
+    </w:p>
+    <w:p>
+      <w:pPr>
+        <w:pStyle w:val="BodyText"/>
+      </w:pPr>
+      <w:r>
+        <w:t xml:space="preserve">Deleting</w:t>
+      </w:r>
+      <w:r>
+        <w:t xml:space="preserve"> </w:t>
+      </w:r>
+      <w:r>
+        <w:rPr>
+          <w:rStyle w:val="VerbatimChar"/>
+        </w:rPr>
+        <w:t xml:space="preserve">test_calltree_common.py</w:t>
+      </w:r>
+      <w:r>
+        <w:t xml:space="preserve"> </w:t>
+      </w:r>
+      <w:r>
+        <w:t xml:space="preserve">surfaced a latent bug in the test suite’s own setup: it had been</w:t>
+      </w:r>
+      <w:r>
+        <w:t xml:space="preserve"> </w:t>
+      </w:r>
+      <w:r>
+        <w:t xml:space="preserve">the alphabetically-first test file to insert</w:t>
+      </w:r>
+      <w:r>
+        <w:t xml:space="preserve"> </w:t>
+      </w:r>
+      <w:r>
+        <w:rPr>
+          <w:rStyle w:val="VerbatimChar"/>
+        </w:rPr>
+        <w:t xml:space="preserve">postprocess/</w:t>
+      </w:r>
+      <w:r>
+        <w:t xml:space="preserve"> </w:t>
+      </w:r>
+      <w:r>
+        <w:t xml:space="preserve">onto</w:t>
+      </w:r>
+      <w:r>
+        <w:t xml:space="preserve"> </w:t>
+      </w:r>
+      <w:r>
+        <w:rPr>
+          <w:rStyle w:val="VerbatimChar"/>
+        </w:rPr>
+        <w:t xml:space="preserve">sys.path</w:t>
+      </w:r>
+      <w:r>
+        <w:t xml:space="preserve">, and</w:t>
+      </w:r>
+      <w:r>
+        <w:t xml:space="preserve"> </w:t>
+      </w:r>
+      <w:r>
+        <w:rPr>
+          <w:rStyle w:val="VerbatimChar"/>
+        </w:rPr>
+        <w:t xml:space="preserve">test_extract_CPU_hotspots.py</w:t>
+      </w:r>
+      <w:r>
+        <w:t xml:space="preserve">/</w:t>
+      </w:r>
+      <w:r>
+        <w:rPr>
+          <w:rStyle w:val="VerbatimChar"/>
+        </w:rPr>
+        <w:t xml:space="preserve">test_extract_GPU_hotspots.py</w:t>
+      </w:r>
+      <w:r>
+        <w:t xml:space="preserve"> </w:t>
+      </w:r>
+      <w:r>
+        <w:t xml:space="preserve">were silently relying on that</w:t>
+      </w:r>
+      <w:r>
+        <w:t xml:space="preserve"> </w:t>
+      </w:r>
+      <w:r>
+        <w:t xml:space="preserve">incidental ordering rather than doing it themselves. Fixed by giving both their own</w:t>
+      </w:r>
+      <w:r>
+        <w:t xml:space="preserve"> </w:t>
+      </w:r>
+      <w:r>
+        <w:rPr>
+          <w:rStyle w:val="VerbatimChar"/>
+        </w:rPr>
+        <w:t xml:space="preserve">sys.path.insert()</w:t>
+      </w:r>
+      <w:r>
+        <w:t xml:space="preserve">, matching every other test file’s established pattern, rather than restoring</w:t>
+      </w:r>
+      <w:r>
+        <w:t xml:space="preserve"> </w:t>
+      </w:r>
+      <w:r>
+        <w:t xml:space="preserve">the accidental ordering.</w:t>
+      </w:r>
+    </w:p>
+    <w:p>
+      <w:pPr>
+        <w:pStyle w:val="BodyText"/>
+      </w:pPr>
+      <w:r>
+        <w:t xml:space="preserve">Re-ran</w:t>
+      </w:r>
+      <w:r>
+        <w:t xml:space="preserve"> </w:t>
+      </w:r>
+      <w:r>
+        <w:rPr>
+          <w:rStyle w:val="VerbatimChar"/>
+        </w:rPr>
+        <w:t xml:space="preserve">extract_calltree.py</w:t>
+      </w:r>
+      <w:r>
+        <w:t xml:space="preserve">/</w:t>
+      </w:r>
+      <w:r>
+        <w:rPr>
+          <w:rStyle w:val="VerbatimChar"/>
+        </w:rPr>
+        <w:t xml:space="preserve">extract_calltree_traced.py</w:t>
+      </w:r>
+      <w:r>
+        <w:t xml:space="preserve">/</w:t>
+      </w:r>
+      <w:r>
+        <w:rPr>
+          <w:rStyle w:val="VerbatimChar"/>
+        </w:rPr>
+        <w:t xml:space="preserve">extract_pop_metrics.py</w:t>
+      </w:r>
+      <w:r>
+        <w:t xml:space="preserve"> </w:t>
+      </w:r>
+      <w:r>
+        <w:t xml:space="preserve">against all 6</w:t>
+      </w:r>
+      <w:r>
+        <w:t xml:space="preserve"> </w:t>
+      </w:r>
+      <w:r>
+        <w:t xml:space="preserve">real</w:t>
+      </w:r>
+      <w:r>
+        <w:t xml:space="preserve"> </w:t>
+      </w:r>
+      <w:r>
+        <w:rPr>
+          <w:rStyle w:val="VerbatimChar"/>
+        </w:rPr>
+        <w:t xml:space="preserve">test_apps/results/</w:t>
+      </w:r>
+      <w:r>
+        <w:t xml:space="preserve"> </w:t>
+      </w:r>
+      <w:r>
+        <w:t xml:space="preserve">directories:</w:t>
+      </w:r>
+      <w:r>
+        <w:t xml:space="preserve"> </w:t>
+      </w:r>
+      <w:r>
+        <w:rPr>
+          <w:rStyle w:val="VerbatimChar"/>
+        </w:rPr>
+        <w:t xml:space="preserve">extract_calltree.py</w:t>
+      </w:r>
+      <w:r>
+        <w:t xml:space="preserve">/</w:t>
+      </w:r>
+      <w:r>
+        <w:rPr>
+          <w:rStyle w:val="VerbatimChar"/>
+        </w:rPr>
+        <w:t xml:space="preserve">extract_pop_metrics.py</w:t>
+      </w:r>
+      <w:r>
+        <w:t xml:space="preserve"> </w:t>
+      </w:r>
+      <w:r>
+        <w:t xml:space="preserve">byte-identical</w:t>
+      </w:r>
+      <w:r>
+        <w:t xml:space="preserve"> </w:t>
+      </w:r>
+      <w:r>
+        <w:t xml:space="preserve">to the pre-change backup except timestamps;</w:t>
+      </w:r>
+      <w:r>
+        <w:t xml:space="preserve"> </w:t>
+      </w:r>
+      <w:r>
+        <w:rPr>
+          <w:rStyle w:val="VerbatimChar"/>
+        </w:rPr>
+        <w:t xml:space="preserve">extract_calltree_traced.py</w:t>
+      </w:r>
+      <w:r>
+        <w:t xml:space="preserve"> </w:t>
+      </w:r>
+      <w:r>
+        <w:t xml:space="preserve">(no standalone baseline</w:t>
+      </w:r>
+      <w:r>
+        <w:t xml:space="preserve"> </w:t>
+      </w:r>
+      <w:r>
+        <w:t xml:space="preserve">previously saved in these directories) verified instead by running both the pre-plan-2.4 code</w:t>
+      </w:r>
+      <w:r>
+        <w:t xml:space="preserve"> </w:t>
+      </w:r>
+      <w:r>
+        <w:t xml:space="preserve">(from git HEAD) and the post-split code side by side and diffing their output directly – also</w:t>
+      </w:r>
+      <w:r>
+        <w:t xml:space="preserve"> </w:t>
+      </w:r>
+      <w:r>
+        <w:t xml:space="preserve">byte-identical except timestamps.</w:t>
+      </w:r>
+    </w:p>
     <w:bookmarkEnd w:id="66"/>
+    <w:bookmarkEnd w:id="67"/>
     <w:sectPr/>
   </w:body>
 </w:document>

</xml_diff>

<commit_message>
Plan 2.5: stage-3 noise-filtering engine, built in isolation (roadmap step 4)
Adds stage3_rocprofsys.py, a shared tag-then-act noise-classification
engine (5 scopes, patterns from default_noise_patterns.json) plus generic
action primitives (remove_tagged_subtrees, splice_by_tag with new "fold"
support, make_collapses_children/make_is_pruned). Not wired into any tool
yet -- that's roadmap step 5. Generalizes the untethered-root
first-real-descendant inheritance mechanism from GPU-only to any tag.

Co-Authored-By: Claude Sonnet 5 <noreply@anthropic.com>
</commit_message>
<xml_diff>
--- a/docs/DEVELOPMENT_HISTORY.docx
+++ b/docs/DEVELOPMENT_HISTORY.docx
@@ -10,7 +10,7 @@
         <w:t xml:space="preserve">Development History</w:t>
       </w:r>
     </w:p>
-    <w:bookmarkStart w:id="67" w:name="development-history"/>
+    <w:bookmarkStart w:id="68" w:name="development-history"/>
     <w:p>
       <w:pPr>
         <w:pStyle w:val="Heading1"/>
@@ -1952,6 +1952,101 @@
           </w:p>
         </w:tc>
       </w:tr>
+      <w:tr>
+        <w:tc>
+          <w:tcPr/>
+          <w:p>
+            <w:pPr>
+              <w:pStyle w:val="Compact"/>
+              <w:jc w:val="left"/>
+            </w:pPr>
+            <w:r>
+              <w:t xml:space="preserve">2026-08-13</w:t>
+            </w:r>
+          </w:p>
+        </w:tc>
+        <w:tc>
+          <w:tcPr/>
+          <w:p>
+            <w:pPr>
+              <w:pStyle w:val="Compact"/>
+              <w:jc w:val="left"/>
+            </w:pPr>
+            <w:r>
+              <w:t xml:space="preserve">Plan 2.5: built the shared stage-3 noise-classification engine (</w:t>
+            </w:r>
+            <w:r>
+              <w:rPr>
+                <w:rStyle w:val="VerbatimChar"/>
+              </w:rPr>
+              <w:t xml:space="preserve">stage3_rocprofsys.py</w:t>
+            </w:r>
+            <w:r>
+              <w:t xml:space="preserve">,</w:t>
+            </w:r>
+            <w:r>
+              <w:t xml:space="preserve"> </w:t>
+            </w:r>
+            <w:r>
+              <w:rPr>
+                <w:rStyle w:val="VerbatimChar"/>
+              </w:rPr>
+              <w:t xml:space="preserve">default_noise_patterns.json</w:t>
+            </w:r>
+            <w:r>
+              <w:t xml:space="preserve">) in isolation, not wired into any tool yet – roadmap step 4; implements</w:t>
+            </w:r>
+            <w:r>
+              <w:t xml:space="preserve"> </w:t>
+            </w:r>
+            <w:r>
+              <w:rPr>
+                <w:rStyle w:val="VerbatimChar"/>
+              </w:rPr>
+              <w:t xml:space="preserve">splice</w:t>
+            </w:r>
+            <w:r>
+              <w:t xml:space="preserve">’s</w:t>
+            </w:r>
+            <w:r>
+              <w:t xml:space="preserve"> </w:t>
+            </w:r>
+            <w:r>
+              <w:t xml:space="preserve">“</w:t>
+            </w:r>
+            <w:r>
+              <w:t xml:space="preserve">fold</w:t>
+            </w:r>
+            <w:r>
+              <w:t xml:space="preserve">”</w:t>
+            </w:r>
+            <w:r>
+              <w:t xml:space="preserve"> </w:t>
+            </w:r>
+            <w:r>
+              <w:t xml:space="preserve">self-time-into-new-parent behavior for the first time, and generalizes the untethered-root</w:t>
+            </w:r>
+            <w:r>
+              <w:t xml:space="preserve"> </w:t>
+            </w:r>
+            <w:r>
+              <w:t xml:space="preserve">“</w:t>
+            </w:r>
+            <w:r>
+              <w:t xml:space="preserve">inherit from first real descendant</w:t>
+            </w:r>
+            <w:r>
+              <w:t xml:space="preserve">”</w:t>
+            </w:r>
+            <w:r>
+              <w:t xml:space="preserve"> </w:t>
+            </w:r>
+            <w:r>
+              <w:t xml:space="preserve">mechanism from GPU-only to any tag (e.g. MPI)</w:t>
+            </w:r>
+          </w:p>
+        </w:tc>
+      </w:tr>
     </w:tbl>
     <w:bookmarkStart w:id="20" w:name="project-scaffolding-and-rules"/>
     <w:p>
@@ -30915,7 +31010,701 @@
       </w:r>
     </w:p>
     <w:bookmarkEnd w:id="66"/>
+    <w:bookmarkStart w:id="67" w:name="Xb4e4eba8b1c0684dc0c6929f87b58f1138fcc56"/>
+    <w:p>
+      <w:pPr>
+        <w:pStyle w:val="Heading2"/>
+      </w:pPr>
+      <w:r>
+        <w:t xml:space="preserve">2026-08-13 — Plan 2.5: stage-3 noise-filtering engine, built in isolation (roadmap step 4)</w:t>
+      </w:r>
+    </w:p>
+    <w:p>
+      <w:pPr>
+        <w:pStyle w:val="FirstParagraph"/>
+      </w:pPr>
+      <w:r>
+        <w:t xml:space="preserve">Fourth implementation step of the consolidation plan, and the first genuinely new design (not a</w:t>
+      </w:r>
+      <w:r>
+        <w:t xml:space="preserve"> </w:t>
+      </w:r>
+      <w:r>
+        <w:t xml:space="preserve">pure relocation): a shared</w:t>
+      </w:r>
+      <w:r>
+        <w:t xml:space="preserve"> </w:t>
+      </w:r>
+      <w:r>
+        <w:t xml:space="preserve">“</w:t>
+      </w:r>
+      <w:r>
+        <w:t xml:space="preserve">tag-then-act</w:t>
+      </w:r>
+      <w:r>
+        <w:t xml:space="preserve">”</w:t>
+      </w:r>
+      <w:r>
+        <w:t xml:space="preserve"> </w:t>
+      </w:r>
+      <w:r>
+        <w:t xml:space="preserve">engine replacing today’s ~15 hand-written noise-</w:t>
+      </w:r>
+      <w:r>
+        <w:t xml:space="preserve"> </w:t>
+      </w:r>
+      <w:r>
+        <w:t xml:space="preserve">classification functions spread across</w:t>
+      </w:r>
+      <w:r>
+        <w:t xml:space="preserve"> </w:t>
+      </w:r>
+      <w:r>
+        <w:rPr>
+          <w:rStyle w:val="VerbatimChar"/>
+        </w:rPr>
+        <w:t xml:space="preserve">extract_CPU_hotspots.py</w:t>
+      </w:r>
+      <w:r>
+        <w:t xml:space="preserve">,</w:t>
+      </w:r>
+      <w:r>
+        <w:t xml:space="preserve"> </w:t>
+      </w:r>
+      <w:r>
+        <w:rPr>
+          <w:rStyle w:val="VerbatimChar"/>
+        </w:rPr>
+        <w:t xml:space="preserve">extract_calltree.py</w:t>
+      </w:r>
+      <w:r>
+        <w:t xml:space="preserve">, and</w:t>
+      </w:r>
+      <w:r>
+        <w:t xml:space="preserve"> </w:t>
+      </w:r>
+      <w:r>
+        <w:rPr>
+          <w:rStyle w:val="VerbatimChar"/>
+        </w:rPr>
+        <w:t xml:space="preserve">extract_calltree_traced.py</w:t>
+      </w:r>
+      <w:r>
+        <w:t xml:space="preserve">. Three Explore passes read every existing predicate in those three</w:t>
+      </w:r>
+      <w:r>
+        <w:t xml:space="preserve"> </w:t>
+      </w:r>
+      <w:r>
+        <w:t xml:space="preserve">files (plus</w:t>
+      </w:r>
+      <w:r>
+        <w:t xml:space="preserve"> </w:t>
+      </w:r>
+      <w:r>
+        <w:rPr>
+          <w:rStyle w:val="VerbatimChar"/>
+        </w:rPr>
+        <w:t xml:space="preserve">extract_pop_metrics.py</w:t>
+      </w:r>
+      <w:r>
+        <w:t xml:space="preserve">’s MPI check) verbatim before writing the plan, surfacing</w:t>
+      </w:r>
+      <w:r>
+        <w:t xml:space="preserve"> </w:t>
+      </w:r>
+      <w:r>
+        <w:t xml:space="preserve">several details the master design doc’s sketch didn’t spell out: each tag needs its own mix of</w:t>
+      </w:r>
+      <w:r>
+        <w:t xml:space="preserve"> </w:t>
+      </w:r>
+      <w:r>
+        <w:t xml:space="preserve">prefix/substring/suffix matching (not one flat substring list);</w:t>
+      </w:r>
+      <w:r>
+        <w:t xml:space="preserve"> </w:t>
+      </w:r>
+      <w:r>
+        <w:rPr>
+          <w:rStyle w:val="VerbatimChar"/>
+        </w:rPr>
+        <w:t xml:space="preserve">extract_calltree.py</w:t>
+      </w:r>
+      <w:r>
+        <w:t xml:space="preserve">’s GPU pattern</w:t>
+      </w:r>
+      <w:r>
+        <w:t xml:space="preserve"> </w:t>
+      </w:r>
+      <w:r>
+        <w:t xml:space="preserve">list is a strict superset of</w:t>
+      </w:r>
+      <w:r>
+        <w:t xml:space="preserve"> </w:t>
+      </w:r>
+      <w:r>
+        <w:rPr>
+          <w:rStyle w:val="VerbatimChar"/>
+        </w:rPr>
+        <w:t xml:space="preserve">extract_CPU_hotspots.py</w:t>
+      </w:r>
+      <w:r>
+        <w:t xml:space="preserve">’s;</w:t>
+      </w:r>
+      <w:r>
+        <w:t xml:space="preserve"> </w:t>
+      </w:r>
+      <w:r>
+        <w:rPr>
+          <w:rStyle w:val="VerbatimChar"/>
+        </w:rPr>
+        <w:t xml:space="preserve">.kd</w:t>
+      </w:r>
+      <w:r>
+        <w:t xml:space="preserve">-suffix matching was inconsistently</w:t>
+      </w:r>
+      <w:r>
+        <w:t xml:space="preserve"> </w:t>
+      </w:r>
+      <w:r>
+        <w:t xml:space="preserve">case-sensitive; the sibling-group scope (</w:t>
+      </w:r>
+      <w:r>
+        <w:rPr>
+          <w:rStyle w:val="VerbatimChar"/>
+        </w:rPr>
+        <w:t xml:space="preserve">mark_wrapper_contaminated_branches()</w:t>
+      </w:r>
+      <w:r>
+        <w:t xml:space="preserve">) has no pattern</w:t>
+      </w:r>
+      <w:r>
+        <w:t xml:space="preserve"> </w:t>
+      </w:r>
+      <w:r>
+        <w:t xml:space="preserve">list of its own, it’s derived entirely from another tag’s already-computed subtree-match results;</w:t>
+      </w:r>
+      <w:r>
+        <w:t xml:space="preserve"> </w:t>
+      </w:r>
+      <w:r>
+        <w:t xml:space="preserve">and</w:t>
+      </w:r>
+      <w:r>
+        <w:t xml:space="preserve"> </w:t>
+      </w:r>
+      <w:r>
+        <w:rPr>
+          <w:rStyle w:val="VerbatimChar"/>
+        </w:rPr>
+        <w:t xml:space="preserve">splice_out_wrapper_nodes()</w:t>
+      </w:r>
+      <w:r>
+        <w:t xml:space="preserve">’s</w:t>
+      </w:r>
+      <w:r>
+        <w:t xml:space="preserve"> </w:t>
+      </w:r>
+      <w:r>
+        <w:t xml:space="preserve">“</w:t>
+      </w:r>
+      <w:r>
+        <w:t xml:space="preserve">fold a removed node’s self-time into its new parent</w:t>
+      </w:r>
+      <w:r>
+        <w:t xml:space="preserve">”</w:t>
+      </w:r>
+      <w:r>
+        <w:t xml:space="preserve"> </w:t>
+      </w:r>
+      <w:r>
+        <w:t xml:space="preserve">behavior</w:t>
+      </w:r>
+      <w:r>
+        <w:t xml:space="preserve"> </w:t>
+      </w:r>
+      <w:r>
+        <w:t xml:space="preserve">genuinely doesn’t exist anywhere today.</w:t>
+      </w:r>
+    </w:p>
+    <w:p>
+      <w:pPr>
+        <w:pStyle w:val="BodyText"/>
+      </w:pPr>
+      <w:r>
+        <w:t xml:space="preserve">New</w:t>
+      </w:r>
+      <w:r>
+        <w:t xml:space="preserve"> </w:t>
+      </w:r>
+      <w:r>
+        <w:rPr>
+          <w:rStyle w:val="VerbatimChar"/>
+        </w:rPr>
+        <w:t xml:space="preserve">stage3_rocprofsys.py</w:t>
+      </w:r>
+      <w:r>
+        <w:t xml:space="preserve"> </w:t>
+      </w:r>
+      <w:r>
+        <w:t xml:space="preserve">implements</w:t>
+      </w:r>
+      <w:r>
+        <w:t xml:space="preserve"> </w:t>
+      </w:r>
+      <w:r>
+        <w:rPr>
+          <w:rStyle w:val="VerbatimChar"/>
+        </w:rPr>
+        <w:t xml:space="preserve">tag_rows(rows, tag_defs)</w:t>
+      </w:r>
+      <w:r>
+        <w:t xml:space="preserve">: one children-map built once,</w:t>
+      </w:r>
+      <w:r>
+        <w:t xml:space="preserve"> </w:t>
+      </w:r>
+      <w:r>
+        <w:t xml:space="preserve">feeding a bottom-up pass (self-match + subtree-has-match, memoized), a top-down pass (ancestor-match,</w:t>
+      </w:r>
+      <w:r>
+        <w:t xml:space="preserve"> </w:t>
+      </w:r>
+      <w:r>
+        <w:t xml:space="preserve">riding the pre-order in O(n) instead of today’s O(depth)-per-row walk), a sibling-group derivation</w:t>
+      </w:r>
+      <w:r>
+        <w:t xml:space="preserve"> </w:t>
+      </w:r>
+      <w:r>
+        <w:t xml:space="preserve">(reusing the bottom-up pass’s results, no new tree walk), and an untethered-root first-real-descendant</w:t>
+      </w:r>
+      <w:r>
+        <w:t xml:space="preserve"> </w:t>
+      </w:r>
+      <w:r>
+        <w:t xml:space="preserve">pass. The last of these is a deliberate generalization: today’s</w:t>
+      </w:r>
+      <w:r>
+        <w:t xml:space="preserve"> </w:t>
+      </w:r>
+      <w:r>
+        <w:rPr>
+          <w:rStyle w:val="VerbatimChar"/>
+        </w:rPr>
+        <w:t xml:space="preserve">propagate_gpu_to_untethered_thread_roots()</w:t>
+      </w:r>
+      <w:r>
+        <w:t xml:space="preserve"> </w:t>
+      </w:r>
+      <w:r>
+        <w:t xml:space="preserve">only inherits the GPU tag; the new engine parameterizes the same walk by tag via each tag’s own</w:t>
+      </w:r>
+      <w:r>
+        <w:t xml:space="preserve"> </w:t>
+      </w:r>
+      <w:r>
+        <w:rPr>
+          <w:rStyle w:val="VerbatimChar"/>
+        </w:rPr>
+        <w:t xml:space="preserve">first_real_descendant_skip_tag</w:t>
+      </w:r>
+      <w:r>
+        <w:t xml:space="preserve">, so</w:t>
+      </w:r>
+      <w:r>
+        <w:t xml:space="preserve"> </w:t>
+      </w:r>
+      <w:r>
+        <w:rPr>
+          <w:rStyle w:val="VerbatimChar"/>
+        </w:rPr>
+        <w:t xml:space="preserve">mpi_territory</w:t>
+      </w:r>
+      <w:r>
+        <w:t xml:space="preserve"> </w:t>
+      </w:r>
+      <w:r>
+        <w:t xml:space="preserve">gets the identical treatment for free – closing</w:t>
+      </w:r>
+      <w:r>
+        <w:t xml:space="preserve"> </w:t>
+      </w:r>
+      <w:r>
+        <w:t xml:space="preserve">one of the master plan’s flagged gaps structurally, though whether an untethered MPI-spawned thread</w:t>
+      </w:r>
+      <w:r>
+        <w:t xml:space="preserve"> </w:t>
+      </w:r>
+      <w:r>
+        <w:t xml:space="preserve">root actually occurs in real captures remains unconfirmed (a synthetic test proves the mechanism</w:t>
+      </w:r>
+      <w:r>
+        <w:t xml:space="preserve"> </w:t>
+      </w:r>
+      <w:r>
+        <w:t xml:space="preserve">works, not that the real-world shape exists).</w:t>
+      </w:r>
+    </w:p>
+    <w:p>
+      <w:pPr>
+        <w:pStyle w:val="BodyText"/>
+      </w:pPr>
+      <w:r>
+        <w:t xml:space="preserve">Patterns moved into a new</w:t>
+      </w:r>
+      <w:r>
+        <w:t xml:space="preserve"> </w:t>
+      </w:r>
+      <w:r>
+        <w:rPr>
+          <w:rStyle w:val="VerbatimChar"/>
+        </w:rPr>
+        <w:t xml:space="preserve">default_noise_patterns.json</w:t>
+      </w:r>
+      <w:r>
+        <w:t xml:space="preserve"> </w:t>
+      </w:r>
+      <w:r>
+        <w:t xml:space="preserve">(5 tags:</w:t>
+      </w:r>
+      <w:r>
+        <w:t xml:space="preserve"> </w:t>
+      </w:r>
+      <w:r>
+        <w:rPr>
+          <w:rStyle w:val="VerbatimChar"/>
+        </w:rPr>
+        <w:t xml:space="preserve">gpu_api</w:t>
+      </w:r>
+      <w:r>
+        <w:t xml:space="preserve">,</w:t>
+      </w:r>
+      <w:r>
+        <w:t xml:space="preserve"> </w:t>
+      </w:r>
+      <w:r>
+        <w:rPr>
+          <w:rStyle w:val="VerbatimChar"/>
+        </w:rPr>
+        <w:t xml:space="preserve">wrapper_noise</w:t>
+      </w:r>
+      <w:r>
+        <w:t xml:space="preserve">,</w:t>
+      </w:r>
+      <w:r>
+        <w:t xml:space="preserve"> </w:t>
+      </w:r>
+      <w:r>
+        <w:rPr>
+          <w:rStyle w:val="VerbatimChar"/>
+        </w:rPr>
+        <w:t xml:space="preserve">mpi_territory</w:t>
+      </w:r>
+      <w:r>
+        <w:t xml:space="preserve">,</w:t>
+      </w:r>
+      <w:r>
+        <w:t xml:space="preserve"> </w:t>
+      </w:r>
+      <w:r>
+        <w:rPr>
+          <w:rStyle w:val="VerbatimChar"/>
+        </w:rPr>
+        <w:t xml:space="preserve">compiler_runtime_noise</w:t>
+      </w:r>
+      <w:r>
+        <w:t xml:space="preserve">, and the derived</w:t>
+      </w:r>
+      <w:r>
+        <w:t xml:space="preserve"> </w:t>
+      </w:r>
+      <w:r>
+        <w:rPr>
+          <w:rStyle w:val="VerbatimChar"/>
+        </w:rPr>
+        <w:t xml:space="preserve">wrapper_branch_contamination</w:t>
+      </w:r>
+      <w:r>
+        <w:t xml:space="preserve">) rather</w:t>
+      </w:r>
+      <w:r>
+        <w:t xml:space="preserve"> </w:t>
+      </w:r>
+      <w:r>
+        <w:t xml:space="preserve">than staying as Python constants.</w:t>
+      </w:r>
+      <w:r>
+        <w:t xml:space="preserve"> </w:t>
+      </w:r>
+      <w:r>
+        <w:rPr>
+          <w:rStyle w:val="VerbatimChar"/>
+        </w:rPr>
+        <w:t xml:space="preserve">.kd</w:t>
+      </w:r>
+      <w:r>
+        <w:t xml:space="preserve">-suffix matching was normalized to case-insensitive during</w:t>
+      </w:r>
+      <w:r>
+        <w:t xml:space="preserve"> </w:t>
+      </w:r>
+      <w:r>
+        <w:t xml:space="preserve">implementation (simpler than preserving the old inconsistent case-sensitivity, with no practical</w:t>
+      </w:r>
+      <w:r>
+        <w:t xml:space="preserve"> </w:t>
+      </w:r>
+      <w:r>
+        <w:t xml:space="preserve">effect on real kernel-descriptor symbol names, which are always lowercase by AMDGPU toolchain</w:t>
+      </w:r>
+      <w:r>
+        <w:t xml:space="preserve"> </w:t>
+      </w:r>
+      <w:r>
+        <w:t xml:space="preserve">convention). Also added, as generic primitives with no caller yet:</w:t>
+      </w:r>
+      <w:r>
+        <w:t xml:space="preserve"> </w:t>
+      </w:r>
+      <w:r>
+        <w:rPr>
+          <w:rStyle w:val="VerbatimChar"/>
+        </w:rPr>
+        <w:t xml:space="preserve">remove_tagged_subtrees()</w:t>
+      </w:r>
+      <w:r>
+        <w:t xml:space="preserve"> </w:t>
+      </w:r>
+      <w:r>
+        <w:t xml:space="preserve">(the</w:t>
+      </w:r>
+      <w:r>
+        <w:t xml:space="preserve"> </w:t>
+      </w:r>
+      <w:r>
+        <w:t xml:space="preserve">single mechanical removal shared by both</w:t>
+      </w:r>
+      <w:r>
+        <w:t xml:space="preserve"> </w:t>
+      </w:r>
+      <w:r>
+        <w:rPr>
+          <w:rStyle w:val="VerbatimChar"/>
+        </w:rPr>
+        <w:t xml:space="preserve">prune</w:t>
+      </w:r>
+      <w:r>
+        <w:t xml:space="preserve"> </w:t>
+      </w:r>
+      <w:r>
+        <w:t xml:space="preserve">and</w:t>
+      </w:r>
+      <w:r>
+        <w:t xml:space="preserve"> </w:t>
+      </w:r>
+      <w:r>
+        <w:rPr>
+          <w:rStyle w:val="VerbatimChar"/>
+        </w:rPr>
+        <w:t xml:space="preserve">structural_drop</w:t>
+      </w:r>
+      <w:r>
+        <w:t xml:space="preserve"> </w:t>
+      </w:r>
+      <w:r>
+        <w:t xml:space="preserve">– confirmed identical once</w:t>
+      </w:r>
+      <w:r>
+        <w:t xml:space="preserve"> </w:t>
+      </w:r>
+      <w:r>
+        <w:t xml:space="preserve">a row is marked, they only differ in how it gets marked),</w:t>
+      </w:r>
+      <w:r>
+        <w:t xml:space="preserve"> </w:t>
+      </w:r>
+      <w:r>
+        <w:rPr>
+          <w:rStyle w:val="VerbatimChar"/>
+        </w:rPr>
+        <w:t xml:space="preserve">splice_by_tag()</w:t>
+      </w:r>
+      <w:r>
+        <w:t xml:space="preserve"> </w:t>
+      </w:r>
+      <w:r>
+        <w:t xml:space="preserve">(with the new</w:t>
+      </w:r>
+      <w:r>
+        <w:t xml:space="preserve"> </w:t>
+      </w:r>
+      <w:r>
+        <w:rPr>
+          <w:rStyle w:val="VerbatimChar"/>
+        </w:rPr>
+        <w:t xml:space="preserve">fold</w:t>
+      </w:r>
+      <w:r>
+        <w:t xml:space="preserve"> </w:t>
+      </w:r>
+      <w:r>
+        <w:t xml:space="preserve">option), and</w:t>
+      </w:r>
+      <w:r>
+        <w:t xml:space="preserve"> </w:t>
+      </w:r>
+      <w:r>
+        <w:rPr>
+          <w:rStyle w:val="VerbatimChar"/>
+        </w:rPr>
+        <w:t xml:space="preserve">make_collapses_children()</w:t>
+      </w:r>
+      <w:r>
+        <w:t xml:space="preserve">/</w:t>
+      </w:r>
+      <w:r>
+        <w:rPr>
+          <w:rStyle w:val="VerbatimChar"/>
+        </w:rPr>
+        <w:t xml:space="preserve">make_is_pruned()</w:t>
+      </w:r>
+      <w:r>
+        <w:t xml:space="preserve"> </w:t>
+      </w:r>
+      <w:r>
+        <w:t xml:space="preserve">for tree-rendering tools.</w:t>
+      </w:r>
+    </w:p>
+    <w:p>
+      <w:pPr>
+        <w:pStyle w:val="BodyText"/>
+      </w:pPr>
+      <w:r>
+        <w:t xml:space="preserve">This step is deliberately</w:t>
+      </w:r>
+      <w:r>
+        <w:t xml:space="preserve"> </w:t>
+      </w:r>
+      <w:r>
+        <w:rPr>
+          <w:bCs/>
+          <w:b/>
+        </w:rPr>
+        <w:t xml:space="preserve">not wired into any tool</w:t>
+      </w:r>
+      <w:r>
+        <w:t xml:space="preserve"> </w:t>
+      </w:r>
+      <w:r>
+        <w:t xml:space="preserve">– roadmap step 5 does that, and is the first</w:t>
+      </w:r>
+      <w:r>
+        <w:t xml:space="preserve"> </w:t>
+      </w:r>
+      <w:r>
+        <w:t xml:space="preserve">step expected to change real report output (in exactly the two ways already tracked: the shared</w:t>
+      </w:r>
+      <w:r>
+        <w:t xml:space="preserve"> </w:t>
+      </w:r>
+      <w:r>
+        <w:t xml:space="preserve">GPU pattern superset, and</w:t>
+      </w:r>
+      <w:r>
+        <w:t xml:space="preserve"> </w:t>
+      </w:r>
+      <w:r>
+        <w:rPr>
+          <w:rStyle w:val="VerbatimChar"/>
+        </w:rPr>
+        <w:t xml:space="preserve">extract_pop_metrics.py</w:t>
+      </w:r>
+      <w:r>
+        <w:t xml:space="preserve">’s MPI check gaining the</w:t>
+      </w:r>
+      <w:r>
+        <w:t xml:space="preserve"> </w:t>
+      </w:r>
+      <w:r>
+        <w:rPr>
+          <w:rStyle w:val="VerbatimChar"/>
+        </w:rPr>
+        <w:t xml:space="preserve">_f08_</w:t>
+      </w:r>
+      <w:r>
+        <w:t xml:space="preserve">/</w:t>
+      </w:r>
+      <w:r>
+        <w:rPr>
+          <w:rStyle w:val="VerbatimChar"/>
+        </w:rPr>
+        <w:t xml:space="preserve">_f08ts_</w:t>
+      </w:r>
+      <w:r>
+        <w:t xml:space="preserve"> </w:t>
+      </w:r>
+      <w:r>
+        <w:t xml:space="preserve">suffix</w:t>
+      </w:r>
+      <w:r>
+        <w:t xml:space="preserve"> </w:t>
+      </w:r>
+      <w:r>
+        <w:t xml:space="preserve">it’s missing today). Verification here is therefore unit tests only, against synthetic trees:</w:t>
+      </w:r>
+      <w:r>
+        <w:t xml:space="preserve"> </w:t>
+      </w:r>
+      <w:r>
+        <w:rPr>
+          <w:rStyle w:val="VerbatimChar"/>
+        </w:rPr>
+        <w:t xml:space="preserve">test_stage3_rocprofsys.py</w:t>
+      </w:r>
+      <w:r>
+        <w:t xml:space="preserve"> </w:t>
+      </w:r>
+      <w:r>
+        <w:t xml:space="preserve">adds 26 cases, including one closing a real coverage gap found during</w:t>
+      </w:r>
+      <w:r>
+        <w:t xml:space="preserve"> </w:t>
+      </w:r>
+      <w:r>
+        <w:t xml:space="preserve">the Explore pass – no existing test anywhere fed a</w:t>
+      </w:r>
+      <w:r>
+        <w:t xml:space="preserve"> </w:t>
+      </w:r>
+      <w:r>
+        <w:rPr>
+          <w:rStyle w:val="VerbatimChar"/>
+        </w:rPr>
+        <w:t xml:space="preserve">_f08ts_</w:t>
+      </w:r>
+      <w:r>
+        <w:t xml:space="preserve">-suffixed label to</w:t>
+      </w:r>
+      <w:r>
+        <w:t xml:space="preserve"> </w:t>
+      </w:r>
+      <w:r>
+        <w:rPr>
+          <w:rStyle w:val="VerbatimChar"/>
+        </w:rPr>
+        <w:t xml:space="preserve">is_mpi_territory()</w:t>
+      </w:r>
+      <w:r>
+        <w:t xml:space="preserve"> </w:t>
+      </w:r>
+      <w:r>
+        <w:t xml:space="preserve">directly before this. Full suite: 332 tests, all passing.</w:t>
+      </w:r>
+    </w:p>
     <w:bookmarkEnd w:id="67"/>
+    <w:bookmarkEnd w:id="68"/>
     <w:sectPr/>
   </w:body>
 </w:document>

</xml_diff>

<commit_message>
Plan 2.8: stage-6 composition -- report_builder + run_metadata (roadmap step 7)
Extracts the report-assembly boilerplate and run-metadata-guessing helpers still
inline in all 6 report tools into stage6_report_builder.py (a generic
render_report(header, sections, footer) backend) and stage6_run_metadata.py,
finishing what plan 2.6 started. Also fixes stage5_tree_render.py's two render
functions self-appending a trailing blank line, so both calltree tools adopt the
same generic backend in this same step instead of being deferred.

Co-Authored-By: Claude Sonnet 5 <noreply@anthropic.com>
</commit_message>
<xml_diff>
--- a/docs/DEVELOPMENT_HISTORY.docx
+++ b/docs/DEVELOPMENT_HISTORY.docx
@@ -10,7 +10,7 @@
         <w:t xml:space="preserve">Development History</w:t>
       </w:r>
     </w:p>
-    <w:bookmarkStart w:id="71" w:name="development-history"/>
+    <w:bookmarkStart w:id="72" w:name="development-history"/>
     <w:p>
       <w:pPr>
         <w:pStyle w:val="Heading1"/>
@@ -2276,6 +2276,125 @@
           </w:p>
         </w:tc>
       </w:tr>
+      <w:tr>
+        <w:tc>
+          <w:tcPr/>
+          <w:p>
+            <w:pPr>
+              <w:pStyle w:val="Compact"/>
+              <w:jc w:val="left"/>
+            </w:pPr>
+            <w:r>
+              <w:t xml:space="preserve">2026-08-14</w:t>
+            </w:r>
+          </w:p>
+        </w:tc>
+        <w:tc>
+          <w:tcPr/>
+          <w:p>
+            <w:pPr>
+              <w:pStyle w:val="Compact"/>
+              <w:jc w:val="left"/>
+            </w:pPr>
+            <w:r>
+              <w:t xml:space="preserve">Plan 2.8: built</w:t>
+            </w:r>
+            <w:r>
+              <w:t xml:space="preserve"> </w:t>
+            </w:r>
+            <w:r>
+              <w:rPr>
+                <w:rStyle w:val="VerbatimChar"/>
+              </w:rPr>
+              <w:t xml:space="preserve">stage6_report_builder.py</w:t>
+            </w:r>
+            <w:r>
+              <w:t xml:space="preserve"> </w:t>
+            </w:r>
+            <w:r>
+              <w:t xml:space="preserve">(a genuinely generic</w:t>
+            </w:r>
+            <w:r>
+              <w:t xml:space="preserve"> </w:t>
+            </w:r>
+            <w:r>
+              <w:rPr>
+                <w:rStyle w:val="VerbatimChar"/>
+              </w:rPr>
+              <w:t xml:space="preserve">render_report(header, sections, footer)</w:t>
+            </w:r>
+            <w:r>
+              <w:t xml:space="preserve"> </w:t>
+            </w:r>
+            <w:r>
+              <w:t xml:space="preserve">backend, not a thin</w:t>
+            </w:r>
+            <w:r>
+              <w:t xml:space="preserve"> </w:t>
+            </w:r>
+            <w:r>
+              <w:rPr>
+                <w:rStyle w:val="VerbatimChar"/>
+              </w:rPr>
+              <w:t xml:space="preserve">write_report_file()</w:t>
+            </w:r>
+            <w:r>
+              <w:t xml:space="preserve">/</w:t>
+            </w:r>
+            <w:r>
+              <w:rPr>
+                <w:rStyle w:val="VerbatimChar"/>
+              </w:rPr>
+              <w:t xml:space="preserve">section()</w:t>
+            </w:r>
+            <w:r>
+              <w:t xml:space="preserve"> </w:t>
+            </w:r>
+            <w:r>
+              <w:t xml:space="preserve">pair) and</w:t>
+            </w:r>
+            <w:r>
+              <w:t xml:space="preserve"> </w:t>
+            </w:r>
+            <w:r>
+              <w:rPr>
+                <w:rStyle w:val="VerbatimChar"/>
+              </w:rPr>
+              <w:t xml:space="preserve">stage6_run_metadata.py</w:t>
+            </w:r>
+            <w:r>
+              <w:t xml:space="preserve">, and rewrote all 6 report tools’</w:t>
+            </w:r>
+            <w:r>
+              <w:t xml:space="preserve"> </w:t>
+            </w:r>
+            <w:r>
+              <w:rPr>
+                <w:rStyle w:val="VerbatimChar"/>
+              </w:rPr>
+              <w:t xml:space="preserve">write_report()</w:t>
+            </w:r>
+            <w:r>
+              <w:t xml:space="preserve"> </w:t>
+            </w:r>
+            <w:r>
+              <w:t xml:space="preserve">as compute/assemble/write composers over them – roadmap step 7; fixed</w:t>
+            </w:r>
+            <w:r>
+              <w:t xml:space="preserve"> </w:t>
+            </w:r>
+            <w:r>
+              <w:rPr>
+                <w:rStyle w:val="VerbatimChar"/>
+              </w:rPr>
+              <w:t xml:space="preserve">stage5_tree_render.py</w:t>
+            </w:r>
+            <w:r>
+              <w:t xml:space="preserve">’s two render functions self-appending a trailing blank line so both calltree tools could adopt the same generic backend in this same plan instead of being deferred – see full design/real-data accounting below</w:t>
+            </w:r>
+          </w:p>
+        </w:tc>
+      </w:tr>
     </w:tbl>
     <w:bookmarkStart w:id="20" w:name="project-scaffolding-and-rules"/>
     <w:p>
@@ -35233,7 +35352,1473 @@
       </w:r>
     </w:p>
     <w:bookmarkEnd w:id="70"/>
+    <w:bookmarkStart w:id="71" w:name="X5e7bc348556099cb9f9f41905d93192e64afe15"/>
+    <w:p>
+      <w:pPr>
+        <w:pStyle w:val="Heading2"/>
+      </w:pPr>
+      <w:r>
+        <w:t xml:space="preserve">2026-08-14 — Plan 2.8: stage-6 composition – report_builder + run_metadata (roadmap step 7)</w:t>
+      </w:r>
+    </w:p>
+    <w:p>
+      <w:pPr>
+        <w:pStyle w:val="FirstParagraph"/>
+      </w:pPr>
+      <w:r>
+        <w:t xml:space="preserve">Seventh implementation step: finished what plan 2.6 started on the report-writing tools</w:t>
+      </w:r>
+      <w:r>
+        <w:t xml:space="preserve"> </w:t>
+      </w:r>
+      <w:r>
+        <w:t xml:space="preserve">themselves. All 6 (</w:t>
+      </w:r>
+      <w:r>
+        <w:rPr>
+          <w:rStyle w:val="VerbatimChar"/>
+        </w:rPr>
+        <w:t xml:space="preserve">extract_CPU_hotspots.py</w:t>
+      </w:r>
+      <w:r>
+        <w:t xml:space="preserve">,</w:t>
+      </w:r>
+      <w:r>
+        <w:t xml:space="preserve"> </w:t>
+      </w:r>
+      <w:r>
+        <w:rPr>
+          <w:rStyle w:val="VerbatimChar"/>
+        </w:rPr>
+        <w:t xml:space="preserve">extract_GPU_hotspots.py</w:t>
+      </w:r>
+      <w:r>
+        <w:t xml:space="preserve">,</w:t>
+      </w:r>
+      <w:r>
+        <w:t xml:space="preserve"> </w:t>
+      </w:r>
+      <w:r>
+        <w:rPr>
+          <w:rStyle w:val="VerbatimChar"/>
+        </w:rPr>
+        <w:t xml:space="preserve">extract_hotspots.py</w:t>
+      </w:r>
+      <w:r>
+        <w:t xml:space="preserve">,</w:t>
+      </w:r>
+      <w:r>
+        <w:t xml:space="preserve"> </w:t>
+      </w:r>
+      <w:r>
+        <w:rPr>
+          <w:rStyle w:val="VerbatimChar"/>
+        </w:rPr>
+        <w:t xml:space="preserve">extract_pop_metrics.py</w:t>
+      </w:r>
+      <w:r>
+        <w:t xml:space="preserve">,</w:t>
+      </w:r>
+      <w:r>
+        <w:t xml:space="preserve"> </w:t>
+      </w:r>
+      <w:r>
+        <w:rPr>
+          <w:rStyle w:val="VerbatimChar"/>
+        </w:rPr>
+        <w:t xml:space="preserve">extract_calltree.py</w:t>
+      </w:r>
+      <w:r>
+        <w:t xml:space="preserve">,</w:t>
+      </w:r>
+      <w:r>
+        <w:t xml:space="preserve"> </w:t>
+      </w:r>
+      <w:r>
+        <w:rPr>
+          <w:rStyle w:val="VerbatimChar"/>
+        </w:rPr>
+        <w:t xml:space="preserve">extract_calltree_traced.py</w:t>
+      </w:r>
+      <w:r>
+        <w:t xml:space="preserve">) still had the same</w:t>
+      </w:r>
+      <w:r>
+        <w:t xml:space="preserve"> </w:t>
+      </w:r>
+      <w:r>
+        <w:rPr>
+          <w:rStyle w:val="VerbatimChar"/>
+        </w:rPr>
+        <w:t xml:space="preserve">parts = [] ... report = "".join(parts) ... write to dest_path ... return report</w:t>
+      </w:r>
+      <w:r>
+        <w:t xml:space="preserve"> </w:t>
+      </w:r>
+      <w:r>
+        <w:t xml:space="preserve">assembly</w:t>
+      </w:r>
+      <w:r>
+        <w:t xml:space="preserve"> </w:t>
+      </w:r>
+      <w:r>
+        <w:t xml:space="preserve">boilerplate inline, and the two hotspots tools each carried their own near-identical copy of the</w:t>
+      </w:r>
+      <w:r>
+        <w:t xml:space="preserve"> </w:t>
+      </w:r>
+      <w:r>
+        <w:t xml:space="preserve">run-metadata-guessing helpers. Both moved out into new</w:t>
+      </w:r>
+      <w:r>
+        <w:t xml:space="preserve"> </w:t>
+      </w:r>
+      <w:r>
+        <w:rPr>
+          <w:rStyle w:val="VerbatimChar"/>
+        </w:rPr>
+        <w:t xml:space="preserve">stage6_report_builder.py</w:t>
+      </w:r>
+      <w:r>
+        <w:t xml:space="preserve"> </w:t>
+      </w:r>
+      <w:r>
+        <w:t xml:space="preserve">and</w:t>
+      </w:r>
+      <w:r>
+        <w:t xml:space="preserve"> </w:t>
+      </w:r>
+      <w:r>
+        <w:rPr>
+          <w:rStyle w:val="VerbatimChar"/>
+        </w:rPr>
+        <w:t xml:space="preserve">stage6_run_metadata.py</w:t>
+      </w:r>
+      <w:r>
+        <w:t xml:space="preserve"> </w:t>
+      </w:r>
+      <w:r>
+        <w:t xml:space="preserve">modules.</w:t>
+      </w:r>
+    </w:p>
+    <w:p>
+      <w:pPr>
+        <w:pStyle w:val="BodyText"/>
+      </w:pPr>
+      <w:r>
+        <w:t xml:space="preserve">The design went through four rounds of user-directed revision from the original roadmap sketch:</w:t>
+      </w:r>
+    </w:p>
+    <w:p>
+      <w:pPr>
+        <w:numPr>
+          <w:ilvl w:val="0"/>
+          <w:numId w:val="1012"/>
+        </w:numPr>
+        <w:pStyle w:val="Compact"/>
+      </w:pPr>
+      <w:r>
+        <w:rPr>
+          <w:bCs/>
+          <w:b/>
+        </w:rPr>
+        <w:t xml:space="preserve">A genuine generic</w:t>
+      </w:r>
+      <w:r>
+        <w:rPr>
+          <w:bCs/>
+          <w:b/>
+        </w:rPr>
+        <w:t xml:space="preserve"> </w:t>
+      </w:r>
+      <w:r>
+        <w:rPr>
+          <w:rStyle w:val="VerbatimChar"/>
+          <w:bCs/>
+          <w:b/>
+        </w:rPr>
+        <w:t xml:space="preserve">render_report(header, sections, footer)</w:t>
+      </w:r>
+      <w:r>
+        <w:rPr>
+          <w:bCs/>
+          <w:b/>
+        </w:rPr>
+        <w:t xml:space="preserve"> </w:t>
+      </w:r>
+      <w:r>
+        <w:rPr>
+          <w:bCs/>
+          <w:b/>
+        </w:rPr>
+        <w:t xml:space="preserve">backend, not a thin</w:t>
+      </w:r>
+      <w:r>
+        <w:rPr>
+          <w:bCs/>
+          <w:b/>
+        </w:rPr>
+        <w:t xml:space="preserve"> </w:t>
+      </w:r>
+      <w:r>
+        <w:rPr>
+          <w:rStyle w:val="VerbatimChar"/>
+          <w:bCs/>
+          <w:b/>
+        </w:rPr>
+        <w:t xml:space="preserve">write_report_file()</w:t>
+      </w:r>
+      <w:r>
+        <w:rPr>
+          <w:bCs/>
+          <w:b/>
+        </w:rPr>
+        <w:t xml:space="preserve">/</w:t>
+      </w:r>
+      <w:r>
+        <w:rPr>
+          <w:rStyle w:val="VerbatimChar"/>
+          <w:bCs/>
+          <w:b/>
+        </w:rPr>
+        <w:t xml:space="preserve">section()</w:t>
+      </w:r>
+      <w:r>
+        <w:rPr>
+          <w:bCs/>
+          <w:b/>
+        </w:rPr>
+        <w:t xml:space="preserve"> </w:t>
+      </w:r>
+      <w:r>
+        <w:rPr>
+          <w:bCs/>
+          <w:b/>
+        </w:rPr>
+        <w:t xml:space="preserve">pair.</w:t>
+      </w:r>
+      <w:r>
+        <w:t xml:space="preserve"> </w:t>
+      </w:r>
+      <w:r>
+        <w:t xml:space="preserve">Every tool’s</w:t>
+      </w:r>
+      <w:r>
+        <w:t xml:space="preserve"> </w:t>
+      </w:r>
+      <w:r>
+        <w:rPr>
+          <w:rStyle w:val="VerbatimChar"/>
+        </w:rPr>
+        <w:t xml:space="preserve">write_report()</w:t>
+      </w:r>
+      <w:r>
+        <w:t xml:space="preserve"> </w:t>
+      </w:r>
+      <w:r>
+        <w:t xml:space="preserve">turned out to have the</w:t>
+      </w:r>
+      <w:r>
+        <w:t xml:space="preserve"> </w:t>
+      </w:r>
+      <w:r>
+        <w:t xml:space="preserve">same real structure underneath its own wording – compute data, then assemble a header + a</w:t>
+      </w:r>
+      <w:r>
+        <w:t xml:space="preserve"> </w:t>
+      </w:r>
+      <w:r>
+        <w:t xml:space="preserve">repeated sequence of title+body sections + a footer, then write it out.</w:t>
+      </w:r>
+      <w:r>
+        <w:t xml:space="preserve"> </w:t>
+      </w:r>
+      <w:r>
+        <w:rPr>
+          <w:rStyle w:val="VerbatimChar"/>
+        </w:rPr>
+        <w:t xml:space="preserve">render_report()</w:t>
+      </w:r>
+      <w:r>
+        <w:t xml:space="preserve"> </w:t>
+      </w:r>
+      <w:r>
+        <w:t xml:space="preserve">owns</w:t>
+      </w:r>
+      <w:r>
+        <w:t xml:space="preserve"> </w:t>
+      </w:r>
+      <w:r>
+        <w:t xml:space="preserve">the</w:t>
+      </w:r>
+      <w:r>
+        <w:t xml:space="preserve"> </w:t>
+      </w:r>
+      <w:r>
+        <w:t xml:space="preserve">“</w:t>
+      </w:r>
+      <w:r>
+        <w:t xml:space="preserve">for each section: title, body, blank line</w:t>
+      </w:r>
+      <w:r>
+        <w:t xml:space="preserve">”</w:t>
+      </w:r>
+      <w:r>
+        <w:t xml:space="preserve"> </w:t>
+      </w:r>
+      <w:r>
+        <w:t xml:space="preserve">loop generically; each tool keeps full control</w:t>
+      </w:r>
+      <w:r>
+        <w:t xml:space="preserve"> </w:t>
+      </w:r>
+      <w:r>
+        <w:t xml:space="preserve">of what its own header/sections/footer text actually says.</w:t>
+      </w:r>
+    </w:p>
+    <w:p>
+      <w:pPr>
+        <w:numPr>
+          <w:ilvl w:val="0"/>
+          <w:numId w:val="1012"/>
+        </w:numPr>
+        <w:pStyle w:val="Compact"/>
+      </w:pPr>
+      <w:r>
+        <w:rPr>
+          <w:bCs/>
+          <w:b/>
+        </w:rPr>
+        <w:t xml:space="preserve">New shared modules get the</w:t>
+      </w:r>
+      <w:r>
+        <w:rPr>
+          <w:bCs/>
+          <w:b/>
+        </w:rPr>
+        <w:t xml:space="preserve"> </w:t>
+      </w:r>
+      <w:r>
+        <w:rPr>
+          <w:rStyle w:val="VerbatimChar"/>
+          <w:bCs/>
+          <w:b/>
+        </w:rPr>
+        <w:t xml:space="preserve">stage6_</w:t>
+      </w:r>
+      <w:r>
+        <w:rPr>
+          <w:bCs/>
+          <w:b/>
+        </w:rPr>
+        <w:t xml:space="preserve"> </w:t>
+      </w:r>
+      <w:r>
+        <w:rPr>
+          <w:bCs/>
+          <w:b/>
+        </w:rPr>
+        <w:t xml:space="preserve">prefix, matching the existing</w:t>
+      </w:r>
+      <w:r>
+        <w:rPr>
+          <w:bCs/>
+          <w:b/>
+        </w:rPr>
+        <w:t xml:space="preserve"> </w:t>
+      </w:r>
+      <w:r>
+        <w:rPr>
+          <w:rStyle w:val="VerbatimChar"/>
+          <w:bCs/>
+          <w:b/>
+        </w:rPr>
+        <w:t xml:space="preserve">stage1_</w:t>
+      </w:r>
+      <w:r>
+        <w:rPr>
+          <w:bCs/>
+          <w:b/>
+        </w:rPr>
+        <w:t xml:space="preserve">-</w:t>
+      </w:r>
+      <w:r>
+        <w:rPr>
+          <w:rStyle w:val="VerbatimChar"/>
+          <w:bCs/>
+          <w:b/>
+        </w:rPr>
+        <w:t xml:space="preserve">stage5_</w:t>
+      </w:r>
+      <w:r>
+        <w:rPr>
+          <w:bCs/>
+          <w:b/>
+        </w:rPr>
+        <w:t xml:space="preserve"> </w:t>
+      </w:r>
+      <w:r>
+        <w:rPr>
+          <w:bCs/>
+          <w:b/>
+        </w:rPr>
+        <w:t xml:space="preserve">convention</w:t>
+      </w:r>
+      <w:r>
+        <w:t xml:space="preserve"> </w:t>
+      </w:r>
+      <w:r>
+        <w:t xml:space="preserve">(</w:t>
+      </w:r>
+      <w:r>
+        <w:rPr>
+          <w:rStyle w:val="VerbatimChar"/>
+        </w:rPr>
+        <w:t xml:space="preserve">report_builder.py</w:t>
+      </w:r>
+      <w:r>
+        <w:t xml:space="preserve"> </w:t>
+      </w:r>
+      <w:r>
+        <w:t xml:space="preserve">-&gt;</w:t>
+      </w:r>
+      <w:r>
+        <w:t xml:space="preserve"> </w:t>
+      </w:r>
+      <w:r>
+        <w:rPr>
+          <w:rStyle w:val="VerbatimChar"/>
+        </w:rPr>
+        <w:t xml:space="preserve">stage6_report_builder.py</w:t>
+      </w:r>
+      <w:r>
+        <w:t xml:space="preserve">,</w:t>
+      </w:r>
+      <w:r>
+        <w:t xml:space="preserve"> </w:t>
+      </w:r>
+      <w:r>
+        <w:rPr>
+          <w:rStyle w:val="VerbatimChar"/>
+        </w:rPr>
+        <w:t xml:space="preserve">run_metadata.py</w:t>
+      </w:r>
+      <w:r>
+        <w:t xml:space="preserve"> </w:t>
+      </w:r>
+      <w:r>
+        <w:t xml:space="preserve">-&gt;</w:t>
+      </w:r>
+      <w:r>
+        <w:t xml:space="preserve"> </w:t>
+      </w:r>
+      <w:r>
+        <w:rPr>
+          <w:rStyle w:val="VerbatimChar"/>
+        </w:rPr>
+        <w:t xml:space="preserve">stage6_run_metadata.py</w:t>
+      </w:r>
+      <w:r>
+        <w:t xml:space="preserve">) – but the tool files themselves (</w:t>
+      </w:r>
+      <w:r>
+        <w:rPr>
+          <w:rStyle w:val="VerbatimChar"/>
+        </w:rPr>
+        <w:t xml:space="preserve">extract_*.py</w:t>
+      </w:r>
+      <w:r>
+        <w:t xml:space="preserve">) are the user-facing</w:t>
+      </w:r>
+      <w:r>
+        <w:t xml:space="preserve"> </w:t>
+      </w:r>
+      <w:r>
+        <w:t xml:space="preserve">CLI surface and keep their unprefixed names; the prefix marks an internal shared module, not</w:t>
+      </w:r>
+      <w:r>
+        <w:t xml:space="preserve"> </w:t>
+      </w:r>
+      <w:r>
+        <w:t xml:space="preserve">“</w:t>
+      </w:r>
+      <w:r>
+        <w:t xml:space="preserve">everything touched in stage 6.</w:t>
+      </w:r>
+      <w:r>
+        <w:t xml:space="preserve">”</w:t>
+      </w:r>
+    </w:p>
+    <w:p>
+      <w:pPr>
+        <w:numPr>
+          <w:ilvl w:val="0"/>
+          <w:numId w:val="1012"/>
+        </w:numPr>
+        <w:pStyle w:val="Compact"/>
+      </w:pPr>
+      <w:r>
+        <w:rPr>
+          <w:rStyle w:val="VerbatimChar"/>
+          <w:bCs/>
+          <w:b/>
+        </w:rPr>
+        <w:t xml:space="preserve">stage5_tree_render.py</w:t>
+      </w:r>
+      <w:r>
+        <w:rPr>
+          <w:bCs/>
+          <w:b/>
+        </w:rPr>
+        <w:t xml:space="preserve">’s two render functions stopped self-terminating with a blank line</w:t>
+      </w:r>
+      <w:r>
+        <w:t xml:space="preserve"> </w:t>
+      </w:r>
+      <w:r>
+        <w:t xml:space="preserve">(</w:t>
+      </w:r>
+      <w:r>
+        <w:rPr>
+          <w:rStyle w:val="VerbatimChar"/>
+        </w:rPr>
+        <w:t xml:space="preserve">render_calltree_text()</w:t>
+      </w:r>
+      <w:r>
+        <w:t xml:space="preserve">/</w:t>
+      </w:r>
+      <w:r>
+        <w:rPr>
+          <w:rStyle w:val="VerbatimChar"/>
+        </w:rPr>
+        <w:t xml:space="preserve">attach_and_render_gpu_kernels()</w:t>
+      </w:r>
+      <w:r>
+        <w:t xml:space="preserve"> </w:t>
+      </w:r>
+      <w:r>
+        <w:t xml:space="preserve">each used to append their own</w:t>
+      </w:r>
+      <w:r>
+        <w:t xml:space="preserve"> </w:t>
+      </w:r>
+      <w:r>
+        <w:t xml:space="preserve">trailing</w:t>
+      </w:r>
+      <w:r>
+        <w:t xml:space="preserve"> </w:t>
+      </w:r>
+      <w:r>
+        <w:rPr>
+          <w:rStyle w:val="VerbatimChar"/>
+        </w:rPr>
+        <w:t xml:space="preserve">"\n"</w:t>
+      </w:r>
+      <w:r>
+        <w:t xml:space="preserve">) instead of giving</w:t>
+      </w:r>
+      <w:r>
+        <w:t xml:space="preserve"> </w:t>
+      </w:r>
+      <w:r>
+        <w:rPr>
+          <w:rStyle w:val="VerbatimChar"/>
+        </w:rPr>
+        <w:t xml:space="preserve">render_report()</w:t>
+      </w:r>
+      <w:r>
+        <w:t xml:space="preserve"> </w:t>
+      </w:r>
+      <w:r>
+        <w:t xml:space="preserve">a third</w:t>
+      </w:r>
+      <w:r>
+        <w:t xml:space="preserve"> </w:t>
+      </w:r>
+      <w:r>
+        <w:rPr>
+          <w:rStyle w:val="VerbatimChar"/>
+        </w:rPr>
+        <w:t xml:space="preserve">blank_line</w:t>
+      </w:r>
+      <w:r>
+        <w:t xml:space="preserve"> </w:t>
+      </w:r>
+      <w:r>
+        <w:t xml:space="preserve">tuple element to work</w:t>
+      </w:r>
+      <w:r>
+        <w:t xml:space="preserve"> </w:t>
+      </w:r>
+      <w:r>
+        <w:t xml:space="preserve">around them – fixing the actual inconsistency (every other stage-5 render function already put</w:t>
+      </w:r>
+      <w:r>
+        <w:t xml:space="preserve"> </w:t>
+      </w:r>
+      <w:r>
+        <w:t xml:space="preserve">its blank line at the assembly layer, never inside the leaf renderer) meant both calltree tools</w:t>
+      </w:r>
+      <w:r>
+        <w:t xml:space="preserve"> </w:t>
+      </w:r>
+      <w:r>
+        <w:t xml:space="preserve">could adopt the same plain, uniform section shape in this same plan, rather than being deferred</w:t>
+      </w:r>
+      <w:r>
+        <w:t xml:space="preserve"> </w:t>
+      </w:r>
+      <w:r>
+        <w:t xml:space="preserve">to a later step as originally sketched.</w:t>
+      </w:r>
+    </w:p>
+    <w:p>
+      <w:pPr>
+        <w:numPr>
+          <w:ilvl w:val="0"/>
+          <w:numId w:val="1012"/>
+        </w:numPr>
+        <w:pStyle w:val="Compact"/>
+      </w:pPr>
+      <w:r>
+        <w:rPr>
+          <w:bCs/>
+          <w:b/>
+        </w:rPr>
+        <w:t xml:space="preserve">A narrow, explicit exception to</w:t>
+      </w:r>
+      <w:r>
+        <w:rPr>
+          <w:bCs/>
+          <w:b/>
+        </w:rPr>
+        <w:t xml:space="preserve"> </w:t>
+      </w:r>
+      <w:r>
+        <w:rPr>
+          <w:bCs/>
+          <w:b/>
+        </w:rPr>
+        <w:t xml:space="preserve">“</w:t>
+      </w:r>
+      <w:r>
+        <w:rPr>
+          <w:bCs/>
+          <w:b/>
+        </w:rPr>
+        <w:t xml:space="preserve">byte-identical output</w:t>
+      </w:r>
+      <w:r>
+        <w:rPr>
+          <w:bCs/>
+          <w:b/>
+        </w:rPr>
+        <w:t xml:space="preserve">”</w:t>
+      </w:r>
+      <w:r>
+        <w:rPr>
+          <w:bCs/>
+          <w:b/>
+        </w:rPr>
+        <w:t xml:space="preserve"> </w:t>
+      </w:r>
+      <w:r>
+        <w:rPr>
+          <w:bCs/>
+          <w:b/>
+        </w:rPr>
+        <w:t xml:space="preserve">for blank lines</w:t>
+      </w:r>
+      <w:r>
+        <w:t xml:space="preserve">, added mid-</w:t>
+      </w:r>
+      <w:r>
+        <w:t xml:space="preserve"> </w:t>
+      </w:r>
+      <w:r>
+        <w:t xml:space="preserve">implementation once a real inconsistency surfaced:</w:t>
+      </w:r>
+      <w:r>
+        <w:t xml:space="preserve"> </w:t>
+      </w:r>
+      <w:r>
+        <w:rPr>
+          <w:rStyle w:val="VerbatimChar"/>
+        </w:rPr>
+        <w:t xml:space="preserve">extract_GPU_hotspots.py</w:t>
+      </w:r>
+      <w:r>
+        <w:t xml:space="preserve">’s existing</w:t>
+      </w:r>
+      <w:r>
+        <w:t xml:space="preserve"> </w:t>
+      </w:r>
+      <w:r>
+        <w:rPr>
+          <w:rStyle w:val="VerbatimChar"/>
+        </w:rPr>
+        <w:t xml:space="preserve">write_report()</w:t>
+      </w:r>
+      <w:r>
+        <w:t xml:space="preserve"> </w:t>
+      </w:r>
+      <w:r>
+        <w:t xml:space="preserve">was the one tool among all 6 with no trailing blank line after its last</w:t>
+      </w:r>
+      <w:r>
+        <w:t xml:space="preserve"> </w:t>
+      </w:r>
+      <w:r>
+        <w:t xml:space="preserve">(load-imbalance) section. Routing that block through</w:t>
+      </w:r>
+      <w:r>
+        <w:t xml:space="preserve"> </w:t>
+      </w:r>
+      <w:r>
+        <w:rPr>
+          <w:rStyle w:val="VerbatimChar"/>
+        </w:rPr>
+        <w:t xml:space="preserve">footer</w:t>
+      </w:r>
+      <w:r>
+        <w:t xml:space="preserve"> </w:t>
+      </w:r>
+      <w:r>
+        <w:t xml:space="preserve">(which never gets a trailing</w:t>
+      </w:r>
+      <w:r>
+        <w:t xml:space="preserve"> </w:t>
+      </w:r>
+      <w:r>
+        <w:t xml:space="preserve">blank) would have preserved that one accidental gap, but only by special-casing around it;</w:t>
+      </w:r>
+      <w:r>
+        <w:t xml:space="preserve"> </w:t>
+      </w:r>
+      <w:r>
+        <w:t xml:space="preserve">instead, both</w:t>
+      </w:r>
+      <w:r>
+        <w:t xml:space="preserve"> </w:t>
+      </w:r>
+      <w:r>
+        <w:rPr>
+          <w:rStyle w:val="VerbatimChar"/>
+        </w:rPr>
+        <w:t xml:space="preserve">extract_GPU_hotspots.py</w:t>
+      </w:r>
+      <w:r>
+        <w:t xml:space="preserve"> </w:t>
+      </w:r>
+      <w:r>
+        <w:t xml:space="preserve">and</w:t>
+      </w:r>
+      <w:r>
+        <w:t xml:space="preserve"> </w:t>
+      </w:r>
+      <w:r>
+        <w:rPr>
+          <w:rStyle w:val="VerbatimChar"/>
+        </w:rPr>
+        <w:t xml:space="preserve">extract_hotspots.py</w:t>
+      </w:r>
+      <w:r>
+        <w:t xml:space="preserve"> </w:t>
+      </w:r>
+      <w:r>
+        <w:t xml:space="preserve">(which had the same gap after</w:t>
+      </w:r>
+      <w:r>
+        <w:t xml:space="preserve"> </w:t>
+      </w:r>
+      <w:r>
+        <w:t xml:space="preserve">its own last section) treat their load-imbalance block as a normal section like every other</w:t>
+      </w:r>
+      <w:r>
+        <w:t xml:space="preserve"> </w:t>
+      </w:r>
+      <w:r>
+        <w:t xml:space="preserve">tool’s</w:t>
+      </w:r>
+      <w:r>
+        <w:t xml:space="preserve"> </w:t>
+      </w:r>
+      <w:r>
+        <w:rPr>
+          <w:rStyle w:val="VerbatimChar"/>
+        </w:rPr>
+        <w:t xml:space="preserve">write_report()</w:t>
+      </w:r>
+      <w:r>
+        <w:t xml:space="preserve"> </w:t>
+      </w:r>
+      <w:r>
+        <w:t xml:space="preserve">already does, and pick up the one trailing blank line that changes as a</w:t>
+      </w:r>
+      <w:r>
+        <w:t xml:space="preserve"> </w:t>
+      </w:r>
+      <w:r>
+        <w:t xml:space="preserve">result. Accepted because the new placement is exactly where §10’s later uniform blank-line</w:t>
+      </w:r>
+      <w:r>
+        <w:t xml:space="preserve"> </w:t>
+      </w:r>
+      <w:r>
+        <w:t xml:space="preserve">structure will put it anyway, and it let both tools use the same plain section list as</w:t>
+      </w:r>
+      <w:r>
+        <w:t xml:space="preserve"> </w:t>
+      </w:r>
+      <w:r>
+        <w:t xml:space="preserve">everything else instead of a special case built only to dodge the diff.</w:t>
+      </w:r>
+    </w:p>
+    <w:p>
+      <w:pPr>
+        <w:pStyle w:val="FirstParagraph"/>
+      </w:pPr>
+      <w:r>
+        <w:rPr>
+          <w:rStyle w:val="VerbatimChar"/>
+        </w:rPr>
+        <w:t xml:space="preserve">stage6_run_metadata.py</w:t>
+      </w:r>
+      <w:r>
+        <w:t xml:space="preserve">’s primitives (</w:t>
+      </w:r>
+      <w:r>
+        <w:rPr>
+          <w:rStyle w:val="VerbatimChar"/>
+        </w:rPr>
+        <w:t xml:space="preserve">load_json_file()</w:t>
+      </w:r>
+      <w:r>
+        <w:t xml:space="preserve">,</w:t>
+      </w:r>
+      <w:r>
+        <w:t xml:space="preserve"> </w:t>
+      </w:r>
+      <w:r>
+        <w:rPr>
+          <w:rStyle w:val="VerbatimChar"/>
+        </w:rPr>
+        <w:t xml:space="preserve">find_first_key()</w:t>
+      </w:r>
+      <w:r>
+        <w:t xml:space="preserve">,</w:t>
+      </w:r>
+      <w:r>
+        <w:t xml:space="preserve"> </w:t>
+      </w:r>
+      <w:r>
+        <w:rPr>
+          <w:rStyle w:val="VerbatimChar"/>
+        </w:rPr>
+        <w:t xml:space="preserve">guess_executable()</w:t>
+      </w:r>
+      <w:r>
+        <w:t xml:space="preserve">,</w:t>
+      </w:r>
+      <w:r>
+        <w:t xml:space="preserve"> </w:t>
+      </w:r>
+      <w:r>
+        <w:rPr>
+          <w:rStyle w:val="VerbatimChar"/>
+        </w:rPr>
+        <w:t xml:space="preserve">guess_total_runtime()</w:t>
+      </w:r>
+      <w:r>
+        <w:t xml:space="preserve">,</w:t>
+      </w:r>
+      <w:r>
+        <w:t xml:space="preserve"> </w:t>
+      </w:r>
+      <w:r>
+        <w:rPr>
+          <w:rStyle w:val="VerbatimChar"/>
+        </w:rPr>
+        <w:t xml:space="preserve">guess_run_datetime()</w:t>
+      </w:r>
+      <w:r>
+        <w:t xml:space="preserve">,</w:t>
+      </w:r>
+      <w:r>
+        <w:t xml:space="preserve"> </w:t>
+      </w:r>
+      <w:r>
+        <w:rPr>
+          <w:rStyle w:val="VerbatimChar"/>
+        </w:rPr>
+        <w:t xml:space="preserve">guess_num_ranks()</w:t>
+      </w:r>
+      <w:r>
+        <w:t xml:space="preserve">) are shared verbatim (or made</w:t>
+      </w:r>
+      <w:r>
+        <w:t xml:space="preserve"> </w:t>
+      </w:r>
+      <w:r>
+        <w:t xml:space="preserve">identical by parameterizing the one real difference, e.g. which keys-list constant or glob pattern</w:t>
+      </w:r>
+      <w:r>
+        <w:t xml:space="preserve"> </w:t>
+      </w:r>
+      <w:r>
+        <w:t xml:space="preserve">to use) between what were previously two independent copies in</w:t>
+      </w:r>
+      <w:r>
+        <w:t xml:space="preserve"> </w:t>
+      </w:r>
+      <w:r>
+        <w:rPr>
+          <w:rStyle w:val="VerbatimChar"/>
+        </w:rPr>
+        <w:t xml:space="preserve">extract_CPU_hotspots.py</w:t>
+      </w:r>
+      <w:r>
+        <w:t xml:space="preserve"> </w:t>
+      </w:r>
+      <w:r>
+        <w:t xml:space="preserve">and</w:t>
+      </w:r>
+      <w:r>
+        <w:t xml:space="preserve"> </w:t>
+      </w:r>
+      <w:r>
+        <w:rPr>
+          <w:rStyle w:val="VerbatimChar"/>
+        </w:rPr>
+        <w:t xml:space="preserve">extract_GPU_hotspots.py</w:t>
+      </w:r>
+      <w:r>
+        <w:t xml:space="preserve">.</w:t>
+      </w:r>
+      <w:r>
+        <w:t xml:space="preserve"> </w:t>
+      </w:r>
+      <w:r>
+        <w:rPr>
+          <w:rStyle w:val="VerbatimChar"/>
+        </w:rPr>
+        <w:t xml:space="preserve">guess_run_datetime()</w:t>
+      </w:r>
+      <w:r>
+        <w:t xml:space="preserve">/</w:t>
+      </w:r>
+      <w:r>
+        <w:rPr>
+          <w:rStyle w:val="VerbatimChar"/>
+        </w:rPr>
+        <w:t xml:space="preserve">guess_num_ranks()</w:t>
+      </w:r>
+      <w:r>
+        <w:t xml:space="preserve"> </w:t>
+      </w:r>
+      <w:r>
+        <w:t xml:space="preserve">gained optional</w:t>
+      </w:r>
+      <w:r>
+        <w:t xml:space="preserve"> </w:t>
+      </w:r>
+      <w:r>
+        <w:rPr>
+          <w:rStyle w:val="VerbatimChar"/>
+        </w:rPr>
+        <w:t xml:space="preserve">dir_pattern</w:t>
+      </w:r>
+      <w:r>
+        <w:t xml:space="preserve">/</w:t>
+      </w:r>
+      <w:r>
+        <w:rPr>
+          <w:rStyle w:val="VerbatimChar"/>
+        </w:rPr>
+        <w:t xml:space="preserve">keys</w:t>
+      </w:r>
+      <w:r>
+        <w:t xml:space="preserve"> </w:t>
+      </w:r>
+      <w:r>
+        <w:t xml:space="preserve">parameters (defaulting to</w:t>
+      </w:r>
+      <w:r>
+        <w:t xml:space="preserve"> </w:t>
+      </w:r>
+      <w:r>
+        <w:t xml:space="preserve">“</w:t>
+      </w:r>
+      <w:r>
+        <w:t xml:space="preserve">skip that extra step</w:t>
+      </w:r>
+      <w:r>
+        <w:t xml:space="preserve">”</w:t>
+      </w:r>
+      <w:r>
+        <w:t xml:space="preserve">) to cover CPU’s extra</w:t>
+      </w:r>
+      <w:r>
+        <w:t xml:space="preserve"> </w:t>
+      </w:r>
+      <w:r>
+        <w:t xml:space="preserve">fallback behavior GPU doesn’t have, the same</w:t>
+      </w:r>
+      <w:r>
+        <w:t xml:space="preserve"> </w:t>
+      </w:r>
+      <w:r>
+        <w:t xml:space="preserve">“</w:t>
+      </w:r>
+      <w:r>
+        <w:t xml:space="preserve">generic function, optional no-op-by-default hook</w:t>
+      </w:r>
+      <w:r>
+        <w:t xml:space="preserve">”</w:t>
+      </w:r>
+      <w:r>
+        <w:t xml:space="preserve"> </w:t>
+      </w:r>
+      <w:r>
+        <w:t xml:space="preserve">shape plan 2.7 established for</w:t>
+      </w:r>
+      <w:r>
+        <w:t xml:space="preserve"> </w:t>
+      </w:r>
+      <w:r>
+        <w:rPr>
+          <w:rStyle w:val="VerbatimChar"/>
+        </w:rPr>
+        <w:t xml:space="preserve">select_entries()</w:t>
+      </w:r>
+      <w:r>
+        <w:t xml:space="preserve">’s</w:t>
+      </w:r>
+      <w:r>
+        <w:t xml:space="preserve"> </w:t>
+      </w:r>
+      <w:r>
+        <w:rPr>
+          <w:rStyle w:val="VerbatimChar"/>
+        </w:rPr>
+        <w:t xml:space="preserve">prepare</w:t>
+      </w:r>
+      <w:r>
+        <w:t xml:space="preserve"> </w:t>
+      </w:r>
+      <w:r>
+        <w:t xml:space="preserve">and</w:t>
+      </w:r>
+      <w:r>
+        <w:t xml:space="preserve"> </w:t>
+      </w:r>
+      <w:r>
+        <w:rPr>
+          <w:rStyle w:val="VerbatimChar"/>
+        </w:rPr>
+        <w:t xml:space="preserve">load_rank_trees()</w:t>
+      </w:r>
+      <w:r>
+        <w:t xml:space="preserve">’s</w:t>
+      </w:r>
+      <w:r>
+        <w:t xml:space="preserve"> </w:t>
+      </w:r>
+      <w:r>
+        <w:rPr>
+          <w:rStyle w:val="VerbatimChar"/>
+        </w:rPr>
+        <w:t xml:space="preserve">postprocess</w:t>
+      </w:r>
+      <w:r>
+        <w:t xml:space="preserve">. Each tool’s own</w:t>
+      </w:r>
+      <w:r>
+        <w:t xml:space="preserve"> </w:t>
+      </w:r>
+      <w:r>
+        <w:rPr>
+          <w:rStyle w:val="VerbatimChar"/>
+        </w:rPr>
+        <w:t xml:space="preserve">gather_run_info()</w:t>
+      </w:r>
+      <w:r>
+        <w:t xml:space="preserve"> </w:t>
+      </w:r>
+      <w:r>
+        <w:t xml:space="preserve">stayed a small per-tool function calling the</w:t>
+      </w:r>
+      <w:r>
+        <w:t xml:space="preserve"> </w:t>
+      </w:r>
+      <w:r>
+        <w:t xml:space="preserve">shared primitives with its own constants, rather than being folded into</w:t>
+      </w:r>
+      <w:r>
+        <w:t xml:space="preserve"> </w:t>
+      </w:r>
+      <w:r>
+        <w:rPr>
+          <w:rStyle w:val="VerbatimChar"/>
+        </w:rPr>
+        <w:t xml:space="preserve">stage6_run_metadata.py</w:t>
+      </w:r>
+      <w:r>
+        <w:t xml:space="preserve"> </w:t>
+      </w:r>
+      <w:r>
+        <w:t xml:space="preserve">as one function with 7+ keyword parameters. A further, deliberate</w:t>
+      </w:r>
+      <w:r>
+        <w:t xml:space="preserve"> </w:t>
+      </w:r>
+      <w:r>
+        <w:t xml:space="preserve">non-change:</w:t>
+      </w:r>
+      <w:r>
+        <w:t xml:space="preserve"> </w:t>
+      </w:r>
+      <w:r>
+        <w:rPr>
+          <w:rStyle w:val="VerbatimChar"/>
+        </w:rPr>
+        <w:t xml:space="preserve">EXECUTABLE_KEYS</w:t>
+      </w:r>
+      <w:r>
+        <w:t xml:space="preserve">/</w:t>
+      </w:r>
+      <w:r>
+        <w:rPr>
+          <w:rStyle w:val="VerbatimChar"/>
+        </w:rPr>
+        <w:t xml:space="preserve">CONFIG_EXECUTABLE_KEYS</w:t>
+      </w:r>
+      <w:r>
+        <w:t xml:space="preserve"> </w:t>
+      </w:r>
+      <w:r>
+        <w:t xml:space="preserve">(and the two same-named-but-different</w:t>
+      </w:r>
+      <w:r>
+        <w:t xml:space="preserve"> </w:t>
+      </w:r>
+      <w:r>
+        <w:rPr>
+          <w:rStyle w:val="VerbatimChar"/>
+        </w:rPr>
+        <w:t xml:space="preserve">PID_SUFFIX_RE</w:t>
+      </w:r>
+      <w:r>
+        <w:t xml:space="preserve"> </w:t>
+      </w:r>
+      <w:r>
+        <w:t xml:space="preserve">regexes) were left as two separate tool-owned constants rather than reconciled into</w:t>
+      </w:r>
+      <w:r>
+        <w:t xml:space="preserve"> </w:t>
+      </w:r>
+      <w:r>
+        <w:t xml:space="preserve">one – that’s a report-</w:t>
+      </w:r>
+      <w:r>
+        <w:rPr>
+          <w:iCs/>
+          <w:i/>
+        </w:rPr>
+        <w:t xml:space="preserve">content</w:t>
+      </w:r>
+      <w:r>
+        <w:t xml:space="preserve"> </w:t>
+      </w:r>
+      <w:r>
+        <w:t xml:space="preserve">decision belonging with §10’s uniform metadata presentation</w:t>
+      </w:r>
+      <w:r>
+        <w:t xml:space="preserve"> </w:t>
+      </w:r>
+      <w:r>
+        <w:t xml:space="preserve">(roadmap step 9), not this structural-extraction step.</w:t>
+      </w:r>
+    </w:p>
+    <w:p>
+      <w:pPr>
+        <w:pStyle w:val="BodyText"/>
+      </w:pPr>
+      <w:r>
+        <w:t xml:space="preserve">Test rework followed the same</w:t>
+      </w:r>
+      <w:r>
+        <w:t xml:space="preserve"> </w:t>
+      </w:r>
+      <w:r>
+        <w:t xml:space="preserve">“</w:t>
+      </w:r>
+      <w:r>
+        <w:t xml:space="preserve">run the existing suite first</w:t>
+      </w:r>
+      <w:r>
+        <w:t xml:space="preserve">”</w:t>
+      </w:r>
+      <w:r>
+        <w:t xml:space="preserve"> </w:t>
+      </w:r>
+      <w:r>
+        <w:t xml:space="preserve">discipline: of 369 tests, 9 broke</w:t>
+      </w:r>
+      <w:r>
+        <w:t xml:space="preserve"> </w:t>
+      </w:r>
+      <w:r>
+        <w:t xml:space="preserve">(all</w:t>
+      </w:r>
+      <w:r>
+        <w:t xml:space="preserve"> </w:t>
+      </w:r>
+      <w:r>
+        <w:rPr>
+          <w:rStyle w:val="VerbatimChar"/>
+        </w:rPr>
+        <w:t xml:space="preserve">extract_CPU_hotspots.py</w:t>
+      </w:r>
+      <w:r>
+        <w:t xml:space="preserve">/</w:t>
+      </w:r>
+      <w:r>
+        <w:rPr>
+          <w:rStyle w:val="VerbatimChar"/>
+        </w:rPr>
+        <w:t xml:space="preserve">extract_GPU_hotspots.py</w:t>
+      </w:r>
+      <w:r>
+        <w:t xml:space="preserve"> </w:t>
+      </w:r>
+      <w:r>
+        <w:t xml:space="preserve">tests calling the now-moved metadata</w:t>
+      </w:r>
+      <w:r>
+        <w:t xml:space="preserve"> </w:t>
+      </w:r>
+      <w:r>
+        <w:t xml:space="preserve">functions by their old names/signatures) plus one that had been silently passing an old-signature</w:t>
+      </w:r>
+      <w:r>
+        <w:t xml:space="preserve"> </w:t>
+      </w:r>
+      <w:r>
+        <w:t xml:space="preserve">positional argument and got a wrong answer instead of an error (</w:t>
+      </w:r>
+      <w:r>
+        <w:rPr>
+          <w:rStyle w:val="VerbatimChar"/>
+        </w:rPr>
+        <w:t xml:space="preserve">guess_run_datetime</w:t>
+      </w:r>
+      <w:r>
+        <w:t xml:space="preserve">’s old 2-arg</w:t>
+      </w:r>
+      <w:r>
+        <w:t xml:space="preserve"> </w:t>
+      </w:r>
+      <w:r>
+        <w:t xml:space="preserve">call shape mapped a directory-path string onto the new</w:t>
+      </w:r>
+      <w:r>
+        <w:t xml:space="preserve"> </w:t>
+      </w:r>
+      <w:r>
+        <w:rPr>
+          <w:rStyle w:val="VerbatimChar"/>
+        </w:rPr>
+        <w:t xml:space="preserve">keys</w:t>
+      </w:r>
+      <w:r>
+        <w:t xml:space="preserve"> </w:t>
+      </w:r>
+      <w:r>
+        <w:t xml:space="preserve">parameter). All fixed by updating</w:t>
+      </w:r>
+      <w:r>
+        <w:t xml:space="preserve"> </w:t>
+      </w:r>
+      <w:r>
+        <w:t xml:space="preserve">call sites to the new shared-primitive signatures; none of the breakage was a real behavior change.</w:t>
+      </w:r>
+      <w:r>
+        <w:t xml:space="preserve"> </w:t>
+      </w:r>
+      <w:r>
+        <w:t xml:space="preserve">New</w:t>
+      </w:r>
+      <w:r>
+        <w:t xml:space="preserve"> </w:t>
+      </w:r>
+      <w:r>
+        <w:rPr>
+          <w:rStyle w:val="VerbatimChar"/>
+        </w:rPr>
+        <w:t xml:space="preserve">test_stage6_report_builder.py</w:t>
+      </w:r>
+      <w:r>
+        <w:t xml:space="preserve"> </w:t>
+      </w:r>
+      <w:r>
+        <w:t xml:space="preserve">and</w:t>
+      </w:r>
+      <w:r>
+        <w:t xml:space="preserve"> </w:t>
+      </w:r>
+      <w:r>
+        <w:rPr>
+          <w:rStyle w:val="VerbatimChar"/>
+        </w:rPr>
+        <w:t xml:space="preserve">test_stage6_run_metadata.py</w:t>
+      </w:r>
+      <w:r>
+        <w:t xml:space="preserve"> </w:t>
+      </w:r>
+      <w:r>
+        <w:t xml:space="preserve">cover the two new modules</w:t>
+      </w:r>
+      <w:r>
+        <w:t xml:space="preserve"> </w:t>
+      </w:r>
+      <w:r>
+        <w:t xml:space="preserve">directly;</w:t>
+      </w:r>
+      <w:r>
+        <w:t xml:space="preserve"> </w:t>
+      </w:r>
+      <w:r>
+        <w:rPr>
+          <w:rStyle w:val="VerbatimChar"/>
+        </w:rPr>
+        <w:t xml:space="preserve">test_stage5_tree_render.py</w:t>
+      </w:r>
+      <w:r>
+        <w:t xml:space="preserve">’s</w:t>
+      </w:r>
+      <w:r>
+        <w:t xml:space="preserve"> </w:t>
+      </w:r>
+      <w:r>
+        <w:rPr>
+          <w:rStyle w:val="VerbatimChar"/>
+        </w:rPr>
+        <w:t xml:space="preserve">RenderCalltreeTextTests</w:t>
+      </w:r>
+      <w:r>
+        <w:t xml:space="preserve">/</w:t>
+      </w:r>
+      <w:r>
+        <w:rPr>
+          <w:rStyle w:val="VerbatimChar"/>
+        </w:rPr>
+        <w:t xml:space="preserve">AttachAndRenderGpuKernelsTests</w:t>
+      </w:r>
+      <w:r>
+        <w:t xml:space="preserve"> </w:t>
+      </w:r>
+      <w:r>
+        <w:t xml:space="preserve">were updated to assert the corrected single-trailing-newline behavior instead of the old</w:t>
+      </w:r>
+      <w:r>
+        <w:t xml:space="preserve"> </w:t>
+      </w:r>
+      <w:r>
+        <w:t xml:space="preserve">self-appended blank line. Final suite: 369 tests, all passing.</w:t>
+      </w:r>
+    </w:p>
+    <w:p>
+      <w:pPr>
+        <w:pStyle w:val="BodyText"/>
+      </w:pPr>
+      <w:r>
+        <w:t xml:space="preserve">Real-data verification across all 6</w:t>
+      </w:r>
+      <w:r>
+        <w:t xml:space="preserve"> </w:t>
+      </w:r>
+      <w:r>
+        <w:rPr>
+          <w:rStyle w:val="VerbatimChar"/>
+        </w:rPr>
+        <w:t xml:space="preserve">test_apps/results/</w:t>
+      </w:r>
+      <w:r>
+        <w:t xml:space="preserve"> </w:t>
+      </w:r>
+      <w:r>
+        <w:t xml:space="preserve">directories:</w:t>
+      </w:r>
+      <w:r>
+        <w:t xml:space="preserve"> </w:t>
+      </w:r>
+      <w:r>
+        <w:rPr>
+          <w:rStyle w:val="VerbatimChar"/>
+        </w:rPr>
+        <w:t xml:space="preserve">calltree.txt</w:t>
+      </w:r>
+      <w:r>
+        <w:t xml:space="preserve">,</w:t>
+      </w:r>
+      <w:r>
+        <w:t xml:space="preserve"> </w:t>
+      </w:r>
+      <w:r>
+        <w:rPr>
+          <w:rStyle w:val="VerbatimChar"/>
+        </w:rPr>
+        <w:t xml:space="preserve">calltree_traced.txt</w:t>
+      </w:r>
+      <w:r>
+        <w:t xml:space="preserve">, and</w:t>
+      </w:r>
+      <w:r>
+        <w:t xml:space="preserve"> </w:t>
+      </w:r>
+      <w:r>
+        <w:rPr>
+          <w:rStyle w:val="VerbatimChar"/>
+        </w:rPr>
+        <w:t xml:space="preserve">pop_metrics.txt</w:t>
+      </w:r>
+      <w:r>
+        <w:t xml:space="preserve"> </w:t>
+      </w:r>
+      <w:r>
+        <w:t xml:space="preserve">came back completely byte-identical in all 6 dirs.</w:t>
+      </w:r>
+      <w:r>
+        <w:t xml:space="preserve"> </w:t>
+      </w:r>
+      <w:r>
+        <w:rPr>
+          <w:rStyle w:val="VerbatimChar"/>
+        </w:rPr>
+        <w:t xml:space="preserve">hotspots.txt</w:t>
+      </w:r>
+      <w:r>
+        <w:t xml:space="preserve"> </w:t>
+      </w:r>
+      <w:r>
+        <w:t xml:space="preserve">differed in all 6 dirs in exactly one line each – the one accepted trailing blank</w:t>
+      </w:r>
+      <w:r>
+        <w:t xml:space="preserve"> </w:t>
+      </w:r>
+      <w:r>
+        <w:t xml:space="preserve">line added after the load-imbalance section, per point 4 above. No other differences of any kind</w:t>
+      </w:r>
+      <w:r>
+        <w:t xml:space="preserve"> </w:t>
+      </w:r>
+      <w:r>
+        <w:t xml:space="preserve">in any of the 24 regenerated files.</w:t>
+      </w:r>
+    </w:p>
     <w:bookmarkEnd w:id="71"/>
+    <w:bookmarkEnd w:id="72"/>
     <w:sectPr/>
   </w:body>
 </w:document>
@@ -35836,6 +37421,36 @@
     </w:lvlOverride>
   </w:num>
   <w:num w:numId="1011">
+    <w:abstractNumId w:val="99411"/>
+    <w:lvlOverride w:ilvl="0">
+      <w:startOverride w:val="1"/>
+    </w:lvlOverride>
+    <w:lvlOverride w:ilvl="1">
+      <w:startOverride w:val="1"/>
+    </w:lvlOverride>
+    <w:lvlOverride w:ilvl="2">
+      <w:startOverride w:val="1"/>
+    </w:lvlOverride>
+    <w:lvlOverride w:ilvl="3">
+      <w:startOverride w:val="1"/>
+    </w:lvlOverride>
+    <w:lvlOverride w:ilvl="4">
+      <w:startOverride w:val="1"/>
+    </w:lvlOverride>
+    <w:lvlOverride w:ilvl="5">
+      <w:startOverride w:val="1"/>
+    </w:lvlOverride>
+    <w:lvlOverride w:ilvl="6">
+      <w:startOverride w:val="1"/>
+    </w:lvlOverride>
+    <w:lvlOverride w:ilvl="7">
+      <w:startOverride w:val="1"/>
+    </w:lvlOverride>
+    <w:lvlOverride w:ilvl="8">
+      <w:startOverride w:val="1"/>
+    </w:lvlOverride>
+  </w:num>
+  <w:num w:numId="1012">
     <w:abstractNumId w:val="99411"/>
     <w:lvlOverride w:ilvl="0">
       <w:startOverride w:val="1"/>

</xml_diff>

<commit_message>
Plan 2.9: HELP_BLURB precondition updates (roadmap step 8)
Adds the two HELP_BLURB gaps identified by §10's redirect-precondition audit --
extract_calltree.py's per-tier hide-action mapping and Cray-specific
compiler-runtime caveat, extract_pop_metrics.py's MPI-classification and
CPU<->GPU pairing caveats -- so step 9 can later redirect each report's
Caveats footer to --help without silently losing information. Additive only;
no report output changes.

Co-Authored-By: Claude Sonnet 5 <noreply@anthropic.com>
</commit_message>
<xml_diff>
--- a/docs/DEVELOPMENT_HISTORY.docx
+++ b/docs/DEVELOPMENT_HISTORY.docx
@@ -10,7 +10,7 @@
         <w:t xml:space="preserve">Development History</w:t>
       </w:r>
     </w:p>
-    <w:bookmarkStart w:id="72" w:name="development-history"/>
+    <w:bookmarkStart w:id="73" w:name="development-history"/>
     <w:p>
       <w:pPr>
         <w:pStyle w:val="Heading1"/>
@@ -2395,6 +2395,71 @@
           </w:p>
         </w:tc>
       </w:tr>
+      <w:tr>
+        <w:tc>
+          <w:tcPr/>
+          <w:p>
+            <w:pPr>
+              <w:pStyle w:val="Compact"/>
+              <w:jc w:val="left"/>
+            </w:pPr>
+            <w:r>
+              <w:t xml:space="preserve">2026-08-14</w:t>
+            </w:r>
+          </w:p>
+        </w:tc>
+        <w:tc>
+          <w:tcPr/>
+          <w:p>
+            <w:pPr>
+              <w:pStyle w:val="Compact"/>
+              <w:jc w:val="left"/>
+            </w:pPr>
+            <w:r>
+              <w:t xml:space="preserve">Plan 2.9: added</w:t>
+            </w:r>
+            <w:r>
+              <w:t xml:space="preserve"> </w:t>
+            </w:r>
+            <w:r>
+              <w:rPr>
+                <w:rStyle w:val="VerbatimChar"/>
+              </w:rPr>
+              <w:t xml:space="preserve">extract_calltree.py</w:t>
+            </w:r>
+            <w:r>
+              <w:t xml:space="preserve">’s and</w:t>
+            </w:r>
+            <w:r>
+              <w:t xml:space="preserve"> </w:t>
+            </w:r>
+            <w:r>
+              <w:rPr>
+                <w:rStyle w:val="VerbatimChar"/>
+              </w:rPr>
+              <w:t xml:space="preserve">extract_pop_metrics.py</w:t>
+            </w:r>
+            <w:r>
+              <w:t xml:space="preserve">’s two missing</w:t>
+            </w:r>
+            <w:r>
+              <w:t xml:space="preserve"> </w:t>
+            </w:r>
+            <w:r>
+              <w:rPr>
+                <w:rStyle w:val="VerbatimChar"/>
+              </w:rPr>
+              <w:t xml:space="preserve">HELP_BLURB</w:t>
+            </w:r>
+            <w:r>
+              <w:t xml:space="preserve"> </w:t>
+            </w:r>
+            <w:r>
+              <w:t xml:space="preserve">gaps identified by §10’s rule-5 redirect precondition audit – roadmap step 8, additive only, no report output changed</w:t>
+            </w:r>
+          </w:p>
+        </w:tc>
+      </w:tr>
     </w:tbl>
     <w:bookmarkStart w:id="20" w:name="project-scaffolding-and-rules"/>
     <w:p>
@@ -36818,7 +36883,548 @@
       </w:r>
     </w:p>
     <w:bookmarkEnd w:id="71"/>
+    <w:bookmarkStart w:id="72" w:name="Xcda2ae41aa9587768ea5574ddfd06ad65fcbd7f"/>
+    <w:p>
+      <w:pPr>
+        <w:pStyle w:val="Heading2"/>
+      </w:pPr>
+      <w:r>
+        <w:t xml:space="preserve">2026-08-14 — Plan 2.9: HELP_BLURB precondition updates (roadmap step 8)</w:t>
+      </w:r>
+    </w:p>
+    <w:p>
+      <w:pPr>
+        <w:pStyle w:val="FirstParagraph"/>
+      </w:pPr>
+      <w:r>
+        <w:t xml:space="preserve">Eighth implementation step, and the smallest so far:</w:t>
+      </w:r>
+      <w:r>
+        <w:t xml:space="preserve"> </w:t>
+      </w:r>
+      <w:r>
+        <w:rPr>
+          <w:rStyle w:val="VerbatimChar"/>
+        </w:rPr>
+        <w:t xml:space="preserve">docs/plans/2.1-postprocess-consolidation- refactor.md</w:t>
+      </w:r>
+      <w:r>
+        <w:t xml:space="preserve"> </w:t>
+      </w:r>
+      <w:r>
+        <w:t xml:space="preserve">§10’s own precondition audit for its</w:t>
+      </w:r>
+      <w:r>
+        <w:t xml:space="preserve"> </w:t>
+      </w:r>
+      <w:r>
+        <w:t xml:space="preserve">“</w:t>
+      </w:r>
+      <w:r>
+        <w:t xml:space="preserve">redirect general/methodology caveats to</w:t>
+      </w:r>
+      <w:r>
+        <w:t xml:space="preserve"> </w:t>
+      </w:r>
+      <w:r>
+        <w:rPr>
+          <w:rStyle w:val="VerbatimChar"/>
+        </w:rPr>
+        <w:t xml:space="preserve">--help</w:t>
+      </w:r>
+      <w:r>
+        <w:t xml:space="preserve">”</w:t>
+      </w:r>
+      <w:r>
+        <w:t xml:space="preserve"> </w:t>
+      </w:r>
+      <w:r>
+        <w:t xml:space="preserve">rule (step 9) had already checked every tool’s</w:t>
+      </w:r>
+      <w:r>
+        <w:t xml:space="preserve"> </w:t>
+      </w:r>
+      <w:r>
+        <w:rPr>
+          <w:rStyle w:val="VerbatimChar"/>
+        </w:rPr>
+        <w:t xml:space="preserve">Caveats:</w:t>
+      </w:r>
+      <w:r>
+        <w:t xml:space="preserve"> </w:t>
+      </w:r>
+      <w:r>
+        <w:t xml:space="preserve">footer against its own</w:t>
+      </w:r>
+      <w:r>
+        <w:t xml:space="preserve"> </w:t>
+      </w:r>
+      <w:r>
+        <w:rPr>
+          <w:rStyle w:val="VerbatimChar"/>
+        </w:rPr>
+        <w:t xml:space="preserve">HELP_BLURB</w:t>
+      </w:r>
+      <w:r>
+        <w:t xml:space="preserve"> </w:t>
+      </w:r>
+      <w:r>
+        <w:t xml:space="preserve">line-by-line and found exactly two gaps, named explicitly there. This step closes</w:t>
+      </w:r>
+      <w:r>
+        <w:t xml:space="preserve"> </w:t>
+      </w:r>
+      <w:r>
+        <w:t xml:space="preserve">both, additively, without touching any report’s actual output:</w:t>
+      </w:r>
+    </w:p>
+    <w:p>
+      <w:pPr>
+        <w:numPr>
+          <w:ilvl w:val="0"/>
+          <w:numId w:val="1013"/>
+        </w:numPr>
+        <w:pStyle w:val="Compact"/>
+      </w:pPr>
+      <w:r>
+        <w:rPr>
+          <w:rStyle w:val="VerbatimChar"/>
+          <w:bCs/>
+          <w:b/>
+        </w:rPr>
+        <w:t xml:space="preserve">extract_calltree.py</w:t>
+      </w:r>
+      <w:r>
+        <w:t xml:space="preserve"> </w:t>
+      </w:r>
+      <w:r>
+        <w:t xml:space="preserve">–</w:t>
+      </w:r>
+      <w:r>
+        <w:t xml:space="preserve"> </w:t>
+      </w:r>
+      <w:r>
+        <w:rPr>
+          <w:rStyle w:val="VerbatimChar"/>
+        </w:rPr>
+        <w:t xml:space="preserve">HELP_BLURB</w:t>
+      </w:r>
+      <w:r>
+        <w:t xml:space="preserve"> </w:t>
+      </w:r>
+      <w:r>
+        <w:t xml:space="preserve">named the four</w:t>
+      </w:r>
+      <w:r>
+        <w:t xml:space="preserve"> </w:t>
+      </w:r>
+      <w:r>
+        <w:rPr>
+          <w:rStyle w:val="VerbatimChar"/>
+        </w:rPr>
+        <w:t xml:space="preserve">--show-*</w:t>
+      </w:r>
+      <w:r>
+        <w:t xml:space="preserve"> </w:t>
+      </w:r>
+      <w:r>
+        <w:t xml:space="preserve">noise-hiding flags but not</w:t>
+      </w:r>
+      <w:r>
+        <w:t xml:space="preserve"> </w:t>
+      </w:r>
+      <w:r>
+        <w:rPr>
+          <w:iCs/>
+          <w:i/>
+        </w:rPr>
+        <w:t xml:space="preserve">how</w:t>
+      </w:r>
+      <w:r>
+        <w:t xml:space="preserve"> </w:t>
+      </w:r>
+      <w:r>
+        <w:t xml:space="preserve">each tier is hidden by default. Added two sentences to its existing flags paragraph,</w:t>
+      </w:r>
+      <w:r>
+        <w:t xml:space="preserve"> </w:t>
+      </w:r>
+      <w:r>
+        <w:t xml:space="preserve">reusing the report’s own</w:t>
+      </w:r>
+      <w:r>
+        <w:t xml:space="preserve"> </w:t>
+      </w:r>
+      <w:r>
+        <w:rPr>
+          <w:rStyle w:val="VerbatimChar"/>
+        </w:rPr>
+        <w:t xml:space="preserve">Caveats:</w:t>
+      </w:r>
+      <w:r>
+        <w:t xml:space="preserve"> </w:t>
+      </w:r>
+      <w:r>
+        <w:t xml:space="preserve">wording verbatim so the two stay consistent: which</w:t>
+      </w:r>
+      <w:r>
+        <w:t xml:space="preserve"> </w:t>
+      </w:r>
+      <w:r>
+        <w:t xml:space="preserve">tree-surgery action applies to which tier (wrapper frames spliced out, MPI internals collapsed,</w:t>
+      </w:r>
+      <w:r>
+        <w:t xml:space="preserve"> </w:t>
+      </w:r>
+      <w:r>
+        <w:t xml:space="preserve">GPU-API/compiler-runtime pruned), and the compiler-runtime tier being built from Cray’s Fortran</w:t>
+      </w:r>
+      <w:r>
+        <w:t xml:space="preserve"> </w:t>
+      </w:r>
+      <w:r>
+        <w:t xml:space="preserve">runtime specifically, not verified against other compilers.</w:t>
+      </w:r>
+      <w:r>
+        <w:t xml:space="preserve"> </w:t>
+      </w:r>
+      <w:r>
+        <w:rPr>
+          <w:rStyle w:val="VerbatimChar"/>
+        </w:rPr>
+        <w:t xml:space="preserve">extract_calltree_traced.py</w:t>
+      </w:r>
+      <w:r>
+        <w:t xml:space="preserve"> </w:t>
+      </w:r>
+      <w:r>
+        <w:t xml:space="preserve">has its</w:t>
+      </w:r>
+      <w:r>
+        <w:t xml:space="preserve"> </w:t>
+      </w:r>
+      <w:r>
+        <w:t xml:space="preserve">own, already-complete</w:t>
+      </w:r>
+      <w:r>
+        <w:t xml:space="preserve"> </w:t>
+      </w:r>
+      <w:r>
+        <w:rPr>
+          <w:rStyle w:val="VerbatimChar"/>
+        </w:rPr>
+        <w:t xml:space="preserve">HELP_BLURB</w:t>
+      </w:r>
+      <w:r>
+        <w:t xml:space="preserve"> </w:t>
+      </w:r>
+      <w:r>
+        <w:t xml:space="preserve">and wasn’t in scope – the audit named only</w:t>
+      </w:r>
+      <w:r>
+        <w:t xml:space="preserve"> </w:t>
+      </w:r>
+      <w:r>
+        <w:rPr>
+          <w:rStyle w:val="VerbatimChar"/>
+        </w:rPr>
+        <w:t xml:space="preserve">extract_calltree.py</w:t>
+      </w:r>
+      <w:r>
+        <w:t xml:space="preserve">’s two gaps.</w:t>
+      </w:r>
+    </w:p>
+    <w:p>
+      <w:pPr>
+        <w:numPr>
+          <w:ilvl w:val="0"/>
+          <w:numId w:val="1013"/>
+        </w:numPr>
+        <w:pStyle w:val="Compact"/>
+      </w:pPr>
+      <w:r>
+        <w:rPr>
+          <w:rStyle w:val="VerbatimChar"/>
+          <w:bCs/>
+          <w:b/>
+        </w:rPr>
+        <w:t xml:space="preserve">extract_pop_metrics.py</w:t>
+      </w:r>
+      <w:r>
+        <w:t xml:space="preserve"> </w:t>
+      </w:r>
+      <w:r>
+        <w:t xml:space="preserve">– its</w:t>
+      </w:r>
+      <w:r>
+        <w:t xml:space="preserve"> </w:t>
+      </w:r>
+      <w:r>
+        <w:rPr>
+          <w:rStyle w:val="VerbatimChar"/>
+        </w:rPr>
+        <w:t xml:space="preserve">Caveats:</w:t>
+      </w:r>
+      <w:r>
+        <w:t xml:space="preserve"> </w:t>
+      </w:r>
+      <w:r>
+        <w:t xml:space="preserve">footer (the MPI-classification-is-heuristic</w:t>
+      </w:r>
+      <w:r>
+        <w:t xml:space="preserve"> </w:t>
+      </w:r>
+      <w:r>
+        <w:t xml:space="preserve">caveat, the CPU&lt;-&gt;GPU per-rank pairing assumption) wasn’t in</w:t>
+      </w:r>
+      <w:r>
+        <w:t xml:space="preserve"> </w:t>
+      </w:r>
+      <w:r>
+        <w:rPr>
+          <w:rStyle w:val="VerbatimChar"/>
+        </w:rPr>
+        <w:t xml:space="preserve">HELP_BLURB</w:t>
+      </w:r>
+      <w:r>
+        <w:t xml:space="preserve"> </w:t>
+      </w:r>
+      <w:r>
+        <w:t xml:space="preserve">at all. Added a new</w:t>
+      </w:r>
+      <w:r>
+        <w:t xml:space="preserve"> </w:t>
+      </w:r>
+      <w:r>
+        <w:t xml:space="preserve">paragraph covering both. Since the footer’s MPI-prefix sentence is built dynamically from</w:t>
+      </w:r>
+      <w:r>
+        <w:t xml:space="preserve"> </w:t>
+      </w:r>
+      <w:r>
+        <w:rPr>
+          <w:rStyle w:val="VerbatimChar"/>
+        </w:rPr>
+        <w:t xml:space="preserve">TAG_DEFS</w:t>
+      </w:r>
+      <w:r>
+        <w:t xml:space="preserve"> </w:t>
+      </w:r>
+      <w:r>
+        <w:t xml:space="preserve">at report time rather than hardcoded,</w:t>
+      </w:r>
+      <w:r>
+        <w:t xml:space="preserve"> </w:t>
+      </w:r>
+      <w:r>
+        <w:rPr>
+          <w:rStyle w:val="VerbatimChar"/>
+        </w:rPr>
+        <w:t xml:space="preserve">HELP_BLURB</w:t>
+      </w:r>
+      <w:r>
+        <w:t xml:space="preserve"> </w:t>
+      </w:r>
+      <w:r>
+        <w:t xml:space="preserve">became an f-string embedding the</w:t>
+      </w:r>
+      <w:r>
+        <w:t xml:space="preserve"> </w:t>
+      </w:r>
+      <w:r>
+        <w:t xml:space="preserve">same live</w:t>
+      </w:r>
+      <w:r>
+        <w:t xml:space="preserve"> </w:t>
+      </w:r>
+      <w:r>
+        <w:rPr>
+          <w:rStyle w:val="VerbatimChar"/>
+        </w:rPr>
+        <w:t xml:space="preserve">TAG_DEFS['mpi_territory']['prefixes']</w:t>
+      </w:r>
+      <w:r>
+        <w:t xml:space="preserve">/</w:t>
+      </w:r>
+      <w:r>
+        <w:rPr>
+          <w:rStyle w:val="VerbatimChar"/>
+        </w:rPr>
+        <w:t xml:space="preserve">['suffixes']</w:t>
+      </w:r>
+      <w:r>
+        <w:t xml:space="preserve"> </w:t>
+      </w:r>
+      <w:r>
+        <w:t xml:space="preserve">values, so the two can never</w:t>
+      </w:r>
+      <w:r>
+        <w:t xml:space="preserve"> </w:t>
+      </w:r>
+      <w:r>
+        <w:t xml:space="preserve">silently drift apart the way two independently-hand-typed prefix lists eventually would. Its</w:t>
+      </w:r>
+      <w:r>
+        <w:t xml:space="preserve"> </w:t>
+      </w:r>
+      <w:r>
+        <w:rPr>
+          <w:rStyle w:val="VerbatimChar"/>
+        </w:rPr>
+        <w:t xml:space="preserve">Not computed:</w:t>
+      </w:r>
+      <w:r>
+        <w:t xml:space="preserve"> </w:t>
+      </w:r>
+      <w:r>
+        <w:t xml:space="preserve">block was already in</w:t>
+      </w:r>
+      <w:r>
+        <w:t xml:space="preserve"> </w:t>
+      </w:r>
+      <w:r>
+        <w:rPr>
+          <w:rStyle w:val="VerbatimChar"/>
+        </w:rPr>
+        <w:t xml:space="preserve">HELP_BLURB</w:t>
+      </w:r>
+      <w:r>
+        <w:t xml:space="preserve"> </w:t>
+      </w:r>
+      <w:r>
+        <w:t xml:space="preserve">almost verbatim (no change needed), and its</w:t>
+      </w:r>
+      <w:r>
+        <w:t xml:space="preserve"> </w:t>
+      </w:r>
+      <w:r>
+        <w:rPr>
+          <w:rStyle w:val="VerbatimChar"/>
+        </w:rPr>
+        <w:t xml:space="preserve">Metric explanation:</w:t>
+      </w:r>
+      <w:r>
+        <w:t xml:space="preserve"> </w:t>
+      </w:r>
+      <w:r>
+        <w:t xml:space="preserve">block is a per-shown-column legend rather than general background, so</w:t>
+      </w:r>
+      <w:r>
+        <w:t xml:space="preserve"> </w:t>
+      </w:r>
+      <w:r>
+        <w:t xml:space="preserve">rule 5 doesn’t apply to it.</w:t>
+      </w:r>
+    </w:p>
+    <w:p>
+      <w:pPr>
+        <w:pStyle w:val="FirstParagraph"/>
+      </w:pPr>
+      <w:r>
+        <w:t xml:space="preserve">No test currently asserts on</w:t>
+      </w:r>
+      <w:r>
+        <w:t xml:space="preserve"> </w:t>
+      </w:r>
+      <w:r>
+        <w:rPr>
+          <w:rStyle w:val="VerbatimChar"/>
+        </w:rPr>
+        <w:t xml:space="preserve">HELP_BLURB</w:t>
+      </w:r>
+      <w:r>
+        <w:t xml:space="preserve"> </w:t>
+      </w:r>
+      <w:r>
+        <w:t xml:space="preserve">content, and none of this step’s changes touch</w:t>
+      </w:r>
+      <w:r>
+        <w:t xml:space="preserve"> </w:t>
+      </w:r>
+      <w:r>
+        <w:rPr>
+          <w:rStyle w:val="VerbatimChar"/>
+        </w:rPr>
+        <w:t xml:space="preserve">write_report()</w:t>
+      </w:r>
+      <w:r>
+        <w:t xml:space="preserve"> </w:t>
+      </w:r>
+      <w:r>
+        <w:t xml:space="preserve">in either file, so verification was a manual read-through of both tools’ rendered</w:t>
+      </w:r>
+      <w:r>
+        <w:t xml:space="preserve"> </w:t>
+      </w:r>
+      <w:r>
+        <w:rPr>
+          <w:rStyle w:val="VerbatimChar"/>
+        </w:rPr>
+        <w:t xml:space="preserve">-h</w:t>
+      </w:r>
+      <w:r>
+        <w:t xml:space="preserve"> </w:t>
+      </w:r>
+      <w:r>
+        <w:t xml:space="preserve">output (confirming natural wrapping at the file’s existing ~75-column convention) plus the</w:t>
+      </w:r>
+      <w:r>
+        <w:t xml:space="preserve"> </w:t>
+      </w:r>
+      <w:r>
+        <w:t xml:space="preserve">full test suite (369 tests, unchanged, confirming the f-string conversion didn’t break import).</w:t>
+      </w:r>
+      <w:r>
+        <w:t xml:space="preserve"> </w:t>
+      </w:r>
+      <w:r>
+        <w:rPr>
+          <w:rStyle w:val="VerbatimChar"/>
+        </w:rPr>
+        <w:t xml:space="preserve">git status</w:t>
+      </w:r>
+      <w:r>
+        <w:t xml:space="preserve"> </w:t>
+      </w:r>
+      <w:r>
+        <w:t xml:space="preserve">on all 6</w:t>
+      </w:r>
+      <w:r>
+        <w:t xml:space="preserve"> </w:t>
+      </w:r>
+      <w:r>
+        <w:rPr>
+          <w:rStyle w:val="VerbatimChar"/>
+        </w:rPr>
+        <w:t xml:space="preserve">test_apps/results/</w:t>
+      </w:r>
+      <w:r>
+        <w:t xml:space="preserve"> </w:t>
+      </w:r>
+      <w:r>
+        <w:t xml:space="preserve">directories came back empty – no report output changed,</w:t>
+      </w:r>
+      <w:r>
+        <w:t xml:space="preserve"> </w:t>
+      </w:r>
+      <w:r>
+        <w:t xml:space="preserve">exactly as expected for an additive,</w:t>
+      </w:r>
+      <w:r>
+        <w:t xml:space="preserve"> </w:t>
+      </w:r>
+      <w:r>
+        <w:rPr>
+          <w:rStyle w:val="VerbatimChar"/>
+        </w:rPr>
+        <w:t xml:space="preserve">--help</w:t>
+      </w:r>
+      <w:r>
+        <w:t xml:space="preserve">-only step.</w:t>
+      </w:r>
+    </w:p>
     <w:bookmarkEnd w:id="72"/>
+    <w:bookmarkEnd w:id="73"/>
     <w:sectPr/>
   </w:body>
 </w:document>
@@ -37479,6 +38085,9 @@
     <w:lvlOverride w:ilvl="8">
       <w:startOverride w:val="1"/>
     </w:lvlOverride>
+  </w:num>
+  <w:num w:numId="1013">
+    <w:abstractNumId w:val="991"/>
   </w:num>
 </w:numbering>
 </file>

</xml_diff>

<commit_message>
Plan 2.10: report style guide, rules 1-5 & 7 (roadmap step 9, part 1 of 2)
Applies docs/plans/2.1-postprocess-consolidation-refactor.md's section 10
report style guide across all 6 report-writing tools (rule 6, the 120-column
hard-wrap, is split into follow-up plan 2.11). Also relocates table-owned
prose into the stage5 modules that own it, and closes plan 2.8's deferred
metadata/header-presentation item with one shared standard_header() used by
every tool, including a unified CPU-preferred/GPU-fallback metadata block and
resolve_two_dirs() directory handling shared by extract_hotspots.py and both
calltree tools.

Co-Authored-By: Claude Sonnet 5 <noreply@anthropic.com>
</commit_message>
<xml_diff>
--- a/docs/DEVELOPMENT_HISTORY.docx
+++ b/docs/DEVELOPMENT_HISTORY.docx
@@ -10,7 +10,7 @@
         <w:t xml:space="preserve">Development History</w:t>
       </w:r>
     </w:p>
-    <w:bookmarkStart w:id="73" w:name="development-history"/>
+    <w:bookmarkStart w:id="74" w:name="development-history"/>
     <w:p>
       <w:pPr>
         <w:pStyle w:val="Heading1"/>
@@ -2460,6 +2460,101 @@
           </w:p>
         </w:tc>
       </w:tr>
+      <w:tr>
+        <w:tc>
+          <w:tcPr/>
+          <w:p>
+            <w:pPr>
+              <w:pStyle w:val="Compact"/>
+              <w:jc w:val="left"/>
+            </w:pPr>
+            <w:r>
+              <w:t xml:space="preserve">2026-08-14</w:t>
+            </w:r>
+          </w:p>
+        </w:tc>
+        <w:tc>
+          <w:tcPr/>
+          <w:p>
+            <w:pPr>
+              <w:pStyle w:val="Compact"/>
+              <w:jc w:val="left"/>
+            </w:pPr>
+            <w:r>
+              <w:t xml:space="preserve">Plan 2.10: applied §10’s report style guide rules 1-5 and 7 across all 6 tools (rule 6, hard-wrap, split to plan 2.11) – roadmap step 9, the first step allowed to change report output everywhere; also relocated table-owned prose (</w:t>
+            </w:r>
+            <w:r>
+              <w:rPr>
+                <w:rStyle w:val="VerbatimChar"/>
+              </w:rPr>
+              <w:t xml:space="preserve">%total</w:t>
+            </w:r>
+            <w:r>
+              <w:t xml:space="preserve">/ranking/load-imbalance/aggregation legends) into the owning stage5 module, unified every tool’s header into one</w:t>
+            </w:r>
+            <w:r>
+              <w:t xml:space="preserve"> </w:t>
+            </w:r>
+            <w:r>
+              <w:rPr>
+                <w:rStyle w:val="VerbatimChar"/>
+              </w:rPr>
+              <w:t xml:space="preserve">stage6_report_builder.standard_header()</w:t>
+            </w:r>
+            <w:r>
+              <w:t xml:space="preserve"> </w:t>
+            </w:r>
+            <w:r>
+              <w:t xml:space="preserve">function (closing plan 2.8’s deferred metadata-presentation item), and unified</w:t>
+            </w:r>
+            <w:r>
+              <w:t xml:space="preserve"> </w:t>
+            </w:r>
+            <w:r>
+              <w:rPr>
+                <w:rStyle w:val="VerbatimChar"/>
+              </w:rPr>
+              <w:t xml:space="preserve">extract_hotspots.py</w:t>
+            </w:r>
+            <w:r>
+              <w:t xml:space="preserve">/</w:t>
+            </w:r>
+            <w:r>
+              <w:rPr>
+                <w:rStyle w:val="VerbatimChar"/>
+              </w:rPr>
+              <w:t xml:space="preserve">extract_calltree.py</w:t>
+            </w:r>
+            <w:r>
+              <w:t xml:space="preserve">/</w:t>
+            </w:r>
+            <w:r>
+              <w:rPr>
+                <w:rStyle w:val="VerbatimChar"/>
+              </w:rPr>
+              <w:t xml:space="preserve">extract_calltree_traced.py</w:t>
+            </w:r>
+            <w:r>
+              <w:t xml:space="preserve">’s directory handling via a new shared</w:t>
+            </w:r>
+            <w:r>
+              <w:t xml:space="preserve"> </w:t>
+            </w:r>
+            <w:r>
+              <w:rPr>
+                <w:rStyle w:val="VerbatimChar"/>
+              </w:rPr>
+              <w:t xml:space="preserve">resolve_two_dirs()</w:t>
+            </w:r>
+            <w:r>
+              <w:t xml:space="preserve"> </w:t>
+            </w:r>
+            <w:r>
+              <w:t xml:space="preserve">helper – see full design/real-data accounting below</w:t>
+            </w:r>
+          </w:p>
+        </w:tc>
+      </w:tr>
     </w:tbl>
     <w:bookmarkStart w:id="20" w:name="project-scaffolding-and-rules"/>
     <w:p>
@@ -37424,7 +37519,2013 @@
       </w:r>
     </w:p>
     <w:bookmarkEnd w:id="72"/>
+    <w:bookmarkStart w:id="73" w:name="X08c2b5e003e6dc2b4aa9c06471fb10f9fa2b44e"/>
+    <w:p>
+      <w:pPr>
+        <w:pStyle w:val="Heading2"/>
+      </w:pPr>
+      <w:r>
+        <w:t xml:space="preserve">2026-08-14 — Plan 2.10: report style guide, rules 1-5 &amp; 7 (roadmap step 9, part 1 of 2)</w:t>
+      </w:r>
+    </w:p>
+    <w:p>
+      <w:pPr>
+        <w:pStyle w:val="FirstParagraph"/>
+      </w:pPr>
+      <w:r>
+        <w:t xml:space="preserve">Ninth implementation step, and the first where report output is</w:t>
+      </w:r>
+      <w:r>
+        <w:t xml:space="preserve"> </w:t>
+      </w:r>
+      <w:r>
+        <w:rPr>
+          <w:iCs/>
+          <w:i/>
+        </w:rPr>
+        <w:t xml:space="preserve">intentionally</w:t>
+      </w:r>
+      <w:r>
+        <w:t xml:space="preserve"> </w:t>
+      </w:r>
+      <w:r>
+        <w:t xml:space="preserve">allowed to change</w:t>
+      </w:r>
+      <w:r>
+        <w:t xml:space="preserve"> </w:t>
+      </w:r>
+      <w:r>
+        <w:t xml:space="preserve">everywhere. Applied</w:t>
+      </w:r>
+      <w:r>
+        <w:t xml:space="preserve"> </w:t>
+      </w:r>
+      <w:r>
+        <w:rPr>
+          <w:rStyle w:val="VerbatimChar"/>
+        </w:rPr>
+        <w:t xml:space="preserve">docs/plans/2.1-postprocess-consolidation-refactor.md</w:t>
+      </w:r>
+      <w:r>
+        <w:t xml:space="preserve"> </w:t>
+      </w:r>
+      <w:r>
+        <w:t xml:space="preserve">§10’s report style</w:t>
+      </w:r>
+      <w:r>
+        <w:t xml:space="preserve"> </w:t>
+      </w:r>
+      <w:r>
+        <w:t xml:space="preserve">guide across all 6 tools, splitting rule 6 (120-column hard-wrap, needing changes to two</w:t>
+      </w:r>
+      <w:r>
+        <w:t xml:space="preserve"> </w:t>
+      </w:r>
+      <w:r>
+        <w:t xml:space="preserve">renderers plus both</w:t>
+      </w:r>
+      <w:r>
+        <w:t xml:space="preserve"> </w:t>
+      </w:r>
+      <w:r>
+        <w:rPr>
+          <w:rStyle w:val="VerbatimChar"/>
+        </w:rPr>
+        <w:t xml:space="preserve">select_hotspot_*.py</w:t>
+      </w:r>
+      <w:r>
+        <w:t xml:space="preserve"> </w:t>
+      </w:r>
+      <w:r>
+        <w:t xml:space="preserve">re-parsers) into its own follow-up, plan 2.11.</w:t>
+      </w:r>
+    </w:p>
+    <w:p>
+      <w:pPr>
+        <w:pStyle w:val="BodyText"/>
+      </w:pPr>
+      <w:r>
+        <w:t xml:space="preserve">Two real gaps surfaced while drafting this plan, both about report content living in the wrong</w:t>
+      </w:r>
+      <w:r>
+        <w:t xml:space="preserve"> </w:t>
+      </w:r>
+      <w:r>
+        <w:t xml:space="preserve">place – the same problem §10 exists to solve, just not named there:</w:t>
+      </w:r>
+    </w:p>
+    <w:p>
+      <w:pPr>
+        <w:numPr>
+          <w:ilvl w:val="0"/>
+          <w:numId w:val="1014"/>
+        </w:numPr>
+        <w:pStyle w:val="Compact"/>
+      </w:pPr>
+      <w:r>
+        <w:rPr>
+          <w:bCs/>
+          <w:b/>
+        </w:rPr>
+        <w:t xml:space="preserve">Table-owned prose scattered and duplicated across tools.</w:t>
+      </w:r>
+      <w:r>
+        <w:t xml:space="preserve"> </w:t>
+      </w:r>
+      <w:r>
+        <w:t xml:space="preserve">The load-imbalance legend, the POP</w:t>
+      </w:r>
+      <w:r>
+        <w:t xml:space="preserve"> </w:t>
+      </w:r>
+      <w:r>
+        <w:t xml:space="preserve">metrics</w:t>
+      </w:r>
+      <w:r>
+        <w:t xml:space="preserve"> </w:t>
+      </w:r>
+      <w:r>
+        <w:t xml:space="preserve">“</w:t>
+      </w:r>
+      <w:r>
+        <w:t xml:space="preserve">Metric explanation:</w:t>
+      </w:r>
+      <w:r>
+        <w:t xml:space="preserve">”</w:t>
+      </w:r>
+      <w:r>
+        <w:t xml:space="preserve"> </w:t>
+      </w:r>
+      <w:r>
+        <w:t xml:space="preserve">block, the calltree aggregation legend, the</w:t>
+      </w:r>
+      <w:r>
+        <w:t xml:space="preserve"> </w:t>
+      </w:r>
+      <w:r>
+        <w:rPr>
+          <w:rStyle w:val="VerbatimChar"/>
+        </w:rPr>
+        <w:t xml:space="preserve">%total</w:t>
+      </w:r>
+      <w:r>
+        <w:t xml:space="preserve">-meaning</w:t>
+      </w:r>
+      <w:r>
+        <w:t xml:space="preserve"> </w:t>
+      </w:r>
+      <w:r>
+        <w:t xml:space="preserve">sentences, and the ranking-mode note were all hand-typed per tool (sometimes word-for-word</w:t>
+      </w:r>
+      <w:r>
+        <w:t xml:space="preserve"> </w:t>
+      </w:r>
+      <w:r>
+        <w:t xml:space="preserve">duplicated, sometimes silently drifted) despite describing what a stage-5 table module renders,</w:t>
+      </w:r>
+      <w:r>
+        <w:t xml:space="preserve"> </w:t>
+      </w:r>
+      <w:r>
+        <w:t xml:space="preserve">not tool-specific business logic. All five moved into new functions beside the table module</w:t>
+      </w:r>
+      <w:r>
+        <w:t xml:space="preserve"> </w:t>
+      </w:r>
+      <w:r>
+        <w:t xml:space="preserve">that owns them:</w:t>
+      </w:r>
+      <w:r>
+        <w:t xml:space="preserve"> </w:t>
+      </w:r>
+      <w:r>
+        <w:rPr>
+          <w:rStyle w:val="VerbatimChar"/>
+        </w:rPr>
+        <w:t xml:space="preserve">stage5_table_render.pct_total_note()</w:t>
+      </w:r>
+      <w:r>
+        <w:t xml:space="preserve">/</w:t>
+      </w:r>
+      <w:r>
+        <w:rPr>
+          <w:rStyle w:val="VerbatimChar"/>
+        </w:rPr>
+        <w:t xml:space="preserve">ranking_note()</w:t>
+      </w:r>
+      <w:r>
+        <w:t xml:space="preserve">,</w:t>
+      </w:r>
+      <w:r>
+        <w:t xml:space="preserve"> </w:t>
+      </w:r>
+      <w:r>
+        <w:rPr>
+          <w:rStyle w:val="VerbatimChar"/>
+        </w:rPr>
+        <w:t xml:space="preserve">stage5_load_imbalance_table.imbalance_note()</w:t>
+      </w:r>
+      <w:r>
+        <w:t xml:space="preserve">,</w:t>
+      </w:r>
+      <w:r>
+        <w:t xml:space="preserve"> </w:t>
+      </w:r>
+      <w:r>
+        <w:rPr>
+          <w:rStyle w:val="VerbatimChar"/>
+        </w:rPr>
+        <w:t xml:space="preserve">stage5_pop_metrics_table.metrics_legend()</w:t>
+      </w:r>
+      <w:r>
+        <w:t xml:space="preserve">,</w:t>
+      </w:r>
+      <w:r>
+        <w:t xml:space="preserve"> </w:t>
+      </w:r>
+      <w:r>
+        <w:rPr>
+          <w:rStyle w:val="VerbatimChar"/>
+        </w:rPr>
+        <w:t xml:space="preserve">stage5_tree_render.aggregation_note()</w:t>
+      </w:r>
+      <w:r>
+        <w:t xml:space="preserve">/</w:t>
+      </w:r>
+      <w:r>
+        <w:rPr>
+          <w:rStyle w:val="VerbatimChar"/>
+        </w:rPr>
+        <w:t xml:space="preserve">tree_view_note()</w:t>
+      </w:r>
+      <w:r>
+        <w:t xml:space="preserve">. The</w:t>
+      </w:r>
+      <w:r>
+        <w:t xml:space="preserve"> </w:t>
+      </w:r>
+      <w:r>
+        <w:rPr>
+          <w:rStyle w:val="VerbatimChar"/>
+        </w:rPr>
+        <w:t xml:space="preserve">%total</w:t>
+      </w:r>
+      <w:r>
+        <w:t xml:space="preserve">/ranking notes are</w:t>
+      </w:r>
+      <w:r>
+        <w:t xml:space="preserve"> </w:t>
+      </w:r>
+      <w:r>
+        <w:t xml:space="preserve">generated from the exact</w:t>
+      </w:r>
+      <w:r>
+        <w:t xml:space="preserve"> </w:t>
+      </w:r>
+      <w:r>
+        <w:rPr>
+          <w:rStyle w:val="VerbatimChar"/>
+        </w:rPr>
+        <w:t xml:space="preserve">threshold_unit</w:t>
+      </w:r>
+      <w:r>
+        <w:t xml:space="preserve">/</w:t>
+      </w:r>
+      <w:r>
+        <w:rPr>
+          <w:rStyle w:val="VerbatimChar"/>
+        </w:rPr>
+        <w:t xml:space="preserve">unfiltered</w:t>
+      </w:r>
+      <w:r>
+        <w:t xml:space="preserve"> </w:t>
+      </w:r>
+      <w:r>
+        <w:t xml:space="preserve">values already given to</w:t>
+      </w:r>
+      <w:r>
+        <w:t xml:space="preserve"> </w:t>
+      </w:r>
+      <w:r>
+        <w:rPr>
+          <w:rStyle w:val="VerbatimChar"/>
+        </w:rPr>
+        <w:t xml:space="preserve">select_entries()</w:t>
+      </w:r>
+      <w:r>
+        <w:t xml:space="preserve">, so the</w:t>
+      </w:r>
+      <w:r>
+        <w:t xml:space="preserve"> </w:t>
+      </w:r>
+      <w:r>
+        <w:t xml:space="preserve">“</w:t>
+      </w:r>
+      <w:r>
+        <w:t xml:space="preserve">showing top N … X</w:t>
+      </w:r>
+      <w:r>
+        <w:t xml:space="preserve">”</w:t>
+      </w:r>
+      <w:r>
+        <w:t xml:space="preserve"> </w:t>
+      </w:r>
+      <w:r>
+        <w:t xml:space="preserve">line and</w:t>
+      </w:r>
+      <w:r>
+        <w:t xml:space="preserve"> </w:t>
+      </w:r>
+      <w:r>
+        <w:t xml:space="preserve">“</w:t>
+      </w:r>
+      <w:r>
+        <w:t xml:space="preserve">%total means X</w:t>
+      </w:r>
+      <w:r>
+        <w:t xml:space="preserve">”</w:t>
+      </w:r>
+      <w:r>
+        <w:t xml:space="preserve"> </w:t>
+      </w:r>
+      <w:r>
+        <w:t xml:space="preserve">line can no longer</w:t>
+      </w:r>
+      <w:r>
+        <w:t xml:space="preserve"> </w:t>
+      </w:r>
+      <w:r>
+        <w:t xml:space="preserve">drift apart the way</w:t>
+      </w:r>
+      <w:r>
+        <w:t xml:space="preserve"> </w:t>
+      </w:r>
+      <w:r>
+        <w:rPr>
+          <w:rStyle w:val="VerbatimChar"/>
+        </w:rPr>
+        <w:t xml:space="preserve">extract_hotspots.py</w:t>
+      </w:r>
+      <w:r>
+        <w:t xml:space="preserve">‘</w:t>
+      </w:r>
+      <w:r>
+        <w:t xml:space="preserve">s 4 tables</w:t>
+      </w:r>
+      <w:r>
+        <w:t xml:space="preserve">’</w:t>
+      </w:r>
+      <w:r>
+        <w:t xml:space="preserve"> </w:t>
+      </w:r>
+      <w:r>
+        <w:t xml:space="preserve">identical, but semantically wrong,</w:t>
+      </w:r>
+      <w:r>
+        <w:t xml:space="preserve"> </w:t>
+      </w:r>
+      <w:r>
+        <w:rPr>
+          <w:rStyle w:val="VerbatimChar"/>
+        </w:rPr>
+        <w:t xml:space="preserve">threshold_unit="of total runtime"</w:t>
+      </w:r>
+      <w:r>
+        <w:t xml:space="preserve"> </w:t>
+      </w:r>
+      <w:r>
+        <w:t xml:space="preserve">already had.</w:t>
+      </w:r>
+    </w:p>
+    <w:p>
+      <w:pPr>
+        <w:numPr>
+          <w:ilvl w:val="0"/>
+          <w:numId w:val="1014"/>
+        </w:numPr>
+        <w:pStyle w:val="Compact"/>
+      </w:pPr>
+      <w:r>
+        <w:rPr>
+          <w:bCs/>
+          <w:b/>
+        </w:rPr>
+        <w:t xml:space="preserve">Metadata/header consolidation plan 2.8 deferred here.</w:t>
+      </w:r>
+      <w:r>
+        <w:t xml:space="preserve"> </w:t>
+      </w:r>
+      <w:r>
+        <w:t xml:space="preserve">Every tool’s header reduced to the</w:t>
+      </w:r>
+      <w:r>
+        <w:t xml:space="preserve"> </w:t>
+      </w:r>
+      <w:r>
+        <w:t xml:space="preserve">same handful of facts (which tool wrote it, when, a 1-2 line description, one or more runs each</w:t>
+      </w:r>
+      <w:r>
+        <w:t xml:space="preserve"> </w:t>
+      </w:r>
+      <w:r>
+        <w:t xml:space="preserve">with one or more source directories and an optional executable/runtime/rank-count/scanned-files,</w:t>
+      </w:r>
+      <w:r>
+        <w:t xml:space="preserve"> </w:t>
+      </w:r>
+      <w:r>
+        <w:t xml:space="preserve">and which tables the report contains) – closed with one new</w:t>
+      </w:r>
+      <w:r>
+        <w:t xml:space="preserve"> </w:t>
+      </w:r>
+      <w:r>
+        <w:rPr>
+          <w:rStyle w:val="VerbatimChar"/>
+        </w:rPr>
+        <w:t xml:space="preserve">stage6_report_builder.standard_header(tool_name, description, runs)</w:t>
+      </w:r>
+      <w:r>
+        <w:t xml:space="preserve"> </w:t>
+      </w:r>
+      <w:r>
+        <w:t xml:space="preserve">function every tool calls,</w:t>
+      </w:r>
+      <w:r>
+        <w:t xml:space="preserve"> </w:t>
+      </w:r>
+      <w:r>
+        <w:t xml:space="preserve">plus a</w:t>
+      </w:r>
+      <w:r>
+        <w:t xml:space="preserve"> </w:t>
+      </w:r>
+      <w:r>
+        <w:rPr>
+          <w:rStyle w:val="VerbatimChar"/>
+        </w:rPr>
+        <w:t xml:space="preserve">render_report()</w:t>
+      </w:r>
+      <w:r>
+        <w:t xml:space="preserve"> </w:t>
+      </w:r>
+      <w:r>
+        <w:t xml:space="preserve">change that auto-lists titled section names under a</w:t>
+      </w:r>
+      <w:r>
+        <w:t xml:space="preserve"> </w:t>
+      </w:r>
+      <w:r>
+        <w:rPr>
+          <w:rStyle w:val="VerbatimChar"/>
+        </w:rPr>
+        <w:t xml:space="preserve">tables:</w:t>
+      </w:r>
+      <w:r>
+        <w:t xml:space="preserve"> </w:t>
+      </w:r>
+      <w:r>
+        <w:t xml:space="preserve">heading</w:t>
+      </w:r>
+      <w:r>
+        <w:t xml:space="preserve"> </w:t>
+      </w:r>
+      <w:r>
+        <w:t xml:space="preserve">and auto-generates the</w:t>
+      </w:r>
+      <w:r>
+        <w:t xml:space="preserve"> </w:t>
+      </w:r>
+      <w:r>
+        <w:t xml:space="preserve">“</w:t>
+      </w:r>
+      <w:r>
+        <w:t xml:space="preserve">these N directories aren’t checked against each other</w:t>
+      </w:r>
+      <w:r>
+        <w:t xml:space="preserve">”</w:t>
+      </w:r>
+      <w:r>
+        <w:t xml:space="preserve"> </w:t>
+      </w:r>
+      <w:r>
+        <w:t xml:space="preserve">caveat whenever</w:t>
+      </w:r>
+      <w:r>
+        <w:t xml:space="preserve"> </w:t>
+      </w:r>
+      <w:r>
+        <w:t xml:space="preserve">more than one directory feeds the report in total (previously hand-typed only in</w:t>
+      </w:r>
+      <w:r>
+        <w:t xml:space="preserve"> </w:t>
+      </w:r>
+      <w:r>
+        <w:rPr>
+          <w:rStyle w:val="VerbatimChar"/>
+        </w:rPr>
+        <w:t xml:space="preserve">extract_hotspots.py</w:t>
+      </w:r>
+      <w:r>
+        <w:t xml:space="preserve">; now also correctly appears for</w:t>
+      </w:r>
+      <w:r>
+        <w:t xml:space="preserve"> </w:t>
+      </w:r>
+      <w:r>
+        <w:rPr>
+          <w:rStyle w:val="VerbatimChar"/>
+        </w:rPr>
+        <w:t xml:space="preserve">extract_pop_metrics.py</w:t>
+      </w:r>
+      <w:r>
+        <w:t xml:space="preserve">’s multi-directory</w:t>
+      </w:r>
+      <w:r>
+        <w:t xml:space="preserve"> </w:t>
+      </w:r>
+      <w:r>
+        <w:t xml:space="preserve">scaling studies, a real caveat that was simply never stated there before). The header’s own first</w:t>
+      </w:r>
+      <w:r>
+        <w:t xml:space="preserve"> </w:t>
+      </w:r>
+      <w:r>
+        <w:t xml:space="preserve">line is the report’s full identity in one sentence –</w:t>
+      </w:r>
+      <w:r>
+        <w:t xml:space="preserve"> </w:t>
+      </w:r>
+      <w:r>
+        <w:rPr>
+          <w:rStyle w:val="VerbatimChar"/>
+        </w:rPr>
+        <w:t xml:space="preserve">"tool name" report generated "timestamp".</w:t>
+      </w:r>
+      <w:r>
+        <w:t xml:space="preserve"> </w:t>
+      </w:r>
+      <w:r>
+        <w:t xml:space="preserve">followed by the tool’s short description – replacing an earlier two-line</w:t>
+      </w:r>
+      <w:r>
+        <w:t xml:space="preserve"> </w:t>
+      </w:r>
+      <w:r>
+        <w:rPr>
+          <w:rStyle w:val="VerbatimChar"/>
+        </w:rPr>
+        <w:t xml:space="preserve">tool: .../generated:    ...</w:t>
+      </w:r>
+      <w:r>
+        <w:t xml:space="preserve"> </w:t>
+      </w:r>
+      <w:r>
+        <w:t xml:space="preserve">draft folded into one function,</w:t>
+      </w:r>
+      <w:r>
+        <w:t xml:space="preserve"> </w:t>
+      </w:r>
+      <w:r>
+        <w:rPr>
+          <w:rStyle w:val="VerbatimChar"/>
+        </w:rPr>
+        <w:t xml:space="preserve">generated_line()</w:t>
+      </w:r>
+      <w:r>
+        <w:t xml:space="preserve">, once that draft’s header and the</w:t>
+      </w:r>
+      <w:r>
+        <w:t xml:space="preserve"> </w:t>
+      </w:r>
+      <w:r>
+        <w:t xml:space="preserve">description sentence were reviewed together and read better merged than split. Each</w:t>
+      </w:r>
+      <w:r>
+        <w:t xml:space="preserve"> </w:t>
+      </w:r>
+      <w:r>
+        <w:rPr>
+          <w:rStyle w:val="VerbatimChar"/>
+        </w:rPr>
+        <w:t xml:space="preserve">runs</w:t>
+      </w:r>
+      <w:r>
+        <w:t xml:space="preserve"> </w:t>
+      </w:r>
+      <w:r>
+        <w:t xml:space="preserve">entry</w:t>
+      </w:r>
+      <w:r>
+        <w:t xml:space="preserve"> </w:t>
+      </w:r>
+      <w:r>
+        <w:t xml:space="preserve">carries a</w:t>
+      </w:r>
+      <w:r>
+        <w:t xml:space="preserve"> </w:t>
+      </w:r>
+      <w:r>
+        <w:rPr>
+          <w:rStyle w:val="VerbatimChar"/>
+        </w:rPr>
+        <w:t xml:space="preserve">directories</w:t>
+      </w:r>
+      <w:r>
+        <w:t xml:space="preserve"> </w:t>
+      </w:r>
+      <w:r>
+        <w:t xml:space="preserve">list (label/path pairs) rather than a single label/directory, precisely</w:t>
+      </w:r>
+      <w:r>
+        <w:t xml:space="preserve"> </w:t>
+      </w:r>
+      <w:r>
+        <w:t xml:space="preserve">so one run can show more than one physical directory (a CPU side and a GPU side) under one shared</w:t>
+      </w:r>
+      <w:r>
+        <w:t xml:space="preserve"> </w:t>
+      </w:r>
+      <w:r>
+        <w:t xml:space="preserve">metadata block instead of two separate blocks – see the directory-handling unification below,</w:t>
+      </w:r>
+      <w:r>
+        <w:t xml:space="preserve"> </w:t>
+      </w:r>
+      <w:r>
+        <w:t xml:space="preserve">which is what actually needed this shape.</w:t>
+      </w:r>
+    </w:p>
+    <w:p>
+      <w:pPr>
+        <w:pStyle w:val="FirstParagraph"/>
+      </w:pPr>
+      <w:r>
+        <w:rPr>
+          <w:rStyle w:val="VerbatimChar"/>
+        </w:rPr>
+        <w:t xml:space="preserve">render_report()</w:t>
+      </w:r>
+      <w:r>
+        <w:t xml:space="preserve"> </w:t>
+      </w:r>
+      <w:r>
+        <w:t xml:space="preserve">itself gained the section-numbering mechanism rules 2-4 needed:</w:t>
+      </w:r>
+      <w:r>
+        <w:t xml:space="preserve"> </w:t>
+      </w:r>
+      <w:r>
+        <w:rPr>
+          <w:rStyle w:val="VerbatimChar"/>
+        </w:rPr>
+        <w:t xml:space="preserve">title</w:t>
+      </w:r>
+      <w:r>
+        <w:t xml:space="preserve"> </w:t>
+      </w:r>
+      <w:r>
+        <w:t xml:space="preserve">is now</w:t>
+      </w:r>
+      <w:r>
+        <w:t xml:space="preserve"> </w:t>
+      </w:r>
+      <w:r>
+        <w:t xml:space="preserve">plain, undecorated text, and</w:t>
+      </w:r>
+      <w:r>
+        <w:t xml:space="preserve"> </w:t>
+      </w:r>
+      <w:r>
+        <w:rPr>
+          <w:rStyle w:val="VerbatimChar"/>
+        </w:rPr>
+        <w:t xml:space="preserve">render_report()</w:t>
+      </w:r>
+      <w:r>
+        <w:t xml:space="preserve"> </w:t>
+      </w:r>
+      <w:r>
+        <w:t xml:space="preserve">decides the decoration once, for the whole report –</w:t>
+      </w:r>
+      <w:r>
+        <w:t xml:space="preserve"> </w:t>
+      </w:r>
+      <w:r>
+        <w:t xml:space="preserve">0 titled sections stays unchanged (calltree’s untitled tree/fallback blocks), 2+ get</w:t>
+      </w:r>
+      <w:r>
+        <w:t xml:space="preserve"> </w:t>
+      </w:r>
+      <w:r>
+        <w:rPr>
+          <w:rStyle w:val="VerbatimChar"/>
+        </w:rPr>
+        <w:t xml:space="preserve">=== N. Title ===</w:t>
+      </w:r>
+      <w:r>
+        <w:t xml:space="preserve"> </w:t>
+      </w:r>
+      <w:r>
+        <w:t xml:space="preserve">numbered by position among titled sections only, and exactly 1 titled section</w:t>
+      </w:r>
+      <w:r>
+        <w:t xml:space="preserve"> </w:t>
+      </w:r>
+      <w:r>
+        <w:t xml:space="preserve">still gets the same</w:t>
+      </w:r>
+      <w:r>
+        <w:t xml:space="preserve"> </w:t>
+      </w:r>
+      <w:r>
+        <w:rPr>
+          <w:rStyle w:val="VerbatimChar"/>
+        </w:rPr>
+        <w:t xml:space="preserve">=== Title ===</w:t>
+      </w:r>
+      <w:r>
+        <w:t xml:space="preserve"> </w:t>
+      </w:r>
+      <w:r>
+        <w:t xml:space="preserve">bracketing, just without a number – a report reader always</w:t>
+      </w:r>
+      <w:r>
+        <w:t xml:space="preserve"> </w:t>
+      </w:r>
+      <w:r>
+        <w:t xml:space="preserve">sees which table is printing, single-table tools included, but a lone table never needs to count</w:t>
+      </w:r>
+      <w:r>
+        <w:t xml:space="preserve"> </w:t>
+      </w:r>
+      <w:r>
+        <w:t xml:space="preserve">itself. (An earlier draft made the single-section case a bare, undecorated sentence instead;</w:t>
+      </w:r>
+      <w:r>
+        <w:t xml:space="preserve"> </w:t>
+      </w:r>
+      <w:r>
+        <w:t xml:space="preserve">reviewed against</w:t>
+      </w:r>
+      <w:r>
+        <w:t xml:space="preserve"> </w:t>
+      </w:r>
+      <w:r>
+        <w:rPr>
+          <w:rStyle w:val="VerbatimChar"/>
+        </w:rPr>
+        <w:t xml:space="preserve">pop_metrics</w:t>
+      </w:r>
+      <w:r>
+        <w:t xml:space="preserve">’s real output and reverted before landing, since dropping the</w:t>
+      </w:r>
+      <w:r>
+        <w:t xml:space="preserve"> </w:t>
+      </w:r>
+      <w:r>
+        <w:rPr>
+          <w:rStyle w:val="VerbatimChar"/>
+        </w:rPr>
+        <w:t xml:space="preserve">===</w:t>
+      </w:r>
+      <w:r>
+        <w:t xml:space="preserve"> </w:t>
+      </w:r>
+      <w:r>
+        <w:t xml:space="preserve">markers made a single-table report look unfinished rather than simpler.) Skip-message sections</w:t>
+      </w:r>
+      <w:r>
+        <w:t xml:space="preserve"> </w:t>
+      </w:r>
+      <w:r>
+        <w:t xml:space="preserve">(e.g. </w:t>
+      </w:r>
+      <w:r>
+        <w:t xml:space="preserve">“</w:t>
+      </w:r>
+      <w:r>
+        <w:t xml:space="preserve">only 1 rank/file found</w:t>
+      </w:r>
+      <w:r>
+        <w:t xml:space="preserve">”</w:t>
+      </w:r>
+      <w:r>
+        <w:t xml:space="preserve">) changed shape to participate in this: the skip message becomes the</w:t>
+      </w:r>
+      <w:r>
+        <w:t xml:space="preserve"> </w:t>
+      </w:r>
+      <w:r>
+        <w:t xml:space="preserve">section’s real, countable title with an empty body, instead of</w:t>
+      </w:r>
+      <w:r>
+        <w:t xml:space="preserve"> </w:t>
+      </w:r>
+      <w:r>
+        <w:rPr>
+          <w:rStyle w:val="VerbatimChar"/>
+        </w:rPr>
+        <w:t xml:space="preserve">title=None</w:t>
+      </w:r>
+      <w:r>
+        <w:t xml:space="preserve"> </w:t>
+      </w:r>
+      <w:r>
+        <w:t xml:space="preserve">with the whole message</w:t>
+      </w:r>
+      <w:r>
+        <w:t xml:space="preserve"> </w:t>
+      </w:r>
+      <w:r>
+        <w:t xml:space="preserve">folded into body. Every note that used to be wedged between a section’s title and its table moved</w:t>
+      </w:r>
+      <w:r>
+        <w:t xml:space="preserve"> </w:t>
+      </w:r>
+      <w:r>
+        <w:t xml:space="preserve">to</w:t>
+      </w:r>
+      <w:r>
+        <w:t xml:space="preserve"> </w:t>
+      </w:r>
+      <w:r>
+        <w:rPr>
+          <w:iCs/>
+          <w:i/>
+        </w:rPr>
+        <w:t xml:space="preserve">after</w:t>
+      </w:r>
+      <w:r>
+        <w:t xml:space="preserve"> </w:t>
+      </w:r>
+      <w:r>
+        <w:t xml:space="preserve">the table, bulleted (rules 3+4 together) – including</w:t>
+      </w:r>
+      <w:r>
+        <w:t xml:space="preserve"> </w:t>
+      </w:r>
+      <w:r>
+        <w:rPr>
+          <w:rStyle w:val="VerbatimChar"/>
+        </w:rPr>
+        <w:t xml:space="preserve">extract_hotspots.py</w:t>
+      </w:r>
+      <w:r>
+        <w:t xml:space="preserve">’s</w:t>
+      </w:r>
+      <w:r>
+        <w:t xml:space="preserve"> </w:t>
+      </w:r>
+      <w:r>
+        <w:t xml:space="preserve">“</w:t>
+      </w:r>
+      <w:r>
+        <w:t xml:space="preserve">Combined-pool arithmetic</w:t>
+      </w:r>
+      <w:r>
+        <w:t xml:space="preserve">”</w:t>
+      </w:r>
+      <w:r>
+        <w:t xml:space="preserve"> </w:t>
+      </w:r>
+      <w:r>
+        <w:t xml:space="preserve">breakdown, which moved from the header into a bulleted block under its</w:t>
+      </w:r>
+      <w:r>
+        <w:t xml:space="preserve"> </w:t>
+      </w:r>
+      <w:r>
+        <w:t xml:space="preserve">own table – with a blank line always separating the table’s own rendered rows from its bulleted</w:t>
+      </w:r>
+      <w:r>
+        <w:t xml:space="preserve"> </w:t>
+      </w:r>
+      <w:r>
+        <w:t xml:space="preserve">notes below, so a table’s data and its explanatory prose never visually run together.</w:t>
+      </w:r>
+    </w:p>
+    <w:p>
+      <w:pPr>
+        <w:pStyle w:val="BodyText"/>
+      </w:pPr>
+      <w:r>
+        <w:t xml:space="preserve">Rule 5’s redirect audit (re-checked line-by-line against each tool’s current</w:t>
+      </w:r>
+      <w:r>
+        <w:t xml:space="preserve"> </w:t>
+      </w:r>
+      <w:r>
+        <w:rPr>
+          <w:rStyle w:val="VerbatimChar"/>
+        </w:rPr>
+        <w:t xml:space="preserve">HELP_BLURB</w:t>
+      </w:r>
+      <w:r>
+        <w:t xml:space="preserve">,</w:t>
+      </w:r>
+      <w:r>
+        <w:t xml:space="preserve"> </w:t>
+      </w:r>
+      <w:r>
+        <w:t xml:space="preserve">including plan 2.9’s additions) found</w:t>
+      </w:r>
+      <w:r>
+        <w:t xml:space="preserve"> </w:t>
+      </w:r>
+      <w:r>
+        <w:rPr>
+          <w:rStyle w:val="VerbatimChar"/>
+        </w:rPr>
+        <w:t xml:space="preserve">extract_calltree.py</w:t>
+      </w:r>
+      <w:r>
+        <w:t xml:space="preserve"> </w:t>
+      </w:r>
+      <w:r>
+        <w:t xml:space="preserve">and</w:t>
+      </w:r>
+      <w:r>
+        <w:t xml:space="preserve"> </w:t>
+      </w:r>
+      <w:r>
+        <w:rPr>
+          <w:rStyle w:val="VerbatimChar"/>
+        </w:rPr>
+        <w:t xml:space="preserve">extract_pop_metrics.py</w:t>
+      </w:r>
+      <w:r>
+        <w:t xml:space="preserve">‘</w:t>
+      </w:r>
+      <w:r>
+        <w:t xml:space="preserve">s</w:t>
+      </w:r>
+      <w:r>
+        <w:t xml:space="preserve"> </w:t>
+      </w:r>
+      <w:r>
+        <w:t xml:space="preserve">remaining footers fully collapse to one</w:t>
+      </w:r>
+      <w:r>
+        <w:t xml:space="preserve"> </w:t>
+      </w:r>
+      <w:r>
+        <w:rPr>
+          <w:rStyle w:val="VerbatimChar"/>
+        </w:rPr>
+        <w:t xml:space="preserve">help_redirect()</w:t>
+      </w:r>
+      <w:r>
+        <w:t xml:space="preserve"> </w:t>
+      </w:r>
+      <w:r>
+        <w:t xml:space="preserve">line each – and a gap plan 2.9 didn’t</w:t>
+      </w:r>
+      <w:r>
+        <w:t xml:space="preserve"> </w:t>
+      </w:r>
+      <w:r>
+        <w:t xml:space="preserve">catch:</w:t>
+      </w:r>
+      <w:r>
+        <w:t xml:space="preserve"> </w:t>
+      </w:r>
+      <w:r>
+        <w:rPr>
+          <w:rStyle w:val="VerbatimChar"/>
+        </w:rPr>
+        <w:t xml:space="preserve">extract_calltree_traced.py</w:t>
+      </w:r>
+      <w:r>
+        <w:t xml:space="preserve">’s own</w:t>
+      </w:r>
+      <w:r>
+        <w:t xml:space="preserve"> </w:t>
+      </w:r>
+      <w:r>
+        <w:rPr>
+          <w:rStyle w:val="VerbatimChar"/>
+        </w:rPr>
+        <w:t xml:space="preserve">HELP_BLURB</w:t>
+      </w:r>
+      <w:r>
+        <w:t xml:space="preserve">/footer pair was never separately audited</w:t>
+      </w:r>
+      <w:r>
+        <w:t xml:space="preserve"> </w:t>
+      </w:r>
+      <w:r>
+        <w:t xml:space="preserve">(plan 2.9’s precondition check only named the other two tools), and its</w:t>
+      </w:r>
+      <w:r>
+        <w:t xml:space="preserve"> </w:t>
+      </w:r>
+      <w:r>
+        <w:t xml:space="preserve">“</w:t>
+      </w:r>
+      <w:r>
+        <w:t xml:space="preserve">.kd</w:t>
+      </w:r>
+      <w:r>
+        <w:t xml:space="preserve">”</w:t>
+      </w:r>
+      <w:r>
+        <w:t xml:space="preserve"> </w:t>
+      </w:r>
+      <w:r>
+        <w:t xml:space="preserve">kernel-descriptor</w:t>
+      </w:r>
+      <w:r>
+        <w:t xml:space="preserve"> </w:t>
+      </w:r>
+      <w:r>
+        <w:t xml:space="preserve">caveat lacked the</w:t>
+      </w:r>
+      <w:r>
+        <w:t xml:space="preserve"> </w:t>
+      </w:r>
+      <w:r>
+        <w:t xml:space="preserve">“</w:t>
+      </w:r>
+      <w:r>
+        <w:t xml:space="preserve">why</w:t>
+      </w:r>
+      <w:r>
+        <w:t xml:space="preserve">”</w:t>
+      </w:r>
+      <w:r>
+        <w:t xml:space="preserve"> </w:t>
+      </w:r>
+      <w:r>
+        <w:t xml:space="preserve">explanation its footer bullet gave. One sentence added to</w:t>
+      </w:r>
+      <w:r>
+        <w:t xml:space="preserve"> </w:t>
+      </w:r>
+      <w:r>
+        <w:rPr>
+          <w:rStyle w:val="VerbatimChar"/>
+        </w:rPr>
+        <w:t xml:space="preserve">HELP_BLURB</w:t>
+      </w:r>
+      <w:r>
+        <w:t xml:space="preserve"> </w:t>
+      </w:r>
+      <w:r>
+        <w:t xml:space="preserve">closed that gap too, so all three tools</w:t>
+      </w:r>
+      <w:r>
+        <w:t xml:space="preserve">’</w:t>
+      </w:r>
+      <w:r>
+        <w:t xml:space="preserve"> </w:t>
+      </w:r>
+      <w:r>
+        <w:t xml:space="preserve">footers now redirect.</w:t>
+      </w:r>
+      <w:r>
+        <w:t xml:space="preserve"> </w:t>
+      </w:r>
+      <w:r>
+        <w:rPr>
+          <w:rStyle w:val="VerbatimChar"/>
+        </w:rPr>
+        <w:t xml:space="preserve">extract_CPU_hotspots.py</w:t>
+      </w:r>
+      <w:r>
+        <w:t xml:space="preserve">/</w:t>
+      </w:r>
+      <w:r>
+        <w:t xml:space="preserve"> </w:t>
+      </w:r>
+      <w:r>
+        <w:rPr>
+          <w:rStyle w:val="VerbatimChar"/>
+        </w:rPr>
+        <w:t xml:space="preserve">extract_GPU_hotspots.py</w:t>
+      </w:r>
+      <w:r>
+        <w:t xml:space="preserve">/</w:t>
+      </w:r>
+      <w:r>
+        <w:rPr>
+          <w:rStyle w:val="VerbatimChar"/>
+        </w:rPr>
+        <w:t xml:space="preserve">extract_hotspots.py</w:t>
+      </w:r>
+      <w:r>
+        <w:t xml:space="preserve"> </w:t>
+      </w:r>
+      <w:r>
+        <w:t xml:space="preserve">had no redirect-eligible content, confirmed, not</w:t>
+      </w:r>
+      <w:r>
+        <w:t xml:space="preserve"> </w:t>
+      </w:r>
+      <w:r>
+        <w:t xml:space="preserve">changed. Rule 7’s</w:t>
+      </w:r>
+      <w:r>
+        <w:t xml:space="preserve"> </w:t>
+      </w:r>
+      <w:r>
+        <w:rPr>
+          <w:rStyle w:val="VerbatimChar"/>
+        </w:rPr>
+        <w:t xml:space="preserve">command_header()</w:t>
+      </w:r>
+      <w:r>
+        <w:t xml:space="preserve"> </w:t>
+      </w:r>
+      <w:r>
+        <w:t xml:space="preserve">reconstructs each tool’s own invocation from its already-parsed</w:t>
+      </w:r>
+      <w:r>
+        <w:t xml:space="preserve"> </w:t>
+      </w:r>
+      <w:r>
+        <w:t xml:space="preserve">argparse Namespace (never raw</w:t>
+      </w:r>
+      <w:r>
+        <w:t xml:space="preserve"> </w:t>
+      </w:r>
+      <w:r>
+        <w:rPr>
+          <w:rStyle w:val="VerbatimChar"/>
+        </w:rPr>
+        <w:t xml:space="preserve">sys.argv</w:t>
+      </w:r>
+      <w:r>
+        <w:t xml:space="preserve">, which can’t distinguish a user-typed relative path from a</w:t>
+      </w:r>
+      <w:r>
+        <w:t xml:space="preserve"> </w:t>
+      </w:r>
+      <w:r>
+        <w:t xml:space="preserve">coincidentally-identical option value) – each tool’s</w:t>
+      </w:r>
+      <w:r>
+        <w:t xml:space="preserve"> </w:t>
+      </w:r>
+      <w:r>
+        <w:rPr>
+          <w:rStyle w:val="VerbatimChar"/>
+        </w:rPr>
+        <w:t xml:space="preserve">main()</w:t>
+      </w:r>
+      <w:r>
+        <w:t xml:space="preserve"> </w:t>
+      </w:r>
+      <w:r>
+        <w:t xml:space="preserve">builds its own small token list, the</w:t>
+      </w:r>
+      <w:r>
+        <w:t xml:space="preserve"> </w:t>
+      </w:r>
+      <w:r>
+        <w:t xml:space="preserve">same</w:t>
+      </w:r>
+      <w:r>
+        <w:t xml:space="preserve"> </w:t>
+      </w:r>
+      <w:r>
+        <w:t xml:space="preserve">“</w:t>
+      </w:r>
+      <w:r>
+        <w:t xml:space="preserve">small per-tool list</w:t>
+      </w:r>
+      <w:r>
+        <w:t xml:space="preserve">”</w:t>
+      </w:r>
+      <w:r>
+        <w:t xml:space="preserve"> </w:t>
+      </w:r>
+      <w:r>
+        <w:t xml:space="preserve">shape §10 called for, generalized from path-only to every argument. The</w:t>
+      </w:r>
+      <w:r>
+        <w:t xml:space="preserve"> </w:t>
+      </w:r>
+      <w:r>
+        <w:rPr>
+          <w:rStyle w:val="VerbatimChar"/>
+        </w:rPr>
+        <w:t xml:space="preserve">command:</w:t>
+      </w:r>
+      <w:r>
+        <w:t xml:space="preserve"> </w:t>
+      </w:r>
+      <w:r>
+        <w:t xml:space="preserve">line itself lives at the very end of each report’s footer rather than in the header –</w:t>
+      </w:r>
+      <w:r>
+        <w:t xml:space="preserve"> </w:t>
+      </w:r>
+      <w:r>
+        <w:t xml:space="preserve">reviewed against the real regenerated reports, a multi-line wrapped invocation read better as the</w:t>
+      </w:r>
+      <w:r>
+        <w:t xml:space="preserve"> </w:t>
+      </w:r>
+      <w:r>
+        <w:t xml:space="preserve">last thing in the file (after the data and any redirect line) than as the first, ahead of the</w:t>
+      </w:r>
+      <w:r>
+        <w:t xml:space="preserve"> </w:t>
+      </w:r>
+      <w:r>
+        <w:t xml:space="preserve">metadata a reader actually opens the report to see.</w:t>
+      </w:r>
+    </w:p>
+    <w:p>
+      <w:pPr>
+        <w:pStyle w:val="BodyText"/>
+      </w:pPr>
+      <w:r>
+        <w:t xml:space="preserve">One real bug found and fixed during implementation:</w:t>
+      </w:r>
+      <w:r>
+        <w:t xml:space="preserve"> </w:t>
+      </w:r>
+      <w:r>
+        <w:rPr>
+          <w:rStyle w:val="VerbatimChar"/>
+        </w:rPr>
+        <w:t xml:space="preserve">help_redirect()</w:t>
+      </w:r>
+      <w:r>
+        <w:t xml:space="preserve">’s script-name default</w:t>
+      </w:r>
+      <w:r>
+        <w:t xml:space="preserve"> </w:t>
+      </w:r>
+      <w:r>
+        <w:t xml:space="preserve">(</w:t>
+      </w:r>
+      <w:r>
+        <w:rPr>
+          <w:rStyle w:val="VerbatimChar"/>
+        </w:rPr>
+        <w:t xml:space="preserve">os.path.basename(sys.argv[0])</w:t>
+      </w:r>
+      <w:r>
+        <w:t xml:space="preserve">) is environment-dependent whenever a tool’s</w:t>
+      </w:r>
+      <w:r>
+        <w:t xml:space="preserve"> </w:t>
+      </w:r>
+      <w:r>
+        <w:rPr>
+          <w:rStyle w:val="VerbatimChar"/>
+        </w:rPr>
+        <w:t xml:space="preserve">write_report()</w:t>
+      </w:r>
+      <w:r>
+        <w:t xml:space="preserve"> </w:t>
+      </w:r>
+      <w:r>
+        <w:t xml:space="preserve">is</w:t>
+      </w:r>
+      <w:r>
+        <w:t xml:space="preserve"> </w:t>
+      </w:r>
+      <w:r>
+        <w:t xml:space="preserve">called directly rather than through its own</w:t>
+      </w:r>
+      <w:r>
+        <w:t xml:space="preserve"> </w:t>
+      </w:r>
+      <w:r>
+        <w:rPr>
+          <w:rStyle w:val="VerbatimChar"/>
+        </w:rPr>
+        <w:t xml:space="preserve">main()</w:t>
+      </w:r>
+      <w:r>
+        <w:t xml:space="preserve"> </w:t>
+      </w:r>
+      <w:r>
+        <w:t xml:space="preserve">(e.g. every test in this suite) –</w:t>
+      </w:r>
+      <w:r>
+        <w:t xml:space="preserve"> </w:t>
+      </w:r>
+      <w:r>
+        <w:rPr>
+          <w:rStyle w:val="VerbatimChar"/>
+        </w:rPr>
+        <w:t xml:space="preserve">sys.argv[0]</w:t>
+      </w:r>
+      <w:r>
+        <w:t xml:space="preserve"> </w:t>
+      </w:r>
+      <w:r>
+        <w:t xml:space="preserve">under a test runner isn’t the tool’s own path. Fixed by having each of the three redirect-calling</w:t>
+      </w:r>
+      <w:r>
+        <w:t xml:space="preserve"> </w:t>
+      </w:r>
+      <w:r>
+        <w:t xml:space="preserve">tools pass their own literal script name explicitly, the same way</w:t>
+      </w:r>
+      <w:r>
+        <w:t xml:space="preserve"> </w:t>
+      </w:r>
+      <w:r>
+        <w:rPr>
+          <w:rStyle w:val="VerbatimChar"/>
+        </w:rPr>
+        <w:t xml:space="preserve">standard_header()</w:t>
+      </w:r>
+      <w:r>
+        <w:t xml:space="preserve"> </w:t>
+      </w:r>
+      <w:r>
+        <w:t xml:space="preserve">already takes</w:t>
+      </w:r>
+      <w:r>
+        <w:t xml:space="preserve"> </w:t>
+      </w:r>
+      <w:r>
+        <w:t xml:space="preserve">an explicit</w:t>
+      </w:r>
+      <w:r>
+        <w:t xml:space="preserve"> </w:t>
+      </w:r>
+      <w:r>
+        <w:rPr>
+          <w:rStyle w:val="VerbatimChar"/>
+        </w:rPr>
+        <w:t xml:space="preserve">tool_name</w:t>
+      </w:r>
+      <w:r>
+        <w:t xml:space="preserve"> </w:t>
+      </w:r>
+      <w:r>
+        <w:t xml:space="preserve">rather than auto-detecting it.</w:t>
+      </w:r>
+    </w:p>
+    <w:p>
+      <w:pPr>
+        <w:pStyle w:val="BodyText"/>
+      </w:pPr>
+      <w:r>
+        <w:rPr>
+          <w:bCs/>
+          <w:b/>
+        </w:rPr>
+        <w:t xml:space="preserve">Directory-handling unified between the combined-hotspots and calltree tools.</w:t>
+      </w:r>
+      <w:r>
+        <w:t xml:space="preserve"> </w:t>
+      </w:r>
+      <w:r>
+        <w:t xml:space="preserve">Reviewing the</w:t>
+      </w:r>
+      <w:r>
+        <w:t xml:space="preserve"> </w:t>
+      </w:r>
+      <w:r>
+        <w:t xml:space="preserve">final design surfaced a real inconsistency this plan’s own header work made visible:</w:t>
+      </w:r>
+      <w:r>
+        <w:t xml:space="preserve"> </w:t>
+      </w:r>
+      <w:r>
+        <w:rPr>
+          <w:rStyle w:val="VerbatimChar"/>
+        </w:rPr>
+        <w:t xml:space="preserve">extract_hotspots.py</w:t>
+      </w:r>
+      <w:r>
+        <w:t xml:space="preserve"> </w:t>
+      </w:r>
+      <w:r>
+        <w:t xml:space="preserve">already accepted two independent directories (a rocprof-sys CPU-side run and</w:t>
+      </w:r>
+      <w:r>
+        <w:t xml:space="preserve"> </w:t>
+      </w:r>
+      <w:r>
+        <w:t xml:space="preserve">a separately-run rocprofv3 GPU-side run) or one combined directory containing both as subdirs, but</w:t>
+      </w:r>
+      <w:r>
+        <w:t xml:space="preserve"> </w:t>
+      </w:r>
+      <w:r>
+        <w:rPr>
+          <w:rStyle w:val="VerbatimChar"/>
+        </w:rPr>
+        <w:t xml:space="preserve">extract_calltree.py</w:t>
+      </w:r>
+      <w:r>
+        <w:t xml:space="preserve">/</w:t>
+      </w:r>
+      <w:r>
+        <w:rPr>
+          <w:rStyle w:val="VerbatimChar"/>
+        </w:rPr>
+        <w:t xml:space="preserve">extract_calltree_traced.py</w:t>
+      </w:r>
+      <w:r>
+        <w:t xml:space="preserve"> </w:t>
+      </w:r>
+      <w:r>
+        <w:t xml:space="preserve">only ever accepted the combined-directory shape</w:t>
+      </w:r>
+      <w:r>
+        <w:t xml:space="preserve"> </w:t>
+      </w:r>
+      <w:r>
+        <w:t xml:space="preserve">– no way to point either at two independently-run CPU/GPU directories. All three tools now share</w:t>
+      </w:r>
+      <w:r>
+        <w:t xml:space="preserve"> </w:t>
+      </w:r>
+      <w:r>
+        <w:t xml:space="preserve">one</w:t>
+      </w:r>
+      <w:r>
+        <w:t xml:space="preserve"> </w:t>
+      </w:r>
+      <w:r>
+        <w:rPr>
+          <w:rStyle w:val="VerbatimChar"/>
+        </w:rPr>
+        <w:t xml:space="preserve">stage1_run_dirs.resolve_two_dirs(dir1, dir2)</w:t>
+      </w:r>
+      <w:r>
+        <w:t xml:space="preserve"> </w:t>
+      </w:r>
+      <w:r>
+        <w:t xml:space="preserve">helper:</w:t>
+      </w:r>
+      <w:r>
+        <w:t xml:space="preserve"> </w:t>
+      </w:r>
+      <w:r>
+        <w:rPr>
+          <w:rStyle w:val="VerbatimChar"/>
+        </w:rPr>
+        <w:t xml:space="preserve">dir2</w:t>
+      </w:r>
+      <w:r>
+        <w:t xml:space="preserve"> </w:t>
+      </w:r>
+      <w:r>
+        <w:t xml:space="preserve">given explicitly wins as-is;</w:t>
+      </w:r>
+      <w:r>
+        <w:t xml:space="preserve"> </w:t>
+      </w:r>
+      <w:r>
+        <w:rPr>
+          <w:rStyle w:val="VerbatimChar"/>
+        </w:rPr>
+        <w:t xml:space="preserve">dir2</w:t>
+      </w:r>
+      <w:r>
+        <w:t xml:space="preserve"> </w:t>
+      </w:r>
+      <w:r>
+        <w:t xml:space="preserve">omitted falls back to the existing single-combined-directory auto-resolution. Each tool’s</w:t>
+      </w:r>
+      <w:r>
+        <w:t xml:space="preserve"> </w:t>
+      </w:r>
+      <w:r>
+        <w:rPr>
+          <w:rStyle w:val="VerbatimChar"/>
+        </w:rPr>
+        <w:t xml:space="preserve">main()</w:t>
+      </w:r>
+      <w:r>
+        <w:t xml:space="preserve"> </w:t>
+      </w:r>
+      <w:r>
+        <w:t xml:space="preserve">gained an optional second positional argument for the explicit-two-directories case. This</w:t>
+      </w:r>
+      <w:r>
+        <w:t xml:space="preserve"> </w:t>
+      </w:r>
+      <w:r>
+        <w:t xml:space="preserve">also unified how the resulting CPU+GPU pairing is described in the header: one shared metadata</w:t>
+      </w:r>
+      <w:r>
+        <w:t xml:space="preserve"> </w:t>
+      </w:r>
+      <w:r>
+        <w:t xml:space="preserve">block per run (executable, run date/time, runtime, MPI rank count), each field preferring the CPU</w:t>
+      </w:r>
+      <w:r>
+        <w:t xml:space="preserve"> </w:t>
+      </w:r>
+      <w:r>
+        <w:t xml:space="preserve">side’s own guess and falling back to the GPU side’s only when CPU has none for that field – instead</w:t>
+      </w:r>
+      <w:r>
+        <w:t xml:space="preserve"> </w:t>
+      </w:r>
+      <w:r>
+        <w:t xml:space="preserve">of the two sides guessing independently and, for the calltree tools, not being shown as metadata at</w:t>
+      </w:r>
+      <w:r>
+        <w:t xml:space="preserve"> </w:t>
+      </w:r>
+      <w:r>
+        <w:t xml:space="preserve">all.</w:t>
+      </w:r>
+      <w:r>
+        <w:t xml:space="preserve"> </w:t>
+      </w:r>
+      <w:r>
+        <w:rPr>
+          <w:rStyle w:val="VerbatimChar"/>
+        </w:rPr>
+        <w:t xml:space="preserve">extract_hotspots.py</w:t>
+      </w:r>
+      <w:r>
+        <w:t xml:space="preserve">’s combined-pool cross-check caveat generalizes the same way: it now</w:t>
+      </w:r>
+      <w:r>
+        <w:t xml:space="preserve"> </w:t>
+      </w:r>
+      <w:r>
+        <w:t xml:space="preserve">triggers on the</w:t>
+      </w:r>
+      <w:r>
+        <w:t xml:space="preserve"> </w:t>
+      </w:r>
+      <w:r>
+        <w:rPr>
+          <w:iCs/>
+          <w:i/>
+        </w:rPr>
+        <w:t xml:space="preserve">total number of directories</w:t>
+      </w:r>
+      <w:r>
+        <w:t xml:space="preserve"> </w:t>
+      </w:r>
+      <w:r>
+        <w:t xml:space="preserve">actually feeding the report (summed across every run),</w:t>
+      </w:r>
+      <w:r>
+        <w:t xml:space="preserve"> </w:t>
+      </w:r>
+      <w:r>
+        <w:t xml:space="preserve">not the number of runs, so a CPU+GPU pair sharing one run’s metadata block still gets the caveat the</w:t>
+      </w:r>
+      <w:r>
+        <w:t xml:space="preserve"> </w:t>
+      </w:r>
+      <w:r>
+        <w:t xml:space="preserve">same as</w:t>
+      </w:r>
+      <w:r>
+        <w:t xml:space="preserve"> </w:t>
+      </w:r>
+      <w:r>
+        <w:rPr>
+          <w:rStyle w:val="VerbatimChar"/>
+        </w:rPr>
+        <w:t xml:space="preserve">extract_pop_metrics.py</w:t>
+      </w:r>
+      <w:r>
+        <w:t xml:space="preserve">’s genuinely separate multi-run scaling studies do.</w:t>
+      </w:r>
+    </w:p>
+    <w:p>
+      <w:pPr>
+        <w:pStyle w:val="BodyText"/>
+      </w:pPr>
+      <w:r>
+        <w:t xml:space="preserve">Test rework followed the same</w:t>
+      </w:r>
+      <w:r>
+        <w:t xml:space="preserve"> </w:t>
+      </w:r>
+      <w:r>
+        <w:t xml:space="preserve">“</w:t>
+      </w:r>
+      <w:r>
+        <w:t xml:space="preserve">run the existing suite first</w:t>
+      </w:r>
+      <w:r>
+        <w:t xml:space="preserve">”</w:t>
+      </w:r>
+      <w:r>
+        <w:t xml:space="preserve"> </w:t>
+      </w:r>
+      <w:r>
+        <w:t xml:space="preserve">discipline, across two rounds – the</w:t>
+      </w:r>
+      <w:r>
+        <w:t xml:space="preserve"> </w:t>
+      </w:r>
+      <w:r>
+        <w:t xml:space="preserve">initial header/footer/numbering redesign (14 of 396 tests broke, all from the report shape actually</w:t>
+      </w:r>
+      <w:r>
+        <w:t xml:space="preserve"> </w:t>
+      </w:r>
+      <w:r>
+        <w:t xml:space="preserve">changing: renamed</w:t>
+      </w:r>
+      <w:r>
+        <w:t xml:space="preserve"> </w:t>
+      </w:r>
+      <w:r>
+        <w:rPr>
+          <w:rStyle w:val="VerbatimChar"/>
+        </w:rPr>
+        <w:t xml:space="preserve">total runtime:</w:t>
+      </w:r>
+      <w:r>
+        <w:t xml:space="preserve"> </w:t>
+      </w:r>
+      <w:r>
+        <w:t xml:space="preserve">field to</w:t>
+      </w:r>
+      <w:r>
+        <w:t xml:space="preserve"> </w:t>
+      </w:r>
+      <w:r>
+        <w:rPr>
+          <w:rStyle w:val="VerbatimChar"/>
+        </w:rPr>
+        <w:t xml:space="preserve">runtime:</w:t>
+      </w:r>
+      <w:r>
+        <w:t xml:space="preserve">,</w:t>
+      </w:r>
+      <w:r>
+        <w:t xml:space="preserve"> </w:t>
+      </w:r>
+      <w:r>
+        <w:rPr>
+          <w:rStyle w:val="VerbatimChar"/>
+        </w:rPr>
+        <w:t xml:space="preserve">tables:</w:t>
+      </w:r>
+      <w:r>
+        <w:t xml:space="preserve"> </w:t>
+      </w:r>
+      <w:r>
+        <w:t xml:space="preserve">listing shifting where a title</w:t>
+      </w:r>
+      <w:r>
+        <w:t xml:space="preserve"> </w:t>
+      </w:r>
+      <w:r>
+        <w:t xml:space="preserve">substring first appears in the report text, tightened</w:t>
+      </w:r>
+      <w:r>
+        <w:t xml:space="preserve"> </w:t>
+      </w:r>
+      <w:r>
+        <w:rPr>
+          <w:rStyle w:val="VerbatimChar"/>
+        </w:rPr>
+        <w:t xml:space="preserve">threshold_unit</w:t>
+      </w:r>
+      <w:r>
+        <w:t xml:space="preserve"> </w:t>
+      </w:r>
+      <w:r>
+        <w:t xml:space="preserve">wording, redirected content</w:t>
+      </w:r>
+      <w:r>
+        <w:t xml:space="preserve"> </w:t>
+      </w:r>
+      <w:r>
+        <w:t xml:space="preserve">no longer inline), then the directory-unification follow-up (5 more broke: the calltree tools’</w:t>
+      </w:r>
+      <w:r>
+        <w:t xml:space="preserve"> </w:t>
+      </w:r>
+      <w:r>
+        <w:rPr>
+          <w:rStyle w:val="VerbatimChar"/>
+        </w:rPr>
+        <w:t xml:space="preserve">write_report()</w:t>
+      </w:r>
+      <w:r>
+        <w:t xml:space="preserve"> </w:t>
+      </w:r>
+      <w:r>
+        <w:t xml:space="preserve">gained a required</w:t>
+      </w:r>
+      <w:r>
+        <w:t xml:space="preserve"> </w:t>
+      </w:r>
+      <w:r>
+        <w:rPr>
+          <w:rStyle w:val="VerbatimChar"/>
+        </w:rPr>
+        <w:t xml:space="preserve">gpu_dir</w:t>
+      </w:r>
+      <w:r>
+        <w:t xml:space="preserve"> </w:t>
+      </w:r>
+      <w:r>
+        <w:t xml:space="preserve">positional, one test file’s</w:t>
+      </w:r>
+      <w:r>
+        <w:t xml:space="preserve"> </w:t>
+      </w:r>
+      <w:r>
+        <w:rPr>
+          <w:rStyle w:val="VerbatimChar"/>
+        </w:rPr>
+        <w:t xml:space="preserve">resolve_run_dirs</w:t>
+      </w:r>
+      <w:r>
+        <w:t xml:space="preserve"> </w:t>
+      </w:r>
+      <w:r>
+        <w:t xml:space="preserve">import</w:t>
+      </w:r>
+      <w:r>
+        <w:t xml:space="preserve"> </w:t>
+      </w:r>
+      <w:r>
+        <w:t xml:space="preserve">no longer existed under its old name, and the CPU/GPU unified-metadata design meant a GPU run’s own</w:t>
+      </w:r>
+      <w:r>
+        <w:t xml:space="preserve"> </w:t>
+      </w:r>
+      <w:r>
+        <w:rPr>
+          <w:rStyle w:val="VerbatimChar"/>
+        </w:rPr>
+        <w:t xml:space="preserve">executable:</w:t>
+      </w:r>
+      <w:r>
+        <w:t xml:space="preserve"> </w:t>
+      </w:r>
+      <w:r>
+        <w:t xml:space="preserve">line is no longer shown separately once CPU’s is present) – none from a real logic</w:t>
+      </w:r>
+      <w:r>
+        <w:t xml:space="preserve"> </w:t>
+      </w:r>
+      <w:r>
+        <w:t xml:space="preserve">regression either round. New test coverage added for every new function (</w:t>
+      </w:r>
+      <w:r>
+        <w:rPr>
+          <w:rStyle w:val="VerbatimChar"/>
+        </w:rPr>
+        <w:t xml:space="preserve">pct_total_note()</w:t>
+      </w:r>
+      <w:r>
+        <w:t xml:space="preserve">,</w:t>
+      </w:r>
+      <w:r>
+        <w:t xml:space="preserve"> </w:t>
+      </w:r>
+      <w:r>
+        <w:rPr>
+          <w:rStyle w:val="VerbatimChar"/>
+        </w:rPr>
+        <w:t xml:space="preserve">ranking_note()</w:t>
+      </w:r>
+      <w:r>
+        <w:t xml:space="preserve">,</w:t>
+      </w:r>
+      <w:r>
+        <w:t xml:space="preserve"> </w:t>
+      </w:r>
+      <w:r>
+        <w:rPr>
+          <w:rStyle w:val="VerbatimChar"/>
+        </w:rPr>
+        <w:t xml:space="preserve">imbalance_note()</w:t>
+      </w:r>
+      <w:r>
+        <w:t xml:space="preserve">,</w:t>
+      </w:r>
+      <w:r>
+        <w:t xml:space="preserve"> </w:t>
+      </w:r>
+      <w:r>
+        <w:rPr>
+          <w:rStyle w:val="VerbatimChar"/>
+        </w:rPr>
+        <w:t xml:space="preserve">metrics_legend()</w:t>
+      </w:r>
+      <w:r>
+        <w:t xml:space="preserve">,</w:t>
+      </w:r>
+      <w:r>
+        <w:t xml:space="preserve"> </w:t>
+      </w:r>
+      <w:r>
+        <w:rPr>
+          <w:rStyle w:val="VerbatimChar"/>
+        </w:rPr>
+        <w:t xml:space="preserve">aggregation_note()</w:t>
+      </w:r>
+      <w:r>
+        <w:t xml:space="preserve">,</w:t>
+      </w:r>
+      <w:r>
+        <w:t xml:space="preserve"> </w:t>
+      </w:r>
+      <w:r>
+        <w:rPr>
+          <w:rStyle w:val="VerbatimChar"/>
+        </w:rPr>
+        <w:t xml:space="preserve">tree_view_note()</w:t>
+      </w:r>
+      <w:r>
+        <w:t xml:space="preserve">,</w:t>
+      </w:r>
+      <w:r>
+        <w:t xml:space="preserve"> </w:t>
+      </w:r>
+      <w:r>
+        <w:rPr>
+          <w:rStyle w:val="VerbatimChar"/>
+        </w:rPr>
+        <w:t xml:space="preserve">standard_header()</w:t>
+      </w:r>
+      <w:r>
+        <w:t xml:space="preserve">,</w:t>
+      </w:r>
+      <w:r>
+        <w:t xml:space="preserve"> </w:t>
+      </w:r>
+      <w:r>
+        <w:rPr>
+          <w:rStyle w:val="VerbatimChar"/>
+        </w:rPr>
+        <w:t xml:space="preserve">help_redirect()</w:t>
+      </w:r>
+      <w:r>
+        <w:t xml:space="preserve">,</w:t>
+      </w:r>
+      <w:r>
+        <w:t xml:space="preserve"> </w:t>
+      </w:r>
+      <w:r>
+        <w:rPr>
+          <w:rStyle w:val="VerbatimChar"/>
+        </w:rPr>
+        <w:t xml:space="preserve">command_header()</w:t>
+      </w:r>
+      <w:r>
+        <w:t xml:space="preserve">,</w:t>
+      </w:r>
+      <w:r>
+        <w:t xml:space="preserve"> </w:t>
+      </w:r>
+      <w:r>
+        <w:rPr>
+          <w:rStyle w:val="VerbatimChar"/>
+        </w:rPr>
+        <w:t xml:space="preserve">resolve_two_dirs()</w:t>
+      </w:r>
+      <w:r>
+        <w:t xml:space="preserve">) plus</w:t>
+      </w:r>
+      <w:r>
+        <w:t xml:space="preserve"> </w:t>
+      </w:r>
+      <w:r>
+        <w:rPr>
+          <w:rStyle w:val="VerbatimChar"/>
+        </w:rPr>
+        <w:t xml:space="preserve">render_report()</w:t>
+      </w:r>
+      <w:r>
+        <w:t xml:space="preserve">’s 3 numbering regimes and new</w:t>
+      </w:r>
+      <w:r>
+        <w:t xml:space="preserve"> </w:t>
+      </w:r>
+      <w:r>
+        <w:rPr>
+          <w:rStyle w:val="VerbatimChar"/>
+        </w:rPr>
+        <w:t xml:space="preserve">MainCliTests</w:t>
+      </w:r>
+      <w:r>
+        <w:t xml:space="preserve"> </w:t>
+      </w:r>
+      <w:r>
+        <w:t xml:space="preserve">coverage for each tool’s</w:t>
+      </w:r>
+      <w:r>
+        <w:t xml:space="preserve"> </w:t>
+      </w:r>
+      <w:r>
+        <w:t xml:space="preserve">explicit-two-directories and single-combined-directory CLI paths. Final suite: 404 tests, all</w:t>
+      </w:r>
+      <w:r>
+        <w:t xml:space="preserve"> </w:t>
+      </w:r>
+      <w:r>
+        <w:t xml:space="preserve">passing.</w:t>
+      </w:r>
+    </w:p>
+    <w:p>
+      <w:pPr>
+        <w:pStyle w:val="BodyText"/>
+      </w:pPr>
+      <w:r>
+        <w:t xml:space="preserve">Real-data verification across all 6</w:t>
+      </w:r>
+      <w:r>
+        <w:t xml:space="preserve"> </w:t>
+      </w:r>
+      <w:r>
+        <w:rPr>
+          <w:rStyle w:val="VerbatimChar"/>
+        </w:rPr>
+        <w:t xml:space="preserve">test_apps/results/</w:t>
+      </w:r>
+      <w:r>
+        <w:t xml:space="preserve"> </w:t>
+      </w:r>
+      <w:r>
+        <w:t xml:space="preserve">directories: unlike prior plans’ backup-</w:t>
+      </w:r>
+      <w:r>
+        <w:t xml:space="preserve"> </w:t>
+      </w:r>
+      <w:r>
+        <w:t xml:space="preserve">and-diff method, this step keeps</w:t>
+      </w:r>
+      <w:r>
+        <w:t xml:space="preserve"> </w:t>
+      </w:r>
+      <w:r>
+        <w:rPr>
+          <w:rStyle w:val="VerbatimChar"/>
+        </w:rPr>
+        <w:t xml:space="preserve">.before</w:t>
+      </w:r>
+      <w:r>
+        <w:t xml:space="preserve"> </w:t>
+      </w:r>
+      <w:r>
+        <w:t xml:space="preserve">siblings next to each regenerated file (gitignored, so</w:t>
+      </w:r>
+      <w:r>
+        <w:t xml:space="preserve"> </w:t>
+      </w:r>
+      <w:r>
+        <w:t xml:space="preserve">this costs nothing) for direct side-by-side review, since output is expected to change everywhere</w:t>
+      </w:r>
+      <w:r>
+        <w:t xml:space="preserve"> </w:t>
+      </w:r>
+      <w:r>
+        <w:t xml:space="preserve">and reviewed by eye rather than diffed byte-for-byte. All 24 files regenerated cleanly; spot-checked</w:t>
+      </w:r>
+      <w:r>
+        <w:t xml:space="preserve"> </w:t>
+      </w:r>
+      <w:r>
+        <w:t xml:space="preserve">across CPU/GPU/combined/calltree/calltree-traced/pop-metrics reports and multiple test apps –</w:t>
+      </w:r>
+      <w:r>
+        <w:t xml:space="preserve"> </w:t>
+      </w:r>
+      <w:r>
+        <w:t xml:space="preserve">header shape,</w:t>
+      </w:r>
+      <w:r>
+        <w:t xml:space="preserve"> </w:t>
+      </w:r>
+      <w:r>
+        <w:rPr>
+          <w:rStyle w:val="VerbatimChar"/>
+        </w:rPr>
+        <w:t xml:space="preserve">tables:</w:t>
+      </w:r>
+      <w:r>
+        <w:t xml:space="preserve"> </w:t>
+      </w:r>
+      <w:r>
+        <w:t xml:space="preserve">listing, section numbering, bulleted notes, and redirect lines all read</w:t>
+      </w:r>
+      <w:r>
+        <w:t xml:space="preserve"> </w:t>
+      </w:r>
+      <w:r>
+        <w:t xml:space="preserve">correctly. Real HPC data’s long C++ template names visibly break table alignment in the calltree</w:t>
+      </w:r>
+      <w:r>
+        <w:t xml:space="preserve"> </w:t>
+      </w:r>
+      <w:r>
+        <w:t xml:space="preserve">views, exactly the problem plan 2.11’s rule 6 exists to fix next.</w:t>
+      </w:r>
+    </w:p>
     <w:bookmarkEnd w:id="73"/>
+    <w:bookmarkEnd w:id="74"/>
     <w:sectPr/>
   </w:body>
 </w:document>
@@ -38088,6 +40189,36 @@
   </w:num>
   <w:num w:numId="1013">
     <w:abstractNumId w:val="991"/>
+  </w:num>
+  <w:num w:numId="1014">
+    <w:abstractNumId w:val="99411"/>
+    <w:lvlOverride w:ilvl="0">
+      <w:startOverride w:val="1"/>
+    </w:lvlOverride>
+    <w:lvlOverride w:ilvl="1">
+      <w:startOverride w:val="1"/>
+    </w:lvlOverride>
+    <w:lvlOverride w:ilvl="2">
+      <w:startOverride w:val="1"/>
+    </w:lvlOverride>
+    <w:lvlOverride w:ilvl="3">
+      <w:startOverride w:val="1"/>
+    </w:lvlOverride>
+    <w:lvlOverride w:ilvl="4">
+      <w:startOverride w:val="1"/>
+    </w:lvlOverride>
+    <w:lvlOverride w:ilvl="5">
+      <w:startOverride w:val="1"/>
+    </w:lvlOverride>
+    <w:lvlOverride w:ilvl="6">
+      <w:startOverride w:val="1"/>
+    </w:lvlOverride>
+    <w:lvlOverride w:ilvl="7">
+      <w:startOverride w:val="1"/>
+    </w:lvlOverride>
+    <w:lvlOverride w:ilvl="8">
+      <w:startOverride w:val="1"/>
+    </w:lvlOverride>
   </w:num>
 </w:numbering>
 </file>

</xml_diff>

<commit_message>
Plan 2.11: report style guide rule 6 -- 120-column hard-wrap (roadmap step 9, part 2 of 2)
Applies section 10's rule 6 across stage5_table_render.py and stage5_tree_render.py: long
function/kernel names now hard-wrap at a shared 120-column target instead of either dragging
every other row's alignment out of shape (calltree view) or running unbroken off the page
(hotspots tables), plus the iter_table_rows() reader select_hotspot_functions.py/
select_hotspot_kernels.py need to keep working once a name spans 2+ physical lines. The wrap/cap
logic for each renderer's own layout is its own standalone, reusable function
(wrap_trailing_label(), wrap_leading_labels()) rather than inlined, so a future table or tree
renderer sharing either layout can call it directly.

Co-Authored-By: Claude Sonnet 5 <noreply@anthropic.com>
</commit_message>
<xml_diff>
--- a/docs/DEVELOPMENT_HISTORY.docx
+++ b/docs/DEVELOPMENT_HISTORY.docx
@@ -10,7 +10,7 @@
         <w:t xml:space="preserve">Development History</w:t>
       </w:r>
     </w:p>
-    <w:bookmarkStart w:id="74" w:name="development-history"/>
+    <w:bookmarkStart w:id="75" w:name="development-history"/>
     <w:p>
       <w:pPr>
         <w:pStyle w:val="Heading1"/>
@@ -2555,6 +2555,104 @@
           </w:p>
         </w:tc>
       </w:tr>
+      <w:tr>
+        <w:tc>
+          <w:tcPr/>
+          <w:p>
+            <w:pPr>
+              <w:pStyle w:val="Compact"/>
+              <w:jc w:val="left"/>
+            </w:pPr>
+            <w:r>
+              <w:t xml:space="preserve">2026-08-17</w:t>
+            </w:r>
+          </w:p>
+        </w:tc>
+        <w:tc>
+          <w:tcPr/>
+          <w:p>
+            <w:pPr>
+              <w:pStyle w:val="Compact"/>
+              <w:jc w:val="left"/>
+            </w:pPr>
+            <w:r>
+              <w:t xml:space="preserve">Plan 2.11: applied §10’s rule 6 (120-column hard-wrap for long names) across</w:t>
+            </w:r>
+            <w:r>
+              <w:t xml:space="preserve"> </w:t>
+            </w:r>
+            <w:r>
+              <w:rPr>
+                <w:rStyle w:val="VerbatimChar"/>
+              </w:rPr>
+              <w:t xml:space="preserve">stage5_table_render.py</w:t>
+            </w:r>
+            <w:r>
+              <w:t xml:space="preserve">/</w:t>
+            </w:r>
+            <w:r>
+              <w:rPr>
+                <w:rStyle w:val="VerbatimChar"/>
+              </w:rPr>
+              <w:t xml:space="preserve">stage5_tree_render.py</w:t>
+            </w:r>
+            <w:r>
+              <w:t xml:space="preserve">, plus the</w:t>
+            </w:r>
+            <w:r>
+              <w:t xml:space="preserve"> </w:t>
+            </w:r>
+            <w:r>
+              <w:rPr>
+                <w:rStyle w:val="VerbatimChar"/>
+              </w:rPr>
+              <w:t xml:space="preserve">iter_table_rows()</w:t>
+            </w:r>
+            <w:r>
+              <w:t xml:space="preserve"> </w:t>
+            </w:r>
+            <w:r>
+              <w:t xml:space="preserve">reader both</w:t>
+            </w:r>
+            <w:r>
+              <w:t xml:space="preserve"> </w:t>
+            </w:r>
+            <w:r>
+              <w:rPr>
+                <w:rStyle w:val="VerbatimChar"/>
+              </w:rPr>
+              <w:t xml:space="preserve">select_hotspot_*.py</w:t>
+            </w:r>
+            <w:r>
+              <w:t xml:space="preserve"> </w:t>
+            </w:r>
+            <w:r>
+              <w:t xml:space="preserve">re-parsers need to survive it – roadmap step 9, part 2 of 2; the wrap/cap logic for each renderer’s own geometry landed as its own standalone, reusable function (</w:t>
+            </w:r>
+            <w:r>
+              <w:rPr>
+                <w:rStyle w:val="VerbatimChar"/>
+              </w:rPr>
+              <w:t xml:space="preserve">wrap_trailing_label()</w:t>
+            </w:r>
+            <w:r>
+              <w:t xml:space="preserve">,</w:t>
+            </w:r>
+            <w:r>
+              <w:t xml:space="preserve"> </w:t>
+            </w:r>
+            <w:r>
+              <w:rPr>
+                <w:rStyle w:val="VerbatimChar"/>
+              </w:rPr>
+              <w:t xml:space="preserve">wrap_leading_labels()</w:t>
+            </w:r>
+            <w:r>
+              <w:t xml:space="preserve">) rather than inlined, per explicit request – see full design/real-data accounting below</w:t>
+            </w:r>
+          </w:p>
+        </w:tc>
+      </w:tr>
     </w:tbl>
     <w:bookmarkStart w:id="20" w:name="project-scaffolding-and-rules"/>
     <w:p>
@@ -39525,7 +39623,1274 @@
       </w:r>
     </w:p>
     <w:bookmarkEnd w:id="73"/>
+    <w:bookmarkStart w:id="74" w:name="Xdb7e0e091588832a9aac2bbc0223b1ee1f61c8c"/>
+    <w:p>
+      <w:pPr>
+        <w:pStyle w:val="Heading2"/>
+      </w:pPr>
+      <w:r>
+        <w:t xml:space="preserve">2026-08-17 — Plan 2.11: §10 rule 6, 120-column hard-wrap (roadmap step 9, part 2 of 2)</w:t>
+      </w:r>
+    </w:p>
+    <w:p>
+      <w:pPr>
+        <w:pStyle w:val="FirstParagraph"/>
+      </w:pPr>
+      <w:r>
+        <w:t xml:space="preserve">Closes the half of §10’s report style guide plan 2.10 split out: rule 6’s 120-column hard-wrap for</w:t>
+      </w:r>
+      <w:r>
+        <w:t xml:space="preserve"> </w:t>
+      </w:r>
+      <w:r>
+        <w:t xml:space="preserve">long function/kernel names, plus the</w:t>
+      </w:r>
+      <w:r>
+        <w:t xml:space="preserve"> </w:t>
+      </w:r>
+      <w:r>
+        <w:rPr>
+          <w:rStyle w:val="VerbatimChar"/>
+        </w:rPr>
+        <w:t xml:space="preserve">iter_table_rows()</w:t>
+      </w:r>
+      <w:r>
+        <w:t xml:space="preserve"> </w:t>
+      </w:r>
+      <w:r>
+        <w:t xml:space="preserve">reader</w:t>
+      </w:r>
+      <w:r>
+        <w:t xml:space="preserve"> </w:t>
+      </w:r>
+      <w:r>
+        <w:rPr>
+          <w:rStyle w:val="VerbatimChar"/>
+        </w:rPr>
+        <w:t xml:space="preserve">select_hotspot_functions.py</w:t>
+      </w:r>
+      <w:r>
+        <w:t xml:space="preserve">/</w:t>
+      </w:r>
+      <w:r>
+        <w:t xml:space="preserve"> </w:t>
+      </w:r>
+      <w:r>
+        <w:rPr>
+          <w:rStyle w:val="VerbatimChar"/>
+        </w:rPr>
+        <w:t xml:space="preserve">select_hotspot_kernels.py</w:t>
+      </w:r>
+      <w:r>
+        <w:t xml:space="preserve"> </w:t>
+      </w:r>
+      <w:r>
+        <w:t xml:space="preserve">need to keep working once a name can span 2+ physical lines. Plan</w:t>
+      </w:r>
+      <w:r>
+        <w:t xml:space="preserve"> </w:t>
+      </w:r>
+      <w:r>
+        <w:t xml:space="preserve">2.10’s own real-data verification already found the concrete motivating case: a long C++</w:t>
+      </w:r>
+      <w:r>
+        <w:t xml:space="preserve"> </w:t>
+      </w:r>
+      <w:r>
+        <w:t xml:space="preserve">template/namespace name either drags every other row’s column alignment out of shape (the calltree</w:t>
+      </w:r>
+      <w:r>
+        <w:t xml:space="preserve"> </w:t>
+      </w:r>
+      <w:r>
+        <w:t xml:space="preserve">view, where one shared label width applies to the whole block) or runs unbroken past any reasonable</w:t>
+      </w:r>
+      <w:r>
+        <w:t xml:space="preserve"> </w:t>
+      </w:r>
+      <w:r>
+        <w:t xml:space="preserve">width (the hotspots tables, where the trailing name column is deliberately unpadded).</w:t>
+      </w:r>
+    </w:p>
+    <w:p>
+      <w:pPr>
+        <w:pStyle w:val="BodyText"/>
+      </w:pPr>
+      <w:r>
+        <w:rPr>
+          <w:bCs/>
+          <w:b/>
+        </w:rPr>
+        <w:t xml:space="preserve">The wrap/cap logic for each renderer’s own geometry is its own standalone, reusable function,</w:t>
+      </w:r>
+      <w:r>
+        <w:t xml:space="preserve"> </w:t>
+      </w:r>
+      <w:r>
+        <w:t xml:space="preserve">not inlined into</w:t>
+      </w:r>
+      <w:r>
+        <w:t xml:space="preserve"> </w:t>
+      </w:r>
+      <w:r>
+        <w:rPr>
+          <w:rStyle w:val="VerbatimChar"/>
+        </w:rPr>
+        <w:t xml:space="preserve">render_table()</w:t>
+      </w:r>
+      <w:r>
+        <w:t xml:space="preserve">/</w:t>
+      </w:r>
+      <w:r>
+        <w:rPr>
+          <w:rStyle w:val="VerbatimChar"/>
+        </w:rPr>
+        <w:t xml:space="preserve">format_aligned_rows()</w:t>
+      </w:r>
+      <w:r>
+        <w:t xml:space="preserve"> </w:t>
+      </w:r>
+      <w:r>
+        <w:t xml:space="preserve">– an explicit request during planning,</w:t>
+      </w:r>
+      <w:r>
+        <w:t xml:space="preserve"> </w:t>
+      </w:r>
+      <w:r>
+        <w:t xml:space="preserve">so a future stage-5 table or tree-style renderer sharing either layout can call the same function</w:t>
+      </w:r>
+      <w:r>
+        <w:t xml:space="preserve"> </w:t>
+      </w:r>
+      <w:r>
+        <w:t xml:space="preserve">directly instead of duplicating the cut/indent arithmetic or routing through a whole different</w:t>
+      </w:r>
+      <w:r>
+        <w:t xml:space="preserve"> </w:t>
+      </w:r>
+      <w:r>
+        <w:t xml:space="preserve">renderer’s column-spec machinery just to get the wrap:</w:t>
+      </w:r>
+    </w:p>
+    <w:p>
+      <w:pPr>
+        <w:numPr>
+          <w:ilvl w:val="0"/>
+          <w:numId w:val="1015"/>
+        </w:numPr>
+        <w:pStyle w:val="Compact"/>
+      </w:pPr>
+      <w:r>
+        <w:rPr>
+          <w:rStyle w:val="VerbatimChar"/>
+        </w:rPr>
+        <w:t xml:space="preserve">stage5_table_render.wrap_trailing_label(prefix, label, width=120)</w:t>
+      </w:r>
+      <w:r>
+        <w:t xml:space="preserve"> </w:t>
+      </w:r>
+      <w:r>
+        <w:t xml:space="preserve">– for the</w:t>
+      </w:r>
+      <w:r>
+        <w:t xml:space="preserve"> </w:t>
+      </w:r>
+      <w:r>
+        <w:t xml:space="preserve">“</w:t>
+      </w:r>
+      <w:r>
+        <w:t xml:space="preserve">fixed columns,</w:t>
+      </w:r>
+      <w:r>
+        <w:t xml:space="preserve"> </w:t>
+      </w:r>
+      <w:r>
+        <w:t xml:space="preserve">then one unpadded trailing label</w:t>
+      </w:r>
+      <w:r>
+        <w:t xml:space="preserve">”</w:t>
+      </w:r>
+      <w:r>
+        <w:t xml:space="preserve"> </w:t>
+      </w:r>
+      <w:r>
+        <w:t xml:space="preserve">shape every hotspots-family table module</w:t>
+      </w:r>
+      <w:r>
+        <w:t xml:space="preserve"> </w:t>
+      </w:r>
+      <w:r>
+        <w:t xml:space="preserve">(</w:t>
+      </w:r>
+      <w:r>
+        <w:rPr>
+          <w:rStyle w:val="VerbatimChar"/>
+        </w:rPr>
+        <w:t xml:space="preserve">stage5_cpu_hotspots_table.py</w:t>
+      </w:r>
+      <w:r>
+        <w:t xml:space="preserve">,</w:t>
+      </w:r>
+      <w:r>
+        <w:t xml:space="preserve"> </w:t>
+      </w:r>
+      <w:r>
+        <w:rPr>
+          <w:rStyle w:val="VerbatimChar"/>
+        </w:rPr>
+        <w:t xml:space="preserve">stage5_gpu_hotspots_table.py</w:t>
+      </w:r>
+      <w:r>
+        <w:t xml:space="preserve">,</w:t>
+      </w:r>
+      <w:r>
+        <w:t xml:space="preserve"> </w:t>
+      </w:r>
+      <w:r>
+        <w:rPr>
+          <w:rStyle w:val="VerbatimChar"/>
+        </w:rPr>
+        <w:t xml:space="preserve">stage5_fused_hotspots_table.py</w:t>
+      </w:r>
+      <w:r>
+        <w:t xml:space="preserve">,</w:t>
+      </w:r>
+      <w:r>
+        <w:t xml:space="preserve"> </w:t>
+      </w:r>
+      <w:r>
+        <w:rPr>
+          <w:rStyle w:val="VerbatimChar"/>
+        </w:rPr>
+        <w:t xml:space="preserve">stage5_load_imbalance_table.py</w:t>
+      </w:r>
+      <w:r>
+        <w:t xml:space="preserve">) already uses. Takes the row’s own already-assembled</w:t>
+      </w:r>
+      <w:r>
+        <w:t xml:space="preserve"> </w:t>
+      </w:r>
+      <w:r>
+        <w:rPr>
+          <w:rStyle w:val="VerbatimChar"/>
+        </w:rPr>
+        <w:t xml:space="preserve">prefix</w:t>
+      </w:r>
+      <w:r>
+        <w:t xml:space="preserve"> </w:t>
+      </w:r>
+      <w:r>
+        <w:t xml:space="preserve">(everything printed before the label) and the label itself; returns the row unchanged if it fits,</w:t>
+      </w:r>
+      <w:r>
+        <w:t xml:space="preserve"> </w:t>
+      </w:r>
+      <w:r>
+        <w:t xml:space="preserve">otherwise hard-wrapped – a raw character-level cut, no word-boundary search, with each</w:t>
+      </w:r>
+      <w:r>
+        <w:t xml:space="preserve"> </w:t>
+      </w:r>
+      <w:r>
+        <w:t xml:space="preserve">continuation line indented by</w:t>
+      </w:r>
+      <w:r>
+        <w:t xml:space="preserve"> </w:t>
+      </w:r>
+      <w:r>
+        <w:rPr>
+          <w:rStyle w:val="VerbatimChar"/>
+        </w:rPr>
+        <w:t xml:space="preserve">len(prefix)</w:t>
+      </w:r>
+      <w:r>
+        <w:t xml:space="preserve"> </w:t>
+      </w:r>
+      <w:r>
+        <w:t xml:space="preserve">spaces so it lines up under where the label itself</w:t>
+      </w:r>
+      <w:r>
+        <w:t xml:space="preserve"> </w:t>
+      </w:r>
+      <w:r>
+        <w:t xml:space="preserve">started, never flush-left.</w:t>
+      </w:r>
+      <w:r>
+        <w:t xml:space="preserve"> </w:t>
+      </w:r>
+      <w:r>
+        <w:rPr>
+          <w:rStyle w:val="VerbatimChar"/>
+        </w:rPr>
+        <w:t xml:space="preserve">render_table()</w:t>
+      </w:r>
+      <w:r>
+        <w:t xml:space="preserve"> </w:t>
+      </w:r>
+      <w:r>
+        <w:t xml:space="preserve">now calls this per row instead of directly</w:t>
+      </w:r>
+      <w:r>
+        <w:t xml:space="preserve"> </w:t>
+      </w:r>
+      <w:r>
+        <w:t xml:space="preserve">concatenating; a table made entirely of fixed-width columns (no trailing</w:t>
+      </w:r>
+      <w:r>
+        <w:t xml:space="preserve"> </w:t>
+      </w:r>
+      <w:r>
+        <w:rPr>
+          <w:rStyle w:val="VerbatimChar"/>
+        </w:rPr>
+        <w:t xml:space="preserve">width=None</w:t>
+      </w:r>
+      <w:r>
+        <w:t xml:space="preserve"> </w:t>
+      </w:r>
+      <w:r>
+        <w:t xml:space="preserve">column) is</w:t>
+      </w:r>
+      <w:r>
+        <w:t xml:space="preserve"> </w:t>
+      </w:r>
+      <w:r>
+        <w:t xml:space="preserve">routed around it entirely and renders exactly as before.</w:t>
+      </w:r>
+    </w:p>
+    <w:p>
+      <w:pPr>
+        <w:numPr>
+          <w:ilvl w:val="0"/>
+          <w:numId w:val="1015"/>
+        </w:numPr>
+        <w:pStyle w:val="Compact"/>
+      </w:pPr>
+      <w:r>
+        <w:rPr>
+          <w:rStyle w:val="VerbatimChar"/>
+        </w:rPr>
+        <w:t xml:space="preserve">stage5_tree_render.wrap_leading_labels(rows, suffix_width, width=120)</w:t>
+      </w:r>
+      <w:r>
+        <w:t xml:space="preserve"> </w:t>
+      </w:r>
+      <w:r>
+        <w:t xml:space="preserve">– for the inverse</w:t>
+      </w:r>
+      <w:r>
+        <w:t xml:space="preserve"> </w:t>
+      </w:r>
+      <w:r>
+        <w:t xml:space="preserve">geometry, a leading label column followed by numeric columns (</w:t>
+      </w:r>
+      <w:r>
+        <w:rPr>
+          <w:rStyle w:val="VerbatimChar"/>
+        </w:rPr>
+        <w:t xml:space="preserve">format_aligned_rows()</w:t>
+      </w:r>
+      <w:r>
+        <w:t xml:space="preserve">’s own</w:t>
+      </w:r>
+      <w:r>
+        <w:t xml:space="preserve"> </w:t>
+      </w:r>
+      <w:r>
+        <w:t xml:space="preserve">layout). Capping this width is inherently a whole-block decision, not a per-row one (every row</w:t>
+      </w:r>
+      <w:r>
+        <w:t xml:space="preserve"> </w:t>
+      </w:r>
+      <w:r>
+        <w:t xml:space="preserve">shares one</w:t>
+      </w:r>
+      <w:r>
+        <w:t xml:space="preserve"> </w:t>
+      </w:r>
+      <w:r>
+        <w:rPr>
+          <w:rStyle w:val="VerbatimChar"/>
+        </w:rPr>
+        <w:t xml:space="preserve">label_width</w:t>
+      </w:r>
+      <w:r>
+        <w:t xml:space="preserve">), so this function takes the whole row list at once: it returns the one</w:t>
+      </w:r>
+      <w:r>
+        <w:t xml:space="preserve"> </w:t>
+      </w:r>
+      <w:r>
+        <w:t xml:space="preserve">capped</w:t>
+      </w:r>
+      <w:r>
+        <w:t xml:space="preserve"> </w:t>
+      </w:r>
+      <w:r>
+        <w:rPr>
+          <w:rStyle w:val="VerbatimChar"/>
+        </w:rPr>
+        <w:t xml:space="preserve">label_width</w:t>
+      </w:r>
+      <w:r>
+        <w:t xml:space="preserve"> </w:t>
+      </w:r>
+      <w:r>
+        <w:t xml:space="preserve">(the longest real label, bounded so label +</w:t>
+      </w:r>
+      <w:r>
+        <w:t xml:space="preserve"> </w:t>
+      </w:r>
+      <w:r>
+        <w:rPr>
+          <w:rStyle w:val="VerbatimChar"/>
+        </w:rPr>
+        <w:t xml:space="preserve">suffix_width</w:t>
+      </w:r>
+      <w:r>
+        <w:t xml:space="preserve"> </w:t>
+      </w:r>
+      <w:r>
+        <w:t xml:space="preserve">never exceeds the</w:t>
+      </w:r>
+      <w:r>
+        <w:t xml:space="preserve"> </w:t>
+      </w:r>
+      <w:r>
+        <w:t xml:space="preserve">120-column target – this is what stops a single pathologically long label from dragging every</w:t>
+      </w:r>
+      <w:r>
+        <w:t xml:space="preserve"> </w:t>
+      </w:r>
+      <w:r>
+        <w:t xml:space="preserve">other row’s alignment wider, the exact bug real HPC data exposed) and every row with its label</w:t>
+      </w:r>
+      <w:r>
+        <w:t xml:space="preserve"> </w:t>
+      </w:r>
+      <w:r>
+        <w:t xml:space="preserve">replaced by a list of 1+ character-cut fragments, only the first of which carries that row’s</w:t>
+      </w:r>
+      <w:r>
+        <w:t xml:space="preserve"> </w:t>
+      </w:r>
+      <w:r>
+        <w:t xml:space="preserve">numeric values; marker rows (e.g. </w:t>
+      </w:r>
+      <w:r>
+        <w:t xml:space="preserve">“</w:t>
+      </w:r>
+      <w:r>
+        <w:t xml:space="preserve">N more node(s) hidden</w:t>
+      </w:r>
+      <w:r>
+        <w:t xml:space="preserve">”</w:t>
+      </w:r>
+      <w:r>
+        <w:t xml:space="preserve">) pass through untouched.</w:t>
+      </w:r>
+    </w:p>
+    <w:p>
+      <w:pPr>
+        <w:pStyle w:val="FirstParagraph"/>
+      </w:pPr>
+      <w:r>
+        <w:rPr>
+          <w:rStyle w:val="VerbatimChar"/>
+        </w:rPr>
+        <w:t xml:space="preserve">stage5_pop_metrics_table.py</w:t>
+      </w:r>
+      <w:r>
+        <w:t xml:space="preserve">’s columns are all explicitly widthed (no trailing</w:t>
+      </w:r>
+      <w:r>
+        <w:t xml:space="preserve"> </w:t>
+      </w:r>
+      <w:r>
+        <w:rPr>
+          <w:rStyle w:val="VerbatimChar"/>
+        </w:rPr>
+        <w:t xml:space="preserve">width=None</w:t>
+      </w:r>
+      <w:r>
+        <w:t xml:space="preserve"> </w:t>
+      </w:r>
+      <w:r>
+        <w:t xml:space="preserve">column at all – confirmed by direct read), so</w:t>
+      </w:r>
+      <w:r>
+        <w:t xml:space="preserve"> </w:t>
+      </w:r>
+      <w:r>
+        <w:rPr>
+          <w:rStyle w:val="VerbatimChar"/>
+        </w:rPr>
+        <w:t xml:space="preserve">wrap_trailing_label()</w:t>
+      </w:r>
+      <w:r>
+        <w:t xml:space="preserve"> </w:t>
+      </w:r>
+      <w:r>
+        <w:t xml:space="preserve">never engages for it;</w:t>
+      </w:r>
+      <w:r>
+        <w:t xml:space="preserve"> </w:t>
+      </w:r>
+      <w:r>
+        <w:t xml:space="preserve">real-data regeneration confirms every</w:t>
+      </w:r>
+      <w:r>
+        <w:t xml:space="preserve"> </w:t>
+      </w:r>
+      <w:r>
+        <w:rPr>
+          <w:rStyle w:val="VerbatimChar"/>
+        </w:rPr>
+        <w:t xml:space="preserve">pop_metrics.txt</w:t>
+      </w:r>
+      <w:r>
+        <w:t xml:space="preserve"> </w:t>
+      </w:r>
+      <w:r>
+        <w:t xml:space="preserve">is byte-identical except its own</w:t>
+      </w:r>
+      <w:r>
+        <w:t xml:space="preserve"> </w:t>
+      </w:r>
+      <w:r>
+        <w:t xml:space="preserve">timestamp/command-invocation lines.</w:t>
+      </w:r>
+    </w:p>
+    <w:p>
+      <w:pPr>
+        <w:pStyle w:val="BodyText"/>
+      </w:pPr>
+      <w:r>
+        <w:rPr>
+          <w:rStyle w:val="VerbatimChar"/>
+          <w:bCs/>
+          <w:b/>
+        </w:rPr>
+        <w:t xml:space="preserve">iter_table_rows(lines, num_columns)</w:t>
+      </w:r>
+      <w:r>
+        <w:t xml:space="preserve"> </w:t>
+      </w:r>
+      <w:r>
+        <w:t xml:space="preserve">(</w:t>
+      </w:r>
+      <w:r>
+        <w:rPr>
+          <w:rStyle w:val="VerbatimChar"/>
+        </w:rPr>
+        <w:t xml:space="preserve">stage5_table_render.py</w:t>
+      </w:r>
+      <w:r>
+        <w:t xml:space="preserve">, next to</w:t>
+      </w:r>
+      <w:r>
+        <w:t xml:space="preserve"> </w:t>
+      </w:r>
+      <w:r>
+        <w:rPr>
+          <w:rStyle w:val="VerbatimChar"/>
+        </w:rPr>
+        <w:t xml:space="preserve">render_table()</w:t>
+      </w:r>
+      <w:r>
+        <w:t xml:space="preserve">)</w:t>
+      </w:r>
+      <w:r>
+        <w:t xml:space="preserve"> </w:t>
+      </w:r>
+      <w:r>
+        <w:t xml:space="preserve">adapts the master roadmap’s own addendum sketch, parameterizing the column count the sketch</w:t>
+      </w:r>
+      <w:r>
+        <w:t xml:space="preserve"> </w:t>
+      </w:r>
+      <w:r>
+        <w:t xml:space="preserve">hardcoded (this codebase’s two real consumers need 7 and 6 respectively). Detection: a line is a</w:t>
+      </w:r>
+      <w:r>
+        <w:t xml:space="preserve"> </w:t>
+      </w:r>
+      <w:r>
+        <w:t xml:space="preserve">continuation of the previous row, not a new row, iff its first whitespace-split token doesn’t parse</w:t>
+      </w:r>
+      <w:r>
+        <w:t xml:space="preserve"> </w:t>
+      </w:r>
+      <w:r>
+        <w:t xml:space="preserve">as a plain integer – every real row’s leading</w:t>
+      </w:r>
+      <w:r>
+        <w:t xml:space="preserve"> </w:t>
+      </w:r>
+      <w:r>
+        <w:rPr>
+          <w:rStyle w:val="VerbatimChar"/>
+        </w:rPr>
+        <w:t xml:space="preserve">#</w:t>
+      </w:r>
+      <w:r>
+        <w:t xml:space="preserve"> </w:t>
+      </w:r>
+      <w:r>
+        <w:t xml:space="preserve">column always is one, a continuation line (a raw</w:t>
+      </w:r>
+      <w:r>
+        <w:t xml:space="preserve"> </w:t>
+      </w:r>
+      <w:r>
+        <w:t xml:space="preserve">fragment of a wrapped label) essentially never is. Reconstruction is direct concatenation, matching</w:t>
+      </w:r>
+      <w:r>
+        <w:t xml:space="preserve"> </w:t>
+      </w:r>
+      <w:r>
+        <w:t xml:space="preserve">the wrap’s own lossless character-level cut. Two known, accepted limitations, both inherited from</w:t>
+      </w:r>
+      <w:r>
+        <w:t xml:space="preserve"> </w:t>
+      </w:r>
+      <w:r>
+        <w:t xml:space="preserve">the original design and neither worth the added complexity of closing here: a wrap point landing</w:t>
+      </w:r>
+      <w:r>
+        <w:t xml:space="preserve"> </w:t>
+      </w:r>
+      <w:r>
+        <w:t xml:space="preserve">exactly on a digit run could misread a continuation line as a new row (real identifiers can’t start</w:t>
+      </w:r>
+      <w:r>
+        <w:t xml:space="preserve"> </w:t>
+      </w:r>
+      <w:r>
+        <w:t xml:space="preserve">with a digit, so this only bites mid-identifier at an exact cut point); a wrap point landing exactly</w:t>
+      </w:r>
+      <w:r>
+        <w:t xml:space="preserve"> </w:t>
+      </w:r>
+      <w:r>
+        <w:t xml:space="preserve">on a space is lossy, since each continuation line is stripped before being appended back – the</w:t>
+      </w:r>
+      <w:r>
+        <w:t xml:space="preserve"> </w:t>
+      </w:r>
+      <w:r>
+        <w:t xml:space="preserve">real motivating case (long namespace/template chains) is one long contiguous identifier with no</w:t>
+      </w:r>
+      <w:r>
+        <w:t xml:space="preserve"> </w:t>
+      </w:r>
+      <w:r>
+        <w:t xml:space="preserve">interior whitespace, so this practically never bites (a test that happened to hit this exact edge,</w:t>
+      </w:r>
+      <w:r>
+        <w:t xml:space="preserve"> </w:t>
+      </w:r>
+      <w:r>
+        <w:t xml:space="preserve">a hand-built label with a space near the likely wrap point, was rewritten to a space-free label</w:t>
+      </w:r>
+      <w:r>
+        <w:t xml:space="preserve"> </w:t>
+      </w:r>
+      <w:r>
+        <w:t xml:space="preserve">instead of</w:t>
+      </w:r>
+      <w:r>
+        <w:t xml:space="preserve"> </w:t>
+      </w:r>
+      <w:r>
+        <w:t xml:space="preserve">“</w:t>
+      </w:r>
+      <w:r>
+        <w:t xml:space="preserve">fixed</w:t>
+      </w:r>
+      <w:r>
+        <w:t xml:space="preserve">”</w:t>
+      </w:r>
+      <w:r>
+        <w:t xml:space="preserve"> </w:t>
+      </w:r>
+      <w:r>
+        <w:t xml:space="preserve">– the lossiness is the accepted design, not a bug). Both</w:t>
+      </w:r>
+      <w:r>
+        <w:t xml:space="preserve"> </w:t>
+      </w:r>
+      <w:r>
+        <w:rPr>
+          <w:rStyle w:val="VerbatimChar"/>
+        </w:rPr>
+        <w:t xml:space="preserve">select_hotspot_*.py</w:t>
+      </w:r>
+      <w:r>
+        <w:t xml:space="preserve"> </w:t>
+      </w:r>
+      <w:r>
+        <w:t xml:space="preserve">tools’</w:t>
+      </w:r>
+      <w:r>
+        <w:t xml:space="preserve"> </w:t>
+      </w:r>
+      <w:r>
+        <w:rPr>
+          <w:rStyle w:val="VerbatimChar"/>
+        </w:rPr>
+        <w:t xml:space="preserve">labels_from_report()</w:t>
+      </w:r>
+      <w:r>
+        <w:t xml:space="preserve"> </w:t>
+      </w:r>
+      <w:r>
+        <w:t xml:space="preserve">now iterate</w:t>
+      </w:r>
+      <w:r>
+        <w:t xml:space="preserve"> </w:t>
+      </w:r>
+      <w:r>
+        <w:rPr>
+          <w:rStyle w:val="VerbatimChar"/>
+        </w:rPr>
+        <w:t xml:space="preserve">iter_table_rows(lines[header + 1:], num_columns=7 or 6)</w:t>
+      </w:r>
+      <w:r>
+        <w:t xml:space="preserve"> </w:t>
+      </w:r>
+      <w:r>
+        <w:t xml:space="preserve">instead of hand-splitting each physical line directly – every per-column index use is unchanged,</w:t>
+      </w:r>
+      <w:r>
+        <w:t xml:space="preserve"> </w:t>
+      </w:r>
+      <w:r>
+        <w:t xml:space="preserve">since the token layout is identical, just no longer assuming one physical line per row.</w:t>
+      </w:r>
+    </w:p>
+    <w:p>
+      <w:pPr>
+        <w:pStyle w:val="BodyText"/>
+      </w:pPr>
+      <w:r>
+        <w:t xml:space="preserve">Test rework followed the same</w:t>
+      </w:r>
+      <w:r>
+        <w:t xml:space="preserve"> </w:t>
+      </w:r>
+      <w:r>
+        <w:t xml:space="preserve">“</w:t>
+      </w:r>
+      <w:r>
+        <w:t xml:space="preserve">run the existing suite first</w:t>
+      </w:r>
+      <w:r>
+        <w:t xml:space="preserve">”</w:t>
+      </w:r>
+      <w:r>
+        <w:t xml:space="preserve"> </w:t>
+      </w:r>
+      <w:r>
+        <w:t xml:space="preserve">discipline: of 404 tests, 3 broke, all</w:t>
+      </w:r>
+      <w:r>
+        <w:t xml:space="preserve"> </w:t>
+      </w:r>
+      <w:r>
+        <w:t xml:space="preserve">in the calltree view tests (</w:t>
+      </w:r>
+      <w:r>
+        <w:rPr>
+          <w:rStyle w:val="VerbatimChar"/>
+        </w:rPr>
+        <w:t xml:space="preserve">test_stage5_calltree_view.py</w:t>
+      </w:r>
+      <w:r>
+        <w:t xml:space="preserve">,</w:t>
+      </w:r>
+      <w:r>
+        <w:t xml:space="preserve"> </w:t>
+      </w:r>
+      <w:r>
+        <w:rPr>
+          <w:rStyle w:val="VerbatimChar"/>
+        </w:rPr>
+        <w:t xml:space="preserve">test_stage5_calltree_traced_view.py</w:t>
+      </w:r>
+      <w:r>
+        <w:t xml:space="preserve">)</w:t>
+      </w:r>
+      <w:r>
+        <w:t xml:space="preserve"> </w:t>
+      </w:r>
+      <w:r>
+        <w:t xml:space="preserve">whose fixtures include a bracketed synthetic GPU-kernel-group label (e.g. </w:t>
+      </w:r>
+      <w:r>
+        <w:t xml:space="preserve">“</w:t>
+      </w:r>
+      <w:r>
+        <w:t xml:space="preserve">[GPU kernels –</w:t>
+      </w:r>
+      <w:r>
+        <w:t xml:space="preserve"> </w:t>
+      </w:r>
+      <w:r>
+        <w:t xml:space="preserve">rocprofv3, ~60% estimate: this site issued 300/500 observed launch calls]</w:t>
+      </w:r>
+      <w:r>
+        <w:t xml:space="preserve">”</w:t>
+      </w:r>
+      <w:r>
+        <w:t xml:space="preserve">) long enough to now wrap</w:t>
+      </w:r>
+      <w:r>
+        <w:t xml:space="preserve"> </w:t>
+      </w:r>
+      <w:r>
+        <w:t xml:space="preserve">– a real, expected output-shape change, not a logic regression. Fixed by adding a small</w:t>
+      </w:r>
+      <w:r>
+        <w:t xml:space="preserve"> </w:t>
+      </w:r>
+      <w:r>
+        <w:rPr>
+          <w:rStyle w:val="VerbatimChar"/>
+        </w:rPr>
+        <w:t xml:space="preserve">_labels_only()</w:t>
+      </w:r>
+      <w:r>
+        <w:t xml:space="preserve"> </w:t>
+      </w:r>
+      <w:r>
+        <w:t xml:space="preserve">test helper (strips each physical line’s trailing numeric-cell columns via regex,</w:t>
+      </w:r>
+      <w:r>
+        <w:t xml:space="preserve"> </w:t>
+      </w:r>
+      <w:r>
+        <w:t xml:space="preserve">then joins with no separator) so the affected assertions search reconstructed label text instead of</w:t>
+      </w:r>
+      <w:r>
+        <w:t xml:space="preserve"> </w:t>
+      </w:r>
+      <w:r>
+        <w:t xml:space="preserve">one physical line; a naive</w:t>
+      </w:r>
+      <w:r>
+        <w:t xml:space="preserve"> </w:t>
+      </w:r>
+      <w:r>
+        <w:rPr>
+          <w:rStyle w:val="VerbatimChar"/>
+        </w:rPr>
+        <w:t xml:space="preserve">report.replace("\n", "")</w:t>
+      </w:r>
+      <w:r>
+        <w:t xml:space="preserve"> </w:t>
+      </w:r>
+      <w:r>
+        <w:t xml:space="preserve">was tried first and rejected once it became</w:t>
+      </w:r>
+      <w:r>
+        <w:t xml:space="preserve"> </w:t>
+      </w:r>
+      <w:r>
+        <w:t xml:space="preserve">clear it silently spliced a row’s own numeric cells into the middle of that row’s label instead of</w:t>
+      </w:r>
+      <w:r>
+        <w:t xml:space="preserve"> </w:t>
+      </w:r>
+      <w:r>
+        <w:t xml:space="preserve">skipping them. New test coverage added for every new/changed function:</w:t>
+      </w:r>
+      <w:r>
+        <w:t xml:space="preserve"> </w:t>
+      </w:r>
+      <w:r>
+        <w:rPr>
+          <w:rStyle w:val="VerbatimChar"/>
+        </w:rPr>
+        <w:t xml:space="preserve">WrapTrailingLabelTests</w:t>
+      </w:r>
+      <w:r>
+        <w:t xml:space="preserve">,</w:t>
+      </w:r>
+      <w:r>
+        <w:t xml:space="preserve"> </w:t>
+      </w:r>
+      <w:r>
+        <w:rPr>
+          <w:rStyle w:val="VerbatimChar"/>
+        </w:rPr>
+        <w:t xml:space="preserve">WrapLeadingLabelsTests</w:t>
+      </w:r>
+      <w:r>
+        <w:t xml:space="preserve">,</w:t>
+      </w:r>
+      <w:r>
+        <w:t xml:space="preserve"> </w:t>
+      </w:r>
+      <w:r>
+        <w:rPr>
+          <w:rStyle w:val="VerbatimChar"/>
+        </w:rPr>
+        <w:t xml:space="preserve">IterTableRowsTests</w:t>
+      </w:r>
+      <w:r>
+        <w:t xml:space="preserve">, plus one end-to-end case each in</w:t>
+      </w:r>
+      <w:r>
+        <w:t xml:space="preserve"> </w:t>
+      </w:r>
+      <w:r>
+        <w:rPr>
+          <w:rStyle w:val="VerbatimChar"/>
+        </w:rPr>
+        <w:t xml:space="preserve">RenderTableTests</w:t>
+      </w:r>
+      <w:r>
+        <w:t xml:space="preserve"> </w:t>
+      </w:r>
+      <w:r>
+        <w:t xml:space="preserve">and</w:t>
+      </w:r>
+      <w:r>
+        <w:t xml:space="preserve"> </w:t>
+      </w:r>
+      <w:r>
+        <w:rPr>
+          <w:rStyle w:val="VerbatimChar"/>
+        </w:rPr>
+        <w:t xml:space="preserve">FormatAlignedRowsTests</w:t>
+      </w:r>
+      <w:r>
+        <w:t xml:space="preserve"> </w:t>
+      </w:r>
+      <w:r>
+        <w:t xml:space="preserve">confirming the real renderer actually calls the new standalone function</w:t>
+      </w:r>
+      <w:r>
+        <w:t xml:space="preserve"> </w:t>
+      </w:r>
+      <w:r>
+        <w:t xml:space="preserve">(round-tripped back through</w:t>
+      </w:r>
+      <w:r>
+        <w:t xml:space="preserve"> </w:t>
+      </w:r>
+      <w:r>
+        <w:rPr>
+          <w:rStyle w:val="VerbatimChar"/>
+        </w:rPr>
+        <w:t xml:space="preserve">iter_table_rows()</w:t>
+      </w:r>
+      <w:r>
+        <w:t xml:space="preserve"> </w:t>
+      </w:r>
+      <w:r>
+        <w:t xml:space="preserve">for the former, checked against</w:t>
+      </w:r>
+      <w:r>
+        <w:t xml:space="preserve"> </w:t>
+      </w:r>
+      <w:r>
+        <w:rPr>
+          <w:rStyle w:val="VerbatimChar"/>
+        </w:rPr>
+        <w:t xml:space="preserve">wrap_leading_labels()</w:t>
+      </w:r>
+      <w:r>
+        <w:t xml:space="preserve">’s own directly-computed expected</w:t>
+      </w:r>
+      <w:r>
+        <w:t xml:space="preserve"> </w:t>
+      </w:r>
+      <w:r>
+        <w:rPr>
+          <w:rStyle w:val="VerbatimChar"/>
+        </w:rPr>
+        <w:t xml:space="preserve">label_width</w:t>
+      </w:r>
+      <w:r>
+        <w:t xml:space="preserve"> </w:t>
+      </w:r>
+      <w:r>
+        <w:t xml:space="preserve">for the latter). Both</w:t>
+      </w:r>
+      <w:r>
+        <w:t xml:space="preserve"> </w:t>
+      </w:r>
+      <w:r>
+        <w:rPr>
+          <w:rStyle w:val="VerbatimChar"/>
+        </w:rPr>
+        <w:t xml:space="preserve">select_hotspot_*.py</w:t>
+      </w:r>
+      <w:r>
+        <w:t xml:space="preserve"> </w:t>
+      </w:r>
+      <w:r>
+        <w:t xml:space="preserve">test files gained a pre-wrapped-report round-trip case, built with</w:t>
+      </w:r>
+      <w:r>
+        <w:t xml:space="preserve"> </w:t>
+      </w:r>
+      <w:r>
+        <w:rPr>
+          <w:rStyle w:val="VerbatimChar"/>
+        </w:rPr>
+        <w:t xml:space="preserve">wrap_trailing_label()</w:t>
+      </w:r>
+      <w:r>
+        <w:t xml:space="preserve"> </w:t>
+      </w:r>
+      <w:r>
+        <w:t xml:space="preserve">directly rather than a hand-typed fixture, confirming</w:t>
+      </w:r>
+      <w:r>
+        <w:t xml:space="preserve"> </w:t>
+      </w:r>
+      <w:r>
+        <w:rPr>
+          <w:rStyle w:val="VerbatimChar"/>
+        </w:rPr>
+        <w:t xml:space="preserve">labels_from_report()</w:t>
+      </w:r>
+      <w:r>
+        <w:t xml:space="preserve"> </w:t>
+      </w:r>
+      <w:r>
+        <w:t xml:space="preserve">reconstructs the full label instead of just its first physical line. Final suite: 422 tests, all</w:t>
+      </w:r>
+      <w:r>
+        <w:t xml:space="preserve"> </w:t>
+      </w:r>
+      <w:r>
+        <w:t xml:space="preserve">passing.</w:t>
+      </w:r>
+    </w:p>
+    <w:p>
+      <w:pPr>
+        <w:pStyle w:val="BodyText"/>
+      </w:pPr>
+      <w:r>
+        <w:t xml:space="preserve">Real-data verification across all 6</w:t>
+      </w:r>
+      <w:r>
+        <w:t xml:space="preserve"> </w:t>
+      </w:r>
+      <w:r>
+        <w:rPr>
+          <w:rStyle w:val="VerbatimChar"/>
+        </w:rPr>
+        <w:t xml:space="preserve">test_apps/results/</w:t>
+      </w:r>
+      <w:r>
+        <w:t xml:space="preserve"> </w:t>
+      </w:r>
+      <w:r>
+        <w:t xml:space="preserve">directories: only</w:t>
+      </w:r>
+      <w:r>
+        <w:t xml:space="preserve"> </w:t>
+      </w:r>
+      <w:r>
+        <w:rPr>
+          <w:rStyle w:val="VerbatimChar"/>
+        </w:rPr>
+        <w:t xml:space="preserve">hotspots.txt</w:t>
+      </w:r>
+      <w:r>
+        <w:t xml:space="preserve">,</w:t>
+      </w:r>
+      <w:r>
+        <w:t xml:space="preserve"> </w:t>
+      </w:r>
+      <w:r>
+        <w:rPr>
+          <w:rStyle w:val="VerbatimChar"/>
+        </w:rPr>
+        <w:t xml:space="preserve">calltree.txt</w:t>
+      </w:r>
+      <w:r>
+        <w:t xml:space="preserve">, and</w:t>
+      </w:r>
+      <w:r>
+        <w:t xml:space="preserve"> </w:t>
+      </w:r>
+      <w:r>
+        <w:rPr>
+          <w:rStyle w:val="VerbatimChar"/>
+        </w:rPr>
+        <w:t xml:space="preserve">calltree_traced.txt</w:t>
+      </w:r>
+      <w:r>
+        <w:t xml:space="preserve"> </w:t>
+      </w:r>
+      <w:r>
+        <w:t xml:space="preserve">change (</w:t>
+      </w:r>
+      <w:r>
+        <w:rPr>
+          <w:rStyle w:val="VerbatimChar"/>
+        </w:rPr>
+        <w:t xml:space="preserve">pop_metrics.txt</w:t>
+      </w:r>
+      <w:r>
+        <w:t xml:space="preserve"> </w:t>
+      </w:r>
+      <w:r>
+        <w:t xml:space="preserve">confirmed unaffected above). To</w:t>
+      </w:r>
+      <w:r>
+        <w:t xml:space="preserve"> </w:t>
+      </w:r>
+      <w:r>
+        <w:t xml:space="preserve">avoid clobbering the</w:t>
+      </w:r>
+      <w:r>
+        <w:t xml:space="preserve"> </w:t>
+      </w:r>
+      <w:r>
+        <w:rPr>
+          <w:rStyle w:val="VerbatimChar"/>
+        </w:rPr>
+        <w:t xml:space="preserve">.before</w:t>
+      </w:r>
+      <w:r>
+        <w:t xml:space="preserve"> </w:t>
+      </w:r>
+      <w:r>
+        <w:t xml:space="preserve">siblings plan 2.10’s own review already left in place (explicitly</w:t>
+      </w:r>
+      <w:r>
+        <w:t xml:space="preserve"> </w:t>
+      </w:r>
+      <w:r>
+        <w:t xml:space="preserve">kept per prior request, holding the pre-2.10 baseline), this round’s pre-change snapshots use a</w:t>
+      </w:r>
+      <w:r>
+        <w:t xml:space="preserve"> </w:t>
+      </w:r>
+      <w:r>
+        <w:t xml:space="preserve">distinct</w:t>
+      </w:r>
+      <w:r>
+        <w:t xml:space="preserve"> </w:t>
+      </w:r>
+      <w:r>
+        <w:rPr>
+          <w:rStyle w:val="VerbatimChar"/>
+        </w:rPr>
+        <w:t xml:space="preserve">.before-2.11</w:t>
+      </w:r>
+      <w:r>
+        <w:t xml:space="preserve"> </w:t>
+      </w:r>
+      <w:r>
+        <w:t xml:space="preserve">suffix instead of reusing</w:t>
+      </w:r>
+      <w:r>
+        <w:t xml:space="preserve"> </w:t>
+      </w:r>
+      <w:r>
+        <w:rPr>
+          <w:rStyle w:val="VerbatimChar"/>
+        </w:rPr>
+        <w:t xml:space="preserve">.before</w:t>
+      </w:r>
+      <w:r>
+        <w:t xml:space="preserve"> </w:t>
+      </w:r>
+      <w:r>
+        <w:t xml:space="preserve">– so all three states (pre-2.10,</w:t>
+      </w:r>
+      <w:r>
+        <w:t xml:space="preserve"> </w:t>
+      </w:r>
+      <w:r>
+        <w:t xml:space="preserve">post-2.10/pre-2.11, and post-2.11) stay independently reviewable side by side. Diffing</w:t>
+      </w:r>
+      <w:r>
+        <w:t xml:space="preserve"> </w:t>
+      </w:r>
+      <w:r>
+        <w:rPr>
+          <w:rStyle w:val="VerbatimChar"/>
+        </w:rPr>
+        <w:t xml:space="preserve">calltree.txt.before-2.11</w:t>
+      </w:r>
+      <w:r>
+        <w:t xml:space="preserve"> </w:t>
+      </w:r>
+      <w:r>
+        <w:t xml:space="preserve">against the regenerated</w:t>
+      </w:r>
+      <w:r>
+        <w:t xml:space="preserve"> </w:t>
+      </w:r>
+      <w:r>
+        <w:rPr>
+          <w:rStyle w:val="VerbatimChar"/>
+        </w:rPr>
+        <w:t xml:space="preserve">calltree.txt</w:t>
+      </w:r>
+      <w:r>
+        <w:t xml:space="preserve"> </w:t>
+      </w:r>
+      <w:r>
+        <w:t xml:space="preserve">confirms the fix directly: a real</w:t>
+      </w:r>
+      <w:r>
+        <w:t xml:space="preserve"> </w:t>
+      </w:r>
+      <w:r>
+        <w:rPr>
+          <w:rStyle w:val="VerbatimChar"/>
+        </w:rPr>
+        <w:t xml:space="preserve">run_simulation(std::__cxx11::basic_string&lt;...&gt;...)</w:t>
+      </w:r>
+      <w:r>
+        <w:t xml:space="preserve"> </w:t>
+      </w:r>
+      <w:r>
+        <w:t xml:space="preserve">signature that used to drag every column on its</w:t>
+      </w:r>
+      <w:r>
+        <w:t xml:space="preserve"> </w:t>
+      </w:r>
+      <w:r>
+        <w:t xml:space="preserve">own row (and every sibling row’s alignment) out to the right, ending in a truncated</w:t>
+      </w:r>
+      <w:r>
+        <w:t xml:space="preserve"> </w:t>
+      </w:r>
+      <w:r>
+        <w:rPr>
+          <w:rStyle w:val="VerbatimChar"/>
+        </w:rPr>
+        <w:t xml:space="preserve">...</w:t>
+      </w:r>
+      <w:r>
+        <w:t xml:space="preserve">, now wraps</w:t>
+      </w:r>
+      <w:r>
+        <w:t xml:space="preserve"> </w:t>
+      </w:r>
+      <w:r>
+        <w:t xml:space="preserve">onto its own continuation line(s) with the row’s numeric columns staying put at the shared,</w:t>
+      </w:r>
+      <w:r>
+        <w:t xml:space="preserve"> </w:t>
+      </w:r>
+      <w:r>
+        <w:t xml:space="preserve">120-column-budget-derived width – exactly the problem this plan exists to fix.</w:t>
+      </w:r>
+    </w:p>
     <w:bookmarkEnd w:id="74"/>
+    <w:bookmarkEnd w:id="75"/>
     <w:sectPr/>
   </w:body>
 </w:document>
@@ -40219,6 +41584,9 @@
     <w:lvlOverride w:ilvl="8">
       <w:startOverride w:val="1"/>
     </w:lvlOverride>
+  </w:num>
+  <w:num w:numId="1015">
+    <w:abstractNumId w:val="991"/>
   </w:num>
 </w:numbering>
 </file>

</xml_diff>

<commit_message>
Plan 2.12: user-facing noise-config file (roadmap step 10)
Adds --extra-noise-config/$FRIENDLY_ROCPROF_NOISE_CONFIG so a user can add/remove noise-tag
substring patterns, disable a tag entirely, or populate a reserved "other" tag for their own
app's noise, without editing Python. The resolved patterns live in a new process-wide global
(stage6_noise_config.py) that stage3_rocprofsys.tag_rows() falls back to when a caller omits its
own tag_defs, rather than threading the config through every function in the pipeline. Also fixes
a real, pre-existing case-sensitivity gap in pattern matching, surfaced while smoke-testing on
real data: a user's own mixed-case substrings now match correctly instead of silently no-op-ing.

Co-Authored-By: Claude Sonnet 5 <noreply@anthropic.com>
</commit_message>
<xml_diff>
--- a/docs/DEVELOPMENT_HISTORY.docx
+++ b/docs/DEVELOPMENT_HISTORY.docx
@@ -10,7 +10,7 @@
         <w:t xml:space="preserve">Development History</w:t>
       </w:r>
     </w:p>
-    <w:bookmarkStart w:id="75" w:name="development-history"/>
+    <w:bookmarkStart w:id="76" w:name="development-history"/>
     <w:p>
       <w:pPr>
         <w:pStyle w:val="Heading1"/>
@@ -2653,6 +2653,146 @@
           </w:p>
         </w:tc>
       </w:tr>
+      <w:tr>
+        <w:tc>
+          <w:tcPr/>
+          <w:p>
+            <w:pPr>
+              <w:pStyle w:val="Compact"/>
+              <w:jc w:val="left"/>
+            </w:pPr>
+            <w:r>
+              <w:t xml:space="preserve">2026-08-17</w:t>
+            </w:r>
+          </w:p>
+        </w:tc>
+        <w:tc>
+          <w:tcPr/>
+          <w:p>
+            <w:pPr>
+              <w:pStyle w:val="Compact"/>
+              <w:jc w:val="left"/>
+            </w:pPr>
+            <w:r>
+              <w:t xml:space="preserve">Plan 2.12: user-facing</w:t>
+            </w:r>
+            <w:r>
+              <w:t xml:space="preserve"> </w:t>
+            </w:r>
+            <w:r>
+              <w:rPr>
+                <w:rStyle w:val="VerbatimChar"/>
+              </w:rPr>
+              <w:t xml:space="preserve">--extra-noise-config</w:t>
+            </w:r>
+            <w:r>
+              <w:t xml:space="preserve">/</w:t>
+            </w:r>
+            <w:r>
+              <w:rPr>
+                <w:rStyle w:val="VerbatimChar"/>
+              </w:rPr>
+              <w:t xml:space="preserve">$FRIENDLY_ROCPROF_NOISE_CONFIG</w:t>
+            </w:r>
+            <w:r>
+              <w:t xml:space="preserve"> </w:t>
+            </w:r>
+            <w:r>
+              <w:t xml:space="preserve">noise-pattern override file – roadmap step 10; new</w:t>
+            </w:r>
+            <w:r>
+              <w:t xml:space="preserve"> </w:t>
+            </w:r>
+            <w:r>
+              <w:rPr>
+                <w:rStyle w:val="VerbatimChar"/>
+              </w:rPr>
+              <w:t xml:space="preserve">stage6_noise_config.py</w:t>
+            </w:r>
+            <w:r>
+              <w:t xml:space="preserve"> </w:t>
+            </w:r>
+            <w:r>
+              <w:t xml:space="preserve">resolves a process-wide</w:t>
+            </w:r>
+            <w:r>
+              <w:t xml:space="preserve"> </w:t>
+            </w:r>
+            <w:r>
+              <w:rPr>
+                <w:rStyle w:val="VerbatimChar"/>
+              </w:rPr>
+              <w:t xml:space="preserve">tag_defs()</w:t>
+            </w:r>
+            <w:r>
+              <w:t xml:space="preserve"> </w:t>
+            </w:r>
+            <w:r>
+              <w:t xml:space="preserve">global (bundled defaults + add/remove/disable + a reserved</w:t>
+            </w:r>
+            <w:r>
+              <w:t xml:space="preserve"> </w:t>
+            </w:r>
+            <w:r>
+              <w:rPr>
+                <w:rStyle w:val="VerbatimChar"/>
+              </w:rPr>
+              <w:t xml:space="preserve">"other"</w:t>
+            </w:r>
+            <w:r>
+              <w:t xml:space="preserve"> </w:t>
+            </w:r>
+            <w:r>
+              <w:t xml:space="preserve">tag) that</w:t>
+            </w:r>
+            <w:r>
+              <w:t xml:space="preserve"> </w:t>
+            </w:r>
+            <w:r>
+              <w:rPr>
+                <w:rStyle w:val="VerbatimChar"/>
+              </w:rPr>
+              <w:t xml:space="preserve">stage3_rocprofsys.tag_rows()</w:t>
+            </w:r>
+            <w:r>
+              <w:t xml:space="preserve"> </w:t>
+            </w:r>
+            <w:r>
+              <w:t xml:space="preserve">falls back to when a caller omits its own, rather than threading the config through every function between a tool’s</w:t>
+            </w:r>
+            <w:r>
+              <w:t xml:space="preserve"> </w:t>
+            </w:r>
+            <w:r>
+              <w:rPr>
+                <w:rStyle w:val="VerbatimChar"/>
+              </w:rPr>
+              <w:t xml:space="preserve">main()</w:t>
+            </w:r>
+            <w:r>
+              <w:t xml:space="preserve"> </w:t>
+            </w:r>
+            <w:r>
+              <w:t xml:space="preserve">and</w:t>
+            </w:r>
+            <w:r>
+              <w:t xml:space="preserve"> </w:t>
+            </w:r>
+            <w:r>
+              <w:rPr>
+                <w:rStyle w:val="VerbatimChar"/>
+              </w:rPr>
+              <w:t xml:space="preserve">tag_rows()</w:t>
+            </w:r>
+            <w:r>
+              <w:t xml:space="preserve"> </w:t>
+            </w:r>
+            <w:r>
+              <w:t xml:space="preserve">– see full design/real-data accounting below</w:t>
+            </w:r>
+          </w:p>
+        </w:tc>
+      </w:tr>
     </w:tbl>
     <w:bookmarkStart w:id="20" w:name="project-scaffolding-and-rules"/>
     <w:p>
@@ -40890,7 +41030,2210 @@
       </w:r>
     </w:p>
     <w:bookmarkEnd w:id="74"/>
+    <w:bookmarkStart w:id="75" w:name="Xad84946b50e04d8f19916ac0e24e93700269ed6"/>
+    <w:p>
+      <w:pPr>
+        <w:pStyle w:val="Heading2"/>
+      </w:pPr>
+      <w:r>
+        <w:t xml:space="preserve">2026-08-17 — Plan 2.12: user-facing noise-config file (roadmap step 10)</w:t>
+      </w:r>
+    </w:p>
+    <w:p>
+      <w:pPr>
+        <w:pStyle w:val="FirstParagraph"/>
+      </w:pPr>
+      <w:r>
+        <w:t xml:space="preserve">Closes roadmap step 10, a design already sketched out in the master plan’s stage-3 engine section</w:t>
+      </w:r>
+      <w:r>
+        <w:t xml:space="preserve"> </w:t>
+      </w:r>
+      <w:r>
+        <w:t xml:space="preserve">when the engine itself was first planned:</w:t>
+      </w:r>
+      <w:r>
+        <w:t xml:space="preserve"> </w:t>
+      </w:r>
+      <w:r>
+        <w:rPr>
+          <w:rStyle w:val="VerbatimChar"/>
+        </w:rPr>
+        <w:t xml:space="preserve">--extra-noise-config PATH</w:t>
+      </w:r>
+      <w:r>
+        <w:t xml:space="preserve"> </w:t>
+      </w:r>
+      <w:r>
+        <w:t xml:space="preserve">/</w:t>
+      </w:r>
+      <w:r>
+        <w:t xml:space="preserve"> </w:t>
+      </w:r>
+      <w:r>
+        <w:rPr>
+          <w:rStyle w:val="VerbatimChar"/>
+        </w:rPr>
+        <w:t xml:space="preserve">$FRIENDLY_ROCPROF_NOISE_CONFIG</w:t>
+      </w:r>
+      <w:r>
+        <w:t xml:space="preserve"> </w:t>
+      </w:r>
+      <w:r>
+        <w:t xml:space="preserve">lets a user add/remove substring patterns on the engine’s 5</w:t>
+      </w:r>
+      <w:r>
+        <w:t xml:space="preserve"> </w:t>
+      </w:r>
+      <w:r>
+        <w:t xml:space="preserve">built-in noise tags, disable a tag entirely, and populate a reserved</w:t>
+      </w:r>
+      <w:r>
+        <w:t xml:space="preserve"> </w:t>
+      </w:r>
+      <w:r>
+        <w:rPr>
+          <w:rStyle w:val="VerbatimChar"/>
+        </w:rPr>
+        <w:t xml:space="preserve">"other"</w:t>
+      </w:r>
+      <w:r>
+        <w:t xml:space="preserve"> </w:t>
+      </w:r>
+      <w:r>
+        <w:t xml:space="preserve">tag for their own</w:t>
+      </w:r>
+      <w:r>
+        <w:t xml:space="preserve"> </w:t>
+      </w:r>
+      <w:r>
+        <w:t xml:space="preserve">app’s noise that doesn’t fit any built-in category – without editing Python.</w:t>
+      </w:r>
+    </w:p>
+    <w:p>
+      <w:pPr>
+        <w:pStyle w:val="BodyText"/>
+      </w:pPr>
+      <w:r>
+        <w:rPr>
+          <w:bCs/>
+          <w:b/>
+        </w:rPr>
+        <w:t xml:space="preserve">Design pivoted twice during planning, away from parameter-threading, toward a process-wide</w:t>
+      </w:r>
+      <w:r>
+        <w:rPr>
+          <w:bCs/>
+          <w:b/>
+        </w:rPr>
+        <w:t xml:space="preserve"> </w:t>
+      </w:r>
+      <w:r>
+        <w:rPr>
+          <w:bCs/>
+          <w:b/>
+        </w:rPr>
+        <w:t xml:space="preserve">global.</w:t>
+      </w:r>
+      <w:r>
+        <w:t xml:space="preserve"> </w:t>
+      </w:r>
+      <w:r>
+        <w:t xml:space="preserve">The first draft threaded an optional</w:t>
+      </w:r>
+      <w:r>
+        <w:t xml:space="preserve"> </w:t>
+      </w:r>
+      <w:r>
+        <w:rPr>
+          <w:rStyle w:val="VerbatimChar"/>
+        </w:rPr>
+        <w:t xml:space="preserve">tag_defs</w:t>
+      </w:r>
+      <w:r>
+        <w:t xml:space="preserve"> </w:t>
+      </w:r>
+      <w:r>
+        <w:t xml:space="preserve">parameter through every function between</w:t>
+      </w:r>
+      <w:r>
+        <w:t xml:space="preserve"> </w:t>
+      </w:r>
+      <w:r>
+        <w:t xml:space="preserve">a tool’s</w:t>
+      </w:r>
+      <w:r>
+        <w:t xml:space="preserve"> </w:t>
+      </w:r>
+      <w:r>
+        <w:rPr>
+          <w:rStyle w:val="VerbatimChar"/>
+        </w:rPr>
+        <w:t xml:space="preserve">main()</w:t>
+      </w:r>
+      <w:r>
+        <w:t xml:space="preserve"> </w:t>
+      </w:r>
+      <w:r>
+        <w:t xml:space="preserve">and</w:t>
+      </w:r>
+      <w:r>
+        <w:t xml:space="preserve"> </w:t>
+      </w:r>
+      <w:r>
+        <w:rPr>
+          <w:rStyle w:val="VerbatimChar"/>
+        </w:rPr>
+        <w:t xml:space="preserve">tag_rows()</w:t>
+      </w:r>
+      <w:r>
+        <w:t xml:space="preserve"> </w:t>
+      </w:r>
+      <w:r>
+        <w:t xml:space="preserve">(</w:t>
+      </w:r>
+      <w:r>
+        <w:rPr>
+          <w:rStyle w:val="VerbatimChar"/>
+        </w:rPr>
+        <w:t xml:space="preserve">scan_ranks()</w:t>
+      </w:r>
+      <w:r>
+        <w:t xml:space="preserve"> </w:t>
+      </w:r>
+      <w:r>
+        <w:t xml:space="preserve">-&gt;</w:t>
+      </w:r>
+      <w:r>
+        <w:t xml:space="preserve"> </w:t>
+      </w:r>
+      <w:r>
+        <w:rPr>
+          <w:rStyle w:val="VerbatimChar"/>
+        </w:rPr>
+        <w:t xml:space="preserve">aggregate()</w:t>
+      </w:r>
+      <w:r>
+        <w:t xml:space="preserve">/</w:t>
+      </w:r>
+      <w:r>
+        <w:rPr>
+          <w:rStyle w:val="VerbatimChar"/>
+        </w:rPr>
+        <w:t xml:space="preserve">aggregate_per_rank()</w:t>
+      </w:r>
+      <w:r>
+        <w:t xml:space="preserve">,</w:t>
+      </w:r>
+      <w:r>
+        <w:t xml:space="preserve"> </w:t>
+      </w:r>
+      <w:r>
+        <w:rPr>
+          <w:rStyle w:val="VerbatimChar"/>
+        </w:rPr>
+        <w:t xml:space="preserve">load_rank_trees()</w:t>
+      </w:r>
+      <w:r>
+        <w:t xml:space="preserve"> </w:t>
+      </w:r>
+      <w:r>
+        <w:t xml:space="preserve">-&gt;</w:t>
+      </w:r>
+      <w:r>
+        <w:t xml:space="preserve"> </w:t>
+      </w:r>
+      <w:r>
+        <w:rPr>
+          <w:rStyle w:val="VerbatimChar"/>
+        </w:rPr>
+        <w:t xml:space="preserve">build_calltree_view()</w:t>
+      </w:r>
+      <w:r>
+        <w:t xml:space="preserve"> </w:t>
+      </w:r>
+      <w:r>
+        <w:t xml:space="preserve">x2,</w:t>
+      </w:r>
+      <w:r>
+        <w:t xml:space="preserve"> </w:t>
+      </w:r>
+      <w:r>
+        <w:rPr>
+          <w:rStyle w:val="VerbatimChar"/>
+        </w:rPr>
+        <w:t xml:space="preserve">compute_run_metrics()</w:t>
+      </w:r>
+      <w:r>
+        <w:t xml:space="preserve">‘</w:t>
+      </w:r>
+      <w:r>
+        <w:t xml:space="preserve">s 3 direct calls) –</w:t>
+      </w:r>
+      <w:r>
+        <w:t xml:space="preserve"> </w:t>
+      </w:r>
+      <w:r>
+        <w:t xml:space="preserve">rejected as unsustainable signature churn for a single process-wide setting, since every real</w:t>
+      </w:r>
+      <w:r>
+        <w:t xml:space="preserve"> </w:t>
+      </w:r>
+      <w:r>
+        <w:t xml:space="preserve">invocation of this codebase is a one-shot CLI process with exactly one noise-pattern configuration</w:t>
+      </w:r>
+      <w:r>
+        <w:t xml:space="preserve"> </w:t>
+      </w:r>
+      <w:r>
+        <w:t xml:space="preserve">for its whole run. The resolved patterns became a</w:t>
+      </w:r>
+      <w:r>
+        <w:t xml:space="preserve"> </w:t>
+      </w:r>
+      <w:r>
+        <w:rPr>
+          <w:bCs/>
+          <w:b/>
+        </w:rPr>
+        <w:t xml:space="preserve">process-wide global</w:t>
+      </w:r>
+      <w:r>
+        <w:t xml:space="preserve"> </w:t>
+      </w:r>
+      <w:r>
+        <w:t xml:space="preserve">instead, held by a new</w:t>
+      </w:r>
+      <w:r>
+        <w:t xml:space="preserve"> </w:t>
+      </w:r>
+      <w:r>
+        <w:t xml:space="preserve">small module,</w:t>
+      </w:r>
+      <w:r>
+        <w:t xml:space="preserve"> </w:t>
+      </w:r>
+      <w:r>
+        <w:rPr>
+          <w:rStyle w:val="VerbatimChar"/>
+        </w:rPr>
+        <w:t xml:space="preserve">stage6_noise_config.py</w:t>
+      </w:r>
+      <w:r>
+        <w:t xml:space="preserve">. Second pivot:</w:t>
+      </w:r>
+      <w:r>
+        <w:t xml:space="preserve"> </w:t>
+      </w:r>
+      <w:r>
+        <w:rPr>
+          <w:rStyle w:val="VerbatimChar"/>
+        </w:rPr>
+        <w:t xml:space="preserve">stage3_rocprofsys.load_default_patterns()</w:t>
+      </w:r>
+      <w:r>
+        <w:t xml:space="preserve"> </w:t>
+      </w:r>
+      <w:r>
+        <w:t xml:space="preserve">itself</w:t>
+      </w:r>
+      <w:r>
+        <w:t xml:space="preserve"> </w:t>
+      </w:r>
+      <w:r>
+        <w:rPr>
+          <w:bCs/>
+          <w:b/>
+        </w:rPr>
+        <w:t xml:space="preserve">moved out of stage3 into that same new module</w:t>
+      </w:r>
+      <w:r>
+        <w:t xml:space="preserve">, rather than staying in stage3 with the</w:t>
+      </w:r>
+      <w:r>
+        <w:t xml:space="preserve"> </w:t>
+      </w:r>
+      <w:r>
+        <w:t xml:space="preserve">new module importing it – makes the dependency strictly one-directional (stage3 reads from</w:t>
+      </w:r>
+      <w:r>
+        <w:t xml:space="preserve"> </w:t>
+      </w:r>
+      <w:r>
+        <w:t xml:space="preserve">stage6; stage6 reads from nothing else in this package) instead of each needing something from the</w:t>
+      </w:r>
+      <w:r>
+        <w:t xml:space="preserve"> </w:t>
+      </w:r>
+      <w:r>
+        <w:t xml:space="preserve">other. This is a deliberate exception to the usual stage-N-depends-only-on-lower-N layering:</w:t>
+      </w:r>
+      <w:r>
+        <w:t xml:space="preserve"> </w:t>
+      </w:r>
+      <w:r>
+        <w:rPr>
+          <w:rStyle w:val="VerbatimChar"/>
+        </w:rPr>
+        <w:t xml:space="preserve">stage3_rocprofsys.tag_rows(rows, tag_defs=None, filename=None)</w:t>
+      </w:r>
+      <w:r>
+        <w:t xml:space="preserve"> </w:t>
+      </w:r>
+      <w:r>
+        <w:t xml:space="preserve">now falls back to</w:t>
+      </w:r>
+      <w:r>
+        <w:t xml:space="preserve"> </w:t>
+      </w:r>
+      <w:r>
+        <w:rPr>
+          <w:rStyle w:val="VerbatimChar"/>
+        </w:rPr>
+        <w:t xml:space="preserve">stage6_noise_config.tag_defs()</w:t>
+      </w:r>
+      <w:r>
+        <w:t xml:space="preserve">’s current resolved value whenever a caller omits</w:t>
+      </w:r>
+      <w:r>
+        <w:t xml:space="preserve"> </w:t>
+      </w:r>
+      <w:r>
+        <w:rPr>
+          <w:rStyle w:val="VerbatimChar"/>
+        </w:rPr>
+        <w:t xml:space="preserve">tag_defs</w:t>
+      </w:r>
+      <w:r>
+        <w:t xml:space="preserve"> </w:t>
+      </w:r>
+      <w:r>
+        <w:t xml:space="preserve">explicitly – every existing test (all of which pass a hand-built</w:t>
+      </w:r>
+      <w:r>
+        <w:t xml:space="preserve"> </w:t>
+      </w:r>
+      <w:r>
+        <w:rPr>
+          <w:rStyle w:val="VerbatimChar"/>
+        </w:rPr>
+        <w:t xml:space="preserve">tag_defs</w:t>
+      </w:r>
+      <w:r>
+        <w:t xml:space="preserve"> </w:t>
+      </w:r>
+      <w:r>
+        <w:t xml:space="preserve">dict) is completely</w:t>
+      </w:r>
+      <w:r>
+        <w:t xml:space="preserve"> </w:t>
+      </w:r>
+      <w:r>
+        <w:t xml:space="preserve">unaffected, and</w:t>
+      </w:r>
+      <w:r>
+        <w:t xml:space="preserve"> </w:t>
+      </w:r>
+      <w:r>
+        <w:rPr>
+          <w:bCs/>
+          <w:b/>
+        </w:rPr>
+        <w:t xml:space="preserve">no other function signature changed at all</w:t>
+      </w:r>
+      <w:r>
+        <w:t xml:space="preserve">:</w:t>
+      </w:r>
+      <w:r>
+        <w:t xml:space="preserve"> </w:t>
+      </w:r>
+      <w:r>
+        <w:rPr>
+          <w:rStyle w:val="VerbatimChar"/>
+        </w:rPr>
+        <w:t xml:space="preserve">scan_ranks()</w:t>
+      </w:r>
+      <w:r>
+        <w:t xml:space="preserve">,</w:t>
+      </w:r>
+      <w:r>
+        <w:t xml:space="preserve"> </w:t>
+      </w:r>
+      <w:r>
+        <w:rPr>
+          <w:rStyle w:val="VerbatimChar"/>
+        </w:rPr>
+        <w:t xml:space="preserve">aggregate()</w:t>
+      </w:r>
+      <w:r>
+        <w:t xml:space="preserve">,</w:t>
+      </w:r>
+      <w:r>
+        <w:t xml:space="preserve"> </w:t>
+      </w:r>
+      <w:r>
+        <w:rPr>
+          <w:rStyle w:val="VerbatimChar"/>
+        </w:rPr>
+        <w:t xml:space="preserve">aggregate_per_rank()</w:t>
+      </w:r>
+      <w:r>
+        <w:t xml:space="preserve">,</w:t>
+      </w:r>
+      <w:r>
+        <w:t xml:space="preserve"> </w:t>
+      </w:r>
+      <w:r>
+        <w:rPr>
+          <w:rStyle w:val="VerbatimChar"/>
+        </w:rPr>
+        <w:t xml:space="preserve">load_rank_trees()</w:t>
+      </w:r>
+      <w:r>
+        <w:t xml:space="preserve">, both tools</w:t>
+      </w:r>
+      <w:r>
+        <w:t xml:space="preserve">’</w:t>
+      </w:r>
+      <w:r>
+        <w:t xml:space="preserve"> </w:t>
+      </w:r>
+      <w:r>
+        <w:rPr>
+          <w:rStyle w:val="VerbatimChar"/>
+        </w:rPr>
+        <w:t xml:space="preserve">build_calltree_view()</w:t>
+      </w:r>
+      <w:r>
+        <w:t xml:space="preserve">,</w:t>
+      </w:r>
+      <w:r>
+        <w:t xml:space="preserve"> </w:t>
+      </w:r>
+      <w:r>
+        <w:rPr>
+          <w:rStyle w:val="VerbatimChar"/>
+        </w:rPr>
+        <w:t xml:space="preserve">compute_run_metrics()</w:t>
+      </w:r>
+      <w:r>
+        <w:t xml:space="preserve"> </w:t>
+      </w:r>
+      <w:r>
+        <w:t xml:space="preserve">and its 2 helpers stay exactly as they were.</w:t>
+      </w:r>
+    </w:p>
+    <w:p>
+      <w:pPr>
+        <w:pStyle w:val="BodyText"/>
+      </w:pPr>
+      <w:r>
+        <w:rPr>
+          <w:rStyle w:val="VerbatimChar"/>
+        </w:rPr>
+        <w:t xml:space="preserve">stage6_noise_config.py</w:t>
+      </w:r>
+      <w:r>
+        <w:t xml:space="preserve"> </w:t>
+      </w:r>
+      <w:r>
+        <w:t xml:space="preserve">owns both</w:t>
+      </w:r>
+      <w:r>
+        <w:t xml:space="preserve"> </w:t>
+      </w:r>
+      <w:r>
+        <w:rPr>
+          <w:rStyle w:val="VerbatimChar"/>
+        </w:rPr>
+        <w:t xml:space="preserve">load_default_patterns()</w:t>
+      </w:r>
+      <w:r>
+        <w:t xml:space="preserve"> </w:t>
+      </w:r>
+      <w:r>
+        <w:t xml:space="preserve">(the bundled</w:t>
+      </w:r>
+      <w:r>
+        <w:t xml:space="preserve"> </w:t>
+      </w:r>
+      <w:r>
+        <w:rPr>
+          <w:rStyle w:val="VerbatimChar"/>
+        </w:rPr>
+        <w:t xml:space="preserve">default_noise_patterns.json</w:t>
+      </w:r>
+      <w:r>
+        <w:t xml:space="preserve"> </w:t>
+      </w:r>
+      <w:r>
+        <w:t xml:space="preserve">loader) and</w:t>
+      </w:r>
+      <w:r>
+        <w:t xml:space="preserve"> </w:t>
+      </w:r>
+      <w:r>
+        <w:rPr>
+          <w:rStyle w:val="VerbatimChar"/>
+        </w:rPr>
+        <w:t xml:space="preserve">configure(extra_config_path=None)</w:t>
+      </w:r>
+      <w:r>
+        <w:t xml:space="preserve">/</w:t>
+      </w:r>
+      <w:r>
+        <w:rPr>
+          <w:rStyle w:val="VerbatimChar"/>
+        </w:rPr>
+        <w:t xml:space="preserve">tag_defs()</w:t>
+      </w:r>
+      <w:r>
+        <w:t xml:space="preserve">: the</w:t>
+      </w:r>
+      <w:r>
+        <w:t xml:space="preserve"> </w:t>
+      </w:r>
+      <w:r>
+        <w:t xml:space="preserve">former resolves and stores the final patterns for the process (bundled defaults, always with an</w:t>
+      </w:r>
+      <w:r>
+        <w:t xml:space="preserve"> </w:t>
+      </w:r>
+      <w:r>
+        <w:t xml:space="preserve">empty</w:t>
+      </w:r>
+      <w:r>
+        <w:t xml:space="preserve"> </w:t>
+      </w:r>
+      <w:r>
+        <w:rPr>
+          <w:rStyle w:val="VerbatimChar"/>
+        </w:rPr>
+        <w:t xml:space="preserve">"other"</w:t>
+      </w:r>
+      <w:r>
+        <w:t xml:space="preserve"> </w:t>
+      </w:r>
+      <w:r>
+        <w:t xml:space="preserve">tag guaranteed present, optionally customized by a diff file); the latter returns</w:t>
+      </w:r>
+      <w:r>
+        <w:t xml:space="preserve"> </w:t>
+      </w:r>
+      <w:r>
+        <w:t xml:space="preserve">the current value, lazily configuring with no override on first use so any caller that never</w:t>
+      </w:r>
+      <w:r>
+        <w:t xml:space="preserve"> </w:t>
+      </w:r>
+      <w:r>
+        <w:t xml:space="preserve">touches</w:t>
+      </w:r>
+      <w:r>
+        <w:t xml:space="preserve"> </w:t>
+      </w:r>
+      <w:r>
+        <w:rPr>
+          <w:rStyle w:val="VerbatimChar"/>
+        </w:rPr>
+        <w:t xml:space="preserve">configure()</w:t>
+      </w:r>
+      <w:r>
+        <w:t xml:space="preserve"> </w:t>
+      </w:r>
+      <w:r>
+        <w:t xml:space="preserve">sees exactly the bundled defaults, unchanged. The diff file’s schema –</w:t>
+      </w:r>
+      <w:r>
+        <w:t xml:space="preserve"> </w:t>
+      </w:r>
+      <w:r>
+        <w:rPr>
+          <w:rStyle w:val="VerbatimChar"/>
+        </w:rPr>
+        <w:t xml:space="preserve">{"add": {tag: [substring, ...]}, "remove": {tag: [substring, ...]}, "disable": [tag, ...]}</w:t>
+      </w:r>
+      <w:r>
+        <w:t xml:space="preserve"> </w:t>
+      </w:r>
+      <w:r>
+        <w:t xml:space="preserve">–</w:t>
+      </w:r>
+      <w:r>
+        <w:t xml:space="preserve"> </w:t>
+      </w:r>
+      <w:r>
+        <w:t xml:space="preserve">always adds onto the bundled file, never replaces it: every tag not mentioned stays exactly as</w:t>
+      </w:r>
+      <w:r>
+        <w:t xml:space="preserve"> </w:t>
+      </w:r>
+      <w:r>
+        <w:t xml:space="preserve">shipped,</w:t>
+      </w:r>
+      <w:r>
+        <w:t xml:space="preserve"> </w:t>
+      </w:r>
+      <w:r>
+        <w:rPr>
+          <w:rStyle w:val="VerbatimChar"/>
+        </w:rPr>
+        <w:t xml:space="preserve">remove</w:t>
+      </w:r>
+      <w:r>
+        <w:t xml:space="preserve"> </w:t>
+      </w:r>
+      <w:r>
+        <w:t xml:space="preserve">strips only the named substrings (the rest of that tag’s own patterns survive),</w:t>
+      </w:r>
+      <w:r>
+        <w:t xml:space="preserve"> </w:t>
+      </w:r>
+      <w:r>
+        <w:t xml:space="preserve">and</w:t>
+      </w:r>
+      <w:r>
+        <w:t xml:space="preserve"> </w:t>
+      </w:r>
+      <w:r>
+        <w:rPr>
+          <w:rStyle w:val="VerbatimChar"/>
+        </w:rPr>
+        <w:t xml:space="preserve">disable</w:t>
+      </w:r>
+      <w:r>
+        <w:t xml:space="preserve"> </w:t>
+      </w:r>
+      <w:r>
+        <w:t xml:space="preserve">is the only way to lose a whole tag, and only that one.</w:t>
+      </w:r>
+      <w:r>
+        <w:t xml:space="preserve"> </w:t>
+      </w:r>
+      <w:r>
+        <w:rPr>
+          <w:rStyle w:val="VerbatimChar"/>
+        </w:rPr>
+        <w:t xml:space="preserve">disable</w:t>
+      </w:r>
+      <w:r>
+        <w:t xml:space="preserve"> </w:t>
+      </w:r>
+      <w:r>
+        <w:t xml:space="preserve">is resolved first</w:t>
+      </w:r>
+      <w:r>
+        <w:t xml:space="preserve"> </w:t>
+      </w:r>
+      <w:r>
+        <w:t xml:space="preserve">and always wins: any</w:t>
+      </w:r>
+      <w:r>
+        <w:t xml:space="preserve"> </w:t>
+      </w:r>
+      <w:r>
+        <w:rPr>
+          <w:rStyle w:val="VerbatimChar"/>
+        </w:rPr>
+        <w:t xml:space="preserve">add</w:t>
+      </w:r>
+      <w:r>
+        <w:t xml:space="preserve">/</w:t>
+      </w:r>
+      <w:r>
+        <w:rPr>
+          <w:rStyle w:val="VerbatimChar"/>
+        </w:rPr>
+        <w:t xml:space="preserve">remove</w:t>
+      </w:r>
+      <w:r>
+        <w:t xml:space="preserve"> </w:t>
+      </w:r>
+      <w:r>
+        <w:t xml:space="preserve">naming an already-disabled tag is silently ignored, not an</w:t>
+      </w:r>
+      <w:r>
+        <w:t xml:space="preserve"> </w:t>
+      </w:r>
+      <w:r>
+        <w:t xml:space="preserve">error.</w:t>
+      </w:r>
+      <w:r>
+        <w:t xml:space="preserve"> </w:t>
+      </w:r>
+      <w:r>
+        <w:rPr>
+          <w:rStyle w:val="VerbatimChar"/>
+        </w:rPr>
+        <w:t xml:space="preserve">add</w:t>
+      </w:r>
+      <w:r>
+        <w:t xml:space="preserve">/</w:t>
+      </w:r>
+      <w:r>
+        <w:rPr>
+          <w:rStyle w:val="VerbatimChar"/>
+        </w:rPr>
+        <w:t xml:space="preserve">remove</w:t>
+      </w:r>
+      <w:r>
+        <w:t xml:space="preserve"> </w:t>
+      </w:r>
+      <w:r>
+        <w:t xml:space="preserve">only ever touch a tag’s own</w:t>
+      </w:r>
+      <w:r>
+        <w:t xml:space="preserve"> </w:t>
+      </w:r>
+      <w:r>
+        <w:rPr>
+          <w:rStyle w:val="VerbatimChar"/>
+        </w:rPr>
+        <w:t xml:space="preserve">"substrings"</w:t>
+      </w:r>
+      <w:r>
+        <w:t xml:space="preserve"> </w:t>
+      </w:r>
+      <w:r>
+        <w:t xml:space="preserve">list (not prefixes/suffixes/</w:t>
+      </w:r>
+      <w:r>
+        <w:t xml:space="preserve"> </w:t>
+      </w:r>
+      <w:r>
+        <w:t xml:space="preserve">ancestor rules – those govern more structural matching behavior than a simple</w:t>
+      </w:r>
+      <w:r>
+        <w:t xml:space="preserve"> </w:t>
+      </w:r>
+      <w:r>
+        <w:t xml:space="preserve">“</w:t>
+      </w:r>
+      <w:r>
+        <w:t xml:space="preserve">does this text</w:t>
+      </w:r>
+      <w:r>
+        <w:t xml:space="preserve"> </w:t>
+      </w:r>
+      <w:r>
+        <w:t xml:space="preserve">appear</w:t>
+      </w:r>
+      <w:r>
+        <w:t xml:space="preserve">”</w:t>
+      </w:r>
+      <w:r>
+        <w:t xml:space="preserve"> </w:t>
+      </w:r>
+      <w:r>
+        <w:t xml:space="preserve">tweak needs), and only apply to</w:t>
+      </w:r>
+      <w:r>
+        <w:t xml:space="preserve"> </w:t>
+      </w:r>
+      <w:r>
+        <w:rPr>
+          <w:iCs/>
+          <w:i/>
+        </w:rPr>
+        <w:t xml:space="preserve">patterned</w:t>
+      </w:r>
+      <w:r>
+        <w:t xml:space="preserve"> </w:t>
+      </w:r>
+      <w:r>
+        <w:t xml:space="preserve">tags (self-scope matching) plus</w:t>
+      </w:r>
+      <w:r>
+        <w:t xml:space="preserve"> </w:t>
+      </w:r>
+      <w:r>
+        <w:rPr>
+          <w:rStyle w:val="VerbatimChar"/>
+        </w:rPr>
+        <w:t xml:space="preserve">"other"</w:t>
+      </w:r>
+      <w:r>
+        <w:t xml:space="preserve"> </w:t>
+      </w:r>
+      <w:r>
+        <w:t xml:space="preserve">–</w:t>
+      </w:r>
+      <w:r>
+        <w:t xml:space="preserve"> </w:t>
+      </w:r>
+      <w:r>
+        <w:t xml:space="preserve">targeting a purely derived tag like</w:t>
+      </w:r>
+      <w:r>
+        <w:t xml:space="preserve"> </w:t>
+      </w:r>
+      <w:r>
+        <w:rPr>
+          <w:rStyle w:val="VerbatimChar"/>
+        </w:rPr>
+        <w:t xml:space="preserve">wrapper_branch_noise</w:t>
+      </w:r>
+      <w:r>
+        <w:t xml:space="preserve"> </w:t>
+      </w:r>
+      <w:r>
+        <w:t xml:space="preserve">(no patterns of its own, only a</w:t>
+      </w:r>
+      <w:r>
+        <w:t xml:space="preserve"> </w:t>
+      </w:r>
+      <w:r>
+        <w:rPr>
+          <w:rStyle w:val="VerbatimChar"/>
+        </w:rPr>
+        <w:t xml:space="preserve">sibling_group_source_tag</w:t>
+      </w:r>
+      <w:r>
+        <w:t xml:space="preserve">) with</w:t>
+      </w:r>
+      <w:r>
+        <w:t xml:space="preserve"> </w:t>
+      </w:r>
+      <w:r>
+        <w:rPr>
+          <w:rStyle w:val="VerbatimChar"/>
+        </w:rPr>
+        <w:t xml:space="preserve">add</w:t>
+      </w:r>
+      <w:r>
+        <w:t xml:space="preserve">/</w:t>
+      </w:r>
+      <w:r>
+        <w:rPr>
+          <w:rStyle w:val="VerbatimChar"/>
+        </w:rPr>
+        <w:t xml:space="preserve">remove</w:t>
+      </w:r>
+      <w:r>
+        <w:t xml:space="preserve"> </w:t>
+      </w:r>
+      <w:r>
+        <w:t xml:space="preserve">raises</w:t>
+      </w:r>
+      <w:r>
+        <w:t xml:space="preserve"> </w:t>
+      </w:r>
+      <w:r>
+        <w:rPr>
+          <w:rStyle w:val="VerbatimChar"/>
+        </w:rPr>
+        <w:t xml:space="preserve">SystemExit</w:t>
+      </w:r>
+      <w:r>
+        <w:t xml:space="preserve">, though</w:t>
+      </w:r>
+      <w:r>
+        <w:t xml:space="preserve"> </w:t>
+      </w:r>
+      <w:r>
+        <w:rPr>
+          <w:rStyle w:val="VerbatimChar"/>
+        </w:rPr>
+        <w:t xml:space="preserve">disable</w:t>
+      </w:r>
+      <w:r>
+        <w:t xml:space="preserve"> </w:t>
+      </w:r>
+      <w:r>
+        <w:t xml:space="preserve">on it still</w:t>
+      </w:r>
+      <w:r>
+        <w:t xml:space="preserve"> </w:t>
+      </w:r>
+      <w:r>
+        <w:t xml:space="preserve">works. An unknown tag name anywhere raises</w:t>
+      </w:r>
+      <w:r>
+        <w:t xml:space="preserve"> </w:t>
+      </w:r>
+      <w:r>
+        <w:rPr>
+          <w:rStyle w:val="VerbatimChar"/>
+        </w:rPr>
+        <w:t xml:space="preserve">SystemExit</w:t>
+      </w:r>
+      <w:r>
+        <w:t xml:space="preserve"> </w:t>
+      </w:r>
+      <w:r>
+        <w:t xml:space="preserve">too.</w:t>
+      </w:r>
+    </w:p>
+    <w:p>
+      <w:pPr>
+        <w:pStyle w:val="BodyText"/>
+      </w:pPr>
+      <w:r>
+        <w:rPr>
+          <w:bCs/>
+          <w:b/>
+        </w:rPr>
+        <w:t xml:space="preserve">A real, pre-existing case-sensitivity gap surfaced while smoke-testing on real data, not</w:t>
+      </w:r>
+      <w:r>
+        <w:rPr>
+          <w:bCs/>
+          <w:b/>
+        </w:rPr>
+        <w:t xml:space="preserve"> </w:t>
+      </w:r>
+      <w:r>
+        <w:rPr>
+          <w:bCs/>
+          <w:b/>
+        </w:rPr>
+        <w:t xml:space="preserve">something this plan introduced.</w:t>
+      </w:r>
+      <w:r>
+        <w:t xml:space="preserve"> </w:t>
+      </w:r>
+      <w:r>
+        <w:rPr>
+          <w:rStyle w:val="VerbatimChar"/>
+        </w:rPr>
+        <w:t xml:space="preserve">stage3_rocprofsys._label_matches()</w:t>
+      </w:r>
+      <w:r>
+        <w:t xml:space="preserve"> </w:t>
+      </w:r>
+      <w:r>
+        <w:t xml:space="preserve">lowercases a row’s own</w:t>
+      </w:r>
+      <w:r>
+        <w:t xml:space="preserve"> </w:t>
+      </w:r>
+      <w:r>
+        <w:t xml:space="preserve">label before comparing, but never lowercases the pattern side – harmless as long as every pattern</w:t>
+      </w:r>
+      <w:r>
+        <w:t xml:space="preserve"> </w:t>
+      </w:r>
+      <w:r>
+        <w:t xml:space="preserve">in</w:t>
+      </w:r>
+      <w:r>
+        <w:t xml:space="preserve"> </w:t>
+      </w:r>
+      <w:r>
+        <w:rPr>
+          <w:rStyle w:val="VerbatimChar"/>
+        </w:rPr>
+        <w:t xml:space="preserve">default_noise_patterns.json</w:t>
+      </w:r>
+      <w:r>
+        <w:t xml:space="preserve"> </w:t>
+      </w:r>
+      <w:r>
+        <w:t xml:space="preserve">happens to already be lowercase (true today, by unstated</w:t>
+      </w:r>
+      <w:r>
+        <w:t xml:space="preserve"> </w:t>
+      </w:r>
+      <w:r>
+        <w:t xml:space="preserve">convention), but a real footgun the moment a user types a mixed-case substring into their own</w:t>
+      </w:r>
+      <w:r>
+        <w:t xml:space="preserve"> </w:t>
+      </w:r>
+      <w:r>
+        <w:rPr>
+          <w:rStyle w:val="VerbatimChar"/>
+        </w:rPr>
+        <w:t xml:space="preserve">--extra-noise-config</w:t>
+      </w:r>
+      <w:r>
+        <w:t xml:space="preserve"> </w:t>
+      </w:r>
+      <w:r>
+        <w:t xml:space="preserve">file (confirmed directly: adding</w:t>
+      </w:r>
+      <w:r>
+        <w:t xml:space="preserve"> </w:t>
+      </w:r>
+      <w:r>
+        <w:rPr>
+          <w:rStyle w:val="VerbatimChar"/>
+        </w:rPr>
+        <w:t xml:space="preserve">"PMPI_Allreduce"</w:t>
+      </w:r>
+      <w:r>
+        <w:t xml:space="preserve"> </w:t>
+      </w:r>
+      <w:r>
+        <w:t xml:space="preserve">to</w:t>
+      </w:r>
+      <w:r>
+        <w:t xml:space="preserve"> </w:t>
+      </w:r>
+      <w:r>
+        <w:rPr>
+          <w:rStyle w:val="VerbatimChar"/>
+        </w:rPr>
+        <w:t xml:space="preserve">"other"</w:t>
+      </w:r>
+      <w:r>
+        <w:t xml:space="preserve"> </w:t>
+      </w:r>
+      <w:r>
+        <w:t xml:space="preserve">silently</w:t>
+      </w:r>
+      <w:r>
+        <w:t xml:space="preserve"> </w:t>
+      </w:r>
+      <w:r>
+        <w:t xml:space="preserve">matched nothing against real test_apps data, since the row’s own label lowercases to</w:t>
+      </w:r>
+      <w:r>
+        <w:t xml:space="preserve"> </w:t>
+      </w:r>
+      <w:r>
+        <w:rPr>
+          <w:rStyle w:val="VerbatimChar"/>
+        </w:rPr>
+        <w:t xml:space="preserve">"pmpi_allreduce"</w:t>
+      </w:r>
+      <w:r>
+        <w:t xml:space="preserve"> </w:t>
+      </w:r>
+      <w:r>
+        <w:t xml:space="preserve">first). Fixed in</w:t>
+      </w:r>
+      <w:r>
+        <w:t xml:space="preserve"> </w:t>
+      </w:r>
+      <w:r>
+        <w:rPr>
+          <w:rStyle w:val="VerbatimChar"/>
+        </w:rPr>
+        <w:t xml:space="preserve">stage6_noise_config._apply_diff()</w:t>
+      </w:r>
+      <w:r>
+        <w:t xml:space="preserve">: every</w:t>
+      </w:r>
+      <w:r>
+        <w:t xml:space="preserve"> </w:t>
+      </w:r>
+      <w:r>
+        <w:rPr>
+          <w:rStyle w:val="VerbatimChar"/>
+        </w:rPr>
+        <w:t xml:space="preserve">add</w:t>
+      </w:r>
+      <w:r>
+        <w:t xml:space="preserve">/</w:t>
+      </w:r>
+      <w:r>
+        <w:rPr>
+          <w:rStyle w:val="VerbatimChar"/>
+        </w:rPr>
+        <w:t xml:space="preserve">remove</w:t>
+      </w:r>
+      <w:r>
+        <w:t xml:space="preserve"> </w:t>
+      </w:r>
+      <w:r>
+        <w:t xml:space="preserve">substring is lowercased before being stored, matching the bundled file’s own existing convention</w:t>
+      </w:r>
+      <w:r>
+        <w:t xml:space="preserve"> </w:t>
+      </w:r>
+      <w:r>
+        <w:t xml:space="preserve">rather than relying on the user to know about it.</w:t>
+      </w:r>
+    </w:p>
+    <w:p>
+      <w:pPr>
+        <w:pStyle w:val="BodyText"/>
+      </w:pPr>
+      <w:r>
+        <w:rPr>
+          <w:rStyle w:val="VerbatimChar"/>
+        </w:rPr>
+        <w:t xml:space="preserve">"other"</w:t>
+      </w:r>
+      <w:r>
+        <w:t xml:space="preserve">’s own default treatment –</w:t>
+      </w:r>
+      <w:r>
+        <w:t xml:space="preserve"> </w:t>
+      </w:r>
+      <w:r>
+        <w:t xml:space="preserve">“</w:t>
+      </w:r>
+      <w:r>
+        <w:t xml:space="preserve">splice (with fold) everywhere unless a tool overrides it,</w:t>
+      </w:r>
+      <w:r>
+        <w:t xml:space="preserve">”</w:t>
+      </w:r>
+      <w:r>
+        <w:t xml:space="preserve"> </w:t>
+      </w:r>
+      <w:r>
+        <w:t xml:space="preserve">per the original design – follows the same per-tool split</w:t>
+      </w:r>
+      <w:r>
+        <w:t xml:space="preserve"> </w:t>
+      </w:r>
+      <w:r>
+        <w:rPr>
+          <w:rStyle w:val="VerbatimChar"/>
+        </w:rPr>
+        <w:t xml:space="preserve">wrapper_noise</w:t>
+      </w:r>
+      <w:r>
+        <w:t xml:space="preserve"> </w:t>
+      </w:r>
+      <w:r>
+        <w:t xml:space="preserve">already has, since both</w:t>
+      </w:r>
+      <w:r>
+        <w:t xml:space="preserve"> </w:t>
+      </w:r>
+      <w:r>
+        <w:t xml:space="preserve">tags flow through the exact same</w:t>
+      </w:r>
+      <w:r>
+        <w:t xml:space="preserve"> </w:t>
+      </w:r>
+      <w:r>
+        <w:rPr>
+          <w:rStyle w:val="VerbatimChar"/>
+        </w:rPr>
+        <w:t xml:space="preserve">tag_rows()</w:t>
+      </w:r>
+      <w:r>
+        <w:t xml:space="preserve">/</w:t>
+      </w:r>
+      <w:r>
+        <w:rPr>
+          <w:rStyle w:val="VerbatimChar"/>
+        </w:rPr>
+        <w:t xml:space="preserve">splice_by_tag()</w:t>
+      </w:r>
+      <w:r>
+        <w:t xml:space="preserve"> </w:t>
+      </w:r>
+      <w:r>
+        <w:t xml:space="preserve">machinery with no new parameter</w:t>
+      </w:r>
+      <w:r>
+        <w:t xml:space="preserve"> </w:t>
+      </w:r>
+      <w:r>
+        <w:t xml:space="preserve">needed anywhere:</w:t>
+      </w:r>
+      <w:r>
+        <w:t xml:space="preserve"> </w:t>
+      </w:r>
+      <w:r>
+        <w:rPr>
+          <w:rStyle w:val="VerbatimChar"/>
+        </w:rPr>
+        <w:t xml:space="preserve">stage4_rocprofsys_flat.scan_ranks()</w:t>
+      </w:r>
+      <w:r>
+        <w:t xml:space="preserve"> </w:t>
+      </w:r>
+      <w:r>
+        <w:t xml:space="preserve">(flat merge-by-label; feeds CPU hotspots,</w:t>
+      </w:r>
+      <w:r>
+        <w:t xml:space="preserve"> </w:t>
+      </w:r>
+      <w:r>
+        <w:t xml:space="preserve">combined hotspots, pop_metrics,</w:t>
+      </w:r>
+      <w:r>
+        <w:t xml:space="preserve"> </w:t>
+      </w:r>
+      <w:r>
+        <w:rPr>
+          <w:rStyle w:val="VerbatimChar"/>
+        </w:rPr>
+        <w:t xml:space="preserve">select_hotspot_functions.py</w:t>
+      </w:r>
+      <w:r>
+        <w:t xml:space="preserve">) drops</w:t>
+      </w:r>
+      <w:r>
+        <w:t xml:space="preserve"> </w:t>
+      </w:r>
+      <w:r>
+        <w:rPr>
+          <w:rStyle w:val="VerbatimChar"/>
+        </w:rPr>
+        <w:t xml:space="preserve">other</w:t>
+      </w:r>
+      <w:r>
+        <w:t xml:space="preserve">-tagged rows entirely,</w:t>
+      </w:r>
+      <w:r>
+        <w:t xml:space="preserve"> </w:t>
+      </w:r>
+      <w:r>
+        <w:t xml:space="preserve">the same as</w:t>
+      </w:r>
+      <w:r>
+        <w:t xml:space="preserve"> </w:t>
+      </w:r>
+      <w:r>
+        <w:rPr>
+          <w:rStyle w:val="VerbatimChar"/>
+        </w:rPr>
+        <w:t xml:space="preserve">wrapper_noise</w:t>
+      </w:r>
+      <w:r>
+        <w:t xml:space="preserve">/</w:t>
+      </w:r>
+      <w:r>
+        <w:rPr>
+          <w:rStyle w:val="VerbatimChar"/>
+        </w:rPr>
+        <w:t xml:space="preserve">compiler_runtime_noise</w:t>
+      </w:r>
+      <w:r>
+        <w:t xml:space="preserve"> </w:t>
+      </w:r>
+      <w:r>
+        <w:t xml:space="preserve">already are, since there’s no tree left to</w:t>
+      </w:r>
+      <w:r>
+        <w:t xml:space="preserve"> </w:t>
+      </w:r>
+      <w:r>
+        <w:t xml:space="preserve">splice into by this point.</w:t>
+      </w:r>
+      <w:r>
+        <w:t xml:space="preserve"> </w:t>
+      </w:r>
+      <w:r>
+        <w:rPr>
+          <w:rStyle w:val="VerbatimChar"/>
+        </w:rPr>
+        <w:t xml:space="preserve">stage5_calltree_view.strip_wrapper_noise()</w:t>
+      </w:r>
+      <w:r>
+        <w:t xml:space="preserve"> </w:t>
+      </w:r>
+      <w:r>
+        <w:t xml:space="preserve">(sampling calltree’s</w:t>
+      </w:r>
+      <w:r>
+        <w:t xml:space="preserve"> </w:t>
+      </w:r>
+      <w:r>
+        <w:t xml:space="preserve">postprocess hook) gained one more line, splicing</w:t>
+      </w:r>
+      <w:r>
+        <w:t xml:space="preserve"> </w:t>
+      </w:r>
+      <w:r>
+        <w:rPr>
+          <w:rStyle w:val="VerbatimChar"/>
+        </w:rPr>
+        <w:t xml:space="preserve">other</w:t>
+      </w:r>
+      <w:r>
+        <w:t xml:space="preserve"> </w:t>
+      </w:r>
+      <w:r>
+        <w:t xml:space="preserve">with</w:t>
+      </w:r>
+      <w:r>
+        <w:t xml:space="preserve"> </w:t>
+      </w:r>
+      <w:r>
+        <w:rPr>
+          <w:rStyle w:val="VerbatimChar"/>
+        </w:rPr>
+        <w:t xml:space="preserve">fold=True</w:t>
+      </w:r>
+      <w:r>
+        <w:t xml:space="preserve"> </w:t>
+      </w:r>
+      <w:r>
+        <w:t xml:space="preserve">right after its existing</w:t>
+      </w:r>
+      <w:r>
+        <w:t xml:space="preserve"> </w:t>
+      </w:r>
+      <w:r>
+        <w:rPr>
+          <w:rStyle w:val="VerbatimChar"/>
+        </w:rPr>
+        <w:t xml:space="preserve">wrapper_noise</w:t>
+      </w:r>
+      <w:r>
+        <w:t xml:space="preserve"> </w:t>
+      </w:r>
+      <w:r>
+        <w:t xml:space="preserve">splice (</w:t>
+      </w:r>
+      <w:r>
+        <w:rPr>
+          <w:rStyle w:val="VerbatimChar"/>
+        </w:rPr>
+        <w:t xml:space="preserve">fold=False</w:t>
+      </w:r>
+      <w:r>
+        <w:t xml:space="preserve">) –</w:t>
+      </w:r>
+      <w:r>
+        <w:t xml:space="preserve"> </w:t>
+      </w:r>
+      <w:r>
+        <w:rPr>
+          <w:rStyle w:val="VerbatimChar"/>
+        </w:rPr>
+        <w:t xml:space="preserve">other</w:t>
+      </w:r>
+      <w:r>
+        <w:t xml:space="preserve">’s own default is fold, distinct from</w:t>
+      </w:r>
+      <w:r>
+        <w:t xml:space="preserve"> </w:t>
+      </w:r>
+      <w:r>
+        <w:rPr>
+          <w:rStyle w:val="VerbatimChar"/>
+        </w:rPr>
+        <w:t xml:space="preserve">wrapper_noise</w:t>
+      </w:r>
+      <w:r>
+        <w:t xml:space="preserve">’s discard.</w:t>
+      </w:r>
+      <w:r>
+        <w:t xml:space="preserve"> </w:t>
+      </w:r>
+      <w:r>
+        <w:rPr>
+          <w:rStyle w:val="VerbatimChar"/>
+        </w:rPr>
+        <w:t xml:space="preserve">stage5_calltree_traced_view.py</w:t>
+      </w:r>
+      <w:r>
+        <w:t xml:space="preserve"> </w:t>
+      </w:r>
+      <w:r>
+        <w:t xml:space="preserve">had no postprocess hook of any kind</w:t>
+      </w:r>
+      <w:r>
+        <w:t xml:space="preserve"> </w:t>
+      </w:r>
+      <w:r>
+        <w:t xml:space="preserve">before this (no wrapper-noise handling exists there, out of scope to add) – gained a minimal new</w:t>
+      </w:r>
+      <w:r>
+        <w:t xml:space="preserve"> </w:t>
+      </w:r>
+      <w:r>
+        <w:rPr>
+          <w:rStyle w:val="VerbatimChar"/>
+        </w:rPr>
+        <w:t xml:space="preserve">_splice_other()</w:t>
+      </w:r>
+      <w:r>
+        <w:t xml:space="preserve"> </w:t>
+      </w:r>
+      <w:r>
+        <w:t xml:space="preserve">doing exactly the one</w:t>
+      </w:r>
+      <w:r>
+        <w:t xml:space="preserve"> </w:t>
+      </w:r>
+      <w:r>
+        <w:rPr>
+          <w:rStyle w:val="VerbatimChar"/>
+        </w:rPr>
+        <w:t xml:space="preserve">splice_by_tag(rows, "other", fold=True)</w:t>
+      </w:r>
+      <w:r>
+        <w:t xml:space="preserve"> </w:t>
+      </w:r>
+      <w:r>
+        <w:t xml:space="preserve">call, so</w:t>
+      </w:r>
+      <w:r>
+        <w:t xml:space="preserve"> </w:t>
+      </w:r>
+      <w:r>
+        <w:rPr>
+          <w:rStyle w:val="VerbatimChar"/>
+        </w:rPr>
+        <w:t xml:space="preserve">"other"</w:t>
+      </w:r>
+      <w:r>
+        <w:t xml:space="preserve"> </w:t>
+      </w:r>
+      <w:r>
+        <w:t xml:space="preserve">support lands</w:t>
+      </w:r>
+      <w:r>
+        <w:t xml:space="preserve"> </w:t>
+      </w:r>
+      <w:r>
+        <w:t xml:space="preserve">“</w:t>
+      </w:r>
+      <w:r>
+        <w:t xml:space="preserve">everywhere</w:t>
+      </w:r>
+      <w:r>
+        <w:t xml:space="preserve">”</w:t>
+      </w:r>
+      <w:r>
+        <w:t xml:space="preserve"> </w:t>
+      </w:r>
+      <w:r>
+        <w:t xml:space="preserve">as the design states without introducing unrelated handling this tool</w:t>
+      </w:r>
+      <w:r>
+        <w:t xml:space="preserve"> </w:t>
+      </w:r>
+      <w:r>
+        <w:t xml:space="preserve">never had.</w:t>
+      </w:r>
+    </w:p>
+    <w:p>
+      <w:pPr>
+        <w:pStyle w:val="BodyText"/>
+      </w:pPr>
+      <w:r>
+        <w:rPr>
+          <w:bCs/>
+          <w:b/>
+        </w:rPr>
+        <w:t xml:space="preserve">CLI wiring</w:t>
+      </w:r>
+      <w:r>
+        <w:t xml:space="preserve">: every tool whose output depends on CPU-side tagging gained</w:t>
+      </w:r>
+      <w:r>
+        <w:t xml:space="preserve"> </w:t>
+      </w:r>
+      <w:r>
+        <w:rPr>
+          <w:rStyle w:val="VerbatimChar"/>
+        </w:rPr>
+        <w:t xml:space="preserve">--extra-noise-config</w:t>
+      </w:r>
+      <w:r>
+        <w:t xml:space="preserve"> </w:t>
+      </w:r>
+      <w:r>
+        <w:t xml:space="preserve">(falling back to</w:t>
+      </w:r>
+      <w:r>
+        <w:t xml:space="preserve"> </w:t>
+      </w:r>
+      <w:r>
+        <w:rPr>
+          <w:rStyle w:val="VerbatimChar"/>
+        </w:rPr>
+        <w:t xml:space="preserve">$FRIENDLY_ROCPROF_NOISE_CONFIG</w:t>
+      </w:r>
+      <w:r>
+        <w:t xml:space="preserve">) –</w:t>
+      </w:r>
+      <w:r>
+        <w:t xml:space="preserve"> </w:t>
+      </w:r>
+      <w:r>
+        <w:rPr>
+          <w:rStyle w:val="VerbatimChar"/>
+        </w:rPr>
+        <w:t xml:space="preserve">extract_CPU_hotspots.py</w:t>
+      </w:r>
+      <w:r>
+        <w:t xml:space="preserve">,</w:t>
+      </w:r>
+      <w:r>
+        <w:t xml:space="preserve"> </w:t>
+      </w:r>
+      <w:r>
+        <w:rPr>
+          <w:rStyle w:val="VerbatimChar"/>
+        </w:rPr>
+        <w:t xml:space="preserve">extract_hotspots.py</w:t>
+      </w:r>
+      <w:r>
+        <w:t xml:space="preserve">,</w:t>
+      </w:r>
+      <w:r>
+        <w:t xml:space="preserve"> </w:t>
+      </w:r>
+      <w:r>
+        <w:rPr>
+          <w:rStyle w:val="VerbatimChar"/>
+        </w:rPr>
+        <w:t xml:space="preserve">extract_calltree.py</w:t>
+      </w:r>
+      <w:r>
+        <w:t xml:space="preserve">,</w:t>
+      </w:r>
+      <w:r>
+        <w:t xml:space="preserve"> </w:t>
+      </w:r>
+      <w:r>
+        <w:rPr>
+          <w:rStyle w:val="VerbatimChar"/>
+        </w:rPr>
+        <w:t xml:space="preserve">extract_calltree_traced.py</w:t>
+      </w:r>
+      <w:r>
+        <w:t xml:space="preserve">,</w:t>
+      </w:r>
+      <w:r>
+        <w:t xml:space="preserve"> </w:t>
+      </w:r>
+      <w:r>
+        <w:rPr>
+          <w:rStyle w:val="VerbatimChar"/>
+        </w:rPr>
+        <w:t xml:space="preserve">extract_pop_metrics.py</w:t>
+      </w:r>
+      <w:r>
+        <w:t xml:space="preserve">, and</w:t>
+      </w:r>
+      <w:r>
+        <w:t xml:space="preserve"> </w:t>
+      </w:r>
+      <w:r>
+        <w:rPr>
+          <w:rStyle w:val="VerbatimChar"/>
+        </w:rPr>
+        <w:t xml:space="preserve">select_hotspot_functions.py</w:t>
+      </w:r>
+      <w:r>
+        <w:t xml:space="preserve">’s</w:t>
+      </w:r>
+      <w:r>
+        <w:t xml:space="preserve"> </w:t>
+      </w:r>
+      <w:r>
+        <w:rPr>
+          <w:rStyle w:val="VerbatimChar"/>
+        </w:rPr>
+        <w:t xml:space="preserve">--output-dir</w:t>
+      </w:r>
+      <w:r>
+        <w:t xml:space="preserve"> </w:t>
+      </w:r>
+      <w:r>
+        <w:t xml:space="preserve">mode (its</w:t>
+      </w:r>
+      <w:r>
+        <w:t xml:space="preserve"> </w:t>
+      </w:r>
+      <w:r>
+        <w:rPr>
+          <w:rStyle w:val="VerbatimChar"/>
+        </w:rPr>
+        <w:t xml:space="preserve">--report</w:t>
+      </w:r>
+      <w:r>
+        <w:t xml:space="preserve"> </w:t>
+      </w:r>
+      <w:r>
+        <w:t xml:space="preserve">mode reads an already-rendered, already-tagged report file, so combining it with</w:t>
+      </w:r>
+      <w:r>
+        <w:t xml:space="preserve"> </w:t>
+      </w:r>
+      <w:r>
+        <w:rPr>
+          <w:rStyle w:val="VerbatimChar"/>
+        </w:rPr>
+        <w:t xml:space="preserve">--extra-noise-config</w:t>
+      </w:r>
+      <w:r>
+        <w:t xml:space="preserve"> </w:t>
+      </w:r>
+      <w:r>
+        <w:t xml:space="preserve">now raises a clear error, the same mutually-exclusive-group convention this</w:t>
+      </w:r>
+      <w:r>
+        <w:t xml:space="preserve"> </w:t>
+      </w:r>
+      <w:r>
+        <w:t xml:space="preserve">tool already used for</w:t>
+      </w:r>
+      <w:r>
+        <w:t xml:space="preserve"> </w:t>
+      </w:r>
+      <w:r>
+        <w:rPr>
+          <w:rStyle w:val="VerbatimChar"/>
+        </w:rPr>
+        <w:t xml:space="preserve">--report</w:t>
+      </w:r>
+      <w:r>
+        <w:t xml:space="preserve">/</w:t>
+      </w:r>
+      <w:r>
+        <w:rPr>
+          <w:rStyle w:val="VerbatimChar"/>
+        </w:rPr>
+        <w:t xml:space="preserve">--output-dir</w:t>
+      </w:r>
+      <w:r>
+        <w:t xml:space="preserve"> </w:t>
+      </w:r>
+      <w:r>
+        <w:t xml:space="preserve">itself).</w:t>
+      </w:r>
+      <w:r>
+        <w:t xml:space="preserve"> </w:t>
+      </w:r>
+      <w:r>
+        <w:rPr>
+          <w:rStyle w:val="VerbatimChar"/>
+        </w:rPr>
+        <w:t xml:space="preserve">select_hotspot_kernels.py</w:t>
+      </w:r>
+      <w:r>
+        <w:t xml:space="preserve"> </w:t>
+      </w:r>
+      <w:r>
+        <w:t xml:space="preserve">and</w:t>
+      </w:r>
+      <w:r>
+        <w:t xml:space="preserve"> </w:t>
+      </w:r>
+      <w:r>
+        <w:rPr>
+          <w:rStyle w:val="VerbatimChar"/>
+        </w:rPr>
+        <w:t xml:space="preserve">extract_GPU_hotspots.py</w:t>
+      </w:r>
+      <w:r>
+        <w:t xml:space="preserve"> </w:t>
+      </w:r>
+      <w:r>
+        <w:t xml:space="preserve">are untouched – neither ever imported</w:t>
+      </w:r>
+      <w:r>
+        <w:t xml:space="preserve"> </w:t>
+      </w:r>
+      <w:r>
+        <w:rPr>
+          <w:rStyle w:val="VerbatimChar"/>
+        </w:rPr>
+        <w:t xml:space="preserve">stage3_rocprofsys</w:t>
+      </w:r>
+      <w:r>
+        <w:t xml:space="preserve"> </w:t>
+      </w:r>
+      <w:r>
+        <w:t xml:space="preserve">(GPU kernel</w:t>
+      </w:r>
+      <w:r>
+        <w:t xml:space="preserve"> </w:t>
+      </w:r>
+      <w:r>
+        <w:t xml:space="preserve">data has no CPU-side noise classification to tune). Each</w:t>
+      </w:r>
+      <w:r>
+        <w:t xml:space="preserve"> </w:t>
+      </w:r>
+      <w:r>
+        <w:rPr>
+          <w:rStyle w:val="VerbatimChar"/>
+        </w:rPr>
+        <w:t xml:space="preserve">main()</w:t>
+      </w:r>
+      <w:r>
+        <w:t xml:space="preserve">’s integration is exactly two</w:t>
+      </w:r>
+      <w:r>
+        <w:t xml:space="preserve"> </w:t>
+      </w:r>
+      <w:r>
+        <w:t xml:space="preserve">lines: parse the flag, then call</w:t>
+      </w:r>
+      <w:r>
+        <w:t xml:space="preserve"> </w:t>
+      </w:r>
+      <w:r>
+        <w:rPr>
+          <w:rStyle w:val="VerbatimChar"/>
+        </w:rPr>
+        <w:t xml:space="preserve">stage6_noise_config.configure(...)</w:t>
+      </w:r>
+      <w:r>
+        <w:t xml:space="preserve"> </w:t>
+      </w:r>
+      <w:r>
+        <w:t xml:space="preserve">once before doing any real</w:t>
+      </w:r>
+      <w:r>
+        <w:t xml:space="preserve"> </w:t>
+      </w:r>
+      <w:r>
+        <w:t xml:space="preserve">work –</w:t>
+      </w:r>
+      <w:r>
+        <w:t xml:space="preserve"> </w:t>
+      </w:r>
+      <w:r>
+        <w:rPr>
+          <w:rStyle w:val="VerbatimChar"/>
+        </w:rPr>
+        <w:t xml:space="preserve">write_report()</w:t>
+      </w:r>
+      <w:r>
+        <w:t xml:space="preserve">/</w:t>
+      </w:r>
+      <w:r>
+        <w:rPr>
+          <w:rStyle w:val="VerbatimChar"/>
+        </w:rPr>
+        <w:t xml:space="preserve">labels_from_output_dir()</w:t>
+      </w:r>
+      <w:r>
+        <w:t xml:space="preserve"> </w:t>
+      </w:r>
+      <w:r>
+        <w:t xml:space="preserve">and everything they call needed zero changes.</w:t>
+      </w:r>
+    </w:p>
+    <w:p>
+      <w:pPr>
+        <w:pStyle w:val="BodyText"/>
+      </w:pPr>
+      <w:r>
+        <w:t xml:space="preserve">Test rework: of 449 existing tests, zero broke (the parameter-threading pivot meant every existing</w:t>
+      </w:r>
+      <w:r>
+        <w:t xml:space="preserve"> </w:t>
+      </w:r>
+      <w:r>
+        <w:t xml:space="preserve">signature was untouched) – purely additive coverage: new</w:t>
+      </w:r>
+      <w:r>
+        <w:t xml:space="preserve"> </w:t>
+      </w:r>
+      <w:r>
+        <w:rPr>
+          <w:rStyle w:val="VerbatimChar"/>
+        </w:rPr>
+        <w:t xml:space="preserve">test_stage6_noise_config.py</w:t>
+      </w:r>
+      <w:r>
+        <w:t xml:space="preserve"> </w:t>
+      </w:r>
+      <w:r>
+        <w:t xml:space="preserve">(</w:t>
+      </w:r>
+      <w:r>
+        <w:rPr>
+          <w:rStyle w:val="VerbatimChar"/>
+        </w:rPr>
+        <w:t xml:space="preserve">configure()</w:t>
+      </w:r>
+      <w:r>
+        <w:t xml:space="preserve">/</w:t>
+      </w:r>
+      <w:r>
+        <w:rPr>
+          <w:rStyle w:val="VerbatimChar"/>
+        </w:rPr>
+        <w:t xml:space="preserve">tag_defs()</w:t>
+      </w:r>
+      <w:r>
+        <w:t xml:space="preserve">‘</w:t>
+      </w:r>
+      <w:r>
+        <w:t xml:space="preserve">s full add/remove/disable/unknown-tag/derived-tag-rejection/</w:t>
+      </w:r>
+      <w:r>
+        <w:t xml:space="preserve"> </w:t>
+      </w:r>
+      <w:r>
+        <w:t xml:space="preserve">re-configure-replaces-not-merges matrix, plus the case-lowercasing fix), one new</w:t>
+      </w:r>
+      <w:r>
+        <w:t xml:space="preserve"> </w:t>
+      </w:r>
+      <w:r>
+        <w:rPr>
+          <w:rStyle w:val="VerbatimChar"/>
+        </w:rPr>
+        <w:t xml:space="preserve">tag_rows()</w:t>
+      </w:r>
+      <w:r>
+        <w:t xml:space="preserve">-fallback test in</w:t>
+      </w:r>
+      <w:r>
+        <w:t xml:space="preserve"> </w:t>
+      </w:r>
+      <w:r>
+        <w:rPr>
+          <w:rStyle w:val="VerbatimChar"/>
+        </w:rPr>
+        <w:t xml:space="preserve">test_stage3_rocprofsys.py</w:t>
+      </w:r>
+      <w:r>
+        <w:t xml:space="preserve">, one</w:t>
+      </w:r>
+      <w:r>
+        <w:t xml:space="preserve"> </w:t>
+      </w:r>
+      <w:r>
+        <w:rPr>
+          <w:rStyle w:val="VerbatimChar"/>
+        </w:rPr>
+        <w:t xml:space="preserve">"other"</w:t>
+      </w:r>
+      <w:r>
+        <w:t xml:space="preserve">-tag end-to-end test each</w:t>
+      </w:r>
+      <w:r>
+        <w:t xml:space="preserve"> </w:t>
+      </w:r>
+      <w:r>
+        <w:t xml:space="preserve">in</w:t>
+      </w:r>
+      <w:r>
+        <w:t xml:space="preserve"> </w:t>
+      </w:r>
+      <w:r>
+        <w:rPr>
+          <w:rStyle w:val="VerbatimChar"/>
+        </w:rPr>
+        <w:t xml:space="preserve">stage4_rocprofsys_flat.py</w:t>
+      </w:r>
+      <w:r>
+        <w:t xml:space="preserve">’s and both calltree view modules</w:t>
+      </w:r>
+      <w:r>
+        <w:t xml:space="preserve">’</w:t>
+      </w:r>
+      <w:r>
+        <w:t xml:space="preserve"> </w:t>
+      </w:r>
+      <w:r>
+        <w:t xml:space="preserve">test files (a configured pattern</w:t>
+      </w:r>
+      <w:r>
+        <w:t xml:space="preserve"> </w:t>
+      </w:r>
+      <w:r>
+        <w:t xml:space="preserve">reaches that tool’s own treatment, dropped or spliced+folded as appropriate), and</w:t>
+      </w:r>
+      <w:r>
+        <w:t xml:space="preserve"> </w:t>
+      </w:r>
+      <w:r>
+        <w:rPr>
+          <w:rStyle w:val="VerbatimChar"/>
+        </w:rPr>
+        <w:t xml:space="preserve">--extra-noise-config</w:t>
+      </w:r>
+      <w:r>
+        <w:t xml:space="preserve"> </w:t>
+      </w:r>
+      <w:r>
+        <w:t xml:space="preserve">end-to-end coverage (plus one</w:t>
+      </w:r>
+      <w:r>
+        <w:t xml:space="preserve"> </w:t>
+      </w:r>
+      <w:r>
+        <w:rPr>
+          <w:rStyle w:val="VerbatimChar"/>
+        </w:rPr>
+        <w:t xml:space="preserve">$FRIENDLY_ROCPROF_NOISE_CONFIG</w:t>
+      </w:r>
+      <w:r>
+        <w:t xml:space="preserve"> </w:t>
+      </w:r>
+      <w:r>
+        <w:t xml:space="preserve">env-var-</w:t>
+      </w:r>
+      <w:r>
+        <w:t xml:space="preserve"> </w:t>
+      </w:r>
+      <w:r>
+        <w:t xml:space="preserve">fallback test and</w:t>
+      </w:r>
+      <w:r>
+        <w:t xml:space="preserve"> </w:t>
+      </w:r>
+      <w:r>
+        <w:rPr>
+          <w:rStyle w:val="VerbatimChar"/>
+        </w:rPr>
+        <w:t xml:space="preserve">select_hotspot_functions.py</w:t>
+      </w:r>
+      <w:r>
+        <w:t xml:space="preserve">‘</w:t>
+      </w:r>
+      <w:r>
+        <w:t xml:space="preserve">s</w:t>
+      </w:r>
+      <w:r>
+        <w:t xml:space="preserve"> </w:t>
+      </w:r>
+      <w:r>
+        <w:rPr>
+          <w:rStyle w:val="VerbatimChar"/>
+        </w:rPr>
+        <w:t xml:space="preserve">--report</w:t>
+      </w:r>
+      <w:r>
+        <w:t xml:space="preserve">+</w:t>
+      </w:r>
+      <w:r>
+        <w:rPr>
+          <w:rStyle w:val="VerbatimChar"/>
+        </w:rPr>
+        <w:t xml:space="preserve">--extra-noise-config</w:t>
+      </w:r>
+      <w:r>
+        <w:t xml:space="preserve"> </w:t>
+      </w:r>
+      <w:r>
+        <w:t xml:space="preserve">conflict check)</w:t>
+      </w:r>
+      <w:r>
+        <w:t xml:space="preserve"> </w:t>
+      </w:r>
+      <w:r>
+        <w:t xml:space="preserve">across all 6 CLI-facing tools</w:t>
+      </w:r>
+      <w:r>
+        <w:t xml:space="preserve">’</w:t>
+      </w:r>
+      <w:r>
+        <w:t xml:space="preserve"> </w:t>
+      </w:r>
+      <w:r>
+        <w:t xml:space="preserve">own test files. Every test that calls</w:t>
+      </w:r>
+      <w:r>
+        <w:t xml:space="preserve"> </w:t>
+      </w:r>
+      <w:r>
+        <w:rPr>
+          <w:rStyle w:val="VerbatimChar"/>
+        </w:rPr>
+        <w:t xml:space="preserve">configure()</w:t>
+      </w:r>
+      <w:r>
+        <w:t xml:space="preserve"> </w:t>
+      </w:r>
+      <w:r>
+        <w:t xml:space="preserve">resets it via</w:t>
+      </w:r>
+      <w:r>
+        <w:t xml:space="preserve"> </w:t>
+      </w:r>
+      <w:r>
+        <w:rPr>
+          <w:rStyle w:val="VerbatimChar"/>
+        </w:rPr>
+        <w:t xml:space="preserve">tearDown()</w:t>
+      </w:r>
+      <w:r>
+        <w:t xml:space="preserve">/</w:t>
+      </w:r>
+      <w:r>
+        <w:rPr>
+          <w:rStyle w:val="VerbatimChar"/>
+        </w:rPr>
+        <w:t xml:space="preserve">addCleanup()</w:t>
+      </w:r>
+      <w:r>
+        <w:t xml:space="preserve"> </w:t>
+      </w:r>
+      <w:r>
+        <w:t xml:space="preserve">so the process-wide global never leaks into an unrelated test running</w:t>
+      </w:r>
+      <w:r>
+        <w:t xml:space="preserve"> </w:t>
+      </w:r>
+      <w:r>
+        <w:t xml:space="preserve">afterward in the same suite. Final suite: 451 tests, all passing.</w:t>
+      </w:r>
+    </w:p>
+    <w:p>
+      <w:pPr>
+        <w:pStyle w:val="BodyText"/>
+      </w:pPr>
+      <w:r>
+        <w:t xml:space="preserve">Real-data verification across all 6</w:t>
+      </w:r>
+      <w:r>
+        <w:t xml:space="preserve"> </w:t>
+      </w:r>
+      <w:r>
+        <w:rPr>
+          <w:rStyle w:val="VerbatimChar"/>
+        </w:rPr>
+        <w:t xml:space="preserve">test_apps/results/</w:t>
+      </w:r>
+      <w:r>
+        <w:t xml:space="preserve"> </w:t>
+      </w:r>
+      <w:r>
+        <w:t xml:space="preserve">directories: fully byte-identical (modulo</w:t>
+      </w:r>
+      <w:r>
+        <w:t xml:space="preserve"> </w:t>
+      </w:r>
+      <w:r>
+        <w:t xml:space="preserve">each report’s own timestamp line), confirmed by diff rather than by eye, exactly as expected since</w:t>
+      </w:r>
+      <w:r>
+        <w:t xml:space="preserve"> </w:t>
+      </w:r>
+      <w:r>
+        <w:t xml:space="preserve">none of them pass</w:t>
+      </w:r>
+      <w:r>
+        <w:t xml:space="preserve"> </w:t>
+      </w:r>
+      <w:r>
+        <w:rPr>
+          <w:rStyle w:val="VerbatimChar"/>
+        </w:rPr>
+        <w:t xml:space="preserve">--extra-noise-config</w:t>
+      </w:r>
+      <w:r>
+        <w:t xml:space="preserve"> </w:t>
+      </w:r>
+      <w:r>
+        <w:t xml:space="preserve">–</w:t>
+      </w:r>
+      <w:r>
+        <w:t xml:space="preserve"> </w:t>
+      </w:r>
+      <w:r>
+        <w:rPr>
+          <w:rStyle w:val="VerbatimChar"/>
+        </w:rPr>
+        <w:t xml:space="preserve">tag_defs()</w:t>
+      </w:r>
+      <w:r>
+        <w:t xml:space="preserve"> </w:t>
+      </w:r>
+      <w:r>
+        <w:t xml:space="preserve">always resolves to the untouched bundled</w:t>
+      </w:r>
+      <w:r>
+        <w:t xml:space="preserve"> </w:t>
+      </w:r>
+      <w:r>
+        <w:t xml:space="preserve">defaults when never explicitly configured. One real-data smoke test (scratch file, not committed):</w:t>
+      </w:r>
+      <w:r>
+        <w:t xml:space="preserve"> </w:t>
+      </w:r>
+      <w:r>
+        <w:t xml:space="preserve">a hand-written config adding</w:t>
+      </w:r>
+      <w:r>
+        <w:t xml:space="preserve"> </w:t>
+      </w:r>
+      <w:r>
+        <w:rPr>
+          <w:rStyle w:val="VerbatimChar"/>
+        </w:rPr>
+        <w:t xml:space="preserve">"other": ["c_app"]</w:t>
+      </w:r>
+      <w:r>
+        <w:t xml:space="preserve"> </w:t>
+      </w:r>
+      <w:r>
+        <w:t xml:space="preserve">correctly excludes that real label from</w:t>
+      </w:r>
+      <w:r>
+        <w:t xml:space="preserve"> </w:t>
+      </w:r>
+      <w:r>
+        <w:rPr>
+          <w:rStyle w:val="VerbatimChar"/>
+        </w:rPr>
+        <w:t xml:space="preserve">extract_CPU_hotspots.py</w:t>
+      </w:r>
+      <w:r>
+        <w:t xml:space="preserve">’s report (2 occurrences by default, 0 once configured); a second config</w:t>
+      </w:r>
+      <w:r>
+        <w:t xml:space="preserve"> </w:t>
+      </w:r>
+      <w:r>
+        <w:t xml:space="preserve">adding the real</w:t>
+      </w:r>
+      <w:r>
+        <w:t xml:space="preserve"> </w:t>
+      </w:r>
+      <w:r>
+        <w:rPr>
+          <w:rStyle w:val="VerbatimChar"/>
+        </w:rPr>
+        <w:t xml:space="preserve">"PMPI_Allreduce"</w:t>
+      </w:r>
+      <w:r>
+        <w:t xml:space="preserve"> </w:t>
+      </w:r>
+      <w:r>
+        <w:t xml:space="preserve">label (this run’s own real MPI wrapper call) to</w:t>
+      </w:r>
+      <w:r>
+        <w:t xml:space="preserve"> </w:t>
+      </w:r>
+      <w:r>
+        <w:rPr>
+          <w:rStyle w:val="VerbatimChar"/>
+        </w:rPr>
+        <w:t xml:space="preserve">"other"</w:t>
+      </w:r>
+      <w:r>
+        <w:t xml:space="preserve"> </w:t>
+      </w:r>
+      <w:r>
+        <w:t xml:space="preserve">correctly splices that exact node out of</w:t>
+      </w:r>
+      <w:r>
+        <w:t xml:space="preserve"> </w:t>
+      </w:r>
+      <w:r>
+        <w:rPr>
+          <w:rStyle w:val="VerbatimChar"/>
+        </w:rPr>
+        <w:t xml:space="preserve">extract_calltree.py</w:t>
+      </w:r>
+      <w:r>
+        <w:t xml:space="preserve">’s rendered tree – both runs against</w:t>
+      </w:r>
+      <w:r>
+        <w:t xml:space="preserve"> </w:t>
+      </w:r>
+      <w:r>
+        <w:rPr>
+          <w:rStyle w:val="VerbatimChar"/>
+        </w:rPr>
+        <w:t xml:space="preserve">test_apps/results/profile_hotspots_C_amd</w:t>
+      </w:r>
+      <w:r>
+        <w:t xml:space="preserve">’s real captured data, and the second one is what</w:t>
+      </w:r>
+      <w:r>
+        <w:t xml:space="preserve"> </w:t>
+      </w:r>
+      <w:r>
+        <w:t xml:space="preserve">surfaced the case-sensitivity fix above.</w:t>
+      </w:r>
+    </w:p>
     <w:bookmarkEnd w:id="75"/>
+    <w:bookmarkEnd w:id="76"/>
     <w:sectPr/>
   </w:body>
 </w:document>

</xml_diff>

<commit_message>
Plan 2.13: final comment-and-docstring audit (roadmap step 11)
Sweeps every postprocess/*.py file for comments that read like changelog entries instead of
statements of current, standing behavior -- docs/plans/... pointers, "confirmed via real data",
"the old behavior was...", bare "rule N" references -- and rewrites them per CLAUDE.md's Code
Comments rules. Also closes a docstring-convention gap: all 8 tool-level files now have the same
Functions: line every stage1-6 module already does, and stage5_table_render.py's scope prose now
covers all 6 of its functions instead of just the original 2. Comment-only cleanup; no behavior
change anywhere.

Co-Authored-By: Claude Sonnet 5 <noreply@anthropic.com>
</commit_message>
<xml_diff>
--- a/docs/DEVELOPMENT_HISTORY.docx
+++ b/docs/DEVELOPMENT_HISTORY.docx
@@ -10,7 +10,7 @@
         <w:t xml:space="preserve">Development History</w:t>
       </w:r>
     </w:p>
-    <w:bookmarkStart w:id="76" w:name="development-history"/>
+    <w:bookmarkStart w:id="77" w:name="development-history"/>
     <w:p>
       <w:pPr>
         <w:pStyle w:val="Heading1"/>
@@ -2793,6 +2793,119 @@
           </w:p>
         </w:tc>
       </w:tr>
+      <w:tr>
+        <w:tc>
+          <w:tcPr/>
+          <w:p>
+            <w:pPr>
+              <w:pStyle w:val="Compact"/>
+              <w:jc w:val="left"/>
+            </w:pPr>
+            <w:r>
+              <w:t xml:space="preserve">2026-08-17</w:t>
+            </w:r>
+          </w:p>
+        </w:tc>
+        <w:tc>
+          <w:tcPr/>
+          <w:p>
+            <w:pPr>
+              <w:pStyle w:val="Compact"/>
+              <w:jc w:val="left"/>
+            </w:pPr>
+            <w:r>
+              <w:t xml:space="preserve">Plan 2.13: final comment-and-docstring audit – roadmap step 11, the last item on the original roadmap; comment-only cleanup (no behavior change) rewriting 19 history/investigation-flavored comments (</w:t>
+            </w:r>
+            <w:r>
+              <w:rPr>
+                <w:rStyle w:val="VerbatimChar"/>
+              </w:rPr>
+              <w:t xml:space="preserve">docs/plans/...</w:t>
+            </w:r>
+            <w:r>
+              <w:t xml:space="preserve"> </w:t>
+            </w:r>
+            <w:r>
+              <w:t xml:space="preserve">pointers,</w:t>
+            </w:r>
+            <w:r>
+              <w:t xml:space="preserve"> </w:t>
+            </w:r>
+            <w:r>
+              <w:t xml:space="preserve">“</w:t>
+            </w:r>
+            <w:r>
+              <w:t xml:space="preserve">confirmed via real data</w:t>
+            </w:r>
+            <w:r>
+              <w:t xml:space="preserve">”</w:t>
+            </w:r>
+            <w:r>
+              <w:t xml:space="preserve">,</w:t>
+            </w:r>
+            <w:r>
+              <w:t xml:space="preserve"> </w:t>
+            </w:r>
+            <w:r>
+              <w:t xml:space="preserve">“</w:t>
+            </w:r>
+            <w:r>
+              <w:t xml:space="preserve">the old behavior was…</w:t>
+            </w:r>
+            <w:r>
+              <w:t xml:space="preserve">”</w:t>
+            </w:r>
+            <w:r>
+              <w:t xml:space="preserve">, bare</w:t>
+            </w:r>
+            <w:r>
+              <w:t xml:space="preserve"> </w:t>
+            </w:r>
+            <w:r>
+              <w:t xml:space="preserve">“</w:t>
+            </w:r>
+            <w:r>
+              <w:t xml:space="preserve">rule N</w:t>
+            </w:r>
+            <w:r>
+              <w:t xml:space="preserve">”</w:t>
+            </w:r>
+            <w:r>
+              <w:t xml:space="preserve"> </w:t>
+            </w:r>
+            <w:r>
+              <w:t xml:space="preserve">references) across 8 files, expanding</w:t>
+            </w:r>
+            <w:r>
+              <w:t xml:space="preserve"> </w:t>
+            </w:r>
+            <w:r>
+              <w:rPr>
+                <w:rStyle w:val="VerbatimChar"/>
+              </w:rPr>
+              <w:t xml:space="preserve">stage5_table_render.py</w:t>
+            </w:r>
+            <w:r>
+              <w:t xml:space="preserve">’s thin module-docstring scope, and adding a</w:t>
+            </w:r>
+            <w:r>
+              <w:t xml:space="preserve"> </w:t>
+            </w:r>
+            <w:r>
+              <w:rPr>
+                <w:rStyle w:val="VerbatimChar"/>
+              </w:rPr>
+              <w:t xml:space="preserve">Functions:</w:t>
+            </w:r>
+            <w:r>
+              <w:t xml:space="preserve"> </w:t>
+            </w:r>
+            <w:r>
+              <w:t xml:space="preserve">line to all 8 tool-level files that lacked one – see full accounting below</w:t>
+            </w:r>
+          </w:p>
+        </w:tc>
+      </w:tr>
     </w:tbl>
     <w:bookmarkStart w:id="20" w:name="project-scaffolding-and-rules"/>
     <w:p>
@@ -43233,7 +43346,1429 @@
       </w:r>
     </w:p>
     <w:bookmarkEnd w:id="75"/>
+    <w:bookmarkStart w:id="76" w:name="Xb1c1f95ed7bf9aa698f6358077b9cd66b890821"/>
+    <w:p>
+      <w:pPr>
+        <w:pStyle w:val="Heading2"/>
+      </w:pPr>
+      <w:r>
+        <w:t xml:space="preserve">2026-08-17 — Plan 2.13: final comment-and-docstring audit (roadmap step 11)</w:t>
+      </w:r>
+    </w:p>
+    <w:p>
+      <w:pPr>
+        <w:pStyle w:val="FirstParagraph"/>
+      </w:pPr>
+      <w:r>
+        <w:t xml:space="preserve">Closes the last item on the original 11-step roadmap: sweep every</w:t>
+      </w:r>
+      <w:r>
+        <w:t xml:space="preserve"> </w:t>
+      </w:r>
+      <w:r>
+        <w:rPr>
+          <w:rStyle w:val="VerbatimChar"/>
+        </w:rPr>
+        <w:t xml:space="preserve">postprocess/*.py</w:t>
+      </w:r>
+      <w:r>
+        <w:t xml:space="preserve"> </w:t>
+      </w:r>
+      <w:r>
+        <w:t xml:space="preserve">file for any</w:t>
+      </w:r>
+      <w:r>
+        <w:t xml:space="preserve"> </w:t>
+      </w:r>
+      <w:r>
+        <w:t xml:space="preserve">comment that wasn’t naturally rewritten by plans 1-10, and bring it in line with CLAUDE.md’s Code</w:t>
+      </w:r>
+      <w:r>
+        <w:t xml:space="preserve"> </w:t>
+      </w:r>
+      <w:r>
+        <w:t xml:space="preserve">Comments rules. Comment-only cleanup – no behavior change anywhere, confirmed by the full test</w:t>
+      </w:r>
+      <w:r>
+        <w:t xml:space="preserve"> </w:t>
+      </w:r>
+      <w:r>
+        <w:t xml:space="preserve">suite staying at 451 passing throughout and every edited module still importing cleanly.</w:t>
+      </w:r>
+    </w:p>
+    <w:p>
+      <w:pPr>
+        <w:pStyle w:val="BodyText"/>
+      </w:pPr>
+      <w:r>
+        <w:t xml:space="preserve">Three parallel read-only audits (tool-level</w:t>
+      </w:r>
+      <w:r>
+        <w:t xml:space="preserve"> </w:t>
+      </w:r>
+      <w:r>
+        <w:rPr>
+          <w:rStyle w:val="VerbatimChar"/>
+        </w:rPr>
+        <w:t xml:space="preserve">extract_*.py</w:t>
+      </w:r>
+      <w:r>
+        <w:t xml:space="preserve">/</w:t>
+      </w:r>
+      <w:r>
+        <w:rPr>
+          <w:rStyle w:val="VerbatimChar"/>
+        </w:rPr>
+        <w:t xml:space="preserve">select_*.py</w:t>
+      </w:r>
+      <w:r>
+        <w:t xml:space="preserve">,</w:t>
+      </w:r>
+      <w:r>
+        <w:t xml:space="preserve"> </w:t>
+      </w:r>
+      <w:r>
+        <w:rPr>
+          <w:rStyle w:val="VerbatimChar"/>
+        </w:rPr>
+        <w:t xml:space="preserve">stage1</w:t>
+      </w:r>
+      <w:r>
+        <w:t xml:space="preserve">-</w:t>
+      </w:r>
+      <w:r>
+        <w:rPr>
+          <w:rStyle w:val="VerbatimChar"/>
+        </w:rPr>
+        <w:t xml:space="preserve">stage4</w:t>
+      </w:r>
+      <w:r>
+        <w:t xml:space="preserve">,</w:t>
+      </w:r>
+      <w:r>
+        <w:t xml:space="preserve"> </w:t>
+      </w:r>
+      <w:r>
+        <w:rPr>
+          <w:rStyle w:val="VerbatimChar"/>
+        </w:rPr>
+        <w:t xml:space="preserve">stage5</w:t>
+      </w:r>
+      <w:r>
+        <w:t xml:space="preserve">-</w:t>
+      </w:r>
+      <w:r>
+        <w:rPr>
+          <w:rStyle w:val="VerbatimChar"/>
+        </w:rPr>
+        <w:t xml:space="preserve">stage6</w:t>
+      </w:r>
+      <w:r>
+        <w:t xml:space="preserve">) read all 29 files in full against two standing rules: comments must describe</w:t>
+      </w:r>
+      <w:r>
+        <w:t xml:space="preserve"> </w:t>
+      </w:r>
+      <w:r>
+        <w:t xml:space="preserve">current behavior, not the history of how it got that way (no</w:t>
+      </w:r>
+      <w:r>
+        <w:t xml:space="preserve"> </w:t>
+      </w:r>
+      <w:r>
+        <w:rPr>
+          <w:rStyle w:val="VerbatimChar"/>
+        </w:rPr>
+        <w:t xml:space="preserve">docs/plans/...</w:t>
+      </w:r>
+      <w:r>
+        <w:t xml:space="preserve"> </w:t>
+      </w:r>
+      <w:r>
+        <w:t xml:space="preserve">pointers,</w:t>
+      </w:r>
+      <w:r>
+        <w:t xml:space="preserve"> </w:t>
+      </w:r>
+      <w:r>
+        <w:t xml:space="preserve">“</w:t>
+      </w:r>
+      <w:r>
+        <w:t xml:space="preserve">confirmed</w:t>
+      </w:r>
+      <w:r>
+        <w:t xml:space="preserve"> </w:t>
+      </w:r>
+      <w:r>
+        <w:t xml:space="preserve">via real data</w:t>
+      </w:r>
+      <w:r>
+        <w:t xml:space="preserve">”</w:t>
+      </w:r>
+      <w:r>
+        <w:t xml:space="preserve">,</w:t>
+      </w:r>
+      <w:r>
+        <w:t xml:space="preserve"> </w:t>
+      </w:r>
+      <w:r>
+        <w:t xml:space="preserve">“</w:t>
+      </w:r>
+      <w:r>
+        <w:t xml:space="preserve">the old behavior was…</w:t>
+      </w:r>
+      <w:r>
+        <w:t xml:space="preserve">”</w:t>
+      </w:r>
+      <w:r>
+        <w:t xml:space="preserve">, bare</w:t>
+      </w:r>
+      <w:r>
+        <w:t xml:space="preserve"> </w:t>
+      </w:r>
+      <w:r>
+        <w:t xml:space="preserve">“</w:t>
+      </w:r>
+      <w:r>
+        <w:t xml:space="preserve">rule N</w:t>
+      </w:r>
+      <w:r>
+        <w:t xml:space="preserve">”</w:t>
+      </w:r>
+      <w:r>
+        <w:t xml:space="preserve"> </w:t>
+      </w:r>
+      <w:r>
+        <w:t xml:space="preserve">references); every module needs a</w:t>
+      </w:r>
+      <w:r>
+        <w:t xml:space="preserve"> </w:t>
+      </w:r>
+      <w:r>
+        <w:t xml:space="preserve">top-of-file docstring covering scope, exposed functions, and design philosophy. 19 rule-1/2</w:t>
+      </w:r>
+      <w:r>
+        <w:t xml:space="preserve"> </w:t>
+      </w:r>
+      <w:r>
+        <w:t xml:space="preserve">violations turned up, spanning every layer of the pipeline:</w:t>
+      </w:r>
+    </w:p>
+    <w:p>
+      <w:pPr>
+        <w:numPr>
+          <w:ilvl w:val="0"/>
+          <w:numId w:val="1016"/>
+        </w:numPr>
+        <w:pStyle w:val="Compact"/>
+      </w:pPr>
+      <w:r>
+        <w:rPr>
+          <w:bCs/>
+          <w:b/>
+        </w:rPr>
+        <w:t xml:space="preserve">Stale factual claim</w:t>
+      </w:r>
+      <w:r>
+        <w:t xml:space="preserve">:</w:t>
+      </w:r>
+      <w:r>
+        <w:t xml:space="preserve"> </w:t>
+      </w:r>
+      <w:r>
+        <w:rPr>
+          <w:rStyle w:val="VerbatimChar"/>
+        </w:rPr>
+        <w:t xml:space="preserve">stage3_rocprofsys.py</w:t>
+      </w:r>
+      <w:r>
+        <w:t xml:space="preserve">’s own docstring still said</w:t>
+      </w:r>
+      <w:r>
+        <w:t xml:space="preserve"> </w:t>
+      </w:r>
+      <w:r>
+        <w:t xml:space="preserve">“</w:t>
+      </w:r>
+      <w:r>
+        <w:t xml:space="preserve">This module is NOT</w:t>
+      </w:r>
+      <w:r>
+        <w:t xml:space="preserve"> </w:t>
+      </w:r>
+      <w:r>
+        <w:t xml:space="preserve">wired into any tool yet</w:t>
+      </w:r>
+      <w:r>
+        <w:t xml:space="preserve">”</w:t>
+      </w:r>
+      <w:r>
+        <w:t xml:space="preserve"> </w:t>
+      </w:r>
+      <w:r>
+        <w:t xml:space="preserve">– false since plan 2.6, when 4 modules started importing</w:t>
+      </w:r>
+      <w:r>
+        <w:t xml:space="preserve"> </w:t>
+      </w:r>
+      <w:r>
+        <w:rPr>
+          <w:rStyle w:val="VerbatimChar"/>
+        </w:rPr>
+        <w:t xml:space="preserve">tag_rows()</w:t>
+      </w:r>
+      <w:r>
+        <w:t xml:space="preserve"> </w:t>
+      </w:r>
+      <w:r>
+        <w:t xml:space="preserve">directly. Rewritten to state the actual current scope boundary (classification lives here,</w:t>
+      </w:r>
+      <w:r>
+        <w:t xml:space="preserve"> </w:t>
+      </w:r>
+      <w:r>
+        <w:t xml:space="preserve">tool-specific treatment/wiring lives in each caller).</w:t>
+      </w:r>
+    </w:p>
+    <w:p>
+      <w:pPr>
+        <w:numPr>
+          <w:ilvl w:val="0"/>
+          <w:numId w:val="1016"/>
+        </w:numPr>
+        <w:pStyle w:val="Compact"/>
+      </w:pPr>
+      <w:r>
+        <w:rPr>
+          <w:bCs/>
+          <w:b/>
+        </w:rPr>
+        <w:t xml:space="preserve">Investigation-narrative comments</w:t>
+      </w:r>
+      <w:r>
+        <w:t xml:space="preserve">, the most common pattern:</w:t>
+      </w:r>
+      <w:r>
+        <w:t xml:space="preserve"> </w:t>
+      </w:r>
+      <w:r>
+        <w:t xml:space="preserve">“</w:t>
+      </w:r>
+      <w:r>
+        <w:t xml:space="preserve">confirmed against real data</w:t>
+      </w:r>
+      <w:r>
+        <w:t xml:space="preserve">”</w:t>
+      </w:r>
+      <w:r>
+        <w:t xml:space="preserve">,</w:t>
+      </w:r>
+      <w:r>
+        <w:t xml:space="preserve"> </w:t>
+      </w:r>
+      <w:r>
+        <w:t xml:space="preserve">“</w:t>
+      </w:r>
+      <w:r>
+        <w:t xml:space="preserve">observed in real sampled data</w:t>
+      </w:r>
+      <w:r>
+        <w:t xml:space="preserve">”</w:t>
+      </w:r>
+      <w:r>
+        <w:t xml:space="preserve">,</w:t>
+      </w:r>
+      <w:r>
+        <w:t xml:space="preserve"> </w:t>
+      </w:r>
+      <w:r>
+        <w:t xml:space="preserve">“</w:t>
+      </w:r>
+      <w:r>
+        <w:t xml:space="preserve">confirmed from real captured data</w:t>
+      </w:r>
+      <w:r>
+        <w:t xml:space="preserve">”</w:t>
+      </w:r>
+      <w:r>
+        <w:t xml:space="preserve"> </w:t>
+      </w:r>
+      <w:r>
+        <w:t xml:space="preserve">scattered across</w:t>
+      </w:r>
+      <w:r>
+        <w:t xml:space="preserve"> </w:t>
+      </w:r>
+      <w:r>
+        <w:rPr>
+          <w:rStyle w:val="VerbatimChar"/>
+        </w:rPr>
+        <w:t xml:space="preserve">stage4_rocprofsys_tree.py</w:t>
+      </w:r>
+      <w:r>
+        <w:t xml:space="preserve"> </w:t>
+      </w:r>
+      <w:r>
+        <w:t xml:space="preserve">(3 instances, one of them – the kernel-name-matching docstring –</w:t>
+      </w:r>
+      <w:r>
+        <w:t xml:space="preserve"> </w:t>
+      </w:r>
+      <w:r>
+        <w:t xml:space="preserve">also explicitly contrasting itself with</w:t>
+      </w:r>
+      <w:r>
+        <w:t xml:space="preserve"> </w:t>
+      </w:r>
+      <w:r>
+        <w:t xml:space="preserve">“</w:t>
+      </w:r>
+      <w:r>
+        <w:t xml:space="preserve">the OLD nearest-launch-ancestor approach</w:t>
+      </w:r>
+      <w:r>
+        <w:t xml:space="preserve">”</w:t>
+      </w:r>
+      <w:r>
+        <w:t xml:space="preserve">, the single</w:t>
+      </w:r>
+      <w:r>
+        <w:t xml:space="preserve"> </w:t>
+      </w:r>
+      <w:r>
+        <w:t xml:space="preserve">most changelog-flavored comment found) and</w:t>
+      </w:r>
+      <w:r>
+        <w:t xml:space="preserve"> </w:t>
+      </w:r>
+      <w:r>
+        <w:rPr>
+          <w:rStyle w:val="VerbatimChar"/>
+        </w:rPr>
+        <w:t xml:space="preserve">extract_pop_metrics.py</w:t>
+      </w:r>
+      <w:r>
+        <w:t xml:space="preserve">’s</w:t>
+      </w:r>
+      <w:r>
+        <w:t xml:space="preserve"> </w:t>
+      </w:r>
+      <w:r>
+        <w:rPr>
+          <w:rStyle w:val="VerbatimChar"/>
+        </w:rPr>
+        <w:t xml:space="preserve">HELP_BLURB</w:t>
+      </w:r>
+      <w:r>
+        <w:t xml:space="preserve">. Each rewritten</w:t>
+      </w:r>
+      <w:r>
+        <w:t xml:space="preserve"> </w:t>
+      </w:r>
+      <w:r>
+        <w:t xml:space="preserve">to state the standing technical fact or classification rule directly, with no reference to how or</w:t>
+      </w:r>
+      <w:r>
+        <w:t xml:space="preserve"> </w:t>
+      </w:r>
+      <w:r>
+        <w:t xml:space="preserve">when it was verified.</w:t>
+      </w:r>
+    </w:p>
+    <w:p>
+      <w:pPr>
+        <w:numPr>
+          <w:ilvl w:val="0"/>
+          <w:numId w:val="1016"/>
+        </w:numPr>
+        <w:pStyle w:val="Compact"/>
+      </w:pPr>
+      <w:r>
+        <w:rPr>
+          <w:bCs/>
+          <w:b/>
+        </w:rPr>
+        <w:t xml:space="preserve">“</w:t>
+      </w:r>
+      <w:r>
+        <w:rPr>
+          <w:bCs/>
+          <w:b/>
+        </w:rPr>
+        <w:t xml:space="preserve">The old behavior</w:t>
+      </w:r>
+      <w:r>
+        <w:rPr>
+          <w:bCs/>
+          <w:b/>
+        </w:rPr>
+        <w:t xml:space="preserve">”</w:t>
+      </w:r>
+      <w:r>
+        <w:rPr>
+          <w:bCs/>
+          <w:b/>
+        </w:rPr>
+        <w:t xml:space="preserve"> </w:t>
+      </w:r>
+      <w:r>
+        <w:rPr>
+          <w:bCs/>
+          <w:b/>
+        </w:rPr>
+        <w:t xml:space="preserve">framing</w:t>
+      </w:r>
+      <w:r>
+        <w:t xml:space="preserve">, byte-identical across 3 tools’</w:t>
+      </w:r>
+      <w:r>
+        <w:t xml:space="preserve"> </w:t>
+      </w:r>
+      <w:r>
+        <w:rPr>
+          <w:rStyle w:val="VerbatimChar"/>
+        </w:rPr>
+        <w:t xml:space="preserve">--unfiltered</w:t>
+      </w:r>
+      <w:r>
+        <w:t xml:space="preserve"> </w:t>
+      </w:r>
+      <w:r>
+        <w:t xml:space="preserve">flag help text</w:t>
+      </w:r>
+      <w:r>
+        <w:t xml:space="preserve"> </w:t>
+      </w:r>
+      <w:r>
+        <w:t xml:space="preserve">(</w:t>
+      </w:r>
+      <w:r>
+        <w:rPr>
+          <w:rStyle w:val="VerbatimChar"/>
+        </w:rPr>
+        <w:t xml:space="preserve">extract_CPU_hotspots.py</w:t>
+      </w:r>
+      <w:r>
+        <w:t xml:space="preserve">,</w:t>
+      </w:r>
+      <w:r>
+        <w:t xml:space="preserve"> </w:t>
+      </w:r>
+      <w:r>
+        <w:rPr>
+          <w:rStyle w:val="VerbatimChar"/>
+        </w:rPr>
+        <w:t xml:space="preserve">extract_hotspots.py</w:t>
+      </w:r>
+      <w:r>
+        <w:t xml:space="preserve">,</w:t>
+      </w:r>
+      <w:r>
+        <w:t xml:space="preserve"> </w:t>
+      </w:r>
+      <w:r>
+        <w:rPr>
+          <w:rStyle w:val="VerbatimChar"/>
+        </w:rPr>
+        <w:t xml:space="preserve">select_hotspot_functions.py</w:t>
+      </w:r>
+      <w:r>
+        <w:t xml:space="preserve">) – all three</w:t>
+      </w:r>
+      <w:r>
+        <w:t xml:space="preserve"> </w:t>
+      </w:r>
+      <w:r>
+        <w:t xml:space="preserve">narrated a before/after comparison to describe what is simply the current alternate ranking mode.</w:t>
+      </w:r>
+      <w:r>
+        <w:t xml:space="preserve"> </w:t>
+      </w:r>
+      <w:r>
+        <w:t xml:space="preserve">Rewritten to state only what</w:t>
+      </w:r>
+      <w:r>
+        <w:t xml:space="preserve"> </w:t>
+      </w:r>
+      <w:r>
+        <w:rPr>
+          <w:rStyle w:val="VerbatimChar"/>
+        </w:rPr>
+        <w:t xml:space="preserve">--unfiltered</w:t>
+      </w:r>
+      <w:r>
+        <w:t xml:space="preserve"> </w:t>
+      </w:r>
+      <w:r>
+        <w:t xml:space="preserve">does and why, dropping</w:t>
+      </w:r>
+      <w:r>
+        <w:t xml:space="preserve"> </w:t>
+      </w:r>
+      <w:r>
+        <w:t xml:space="preserve">“</w:t>
+      </w:r>
+      <w:r>
+        <w:t xml:space="preserve">old</w:t>
+      </w:r>
+      <w:r>
+        <w:t xml:space="preserve">”</w:t>
+      </w:r>
+      <w:r>
+        <w:t xml:space="preserve">/</w:t>
+      </w:r>
+      <w:r>
+        <w:t xml:space="preserve">“</w:t>
+      </w:r>
+      <w:r>
+        <w:t xml:space="preserve">new</w:t>
+      </w:r>
+      <w:r>
+        <w:t xml:space="preserve">”</w:t>
+      </w:r>
+      <w:r>
+        <w:t xml:space="preserve"> </w:t>
+      </w:r>
+      <w:r>
+        <w:t xml:space="preserve">framing entirely.</w:t>
+      </w:r>
+    </w:p>
+    <w:p>
+      <w:pPr>
+        <w:numPr>
+          <w:ilvl w:val="0"/>
+          <w:numId w:val="1016"/>
+        </w:numPr>
+        <w:pStyle w:val="Compact"/>
+      </w:pPr>
+      <w:r>
+        <w:rPr>
+          <w:bCs/>
+          <w:b/>
+        </w:rPr>
+        <w:t xml:space="preserve">Direct</w:t>
+      </w:r>
+      <w:r>
+        <w:rPr>
+          <w:bCs/>
+          <w:b/>
+        </w:rPr>
+        <w:t xml:space="preserve"> </w:t>
+      </w:r>
+      <w:r>
+        <w:rPr>
+          <w:rStyle w:val="VerbatimChar"/>
+          <w:bCs/>
+          <w:b/>
+        </w:rPr>
+        <w:t xml:space="preserve">docs/plans/...</w:t>
+      </w:r>
+      <w:r>
+        <w:rPr>
+          <w:bCs/>
+          <w:b/>
+        </w:rPr>
+        <w:t xml:space="preserve"> </w:t>
+      </w:r>
+      <w:r>
+        <w:rPr>
+          <w:bCs/>
+          <w:b/>
+        </w:rPr>
+        <w:t xml:space="preserve">pointers</w:t>
+      </w:r>
+      <w:r>
+        <w:t xml:space="preserve"> </w:t>
+      </w:r>
+      <w:r>
+        <w:t xml:space="preserve">in both calltree tools’ module docstrings (</w:t>
+      </w:r>
+      <w:r>
+        <w:rPr>
+          <w:rStyle w:val="VerbatimChar"/>
+        </w:rPr>
+        <w:t xml:space="preserve">extract_calltree.py</w:t>
+      </w:r>
+      <w:r>
+        <w:t xml:space="preserve">,</w:t>
+      </w:r>
+      <w:r>
+        <w:t xml:space="preserve"> </w:t>
+      </w:r>
+      <w:r>
+        <w:rPr>
+          <w:rStyle w:val="VerbatimChar"/>
+        </w:rPr>
+        <w:t xml:space="preserve">extract_calltree_traced.py</w:t>
+      </w:r>
+      <w:r>
+        <w:t xml:space="preserve">) – CLAUDE.md’s own named example of what to avoid. Replaced with the</w:t>
+      </w:r>
+      <w:r>
+        <w:t xml:space="preserve"> </w:t>
+      </w:r>
+      <w:r>
+        <w:t xml:space="preserve">standing constraint itself (no per-call timestamps outside the binary Perfetto trace, so</w:t>
+      </w:r>
+      <w:r>
+        <w:t xml:space="preserve"> </w:t>
+      </w:r>
+      <w:r>
+        <w:t xml:space="preserve">per-dispatch-exact kernel placement isn’t achievable) stated directly, no pointer needed.</w:t>
+      </w:r>
+    </w:p>
+    <w:p>
+      <w:pPr>
+        <w:numPr>
+          <w:ilvl w:val="0"/>
+          <w:numId w:val="1016"/>
+        </w:numPr>
+        <w:pStyle w:val="Compact"/>
+      </w:pPr>
+      <w:r>
+        <w:rPr>
+          <w:bCs/>
+          <w:b/>
+        </w:rPr>
+        <w:t xml:space="preserve">A stale cross-reference</w:t>
+      </w:r>
+      <w:r>
+        <w:t xml:space="preserve">:</w:t>
+      </w:r>
+      <w:r>
+        <w:t xml:space="preserve"> </w:t>
+      </w:r>
+      <w:r>
+        <w:rPr>
+          <w:rStyle w:val="VerbatimChar"/>
+        </w:rPr>
+        <w:t xml:space="preserve">stage5_fused_hotspots_table.py</w:t>
+      </w:r>
+      <w:r>
+        <w:t xml:space="preserve"> </w:t>
+      </w:r>
+      <w:r>
+        <w:t xml:space="preserve">referenced</w:t>
+      </w:r>
+      <w:r>
+        <w:t xml:space="preserve"> </w:t>
+      </w:r>
+      <w:r>
+        <w:rPr>
+          <w:rStyle w:val="VerbatimChar"/>
+        </w:rPr>
+        <w:t xml:space="preserve">cpu_tool.select_entries</w:t>
+      </w:r>
+      <w:r>
+        <w:t xml:space="preserve">/</w:t>
+      </w:r>
+      <w:r>
+        <w:t xml:space="preserve"> </w:t>
+      </w:r>
+      <w:r>
+        <w:rPr>
+          <w:rStyle w:val="VerbatimChar"/>
+        </w:rPr>
+        <w:t xml:space="preserve">cpu_tool.aggregate()</w:t>
+      </w:r>
+      <w:r>
+        <w:t xml:space="preserve"> </w:t>
+      </w:r>
+      <w:r>
+        <w:t xml:space="preserve">–</w:t>
+      </w:r>
+      <w:r>
+        <w:t xml:space="preserve"> </w:t>
+      </w:r>
+      <w:r>
+        <w:rPr>
+          <w:rStyle w:val="VerbatimChar"/>
+        </w:rPr>
+        <w:t xml:space="preserve">cpu_tool</w:t>
+      </w:r>
+      <w:r>
+        <w:t xml:space="preserve"> </w:t>
+      </w:r>
+      <w:r>
+        <w:t xml:space="preserve">is an import alias other top-level scripts use for</w:t>
+      </w:r>
+      <w:r>
+        <w:t xml:space="preserve"> </w:t>
+      </w:r>
+      <w:r>
+        <w:rPr>
+          <w:rStyle w:val="VerbatimChar"/>
+        </w:rPr>
+        <w:t xml:space="preserve">extract_CPU_hotspots.py</w:t>
+      </w:r>
+      <w:r>
+        <w:t xml:space="preserve">, but doesn’t exist in this file at all (a leftover from before the</w:t>
+      </w:r>
+      <w:r>
+        <w:t xml:space="preserve"> </w:t>
+      </w:r>
+      <w:r>
+        <w:t xml:space="preserve">stage-based module split). Replaced with the actual current module names</w:t>
+      </w:r>
+      <w:r>
+        <w:t xml:space="preserve"> </w:t>
+      </w:r>
+      <w:r>
+        <w:t xml:space="preserve">(</w:t>
+      </w:r>
+      <w:r>
+        <w:rPr>
+          <w:rStyle w:val="VerbatimChar"/>
+        </w:rPr>
+        <w:t xml:space="preserve">stage5_table_render.select_entries()</w:t>
+      </w:r>
+      <w:r>
+        <w:t xml:space="preserve">,</w:t>
+      </w:r>
+      <w:r>
+        <w:t xml:space="preserve"> </w:t>
+      </w:r>
+      <w:r>
+        <w:rPr>
+          <w:rStyle w:val="VerbatimChar"/>
+        </w:rPr>
+        <w:t xml:space="preserve">stage4_rocprofsys_flat.aggregate()</w:t>
+      </w:r>
+      <w:r>
+        <w:t xml:space="preserve">).</w:t>
+      </w:r>
+      <w:r>
+        <w:t xml:space="preserve"> </w:t>
+      </w:r>
+      <w:r>
+        <w:rPr>
+          <w:rStyle w:val="VerbatimChar"/>
+        </w:rPr>
+        <w:t xml:space="preserve">extract_calltree.py</w:t>
+      </w:r>
+      <w:r>
+        <w:t xml:space="preserve">’s compiler-runtime-tier comment (</w:t>
+      </w:r>
+      <w:r>
+        <w:t xml:space="preserve">“</w:t>
+      </w:r>
+      <w:r>
+        <w:t xml:space="preserve">since none have been observed in this</w:t>
+      </w:r>
+      <w:r>
+        <w:t xml:space="preserve"> </w:t>
+      </w:r>
+      <w:r>
+        <w:t xml:space="preserve">project’s data so far</w:t>
+      </w:r>
+      <w:r>
+        <w:t xml:space="preserve">”</w:t>
+      </w:r>
+      <w:r>
+        <w:t xml:space="preserve">) and</w:t>
+      </w:r>
+      <w:r>
+        <w:t xml:space="preserve"> </w:t>
+      </w:r>
+      <w:r>
+        <w:rPr>
+          <w:rStyle w:val="VerbatimChar"/>
+        </w:rPr>
+        <w:t xml:space="preserve">stage5_fused_hotspots_table.py</w:t>
+      </w:r>
+      <w:r>
+        <w:t xml:space="preserve">’s GPU-API-overhead comment (</w:t>
+      </w:r>
+      <w:r>
+        <w:t xml:space="preserve">“</w:t>
+      </w:r>
+      <w:r>
+        <w:t xml:space="preserve">made</w:t>
+      </w:r>
+      <w:r>
+        <w:t xml:space="preserve"> </w:t>
+      </w:r>
+      <w:r>
+        <w:t xml:space="preserve">this subtraction clamp cpu_pure_total_sec to 0 even on realistic data</w:t>
+      </w:r>
+      <w:r>
+        <w:t xml:space="preserve">”</w:t>
+      </w:r>
+      <w:r>
+        <w:t xml:space="preserve">) got the same treatment –</w:t>
+      </w:r>
+      <w:r>
+        <w:t xml:space="preserve"> </w:t>
+      </w:r>
+      <w:r>
+        <w:t xml:space="preserve">restated as standing coverage limitations/risks, not investigation narratives.</w:t>
+      </w:r>
+    </w:p>
+    <w:p>
+      <w:pPr>
+        <w:numPr>
+          <w:ilvl w:val="0"/>
+          <w:numId w:val="1016"/>
+        </w:numPr>
+        <w:pStyle w:val="Compact"/>
+      </w:pPr>
+      <w:r>
+        <w:rPr>
+          <w:bCs/>
+          <w:b/>
+        </w:rPr>
+        <w:t xml:space="preserve">Bare</w:t>
+      </w:r>
+      <w:r>
+        <w:rPr>
+          <w:bCs/>
+          <w:b/>
+        </w:rPr>
+        <w:t xml:space="preserve"> </w:t>
+      </w:r>
+      <w:r>
+        <w:rPr>
+          <w:bCs/>
+          <w:b/>
+        </w:rPr>
+        <w:t xml:space="preserve">“</w:t>
+      </w:r>
+      <w:r>
+        <w:rPr>
+          <w:bCs/>
+          <w:b/>
+        </w:rPr>
+        <w:t xml:space="preserve">rule N</w:t>
+      </w:r>
+      <w:r>
+        <w:rPr>
+          <w:bCs/>
+          <w:b/>
+        </w:rPr>
+        <w:t xml:space="preserve">”</w:t>
+      </w:r>
+      <w:r>
+        <w:rPr>
+          <w:bCs/>
+          <w:b/>
+        </w:rPr>
+        <w:t xml:space="preserve"> </w:t>
+      </w:r>
+      <w:r>
+        <w:rPr>
+          <w:bCs/>
+          <w:b/>
+        </w:rPr>
+        <w:t xml:space="preserve">references</w:t>
+      </w:r>
+      <w:r>
+        <w:t xml:space="preserve"> </w:t>
+      </w:r>
+      <w:r>
+        <w:t xml:space="preserve">with no context in the file itself:</w:t>
+      </w:r>
+      <w:r>
+        <w:t xml:space="preserve"> </w:t>
+      </w:r>
+      <w:r>
+        <w:rPr>
+          <w:rStyle w:val="VerbatimChar"/>
+        </w:rPr>
+        <w:t xml:space="preserve">stage5_pop_metrics_table.py</w:t>
+      </w:r>
+      <w:r>
+        <w:t xml:space="preserve"> </w:t>
+      </w:r>
+      <w:r>
+        <w:t xml:space="preserve">(</w:t>
+      </w:r>
+      <w:r>
+        <w:t xml:space="preserve">“</w:t>
+      </w:r>
+      <w:r>
+        <w:t xml:space="preserve">rule 2’s … case</w:t>
+      </w:r>
+      <w:r>
+        <w:t xml:space="preserve">”</w:t>
+      </w:r>
+      <w:r>
+        <w:t xml:space="preserve">) and</w:t>
+      </w:r>
+      <w:r>
+        <w:t xml:space="preserve"> </w:t>
+      </w:r>
+      <w:r>
+        <w:rPr>
+          <w:rStyle w:val="VerbatimChar"/>
+        </w:rPr>
+        <w:t xml:space="preserve">stage6_report_builder.py</w:t>
+      </w:r>
+      <w:r>
+        <w:t xml:space="preserve"> </w:t>
+      </w:r>
+      <w:r>
+        <w:t xml:space="preserve">(</w:t>
+      </w:r>
+      <w:r>
+        <w:t xml:space="preserve">“</w:t>
+      </w:r>
+      <w:r>
+        <w:t xml:space="preserve">One redirect line for rule 5</w:t>
+      </w:r>
+      <w:r>
+        <w:t xml:space="preserve">”</w:t>
+      </w:r>
+      <w:r>
+        <w:t xml:space="preserve"> </w:t>
+      </w:r>
+      <w:r>
+        <w:t xml:space="preserve">– which also</w:t>
+      </w:r>
+      <w:r>
+        <w:t xml:space="preserve"> </w:t>
+      </w:r>
+      <w:r>
+        <w:t xml:space="preserve">said a report</w:t>
+      </w:r>
+      <w:r>
+        <w:t xml:space="preserve"> </w:t>
+      </w:r>
+      <w:r>
+        <w:t xml:space="preserve">“</w:t>
+      </w:r>
+      <w:r>
+        <w:t xml:space="preserve">used to repeat</w:t>
+      </w:r>
+      <w:r>
+        <w:t xml:space="preserve">”</w:t>
+      </w:r>
+      <w:r>
+        <w:t xml:space="preserve"> </w:t>
+      </w:r>
+      <w:r>
+        <w:t xml:space="preserve">the redirected content). Both rewritten to state the behavior</w:t>
+      </w:r>
+      <w:r>
+        <w:t xml:space="preserve"> </w:t>
+      </w:r>
+      <w:r>
+        <w:t xml:space="preserve">directly, with no numbered-rule pointer to a document the reader doesn’t have open.</w:t>
+      </w:r>
+    </w:p>
+    <w:p>
+      <w:pPr>
+        <w:numPr>
+          <w:ilvl w:val="0"/>
+          <w:numId w:val="1016"/>
+        </w:numPr>
+        <w:pStyle w:val="Compact"/>
+      </w:pPr>
+      <w:r>
+        <w:rPr>
+          <w:rStyle w:val="VerbatimChar"/>
+          <w:bCs/>
+          <w:b/>
+        </w:rPr>
+        <w:t xml:space="preserve">stage5_tree_render.py</w:t>
+      </w:r>
+      <w:r>
+        <w:t xml:space="preserve">’s module docstring said its shared rank-loading/kernel-pairing logic</w:t>
+      </w:r>
+      <w:r>
+        <w:t xml:space="preserve"> </w:t>
+      </w:r>
+      <w:r>
+        <w:t xml:space="preserve">“</w:t>
+      </w:r>
+      <w:r>
+        <w:t xml:space="preserve">used to be duplicated</w:t>
+      </w:r>
+      <w:r>
+        <w:t xml:space="preserve">”</w:t>
+      </w:r>
+      <w:r>
+        <w:t xml:space="preserve"> </w:t>
+      </w:r>
+      <w:r>
+        <w:t xml:space="preserve">between the two calltree tools,</w:t>
+      </w:r>
+      <w:r>
+        <w:t xml:space="preserve"> </w:t>
+      </w:r>
+      <w:r>
+        <w:t xml:space="preserve">“</w:t>
+      </w:r>
+      <w:r>
+        <w:t xml:space="preserve">confirmed identical… by direct</w:t>
+      </w:r>
+      <w:r>
+        <w:t xml:space="preserve"> </w:t>
+      </w:r>
+      <w:r>
+        <w:t xml:space="preserve">comparison</w:t>
+      </w:r>
+      <w:r>
+        <w:t xml:space="preserve">”</w:t>
+      </w:r>
+      <w:r>
+        <w:t xml:space="preserve"> </w:t>
+      </w:r>
+      <w:r>
+        <w:t xml:space="preserve">– rewritten to state the current fact (it’s identical between the two tools today)</w:t>
+      </w:r>
+      <w:r>
+        <w:t xml:space="preserve"> </w:t>
+      </w:r>
+      <w:r>
+        <w:t xml:space="preserve">without the refactor-history framing.</w:t>
+      </w:r>
+    </w:p>
+    <w:p>
+      <w:pPr>
+        <w:pStyle w:val="FirstParagraph"/>
+      </w:pPr>
+      <w:r>
+        <w:t xml:space="preserve">Rule-3 docstring gaps, separate from the rule-1/2 language issues above:</w:t>
+      </w:r>
+      <w:r>
+        <w:t xml:space="preserve"> </w:t>
+      </w:r>
+      <w:r>
+        <w:rPr>
+          <w:rStyle w:val="VerbatimChar"/>
+        </w:rPr>
+        <w:t xml:space="preserve">stage5_table_render.py</w:t>
+      </w:r>
+      <w:r>
+        <w:t xml:space="preserve">’s</w:t>
+      </w:r>
+      <w:r>
+        <w:t xml:space="preserve"> </w:t>
+      </w:r>
+      <w:r>
+        <w:t xml:space="preserve">scope paragraph only ever described 2 of its 6 functions (</w:t>
+      </w:r>
+      <w:r>
+        <w:rPr>
+          <w:rStyle w:val="VerbatimChar"/>
+        </w:rPr>
+        <w:t xml:space="preserve">select_entries()</w:t>
+      </w:r>
+      <w:r>
+        <w:t xml:space="preserve">/</w:t>
+      </w:r>
+      <w:r>
+        <w:rPr>
+          <w:rStyle w:val="VerbatimChar"/>
+        </w:rPr>
+        <w:t xml:space="preserve">render_table()</w:t>
+      </w:r>
+      <w:r>
+        <w:t xml:space="preserve">),</w:t>
+      </w:r>
+      <w:r>
+        <w:t xml:space="preserve"> </w:t>
+      </w:r>
+      <w:r>
+        <w:t xml:space="preserve">silent on</w:t>
+      </w:r>
+      <w:r>
+        <w:t xml:space="preserve"> </w:t>
+      </w:r>
+      <w:r>
+        <w:rPr>
+          <w:rStyle w:val="VerbatimChar"/>
+        </w:rPr>
+        <w:t xml:space="preserve">wrap_trailing_label()</w:t>
+      </w:r>
+      <w:r>
+        <w:t xml:space="preserve">/</w:t>
+      </w:r>
+      <w:r>
+        <w:rPr>
+          <w:rStyle w:val="VerbatimChar"/>
+        </w:rPr>
+        <w:t xml:space="preserve">iter_table_rows()</w:t>
+      </w:r>
+      <w:r>
+        <w:t xml:space="preserve">/</w:t>
+      </w:r>
+      <w:r>
+        <w:rPr>
+          <w:rStyle w:val="VerbatimChar"/>
+        </w:rPr>
+        <w:t xml:space="preserve">pct_total_note()</w:t>
+      </w:r>
+      <w:r>
+        <w:t xml:space="preserve">/</w:t>
+      </w:r>
+      <w:r>
+        <w:rPr>
+          <w:rStyle w:val="VerbatimChar"/>
+        </w:rPr>
+        <w:t xml:space="preserve">ranking_note()</w:t>
+      </w:r>
+      <w:r>
+        <w:t xml:space="preserve"> </w:t>
+      </w:r>
+      <w:r>
+        <w:t xml:space="preserve">added by</w:t>
+      </w:r>
+      <w:r>
+        <w:t xml:space="preserve"> </w:t>
+      </w:r>
+      <w:r>
+        <w:t xml:space="preserve">plans 2.10-2.11 – expanded to cover all three responsibilities the module actually has today</w:t>
+      </w:r>
+      <w:r>
+        <w:t xml:space="preserve"> </w:t>
+      </w:r>
+      <w:r>
+        <w:t xml:space="preserve">(rank/filter, render, wrap/reparse + legend-text generation). Separately, all 8 tool-level files</w:t>
+      </w:r>
+      <w:r>
+        <w:t xml:space="preserve"> </w:t>
+      </w:r>
+      <w:r>
+        <w:t xml:space="preserve">(</w:t>
+      </w:r>
+      <w:r>
+        <w:rPr>
+          <w:rStyle w:val="VerbatimChar"/>
+        </w:rPr>
+        <w:t xml:space="preserve">extract_CPU_hotspots.py</w:t>
+      </w:r>
+      <w:r>
+        <w:t xml:space="preserve">,</w:t>
+      </w:r>
+      <w:r>
+        <w:t xml:space="preserve"> </w:t>
+      </w:r>
+      <w:r>
+        <w:rPr>
+          <w:rStyle w:val="VerbatimChar"/>
+        </w:rPr>
+        <w:t xml:space="preserve">extract_GPU_hotspots.py</w:t>
+      </w:r>
+      <w:r>
+        <w:t xml:space="preserve">,</w:t>
+      </w:r>
+      <w:r>
+        <w:t xml:space="preserve"> </w:t>
+      </w:r>
+      <w:r>
+        <w:rPr>
+          <w:rStyle w:val="VerbatimChar"/>
+        </w:rPr>
+        <w:t xml:space="preserve">extract_hotspots.py</w:t>
+      </w:r>
+      <w:r>
+        <w:t xml:space="preserve">,</w:t>
+      </w:r>
+      <w:r>
+        <w:t xml:space="preserve"> </w:t>
+      </w:r>
+      <w:r>
+        <w:rPr>
+          <w:rStyle w:val="VerbatimChar"/>
+        </w:rPr>
+        <w:t xml:space="preserve">extract_calltree.py</w:t>
+      </w:r>
+      <w:r>
+        <w:t xml:space="preserve">,</w:t>
+      </w:r>
+      <w:r>
+        <w:t xml:space="preserve"> </w:t>
+      </w:r>
+      <w:r>
+        <w:rPr>
+          <w:rStyle w:val="VerbatimChar"/>
+        </w:rPr>
+        <w:t xml:space="preserve">extract_calltree_traced.py</w:t>
+      </w:r>
+      <w:r>
+        <w:t xml:space="preserve">,</w:t>
+      </w:r>
+      <w:r>
+        <w:t xml:space="preserve"> </w:t>
+      </w:r>
+      <w:r>
+        <w:rPr>
+          <w:rStyle w:val="VerbatimChar"/>
+        </w:rPr>
+        <w:t xml:space="preserve">extract_pop_metrics.py</w:t>
+      </w:r>
+      <w:r>
+        <w:t xml:space="preserve">,</w:t>
+      </w:r>
+      <w:r>
+        <w:t xml:space="preserve"> </w:t>
+      </w:r>
+      <w:r>
+        <w:rPr>
+          <w:rStyle w:val="VerbatimChar"/>
+        </w:rPr>
+        <w:t xml:space="preserve">select_hotspot_functions.py</w:t>
+      </w:r>
+      <w:r>
+        <w:t xml:space="preserve">,</w:t>
+      </w:r>
+      <w:r>
+        <w:t xml:space="preserve"> </w:t>
+      </w:r>
+      <w:r>
+        <w:rPr>
+          <w:rStyle w:val="VerbatimChar"/>
+        </w:rPr>
+        <w:t xml:space="preserve">select_hotspot_kernels.py</w:t>
+      </w:r>
+      <w:r>
+        <w:t xml:space="preserve">) lacked the</w:t>
+      </w:r>
+      <w:r>
+        <w:t xml:space="preserve"> </w:t>
+      </w:r>
+      <w:r>
+        <w:rPr>
+          <w:rStyle w:val="VerbatimChar"/>
+        </w:rPr>
+        <w:t xml:space="preserve">Functions:</w:t>
+      </w:r>
+      <w:r>
+        <w:t xml:space="preserve"> </w:t>
+      </w:r>
+      <w:r>
+        <w:t xml:space="preserve">line every</w:t>
+      </w:r>
+      <w:r>
+        <w:t xml:space="preserve"> </w:t>
+      </w:r>
+      <w:r>
+        <w:rPr>
+          <w:rStyle w:val="VerbatimChar"/>
+        </w:rPr>
+        <w:t xml:space="preserve">stage1</w:t>
+      </w:r>
+      <w:r>
+        <w:t xml:space="preserve">-</w:t>
+      </w:r>
+      <w:r>
+        <w:rPr>
+          <w:rStyle w:val="VerbatimChar"/>
+        </w:rPr>
+        <w:t xml:space="preserve">stage6</w:t>
+      </w:r>
+      <w:r>
+        <w:t xml:space="preserve"> </w:t>
+      </w:r>
+      <w:r>
+        <w:t xml:space="preserve">module already has</w:t>
+      </w:r>
+      <w:r>
+        <w:t xml:space="preserve"> </w:t>
+      </w:r>
+      <w:r>
+        <w:t xml:space="preserve">– added one to each, naming that file’s own exposed symbols, closing the one place this codebase’s</w:t>
+      </w:r>
+      <w:r>
+        <w:t xml:space="preserve"> </w:t>
+      </w:r>
+      <w:r>
+        <w:t xml:space="preserve">docstring convention wasn’t applied consistently.</w:t>
+      </w:r>
+    </w:p>
+    <w:p>
+      <w:pPr>
+        <w:pStyle w:val="BodyText"/>
+      </w:pPr>
+      <w:r>
+        <w:t xml:space="preserve">The other 20 of 29 files’ docstrings and comments were confirmed accurate and compliant already –</w:t>
+      </w:r>
+      <w:r>
+        <w:t xml:space="preserve"> </w:t>
+      </w:r>
+      <w:r>
+        <w:t xml:space="preserve">no changes needed. Verification: full suite stayed at 451 passing throughout; every edited module</w:t>
+      </w:r>
+      <w:r>
+        <w:t xml:space="preserve"> </w:t>
+      </w:r>
+      <w:r>
+        <w:t xml:space="preserve">spot-checked with a plain</w:t>
+      </w:r>
+      <w:r>
+        <w:t xml:space="preserve"> </w:t>
+      </w:r>
+      <w:r>
+        <w:rPr>
+          <w:rStyle w:val="VerbatimChar"/>
+        </w:rPr>
+        <w:t xml:space="preserve">import</w:t>
+      </w:r>
+      <w:r>
+        <w:t xml:space="preserve"> </w:t>
+      </w:r>
+      <w:r>
+        <w:t xml:space="preserve">to confirm no syntax errors;</w:t>
+      </w:r>
+      <w:r>
+        <w:t xml:space="preserve"> </w:t>
+      </w:r>
+      <w:r>
+        <w:rPr>
+          <w:rStyle w:val="VerbatimChar"/>
+        </w:rPr>
+        <w:t xml:space="preserve">--help</w:t>
+      </w:r>
+      <w:r>
+        <w:t xml:space="preserve"> </w:t>
+      </w:r>
+      <w:r>
+        <w:t xml:space="preserve">output on the 3</w:t>
+      </w:r>
+      <w:r>
+        <w:t xml:space="preserve"> </w:t>
+      </w:r>
+      <w:r>
+        <w:rPr>
+          <w:rStyle w:val="VerbatimChar"/>
+        </w:rPr>
+        <w:t xml:space="preserve">--unfiltered</w:t>
+      </w:r>
+      <w:r>
+        <w:t xml:space="preserve">-rewording tools read through to confirm the new wording reads naturally. No real-data</w:t>
+      </w:r>
+      <w:r>
+        <w:t xml:space="preserve"> </w:t>
+      </w:r>
+      <w:r>
+        <w:t xml:space="preserve">regeneration needed – report</w:t>
+      </w:r>
+      <w:r>
+        <w:t xml:space="preserve"> </w:t>
+      </w:r>
+      <w:r>
+        <w:rPr>
+          <w:iCs/>
+          <w:i/>
+        </w:rPr>
+        <w:t xml:space="preserve">output</w:t>
+      </w:r>
+      <w:r>
+        <w:t xml:space="preserve"> </w:t>
+      </w:r>
+      <w:r>
+        <w:t xml:space="preserve">text is untouched by this plan, only source comments</w:t>
+      </w:r>
+      <w:r>
+        <w:t xml:space="preserve"> </w:t>
+      </w:r>
+      <w:r>
+        <w:t xml:space="preserve">changed.</w:t>
+      </w:r>
+    </w:p>
     <w:bookmarkEnd w:id="76"/>
+    <w:bookmarkEnd w:id="77"/>
     <w:sectPr/>
   </w:body>
 </w:document>
@@ -43929,6 +45464,9 @@
     </w:lvlOverride>
   </w:num>
   <w:num w:numId="1015">
+    <w:abstractNumId w:val="991"/>
+  </w:num>
+  <w:num w:numId="1016">
     <w:abstractNumId w:val="991"/>
   </w:num>
 </w:numbering>

</xml_diff>

<commit_message>
Plan 2.14: consolidate main()'s repeated argument-handling/setup steps
New stage6_cli_common.py owns the argparse/validation boilerplate every CLI tool's main()
repeated: directory-existence checks (single and multi-directory), -o/--output destination
resolution, the -n/--top/--threshold/--all selection group, --max-depth, and --show-* noise-tier
flags. stage6_noise_config.py gains add_cli_argument()/configure_from_args() for
--extra-noise-config, co-located with the module that owns that behavior. All 8 tools' main()
migrated to the shared helpers with zero behavior change, confirmed by a full --help diff (6 of 8
tools byte-identical; the other 2 differences are deliberate wording unifications, not accidents)
and byte-identical real-data regeneration across all 6 test apps.

Co-Authored-By: Claude Sonnet 5 <noreply@anthropic.com>
</commit_message>
<xml_diff>
--- a/docs/DEVELOPMENT_HISTORY.docx
+++ b/docs/DEVELOPMENT_HISTORY.docx
@@ -10,7 +10,7 @@
         <w:t xml:space="preserve">Development History</w:t>
       </w:r>
     </w:p>
-    <w:bookmarkStart w:id="77" w:name="development-history"/>
+    <w:bookmarkStart w:id="78" w:name="development-history"/>
     <w:p>
       <w:pPr>
         <w:pStyle w:val="Heading1"/>
@@ -2906,6 +2906,179 @@
           </w:p>
         </w:tc>
       </w:tr>
+      <w:tr>
+        <w:tc>
+          <w:tcPr/>
+          <w:p>
+            <w:pPr>
+              <w:pStyle w:val="Compact"/>
+              <w:jc w:val="left"/>
+            </w:pPr>
+            <w:r>
+              <w:t xml:space="preserve">2026-08-17</w:t>
+            </w:r>
+          </w:p>
+        </w:tc>
+        <w:tc>
+          <w:tcPr/>
+          <w:p>
+            <w:pPr>
+              <w:pStyle w:val="Compact"/>
+              <w:jc w:val="left"/>
+            </w:pPr>
+            <w:r>
+              <w:t xml:space="preserve">Plan 2.14: consolidates</w:t>
+            </w:r>
+            <w:r>
+              <w:t xml:space="preserve"> </w:t>
+            </w:r>
+            <w:r>
+              <w:rPr>
+                <w:rStyle w:val="VerbatimChar"/>
+              </w:rPr>
+              <w:t xml:space="preserve">main()</w:t>
+            </w:r>
+            <w:r>
+              <w:t xml:space="preserve">’s repeated argument-handling/setup steps – new work beyond the original 11-step roadmap; new</w:t>
+            </w:r>
+            <w:r>
+              <w:t xml:space="preserve"> </w:t>
+            </w:r>
+            <w:r>
+              <w:rPr>
+                <w:rStyle w:val="VerbatimChar"/>
+              </w:rPr>
+              <w:t xml:space="preserve">stage6_cli_common.py</w:t>
+            </w:r>
+            <w:r>
+              <w:t xml:space="preserve"> </w:t>
+            </w:r>
+            <w:r>
+              <w:t xml:space="preserve">(directory validation,</w:t>
+            </w:r>
+            <w:r>
+              <w:t xml:space="preserve"> </w:t>
+            </w:r>
+            <w:r>
+              <w:rPr>
+                <w:rStyle w:val="VerbatimChar"/>
+              </w:rPr>
+              <w:t xml:space="preserve">-o</w:t>
+            </w:r>
+            <w:r>
+              <w:t xml:space="preserve">/</w:t>
+            </w:r>
+            <w:r>
+              <w:rPr>
+                <w:rStyle w:val="VerbatimChar"/>
+              </w:rPr>
+              <w:t xml:space="preserve">--output</w:t>
+            </w:r>
+            <w:r>
+              <w:t xml:space="preserve"> </w:t>
+            </w:r>
+            <w:r>
+              <w:t xml:space="preserve">resolution, the</w:t>
+            </w:r>
+            <w:r>
+              <w:t xml:space="preserve"> </w:t>
+            </w:r>
+            <w:r>
+              <w:rPr>
+                <w:rStyle w:val="VerbatimChar"/>
+              </w:rPr>
+              <w:t xml:space="preserve">-n/--top</w:t>
+            </w:r>
+            <w:r>
+              <w:t xml:space="preserve">/</w:t>
+            </w:r>
+            <w:r>
+              <w:rPr>
+                <w:rStyle w:val="VerbatimChar"/>
+              </w:rPr>
+              <w:t xml:space="preserve">--threshold</w:t>
+            </w:r>
+            <w:r>
+              <w:t xml:space="preserve">/</w:t>
+            </w:r>
+            <w:r>
+              <w:rPr>
+                <w:rStyle w:val="VerbatimChar"/>
+              </w:rPr>
+              <w:t xml:space="preserve">--all</w:t>
+            </w:r>
+            <w:r>
+              <w:t xml:space="preserve"> </w:t>
+            </w:r>
+            <w:r>
+              <w:t xml:space="preserve">selection group,</w:t>
+            </w:r>
+            <w:r>
+              <w:t xml:space="preserve"> </w:t>
+            </w:r>
+            <w:r>
+              <w:rPr>
+                <w:rStyle w:val="VerbatimChar"/>
+              </w:rPr>
+              <w:t xml:space="preserve">--max-depth</w:t>
+            </w:r>
+            <w:r>
+              <w:t xml:space="preserve">,</w:t>
+            </w:r>
+            <w:r>
+              <w:t xml:space="preserve"> </w:t>
+            </w:r>
+            <w:r>
+              <w:rPr>
+                <w:rStyle w:val="VerbatimChar"/>
+              </w:rPr>
+              <w:t xml:space="preserve">--show-*</w:t>
+            </w:r>
+            <w:r>
+              <w:t xml:space="preserve"> </w:t>
+            </w:r>
+            <w:r>
+              <w:t xml:space="preserve">noise-tier flags) plus</w:t>
+            </w:r>
+            <w:r>
+              <w:t xml:space="preserve"> </w:t>
+            </w:r>
+            <w:r>
+              <w:rPr>
+                <w:rStyle w:val="VerbatimChar"/>
+              </w:rPr>
+              <w:t xml:space="preserve">stage6_noise_config.add_cli_argument()</w:t>
+            </w:r>
+            <w:r>
+              <w:t xml:space="preserve">/</w:t>
+            </w:r>
+            <w:r>
+              <w:rPr>
+                <w:rStyle w:val="VerbatimChar"/>
+              </w:rPr>
+              <w:t xml:space="preserve">configure_from_args()</w:t>
+            </w:r>
+            <w:r>
+              <w:t xml:space="preserve">, replacing copy-pasted argparse blocks across all 8 CLI tools with zero behavior change (confirmed via full</w:t>
+            </w:r>
+            <w:r>
+              <w:t xml:space="preserve"> </w:t>
+            </w:r>
+            <w:r>
+              <w:rPr>
+                <w:rStyle w:val="VerbatimChar"/>
+              </w:rPr>
+              <w:t xml:space="preserve">--help</w:t>
+            </w:r>
+            <w:r>
+              <w:t xml:space="preserve"> </w:t>
+            </w:r>
+            <w:r>
+              <w:t xml:space="preserve">diff and byte-identical real-data regeneration) – see full accounting below</w:t>
+            </w:r>
+          </w:p>
+        </w:tc>
+      </w:tr>
     </w:tbl>
     <w:bookmarkStart w:id="20" w:name="project-scaffolding-and-rules"/>
     <w:p>
@@ -44768,7 +44941,1198 @@
       </w:r>
     </w:p>
     <w:bookmarkEnd w:id="76"/>
+    <w:bookmarkStart w:id="77" w:name="Xe4ae8a7d6466c990e0a2bd46075644efd4dbf64"/>
+    <w:p>
+      <w:pPr>
+        <w:pStyle w:val="Heading2"/>
+      </w:pPr>
+      <w:r>
+        <w:t xml:space="preserve">2026-08-17 — Plan 2.14: consolidate</w:t>
+      </w:r>
+      <w:r>
+        <w:t xml:space="preserve"> </w:t>
+      </w:r>
+      <w:r>
+        <w:rPr>
+          <w:rStyle w:val="VerbatimChar"/>
+        </w:rPr>
+        <w:t xml:space="preserve">main()</w:t>
+      </w:r>
+      <w:r>
+        <w:t xml:space="preserve">’s repeated argument-handling/setup steps</w:t>
+      </w:r>
+    </w:p>
+    <w:p>
+      <w:pPr>
+        <w:pStyle w:val="FirstParagraph"/>
+      </w:pPr>
+      <w:r>
+        <w:t xml:space="preserve">New work beyond the original 11-step roadmap, requested immediately after closing it out, having</w:t>
+      </w:r>
+      <w:r>
+        <w:t xml:space="preserve"> </w:t>
+      </w:r>
+      <w:r>
+        <w:t xml:space="preserve">just spent plan 2.12 copy-pasting near-identical</w:t>
+      </w:r>
+      <w:r>
+        <w:t xml:space="preserve"> </w:t>
+      </w:r>
+      <w:r>
+        <w:rPr>
+          <w:rStyle w:val="VerbatimChar"/>
+        </w:rPr>
+        <w:t xml:space="preserve">--extra-noise-config</w:t>
+      </w:r>
+      <w:r>
+        <w:t xml:space="preserve"> </w:t>
+      </w:r>
+      <w:r>
+        <w:t xml:space="preserve">blocks into 6 different</w:t>
+      </w:r>
+      <w:r>
+        <w:t xml:space="preserve"> </w:t>
+      </w:r>
+      <w:r>
+        <w:rPr>
+          <w:rStyle w:val="VerbatimChar"/>
+        </w:rPr>
+        <w:t xml:space="preserve">main()</w:t>
+      </w:r>
+      <w:r>
+        <w:t xml:space="preserve"> </w:t>
+      </w:r>
+      <w:r>
+        <w:t xml:space="preserve">functions. A direct grep across all 8 CLI tool files confirmed the duplication wasn’t</w:t>
+      </w:r>
+      <w:r>
+        <w:t xml:space="preserve"> </w:t>
+      </w:r>
+      <w:r>
+        <w:t xml:space="preserve">limited to that one flag: a byte-identical directory-existence check in 6 of 8 files (the other 2</w:t>
+      </w:r>
+      <w:r>
+        <w:t xml:space="preserve"> </w:t>
+      </w:r>
+      <w:r>
+        <w:t xml:space="preserve">had their own hand-rolled multi-directory variants); a</w:t>
+      </w:r>
+      <w:r>
+        <w:t xml:space="preserve"> </w:t>
+      </w:r>
+      <w:r>
+        <w:rPr>
+          <w:rStyle w:val="VerbatimChar"/>
+        </w:rPr>
+        <w:t xml:space="preserve">-n/--top</w:t>
+      </w:r>
+      <w:r>
+        <w:t xml:space="preserve">/</w:t>
+      </w:r>
+      <w:r>
+        <w:rPr>
+          <w:rStyle w:val="VerbatimChar"/>
+        </w:rPr>
+        <w:t xml:space="preserve">--threshold</w:t>
+      </w:r>
+      <w:r>
+        <w:t xml:space="preserve">/</w:t>
+      </w:r>
+      <w:r>
+        <w:rPr>
+          <w:rStyle w:val="VerbatimChar"/>
+        </w:rPr>
+        <w:t xml:space="preserve">--all</w:t>
+      </w:r>
+      <w:r>
+        <w:t xml:space="preserve"> </w:t>
+      </w:r>
+      <w:r>
+        <w:t xml:space="preserve">mutually-exclusive selection group in 4 files with near-identical wording;</w:t>
+      </w:r>
+      <w:r>
+        <w:t xml:space="preserve"> </w:t>
+      </w:r>
+      <w:r>
+        <w:rPr>
+          <w:rStyle w:val="VerbatimChar"/>
+        </w:rPr>
+        <w:t xml:space="preserve">--max-depth</w:t>
+      </w:r>
+      <w:r>
+        <w:t xml:space="preserve"> </w:t>
+      </w:r>
+      <w:r>
+        <w:t xml:space="preserve">byte-identical in both calltree tools; 4</w:t>
+      </w:r>
+      <w:r>
+        <w:t xml:space="preserve"> </w:t>
+      </w:r>
+      <w:r>
+        <w:rPr>
+          <w:rStyle w:val="VerbatimChar"/>
+        </w:rPr>
+        <w:t xml:space="preserve">--show-*</w:t>
+      </w:r>
+      <w:r>
+        <w:t xml:space="preserve"> </w:t>
+      </w:r>
+      <w:r>
+        <w:t xml:space="preserve">noise-visibility flags, 3 of them</w:t>
+      </w:r>
+      <w:r>
+        <w:t xml:space="preserve"> </w:t>
+      </w:r>
+      <w:r>
+        <w:t xml:space="preserve">byte-identical between the two calltree tools and one (</w:t>
+      </w:r>
+      <w:r>
+        <w:rPr>
+          <w:rStyle w:val="VerbatimChar"/>
+        </w:rPr>
+        <w:t xml:space="preserve">--show-gpu-api</w:t>
+      </w:r>
+      <w:r>
+        <w:t xml:space="preserve">) worded differently between</w:t>
+      </w:r>
+      <w:r>
+        <w:t xml:space="preserve"> </w:t>
+      </w:r>
+      <w:r>
+        <w:t xml:space="preserve">them; and the same</w:t>
+      </w:r>
+      <w:r>
+        <w:t xml:space="preserve"> </w:t>
+      </w:r>
+      <w:r>
+        <w:rPr>
+          <w:rStyle w:val="VerbatimChar"/>
+        </w:rPr>
+        <w:t xml:space="preserve">-o</w:t>
+      </w:r>
+      <w:r>
+        <w:t xml:space="preserve">/</w:t>
+      </w:r>
+      <w:r>
+        <w:rPr>
+          <w:rStyle w:val="VerbatimChar"/>
+        </w:rPr>
+        <w:t xml:space="preserve">--output</w:t>
+      </w:r>
+      <w:r>
+        <w:t xml:space="preserve"> </w:t>
+      </w:r>
+      <w:r>
+        <w:t xml:space="preserve">destination-resolution pattern in ~6 files.</w:t>
+      </w:r>
+    </w:p>
+    <w:p>
+      <w:pPr>
+        <w:pStyle w:val="BodyText"/>
+      </w:pPr>
+      <w:r>
+        <w:rPr>
+          <w:bCs/>
+          <w:b/>
+        </w:rPr>
+        <w:t xml:space="preserve">New module</w:t>
+      </w:r>
+      <w:r>
+        <w:rPr>
+          <w:bCs/>
+          <w:b/>
+        </w:rPr>
+        <w:t xml:space="preserve"> </w:t>
+      </w:r>
+      <w:r>
+        <w:rPr>
+          <w:rStyle w:val="VerbatimChar"/>
+          <w:bCs/>
+          <w:b/>
+        </w:rPr>
+        <w:t xml:space="preserve">stage6_cli_common.py</w:t>
+      </w:r>
+      <w:r>
+        <w:t xml:space="preserve">, a 4th narrowly-scoped stage-6 module alongside</w:t>
+      </w:r>
+      <w:r>
+        <w:t xml:space="preserve"> </w:t>
+      </w:r>
+      <w:r>
+        <w:rPr>
+          <w:rStyle w:val="VerbatimChar"/>
+        </w:rPr>
+        <w:t xml:space="preserve">stage6_report_builder.py</w:t>
+      </w:r>
+      <w:r>
+        <w:t xml:space="preserve">/</w:t>
+      </w:r>
+      <w:r>
+        <w:rPr>
+          <w:rStyle w:val="VerbatimChar"/>
+        </w:rPr>
+        <w:t xml:space="preserve">stage6_run_metadata.py</w:t>
+      </w:r>
+      <w:r>
+        <w:t xml:space="preserve">/</w:t>
+      </w:r>
+      <w:r>
+        <w:rPr>
+          <w:rStyle w:val="VerbatimChar"/>
+        </w:rPr>
+        <w:t xml:space="preserve">stage6_noise_config.py</w:t>
+      </w:r>
+      <w:r>
+        <w:t xml:space="preserve">:</w:t>
+      </w:r>
+      <w:r>
+        <w:t xml:space="preserve"> </w:t>
+      </w:r>
+      <w:r>
+        <w:rPr>
+          <w:rStyle w:val="VerbatimChar"/>
+        </w:rPr>
+        <w:t xml:space="preserve">require_directory()</w:t>
+      </w:r>
+      <w:r>
+        <w:t xml:space="preserve">/</w:t>
+      </w:r>
+      <w:r>
+        <w:t xml:space="preserve"> </w:t>
+      </w:r>
+      <w:r>
+        <w:rPr>
+          <w:rStyle w:val="VerbatimChar"/>
+        </w:rPr>
+        <w:t xml:space="preserve">require_directories()</w:t>
+      </w:r>
+      <w:r>
+        <w:t xml:space="preserve"> </w:t>
+      </w:r>
+      <w:r>
+        <w:t xml:space="preserve">(the latter treating</w:t>
+      </w:r>
+      <w:r>
+        <w:t xml:space="preserve"> </w:t>
+      </w:r>
+      <w:r>
+        <w:rPr>
+          <w:rStyle w:val="VerbatimChar"/>
+        </w:rPr>
+        <w:t xml:space="preserve">None</w:t>
+      </w:r>
+      <w:r>
+        <w:t xml:space="preserve"> </w:t>
+      </w:r>
+      <w:r>
+        <w:t xml:space="preserve">entries as</w:t>
+      </w:r>
+      <w:r>
+        <w:t xml:space="preserve"> </w:t>
+      </w:r>
+      <w:r>
+        <w:t xml:space="preserve">“</w:t>
+      </w:r>
+      <w:r>
+        <w:t xml:space="preserve">not given,</w:t>
+      </w:r>
+      <w:r>
+        <w:t xml:space="preserve">”</w:t>
+      </w:r>
+      <w:r>
+        <w:t xml:space="preserve"> </w:t>
+      </w:r>
+      <w:r>
+        <w:t xml:space="preserve">not</w:t>
+      </w:r>
+      <w:r>
+        <w:t xml:space="preserve"> </w:t>
+      </w:r>
+      <w:r>
+        <w:t xml:space="preserve">“</w:t>
+      </w:r>
+      <w:r>
+        <w:t xml:space="preserve">missing</w:t>
+      </w:r>
+      <w:r>
+        <w:t xml:space="preserve">”</w:t>
+      </w:r>
+      <w:r>
+        <w:t xml:space="preserve"> </w:t>
+      </w:r>
+      <w:r>
+        <w:t xml:space="preserve">– the</w:t>
+      </w:r>
+      <w:r>
+        <w:t xml:space="preserve"> </w:t>
+      </w:r>
+      <w:r>
+        <w:t xml:space="preserve">same distinction each tool’s own resolved-optional-GPU-directory logic already needed, now shared</w:t>
+      </w:r>
+      <w:r>
+        <w:t xml:space="preserve"> </w:t>
+      </w:r>
+      <w:r>
+        <w:t xml:space="preserve">instead of duplicated),</w:t>
+      </w:r>
+      <w:r>
+        <w:t xml:space="preserve"> </w:t>
+      </w:r>
+      <w:r>
+        <w:rPr>
+          <w:rStyle w:val="VerbatimChar"/>
+        </w:rPr>
+        <w:t xml:space="preserve">resolve_dest()</w:t>
+      </w:r>
+      <w:r>
+        <w:t xml:space="preserve">,</w:t>
+      </w:r>
+      <w:r>
+        <w:t xml:space="preserve"> </w:t>
+      </w:r>
+      <w:r>
+        <w:rPr>
+          <w:rStyle w:val="VerbatimChar"/>
+        </w:rPr>
+        <w:t xml:space="preserve">add_selection_args()</w:t>
+      </w:r>
+      <w:r>
+        <w:t xml:space="preserve">,</w:t>
+      </w:r>
+      <w:r>
+        <w:t xml:space="preserve"> </w:t>
+      </w:r>
+      <w:r>
+        <w:rPr>
+          <w:rStyle w:val="VerbatimChar"/>
+        </w:rPr>
+        <w:t xml:space="preserve">add_max_depth_arg()</w:t>
+      </w:r>
+      <w:r>
+        <w:t xml:space="preserve">, and</w:t>
+      </w:r>
+      <w:r>
+        <w:t xml:space="preserve"> </w:t>
+      </w:r>
+      <w:r>
+        <w:rPr>
+          <w:rStyle w:val="VerbatimChar"/>
+        </w:rPr>
+        <w:t xml:space="preserve">add_noise_tier_args()</w:t>
+      </w:r>
+      <w:r>
+        <w:t xml:space="preserve"> </w:t>
+      </w:r>
+      <w:r>
+        <w:t xml:space="preserve">(any subset of the 4</w:t>
+      </w:r>
+      <w:r>
+        <w:t xml:space="preserve"> </w:t>
+      </w:r>
+      <w:r>
+        <w:rPr>
+          <w:rStyle w:val="VerbatimChar"/>
+        </w:rPr>
+        <w:t xml:space="preserve">--show-*</w:t>
+      </w:r>
+      <w:r>
+        <w:t xml:space="preserve"> </w:t>
+      </w:r>
+      <w:r>
+        <w:t xml:space="preserve">tiers, with an optional</w:t>
+      </w:r>
+      <w:r>
+        <w:t xml:space="preserve"> </w:t>
+      </w:r>
+      <w:r>
+        <w:rPr>
+          <w:rStyle w:val="VerbatimChar"/>
+        </w:rPr>
+        <w:t xml:space="preserve">--show-all-internals</w:t>
+      </w:r>
+      <w:r>
+        <w:t xml:space="preserve"> </w:t>
+      </w:r>
+      <w:r>
+        <w:t xml:space="preserve">shorthand when 2+ tiers are requested).</w:t>
+      </w:r>
+      <w:r>
+        <w:t xml:space="preserve"> </w:t>
+      </w:r>
+      <w:r>
+        <w:rPr>
+          <w:rStyle w:val="VerbatimChar"/>
+        </w:rPr>
+        <w:t xml:space="preserve">--extra-noise-config</w:t>
+      </w:r>
+      <w:r>
+        <w:t xml:space="preserve">’s own</w:t>
+      </w:r>
+      <w:r>
+        <w:t xml:space="preserve"> </w:t>
+      </w:r>
+      <w:r>
+        <w:t xml:space="preserve">argparse registration moved to</w:t>
+      </w:r>
+      <w:r>
+        <w:t xml:space="preserve"> </w:t>
+      </w:r>
+      <w:r>
+        <w:rPr>
+          <w:rStyle w:val="VerbatimChar"/>
+        </w:rPr>
+        <w:t xml:space="preserve">stage6_noise_config.add_cli_argument()</w:t>
+      </w:r>
+      <w:r>
+        <w:t xml:space="preserve">/</w:t>
+      </w:r>
+      <w:r>
+        <w:rPr>
+          <w:rStyle w:val="VerbatimChar"/>
+        </w:rPr>
+        <w:t xml:space="preserve">configure_from_args()</w:t>
+      </w:r>
+      <w:r>
+        <w:t xml:space="preserve"> </w:t>
+      </w:r>
+      <w:r>
+        <w:t xml:space="preserve">instead – co-located with the module that owns that behavior, not folded into the generic grab-bag.</w:t>
+      </w:r>
+    </w:p>
+    <w:p>
+      <w:pPr>
+        <w:pStyle w:val="BodyText"/>
+      </w:pPr>
+      <w:r>
+        <w:rPr>
+          <w:bCs/>
+          <w:b/>
+        </w:rPr>
+        <w:t xml:space="preserve">A real wording inconsistency surfaced while consolidating</w:t>
+      </w:r>
+      <w:r>
+        <w:rPr>
+          <w:bCs/>
+          <w:b/>
+        </w:rPr>
+        <w:t xml:space="preserve"> </w:t>
+      </w:r>
+      <w:r>
+        <w:rPr>
+          <w:rStyle w:val="VerbatimChar"/>
+          <w:bCs/>
+          <w:b/>
+        </w:rPr>
+        <w:t xml:space="preserve">add_selection_args()</w:t>
+      </w:r>
+      <w:r>
+        <w:t xml:space="preserve">: the three</w:t>
+      </w:r>
+      <w:r>
+        <w:t xml:space="preserve"> </w:t>
+      </w:r>
+      <w:r>
+        <w:t xml:space="preserve">lines of the selection group (</w:t>
+      </w:r>
+      <w:r>
+        <w:rPr>
+          <w:rStyle w:val="VerbatimChar"/>
+        </w:rPr>
+        <w:t xml:space="preserve">-n/--top</w:t>
+      </w:r>
+      <w:r>
+        <w:t xml:space="preserve">,</w:t>
+      </w:r>
+      <w:r>
+        <w:t xml:space="preserve"> </w:t>
+      </w:r>
+      <w:r>
+        <w:rPr>
+          <w:rStyle w:val="VerbatimChar"/>
+        </w:rPr>
+        <w:t xml:space="preserve">--threshold</w:t>
+      </w:r>
+      <w:r>
+        <w:t xml:space="preserve">,</w:t>
+      </w:r>
+      <w:r>
+        <w:t xml:space="preserve"> </w:t>
+      </w:r>
+      <w:r>
+        <w:rPr>
+          <w:rStyle w:val="VerbatimChar"/>
+        </w:rPr>
+        <w:t xml:space="preserve">--all</w:t>
+      </w:r>
+      <w:r>
+        <w:t xml:space="preserve">) don’t share one noun across every</w:t>
+      </w:r>
+      <w:r>
+        <w:t xml:space="preserve"> </w:t>
+      </w:r>
+      <w:r>
+        <w:t xml:space="preserve">tool today –</w:t>
+      </w:r>
+      <w:r>
+        <w:t xml:space="preserve"> </w:t>
+      </w:r>
+      <w:r>
+        <w:rPr>
+          <w:rStyle w:val="VerbatimChar"/>
+        </w:rPr>
+        <w:t xml:space="preserve">extract_CPU_hotspots.py</w:t>
+      </w:r>
+      <w:r>
+        <w:t xml:space="preserve">’s own three lines say</w:t>
+      </w:r>
+      <w:r>
+        <w:t xml:space="preserve"> </w:t>
+      </w:r>
+      <w:r>
+        <w:t xml:space="preserve">“</w:t>
+      </w:r>
+      <w:r>
+        <w:t xml:space="preserve">hotspots</w:t>
+      </w:r>
+      <w:r>
+        <w:t xml:space="preserve">”</w:t>
+      </w:r>
+      <w:r>
+        <w:t xml:space="preserve"> </w:t>
+      </w:r>
+      <w:r>
+        <w:t xml:space="preserve">(top),</w:t>
+      </w:r>
+      <w:r>
+        <w:t xml:space="preserve"> </w:t>
+      </w:r>
+      <w:r>
+        <w:t xml:space="preserve">“</w:t>
+      </w:r>
+      <w:r>
+        <w:t xml:space="preserve">entries</w:t>
+      </w:r>
+      <w:r>
+        <w:t xml:space="preserve">”</w:t>
+      </w:r>
+      <w:r>
+        <w:t xml:space="preserve"> </w:t>
+      </w:r>
+      <w:r>
+        <w:t xml:space="preserve">(threshold),</w:t>
+      </w:r>
+      <w:r>
+        <w:t xml:space="preserve"> </w:t>
+      </w:r>
+      <w:r>
+        <w:t xml:space="preserve">“</w:t>
+      </w:r>
+      <w:r>
+        <w:t xml:space="preserve">entry</w:t>
+      </w:r>
+      <w:r>
+        <w:t xml:space="preserve">”</w:t>
+      </w:r>
+      <w:r>
+        <w:t xml:space="preserve"> </w:t>
+      </w:r>
+      <w:r>
+        <w:t xml:space="preserve">(all) in the</w:t>
+      </w:r>
+      <w:r>
+        <w:t xml:space="preserve"> </w:t>
+      </w:r>
+      <w:r>
+        <w:rPr>
+          <w:iCs/>
+          <w:i/>
+        </w:rPr>
+        <w:t xml:space="preserve">same tool</w:t>
+      </w:r>
+      <w:r>
+        <w:t xml:space="preserve">, and</w:t>
+      </w:r>
+      <w:r>
+        <w:t xml:space="preserve"> </w:t>
+      </w:r>
+      <w:r>
+        <w:rPr>
+          <w:rStyle w:val="VerbatimChar"/>
+        </w:rPr>
+        <w:t xml:space="preserve">select_hotspot_functions.py</w:t>
+      </w:r>
+      <w:r>
+        <w:t xml:space="preserve">/</w:t>
+      </w:r>
+      <w:r>
+        <w:t xml:space="preserve"> </w:t>
+      </w:r>
+      <w:r>
+        <w:rPr>
+          <w:rStyle w:val="VerbatimChar"/>
+        </w:rPr>
+        <w:t xml:space="preserve">select_hotspot_kernels.py</w:t>
+      </w:r>
+      <w:r>
+        <w:t xml:space="preserve"> </w:t>
+      </w:r>
+      <w:r>
+        <w:t xml:space="preserve">use</w:t>
+      </w:r>
+      <w:r>
+        <w:t xml:space="preserve"> </w:t>
+      </w:r>
+      <w:r>
+        <w:t xml:space="preserve">“</w:t>
+      </w:r>
+      <w:r>
+        <w:t xml:space="preserve">select</w:t>
+      </w:r>
+      <w:r>
+        <w:t xml:space="preserve">”</w:t>
+      </w:r>
+      <w:r>
+        <w:t xml:space="preserve"> </w:t>
+      </w:r>
+      <w:r>
+        <w:t xml:space="preserve">where the report tools say</w:t>
+      </w:r>
+      <w:r>
+        <w:t xml:space="preserve"> </w:t>
+      </w:r>
+      <w:r>
+        <w:t xml:space="preserve">“</w:t>
+      </w:r>
+      <w:r>
+        <w:t xml:space="preserve">list</w:t>
+      </w:r>
+      <w:r>
+        <w:t xml:space="preserve">”</w:t>
+      </w:r>
+      <w:r>
+        <w:t xml:space="preserve">. Rather than force one</w:t>
+      </w:r>
+      <w:r>
+        <w:t xml:space="preserve"> </w:t>
+      </w:r>
+      <w:r>
+        <w:t xml:space="preserve">noun (which would have silently changed real help text mid-consolidation),</w:t>
+      </w:r>
+      <w:r>
+        <w:t xml:space="preserve"> </w:t>
+      </w:r>
+      <w:r>
+        <w:rPr>
+          <w:rStyle w:val="VerbatimChar"/>
+        </w:rPr>
+        <w:t xml:space="preserve">add_selection_args()</w:t>
+      </w:r>
+      <w:r>
+        <w:t xml:space="preserve"> </w:t>
+      </w:r>
+      <w:r>
+        <w:t xml:space="preserve">takes a</w:t>
+      </w:r>
+      <w:r>
+        <w:t xml:space="preserve"> </w:t>
+      </w:r>
+      <w:r>
+        <w:rPr>
+          <w:rStyle w:val="VerbatimChar"/>
+        </w:rPr>
+        <w:t xml:space="preserve">plural_noun</w:t>
+      </w:r>
+      <w:r>
+        <w:t xml:space="preserve"> </w:t>
+      </w:r>
+      <w:r>
+        <w:t xml:space="preserve">(the</w:t>
+      </w:r>
+      <w:r>
+        <w:t xml:space="preserve"> </w:t>
+      </w:r>
+      <w:r>
+        <w:rPr>
+          <w:rStyle w:val="VerbatimChar"/>
+        </w:rPr>
+        <w:t xml:space="preserve">--threshold</w:t>
+      </w:r>
+      <w:r>
+        <w:t xml:space="preserve"> </w:t>
+      </w:r>
+      <w:r>
+        <w:t xml:space="preserve">line’s own noun), an optional</w:t>
+      </w:r>
+      <w:r>
+        <w:t xml:space="preserve"> </w:t>
+      </w:r>
+      <w:r>
+        <w:rPr>
+          <w:rStyle w:val="VerbatimChar"/>
+        </w:rPr>
+        <w:t xml:space="preserve">singular_noun</w:t>
+      </w:r>
+      <w:r>
+        <w:t xml:space="preserve"> </w:t>
+      </w:r>
+      <w:r>
+        <w:t xml:space="preserve">(defaults to</w:t>
+      </w:r>
+      <w:r>
+        <w:t xml:space="preserve"> </w:t>
+      </w:r>
+      <w:r>
+        <w:t xml:space="preserve">stripping a trailing</w:t>
+      </w:r>
+      <w:r>
+        <w:t xml:space="preserve"> </w:t>
+      </w:r>
+      <w:r>
+        <w:t xml:space="preserve">“</w:t>
+      </w:r>
+      <w:r>
+        <w:t xml:space="preserve">s</w:t>
+      </w:r>
+      <w:r>
+        <w:t xml:space="preserve">”</w:t>
+      </w:r>
+      <w:r>
+        <w:t xml:space="preserve"> </w:t>
+      </w:r>
+      <w:r>
+        <w:t xml:space="preserve">– wrong for</w:t>
+      </w:r>
+      <w:r>
+        <w:t xml:space="preserve"> </w:t>
+      </w:r>
+      <w:r>
+        <w:t xml:space="preserve">“</w:t>
+      </w:r>
+      <w:r>
+        <w:t xml:space="preserve">entries</w:t>
+      </w:r>
+      <w:r>
+        <w:t xml:space="preserve">”</w:t>
+      </w:r>
+      <w:r>
+        <w:t xml:space="preserve">, caught by a test using that exact case and fixed by</w:t>
+      </w:r>
+      <w:r>
+        <w:t xml:space="preserve"> </w:t>
+      </w:r>
+      <w:r>
+        <w:t xml:space="preserve">passing</w:t>
+      </w:r>
+      <w:r>
+        <w:t xml:space="preserve"> </w:t>
+      </w:r>
+      <w:r>
+        <w:rPr>
+          <w:rStyle w:val="VerbatimChar"/>
+        </w:rPr>
+        <w:t xml:space="preserve">singular_noun="entry"</w:t>
+      </w:r>
+      <w:r>
+        <w:t xml:space="preserve"> </w:t>
+      </w:r>
+      <w:r>
+        <w:t xml:space="preserve">explicitly at its 2 real call sites), an optional</w:t>
+      </w:r>
+      <w:r>
+        <w:t xml:space="preserve"> </w:t>
+      </w:r>
+      <w:r>
+        <w:rPr>
+          <w:rStyle w:val="VerbatimChar"/>
+        </w:rPr>
+        <w:t xml:space="preserve">top_noun</w:t>
+      </w:r>
+      <w:r>
+        <w:t xml:space="preserve"> </w:t>
+      </w:r>
+      <w:r>
+        <w:t xml:space="preserve">(defaults to</w:t>
+      </w:r>
+      <w:r>
+        <w:t xml:space="preserve"> </w:t>
+      </w:r>
+      <w:r>
+        <w:rPr>
+          <w:rStyle w:val="VerbatimChar"/>
+        </w:rPr>
+        <w:t xml:space="preserve">plural_noun</w:t>
+      </w:r>
+      <w:r>
+        <w:t xml:space="preserve">, overridable for the tools whose</w:t>
+      </w:r>
+      <w:r>
+        <w:t xml:space="preserve"> </w:t>
+      </w:r>
+      <w:r>
+        <w:rPr>
+          <w:rStyle w:val="VerbatimChar"/>
+        </w:rPr>
+        <w:t xml:space="preserve">-n/--top</w:t>
+      </w:r>
+      <w:r>
+        <w:t xml:space="preserve"> </w:t>
+      </w:r>
+      <w:r>
+        <w:t xml:space="preserve">line uses a different,</w:t>
+      </w:r>
+      <w:r>
+        <w:t xml:space="preserve"> </w:t>
+      </w:r>
+      <w:r>
+        <w:t xml:space="preserve">often more qualified phrase like</w:t>
+      </w:r>
+      <w:r>
+        <w:t xml:space="preserve"> </w:t>
+      </w:r>
+      <w:r>
+        <w:t xml:space="preserve">“</w:t>
+      </w:r>
+      <w:r>
+        <w:t xml:space="preserve">hotspot kernels</w:t>
+      </w:r>
+      <w:r>
+        <w:t xml:space="preserve">”</w:t>
+      </w:r>
+      <w:r>
+        <w:t xml:space="preserve">), and</w:t>
+      </w:r>
+      <w:r>
+        <w:t xml:space="preserve"> </w:t>
+      </w:r>
+      <w:r>
+        <w:rPr>
+          <w:rStyle w:val="VerbatimChar"/>
+        </w:rPr>
+        <w:t xml:space="preserve">verb</w:t>
+      </w:r>
+      <w:r>
+        <w:t xml:space="preserve"> </w:t>
+      </w:r>
+      <w:r>
+        <w:t xml:space="preserve">(defaults to</w:t>
+      </w:r>
+      <w:r>
+        <w:t xml:space="preserve"> </w:t>
+      </w:r>
+      <w:r>
+        <w:rPr>
+          <w:rStyle w:val="VerbatimChar"/>
+        </w:rPr>
+        <w:t xml:space="preserve">"list"</w:t>
+      </w:r>
+      <w:r>
+        <w:t xml:space="preserve">,</w:t>
+      </w:r>
+      <w:r>
+        <w:t xml:space="preserve"> </w:t>
+      </w:r>
+      <w:r>
+        <w:rPr>
+          <w:rStyle w:val="VerbatimChar"/>
+        </w:rPr>
+        <w:t xml:space="preserve">select_hotspot_*.py</w:t>
+      </w:r>
+      <w:r>
+        <w:t xml:space="preserve"> </w:t>
+      </w:r>
+      <w:r>
+        <w:t xml:space="preserve">pass</w:t>
+      </w:r>
+      <w:r>
+        <w:t xml:space="preserve"> </w:t>
+      </w:r>
+      <w:r>
+        <w:rPr>
+          <w:rStyle w:val="VerbatimChar"/>
+        </w:rPr>
+        <w:t xml:space="preserve">"select"</w:t>
+      </w:r>
+      <w:r>
+        <w:t xml:space="preserve">) – preserving every tool’s exact original wording rather than</w:t>
+      </w:r>
+      <w:r>
+        <w:t xml:space="preserve"> </w:t>
+      </w:r>
+      <w:r>
+        <w:t xml:space="preserve">collapsing them into one.</w:t>
+      </w:r>
+    </w:p>
+    <w:p>
+      <w:pPr>
+        <w:pStyle w:val="BodyText"/>
+      </w:pPr>
+      <w:r>
+        <w:t xml:space="preserve">Every one of the 8 tools’</w:t>
+      </w:r>
+      <w:r>
+        <w:t xml:space="preserve"> </w:t>
+      </w:r>
+      <w:r>
+        <w:rPr>
+          <w:rStyle w:val="VerbatimChar"/>
+        </w:rPr>
+        <w:t xml:space="preserve">main()</w:t>
+      </w:r>
+      <w:r>
+        <w:t xml:space="preserve"> </w:t>
+      </w:r>
+      <w:r>
+        <w:t xml:space="preserve">was updated to call the shared helpers instead of repeating the</w:t>
+      </w:r>
+      <w:r>
+        <w:t xml:space="preserve"> </w:t>
+      </w:r>
+      <w:r>
+        <w:t xml:space="preserve">inline code. Verification: full</w:t>
+      </w:r>
+      <w:r>
+        <w:t xml:space="preserve"> </w:t>
+      </w:r>
+      <w:r>
+        <w:rPr>
+          <w:rStyle w:val="VerbatimChar"/>
+        </w:rPr>
+        <w:t xml:space="preserve">--help</w:t>
+      </w:r>
+      <w:r>
+        <w:t xml:space="preserve"> </w:t>
+      </w:r>
+      <w:r>
+        <w:t xml:space="preserve">diff, before vs. after, across all 8 tools – 6 came back</w:t>
+      </w:r>
+      <w:r>
+        <w:t xml:space="preserve"> </w:t>
+      </w:r>
+      <w:r>
+        <w:t xml:space="preserve">completely byte-identical; the other 2 differences are both deliberate, expected consolidation</w:t>
+      </w:r>
+      <w:r>
+        <w:t xml:space="preserve"> </w:t>
+      </w:r>
+      <w:r>
+        <w:t xml:space="preserve">side-effects, not accidents:</w:t>
+      </w:r>
+      <w:r>
+        <w:t xml:space="preserve"> </w:t>
+      </w:r>
+      <w:r>
+        <w:rPr>
+          <w:rStyle w:val="VerbatimChar"/>
+        </w:rPr>
+        <w:t xml:space="preserve">extract_calltree.py</w:t>
+      </w:r>
+      <w:r>
+        <w:t xml:space="preserve">’s</w:t>
+      </w:r>
+      <w:r>
+        <w:t xml:space="preserve"> </w:t>
+      </w:r>
+      <w:r>
+        <w:rPr>
+          <w:rStyle w:val="VerbatimChar"/>
+        </w:rPr>
+        <w:t xml:space="preserve">--show-all-internals</w:t>
+      </w:r>
+      <w:r>
+        <w:t xml:space="preserve"> </w:t>
+      </w:r>
+      <w:r>
+        <w:t xml:space="preserve">line now says</w:t>
+      </w:r>
+      <w:r>
+        <w:t xml:space="preserve"> </w:t>
+      </w:r>
+      <w:r>
+        <w:t xml:space="preserve">“</w:t>
+      </w:r>
+      <w:r>
+        <w:t xml:space="preserve">all 4</w:t>
+      </w:r>
+      <w:r>
+        <w:t xml:space="preserve"> </w:t>
+      </w:r>
+      <w:r>
+        <w:t xml:space="preserve">–show-* flags</w:t>
+      </w:r>
+      <w:r>
+        <w:t xml:space="preserve">”</w:t>
+      </w:r>
+      <w:r>
+        <w:t xml:space="preserve"> </w:t>
+      </w:r>
+      <w:r>
+        <w:t xml:space="preserve">(computed from</w:t>
+      </w:r>
+      <w:r>
+        <w:t xml:space="preserve"> </w:t>
+      </w:r>
+      <w:r>
+        <w:rPr>
+          <w:rStyle w:val="VerbatimChar"/>
+        </w:rPr>
+        <w:t xml:space="preserve">len(tiers)</w:t>
+      </w:r>
+      <w:r>
+        <w:t xml:space="preserve">) instead of the hardcoded word</w:t>
+      </w:r>
+      <w:r>
+        <w:t xml:space="preserve"> </w:t>
+      </w:r>
+      <w:r>
+        <w:t xml:space="preserve">“</w:t>
+      </w:r>
+      <w:r>
+        <w:t xml:space="preserve">four</w:t>
+      </w:r>
+      <w:r>
+        <w:t xml:space="preserve">”</w:t>
+      </w:r>
+      <w:r>
+        <w:t xml:space="preserve">; and</w:t>
+      </w:r>
+      <w:r>
+        <w:t xml:space="preserve"> </w:t>
+      </w:r>
+      <w:r>
+        <w:rPr>
+          <w:rStyle w:val="VerbatimChar"/>
+        </w:rPr>
+        <w:t xml:space="preserve">extract_calltree_traced.py</w:t>
+      </w:r>
+      <w:r>
+        <w:t xml:space="preserve">’s own</w:t>
+      </w:r>
+      <w:r>
+        <w:t xml:space="preserve"> </w:t>
+      </w:r>
+      <w:r>
+        <w:rPr>
+          <w:rStyle w:val="VerbatimChar"/>
+        </w:rPr>
+        <w:t xml:space="preserve">--show-gpu-api</w:t>
+      </w:r>
+      <w:r>
+        <w:t xml:space="preserve"> </w:t>
+      </w:r>
+      <w:r>
+        <w:t xml:space="preserve">help text – which, it turned out, was never</w:t>
+      </w:r>
+      <w:r>
+        <w:t xml:space="preserve"> </w:t>
+      </w:r>
+      <w:r>
+        <w:t xml:space="preserve">actually byte-identical to</w:t>
+      </w:r>
+      <w:r>
+        <w:t xml:space="preserve"> </w:t>
+      </w:r>
+      <w:r>
+        <w:rPr>
+          <w:rStyle w:val="VerbatimChar"/>
+        </w:rPr>
+        <w:t xml:space="preserve">extract_calltree.py</w:t>
+      </w:r>
+      <w:r>
+        <w:t xml:space="preserve">’s version to begin with (it separately named the</w:t>
+      </w:r>
+      <w:r>
+        <w:t xml:space="preserve"> </w:t>
+      </w:r>
+      <w:r>
+        <w:t xml:space="preserve">hip/hsa/roctx/kfd/rocdecode/rocjpeg/rocr prefix list) – now shares</w:t>
+      </w:r>
+      <w:r>
+        <w:t xml:space="preserve"> </w:t>
+      </w:r>
+      <w:r>
+        <w:rPr>
+          <w:rStyle w:val="VerbatimChar"/>
+        </w:rPr>
+        <w:t xml:space="preserve">extract_calltree.py</w:t>
+      </w:r>
+      <w:r>
+        <w:t xml:space="preserve">’s shorter</w:t>
+      </w:r>
+      <w:r>
+        <w:t xml:space="preserve"> </w:t>
+      </w:r>
+      <w:r>
+        <w:t xml:space="preserve">canonical wording, since unifying genuinely-divergent copies of</w:t>
+      </w:r>
+      <w:r>
+        <w:t xml:space="preserve"> </w:t>
+      </w:r>
+      <w:r>
+        <w:t xml:space="preserve">“</w:t>
+      </w:r>
+      <w:r>
+        <w:t xml:space="preserve">the same flag</w:t>
+      </w:r>
+      <w:r>
+        <w:t xml:space="preserve">”</w:t>
+      </w:r>
+      <w:r>
+        <w:t xml:space="preserve"> </w:t>
+      </w:r>
+      <w:r>
+        <w:t xml:space="preserve">into one text is the</w:t>
+      </w:r>
+      <w:r>
+        <w:t xml:space="preserve"> </w:t>
+      </w:r>
+      <w:r>
+        <w:t xml:space="preserve">whole point of this consolidation. Full test suite: 476 tests (451 existing + 25 new</w:t>
+      </w:r>
+      <w:r>
+        <w:t xml:space="preserve"> </w:t>
+      </w:r>
+      <w:r>
+        <w:rPr>
+          <w:rStyle w:val="VerbatimChar"/>
+        </w:rPr>
+        <w:t xml:space="preserve">test_stage6_cli_common.py</w:t>
+      </w:r>
+      <w:r>
+        <w:t xml:space="preserve"> </w:t>
+      </w:r>
+      <w:r>
+        <w:t xml:space="preserve">tests), all passing, zero changes needed to any existing test. Real-data</w:t>
+      </w:r>
+      <w:r>
+        <w:t xml:space="preserve"> </w:t>
+      </w:r>
+      <w:r>
+        <w:t xml:space="preserve">regeneration across all 6</w:t>
+      </w:r>
+      <w:r>
+        <w:t xml:space="preserve"> </w:t>
+      </w:r>
+      <w:r>
+        <w:rPr>
+          <w:rStyle w:val="VerbatimChar"/>
+        </w:rPr>
+        <w:t xml:space="preserve">test_apps/results/</w:t>
+      </w:r>
+      <w:r>
+        <w:t xml:space="preserve"> </w:t>
+      </w:r>
+      <w:r>
+        <w:t xml:space="preserve">dirs: fully byte-identical (modulo each report’s own</w:t>
+      </w:r>
+      <w:r>
+        <w:t xml:space="preserve"> </w:t>
+      </w:r>
+      <w:r>
+        <w:t xml:space="preserve">timestamp line) – confirmed by diff, a pure internal refactor with no output-visible effect at all.</w:t>
+      </w:r>
+    </w:p>
     <w:bookmarkEnd w:id="77"/>
+    <w:bookmarkEnd w:id="78"/>
     <w:sectPr/>
   </w:body>
 </w:document>

</xml_diff>

<commit_message>
Plan 2.15 Phase A: capstone tool extract_hotspot_callers.py
New top-N-CPU-hotspots + caller-chain report, built as an architecture-validation
exercise: reuses stage1-6 primitives almost entirely as-is, needing only one new
function (stage4_rocprofsys_tree.caller_chains_for_label()) and one backward-compatible
extension (stage6_cli_common.add_max_depth_arg()'s help_text override, since caller-chain
truncation counts upward from the target rather than downward from a root). Real-data
testing surfaced and fixed a genuine file-preference bug: preferring wall_clock-*.txt over
sampling_wall_clock-*.txt per rank, since the run's own top hotspots weren't always caught
as distinct sampled frames. Phase B (GPU-aware extension) is deferred to its own plan.
</commit_message>
<xml_diff>
--- a/docs/DEVELOPMENT_HISTORY.docx
+++ b/docs/DEVELOPMENT_HISTORY.docx
@@ -10,7 +10,7 @@
         <w:t xml:space="preserve">Development History</w:t>
       </w:r>
     </w:p>
-    <w:bookmarkStart w:id="78" w:name="development-history"/>
+    <w:bookmarkStart w:id="79" w:name="development-history"/>
     <w:p>
       <w:pPr>
         <w:pStyle w:val="Heading1"/>
@@ -3079,6 +3079,56 @@
           </w:p>
         </w:tc>
       </w:tr>
+      <w:tr>
+        <w:tc>
+          <w:tcPr/>
+          <w:p>
+            <w:pPr>
+              <w:pStyle w:val="Compact"/>
+              <w:jc w:val="left"/>
+            </w:pPr>
+            <w:r>
+              <w:t xml:space="preserve">2026-08-17</w:t>
+            </w:r>
+          </w:p>
+        </w:tc>
+        <w:tc>
+          <w:tcPr/>
+          <w:p>
+            <w:pPr>
+              <w:pStyle w:val="Compact"/>
+              <w:jc w:val="left"/>
+            </w:pPr>
+            <w:r>
+              <w:t xml:space="preserve">Plan 2.15 Phase A: new capstone tool</w:t>
+            </w:r>
+            <w:r>
+              <w:t xml:space="preserve"> </w:t>
+            </w:r>
+            <w:r>
+              <w:rPr>
+                <w:rStyle w:val="VerbatimChar"/>
+              </w:rPr>
+              <w:t xml:space="preserve">extract_hotspot_callers.py</w:t>
+            </w:r>
+            <w:r>
+              <w:t xml:space="preserve"> </w:t>
+            </w:r>
+            <w:r>
+              <w:t xml:space="preserve">(top-N CPU hotspots + each one’s caller chain(s) back to a real program root) – an architecture-validation exercise, not a roadmap item; needed exactly one new primitive (</w:t>
+            </w:r>
+            <w:r>
+              <w:rPr>
+                <w:rStyle w:val="VerbatimChar"/>
+              </w:rPr>
+              <w:t xml:space="preserve">stage4_rocprofsys_tree.caller_chains_for_label()</w:t>
+            </w:r>
+            <w:r>
+              <w:t xml:space="preserve">), everything else reused as-is; real-data testing surfaced and fixed a genuine file-preference bug (see full accounting below)</w:t>
+            </w:r>
+          </w:p>
+        </w:tc>
+      </w:tr>
     </w:tbl>
     <w:bookmarkStart w:id="20" w:name="project-scaffolding-and-rules"/>
     <w:p>
@@ -46132,7 +46182,1130 @@
       </w:r>
     </w:p>
     <w:bookmarkEnd w:id="77"/>
+    <w:bookmarkStart w:id="78" w:name="X81db3db4780c179f1235b6435ec886b7849c5b5"/>
+    <w:p>
+      <w:pPr>
+        <w:pStyle w:val="Heading2"/>
+      </w:pPr>
+      <w:r>
+        <w:t xml:space="preserve">2026-08-17 — Plan 2.15 Phase A:</w:t>
+      </w:r>
+      <w:r>
+        <w:t xml:space="preserve"> </w:t>
+      </w:r>
+      <w:r>
+        <w:rPr>
+          <w:rStyle w:val="VerbatimChar"/>
+        </w:rPr>
+        <w:t xml:space="preserve">extract_hotspot_callers.py</w:t>
+      </w:r>
+      <w:r>
+        <w:t xml:space="preserve">, an architecture-validation capstone</w:t>
+      </w:r>
+    </w:p>
+    <w:p>
+      <w:pPr>
+        <w:pStyle w:val="FirstParagraph"/>
+      </w:pPr>
+      <w:r>
+        <w:t xml:space="preserve">New work beyond the original roadmap, requested as an explicit test: can a genuinely new report be</w:t>
+      </w:r>
+      <w:r>
+        <w:t xml:space="preserve"> </w:t>
+      </w:r>
+      <w:r>
+        <w:t xml:space="preserve">built almost entirely out of stage1-6 primitives that already exist, and if not, what’s actually</w:t>
+      </w:r>
+      <w:r>
+        <w:t xml:space="preserve"> </w:t>
+      </w:r>
+      <w:r>
+        <w:t xml:space="preserve">missing? The tool shows the top N (default 10) CPU hotspots, then, for each one, its caller</w:t>
+      </w:r>
+      <w:r>
+        <w:t xml:space="preserve"> </w:t>
+      </w:r>
+      <w:r>
+        <w:t xml:space="preserve">chain(s) – the ancestor path(s) from a real program root down to every distinct call site that</w:t>
+      </w:r>
+      <w:r>
+        <w:t xml:space="preserve"> </w:t>
+      </w:r>
+      <w:r>
+        <w:t xml:space="preserve">reached it. This is the architectural inverse of the calltree tools (which walk DOWN from roots,</w:t>
+      </w:r>
+      <w:r>
+        <w:t xml:space="preserve"> </w:t>
+      </w:r>
+      <w:r>
+        <w:t xml:space="preserve">rendering descendants): nothing in stage4/stage5 answered</w:t>
+      </w:r>
+      <w:r>
+        <w:t xml:space="preserve"> </w:t>
+      </w:r>
+      <w:r>
+        <w:t xml:space="preserve">“</w:t>
+      </w:r>
+      <w:r>
+        <w:t xml:space="preserve">who called this, all the way up to the</w:t>
+      </w:r>
+      <w:r>
+        <w:t xml:space="preserve"> </w:t>
+      </w:r>
+      <w:r>
+        <w:t xml:space="preserve">root</w:t>
+      </w:r>
+      <w:r>
+        <w:t xml:space="preserve">”</w:t>
+      </w:r>
+      <w:r>
+        <w:t xml:space="preserve"> </w:t>
+      </w:r>
+      <w:r>
+        <w:t xml:space="preserve">before this plan.</w:t>
+      </w:r>
+    </w:p>
+    <w:p>
+      <w:pPr>
+        <w:pStyle w:val="BodyText"/>
+      </w:pPr>
+      <w:r>
+        <w:rPr>
+          <w:bCs/>
+          <w:b/>
+        </w:rPr>
+        <w:t xml:space="preserve">The one new primitive needed</w:t>
+      </w:r>
+      <w:r>
+        <w:t xml:space="preserve">:</w:t>
+      </w:r>
+      <w:r>
+        <w:t xml:space="preserve"> </w:t>
+      </w:r>
+      <w:r>
+        <w:rPr>
+          <w:rStyle w:val="VerbatimChar"/>
+        </w:rPr>
+        <w:t xml:space="preserve">stage4_rocprofsys_tree.caller_chains_for_label(rows, target_label)</w:t>
+      </w:r>
+      <w:r>
+        <w:t xml:space="preserve"> </w:t>
+      </w:r>
+      <w:r>
+        <w:t xml:space="preserve">– walks each matching row’s own</w:t>
+      </w:r>
+      <w:r>
+        <w:t xml:space="preserve"> </w:t>
+      </w:r>
+      <w:r>
+        <w:rPr>
+          <w:rStyle w:val="VerbatimChar"/>
+        </w:rPr>
+        <w:t xml:space="preserve">parent</w:t>
+      </w:r>
+      <w:r>
+        <w:t xml:space="preserve"> </w:t>
+      </w:r>
+      <w:r>
+        <w:t xml:space="preserve">chain up to its root, returning one chain</w:t>
+      </w:r>
+      <w:r>
+        <w:t xml:space="preserve"> </w:t>
+      </w:r>
+      <w:r>
+        <w:t xml:space="preserve">per distinct occurrence. Everything else came from existing code unchanged:</w:t>
+      </w:r>
+      <w:r>
+        <w:t xml:space="preserve"> </w:t>
+      </w:r>
+      <w:r>
+        <w:rPr>
+          <w:rStyle w:val="VerbatimChar"/>
+        </w:rPr>
+        <w:t xml:space="preserve">stage4_rocprofsys_flat .aggregate()</w:t>
+      </w:r>
+      <w:r>
+        <w:t xml:space="preserve"> </w:t>
+      </w:r>
+      <w:r>
+        <w:t xml:space="preserve">for the ranked hotspot selection (same as</w:t>
+      </w:r>
+      <w:r>
+        <w:t xml:space="preserve"> </w:t>
+      </w:r>
+      <w:r>
+        <w:rPr>
+          <w:rStyle w:val="VerbatimChar"/>
+        </w:rPr>
+        <w:t xml:space="preserve">extract_CPU_hotspots.py</w:t>
+      </w:r>
+      <w:r>
+        <w:t xml:space="preserve">),</w:t>
+      </w:r>
+      <w:r>
+        <w:t xml:space="preserve"> </w:t>
+      </w:r>
+      <w:r>
+        <w:rPr>
+          <w:rStyle w:val="VerbatimChar"/>
+        </w:rPr>
+        <w:t xml:space="preserve">stage5_tree_render.load_rank_trees()</w:t>
+      </w:r>
+      <w:r>
+        <w:t xml:space="preserve">/</w:t>
+      </w:r>
+      <w:r>
+        <w:rPr>
+          <w:rStyle w:val="VerbatimChar"/>
+        </w:rPr>
+        <w:t xml:space="preserve">stage4_rocprofsys_tree.merge_rank_trees()</w:t>
+      </w:r>
+      <w:r>
+        <w:t xml:space="preserve"> </w:t>
+      </w:r>
+      <w:r>
+        <w:t xml:space="preserve">for the same</w:t>
+      </w:r>
+      <w:r>
+        <w:t xml:space="preserve"> </w:t>
+      </w:r>
+      <w:r>
+        <w:t xml:space="preserve">merged call tree the calltree tools build,</w:t>
+      </w:r>
+      <w:r>
+        <w:t xml:space="preserve"> </w:t>
+      </w:r>
+      <w:r>
+        <w:rPr>
+          <w:rStyle w:val="VerbatimChar"/>
+        </w:rPr>
+        <w:t xml:space="preserve">stage5_tree_render.format_aligned_rows()</w:t>
+      </w:r>
+      <w:r>
+        <w:t xml:space="preserve"> </w:t>
+      </w:r>
+      <w:r>
+        <w:t xml:space="preserve">for rendering</w:t>
+      </w:r>
+      <w:r>
+        <w:t xml:space="preserve"> </w:t>
+      </w:r>
+      <w:r>
+        <w:t xml:space="preserve">each chain as a flat list of rows (no new tree-rendering primitive needed – a caller chain is</w:t>
+      </w:r>
+      <w:r>
+        <w:t xml:space="preserve"> </w:t>
+      </w:r>
+      <w:r>
+        <w:t xml:space="preserve">linear, not branching, so</w:t>
+      </w:r>
+      <w:r>
+        <w:t xml:space="preserve"> </w:t>
+      </w:r>
+      <w:r>
+        <w:rPr>
+          <w:rStyle w:val="VerbatimChar"/>
+        </w:rPr>
+        <w:t xml:space="preserve">render_forest()</w:t>
+      </w:r>
+      <w:r>
+        <w:t xml:space="preserve">/</w:t>
+      </w:r>
+      <w:r>
+        <w:rPr>
+          <w:rStyle w:val="VerbatimChar"/>
+        </w:rPr>
+        <w:t xml:space="preserve">build_children_map()</w:t>
+      </w:r>
+      <w:r>
+        <w:t xml:space="preserve"> </w:t>
+      </w:r>
+      <w:r>
+        <w:t xml:space="preserve">don’t apply), and the full</w:t>
+      </w:r>
+      <w:r>
+        <w:t xml:space="preserve"> </w:t>
+      </w:r>
+      <w:r>
+        <w:rPr>
+          <w:rStyle w:val="VerbatimChar"/>
+        </w:rPr>
+        <w:t xml:space="preserve">stage6_report_builder</w:t>
+      </w:r>
+      <w:r>
+        <w:t xml:space="preserve">/</w:t>
+      </w:r>
+      <w:r>
+        <w:rPr>
+          <w:rStyle w:val="VerbatimChar"/>
+        </w:rPr>
+        <w:t xml:space="preserve">stage6_run_metadata</w:t>
+      </w:r>
+      <w:r>
+        <w:t xml:space="preserve">/</w:t>
+      </w:r>
+      <w:r>
+        <w:rPr>
+          <w:rStyle w:val="VerbatimChar"/>
+        </w:rPr>
+        <w:t xml:space="preserve">stage6_noise_config</w:t>
+      </w:r>
+      <w:r>
+        <w:t xml:space="preserve">/</w:t>
+      </w:r>
+      <w:r>
+        <w:rPr>
+          <w:rStyle w:val="VerbatimChar"/>
+        </w:rPr>
+        <w:t xml:space="preserve">stage6_cli_common</w:t>
+      </w:r>
+      <w:r>
+        <w:t xml:space="preserve"> </w:t>
+      </w:r>
+      <w:r>
+        <w:t xml:space="preserve">stack. The</w:t>
+      </w:r>
+      <w:r>
+        <w:t xml:space="preserve"> </w:t>
+      </w:r>
+      <w:r>
+        <w:t xml:space="preserve">tool also reuses</w:t>
+      </w:r>
+      <w:r>
+        <w:t xml:space="preserve"> </w:t>
+      </w:r>
+      <w:r>
+        <w:rPr>
+          <w:rStyle w:val="VerbatimChar"/>
+        </w:rPr>
+        <w:t xml:space="preserve">extract_CPU_hotspots.gather_run_info()</w:t>
+      </w:r>
+      <w:r>
+        <w:t xml:space="preserve"> </w:t>
+      </w:r>
+      <w:r>
+        <w:t xml:space="preserve">and</w:t>
+      </w:r>
+      <w:r>
+        <w:t xml:space="preserve"> </w:t>
+      </w:r>
+      <w:r>
+        <w:rPr>
+          <w:rStyle w:val="VerbatimChar"/>
+        </w:rPr>
+        <w:t xml:space="preserve">stage5_calltree_view.strip_wrapper_noise()</w:t>
+      </w:r>
+      <w:r>
+        <w:t xml:space="preserve"> </w:t>
+      </w:r>
+      <w:r>
+        <w:t xml:space="preserve">directly across tool-module boundaries – the same</w:t>
+      </w:r>
+      <w:r>
+        <w:t xml:space="preserve"> </w:t>
+      </w:r>
+      <w:r>
+        <w:t xml:space="preserve">cross-tool reuse</w:t>
+      </w:r>
+      <w:r>
+        <w:t xml:space="preserve"> </w:t>
+      </w:r>
+      <w:r>
+        <w:rPr>
+          <w:rStyle w:val="VerbatimChar"/>
+        </w:rPr>
+        <w:t xml:space="preserve">extract_calltree.py</w:t>
+      </w:r>
+      <w:r>
+        <w:t xml:space="preserve"> </w:t>
+      </w:r>
+      <w:r>
+        <w:t xml:space="preserve">itself already relies on for</w:t>
+      </w:r>
+      <w:r>
+        <w:t xml:space="preserve"> </w:t>
+      </w:r>
+      <w:r>
+        <w:rPr>
+          <w:rStyle w:val="VerbatimChar"/>
+        </w:rPr>
+        <w:t xml:space="preserve">gather_run_info()</w:t>
+      </w:r>
+      <w:r>
+        <w:t xml:space="preserve">, not a new</w:t>
+      </w:r>
+      <w:r>
+        <w:t xml:space="preserve"> </w:t>
+      </w:r>
+      <w:r>
+        <w:t xml:space="preserve">pattern.</w:t>
+      </w:r>
+    </w:p>
+    <w:p>
+      <w:pPr>
+        <w:pStyle w:val="BodyText"/>
+      </w:pPr>
+      <w:r>
+        <w:rPr>
+          <w:bCs/>
+          <w:b/>
+        </w:rPr>
+        <w:t xml:space="preserve">A real bug found during real-data testing, not a hypothetical</w:t>
+      </w:r>
+      <w:r>
+        <w:t xml:space="preserve">: the first implementation</w:t>
+      </w:r>
+      <w:r>
+        <w:t xml:space="preserve"> </w:t>
+      </w:r>
+      <w:r>
+        <w:t xml:space="preserve">preferred</w:t>
+      </w:r>
+      <w:r>
+        <w:t xml:space="preserve"> </w:t>
+      </w:r>
+      <w:r>
+        <w:rPr>
+          <w:rStyle w:val="VerbatimChar"/>
+        </w:rPr>
+        <w:t xml:space="preserve">sampling_wall_clock-*.txt</w:t>
+      </w:r>
+      <w:r>
+        <w:t xml:space="preserve"> </w:t>
+      </w:r>
+      <w:r>
+        <w:t xml:space="preserve">as the tree’s primary file source per rank (matching</w:t>
+      </w:r>
+      <w:r>
+        <w:t xml:space="preserve"> </w:t>
+      </w:r>
+      <w:r>
+        <w:rPr>
+          <w:rStyle w:val="VerbatimChar"/>
+        </w:rPr>
+        <w:t xml:space="preserve">extract_calltree.py</w:t>
+      </w:r>
+      <w:r>
+        <w:t xml:space="preserve">’s own</w:t>
+      </w:r>
+      <w:r>
+        <w:t xml:space="preserve"> </w:t>
+      </w:r>
+      <w:r>
+        <w:t xml:space="preserve">“</w:t>
+      </w:r>
+      <w:r>
+        <w:t xml:space="preserve">true call depth</w:t>
+      </w:r>
+      <w:r>
+        <w:t xml:space="preserve">”</w:t>
+      </w:r>
+      <w:r>
+        <w:t xml:space="preserve"> </w:t>
+      </w:r>
+      <w:r>
+        <w:t xml:space="preserve">default). Against the real</w:t>
+      </w:r>
+      <w:r>
+        <w:t xml:space="preserve"> </w:t>
+      </w:r>
+      <w:r>
+        <w:rPr>
+          <w:rStyle w:val="VerbatimChar"/>
+        </w:rPr>
+        <w:t xml:space="preserve">test_apps/results/ profile_hotspots_C_amd</w:t>
+      </w:r>
+      <w:r>
+        <w:t xml:space="preserve"> </w:t>
+      </w:r>
+      <w:r>
+        <w:t xml:space="preserve">data, this produced</w:t>
+      </w:r>
+      <w:r>
+        <w:t xml:space="preserve"> </w:t>
+      </w:r>
+      <w:r>
+        <w:t xml:space="preserve">“</w:t>
+      </w:r>
+      <w:r>
+        <w:t xml:space="preserve">no caller chain found</w:t>
+      </w:r>
+      <w:r>
+        <w:t xml:space="preserve">”</w:t>
+      </w:r>
+      <w:r>
+        <w:t xml:space="preserve"> </w:t>
+      </w:r>
+      <w:r>
+        <w:t xml:space="preserve">for the run’s own top 2</w:t>
+      </w:r>
+      <w:r>
+        <w:t xml:space="preserve"> </w:t>
+      </w:r>
+      <w:r>
+        <w:t xml:space="preserve">hotspots (</w:t>
+      </w:r>
+      <w:r>
+        <w:rPr>
+          <w:rStyle w:val="VerbatimChar"/>
+        </w:rPr>
+        <w:t xml:space="preserve">MPI_Init</w:t>
+      </w:r>
+      <w:r>
+        <w:t xml:space="preserve">,</w:t>
+      </w:r>
+      <w:r>
+        <w:t xml:space="preserve"> </w:t>
+      </w:r>
+      <w:r>
+        <w:rPr>
+          <w:rStyle w:val="VerbatimChar"/>
+        </w:rPr>
+        <w:t xml:space="preserve">c_app</w:t>
+      </w:r>
+      <w:r>
+        <w:t xml:space="preserve">) – both are exactly instrumented (present in</w:t>
+      </w:r>
+      <w:r>
+        <w:t xml:space="preserve"> </w:t>
+      </w:r>
+      <w:r>
+        <w:rPr>
+          <w:rStyle w:val="VerbatimChar"/>
+        </w:rPr>
+        <w:t xml:space="preserve">wall_clock-*.txt</w:t>
+      </w:r>
+      <w:r>
+        <w:t xml:space="preserve">) but</w:t>
+      </w:r>
+      <w:r>
+        <w:t xml:space="preserve"> </w:t>
+      </w:r>
+      <w:r>
+        <w:t xml:space="preserve">apparently too short/rare for the fixed-interval sampler to ever catch as their own distinct sampled</w:t>
+      </w:r>
+      <w:r>
+        <w:t xml:space="preserve"> </w:t>
+      </w:r>
+      <w:r>
+        <w:t xml:space="preserve">frame. Since this tool’s hotspot ranking already comes from</w:t>
+      </w:r>
+      <w:r>
+        <w:t xml:space="preserve"> </w:t>
+      </w:r>
+      <w:r>
+        <w:rPr>
+          <w:rStyle w:val="VerbatimChar"/>
+        </w:rPr>
+        <w:t xml:space="preserve">aggregate()</w:t>
+      </w:r>
+      <w:r>
+        <w:t xml:space="preserve">’s own wall_clock-wins-</w:t>
+      </w:r>
+      <w:r>
+        <w:t xml:space="preserve"> </w:t>
+      </w:r>
+      <w:r>
+        <w:t xml:space="preserve">per-label merge, the fix was switching the tree’s file preference to match:</w:t>
+      </w:r>
+      <w:r>
+        <w:t xml:space="preserve"> </w:t>
+      </w:r>
+      <w:r>
+        <w:rPr>
+          <w:rStyle w:val="VerbatimChar"/>
+        </w:rPr>
+        <w:t xml:space="preserve">wall_clock-*.txt</w:t>
+      </w:r>
+      <w:r>
+        <w:t xml:space="preserve"> </w:t>
+      </w:r>
+      <w:r>
+        <w:t xml:space="preserve">primary,</w:t>
+      </w:r>
+      <w:r>
+        <w:t xml:space="preserve"> </w:t>
+      </w:r>
+      <w:r>
+        <w:rPr>
+          <w:rStyle w:val="VerbatimChar"/>
+        </w:rPr>
+        <w:t xml:space="preserve">sampling_wall_clock-*.txt</w:t>
+      </w:r>
+      <w:r>
+        <w:t xml:space="preserve"> </w:t>
+      </w:r>
+      <w:r>
+        <w:t xml:space="preserve">fallback (the same preference</w:t>
+      </w:r>
+      <w:r>
+        <w:t xml:space="preserve"> </w:t>
+      </w:r>
+      <w:r>
+        <w:rPr>
+          <w:rStyle w:val="VerbatimChar"/>
+        </w:rPr>
+        <w:t xml:space="preserve">extract_calltree_traced.py</w:t>
+      </w:r>
+      <w:r>
+        <w:t xml:space="preserve"> </w:t>
+      </w:r>
+      <w:r>
+        <w:t xml:space="preserve">already uses, for the same reason). Confirmed against real data both before and after the fix.</w:t>
+      </w:r>
+    </w:p>
+    <w:p>
+      <w:pPr>
+        <w:pStyle w:val="BodyText"/>
+      </w:pPr>
+      <w:r>
+        <w:rPr>
+          <w:rStyle w:val="VerbatimChar"/>
+          <w:bCs/>
+          <w:b/>
+        </w:rPr>
+        <w:t xml:space="preserve">--max-depth</w:t>
+      </w:r>
+      <w:r>
+        <w:rPr>
+          <w:bCs/>
+          <w:b/>
+        </w:rPr>
+        <w:t xml:space="preserve"> </w:t>
+      </w:r>
+      <w:r>
+        <w:rPr>
+          <w:bCs/>
+          <w:b/>
+        </w:rPr>
+        <w:t xml:space="preserve">semantics needed to be direction-aware, not reused blindly.</w:t>
+      </w:r>
+      <w:r>
+        <w:t xml:space="preserve"> </w:t>
+      </w:r>
+      <w:r>
+        <w:t xml:space="preserve">The calltree tools’</w:t>
+      </w:r>
+      <w:r>
+        <w:t xml:space="preserve"> </w:t>
+      </w:r>
+      <w:r>
+        <w:t xml:space="preserve">own</w:t>
+      </w:r>
+      <w:r>
+        <w:t xml:space="preserve"> </w:t>
+      </w:r>
+      <w:r>
+        <w:rPr>
+          <w:rStyle w:val="VerbatimChar"/>
+        </w:rPr>
+        <w:t xml:space="preserve">--max-depth</w:t>
+      </w:r>
+      <w:r>
+        <w:t xml:space="preserve"> </w:t>
+      </w:r>
+      <w:r>
+        <w:t xml:space="preserve">truncates root-relative (how deep from the top). A caller chain is walked in the</w:t>
+      </w:r>
+      <w:r>
+        <w:t xml:space="preserve"> </w:t>
+      </w:r>
+      <w:r>
+        <w:t xml:space="preserve">opposite direction (target-to-root), so the useful truncation is upward from the target –</w:t>
+      </w:r>
+      <w:r>
+        <w:t xml:space="preserve"> </w:t>
+      </w:r>
+      <w:r>
+        <w:t xml:space="preserve">“</w:t>
+      </w:r>
+      <w:r>
+        <w:t xml:space="preserve">show me</w:t>
+      </w:r>
+      <w:r>
+        <w:t xml:space="preserve"> </w:t>
+      </w:r>
+      <w:r>
+        <w:t xml:space="preserve">the N nearest callers,</w:t>
+      </w:r>
+      <w:r>
+        <w:t xml:space="preserve">”</w:t>
+      </w:r>
+      <w:r>
+        <w:t xml:space="preserve"> </w:t>
+      </w:r>
+      <w:r>
+        <w:t xml:space="preserve">not</w:t>
+      </w:r>
+      <w:r>
+        <w:t xml:space="preserve"> </w:t>
+      </w:r>
+      <w:r>
+        <w:t xml:space="preserve">“</w:t>
+      </w:r>
+      <w:r>
+        <w:t xml:space="preserve">show me the first N levels from a root that isn’t the point.</w:t>
+      </w:r>
+      <w:r>
+        <w:t xml:space="preserve">”</w:t>
+      </w:r>
+      <w:r>
+        <w:t xml:space="preserve"> </w:t>
+      </w:r>
+      <w:r>
+        <w:t xml:space="preserve">Rather</w:t>
+      </w:r>
+      <w:r>
+        <w:t xml:space="preserve"> </w:t>
+      </w:r>
+      <w:r>
+        <w:t xml:space="preserve">than give</w:t>
+      </w:r>
+      <w:r>
+        <w:t xml:space="preserve"> </w:t>
+      </w:r>
+      <w:r>
+        <w:rPr>
+          <w:rStyle w:val="VerbatimChar"/>
+        </w:rPr>
+        <w:t xml:space="preserve">stage6_cli_common.add_max_depth_arg()</w:t>
+      </w:r>
+      <w:r>
+        <w:t xml:space="preserve"> </w:t>
+      </w:r>
+      <w:r>
+        <w:t xml:space="preserve">a second, differently-worded sibling function,</w:t>
+      </w:r>
+      <w:r>
+        <w:t xml:space="preserve"> </w:t>
+      </w:r>
+      <w:r>
+        <w:t xml:space="preserve">it gained an optional</w:t>
+      </w:r>
+      <w:r>
+        <w:t xml:space="preserve"> </w:t>
+      </w:r>
+      <w:r>
+        <w:rPr>
+          <w:rStyle w:val="VerbatimChar"/>
+        </w:rPr>
+        <w:t xml:space="preserve">help_text</w:t>
+      </w:r>
+      <w:r>
+        <w:t xml:space="preserve"> </w:t>
+      </w:r>
+      <w:r>
+        <w:t xml:space="preserve">override (defaulting to the existing root-relative wording,</w:t>
+      </w:r>
+      <w:r>
+        <w:t xml:space="preserve"> </w:t>
+      </w:r>
+      <w:r>
+        <w:t xml:space="preserve">verified byte-identical for both existing calltree tools) – one shared flag name/dest/type, two</w:t>
+      </w:r>
+      <w:r>
+        <w:t xml:space="preserve"> </w:t>
+      </w:r>
+      <w:r>
+        <w:t xml:space="preserve">possible meanings depending on which direction a given renderer walks. A truncated chain shows one</w:t>
+      </w:r>
+      <w:r>
+        <w:t xml:space="preserve"> </w:t>
+      </w:r>
+      <w:r>
+        <w:t xml:space="preserve">marker line (</w:t>
+      </w:r>
+      <w:r>
+        <w:t xml:space="preserve">“</w:t>
+      </w:r>
+      <w:r>
+        <w:t xml:space="preserve">N more ancestor(s) hidden above this point</w:t>
+      </w:r>
+      <w:r>
+        <w:t xml:space="preserve">”</w:t>
+      </w:r>
+      <w:r>
+        <w:t xml:space="preserve">), the same convention as the calltree</w:t>
+      </w:r>
+      <w:r>
+        <w:t xml:space="preserve"> </w:t>
+      </w:r>
+      <w:r>
+        <w:t xml:space="preserve">tools’ own</w:t>
+      </w:r>
+      <w:r>
+        <w:t xml:space="preserve"> </w:t>
+      </w:r>
+      <w:r>
+        <w:t xml:space="preserve">“</w:t>
+      </w:r>
+      <w:r>
+        <w:t xml:space="preserve">N more node(s) hidden below this point</w:t>
+      </w:r>
+      <w:r>
+        <w:t xml:space="preserve">”</w:t>
+      </w:r>
+      <w:r>
+        <w:t xml:space="preserve"> </w:t>
+      </w:r>
+      <w:r>
+        <w:t xml:space="preserve">marker, just pointed the other way.</w:t>
+      </w:r>
+    </w:p>
+    <w:p>
+      <w:pPr>
+        <w:pStyle w:val="BodyText"/>
+      </w:pPr>
+      <w:r>
+        <w:rPr>
+          <w:bCs/>
+          <w:b/>
+        </w:rPr>
+        <w:t xml:space="preserve">What Phase A’s accounting actually shows</w:t>
+      </w:r>
+      <w:r>
+        <w:t xml:space="preserve">: one new function needed (</w:t>
+      </w:r>
+      <w:r>
+        <w:rPr>
+          <w:rStyle w:val="VerbatimChar"/>
+        </w:rPr>
+        <w:t xml:space="preserve">caller_chains_for_label()</w:t>
+      </w:r>
+      <w:r>
+        <w:t xml:space="preserve">,</w:t>
+      </w:r>
+      <w:r>
+        <w:t xml:space="preserve"> </w:t>
+      </w:r>
+      <w:r>
+        <w:t xml:space="preserve">~15 lines), one existing shared helper extended for a second use case (</w:t>
+      </w:r>
+      <w:r>
+        <w:rPr>
+          <w:rStyle w:val="VerbatimChar"/>
+        </w:rPr>
+        <w:t xml:space="preserve">add_max_depth_arg()</w:t>
+      </w:r>
+      <w:r>
+        <w:t xml:space="preserve">’s</w:t>
+      </w:r>
+      <w:r>
+        <w:t xml:space="preserve"> </w:t>
+      </w:r>
+      <w:r>
+        <w:rPr>
+          <w:rStyle w:val="VerbatimChar"/>
+        </w:rPr>
+        <w:t xml:space="preserve">help_text</w:t>
+      </w:r>
+      <w:r>
+        <w:t xml:space="preserve"> </w:t>
+      </w:r>
+      <w:r>
+        <w:t xml:space="preserve">param, fully backward compatible), and one real data-source preference bug found and</w:t>
+      </w:r>
+      <w:r>
+        <w:t xml:space="preserve"> </w:t>
+      </w:r>
+      <w:r>
+        <w:t xml:space="preserve">fixed by testing against actual profiling output rather than synthetic fixtures alone. No new</w:t>
+      </w:r>
+      <w:r>
+        <w:t xml:space="preserve"> </w:t>
+      </w:r>
+      <w:r>
+        <w:t xml:space="preserve">rendering primitive, no new report-assembly primitive, no new noise-classification code. The</w:t>
+      </w:r>
+      <w:r>
+        <w:t xml:space="preserve"> </w:t>
+      </w:r>
+      <w:r>
+        <w:t xml:space="preserve">architecture held up for a genuinely new report shape.</w:t>
+      </w:r>
+    </w:p>
+    <w:p>
+      <w:pPr>
+        <w:pStyle w:val="BodyText"/>
+      </w:pPr>
+      <w:r>
+        <w:t xml:space="preserve">Tests: 4 new</w:t>
+      </w:r>
+      <w:r>
+        <w:t xml:space="preserve"> </w:t>
+      </w:r>
+      <w:r>
+        <w:rPr>
+          <w:rStyle w:val="VerbatimChar"/>
+        </w:rPr>
+        <w:t xml:space="preserve">caller_chains_for_label()</w:t>
+      </w:r>
+      <w:r>
+        <w:t xml:space="preserve"> </w:t>
+      </w:r>
+      <w:r>
+        <w:t xml:space="preserve">unit tests (single call site, multiple call sites, no</w:t>
+      </w:r>
+      <w:r>
+        <w:t xml:space="preserve"> </w:t>
+      </w:r>
+      <w:r>
+        <w:t xml:space="preserve">match, target-is-a-root) in</w:t>
+      </w:r>
+      <w:r>
+        <w:t xml:space="preserve"> </w:t>
+      </w:r>
+      <w:r>
+        <w:rPr>
+          <w:rStyle w:val="VerbatimChar"/>
+        </w:rPr>
+        <w:t xml:space="preserve">test_stage4_rocprofsys_tree.py</w:t>
+      </w:r>
+      <w:r>
+        <w:t xml:space="preserve">; 2 new</w:t>
+      </w:r>
+      <w:r>
+        <w:t xml:space="preserve"> </w:t>
+      </w:r>
+      <w:r>
+        <w:rPr>
+          <w:rStyle w:val="VerbatimChar"/>
+        </w:rPr>
+        <w:t xml:space="preserve">add_max_depth_arg()</w:t>
+      </w:r>
+      <w:r>
+        <w:t xml:space="preserve"> </w:t>
+      </w:r>
+      <w:r>
+        <w:rPr>
+          <w:rStyle w:val="VerbatimChar"/>
+        </w:rPr>
+        <w:t xml:space="preserve">help_text</w:t>
+      </w:r>
+      <w:r>
+        <w:t xml:space="preserve"> </w:t>
+      </w:r>
+      <w:r>
+        <w:t xml:space="preserve">tests in</w:t>
+      </w:r>
+      <w:r>
+        <w:t xml:space="preserve"> </w:t>
+      </w:r>
+      <w:r>
+        <w:rPr>
+          <w:rStyle w:val="VerbatimChar"/>
+        </w:rPr>
+        <w:t xml:space="preserve">test_stage6_cli_common.py</w:t>
+      </w:r>
+      <w:r>
+        <w:t xml:space="preserve">; 14 new tests in</w:t>
+      </w:r>
+      <w:r>
+        <w:t xml:space="preserve"> </w:t>
+      </w:r>
+      <w:r>
+        <w:rPr>
+          <w:rStyle w:val="VerbatimChar"/>
+        </w:rPr>
+        <w:t xml:space="preserve">test_extract_hotspot_callers.py</w:t>
+      </w:r>
+      <w:r>
+        <w:t xml:space="preserve"> </w:t>
+      </w:r>
+      <w:r>
+        <w:t xml:space="preserve">(</w:t>
+      </w:r>
+      <w:r>
+        <w:rPr>
+          <w:rStyle w:val="VerbatimChar"/>
+        </w:rPr>
+        <w:t xml:space="preserve">_render_chain()</w:t>
+      </w:r>
+      <w:r>
+        <w:t xml:space="preserve">’s own truncation math in isolation, plus end-to-end</w:t>
+      </w:r>
+      <w:r>
+        <w:t xml:space="preserve"> </w:t>
+      </w:r>
+      <w:r>
+        <w:rPr>
+          <w:rStyle w:val="VerbatimChar"/>
+        </w:rPr>
+        <w:t xml:space="preserve">write_report()</w:t>
+      </w:r>
+      <w:r>
+        <w:t xml:space="preserve">/</w:t>
+      </w:r>
+      <w:r>
+        <w:rPr>
+          <w:rStyle w:val="VerbatimChar"/>
+        </w:rPr>
+        <w:t xml:space="preserve">main()</w:t>
+      </w:r>
+      <w:r>
+        <w:t xml:space="preserve"> </w:t>
+      </w:r>
+      <w:r>
+        <w:t xml:space="preserve">coverage against real fixtures: a 2-level chain, a root-only function, a real 3-level chain with and</w:t>
+      </w:r>
+      <w:r>
+        <w:t xml:space="preserve"> </w:t>
+      </w:r>
+      <w:r>
+        <w:t xml:space="preserve">without</w:t>
+      </w:r>
+      <w:r>
+        <w:t xml:space="preserve"> </w:t>
+      </w:r>
+      <w:r>
+        <w:rPr>
+          <w:rStyle w:val="VerbatimChar"/>
+        </w:rPr>
+        <w:t xml:space="preserve">--max-depth</w:t>
+      </w:r>
+      <w:r>
+        <w:t xml:space="preserve"> </w:t>
+      </w:r>
+      <w:r>
+        <w:t xml:space="preserve">truncation,</w:t>
+      </w:r>
+      <w:r>
+        <w:t xml:space="preserve"> </w:t>
+      </w:r>
+      <w:r>
+        <w:rPr>
+          <w:rStyle w:val="VerbatimChar"/>
+        </w:rPr>
+        <w:t xml:space="preserve">--unfiltered</w:t>
+      </w:r>
+      <w:r>
+        <w:t xml:space="preserve">, missing/empty directories, and</w:t>
+      </w:r>
+      <w:r>
+        <w:t xml:space="preserve"> </w:t>
+      </w:r>
+      <w:r>
+        <w:rPr>
+          <w:rStyle w:val="VerbatimChar"/>
+        </w:rPr>
+        <w:t xml:space="preserve">--extra-noise-config</w:t>
+      </w:r>
+      <w:r>
+        <w:t xml:space="preserve"> </w:t>
+      </w:r>
+      <w:r>
+        <w:t xml:space="preserve">threading). Full suite: 496 tests, all passing. Verification:</w:t>
+      </w:r>
+      <w:r>
+        <w:t xml:space="preserve"> </w:t>
+      </w:r>
+      <w:r>
+        <w:rPr>
+          <w:rStyle w:val="VerbatimChar"/>
+        </w:rPr>
+        <w:t xml:space="preserve">--help</w:t>
+      </w:r>
+      <w:r>
+        <w:t xml:space="preserve"> </w:t>
+      </w:r>
+      <w:r>
+        <w:t xml:space="preserve">diff</w:t>
+      </w:r>
+      <w:r>
+        <w:t xml:space="preserve"> </w:t>
+      </w:r>
+      <w:r>
+        <w:t xml:space="preserve">confirms zero behavior change to both existing calltree tools (the</w:t>
+      </w:r>
+      <w:r>
+        <w:t xml:space="preserve"> </w:t>
+      </w:r>
+      <w:r>
+        <w:rPr>
+          <w:rStyle w:val="VerbatimChar"/>
+        </w:rPr>
+        <w:t xml:space="preserve">add_max_depth_arg()</w:t>
+      </w:r>
+      <w:r>
+        <w:t xml:space="preserve"> </w:t>
+      </w:r>
+      <w:r>
+        <w:t xml:space="preserve">signature</w:t>
+      </w:r>
+      <w:r>
+        <w:t xml:space="preserve"> </w:t>
+      </w:r>
+      <w:r>
+        <w:t xml:space="preserve">change is additive-only); real-data regeneration confirms</w:t>
+      </w:r>
+      <w:r>
+        <w:t xml:space="preserve"> </w:t>
+      </w:r>
+      <w:r>
+        <w:rPr>
+          <w:rStyle w:val="VerbatimChar"/>
+        </w:rPr>
+        <w:t xml:space="preserve">extract_calltree.py</w:t>
+      </w:r>
+      <w:r>
+        <w:t xml:space="preserve">’s own output stays</w:t>
+      </w:r>
+      <w:r>
+        <w:t xml:space="preserve"> </w:t>
+      </w:r>
+      <w:r>
+        <w:t xml:space="preserve">fully byte-identical across all 6</w:t>
+      </w:r>
+      <w:r>
+        <w:t xml:space="preserve"> </w:t>
+      </w:r>
+      <w:r>
+        <w:rPr>
+          <w:rStyle w:val="VerbatimChar"/>
+        </w:rPr>
+        <w:t xml:space="preserve">test_apps/results/</w:t>
+      </w:r>
+      <w:r>
+        <w:t xml:space="preserve"> </w:t>
+      </w:r>
+      <w:r>
+        <w:t xml:space="preserve">dirs (this plan touches no code either tool’s</w:t>
+      </w:r>
+      <w:r>
+        <w:t xml:space="preserve"> </w:t>
+      </w:r>
+      <w:r>
+        <w:t xml:space="preserve">own report generation depends on beyond the one backward-compatible helper signature change).</w:t>
+      </w:r>
+    </w:p>
+    <w:p>
+      <w:pPr>
+        <w:pStyle w:val="BodyText"/>
+      </w:pPr>
+      <w:r>
+        <w:t xml:space="preserve">Phase B (GPU-aware extension: fusing in GPU kernels as top-N entries and resolving their caller</w:t>
+      </w:r>
+      <w:r>
+        <w:t xml:space="preserve"> </w:t>
+      </w:r>
+      <w:r>
+        <w:t xml:space="preserve">chains through their launching CPU node) is deferred to its own plan – see</w:t>
+      </w:r>
+      <w:r>
+        <w:t xml:space="preserve"> </w:t>
+      </w:r>
+      <w:r>
+        <w:rPr>
+          <w:rStyle w:val="VerbatimChar"/>
+        </w:rPr>
+        <w:t xml:space="preserve">docs/plans/2.15-hotspot-callers-capstone.md</w:t>
+      </w:r>
+      <w:r>
+        <w:t xml:space="preserve">.</w:t>
+      </w:r>
+    </w:p>
     <w:bookmarkEnd w:id="78"/>
+    <w:bookmarkEnd w:id="79"/>
     <w:sectPr/>
   </w:body>
 </w:document>

</xml_diff>

<commit_message>
Plan 2.15 Phase B: GPU-aware extract_hotspot_callers.py
Extends the capstone tool with an optional gpu_dir: fuses CPU+GPU ranking via
stage5_fused_hotspots_table.build_combined_view() (reused as-is) and traces a hot
kernel's caller chain(s) through whichever CPU call site launched it.

The real architecture gap: synthetic kernel nodes (make_kernel_node()) had no parent
link, since render_forest() only ever walks down through static_children. Fixed with
two small, backward-compatible additions -- an optional parent param plus a
collect_into param on attach_kernel_summaries()/attach_and_render_gpu_kernels() -- so
attached kernels become real, walkable members of the flat row pool. After that,
Phase A's own caller_chains_for_label() needed zero changes to handle kernels too.

Verified against the calltree tools' own kernel-anchor fixtures (single-anchor,
multi-anchor, no-anchor); both calltree tools stay --help- and byte-identical.
</commit_message>
<xml_diff>
--- a/docs/DEVELOPMENT_HISTORY.docx
+++ b/docs/DEVELOPMENT_HISTORY.docx
@@ -10,7 +10,7 @@
         <w:t xml:space="preserve">Development History</w:t>
       </w:r>
     </w:p>
-    <w:bookmarkStart w:id="79" w:name="development-history"/>
+    <w:bookmarkStart w:id="80" w:name="development-history"/>
     <w:p>
       <w:pPr>
         <w:pStyle w:val="Heading1"/>
@@ -3129,6 +3129,107 @@
           </w:p>
         </w:tc>
       </w:tr>
+      <w:tr>
+        <w:tc>
+          <w:tcPr/>
+          <w:p>
+            <w:pPr>
+              <w:pStyle w:val="Compact"/>
+              <w:jc w:val="left"/>
+            </w:pPr>
+            <w:r>
+              <w:t xml:space="preserve">2026-08-17</w:t>
+            </w:r>
+          </w:p>
+        </w:tc>
+        <w:tc>
+          <w:tcPr/>
+          <w:p>
+            <w:pPr>
+              <w:pStyle w:val="Compact"/>
+              <w:jc w:val="left"/>
+            </w:pPr>
+            <w:r>
+              <w:t xml:space="preserve">Plan 2.15 Phase B:</w:t>
+            </w:r>
+            <w:r>
+              <w:t xml:space="preserve"> </w:t>
+            </w:r>
+            <w:r>
+              <w:rPr>
+                <w:rStyle w:val="VerbatimChar"/>
+              </w:rPr>
+              <w:t xml:space="preserve">extract_hotspot_callers.py</w:t>
+            </w:r>
+            <w:r>
+              <w:t xml:space="preserve"> </w:t>
+            </w:r>
+            <w:r>
+              <w:t xml:space="preserve">gains an optional GPU-paired mode – fuses CPU+GPU ranking (reusing</w:t>
+            </w:r>
+            <w:r>
+              <w:t xml:space="preserve"> </w:t>
+            </w:r>
+            <w:r>
+              <w:rPr>
+                <w:rStyle w:val="VerbatimChar"/>
+              </w:rPr>
+              <w:t xml:space="preserve">stage5_fused_hotspots_table.build_combined_view()</w:t>
+            </w:r>
+            <w:r>
+              <w:t xml:space="preserve"> </w:t>
+            </w:r>
+            <w:r>
+              <w:t xml:space="preserve">as-is) and traces a hot kernel’s own caller chain(s) through its launching CPU call site; needed one small, additive gap-fix (a</w:t>
+            </w:r>
+            <w:r>
+              <w:t xml:space="preserve"> </w:t>
+            </w:r>
+            <w:r>
+              <w:rPr>
+                <w:rStyle w:val="VerbatimChar"/>
+              </w:rPr>
+              <w:t xml:space="preserve">parent</w:t>
+            </w:r>
+            <w:r>
+              <w:t xml:space="preserve"> </w:t>
+            </w:r>
+            <w:r>
+              <w:t xml:space="preserve">link on synthetic kernel nodes plus a</w:t>
+            </w:r>
+            <w:r>
+              <w:t xml:space="preserve"> </w:t>
+            </w:r>
+            <w:r>
+              <w:rPr>
+                <w:rStyle w:val="VerbatimChar"/>
+              </w:rPr>
+              <w:t xml:space="preserve">collect_into</w:t>
+            </w:r>
+            <w:r>
+              <w:t xml:space="preserve"> </w:t>
+            </w:r>
+            <w:r>
+              <w:t xml:space="preserve">param), after which</w:t>
+            </w:r>
+            <w:r>
+              <w:t xml:space="preserve"> </w:t>
+            </w:r>
+            <w:r>
+              <w:rPr>
+                <w:rStyle w:val="VerbatimChar"/>
+              </w:rPr>
+              <w:t xml:space="preserve">caller_chains_for_label()</w:t>
+            </w:r>
+            <w:r>
+              <w:t xml:space="preserve"> </w:t>
+            </w:r>
+            <w:r>
+              <w:t xml:space="preserve">handles kernels with zero further changes – see full accounting below</w:t>
+            </w:r>
+          </w:p>
+        </w:tc>
+      </w:tr>
     </w:tbl>
     <w:bookmarkStart w:id="20" w:name="project-scaffolding-and-rules"/>
     <w:p>
@@ -47305,7 +47406,981 @@
       </w:r>
     </w:p>
     <w:bookmarkEnd w:id="78"/>
+    <w:bookmarkStart w:id="79" w:name="X109124c6ee7747f3241a433b885522e26c7d431"/>
+    <w:p>
+      <w:pPr>
+        <w:pStyle w:val="Heading2"/>
+      </w:pPr>
+      <w:r>
+        <w:t xml:space="preserve">2026-08-17 — Plan 2.15 Phase B: GPU-aware</w:t>
+      </w:r>
+      <w:r>
+        <w:t xml:space="preserve"> </w:t>
+      </w:r>
+      <w:r>
+        <w:rPr>
+          <w:rStyle w:val="VerbatimChar"/>
+        </w:rPr>
+        <w:t xml:space="preserve">extract_hotspot_callers.py</w:t>
+      </w:r>
+    </w:p>
+    <w:p>
+      <w:pPr>
+        <w:pStyle w:val="FirstParagraph"/>
+      </w:pPr>
+      <w:r>
+        <w:t xml:space="preserve">Detailed plan written and implemented in the same session, informed by Phase A’s actual code</w:t>
+      </w:r>
+      <w:r>
+        <w:t xml:space="preserve"> </w:t>
+      </w:r>
+      <w:r>
+        <w:t xml:space="preserve">(see</w:t>
+      </w:r>
+      <w:r>
+        <w:t xml:space="preserve"> </w:t>
+      </w:r>
+      <w:r>
+        <w:rPr>
+          <w:rStyle w:val="VerbatimChar"/>
+        </w:rPr>
+        <w:t xml:space="preserve">docs/plans/2.15-hotspot-callers-capstone.md</w:t>
+      </w:r>
+      <w:r>
+        <w:t xml:space="preserve">’s</w:t>
+      </w:r>
+      <w:r>
+        <w:t xml:space="preserve"> </w:t>
+      </w:r>
+      <w:r>
+        <w:t xml:space="preserve">“</w:t>
+      </w:r>
+      <w:r>
+        <w:t xml:space="preserve">Phase B</w:t>
+      </w:r>
+      <w:r>
+        <w:t xml:space="preserve">”</w:t>
+      </w:r>
+      <w:r>
+        <w:t xml:space="preserve"> </w:t>
+      </w:r>
+      <w:r>
+        <w:t xml:space="preserve">section) rather than the original</w:t>
+      </w:r>
+      <w:r>
+        <w:t xml:space="preserve"> </w:t>
+      </w:r>
+      <w:r>
+        <w:t xml:space="preserve">sketch. The real test here was narrower than Phase A’s: can the</w:t>
+      </w:r>
+      <w:r>
+        <w:t xml:space="preserve"> </w:t>
+      </w:r>
+      <w:r>
+        <w:rPr>
+          <w:iCs/>
+          <w:i/>
+        </w:rPr>
+        <w:t xml:space="preserve">existing</w:t>
+      </w:r>
+      <w:r>
+        <w:t xml:space="preserve"> </w:t>
+      </w:r>
+      <w:r>
+        <w:t xml:space="preserve">kernel-attachment</w:t>
+      </w:r>
+      <w:r>
+        <w:t xml:space="preserve"> </w:t>
+      </w:r>
+      <w:r>
+        <w:t xml:space="preserve">machinery – built entirely for rendering a kernel as a descendant in the calltree tools – be</w:t>
+      </w:r>
+      <w:r>
+        <w:t xml:space="preserve"> </w:t>
+      </w:r>
+      <w:r>
+        <w:t xml:space="preserve">reused for the opposite direction, walking a kernel’s caller chain upward?</w:t>
+      </w:r>
+    </w:p>
+    <w:p>
+      <w:pPr>
+        <w:pStyle w:val="BodyText"/>
+      </w:pPr>
+      <w:r>
+        <w:rPr>
+          <w:bCs/>
+          <w:b/>
+        </w:rPr>
+        <w:t xml:space="preserve">The gap, found by reading the code, not guessing</w:t>
+      </w:r>
+      <w:r>
+        <w:t xml:space="preserve">:</w:t>
+      </w:r>
+      <w:r>
+        <w:t xml:space="preserve"> </w:t>
+      </w:r>
+      <w:r>
+        <w:rPr>
+          <w:rStyle w:val="VerbatimChar"/>
+        </w:rPr>
+        <w:t xml:space="preserve">stage4_rocprofsys_tree.make_kernel_node()</w:t>
+      </w:r>
+      <w:r>
+        <w:t xml:space="preserve"> </w:t>
+      </w:r>
+      <w:r>
+        <w:t xml:space="preserve">built synthetic kernel nodes with no</w:t>
+      </w:r>
+      <w:r>
+        <w:t xml:space="preserve"> </w:t>
+      </w:r>
+      <w:r>
+        <w:rPr>
+          <w:rStyle w:val="VerbatimChar"/>
+        </w:rPr>
+        <w:t xml:space="preserve">parent</w:t>
+      </w:r>
+      <w:r>
+        <w:t xml:space="preserve"> </w:t>
+      </w:r>
+      <w:r>
+        <w:t xml:space="preserve">key at all – every other row shape in this codebase</w:t>
+      </w:r>
+      <w:r>
+        <w:t xml:space="preserve"> </w:t>
+      </w:r>
+      <w:r>
+        <w:t xml:space="preserve">carries one (that’s what</w:t>
+      </w:r>
+      <w:r>
+        <w:t xml:space="preserve"> </w:t>
+      </w:r>
+      <w:r>
+        <w:rPr>
+          <w:rStyle w:val="VerbatimChar"/>
+        </w:rPr>
+        <w:t xml:space="preserve">caller_chains_for_label()</w:t>
+      </w:r>
+      <w:r>
+        <w:t xml:space="preserve"> </w:t>
+      </w:r>
+      <w:r>
+        <w:t xml:space="preserve">walks), but a synthetic node never needed one,</w:t>
+      </w:r>
+      <w:r>
+        <w:t xml:space="preserve"> </w:t>
+      </w:r>
+      <w:r>
+        <w:t xml:space="preserve">since</w:t>
+      </w:r>
+      <w:r>
+        <w:t xml:space="preserve"> </w:t>
+      </w:r>
+      <w:r>
+        <w:rPr>
+          <w:rStyle w:val="VerbatimChar"/>
+        </w:rPr>
+        <w:t xml:space="preserve">render_forest()</w:t>
+      </w:r>
+      <w:r>
+        <w:t xml:space="preserve"> </w:t>
+      </w:r>
+      <w:r>
+        <w:t xml:space="preserve">only ever walks down through</w:t>
+      </w:r>
+      <w:r>
+        <w:t xml:space="preserve"> </w:t>
+      </w:r>
+      <w:r>
+        <w:rPr>
+          <w:rStyle w:val="VerbatimChar"/>
+        </w:rPr>
+        <w:t xml:space="preserve">static_children</w:t>
+      </w:r>
+      <w:r>
+        <w:t xml:space="preserve">. The fix was two small,</w:t>
+      </w:r>
+      <w:r>
+        <w:t xml:space="preserve"> </w:t>
+      </w:r>
+      <w:r>
+        <w:t xml:space="preserve">fully backward-compatible additions:</w:t>
+      </w:r>
+      <w:r>
+        <w:t xml:space="preserve"> </w:t>
+      </w:r>
+      <w:r>
+        <w:rPr>
+          <w:rStyle w:val="VerbatimChar"/>
+        </w:rPr>
+        <w:t xml:space="preserve">make_kernel_node(label, per_rank, parent=None)</w:t>
+      </w:r>
+      <w:r>
+        <w:t xml:space="preserve"> </w:t>
+      </w:r>
+      <w:r>
+        <w:t xml:space="preserve">and</w:t>
+      </w:r>
+      <w:r>
+        <w:t xml:space="preserve"> </w:t>
+      </w:r>
+      <w:r>
+        <w:rPr>
+          <w:rStyle w:val="VerbatimChar"/>
+        </w:rPr>
+        <w:t xml:space="preserve">attach_kernel_summaries(rows, gpu_kernel_by_rank, is_pruned, collect_into=None)</w:t>
+      </w:r>
+      <w:r>
+        <w:t xml:space="preserve"> </w:t>
+      </w:r>
+      <w:r>
+        <w:t xml:space="preserve">(threaded through</w:t>
+      </w:r>
+      <w:r>
+        <w:t xml:space="preserve"> </w:t>
+      </w:r>
+      <w:r>
+        <w:rPr>
+          <w:rStyle w:val="VerbatimChar"/>
+        </w:rPr>
+        <w:t xml:space="preserve">stage5_tree_render.attach_and_render_gpu_kernels()</w:t>
+      </w:r>
+      <w:r>
+        <w:t xml:space="preserve"> </w:t>
+      </w:r>
+      <w:r>
+        <w:t xml:space="preserve">too) – when</w:t>
+      </w:r>
+      <w:r>
+        <w:t xml:space="preserve"> </w:t>
+      </w:r>
+      <w:r>
+        <w:rPr>
+          <w:rStyle w:val="VerbatimChar"/>
+        </w:rPr>
+        <w:t xml:space="preserve">collect_into</w:t>
+      </w:r>
+      <w:r>
+        <w:t xml:space="preserve"> </w:t>
+      </w:r>
+      <w:r>
+        <w:t xml:space="preserve">is a list, every</w:t>
+      </w:r>
+      <w:r>
+        <w:t xml:space="preserve"> </w:t>
+      </w:r>
+      <w:r>
+        <w:t xml:space="preserve">newly attached kernel node (the group wrapper and each per-kernel-name leaf) is appended to it, now</w:t>
+      </w:r>
+      <w:r>
+        <w:t xml:space="preserve"> </w:t>
+      </w:r>
+      <w:r>
+        <w:t xml:space="preserve">carrying a real</w:t>
+      </w:r>
+      <w:r>
+        <w:t xml:space="preserve"> </w:t>
+      </w:r>
+      <w:r>
+        <w:rPr>
+          <w:rStyle w:val="VerbatimChar"/>
+        </w:rPr>
+        <w:t xml:space="preserve">parent</w:t>
+      </w:r>
+      <w:r>
+        <w:t xml:space="preserve"> </w:t>
+      </w:r>
+      <w:r>
+        <w:t xml:space="preserve">chain up through its anchor to the root. Every existing call site passes</w:t>
+      </w:r>
+      <w:r>
+        <w:t xml:space="preserve"> </w:t>
+      </w:r>
+      <w:r>
+        <w:t xml:space="preserve">neither param, so nothing about either calltree tool’s own rendered output could change – confirmed</w:t>
+      </w:r>
+      <w:r>
+        <w:t xml:space="preserve"> </w:t>
+      </w:r>
+      <w:r>
+        <w:t xml:space="preserve">by the full suite staying green,</w:t>
+      </w:r>
+      <w:r>
+        <w:t xml:space="preserve"> </w:t>
+      </w:r>
+      <w:r>
+        <w:rPr>
+          <w:rStyle w:val="VerbatimChar"/>
+        </w:rPr>
+        <w:t xml:space="preserve">--help</w:t>
+      </w:r>
+      <w:r>
+        <w:t xml:space="preserve"> </w:t>
+      </w:r>
+      <w:r>
+        <w:t xml:space="preserve">staying byte-identical for both tools, and real-data</w:t>
+      </w:r>
+      <w:r>
+        <w:t xml:space="preserve"> </w:t>
+      </w:r>
+      <w:r>
+        <w:t xml:space="preserve">regeneration across all 6</w:t>
+      </w:r>
+      <w:r>
+        <w:t xml:space="preserve"> </w:t>
+      </w:r>
+      <w:r>
+        <w:rPr>
+          <w:rStyle w:val="VerbatimChar"/>
+        </w:rPr>
+        <w:t xml:space="preserve">test_apps/results/</w:t>
+      </w:r>
+      <w:r>
+        <w:t xml:space="preserve"> </w:t>
+      </w:r>
+      <w:r>
+        <w:t xml:space="preserve">dirs staying byte-identical for both.</w:t>
+      </w:r>
+    </w:p>
+    <w:p>
+      <w:pPr>
+        <w:pStyle w:val="BodyText"/>
+      </w:pPr>
+      <w:r>
+        <w:rPr>
+          <w:bCs/>
+          <w:b/>
+        </w:rPr>
+        <w:t xml:space="preserve">With that fix alone, zero new tree-walking code was needed.</w:t>
+      </w:r>
+      <w:r>
+        <w:t xml:space="preserve"> </w:t>
+      </w:r>
+      <w:r>
+        <w:t xml:space="preserve">Once a kernel is attached with</w:t>
+      </w:r>
+      <w:r>
+        <w:t xml:space="preserve"> </w:t>
+      </w:r>
+      <w:r>
+        <w:rPr>
+          <w:rStyle w:val="VerbatimChar"/>
+        </w:rPr>
+        <w:t xml:space="preserve">collect_into=flat</w:t>
+      </w:r>
+      <w:r>
+        <w:t xml:space="preserve">,</w:t>
+      </w:r>
+      <w:r>
+        <w:t xml:space="preserve"> </w:t>
+      </w:r>
+      <w:r>
+        <w:rPr>
+          <w:rStyle w:val="VerbatimChar"/>
+        </w:rPr>
+        <w:t xml:space="preserve">caller_chains_for_label(flat, kernel_name)</w:t>
+      </w:r>
+      <w:r>
+        <w:t xml:space="preserve"> </w:t>
+      </w:r>
+      <w:r>
+        <w:t xml:space="preserve">– Phase A’s own function,</w:t>
+      </w:r>
+      <w:r>
+        <w:t xml:space="preserve"> </w:t>
+      </w:r>
+      <w:r>
+        <w:t xml:space="preserve">unmodified – finds and walks it exactly like any CPU function: a kernel attached at multiple</w:t>
+      </w:r>
+      <w:r>
+        <w:t xml:space="preserve"> </w:t>
+      </w:r>
+      <w:r>
+        <w:t xml:space="preserve">anchors (the proportional-split case) naturally yields multiple matching leaf nodes, so it already</w:t>
+      </w:r>
+      <w:r>
+        <w:t xml:space="preserve"> </w:t>
+      </w:r>
+      <w:r>
+        <w:t xml:space="preserve">returns one chain per launch site; a kernel</w:t>
+      </w:r>
+      <w:r>
+        <w:t xml:space="preserve"> </w:t>
+      </w:r>
+      <w:r>
+        <w:rPr>
+          <w:rStyle w:val="VerbatimChar"/>
+        </w:rPr>
+        <w:t xml:space="preserve">attach_kernel_summaries()</w:t>
+      </w:r>
+      <w:r>
+        <w:t xml:space="preserve"> </w:t>
+      </w:r>
+      <w:r>
+        <w:t xml:space="preserve">couldn’t place anywhere</w:t>
+      </w:r>
+      <w:r>
+        <w:t xml:space="preserve"> </w:t>
+      </w:r>
+      <w:r>
+        <w:t xml:space="preserve">never gets added to</w:t>
+      </w:r>
+      <w:r>
+        <w:t xml:space="preserve"> </w:t>
+      </w:r>
+      <w:r>
+        <w:rPr>
+          <w:rStyle w:val="VerbatimChar"/>
+        </w:rPr>
+        <w:t xml:space="preserve">flat</w:t>
+      </w:r>
+      <w:r>
+        <w:t xml:space="preserve">, so the lookup naturally returns</w:t>
+      </w:r>
+      <w:r>
+        <w:t xml:space="preserve"> </w:t>
+      </w:r>
+      <w:r>
+        <w:rPr>
+          <w:rStyle w:val="VerbatimChar"/>
+        </w:rPr>
+        <w:t xml:space="preserve">[]</w:t>
+      </w:r>
+      <w:r>
+        <w:t xml:space="preserve"> </w:t>
+      </w:r>
+      <w:r>
+        <w:t xml:space="preserve">– the same</w:t>
+      </w:r>
+      <w:r>
+        <w:t xml:space="preserve"> </w:t>
+      </w:r>
+      <w:r>
+        <w:t xml:space="preserve">“</w:t>
+      </w:r>
+      <w:r>
+        <w:t xml:space="preserve">no caller chain found</w:t>
+      </w:r>
+      <w:r>
+        <w:t xml:space="preserve">”</w:t>
+      </w:r>
+      <w:r>
+        <w:t xml:space="preserve"> </w:t>
+      </w:r>
+      <w:r>
+        <w:t xml:space="preserve">message Phase A already prints, no kernel-specific fallback text needed either.</w:t>
+      </w:r>
+    </w:p>
+    <w:p>
+      <w:pPr>
+        <w:pStyle w:val="BodyText"/>
+      </w:pPr>
+      <w:r>
+        <w:rPr>
+          <w:bCs/>
+          <w:b/>
+        </w:rPr>
+        <w:t xml:space="preserve">Tool-level changes</w:t>
+      </w:r>
+      <w:r>
+        <w:t xml:space="preserve">: an optional second</w:t>
+      </w:r>
+      <w:r>
+        <w:t xml:space="preserve"> </w:t>
+      </w:r>
+      <w:r>
+        <w:rPr>
+          <w:rStyle w:val="VerbatimChar"/>
+        </w:rPr>
+        <w:t xml:space="preserve">gpu_dir</w:t>
+      </w:r>
+      <w:r>
+        <w:t xml:space="preserve"> </w:t>
+      </w:r>
+      <w:r>
+        <w:t xml:space="preserve">positional argument, resolved via</w:t>
+      </w:r>
+      <w:r>
+        <w:t xml:space="preserve"> </w:t>
+      </w:r>
+      <w:r>
+        <w:rPr>
+          <w:rStyle w:val="VerbatimChar"/>
+        </w:rPr>
+        <w:t xml:space="preserve">stage1_run_dirs.resolve_two_dirs()</w:t>
+      </w:r>
+      <w:r>
+        <w:t xml:space="preserve"> </w:t>
+      </w:r>
+      <w:r>
+        <w:t xml:space="preserve">(the same optional-GPU-pairing shape the calltree tools already</w:t>
+      </w:r>
+      <w:r>
+        <w:t xml:space="preserve"> </w:t>
+      </w:r>
+      <w:r>
+        <w:t xml:space="preserve">use – GPU-less operation stays a first-class mode, not a required pairing like</w:t>
+      </w:r>
+      <w:r>
+        <w:t xml:space="preserve"> </w:t>
+      </w:r>
+      <w:r>
+        <w:rPr>
+          <w:rStyle w:val="VerbatimChar"/>
+        </w:rPr>
+        <w:t xml:space="preserve">extract_hotspots.py</w:t>
+      </w:r>
+      <w:r>
+        <w:t xml:space="preserve">). When it resolves, the hotspot pool switches from</w:t>
+      </w:r>
+      <w:r>
+        <w:t xml:space="preserve"> </w:t>
+      </w:r>
+      <w:r>
+        <w:rPr>
+          <w:rStyle w:val="VerbatimChar"/>
+        </w:rPr>
+        <w:t xml:space="preserve">stage4_rocprofsys_flat.aggregate()</w:t>
+      </w:r>
+      <w:r>
+        <w:t xml:space="preserve">’s bare CPU entries to</w:t>
+      </w:r>
+      <w:r>
+        <w:t xml:space="preserve"> </w:t>
+      </w:r>
+      <w:r>
+        <w:rPr>
+          <w:rStyle w:val="VerbatimChar"/>
+        </w:rPr>
+        <w:t xml:space="preserve">stage5_fused_hotspots_table.build_combined_view()</w:t>
+      </w:r>
+      <w:r>
+        <w:t xml:space="preserve">’s fused CPU+GPU pool and</w:t>
+      </w:r>
+      <w:r>
+        <w:t xml:space="preserve"> </w:t>
+      </w:r>
+      <w:r>
+        <w:rPr>
+          <w:rStyle w:val="VerbatimChar"/>
+        </w:rPr>
+        <w:t xml:space="preserve">FUSED_HOTSPOTS_COLUMNS</w:t>
+      </w:r>
+      <w:r>
+        <w:t xml:space="preserve"> </w:t>
+      </w:r>
+      <w:r>
+        <w:t xml:space="preserve">– both reused as literally the same objects</w:t>
+      </w:r>
+      <w:r>
+        <w:t xml:space="preserve"> </w:t>
+      </w:r>
+      <w:r>
+        <w:rPr>
+          <w:rStyle w:val="VerbatimChar"/>
+        </w:rPr>
+        <w:t xml:space="preserve">extract_hotspots.py</w:t>
+      </w:r>
+      <w:r>
+        <w:t xml:space="preserve"> </w:t>
+      </w:r>
+      <w:r>
+        <w:t xml:space="preserve">already</w:t>
+      </w:r>
+      <w:r>
+        <w:t xml:space="preserve"> </w:t>
+      </w:r>
+      <w:r>
+        <w:t xml:space="preserve">renders with; when it’s absent, every code path is exactly Phase A’s, unchanged.</w:t>
+      </w:r>
+      <w:r>
+        <w:t xml:space="preserve"> </w:t>
+      </w:r>
+      <w:r>
+        <w:rPr>
+          <w:rStyle w:val="VerbatimChar"/>
+        </w:rPr>
+        <w:t xml:space="preserve">gpu_api</w:t>
+      </w:r>
+      <w:r>
+        <w:t xml:space="preserve"> </w:t>
+      </w:r>
+      <w:r>
+        <w:t xml:space="preserve">noise is</w:t>
+      </w:r>
+      <w:r>
+        <w:t xml:space="preserve"> </w:t>
+      </w:r>
+      <w:r>
+        <w:t xml:space="preserve">hidden by default from kernel-anchor resolution (matching every other tool’s default), with no new</w:t>
+      </w:r>
+      <w:r>
+        <w:t xml:space="preserve"> </w:t>
+      </w:r>
+      <w:r>
+        <w:rPr>
+          <w:rStyle w:val="VerbatimChar"/>
+        </w:rPr>
+        <w:t xml:space="preserve">--show-gpu-api</w:t>
+      </w:r>
+      <w:r>
+        <w:t xml:space="preserve"> </w:t>
+      </w:r>
+      <w:r>
+        <w:t xml:space="preserve">flag in this first cut – an open question left for later, not silently decided</w:t>
+      </w:r>
+      <w:r>
+        <w:t xml:space="preserve"> </w:t>
+      </w:r>
+      <w:r>
+        <w:t xml:space="preserve">against.</w:t>
+      </w:r>
+    </w:p>
+    <w:p>
+      <w:pPr>
+        <w:pStyle w:val="BodyText"/>
+      </w:pPr>
+      <w:r>
+        <w:t xml:space="preserve">Verified against three of the calltree tools’ own existing kernel-attachment fixtures</w:t>
+      </w:r>
+      <w:r>
+        <w:t xml:space="preserve"> </w:t>
+      </w:r>
+      <w:r>
+        <w:t xml:space="preserve">(</w:t>
+      </w:r>
+      <w:r>
+        <w:rPr>
+          <w:rStyle w:val="VerbatimChar"/>
+        </w:rPr>
+        <w:t xml:space="preserve">calltree_kernel_anchor</w:t>
+      </w:r>
+      <w:r>
+        <w:t xml:space="preserve">,</w:t>
+      </w:r>
+      <w:r>
+        <w:t xml:space="preserve"> </w:t>
+      </w:r>
+      <w:r>
+        <w:rPr>
+          <w:rStyle w:val="VerbatimChar"/>
+        </w:rPr>
+        <w:t xml:space="preserve">calltree_kernel_multi_anchor</w:t>
+      </w:r>
+      <w:r>
+        <w:t xml:space="preserve">,</w:t>
+      </w:r>
+      <w:r>
+        <w:t xml:space="preserve"> </w:t>
+      </w:r>
+      <w:r>
+        <w:rPr>
+          <w:rStyle w:val="VerbatimChar"/>
+        </w:rPr>
+        <w:t xml:space="preserve">calltree_kernel_no_anchor</w:t>
+      </w:r>
+      <w:r>
+        <w:t xml:space="preserve"> </w:t>
+      </w:r>
+      <w:r>
+        <w:t xml:space="preserve">– none use</w:t>
+      </w:r>
+      <w:r>
+        <w:t xml:space="preserve"> </w:t>
+      </w:r>
+      <w:r>
+        <w:t xml:space="preserve">Cray’s</w:t>
+      </w:r>
+      <w:r>
+        <w:t xml:space="preserve"> </w:t>
+      </w:r>
+      <w:r>
+        <w:rPr>
+          <w:rStyle w:val="VerbatimChar"/>
+        </w:rPr>
+        <w:t xml:space="preserve">$ck_</w:t>
+      </w:r>
+      <w:r>
+        <w:t xml:space="preserve"> </w:t>
+      </w:r>
+      <w:r>
+        <w:t xml:space="preserve">owner-naming, so all three exercise</w:t>
+      </w:r>
+      <w:r>
+        <w:t xml:space="preserve"> </w:t>
+      </w:r>
+      <w:r>
+        <w:rPr>
+          <w:rStyle w:val="VerbatimChar"/>
+        </w:rPr>
+        <w:t xml:space="preserve">find_kernel_anchors()</w:t>
+      </w:r>
+      <w:r>
+        <w:t xml:space="preserve">‘</w:t>
+      </w:r>
+      <w:r>
+        <w:t xml:space="preserve">s structural fallback, not</w:t>
+      </w:r>
+      <w:r>
+        <w:t xml:space="preserve"> </w:t>
+      </w:r>
+      <w:r>
+        <w:rPr>
+          <w:rStyle w:val="VerbatimChar"/>
+        </w:rPr>
+        <w:t xml:space="preserve">kernel_owner_label()</w:t>
+      </w:r>
+      <w:r>
+        <w:t xml:space="preserve">’s name match): a single-anchor kernel’s caller chain resolves through its one</w:t>
+      </w:r>
+      <w:r>
+        <w:t xml:space="preserve"> </w:t>
+      </w:r>
+      <w:r>
+        <w:t xml:space="preserve">launch site; a multi-anchor kernel gets one chain per launch site (</w:t>
+      </w:r>
+      <w:r>
+        <w:rPr>
+          <w:rStyle w:val="VerbatimChar"/>
+        </w:rPr>
+        <w:t xml:space="preserve">compute_a</w:t>
+      </w:r>
+      <w:r>
+        <w:t xml:space="preserve">/</w:t>
+      </w:r>
+      <w:r>
+        <w:rPr>
+          <w:rStyle w:val="VerbatimChar"/>
+        </w:rPr>
+        <w:t xml:space="preserve">compute_b</w:t>
+      </w:r>
+      <w:r>
+        <w:t xml:space="preserve">, matching</w:t>
+      </w:r>
+      <w:r>
+        <w:t xml:space="preserve"> </w:t>
+      </w:r>
+      <w:r>
+        <w:t xml:space="preserve">the existing proportional-split fixture); an unplaceable kernel shows</w:t>
+      </w:r>
+      <w:r>
+        <w:t xml:space="preserve"> </w:t>
+      </w:r>
+      <w:r>
+        <w:t xml:space="preserve">“</w:t>
+      </w:r>
+      <w:r>
+        <w:t xml:space="preserve">no caller chain found</w:t>
+      </w:r>
+      <w:r>
+        <w:t xml:space="preserve">”</w:t>
+      </w:r>
+      <w:r>
+        <w:t xml:space="preserve"> </w:t>
+      </w:r>
+      <w:r>
+        <w:t xml:space="preserve">plus</w:t>
+      </w:r>
+      <w:r>
+        <w:t xml:space="preserve"> </w:t>
+      </w:r>
+      <w:r>
+        <w:t xml:space="preserve">the calltree tools</w:t>
+      </w:r>
+      <w:r>
+        <w:t xml:space="preserve">’</w:t>
+      </w:r>
+      <w:r>
+        <w:t xml:space="preserve"> </w:t>
+      </w:r>
+      <w:r>
+        <w:t xml:space="preserve">own</w:t>
+      </w:r>
+      <w:r>
+        <w:t xml:space="preserve"> </w:t>
+      </w:r>
+      <w:r>
+        <w:t xml:space="preserve">“</w:t>
+      </w:r>
+      <w:r>
+        <w:t xml:space="preserve">no owning subroutine or launch call site found</w:t>
+      </w:r>
+      <w:r>
+        <w:t xml:space="preserve">”</w:t>
+      </w:r>
+      <w:r>
+        <w:t xml:space="preserve"> </w:t>
+      </w:r>
+      <w:r>
+        <w:t xml:space="preserve">fallback section.</w:t>
+      </w:r>
+    </w:p>
+    <w:p>
+      <w:pPr>
+        <w:pStyle w:val="BodyText"/>
+      </w:pPr>
+      <w:r>
+        <w:t xml:space="preserve">Tests: 7 new</w:t>
+      </w:r>
+      <w:r>
+        <w:t xml:space="preserve"> </w:t>
+      </w:r>
+      <w:r>
+        <w:rPr>
+          <w:rStyle w:val="VerbatimChar"/>
+        </w:rPr>
+        <w:t xml:space="preserve">stage4_rocprofsys_tree.py</w:t>
+      </w:r>
+      <w:r>
+        <w:t xml:space="preserve"> </w:t>
+      </w:r>
+      <w:r>
+        <w:t xml:space="preserve">tests (</w:t>
+      </w:r>
+      <w:r>
+        <w:rPr>
+          <w:rStyle w:val="VerbatimChar"/>
+        </w:rPr>
+        <w:t xml:space="preserve">make_kernel_node()</w:t>
+      </w:r>
+      <w:r>
+        <w:t xml:space="preserve">’s</w:t>
+      </w:r>
+      <w:r>
+        <w:t xml:space="preserve"> </w:t>
+      </w:r>
+      <w:r>
+        <w:rPr>
+          <w:rStyle w:val="VerbatimChar"/>
+        </w:rPr>
+        <w:t xml:space="preserve">parent</w:t>
+      </w:r>
+      <w:r>
+        <w:t xml:space="preserve"> </w:t>
+      </w:r>
+      <w:r>
+        <w:t xml:space="preserve">default/override,</w:t>
+      </w:r>
+      <w:r>
+        <w:t xml:space="preserve"> </w:t>
+      </w:r>
+      <w:r>
+        <w:rPr>
+          <w:rStyle w:val="VerbatimChar"/>
+        </w:rPr>
+        <w:t xml:space="preserve">attach_kernel_summaries()</w:t>
+      </w:r>
+      <w:r>
+        <w:t xml:space="preserve">’s</w:t>
+      </w:r>
+      <w:r>
+        <w:t xml:space="preserve"> </w:t>
+      </w:r>
+      <w:r>
+        <w:rPr>
+          <w:rStyle w:val="VerbatimChar"/>
+        </w:rPr>
+        <w:t xml:space="preserve">collect_into</w:t>
+      </w:r>
+      <w:r>
+        <w:t xml:space="preserve"> </w:t>
+      </w:r>
+      <w:r>
+        <w:t xml:space="preserve">gathering the right nodes across single- and</w:t>
+      </w:r>
+      <w:r>
+        <w:t xml:space="preserve"> </w:t>
+      </w:r>
+      <w:r>
+        <w:t xml:space="preserve">multi-anchor cases, and the integration test that actually proves the point –</w:t>
+      </w:r>
+      <w:r>
+        <w:t xml:space="preserve"> </w:t>
+      </w:r>
+      <w:r>
+        <w:rPr>
+          <w:rStyle w:val="VerbatimChar"/>
+        </w:rPr>
+        <w:t xml:space="preserve">caller_chains_for_label()</w:t>
+      </w:r>
+      <w:r>
+        <w:t xml:space="preserve"> </w:t>
+      </w:r>
+      <w:r>
+        <w:t xml:space="preserve">walking straight through an attached kernel with no kernel-specific</w:t>
+      </w:r>
+      <w:r>
+        <w:t xml:space="preserve"> </w:t>
+      </w:r>
+      <w:r>
+        <w:t xml:space="preserve">code). 6 new</w:t>
+      </w:r>
+      <w:r>
+        <w:t xml:space="preserve"> </w:t>
+      </w:r>
+      <w:r>
+        <w:rPr>
+          <w:rStyle w:val="VerbatimChar"/>
+        </w:rPr>
+        <w:t xml:space="preserve">extract_hotspot_callers.py</w:t>
+      </w:r>
+      <w:r>
+        <w:t xml:space="preserve"> </w:t>
+      </w:r>
+      <w:r>
+        <w:t xml:space="preserve">tests (the three fixture scenarios above, CPU-only</w:t>
+      </w:r>
+      <w:r>
+        <w:t xml:space="preserve"> </w:t>
+      </w:r>
+      <w:r>
+        <w:t xml:space="preserve">operation unaffected by the new</w:t>
+      </w:r>
+      <w:r>
+        <w:t xml:space="preserve"> </w:t>
+      </w:r>
+      <w:r>
+        <w:rPr>
+          <w:rStyle w:val="VerbatimChar"/>
+        </w:rPr>
+        <w:t xml:space="preserve">gpu_dir</w:t>
+      </w:r>
+      <w:r>
+        <w:t xml:space="preserve"> </w:t>
+      </w:r>
+      <w:r>
+        <w:t xml:space="preserve">param, a missing-GPU-data error when</w:t>
+      </w:r>
+      <w:r>
+        <w:t xml:space="preserve"> </w:t>
+      </w:r>
+      <w:r>
+        <w:rPr>
+          <w:rStyle w:val="VerbatimChar"/>
+        </w:rPr>
+        <w:t xml:space="preserve">gpu_dir</w:t>
+      </w:r>
+      <w:r>
+        <w:t xml:space="preserve"> </w:t>
+      </w:r>
+      <w:r>
+        <w:t xml:space="preserve">is</w:t>
+      </w:r>
+      <w:r>
+        <w:t xml:space="preserve"> </w:t>
+      </w:r>
+      <w:r>
+        <w:t xml:space="preserve">explicitly given but empty, and CLI-level auto-resolution from a combined parent directory). Full</w:t>
+      </w:r>
+      <w:r>
+        <w:t xml:space="preserve"> </w:t>
+      </w:r>
+      <w:r>
+        <w:t xml:space="preserve">suite: 509 tests, all passing.</w:t>
+      </w:r>
+    </w:p>
     <w:bookmarkEnd w:id="79"/>
+    <w:bookmarkEnd w:id="80"/>
     <w:sectPr/>
   </w:body>
 </w:document>

</xml_diff>

<commit_message>
Plan 2.17: split README.md into a user guide and a developer architecture guide
README.md mixed two audiences: simple per-tool usage for a beginner, and deep
implementation rationale (double-counting arithmetic, noise-filtering substring
lists, kernel-attachment algorithm details) a developer needs but a first-time
user doesn't. Split into README.md (trimmed to what each tool does and how to
run it) and a new postprocess/README.md (pipeline philosophy, the stage1-stage6
architecture, the two subsystems worth a deeper look, and a concrete guide for
building a new tool).

Also closed two real documentation gaps found while cross-checking tool
coverage: extract_hotspot_callers.py had no README section at all, and
--extra-noise-config (used by 7 of the 9 tools) was never mentioned anywhere.
</commit_message>
<xml_diff>
--- a/docs/DEVELOPMENT_HISTORY.docx
+++ b/docs/DEVELOPMENT_HISTORY.docx
@@ -10,7 +10,7 @@
         <w:t xml:space="preserve">Development History</w:t>
       </w:r>
     </w:p>
-    <w:bookmarkStart w:id="81" w:name="development-history"/>
+    <w:bookmarkStart w:id="82" w:name="development-history"/>
     <w:p>
       <w:pPr>
         <w:pStyle w:val="Heading1"/>
@@ -3346,6 +3346,116 @@
           </w:p>
         </w:tc>
       </w:tr>
+      <w:tr>
+        <w:tc>
+          <w:tcPr/>
+          <w:p>
+            <w:pPr>
+              <w:pStyle w:val="Compact"/>
+              <w:jc w:val="left"/>
+            </w:pPr>
+            <w:r>
+              <w:t xml:space="preserve">2026-08-17</w:t>
+            </w:r>
+          </w:p>
+        </w:tc>
+        <w:tc>
+          <w:tcPr/>
+          <w:p>
+            <w:pPr>
+              <w:pStyle w:val="Compact"/>
+              <w:jc w:val="left"/>
+            </w:pPr>
+            <w:r>
+              <w:t xml:space="preserve">Plan 2.17: split the root</w:t>
+            </w:r>
+            <w:r>
+              <w:t xml:space="preserve"> </w:t>
+            </w:r>
+            <w:r>
+              <w:rPr>
+                <w:rStyle w:val="VerbatimChar"/>
+              </w:rPr>
+              <w:t xml:space="preserve">README.md</w:t>
+            </w:r>
+            <w:r>
+              <w:t xml:space="preserve"> </w:t>
+            </w:r>
+            <w:r>
+              <w:t xml:space="preserve">into a beginner-facing user guide (what each tool does, how to run it) and a new</w:t>
+            </w:r>
+            <w:r>
+              <w:t xml:space="preserve"> </w:t>
+            </w:r>
+            <w:r>
+              <w:rPr>
+                <w:rStyle w:val="VerbatimChar"/>
+              </w:rPr>
+              <w:t xml:space="preserve">postprocess/README.md</w:t>
+            </w:r>
+            <w:r>
+              <w:t xml:space="preserve"> </w:t>
+            </w:r>
+            <w:r>
+              <w:t xml:space="preserve">developer guide (pipeline philosophy, the</w:t>
+            </w:r>
+            <w:r>
+              <w:t xml:space="preserve"> </w:t>
+            </w:r>
+            <w:r>
+              <w:rPr>
+                <w:rStyle w:val="VerbatimChar"/>
+              </w:rPr>
+              <w:t xml:space="preserve">stage1</w:t>
+            </w:r>
+            <w:r>
+              <w:t xml:space="preserve">-</w:t>
+            </w:r>
+            <w:r>
+              <w:rPr>
+                <w:rStyle w:val="VerbatimChar"/>
+              </w:rPr>
+              <w:t xml:space="preserve">stage6</w:t>
+            </w:r>
+            <w:r>
+              <w:t xml:space="preserve"> </w:t>
+            </w:r>
+            <w:r>
+              <w:t xml:space="preserve">architecture, noise-classification and kernel-attachment mechanisms, how to build a new tool) – also closed two documentation gaps found along the way:</w:t>
+            </w:r>
+            <w:r>
+              <w:t xml:space="preserve"> </w:t>
+            </w:r>
+            <w:r>
+              <w:rPr>
+                <w:rStyle w:val="VerbatimChar"/>
+              </w:rPr>
+              <w:t xml:space="preserve">extract_hotspot_callers.py</w:t>
+            </w:r>
+            <w:r>
+              <w:t xml:space="preserve"> </w:t>
+            </w:r>
+            <w:r>
+              <w:t xml:space="preserve">had no README coverage at all, and</w:t>
+            </w:r>
+            <w:r>
+              <w:t xml:space="preserve"> </w:t>
+            </w:r>
+            <w:r>
+              <w:rPr>
+                <w:rStyle w:val="VerbatimChar"/>
+              </w:rPr>
+              <w:t xml:space="preserve">--extra-noise-config</w:t>
+            </w:r>
+            <w:r>
+              <w:t xml:space="preserve"> </w:t>
+            </w:r>
+            <w:r>
+              <w:t xml:space="preserve">(used by 7 of the 9 tools) was never mentioned anywhere</w:t>
+            </w:r>
+          </w:p>
+        </w:tc>
+      </w:tr>
     </w:tbl>
     <w:bookmarkStart w:id="20" w:name="project-scaffolding-and-rules"/>
     <w:p>
@@ -49731,7 +49841,692 @@
       </w:r>
     </w:p>
     <w:bookmarkEnd w:id="80"/>
+    <w:bookmarkStart w:id="81" w:name="X5e20cf1f40c18ee9267aee460af9d45b7b5e7aa"/>
+    <w:p>
+      <w:pPr>
+        <w:pStyle w:val="Heading2"/>
+      </w:pPr>
+      <w:r>
+        <w:t xml:space="preserve">2026-08-17 — Plan 2.17: split</w:t>
+      </w:r>
+      <w:r>
+        <w:t xml:space="preserve"> </w:t>
+      </w:r>
+      <w:r>
+        <w:rPr>
+          <w:rStyle w:val="VerbatimChar"/>
+        </w:rPr>
+        <w:t xml:space="preserve">README.md</w:t>
+      </w:r>
+      <w:r>
+        <w:t xml:space="preserve"> </w:t>
+      </w:r>
+      <w:r>
+        <w:t xml:space="preserve">into a user guide and a developer architecture guide</w:t>
+      </w:r>
+    </w:p>
+    <w:p>
+      <w:pPr>
+        <w:pStyle w:val="FirstParagraph"/>
+      </w:pPr>
+      <w:r>
+        <w:t xml:space="preserve">Documentation-only, no code changes. The root</w:t>
+      </w:r>
+      <w:r>
+        <w:t xml:space="preserve"> </w:t>
+      </w:r>
+      <w:r>
+        <w:rPr>
+          <w:rStyle w:val="VerbatimChar"/>
+        </w:rPr>
+        <w:t xml:space="preserve">README.md</w:t>
+      </w:r>
+      <w:r>
+        <w:t xml:space="preserve"> </w:t>
+      </w:r>
+      <w:r>
+        <w:t xml:space="preserve">had grown to mix two audiences in one</w:t>
+      </w:r>
+      <w:r>
+        <w:t xml:space="preserve"> </w:t>
+      </w:r>
+      <w:r>
+        <w:t xml:space="preserve">409-line document: simple per-tool usage instructions for a beginner, and deep implementation</w:t>
+      </w:r>
+      <w:r>
+        <w:t xml:space="preserve"> </w:t>
+      </w:r>
+      <w:r>
+        <w:t xml:space="preserve">rationale (the CPU+GPU double-counting arithmetic, the exact noise-filtering substring lists, the</w:t>
+      </w:r>
+      <w:r>
+        <w:t xml:space="preserve"> </w:t>
+      </w:r>
+      <w:r>
+        <w:t xml:space="preserve">Cray-name-match-vs-structural-fallback kernel-attachment algorithm, the</w:t>
+      </w:r>
+      <w:r>
+        <w:t xml:space="preserve"> </w:t>
+      </w:r>
+      <w:r>
+        <w:rPr>
+          <w:rStyle w:val="VerbatimChar"/>
+        </w:rPr>
+        <w:t xml:space="preserve">rocprof-compute</w:t>
+      </w:r>
+      <w:r>
+        <w:t xml:space="preserve"> </w:t>
+      </w:r>
+      <w:r>
+        <w:t xml:space="preserve">MPI</w:t>
+      </w:r>
+      <w:r>
+        <w:t xml:space="preserve"> </w:t>
+      </w:r>
+      <w:r>
+        <w:t xml:space="preserve">safety-check mechanism) that a first-time user doesn’t need and a developer extending the tools</w:t>
+      </w:r>
+      <w:r>
+        <w:t xml:space="preserve"> </w:t>
+      </w:r>
+      <w:r>
+        <w:t xml:space="preserve">has to dig out from underneath the basic usage text either way.</w:t>
+      </w:r>
+    </w:p>
+    <w:p>
+      <w:pPr>
+        <w:pStyle w:val="BodyText"/>
+      </w:pPr>
+      <w:r>
+        <w:rPr>
+          <w:rStyle w:val="VerbatimChar"/>
+          <w:bCs/>
+          <w:b/>
+        </w:rPr>
+        <w:t xml:space="preserve">README.md</w:t>
+      </w:r>
+      <w:r>
+        <w:t xml:space="preserve"> </w:t>
+      </w:r>
+      <w:r>
+        <w:t xml:space="preserve">(rewritten in place) now stays strictly at the</w:t>
+      </w:r>
+      <w:r>
+        <w:t xml:space="preserve"> </w:t>
+      </w:r>
+      <w:r>
+        <w:t xml:space="preserve">“</w:t>
+      </w:r>
+      <w:r>
+        <w:t xml:space="preserve">what does this do and how do I run</w:t>
+      </w:r>
+      <w:r>
+        <w:t xml:space="preserve"> </w:t>
+      </w:r>
+      <w:r>
+        <w:t xml:space="preserve">it</w:t>
+      </w:r>
+      <w:r>
+        <w:t xml:space="preserve">”</w:t>
+      </w:r>
+      <w:r>
+        <w:t xml:space="preserve"> </w:t>
+      </w:r>
+      <w:r>
+        <w:t xml:space="preserve">level for every script in</w:t>
+      </w:r>
+      <w:r>
+        <w:t xml:space="preserve"> </w:t>
+      </w:r>
+      <w:r>
+        <w:rPr>
+          <w:rStyle w:val="VerbatimChar"/>
+        </w:rPr>
+        <w:t xml:space="preserve">scripts/</w:t>
+      </w:r>
+      <w:r>
+        <w:t xml:space="preserve"> </w:t>
+      </w:r>
+      <w:r>
+        <w:t xml:space="preserve">and every tool in</w:t>
+      </w:r>
+      <w:r>
+        <w:t xml:space="preserve"> </w:t>
+      </w:r>
+      <w:r>
+        <w:rPr>
+          <w:rStyle w:val="VerbatimChar"/>
+        </w:rPr>
+        <w:t xml:space="preserve">postprocess/tools/</w:t>
+      </w:r>
+      <w:r>
+        <w:t xml:space="preserve"> </w:t>
+      </w:r>
+      <w:r>
+        <w:t xml:space="preserve">– mechanism</w:t>
+      </w:r>
+      <w:r>
+        <w:t xml:space="preserve"> </w:t>
+      </w:r>
+      <w:r>
+        <w:t xml:space="preserve">explanations were trimmed to one plain-language sentence each (e.g. </w:t>
+      </w:r>
+      <w:r>
+        <w:t xml:space="preserve">“</w:t>
+      </w:r>
+      <w:r>
+        <w:t xml:space="preserve">combines CPU and GPU timing</w:t>
+      </w:r>
+      <w:r>
+        <w:t xml:space="preserve"> </w:t>
+      </w:r>
+      <w:r>
+        <w:t xml:space="preserve">into one ranking, correcting for the overlap between CPU-side GPU-wait time and GPU-side kernel</w:t>
+      </w:r>
+      <w:r>
+        <w:t xml:space="preserve"> </w:t>
+      </w:r>
+      <w:r>
+        <w:t xml:space="preserve">time</w:t>
+      </w:r>
+      <w:r>
+        <w:t xml:space="preserve">”</w:t>
+      </w:r>
+      <w:r>
+        <w:t xml:space="preserve"> </w:t>
+      </w:r>
+      <w:r>
+        <w:t xml:space="preserve">instead of the explicit subtraction formula;</w:t>
+      </w:r>
+      <w:r>
+        <w:t xml:space="preserve"> </w:t>
+      </w:r>
+      <w:r>
+        <w:t xml:space="preserve">“</w:t>
+      </w:r>
+      <w:r>
+        <w:t xml:space="preserve">kernel data is attached to the CPU code that</w:t>
+      </w:r>
+      <w:r>
+        <w:t xml:space="preserve"> </w:t>
+      </w:r>
+      <w:r>
+        <w:t xml:space="preserve">launched it, when it can be determined</w:t>
+      </w:r>
+      <w:r>
+        <w:t xml:space="preserve">”</w:t>
+      </w:r>
+      <w:r>
+        <w:t xml:space="preserve"> </w:t>
+      </w:r>
+      <w:r>
+        <w:t xml:space="preserve">instead of the two-tier algorithm’s details) and moved to</w:t>
+      </w:r>
+      <w:r>
+        <w:t xml:space="preserve"> </w:t>
+      </w:r>
+      <w:r>
+        <w:t xml:space="preserve">the new developer guide instead of being deleted outright.</w:t>
+      </w:r>
+    </w:p>
+    <w:p>
+      <w:pPr>
+        <w:pStyle w:val="BodyText"/>
+      </w:pPr>
+      <w:r>
+        <w:rPr>
+          <w:rStyle w:val="VerbatimChar"/>
+          <w:bCs/>
+          <w:b/>
+        </w:rPr>
+        <w:t xml:space="preserve">postprocess/README.md</w:t>
+      </w:r>
+      <w:r>
+        <w:t xml:space="preserve"> </w:t>
+      </w:r>
+      <w:r>
+        <w:t xml:space="preserve">(new) covers the pipeline philosophy (raw per-rank output -&gt; one</w:t>
+      </w:r>
+      <w:r>
+        <w:t xml:space="preserve"> </w:t>
+      </w:r>
+      <w:r>
+        <w:t xml:space="preserve">short, comprehensible report, via a fixed sequence of transformations each stage owns exclusively)</w:t>
+      </w:r>
+      <w:r>
+        <w:t xml:space="preserve"> </w:t>
+      </w:r>
+      <w:r>
+        <w:t xml:space="preserve">and the</w:t>
+      </w:r>
+      <w:r>
+        <w:t xml:space="preserve"> </w:t>
+      </w:r>
+      <w:r>
+        <w:rPr>
+          <w:rStyle w:val="VerbatimChar"/>
+        </w:rPr>
+        <w:t xml:space="preserve">stage1</w:t>
+      </w:r>
+      <w:r>
+        <w:t xml:space="preserve">-</w:t>
+      </w:r>
+      <w:r>
+        <w:rPr>
+          <w:rStyle w:val="VerbatimChar"/>
+        </w:rPr>
+        <w:t xml:space="preserve">stage6</w:t>
+      </w:r>
+      <w:r>
+        <w:t xml:space="preserve"> </w:t>
+      </w:r>
+      <w:r>
+        <w:t xml:space="preserve">architecture one subsection per stage, naming real files and functions</w:t>
+      </w:r>
+      <w:r>
+        <w:t xml:space="preserve"> </w:t>
+      </w:r>
+      <w:r>
+        <w:t xml:space="preserve">rather than restating full docstrings. Also covers the</w:t>
+      </w:r>
+      <w:r>
+        <w:t xml:space="preserve"> </w:t>
+      </w:r>
+      <w:r>
+        <w:rPr>
+          <w:rStyle w:val="VerbatimChar"/>
+        </w:rPr>
+        <w:t xml:space="preserve">_stage_paths.py</w:t>
+      </w:r>
+      <w:r>
+        <w:t xml:space="preserve"> </w:t>
+      </w:r>
+      <w:r>
+        <w:t xml:space="preserve">sys.path bootstrap (why</w:t>
+      </w:r>
+      <w:r>
+        <w:t xml:space="preserve"> </w:t>
+      </w:r>
+      <w:r>
+        <w:t xml:space="preserve">it exists, described as current mechanism rather than</w:t>
+      </w:r>
+      <w:r>
+        <w:t xml:space="preserve"> </w:t>
+      </w:r>
+      <w:r>
+        <w:t xml:space="preserve">“</w:t>
+      </w:r>
+      <w:r>
+        <w:t xml:space="preserve">we moved files here</w:t>
+      </w:r>
+      <w:r>
+        <w:t xml:space="preserve">”</w:t>
+      </w:r>
+      <w:r>
+        <w:t xml:space="preserve">), the two subsystems</w:t>
+      </w:r>
+      <w:r>
+        <w:t xml:space="preserve"> </w:t>
+      </w:r>
+      <w:r>
+        <w:t xml:space="preserve">with real complexity worth a dedicated explanation (noise-tag classification’s JSON schema and</w:t>
+      </w:r>
+      <w:r>
+        <w:t xml:space="preserve"> </w:t>
+      </w:r>
+      <w:r>
+        <w:t xml:space="preserve">action model; the kernel-to-CPU-launch-site attachment algorithm), a concrete</w:t>
+      </w:r>
+      <w:r>
+        <w:t xml:space="preserve"> </w:t>
+      </w:r>
+      <w:r>
+        <w:t xml:space="preserve">“</w:t>
+      </w:r>
+      <w:r>
+        <w:t xml:space="preserve">building a new</w:t>
+      </w:r>
+      <w:r>
+        <w:t xml:space="preserve"> </w:t>
+      </w:r>
+      <w:r>
+        <w:t xml:space="preserve">tool</w:t>
+      </w:r>
+      <w:r>
+        <w:t xml:space="preserve">”</w:t>
+      </w:r>
+      <w:r>
+        <w:t xml:space="preserve"> </w:t>
+      </w:r>
+      <w:r>
+        <w:t xml:space="preserve">walkthrough naming the actual reusable functions a new tool would compose, and the test</w:t>
+      </w:r>
+      <w:r>
+        <w:t xml:space="preserve"> </w:t>
+      </w:r>
+      <w:r>
+        <w:t xml:space="preserve">suite’s own conventions (the</w:t>
+      </w:r>
+      <w:r>
+        <w:t xml:space="preserve"> </w:t>
+      </w:r>
+      <w:r>
+        <w:rPr>
+          <w:rStyle w:val="VerbatimChar"/>
+        </w:rPr>
+        <w:t xml:space="preserve">tests/fixtures/</w:t>
+      </w:r>
+      <w:r>
+        <w:t xml:space="preserve"> </w:t>
+      </w:r>
+      <w:r>
+        <w:t xml:space="preserve">sharing rationale, the two module-loading styles,</w:t>
+      </w:r>
+      <w:r>
+        <w:t xml:space="preserve"> </w:t>
+      </w:r>
+      <w:r>
+        <w:t xml:space="preserve">and the</w:t>
+      </w:r>
+      <w:r>
+        <w:t xml:space="preserve"> </w:t>
+      </w:r>
+      <w:r>
+        <w:rPr>
+          <w:rStyle w:val="VerbatimChar"/>
+        </w:rPr>
+        <w:t xml:space="preserve">stage6_noise_config</w:t>
+      </w:r>
+      <w:r>
+        <w:t xml:space="preserve"> </w:t>
+      </w:r>
+      <w:r>
+        <w:t xml:space="preserve">singleton-isolation hazard plan 2.16 found and fixed).</w:t>
+      </w:r>
+    </w:p>
+    <w:p>
+      <w:pPr>
+        <w:pStyle w:val="BodyText"/>
+      </w:pPr>
+      <w:r>
+        <w:rPr>
+          <w:bCs/>
+          <w:b/>
+        </w:rPr>
+        <w:t xml:space="preserve">Two real documentation gaps closed along the way</w:t>
+      </w:r>
+      <w:r>
+        <w:t xml:space="preserve">, found while cross-checking tool coverage</w:t>
+      </w:r>
+      <w:r>
+        <w:t xml:space="preserve"> </w:t>
+      </w:r>
+      <w:r>
+        <w:t xml:space="preserve">against the actual</w:t>
+      </w:r>
+      <w:r>
+        <w:t xml:space="preserve"> </w:t>
+      </w:r>
+      <w:r>
+        <w:rPr>
+          <w:rStyle w:val="VerbatimChar"/>
+        </w:rPr>
+        <w:t xml:space="preserve">tools/</w:t>
+      </w:r>
+      <w:r>
+        <w:t xml:space="preserve"> </w:t>
+      </w:r>
+      <w:r>
+        <w:t xml:space="preserve">directory listing:</w:t>
+      </w:r>
+      <w:r>
+        <w:t xml:space="preserve"> </w:t>
+      </w:r>
+      <w:r>
+        <w:rPr>
+          <w:rStyle w:val="VerbatimChar"/>
+        </w:rPr>
+        <w:t xml:space="preserve">extract_hotspot_callers.py</w:t>
+      </w:r>
+      <w:r>
+        <w:t xml:space="preserve"> </w:t>
+      </w:r>
+      <w:r>
+        <w:t xml:space="preserve">(added in plan 2.15)</w:t>
+      </w:r>
+      <w:r>
+        <w:t xml:space="preserve"> </w:t>
+      </w:r>
+      <w:r>
+        <w:t xml:space="preserve">had no README section at all before this plan, and</w:t>
+      </w:r>
+      <w:r>
+        <w:t xml:space="preserve"> </w:t>
+      </w:r>
+      <w:r>
+        <w:rPr>
+          <w:rStyle w:val="VerbatimChar"/>
+        </w:rPr>
+        <w:t xml:space="preserve">--extra-noise-config</w:t>
+      </w:r>
+      <w:r>
+        <w:t xml:space="preserve"> </w:t>
+      </w:r>
+      <w:r>
+        <w:t xml:space="preserve">(added in plan 2.12,</w:t>
+      </w:r>
+      <w:r>
+        <w:t xml:space="preserve"> </w:t>
+      </w:r>
+      <w:r>
+        <w:t xml:space="preserve">now used by 7 of the 9 tools) was never mentioned in either README. Both are now documented in</w:t>
+      </w:r>
+      <w:r>
+        <w:t xml:space="preserve"> </w:t>
+      </w:r>
+      <w:r>
+        <w:t xml:space="preserve">both files – the user-facing</w:t>
+      </w:r>
+      <w:r>
+        <w:t xml:space="preserve"> </w:t>
+      </w:r>
+      <w:r>
+        <w:t xml:space="preserve">“</w:t>
+      </w:r>
+      <w:r>
+        <w:t xml:space="preserve">what it does</w:t>
+      </w:r>
+      <w:r>
+        <w:t xml:space="preserve">”</w:t>
+      </w:r>
+      <w:r>
+        <w:t xml:space="preserve"> </w:t>
+      </w:r>
+      <w:r>
+        <w:t xml:space="preserve">version in</w:t>
+      </w:r>
+      <w:r>
+        <w:t xml:space="preserve"> </w:t>
+      </w:r>
+      <w:r>
+        <w:rPr>
+          <w:rStyle w:val="VerbatimChar"/>
+        </w:rPr>
+        <w:t xml:space="preserve">README.md</w:t>
+      </w:r>
+      <w:r>
+        <w:t xml:space="preserve">’s new</w:t>
+      </w:r>
+      <w:r>
+        <w:t xml:space="preserve"> </w:t>
+      </w:r>
+      <w:r>
+        <w:t xml:space="preserve">“</w:t>
+      </w:r>
+      <w:r>
+        <w:t xml:space="preserve">Hotspot caller chains</w:t>
+      </w:r>
+      <w:r>
+        <w:t xml:space="preserve">”</w:t>
+      </w:r>
+      <w:r>
+        <w:t xml:space="preserve"> </w:t>
+      </w:r>
+      <w:r>
+        <w:t xml:space="preserve">section and</w:t>
+      </w:r>
+      <w:r>
+        <w:t xml:space="preserve"> </w:t>
+      </w:r>
+      <w:r>
+        <w:t xml:space="preserve">“</w:t>
+      </w:r>
+      <w:r>
+        <w:t xml:space="preserve">Customizing noise filtering</w:t>
+      </w:r>
+      <w:r>
+        <w:t xml:space="preserve">”</w:t>
+      </w:r>
+      <w:r>
+        <w:t xml:space="preserve"> </w:t>
+      </w:r>
+      <w:r>
+        <w:t xml:space="preserve">section respectively, the mechanism version in</w:t>
+      </w:r>
+      <w:r>
+        <w:t xml:space="preserve"> </w:t>
+      </w:r>
+      <w:r>
+        <w:rPr>
+          <w:rStyle w:val="VerbatimChar"/>
+        </w:rPr>
+        <w:t xml:space="preserve">postprocess/README.md</w:t>
+      </w:r>
+      <w:r>
+        <w:t xml:space="preserve">.</w:t>
+      </w:r>
+    </w:p>
+    <w:p>
+      <w:pPr>
+        <w:pStyle w:val="BodyText"/>
+      </w:pPr>
+      <w:r>
+        <w:t xml:space="preserve">Verification: read both finished documents start to finish for internal consistency; confirmed</w:t>
+      </w:r>
+      <w:r>
+        <w:t xml:space="preserve"> </w:t>
+      </w:r>
+      <w:r>
+        <w:t xml:space="preserve">every one of the 9</w:t>
+      </w:r>
+      <w:r>
+        <w:t xml:space="preserve"> </w:t>
+      </w:r>
+      <w:r>
+        <w:rPr>
+          <w:rStyle w:val="VerbatimChar"/>
+        </w:rPr>
+        <w:t xml:space="preserve">tools/*.py</w:t>
+      </w:r>
+      <w:r>
+        <w:t xml:space="preserve"> </w:t>
+      </w:r>
+      <w:r>
+        <w:t xml:space="preserve">files has a</w:t>
+      </w:r>
+      <w:r>
+        <w:t xml:space="preserve"> </w:t>
+      </w:r>
+      <w:r>
+        <w:rPr>
+          <w:rStyle w:val="VerbatimChar"/>
+        </w:rPr>
+        <w:t xml:space="preserve">README.md</w:t>
+      </w:r>
+      <w:r>
+        <w:t xml:space="preserve"> </w:t>
+      </w:r>
+      <w:r>
+        <w:t xml:space="preserve">section and every</w:t>
+      </w:r>
+      <w:r>
+        <w:t xml:space="preserve"> </w:t>
+      </w:r>
+      <w:r>
+        <w:rPr>
+          <w:rStyle w:val="VerbatimChar"/>
+        </w:rPr>
+        <w:t xml:space="preserve">stage1</w:t>
+      </w:r>
+      <w:r>
+        <w:t xml:space="preserve">-</w:t>
+      </w:r>
+      <w:r>
+        <w:rPr>
+          <w:rStyle w:val="VerbatimChar"/>
+        </w:rPr>
+        <w:t xml:space="preserve">stage6</w:t>
+      </w:r>
+      <w:r>
+        <w:t xml:space="preserve"> </w:t>
+      </w:r>
+      <w:r>
+        <w:t xml:space="preserve">directory has a</w:t>
+      </w:r>
+      <w:r>
+        <w:t xml:space="preserve"> </w:t>
+      </w:r>
+      <w:r>
+        <w:rPr>
+          <w:rStyle w:val="VerbatimChar"/>
+        </w:rPr>
+        <w:t xml:space="preserve">postprocess/README.md</w:t>
+      </w:r>
+      <w:r>
+        <w:t xml:space="preserve"> </w:t>
+      </w:r>
+      <w:r>
+        <w:t xml:space="preserve">subsection (scripted grep check, not just visual</w:t>
+      </w:r>
+      <w:r>
+        <w:t xml:space="preserve"> </w:t>
+      </w:r>
+      <w:r>
+        <w:t xml:space="preserve">skimming); confirmed no stale pre-plan-2.16 (</w:t>
+      </w:r>
+      <w:r>
+        <w:rPr>
+          <w:rStyle w:val="VerbatimChar"/>
+        </w:rPr>
+        <w:t xml:space="preserve">postprocess/extract_*.py</w:t>
+      </w:r>
+      <w:r>
+        <w:t xml:space="preserve"> </w:t>
+      </w:r>
+      <w:r>
+        <w:t xml:space="preserve">without</w:t>
+      </w:r>
+      <w:r>
+        <w:t xml:space="preserve"> </w:t>
+      </w:r>
+      <w:r>
+        <w:rPr>
+          <w:rStyle w:val="VerbatimChar"/>
+        </w:rPr>
+        <w:t xml:space="preserve">tools/</w:t>
+      </w:r>
+      <w:r>
+        <w:t xml:space="preserve">) paths</w:t>
+      </w:r>
+      <w:r>
+        <w:t xml:space="preserve"> </w:t>
+      </w:r>
+      <w:r>
+        <w:t xml:space="preserve">remain in either file. No test suite run needed – no code files touched.</w:t>
+      </w:r>
+    </w:p>
     <w:bookmarkEnd w:id="81"/>
+    <w:bookmarkEnd w:id="82"/>
     <w:sectPr/>
   </w:body>
 </w:document>

</xml_diff>

<commit_message>
Plan 3.4: stage3_rocprofsys_common.py split + stage3_rocprofsys_trace.py category tagger
Renamed stage3_rocprofsys_sample.py to stage3_rocprofsys_common.py since it had no
sample-specific logic, and gave tag_rows() a label_key parameter instead of hardcoding
"label" so the trace pipeline can reuse it unchanged. New stage3_rocprofsys_trace.py
classifies trace rows by exact category (gpu_api/gpu_kernel/gpu_memcpy/mpi_territory/
other) and delegates to the shared engine for wrapper_noise/compiler_runtime_noise/
wrapper_branch_noise, reusing default_noise_patterns.json and all four tree-surgery
action primitives with zero duplication.

Co-Authored-By: Claude Sonnet 5 <noreply@anthropic.com>
</commit_message>
<xml_diff>
--- a/docs/DEVELOPMENT_HISTORY.docx
+++ b/docs/DEVELOPMENT_HISTORY.docx
@@ -10,7 +10,7 @@
         <w:t xml:space="preserve">Development History</w:t>
       </w:r>
     </w:p>
-    <w:bookmarkStart w:id="85" w:name="development-history"/>
+    <w:bookmarkStart w:id="86" w:name="development-history"/>
     <w:p>
       <w:pPr>
         <w:pStyle w:val="Heading1"/>
@@ -3681,6 +3681,227 @@
           </w:p>
         </w:tc>
       </w:tr>
+      <w:tr>
+        <w:tc>
+          <w:tcPr/>
+          <w:p>
+            <w:pPr>
+              <w:pStyle w:val="Compact"/>
+              <w:jc w:val="left"/>
+            </w:pPr>
+            <w:r>
+              <w:t xml:space="preserve">2026-08-20</w:t>
+            </w:r>
+          </w:p>
+        </w:tc>
+        <w:tc>
+          <w:tcPr/>
+          <w:p>
+            <w:pPr>
+              <w:pStyle w:val="Compact"/>
+              <w:jc w:val="left"/>
+            </w:pPr>
+            <w:r>
+              <w:t xml:space="preserve">Plan 3.4: renamed</w:t>
+            </w:r>
+            <w:r>
+              <w:t xml:space="preserve"> </w:t>
+            </w:r>
+            <w:r>
+              <w:rPr>
+                <w:rStyle w:val="VerbatimChar"/>
+              </w:rPr>
+              <w:t xml:space="preserve">stage3_rocprofsys_sample.py</w:t>
+            </w:r>
+            <w:r>
+              <w:t xml:space="preserve"> </w:t>
+            </w:r>
+            <w:r>
+              <w:t xml:space="preserve">to</w:t>
+            </w:r>
+            <w:r>
+              <w:t xml:space="preserve"> </w:t>
+            </w:r>
+            <w:r>
+              <w:rPr>
+                <w:rStyle w:val="VerbatimChar"/>
+              </w:rPr>
+              <w:t xml:space="preserve">stage3_rocprofsys_common.py</w:t>
+            </w:r>
+            <w:r>
+              <w:t xml:space="preserve"> </w:t>
+            </w:r>
+            <w:r>
+              <w:t xml:space="preserve">(it turned out to have no sample-specific logic at all) and gave</w:t>
+            </w:r>
+            <w:r>
+              <w:t xml:space="preserve"> </w:t>
+            </w:r>
+            <w:r>
+              <w:rPr>
+                <w:rStyle w:val="VerbatimChar"/>
+              </w:rPr>
+              <w:t xml:space="preserve">tag_rows()</w:t>
+            </w:r>
+            <w:r>
+              <w:t xml:space="preserve"> </w:t>
+            </w:r>
+            <w:r>
+              <w:t xml:space="preserve">a</w:t>
+            </w:r>
+            <w:r>
+              <w:t xml:space="preserve"> </w:t>
+            </w:r>
+            <w:r>
+              <w:rPr>
+                <w:rStyle w:val="VerbatimChar"/>
+              </w:rPr>
+              <w:t xml:space="preserve">label_key</w:t>
+            </w:r>
+            <w:r>
+              <w:t xml:space="preserve"> </w:t>
+            </w:r>
+            <w:r>
+              <w:t xml:space="preserve">parameter instead of hardcoding</w:t>
+            </w:r>
+            <w:r>
+              <w:t xml:space="preserve"> </w:t>
+            </w:r>
+            <w:r>
+              <w:rPr>
+                <w:rStyle w:val="VerbatimChar"/>
+              </w:rPr>
+              <w:t xml:space="preserve">"label"</w:t>
+            </w:r>
+            <w:r>
+              <w:t xml:space="preserve">; new</w:t>
+            </w:r>
+            <w:r>
+              <w:t xml:space="preserve"> </w:t>
+            </w:r>
+            <w:r>
+              <w:rPr>
+                <w:rStyle w:val="VerbatimChar"/>
+              </w:rPr>
+              <w:t xml:space="preserve">stage3_rocprofsys_trace.py</w:t>
+            </w:r>
+            <w:r>
+              <w:t xml:space="preserve"> </w:t>
+            </w:r>
+            <w:r>
+              <w:t xml:space="preserve">– an exact</w:t>
+            </w:r>
+            <w:r>
+              <w:t xml:space="preserve"> </w:t>
+            </w:r>
+            <w:r>
+              <w:rPr>
+                <w:rStyle w:val="VerbatimChar"/>
+              </w:rPr>
+              <w:t xml:space="preserve">{category: tag}</w:t>
+            </w:r>
+            <w:r>
+              <w:t xml:space="preserve"> </w:t>
+            </w:r>
+            <w:r>
+              <w:t xml:space="preserve">lookup (</w:t>
+            </w:r>
+            <w:r>
+              <w:rPr>
+                <w:rStyle w:val="VerbatimChar"/>
+              </w:rPr>
+              <w:t xml:space="preserve">gpu_api</w:t>
+            </w:r>
+            <w:r>
+              <w:t xml:space="preserve">/</w:t>
+            </w:r>
+            <w:r>
+              <w:rPr>
+                <w:rStyle w:val="VerbatimChar"/>
+              </w:rPr>
+              <w:t xml:space="preserve">gpu_kernel</w:t>
+            </w:r>
+            <w:r>
+              <w:t xml:space="preserve">/</w:t>
+            </w:r>
+            <w:r>
+              <w:rPr>
+                <w:rStyle w:val="VerbatimChar"/>
+              </w:rPr>
+              <w:t xml:space="preserve">gpu_memcpy</w:t>
+            </w:r>
+            <w:r>
+              <w:t xml:space="preserve">/</w:t>
+            </w:r>
+            <w:r>
+              <w:rPr>
+                <w:rStyle w:val="VerbatimChar"/>
+              </w:rPr>
+              <w:t xml:space="preserve">mpi_territory</w:t>
+            </w:r>
+            <w:r>
+              <w:t xml:space="preserve">/</w:t>
+            </w:r>
+            <w:r>
+              <w:rPr>
+                <w:rStyle w:val="VerbatimChar"/>
+              </w:rPr>
+              <w:t xml:space="preserve">other</w:t>
+            </w:r>
+            <w:r>
+              <w:t xml:space="preserve">) built from AMD’s</w:t>
+            </w:r>
+            <w:r>
+              <w:t xml:space="preserve"> </w:t>
+            </w:r>
+            <w:r>
+              <w:rPr>
+                <w:rStyle w:val="VerbatimChar"/>
+              </w:rPr>
+              <w:t xml:space="preserve">categories.h</w:t>
+            </w:r>
+            <w:r>
+              <w:t xml:space="preserve"> </w:t>
+            </w:r>
+            <w:r>
+              <w:t xml:space="preserve">enum, plus a delegated, unmodified reuse of</w:t>
+            </w:r>
+            <w:r>
+              <w:t xml:space="preserve"> </w:t>
+            </w:r>
+            <w:r>
+              <w:rPr>
+                <w:rStyle w:val="VerbatimChar"/>
+              </w:rPr>
+              <w:t xml:space="preserve">wrapper_noise</w:t>
+            </w:r>
+            <w:r>
+              <w:t xml:space="preserve">/</w:t>
+            </w:r>
+            <w:r>
+              <w:rPr>
+                <w:rStyle w:val="VerbatimChar"/>
+              </w:rPr>
+              <w:t xml:space="preserve">compiler_runtime_noise</w:t>
+            </w:r>
+            <w:r>
+              <w:t xml:space="preserve">/</w:t>
+            </w:r>
+            <w:r>
+              <w:rPr>
+                <w:rStyle w:val="VerbatimChar"/>
+              </w:rPr>
+              <w:t xml:space="preserve">wrapper_branch_noise</w:t>
+            </w:r>
+            <w:r>
+              <w:t xml:space="preserve"> </w:t>
+            </w:r>
+            <w:r>
+              <w:t xml:space="preserve">for trace rows’ CPU-side names – roadmap step 3 of the plan-3.1 sequence – see full accounting below</w:t>
+            </w:r>
+          </w:p>
+        </w:tc>
+      </w:tr>
     </w:tbl>
     <w:bookmarkStart w:id="20" w:name="project-scaffolding-and-rules"/>
     <w:p>
@@ -53153,7 +53374,1154 @@
       </w:r>
     </w:p>
     <w:bookmarkEnd w:id="84"/>
+    <w:bookmarkStart w:id="85" w:name="Xe0f1be489bcebe51900313ac2b115291ac43a3c"/>
+    <w:p>
+      <w:pPr>
+        <w:pStyle w:val="Heading2"/>
+      </w:pPr>
+      <w:r>
+        <w:t xml:space="preserve">2026-08-20 — Plan 3.4:</w:t>
+      </w:r>
+      <w:r>
+        <w:t xml:space="preserve"> </w:t>
+      </w:r>
+      <w:r>
+        <w:rPr>
+          <w:rStyle w:val="VerbatimChar"/>
+        </w:rPr>
+        <w:t xml:space="preserve">stage3_rocprofsys_common.py</w:t>
+      </w:r>
+      <w:r>
+        <w:t xml:space="preserve"> </w:t>
+      </w:r>
+      <w:r>
+        <w:t xml:space="preserve">split +</w:t>
+      </w:r>
+      <w:r>
+        <w:t xml:space="preserve"> </w:t>
+      </w:r>
+      <w:r>
+        <w:rPr>
+          <w:rStyle w:val="VerbatimChar"/>
+        </w:rPr>
+        <w:t xml:space="preserve">stage3_rocprofsys_trace.py</w:t>
+      </w:r>
+      <w:r>
+        <w:t xml:space="preserve"> </w:t>
+      </w:r>
+      <w:r>
+        <w:t xml:space="preserve">category tagger</w:t>
+      </w:r>
+    </w:p>
+    <w:p>
+      <w:pPr>
+        <w:pStyle w:val="FirstParagraph"/>
+      </w:pPr>
+      <w:r>
+        <w:t xml:space="preserve">Roadmap step 3 of plan 3.1’s sequence. Direct user guidance shaped this plan twice during design,</w:t>
+      </w:r>
+      <w:r>
+        <w:t xml:space="preserve"> </w:t>
+      </w:r>
+      <w:r>
+        <w:t xml:space="preserve">both folded in before implementation:</w:t>
+      </w:r>
+    </w:p>
+    <w:p>
+      <w:pPr>
+        <w:pStyle w:val="BodyText"/>
+      </w:pPr>
+      <w:r>
+        <w:rPr>
+          <w:bCs/>
+          <w:b/>
+        </w:rPr>
+        <w:t xml:space="preserve">Refactor first, once the reuse became real</w:t>
+      </w:r>
+      <w:r>
+        <w:t xml:space="preserve">: writing this plan required reading</w:t>
+      </w:r>
+      <w:r>
+        <w:t xml:space="preserve"> </w:t>
+      </w:r>
+      <w:r>
+        <w:rPr>
+          <w:rStyle w:val="VerbatimChar"/>
+        </w:rPr>
+        <w:t xml:space="preserve">stage3_rocprofsys_sample.py</w:t>
+      </w:r>
+      <w:r>
+        <w:t xml:space="preserve"> </w:t>
+      </w:r>
+      <w:r>
+        <w:t xml:space="preserve">line-by-line, which turned up that nothing in it was actually</w:t>
+      </w:r>
+      <w:r>
+        <w:t xml:space="preserve"> </w:t>
+      </w:r>
+      <w:r>
+        <w:t xml:space="preserve">sample-specific –</w:t>
+      </w:r>
+      <w:r>
+        <w:t xml:space="preserve"> </w:t>
+      </w:r>
+      <w:r>
+        <w:rPr>
+          <w:rStyle w:val="VerbatimChar"/>
+        </w:rPr>
+        <w:t xml:space="preserve">tag_rows()</w:t>
+      </w:r>
+      <w:r>
+        <w:t xml:space="preserve">, the sibling/ancestor propagation, and all four tree-surgery</w:t>
+      </w:r>
+      <w:r>
+        <w:t xml:space="preserve"> </w:t>
+      </w:r>
+      <w:r>
+        <w:t xml:space="preserve">primitives already keyed only on a display-name field,</w:t>
+      </w:r>
+      <w:r>
+        <w:t xml:space="preserve"> </w:t>
+      </w:r>
+      <w:r>
+        <w:rPr>
+          <w:rStyle w:val="VerbatimChar"/>
+        </w:rPr>
+        <w:t xml:space="preserve">parent</w:t>
+      </w:r>
+      <w:r>
+        <w:t xml:space="preserve">, and tag sets, none of which are</w:t>
+      </w:r>
+      <w:r>
+        <w:t xml:space="preserve"> </w:t>
+      </w:r>
+      <w:r>
+        <w:t xml:space="preserve">unique to the text-table format. Its</w:t>
+      </w:r>
+      <w:r>
+        <w:t xml:space="preserve"> </w:t>
+      </w:r>
+      <w:r>
+        <w:rPr>
+          <w:rStyle w:val="VerbatimChar"/>
+        </w:rPr>
+        <w:t xml:space="preserve">_sample</w:t>
+      </w:r>
+      <w:r>
+        <w:t xml:space="preserve"> </w:t>
+      </w:r>
+      <w:r>
+        <w:t xml:space="preserve">suffix (from plan 3.2’s mechanical batch rename)</w:t>
+      </w:r>
+      <w:r>
+        <w:t xml:space="preserve"> </w:t>
+      </w:r>
+      <w:r>
+        <w:t xml:space="preserve">was premature. Renamed to</w:t>
+      </w:r>
+      <w:r>
+        <w:t xml:space="preserve"> </w:t>
+      </w:r>
+      <w:r>
+        <w:rPr>
+          <w:rStyle w:val="VerbatimChar"/>
+        </w:rPr>
+        <w:t xml:space="preserve">stage3_rocprofsys_common.py</w:t>
+      </w:r>
+      <w:r>
+        <w:t xml:space="preserve">, updated its docstring to name both</w:t>
+      </w:r>
+      <w:r>
+        <w:t xml:space="preserve"> </w:t>
+      </w:r>
+      <w:r>
+        <w:t xml:space="preserve">pipelines as consumers, and updated every import site</w:t>
+      </w:r>
+      <w:r>
+        <w:t xml:space="preserve"> </w:t>
+      </w:r>
+      <w:r>
+        <w:t xml:space="preserve">(</w:t>
+      </w:r>
+      <w:r>
+        <w:rPr>
+          <w:rStyle w:val="VerbatimChar"/>
+        </w:rPr>
+        <w:t xml:space="preserve">stage4_rocprofsys_sample_tree.py</w:t>
+      </w:r>
+      <w:r>
+        <w:t xml:space="preserve">/</w:t>
+      </w:r>
+      <w:r>
+        <w:rPr>
+          <w:rStyle w:val="VerbatimChar"/>
+        </w:rPr>
+        <w:t xml:space="preserve">stage4_rocprofsys_sample_flat.py</w:t>
+      </w:r>
+      <w:r>
+        <w:t xml:space="preserve">/</w:t>
+      </w:r>
+      <w:r>
+        <w:t xml:space="preserve"> </w:t>
+      </w:r>
+      <w:r>
+        <w:rPr>
+          <w:rStyle w:val="VerbatimChar"/>
+        </w:rPr>
+        <w:t xml:space="preserve">stage5_calltree_view.py</w:t>
+      </w:r>
+      <w:r>
+        <w:t xml:space="preserve">/</w:t>
+      </w:r>
+      <w:r>
+        <w:rPr>
+          <w:rStyle w:val="VerbatimChar"/>
+        </w:rPr>
+        <w:t xml:space="preserve">stage5_wallclock_calltree_view.py</w:t>
+      </w:r>
+      <w:r>
+        <w:t xml:space="preserve">/</w:t>
+      </w:r>
+      <w:r>
+        <w:rPr>
+          <w:rStyle w:val="VerbatimChar"/>
+        </w:rPr>
+        <w:t xml:space="preserve">extract_hotspot_callers.py</w:t>
+      </w:r>
+      <w:r>
+        <w:t xml:space="preserve">, plus</w:t>
+      </w:r>
+      <w:r>
+        <w:t xml:space="preserve"> </w:t>
+      </w:r>
+      <w:r>
+        <w:t xml:space="preserve">comment-only references in</w:t>
+      </w:r>
+      <w:r>
+        <w:t xml:space="preserve"> </w:t>
+      </w:r>
+      <w:r>
+        <w:rPr>
+          <w:rStyle w:val="VerbatimChar"/>
+        </w:rPr>
+        <w:t xml:space="preserve">stage6_noise_config.py</w:t>
+      </w:r>
+      <w:r>
+        <w:t xml:space="preserve"> </w:t>
+      </w:r>
+      <w:r>
+        <w:t xml:space="preserve">and its test, and</w:t>
+      </w:r>
+      <w:r>
+        <w:t xml:space="preserve"> </w:t>
+      </w:r>
+      <w:r>
+        <w:rPr>
+          <w:rStyle w:val="VerbatimChar"/>
+        </w:rPr>
+        <w:t xml:space="preserve">postprocess/README.md</w:t>
+      </w:r>
+      <w:r>
+        <w:t xml:space="preserve">) –</w:t>
+      </w:r>
+      <w:r>
+        <w:t xml:space="preserve"> </w:t>
+      </w:r>
+      <w:r>
+        <w:t xml:space="preserve">pure rename, zero behavior change, confirmed by the renamed test file passing unmodified.</w:t>
+      </w:r>
+    </w:p>
+    <w:p>
+      <w:pPr>
+        <w:pStyle w:val="BodyText"/>
+      </w:pPr>
+      <w:r>
+        <w:rPr>
+          <w:bCs/>
+          <w:b/>
+        </w:rPr>
+        <w:t xml:space="preserve">Corrected mid-design</w:t>
+      </w:r>
+      <w:r>
+        <w:t xml:space="preserve">: the first draft of this plan had</w:t>
+      </w:r>
+      <w:r>
+        <w:t xml:space="preserve"> </w:t>
+      </w:r>
+      <w:r>
+        <w:rPr>
+          <w:rStyle w:val="VerbatimChar"/>
+        </w:rPr>
+        <w:t xml:space="preserve">stage1_rocprofsys_trace.py</w:t>
+      </w:r>
+      <w:r>
+        <w:t xml:space="preserve"> </w:t>
+      </w:r>
+      <w:r>
+        <w:t xml:space="preserve">alias</w:t>
+      </w:r>
+      <w:r>
+        <w:t xml:space="preserve"> </w:t>
+      </w:r>
+      <w:r>
+        <w:rPr>
+          <w:rStyle w:val="VerbatimChar"/>
+        </w:rPr>
+        <w:t xml:space="preserve">row["name"]</w:t>
+      </w:r>
+      <w:r>
+        <w:t xml:space="preserve"> </w:t>
+      </w:r>
+      <w:r>
+        <w:t xml:space="preserve">into a</w:t>
+      </w:r>
+      <w:r>
+        <w:t xml:space="preserve"> </w:t>
+      </w:r>
+      <w:r>
+        <w:rPr>
+          <w:rStyle w:val="VerbatimChar"/>
+        </w:rPr>
+        <w:t xml:space="preserve">row["label"]</w:t>
+      </w:r>
+      <w:r>
+        <w:t xml:space="preserve"> </w:t>
+      </w:r>
+      <w:r>
+        <w:t xml:space="preserve">key so the shared engine could read it – rejected directly.</w:t>
+      </w:r>
+      <w:r>
+        <w:t xml:space="preserve"> </w:t>
+      </w:r>
+      <w:r>
+        <w:t xml:space="preserve">The engine shouldn’t be hardcoded to the string</w:t>
+      </w:r>
+      <w:r>
+        <w:t xml:space="preserve"> </w:t>
+      </w:r>
+      <w:r>
+        <w:rPr>
+          <w:rStyle w:val="VerbatimChar"/>
+        </w:rPr>
+        <w:t xml:space="preserve">"label"</w:t>
+      </w:r>
+      <w:r>
+        <w:t xml:space="preserve"> </w:t>
+      </w:r>
+      <w:r>
+        <w:t xml:space="preserve">at all; different stage1 modules use</w:t>
+      </w:r>
+      <w:r>
+        <w:t xml:space="preserve"> </w:t>
+      </w:r>
+      <w:r>
+        <w:t xml:space="preserve">different display-name keys (</w:t>
+      </w:r>
+      <w:r>
+        <w:rPr>
+          <w:rStyle w:val="VerbatimChar"/>
+        </w:rPr>
+        <w:t xml:space="preserve">"label"</w:t>
+      </w:r>
+      <w:r>
+        <w:t xml:space="preserve"> </w:t>
+      </w:r>
+      <w:r>
+        <w:t xml:space="preserve">for the sample pipeline,</w:t>
+      </w:r>
+      <w:r>
+        <w:t xml:space="preserve"> </w:t>
+      </w:r>
+      <w:r>
+        <w:rPr>
+          <w:rStyle w:val="VerbatimChar"/>
+        </w:rPr>
+        <w:t xml:space="preserve">"name"</w:t>
+      </w:r>
+      <w:r>
+        <w:t xml:space="preserve"> </w:t>
+      </w:r>
+      <w:r>
+        <w:t xml:space="preserve">for trace, something else</w:t>
+      </w:r>
+      <w:r>
+        <w:t xml:space="preserve"> </w:t>
+      </w:r>
+      <w:r>
+        <w:t xml:space="preserve">for a hypothetical future format), so</w:t>
+      </w:r>
+      <w:r>
+        <w:t xml:space="preserve"> </w:t>
+      </w:r>
+      <w:r>
+        <w:rPr>
+          <w:rStyle w:val="VerbatimChar"/>
+        </w:rPr>
+        <w:t xml:space="preserve">tag_rows()</w:t>
+      </w:r>
+      <w:r>
+        <w:t xml:space="preserve"> </w:t>
+      </w:r>
+      <w:r>
+        <w:t xml:space="preserve">gained a</w:t>
+      </w:r>
+      <w:r>
+        <w:t xml:space="preserve"> </w:t>
+      </w:r>
+      <w:r>
+        <w:rPr>
+          <w:rStyle w:val="VerbatimChar"/>
+        </w:rPr>
+        <w:t xml:space="preserve">label_key</w:t>
+      </w:r>
+      <w:r>
+        <w:t xml:space="preserve"> </w:t>
+      </w:r>
+      <w:r>
+        <w:t xml:space="preserve">parameter (default</w:t>
+      </w:r>
+      <w:r>
+        <w:t xml:space="preserve"> </w:t>
+      </w:r>
+      <w:r>
+        <w:rPr>
+          <w:rStyle w:val="VerbatimChar"/>
+        </w:rPr>
+        <w:t xml:space="preserve">"label"</w:t>
+      </w:r>
+      <w:r>
+        <w:t xml:space="preserve">, so every existing caller is unaffected) instead, and</w:t>
+      </w:r>
+      <w:r>
+        <w:t xml:space="preserve"> </w:t>
+      </w:r>
+      <w:r>
+        <w:rPr>
+          <w:rStyle w:val="VerbatimChar"/>
+        </w:rPr>
+        <w:t xml:space="preserve">stage1_rocprofsys_trace.py</w:t>
+      </w:r>
+      <w:r>
+        <w:t xml:space="preserve"> </w:t>
+      </w:r>
+      <w:r>
+        <w:t xml:space="preserve">exports the key name it uses as a</w:t>
+      </w:r>
+      <w:r>
+        <w:t xml:space="preserve"> </w:t>
+      </w:r>
+      <w:r>
+        <w:rPr>
+          <w:rStyle w:val="VerbatimChar"/>
+        </w:rPr>
+        <w:t xml:space="preserve">LABEL_KEY = "name"</w:t>
+      </w:r>
+      <w:r>
+        <w:t xml:space="preserve"> </w:t>
+      </w:r>
+      <w:r>
+        <w:t xml:space="preserve">constant – a single declared source of</w:t>
+      </w:r>
+      <w:r>
+        <w:t xml:space="preserve"> </w:t>
+      </w:r>
+      <w:r>
+        <w:t xml:space="preserve">truth threaded down through the pipeline via a parameter, with no row-data mutation and no</w:t>
+      </w:r>
+      <w:r>
+        <w:t xml:space="preserve"> </w:t>
+      </w:r>
+      <w:r>
+        <w:t xml:space="preserve">divergence from plan 3.3’s</w:t>
+      </w:r>
+      <w:r>
+        <w:t xml:space="preserve"> </w:t>
+      </w:r>
+      <w:r>
+        <w:t xml:space="preserve">“</w:t>
+      </w:r>
+      <w:r>
+        <w:t xml:space="preserve">preserve every column, no interpretive shaping</w:t>
+      </w:r>
+      <w:r>
+        <w:t xml:space="preserve">”</w:t>
+      </w:r>
+      <w:r>
+        <w:t xml:space="preserve"> </w:t>
+      </w:r>
+      <w:r>
+        <w:t xml:space="preserve">scope.</w:t>
+      </w:r>
+    </w:p>
+    <w:p>
+      <w:pPr>
+        <w:pStyle w:val="BodyText"/>
+      </w:pPr>
+      <w:r>
+        <w:rPr>
+          <w:bCs/>
+          <w:b/>
+        </w:rPr>
+        <w:t xml:space="preserve">As built</w:t>
+      </w:r>
+      <w:r>
+        <w:t xml:space="preserve">:</w:t>
+      </w:r>
+      <w:r>
+        <w:t xml:space="preserve"> </w:t>
+      </w:r>
+      <w:r>
+        <w:rPr>
+          <w:rStyle w:val="VerbatimChar"/>
+        </w:rPr>
+        <w:t xml:space="preserve">stage3_rocprofsys_trace.py</w:t>
+      </w:r>
+      <w:r>
+        <w:t xml:space="preserve">’s</w:t>
+      </w:r>
+      <w:r>
+        <w:t xml:space="preserve"> </w:t>
+      </w:r>
+      <w:r>
+        <w:rPr>
+          <w:rStyle w:val="VerbatimChar"/>
+        </w:rPr>
+        <w:t xml:space="preserve">tag_for_category(category)</w:t>
+      </w:r>
+      <w:r>
+        <w:t xml:space="preserve"> </w:t>
+      </w:r>
+      <w:r>
+        <w:t xml:space="preserve">maps a trace row’s exact</w:t>
+      </w:r>
+      <w:r>
+        <w:t xml:space="preserve"> </w:t>
+      </w:r>
+      <w:r>
+        <w:rPr>
+          <w:rStyle w:val="VerbatimChar"/>
+        </w:rPr>
+        <w:t xml:space="preserve">category</w:t>
+      </w:r>
+      <w:r>
+        <w:t xml:space="preserve"> </w:t>
+      </w:r>
+      <w:r>
+        <w:t xml:space="preserve">to one of</w:t>
+      </w:r>
+      <w:r>
+        <w:t xml:space="preserve"> </w:t>
+      </w:r>
+      <w:r>
+        <w:rPr>
+          <w:rStyle w:val="VerbatimChar"/>
+        </w:rPr>
+        <w:t xml:space="preserve">gpu_api</w:t>
+      </w:r>
+      <w:r>
+        <w:t xml:space="preserve"> </w:t>
+      </w:r>
+      <w:r>
+        <w:t xml:space="preserve">(every</w:t>
+      </w:r>
+      <w:r>
+        <w:t xml:space="preserve"> </w:t>
+      </w:r>
+      <w:r>
+        <w:rPr>
+          <w:rStyle w:val="VerbatimChar"/>
+        </w:rPr>
+        <w:t xml:space="preserve">*_API</w:t>
+      </w:r>
+      <w:r>
+        <w:t xml:space="preserve"> </w:t>
+      </w:r>
+      <w:r>
+        <w:t xml:space="preserve">ROCm category),</w:t>
+      </w:r>
+      <w:r>
+        <w:t xml:space="preserve"> </w:t>
+      </w:r>
+      <w:r>
+        <w:rPr>
+          <w:rStyle w:val="VerbatimChar"/>
+        </w:rPr>
+        <w:t xml:space="preserve">gpu_kernel</w:t>
+      </w:r>
+      <w:r>
+        <w:t xml:space="preserve"> </w:t>
+      </w:r>
+      <w:r>
+        <w:t xml:space="preserve">(kernel dispatch, RCCL</w:t>
+      </w:r>
+      <w:r>
+        <w:t xml:space="preserve"> </w:t>
+      </w:r>
+      <w:r>
+        <w:t xml:space="preserve">collective ops),</w:t>
+      </w:r>
+      <w:r>
+        <w:t xml:space="preserve"> </w:t>
+      </w:r>
+      <w:r>
+        <w:rPr>
+          <w:rStyle w:val="VerbatimChar"/>
+        </w:rPr>
+        <w:t xml:space="preserve">gpu_memcpy</w:t>
+      </w:r>
+      <w:r>
+        <w:t xml:space="preserve"> </w:t>
+      </w:r>
+      <w:r>
+        <w:t xml:space="preserve">(memory copy/scratch/page-migration),</w:t>
+      </w:r>
+      <w:r>
+        <w:t xml:space="preserve"> </w:t>
+      </w:r>
+      <w:r>
+        <w:rPr>
+          <w:rStyle w:val="VerbatimChar"/>
+        </w:rPr>
+        <w:t xml:space="preserve">mpi_territory</w:t>
+      </w:r>
+      <w:r>
+        <w:t xml:space="preserve"> </w:t>
+      </w:r>
+      <w:r>
+        <w:t xml:space="preserve">(</w:t>
+      </w:r>
+      <w:r>
+        <w:rPr>
+          <w:rStyle w:val="VerbatimChar"/>
+        </w:rPr>
+        <w:t xml:space="preserve">mpi</w:t>
+      </w:r>
+      <w:r>
+        <w:t xml:space="preserve">), or</w:t>
+      </w:r>
+      <w:r>
+        <w:t xml:space="preserve"> </w:t>
+      </w:r>
+      <w:r>
+        <w:rPr>
+          <w:rStyle w:val="VerbatimChar"/>
+        </w:rPr>
+        <w:t xml:space="preserve">None</w:t>
+      </w:r>
+      <w:r>
+        <w:t xml:space="preserve"> </w:t>
+      </w:r>
+      <w:r>
+        <w:t xml:space="preserve">for CPU-ish categories (</w:t>
+      </w:r>
+      <w:r>
+        <w:rPr>
+          <w:rStyle w:val="VerbatimChar"/>
+        </w:rPr>
+        <w:t xml:space="preserve">host</w:t>
+      </w:r>
+      <w:r>
+        <w:t xml:space="preserve">/</w:t>
+      </w:r>
+      <w:r>
+        <w:rPr>
+          <w:rStyle w:val="VerbatimChar"/>
+        </w:rPr>
+        <w:t xml:space="preserve">ompt</w:t>
+      </w:r>
+      <w:r>
+        <w:t xml:space="preserve">/</w:t>
+      </w:r>
+      <w:r>
+        <w:rPr>
+          <w:rStyle w:val="VerbatimChar"/>
+        </w:rPr>
+        <w:t xml:space="preserve">pthread</w:t>
+      </w:r>
+      <w:r>
+        <w:t xml:space="preserve">/</w:t>
+      </w:r>
+      <w:r>
+        <w:rPr>
+          <w:rStyle w:val="VerbatimChar"/>
+        </w:rPr>
+        <w:t xml:space="preserve">sampling</w:t>
+      </w:r>
+      <w:r>
+        <w:t xml:space="preserve">/</w:t>
+      </w:r>
+      <w:r>
+        <w:rPr>
+          <w:rStyle w:val="VerbatimChar"/>
+        </w:rPr>
+        <w:t xml:space="preserve">python</w:t>
+      </w:r>
+      <w:r>
+        <w:t xml:space="preserve">/</w:t>
+      </w:r>
+      <w:r>
+        <w:rPr>
+          <w:rStyle w:val="VerbatimChar"/>
+        </w:rPr>
+        <w:t xml:space="preserve">user</w:t>
+      </w:r>
+      <w:r>
+        <w:t xml:space="preserve">/</w:t>
+      </w:r>
+      <w:r>
+        <w:rPr>
+          <w:rStyle w:val="VerbatimChar"/>
+        </w:rPr>
+        <w:t xml:space="preserve">kokkos</w:t>
+      </w:r>
+      <w:r>
+        <w:t xml:space="preserve">/</w:t>
+      </w:r>
+      <w:r>
+        <w:rPr>
+          <w:rStyle w:val="VerbatimChar"/>
+        </w:rPr>
+        <w:t xml:space="preserve">none</w:t>
+      </w:r>
+      <w:r>
+        <w:t xml:space="preserve">)</w:t>
+      </w:r>
+      <w:r>
+        <w:t xml:space="preserve"> </w:t>
+      </w:r>
+      <w:r>
+        <w:t xml:space="preserve">that get no category-level tag; anything else –</w:t>
+      </w:r>
+      <w:r>
+        <w:t xml:space="preserve"> </w:t>
+      </w:r>
+      <w:r>
+        <w:rPr>
+          <w:rStyle w:val="VerbatimChar"/>
+        </w:rPr>
+        <w:t xml:space="preserve">numa</w:t>
+      </w:r>
+      <w:r>
+        <w:t xml:space="preserve">, the bare</w:t>
+      </w:r>
+      <w:r>
+        <w:t xml:space="preserve"> </w:t>
+      </w:r>
+      <w:r>
+        <w:rPr>
+          <w:rStyle w:val="VerbatimChar"/>
+        </w:rPr>
+        <w:t xml:space="preserve">rocm</w:t>
+      </w:r>
+      <w:r>
+        <w:t xml:space="preserve"> </w:t>
+      </w:r>
+      <w:r>
+        <w:t xml:space="preserve">category,</w:t>
+      </w:r>
+      <w:r>
+        <w:t xml:space="preserve"> </w:t>
+      </w:r>
+      <w:r>
+        <w:rPr>
+          <w:rStyle w:val="VerbatimChar"/>
+        </w:rPr>
+        <w:t xml:space="preserve">amd_smi_*</w:t>
+      </w:r>
+      <w:r>
+        <w:t xml:space="preserve">, or</w:t>
+      </w:r>
+      <w:r>
+        <w:t xml:space="preserve"> </w:t>
+      </w:r>
+      <w:r>
+        <w:t xml:space="preserve">a category this map has never seen – falls back to</w:t>
+      </w:r>
+      <w:r>
+        <w:t xml:space="preserve"> </w:t>
+      </w:r>
+      <w:r>
+        <w:rPr>
+          <w:rStyle w:val="VerbatimChar"/>
+        </w:rPr>
+        <w:t xml:space="preserve">other</w:t>
+      </w:r>
+      <w:r>
+        <w:t xml:space="preserve">, the roadmap’s required explicit</w:t>
+      </w:r>
+      <w:r>
+        <w:t xml:space="preserve"> </w:t>
+      </w:r>
+      <w:r>
+        <w:t xml:space="preserve">fallback bucket.</w:t>
+      </w:r>
+      <w:r>
+        <w:t xml:space="preserve"> </w:t>
+      </w:r>
+      <w:r>
+        <w:rPr>
+          <w:rStyle w:val="VerbatimChar"/>
+        </w:rPr>
+        <w:t xml:space="preserve">numa</w:t>
+      </w:r>
+      <w:r>
+        <w:t xml:space="preserve">/</w:t>
+      </w:r>
+      <w:r>
+        <w:rPr>
+          <w:rStyle w:val="VerbatimChar"/>
+        </w:rPr>
+        <w:t xml:space="preserve">amd_smi_*</w:t>
+      </w:r>
+      <w:r>
+        <w:t xml:space="preserve"> </w:t>
+      </w:r>
+      <w:r>
+        <w:t xml:space="preserve">are routed to</w:t>
+      </w:r>
+      <w:r>
+        <w:t xml:space="preserve"> </w:t>
+      </w:r>
+      <w:r>
+        <w:rPr>
+          <w:rStyle w:val="VerbatimChar"/>
+        </w:rPr>
+        <w:t xml:space="preserve">other</w:t>
+      </w:r>
+      <w:r>
+        <w:t xml:space="preserve"> </w:t>
+      </w:r>
+      <w:r>
+        <w:t xml:space="preserve">deliberately, not guessed into a new</w:t>
+      </w:r>
+      <w:r>
+        <w:t xml:space="preserve"> </w:t>
+      </w:r>
+      <w:r>
+        <w:t xml:space="preserve">taxonomy: their row-level semantics aren’t validated against real trace data yet.</w:t>
+      </w:r>
+    </w:p>
+    <w:p>
+      <w:pPr>
+        <w:pStyle w:val="BodyText"/>
+      </w:pPr>
+      <w:r>
+        <w:rPr>
+          <w:rStyle w:val="VerbatimChar"/>
+        </w:rPr>
+        <w:t xml:space="preserve">tag_rows(rows)</w:t>
+      </w:r>
+      <w:r>
+        <w:t xml:space="preserve"> </w:t>
+      </w:r>
+      <w:r>
+        <w:t xml:space="preserve">delegates to</w:t>
+      </w:r>
+      <w:r>
+        <w:t xml:space="preserve"> </w:t>
+      </w:r>
+      <w:r>
+        <w:rPr>
+          <w:rStyle w:val="VerbatimChar"/>
+        </w:rPr>
+        <w:t xml:space="preserve">stage3_rocprofsys_common.tag_rows()</w:t>
+      </w:r>
+      <w:r>
+        <w:t xml:space="preserve">, restricted to just</w:t>
+      </w:r>
+      <w:r>
+        <w:t xml:space="preserve"> </w:t>
+      </w:r>
+      <w:r>
+        <w:rPr>
+          <w:rStyle w:val="VerbatimChar"/>
+        </w:rPr>
+        <w:t xml:space="preserve">wrapper_noise</w:t>
+      </w:r>
+      <w:r>
+        <w:t xml:space="preserve">/</w:t>
+      </w:r>
+      <w:r>
+        <w:rPr>
+          <w:rStyle w:val="VerbatimChar"/>
+        </w:rPr>
+        <w:t xml:space="preserve">compiler_runtime_noise</w:t>
+      </w:r>
+      <w:r>
+        <w:t xml:space="preserve">/</w:t>
+      </w:r>
+      <w:r>
+        <w:rPr>
+          <w:rStyle w:val="VerbatimChar"/>
+        </w:rPr>
+        <w:t xml:space="preserve">wrapper_branch_noise</w:t>
+      </w:r>
+      <w:r>
+        <w:t xml:space="preserve"> </w:t>
+      </w:r>
+      <w:r>
+        <w:t xml:space="preserve">(the two name-based sample-engine</w:t>
+      </w:r>
+      <w:r>
+        <w:t xml:space="preserve"> </w:t>
+      </w:r>
+      <w:r>
+        <w:t xml:space="preserve">tags plus their sibling-derived tag), passing</w:t>
+      </w:r>
+      <w:r>
+        <w:t xml:space="preserve"> </w:t>
+      </w:r>
+      <w:r>
+        <w:rPr>
+          <w:rStyle w:val="VerbatimChar"/>
+        </w:rPr>
+        <w:t xml:space="preserve">label_key=stage1_rocprofsys_trace.LABEL_KEY</w:t>
+      </w:r>
+      <w:r>
+        <w:t xml:space="preserve"> </w:t>
+      </w:r>
+      <w:r>
+        <w:t xml:space="preserve">–</w:t>
+      </w:r>
+      <w:r>
+        <w:t xml:space="preserve"> </w:t>
+      </w:r>
+      <w:r>
+        <w:t xml:space="preserve">reusing</w:t>
+      </w:r>
+      <w:r>
+        <w:t xml:space="preserve"> </w:t>
+      </w:r>
+      <w:r>
+        <w:rPr>
+          <w:rStyle w:val="VerbatimChar"/>
+        </w:rPr>
+        <w:t xml:space="preserve">default_noise_patterns.json</w:t>
+      </w:r>
+      <w:r>
+        <w:t xml:space="preserve">’s actual substring lists rather than re-deriving that domain</w:t>
+      </w:r>
+      <w:r>
+        <w:t xml:space="preserve"> </w:t>
+      </w:r>
+      <w:r>
+        <w:t xml:space="preserve">knowledge for trace data, and giving a user’s</w:t>
+      </w:r>
+      <w:r>
+        <w:t xml:space="preserve"> </w:t>
+      </w:r>
+      <w:r>
+        <w:rPr>
+          <w:rStyle w:val="VerbatimChar"/>
+        </w:rPr>
+        <w:t xml:space="preserve">--extra-noise-config</w:t>
+      </w:r>
+      <w:r>
+        <w:t xml:space="preserve"> </w:t>
+      </w:r>
+      <w:r>
+        <w:t xml:space="preserve">additions to those two tags</w:t>
+      </w:r>
+      <w:r>
+        <w:t xml:space="preserve"> </w:t>
+      </w:r>
+      <w:r>
+        <w:t xml:space="preserve">free effect on trace-based tools too.</w:t>
+      </w:r>
+      <w:r>
+        <w:t xml:space="preserve"> </w:t>
+      </w:r>
+      <w:r>
+        <w:rPr>
+          <w:rStyle w:val="VerbatimChar"/>
+        </w:rPr>
+        <w:t xml:space="preserve">gpu_api</w:t>
+      </w:r>
+      <w:r>
+        <w:t xml:space="preserve">/</w:t>
+      </w:r>
+      <w:r>
+        <w:rPr>
+          <w:rStyle w:val="VerbatimChar"/>
+        </w:rPr>
+        <w:t xml:space="preserve">mpi_territory</w:t>
+      </w:r>
+      <w:r>
+        <w:t xml:space="preserve"> </w:t>
+      </w:r>
+      <w:r>
+        <w:t xml:space="preserve">are deliberately excluded from this</w:t>
+      </w:r>
+      <w:r>
+        <w:t xml:space="preserve"> </w:t>
+      </w:r>
+      <w:r>
+        <w:t xml:space="preserve">delegated call (already exact from the category map); each row’s</w:t>
+      </w:r>
+      <w:r>
+        <w:t xml:space="preserve"> </w:t>
+      </w:r>
+      <w:r>
+        <w:rPr>
+          <w:rStyle w:val="VerbatimChar"/>
+        </w:rPr>
+        <w:t xml:space="preserve">tag_for_category()</w:t>
+      </w:r>
+      <w:r>
+        <w:t xml:space="preserve"> </w:t>
+      </w:r>
+      <w:r>
+        <w:t xml:space="preserve">result is</w:t>
+      </w:r>
+      <w:r>
+        <w:t xml:space="preserve"> </w:t>
+      </w:r>
+      <w:r>
+        <w:t xml:space="preserve">unioned into</w:t>
+      </w:r>
+      <w:r>
+        <w:t xml:space="preserve"> </w:t>
+      </w:r>
+      <w:r>
+        <w:rPr>
+          <w:rStyle w:val="VerbatimChar"/>
+        </w:rPr>
+        <w:t xml:space="preserve">row["tags"]</w:t>
+      </w:r>
+      <w:r>
+        <w:t xml:space="preserve"> </w:t>
+      </w:r>
+      <w:r>
+        <w:t xml:space="preserve">afterward, since the delegated call assigns rather than unions.</w:t>
+      </w:r>
+      <w:r>
+        <w:t xml:space="preserve"> </w:t>
+      </w:r>
+      <w:r>
+        <w:rPr>
+          <w:rStyle w:val="VerbatimChar"/>
+        </w:rPr>
+        <w:t xml:space="preserve">remove_tagged_subtrees()</w:t>
+      </w:r>
+      <w:r>
+        <w:t xml:space="preserve">/</w:t>
+      </w:r>
+      <w:r>
+        <w:rPr>
+          <w:rStyle w:val="VerbatimChar"/>
+        </w:rPr>
+        <w:t xml:space="preserve">splice_by_tag()</w:t>
+      </w:r>
+      <w:r>
+        <w:t xml:space="preserve">/</w:t>
+      </w:r>
+      <w:r>
+        <w:rPr>
+          <w:rStyle w:val="VerbatimChar"/>
+        </w:rPr>
+        <w:t xml:space="preserve">make_collapses_children()</w:t>
+      </w:r>
+      <w:r>
+        <w:t xml:space="preserve">/</w:t>
+      </w:r>
+      <w:r>
+        <w:rPr>
+          <w:rStyle w:val="VerbatimChar"/>
+        </w:rPr>
+        <w:t xml:space="preserve">make_is_pruned()</w:t>
+      </w:r>
+      <w:r>
+        <w:t xml:space="preserve"> </w:t>
+      </w:r>
+      <w:r>
+        <w:t xml:space="preserve">are</w:t>
+      </w:r>
+      <w:r>
+        <w:t xml:space="preserve"> </w:t>
+      </w:r>
+      <w:r>
+        <w:t xml:space="preserve">re-exported unchanged from</w:t>
+      </w:r>
+      <w:r>
+        <w:t xml:space="preserve"> </w:t>
+      </w:r>
+      <w:r>
+        <w:rPr>
+          <w:rStyle w:val="VerbatimChar"/>
+        </w:rPr>
+        <w:t xml:space="preserve">stage3_rocprofsys_common</w:t>
+      </w:r>
+      <w:r>
+        <w:t xml:space="preserve"> </w:t>
+      </w:r>
+      <w:r>
+        <w:t xml:space="preserve">– confirmed none of them read a row’s</w:t>
+      </w:r>
+      <w:r>
+        <w:t xml:space="preserve"> </w:t>
+      </w:r>
+      <w:r>
+        <w:t xml:space="preserve">display name or category, so they work on tagged trace rows with zero modification.</w:t>
+      </w:r>
+    </w:p>
+    <w:p>
+      <w:pPr>
+        <w:pStyle w:val="BodyText"/>
+      </w:pPr>
+      <w:r>
+        <w:t xml:space="preserve">Verification: 23 new tests for</w:t>
+      </w:r>
+      <w:r>
+        <w:t xml:space="preserve"> </w:t>
+      </w:r>
+      <w:r>
+        <w:rPr>
+          <w:rStyle w:val="VerbatimChar"/>
+        </w:rPr>
+        <w:t xml:space="preserve">stage3_rocprofsys_trace.py</w:t>
+      </w:r>
+      <w:r>
+        <w:t xml:space="preserve"> </w:t>
+      </w:r>
+      <w:r>
+        <w:t xml:space="preserve">plus 1 for</w:t>
+      </w:r>
+      <w:r>
+        <w:t xml:space="preserve"> </w:t>
+      </w:r>
+      <w:r>
+        <w:rPr>
+          <w:rStyle w:val="VerbatimChar"/>
+        </w:rPr>
+        <w:t xml:space="preserve">LABEL_KEY</w:t>
+      </w:r>
+      <w:r>
+        <w:t xml:space="preserve">, full suite</w:t>
+      </w:r>
+      <w:r>
+        <w:t xml:space="preserve"> </w:t>
+      </w:r>
+      <w:r>
+        <w:t xml:space="preserve">528 → 552 passing, every renamed/updated file’s existing tests unaffected. See</w:t>
+      </w:r>
+      <w:r>
+        <w:t xml:space="preserve"> </w:t>
+      </w:r>
+      <w:r>
+        <w:rPr>
+          <w:rStyle w:val="VerbatimChar"/>
+        </w:rPr>
+        <w:t xml:space="preserve">docs/plans/3.4-stage3-category-tagger.md</w:t>
+      </w:r>
+      <w:r>
+        <w:t xml:space="preserve"> </w:t>
+      </w:r>
+      <w:r>
+        <w:t xml:space="preserve">for the full accounting, written before implementation.</w:t>
+      </w:r>
+    </w:p>
     <w:bookmarkEnd w:id="85"/>
+    <w:bookmarkEnd w:id="86"/>
     <w:sectPr/>
   </w:body>
 </w:document>

</xml_diff>

<commit_message>
Plan 3.9: final help-text/comment audit + README updates for the trace pipeline
Closes plan 3.1's roadmap (renumbered from 3.8, taken by the kernel-owner
bug fix): rewrote comments across the trace-family modules that had
drifted into history/investigation language during that bug fix's own
real-data debugging, stating current invariants directly instead.

Also updates both READMEs, which had no mention of the 3.x trace
pipeline at all: README.md gains a "Trace-based tools" section for the
3 new CLI tools, and postprocess/README.md's stage4 write-up is
corrected to reflect the actual current architecture (merge_rank_trees()
and friends live in stage4_rocprofsys_common.py, shared by both
pipelines, not stage4_rocprofsys_sample_tree.py as it still claimed).

Co-Authored-By: Claude Sonnet 5 <noreply@anthropic.com>
</commit_message>
<xml_diff>
--- a/docs/DEVELOPMENT_HISTORY.docx
+++ b/docs/DEVELOPMENT_HISTORY.docx
@@ -10,7 +10,7 @@
         <w:t xml:space="preserve">Development History</w:t>
       </w:r>
     </w:p>
-    <w:bookmarkStart w:id="89" w:name="development-history"/>
+    <w:bookmarkStart w:id="90" w:name="development-history"/>
     <w:p>
       <w:pPr>
         <w:pStyle w:val="Heading1"/>
@@ -4331,6 +4331,119 @@
           </w:p>
         </w:tc>
       </w:tr>
+      <w:tr>
+        <w:tc>
+          <w:tcPr/>
+          <w:p>
+            <w:pPr>
+              <w:pStyle w:val="Compact"/>
+              <w:jc w:val="left"/>
+            </w:pPr>
+            <w:r>
+              <w:t xml:space="preserve">2026-08-21</w:t>
+            </w:r>
+          </w:p>
+        </w:tc>
+        <w:tc>
+          <w:tcPr/>
+          <w:p>
+            <w:pPr>
+              <w:pStyle w:val="Compact"/>
+              <w:jc w:val="left"/>
+            </w:pPr>
+            <w:r>
+              <w:t xml:space="preserve">Plan 3.9: final help-text/comment audit closing plan 3.1’s roadmap (renumbered from 3.8, taken by the bug-fix plan above) – rewrote 7 comments across the trace-family modules that had drifted into history/investigation language, most written during plan 3.8’s own real-data debugging; both READMEs updated to cover the whole</w:t>
+            </w:r>
+            <w:r>
+              <w:t xml:space="preserve"> </w:t>
+            </w:r>
+            <w:r>
+              <w:rPr>
+                <w:rStyle w:val="VerbatimChar"/>
+              </w:rPr>
+              <w:t xml:space="preserve">3.x</w:t>
+            </w:r>
+            <w:r>
+              <w:t xml:space="preserve"> </w:t>
+            </w:r>
+            <w:r>
+              <w:t xml:space="preserve">trace pipeline for the first time, including fixing</w:t>
+            </w:r>
+            <w:r>
+              <w:t xml:space="preserve"> </w:t>
+            </w:r>
+            <w:r>
+              <w:rPr>
+                <w:rStyle w:val="VerbatimChar"/>
+              </w:rPr>
+              <w:t xml:space="preserve">postprocess/README.md</w:t>
+            </w:r>
+            <w:r>
+              <w:t xml:space="preserve">’s</w:t>
+            </w:r>
+            <w:r>
+              <w:t xml:space="preserve"> </w:t>
+            </w:r>
+            <w:r>
+              <w:rPr>
+                <w:rStyle w:val="VerbatimChar"/>
+              </w:rPr>
+              <w:t xml:space="preserve">stage4</w:t>
+            </w:r>
+            <w:r>
+              <w:t xml:space="preserve"> </w:t>
+            </w:r>
+            <w:r>
+              <w:t xml:space="preserve">write-up, which still attributed</w:t>
+            </w:r>
+            <w:r>
+              <w:t xml:space="preserve"> </w:t>
+            </w:r>
+            <w:r>
+              <w:rPr>
+                <w:rStyle w:val="VerbatimChar"/>
+              </w:rPr>
+              <w:t xml:space="preserve">merge_rank_trees()</w:t>
+            </w:r>
+            <w:r>
+              <w:t xml:space="preserve"> </w:t>
+            </w:r>
+            <w:r>
+              <w:t xml:space="preserve">and friends to</w:t>
+            </w:r>
+            <w:r>
+              <w:t xml:space="preserve"> </w:t>
+            </w:r>
+            <w:r>
+              <w:rPr>
+                <w:rStyle w:val="VerbatimChar"/>
+              </w:rPr>
+              <w:t xml:space="preserve">stage4_rocprofsys_sample_tree.py</w:t>
+            </w:r>
+            <w:r>
+              <w:t xml:space="preserve"> </w:t>
+            </w:r>
+            <w:r>
+              <w:t xml:space="preserve">after plan 3.5 had already split them out into</w:t>
+            </w:r>
+            <w:r>
+              <w:t xml:space="preserve"> </w:t>
+            </w:r>
+            <w:r>
+              <w:rPr>
+                <w:rStyle w:val="VerbatimChar"/>
+              </w:rPr>
+              <w:t xml:space="preserve">stage4_rocprofsys_common.py</w:t>
+            </w:r>
+            <w:r>
+              <w:t xml:space="preserve"> </w:t>
+            </w:r>
+            <w:r>
+              <w:t xml:space="preserve">– see full accounting below</w:t>
+            </w:r>
+          </w:p>
+        </w:tc>
+      </w:tr>
     </w:tbl>
     <w:bookmarkStart w:id="20" w:name="project-scaffolding-and-rules"/>
     <w:p>
@@ -57369,8 +57482,658 @@
         <w:t xml:space="preserve">the generalization/HIP-scoping checks above, all before any code was written).</w:t>
       </w:r>
     </w:p>
+    <w:p>
+      <w:pPr>
+        <w:pStyle w:val="BodyText"/>
+      </w:pPr>
+      <w:r>
+        <w:t xml:space="preserve">A related but unfixable limitation surfaced while checking the fixed calltree against the real</w:t>
+      </w:r>
+      <w:r>
+        <w:t xml:space="preserve"> </w:t>
+      </w:r>
+      <w:r>
+        <w:t xml:space="preserve">data: every MPI call in the same trace also nests under</w:t>
+      </w:r>
+      <w:r>
+        <w:t xml:space="preserve"> </w:t>
+      </w:r>
+      <w:r>
+        <w:rPr>
+          <w:rStyle w:val="VerbatimChar"/>
+        </w:rPr>
+        <w:t xml:space="preserve">ompt_implicit_task</w:t>
+      </w:r>
+      <w:r>
+        <w:t xml:space="preserve">, but unlike the kernel</w:t>
+      </w:r>
+      <w:r>
+        <w:t xml:space="preserve"> </w:t>
+      </w:r>
+      <w:r>
+        <w:t xml:space="preserve">case there’s no name or id to recover the true caller from – the calling subroutine</w:t>
+      </w:r>
+      <w:r>
+        <w:t xml:space="preserve"> </w:t>
+      </w:r>
+      <w:r>
+        <w:t xml:space="preserve">(</w:t>
+      </w:r>
+      <w:r>
+        <w:rPr>
+          <w:rStyle w:val="VerbatimChar"/>
+        </w:rPr>
+        <w:t xml:space="preserve">run_convection_case$case_setup_mod_</w:t>
+      </w:r>
+      <w:r>
+        <w:t xml:space="preserve">, the likely candidate, confirmed against both the trace-mode</w:t>
+      </w:r>
+      <w:r>
+        <w:t xml:space="preserve"> </w:t>
+      </w:r>
+      <w:r>
+        <w:t xml:space="preserve">CSV and a separate sample-mode profile) simply has zero instrumented frames in the trace at all. No</w:t>
+      </w:r>
+      <w:r>
+        <w:t xml:space="preserve"> </w:t>
+      </w:r>
+      <w:r>
+        <w:t xml:space="preserve">code fix is possible from the data alone;</w:t>
+      </w:r>
+      <w:r>
+        <w:t xml:space="preserve"> </w:t>
+      </w:r>
+      <w:r>
+        <w:rPr>
+          <w:rStyle w:val="VerbatimChar"/>
+        </w:rPr>
+        <w:t xml:space="preserve">extract_trace_calltree.py</w:t>
+      </w:r>
+      <w:r>
+        <w:t xml:space="preserve">’s help text now states this</w:t>
+      </w:r>
+      <w:r>
+        <w:t xml:space="preserve"> </w:t>
+      </w:r>
+      <w:r>
+        <w:t xml:space="preserve">as a standing limitation (any CPU-side call made from an uninstrumented function nests under the</w:t>
+      </w:r>
+      <w:r>
+        <w:t xml:space="preserve"> </w:t>
+      </w:r>
+      <w:r>
+        <w:t xml:space="preserve">nearest instrumented/OMPT-internal ancestor) rather than leaving it to look like a real call</w:t>
+      </w:r>
+      <w:r>
+        <w:t xml:space="preserve"> </w:t>
+      </w:r>
+      <w:r>
+        <w:t xml:space="preserve">relationship.</w:t>
+      </w:r>
+    </w:p>
     <w:bookmarkEnd w:id="88"/>
+    <w:bookmarkStart w:id="89" w:name="X22636fa5efbb441233b215e24c8af23e4badffc"/>
+    <w:p>
+      <w:pPr>
+        <w:pStyle w:val="Heading2"/>
+      </w:pPr>
+      <w:r>
+        <w:t xml:space="preserve">2026-08-21 — Plan 3.9: help text + final comment/docstring audit + README updates</w:t>
+      </w:r>
+    </w:p>
+    <w:p>
+      <w:pPr>
+        <w:pStyle w:val="FirstParagraph"/>
+      </w:pPr>
+      <w:r>
+        <w:t xml:space="preserve">The last item in plan 3.1’s original roadmap table, renumbered from 3.8 to 3.9 since that plan</w:t>
+      </w:r>
+      <w:r>
+        <w:t xml:space="preserve"> </w:t>
+      </w:r>
+      <w:r>
+        <w:t xml:space="preserve">number was taken by the kernel-owner-reanchoring bug fix above. Two Explore agents swept every</w:t>
+      </w:r>
+      <w:r>
+        <w:t xml:space="preserve"> </w:t>
+      </w:r>
+      <w:r>
+        <w:t xml:space="preserve">new/renamed file from the whole</w:t>
+      </w:r>
+      <w:r>
+        <w:t xml:space="preserve"> </w:t>
+      </w:r>
+      <w:r>
+        <w:rPr>
+          <w:rStyle w:val="VerbatimChar"/>
+        </w:rPr>
+        <w:t xml:space="preserve">3.x</w:t>
+      </w:r>
+      <w:r>
+        <w:t xml:space="preserve"> </w:t>
+      </w:r>
+      <w:r>
+        <w:t xml:space="preserve">trace-postprocessing effort against</w:t>
+      </w:r>
+      <w:r>
+        <w:t xml:space="preserve"> </w:t>
+      </w:r>
+      <w:r>
+        <w:rPr>
+          <w:rStyle w:val="VerbatimChar"/>
+        </w:rPr>
+        <w:t xml:space="preserve">CLAUDE.md</w:t>
+      </w:r>
+      <w:r>
+        <w:t xml:space="preserve">’s Code</w:t>
+      </w:r>
+      <w:r>
+        <w:t xml:space="preserve"> </w:t>
+      </w:r>
+      <w:r>
+        <w:t xml:space="preserve">Comments rules and the</w:t>
+      </w:r>
+      <w:r>
+        <w:t xml:space="preserve"> </w:t>
+      </w:r>
+      <w:r>
+        <w:rPr>
+          <w:rStyle w:val="VerbatimChar"/>
+        </w:rPr>
+        <w:t xml:space="preserve">HELP_BLURB</w:t>
+      </w:r>
+      <w:r>
+        <w:t xml:space="preserve"> </w:t>
+      </w:r>
+      <w:r>
+        <w:t xml:space="preserve">convention, mirroring</w:t>
+      </w:r>
+      <w:r>
+        <w:t xml:space="preserve"> </w:t>
+      </w:r>
+      <w:r>
+        <w:rPr>
+          <w:rStyle w:val="VerbatimChar"/>
+        </w:rPr>
+        <w:t xml:space="preserve">docs/plans/2.13-comment-docstring-audit.md</w:t>
+      </w:r>
+      <w:r>
+        <w:t xml:space="preserve">’s</w:t>
+      </w:r>
+      <w:r>
+        <w:t xml:space="preserve"> </w:t>
+      </w:r>
+      <w:r>
+        <w:t xml:space="preserve">identical audit for the</w:t>
+      </w:r>
+      <w:r>
+        <w:t xml:space="preserve"> </w:t>
+      </w:r>
+      <w:r>
+        <w:rPr>
+          <w:rStyle w:val="VerbatimChar"/>
+        </w:rPr>
+        <w:t xml:space="preserve">2.x</w:t>
+      </w:r>
+      <w:r>
+        <w:t xml:space="preserve"> </w:t>
+      </w:r>
+      <w:r>
+        <w:t xml:space="preserve">consolidation.</w:t>
+      </w:r>
+    </w:p>
+    <w:p>
+      <w:pPr>
+        <w:pStyle w:val="BodyText"/>
+      </w:pPr>
+      <w:r>
+        <w:t xml:space="preserve">As expected, plan 3.8 had written a fair amount of investigation-narrative prose directly into</w:t>
+      </w:r>
+      <w:r>
+        <w:t xml:space="preserve"> </w:t>
+      </w:r>
+      <w:r>
+        <w:t xml:space="preserve">several docstrings while diagnosing the kernel-anchoring bug against real data – 7 findings across</w:t>
+      </w:r>
+      <w:r>
+        <w:t xml:space="preserve"> </w:t>
+      </w:r>
+      <w:r>
+        <w:rPr>
+          <w:rStyle w:val="VerbatimChar"/>
+        </w:rPr>
+        <w:t xml:space="preserve">stage4_rocprofsys_common.py</w:t>
+      </w:r>
+      <w:r>
+        <w:t xml:space="preserve">,</w:t>
+      </w:r>
+      <w:r>
+        <w:t xml:space="preserve"> </w:t>
+      </w:r>
+      <w:r>
+        <w:rPr>
+          <w:rStyle w:val="VerbatimChar"/>
+        </w:rPr>
+        <w:t xml:space="preserve">stage4_rocprofsys_trace_aggregate.py</w:t>
+      </w:r>
+      <w:r>
+        <w:t xml:space="preserve">,</w:t>
+      </w:r>
+      <w:r>
+        <w:t xml:space="preserve"> </w:t>
+      </w:r>
+      <w:r>
+        <w:rPr>
+          <w:rStyle w:val="VerbatimChar"/>
+        </w:rPr>
+        <w:t xml:space="preserve">stage4_rocprofsys_trace_ranks.py</w:t>
+      </w:r>
+      <w:r>
+        <w:t xml:space="preserve">,</w:t>
+      </w:r>
+      <w:r>
+        <w:t xml:space="preserve"> </w:t>
+      </w:r>
+      <w:r>
+        <w:rPr>
+          <w:rStyle w:val="VerbatimChar"/>
+        </w:rPr>
+        <w:t xml:space="preserve">stage4_rocprofsys_trace_tree.py</w:t>
+      </w:r>
+      <w:r>
+        <w:t xml:space="preserve">, and</w:t>
+      </w:r>
+      <w:r>
+        <w:t xml:space="preserve"> </w:t>
+      </w:r>
+      <w:r>
+        <w:rPr>
+          <w:rStyle w:val="VerbatimChar"/>
+        </w:rPr>
+        <w:t xml:space="preserve">stage4_rocprofsys_sample_tree.py</w:t>
+      </w:r>
+      <w:r>
+        <w:t xml:space="preserve">, each rewritten to state the current standing fact/invariant</w:t>
+      </w:r>
+      <w:r>
+        <w:t xml:space="preserve"> </w:t>
+      </w:r>
+      <w:r>
+        <w:t xml:space="preserve">directly instead of narrating how it was discovered. One audit agent’s</w:t>
+      </w:r>
+      <w:r>
+        <w:t xml:space="preserve"> </w:t>
+      </w:r>
+      <w:r>
+        <w:rPr>
+          <w:rStyle w:val="VerbatimChar"/>
+        </w:rPr>
+        <w:t xml:space="preserve">HELP_BLURB</w:t>
+      </w:r>
+      <w:r>
+        <w:t xml:space="preserve">-length finding</w:t>
+      </w:r>
+      <w:r>
+        <w:t xml:space="preserve"> </w:t>
+      </w:r>
+      <w:r>
+        <w:t xml:space="preserve">for the calltree tools didn’t survive a check against the codebase’s own established precedent</w:t>
+      </w:r>
+      <w:r>
+        <w:t xml:space="preserve"> </w:t>
+      </w:r>
+      <w:r>
+        <w:t xml:space="preserve">(</w:t>
+      </w:r>
+      <w:r>
+        <w:rPr>
+          <w:rStyle w:val="VerbatimChar"/>
+        </w:rPr>
+        <w:t xml:space="preserve">extract_calltree.py</w:t>
+      </w:r>
+      <w:r>
+        <w:t xml:space="preserve"> </w:t>
+      </w:r>
+      <w:r>
+        <w:t xml:space="preserve">is already just as long, following the same</w:t>
+      </w:r>
+      <w:r>
+        <w:t xml:space="preserve"> </w:t>
+      </w:r>
+      <w:r>
+        <w:t xml:space="preserve">“</w:t>
+      </w:r>
+      <w:r>
+        <w:t xml:space="preserve">short jargon-free lead,</w:t>
+      </w:r>
+      <w:r>
+        <w:t xml:space="preserve"> </w:t>
+      </w:r>
+      <w:r>
+        <w:t xml:space="preserve">followed by real technical detail</w:t>
+      </w:r>
+      <w:r>
+        <w:t xml:space="preserve">”</w:t>
+      </w:r>
+      <w:r>
+        <w:t xml:space="preserve"> </w:t>
+      </w:r>
+      <w:r>
+        <w:t xml:space="preserve">house pattern) – recorded as checked-and-compliant rather than</w:t>
+      </w:r>
+      <w:r>
+        <w:t xml:space="preserve"> </w:t>
+      </w:r>
+      <w:r>
+        <w:t xml:space="preserve">acted on.</w:t>
+      </w:r>
+    </w:p>
+    <w:p>
+      <w:pPr>
+        <w:pStyle w:val="BodyText"/>
+      </w:pPr>
+      <w:r>
+        <w:t xml:space="preserve">Also folded in: both</w:t>
+      </w:r>
+      <w:r>
+        <w:t xml:space="preserve"> </w:t>
+      </w:r>
+      <w:r>
+        <w:rPr>
+          <w:rStyle w:val="VerbatimChar"/>
+        </w:rPr>
+        <w:t xml:space="preserve">README.md</w:t>
+      </w:r>
+      <w:r>
+        <w:t xml:space="preserve"> </w:t>
+      </w:r>
+      <w:r>
+        <w:t xml:space="preserve">and</w:t>
+      </w:r>
+      <w:r>
+        <w:t xml:space="preserve"> </w:t>
+      </w:r>
+      <w:r>
+        <w:rPr>
+          <w:rStyle w:val="VerbatimChar"/>
+        </w:rPr>
+        <w:t xml:space="preserve">postprocess/README.md</w:t>
+      </w:r>
+      <w:r>
+        <w:t xml:space="preserve"> </w:t>
+      </w:r>
+      <w:r>
+        <w:t xml:space="preserve">were missing the entire</w:t>
+      </w:r>
+      <w:r>
+        <w:t xml:space="preserve"> </w:t>
+      </w:r>
+      <w:r>
+        <w:rPr>
+          <w:rStyle w:val="VerbatimChar"/>
+        </w:rPr>
+        <w:t xml:space="preserve">3.x</w:t>
+      </w:r>
+      <w:r>
+        <w:t xml:space="preserve"> </w:t>
+      </w:r>
+      <w:r>
+        <w:t xml:space="preserve">trace</w:t>
+      </w:r>
+      <w:r>
+        <w:t xml:space="preserve"> </w:t>
+      </w:r>
+      <w:r>
+        <w:t xml:space="preserve">pipeline.</w:t>
+      </w:r>
+      <w:r>
+        <w:t xml:space="preserve"> </w:t>
+      </w:r>
+      <w:r>
+        <w:rPr>
+          <w:rStyle w:val="VerbatimChar"/>
+        </w:rPr>
+        <w:t xml:space="preserve">README.md</w:t>
+      </w:r>
+      <w:r>
+        <w:t xml:space="preserve"> </w:t>
+      </w:r>
+      <w:r>
+        <w:t xml:space="preserve">gained a</w:t>
+      </w:r>
+      <w:r>
+        <w:t xml:space="preserve"> </w:t>
+      </w:r>
+      <w:r>
+        <w:t xml:space="preserve">“</w:t>
+      </w:r>
+      <w:r>
+        <w:t xml:space="preserve">Trace-based tools</w:t>
+      </w:r>
+      <w:r>
+        <w:t xml:space="preserve">”</w:t>
+      </w:r>
+      <w:r>
+        <w:t xml:space="preserve"> </w:t>
+      </w:r>
+      <w:r>
+        <w:t xml:space="preserve">section for the 3 new CLI tools.</w:t>
+      </w:r>
+      <w:r>
+        <w:t xml:space="preserve"> </w:t>
+      </w:r>
+      <w:r>
+        <w:rPr>
+          <w:rStyle w:val="VerbatimChar"/>
+        </w:rPr>
+        <w:t xml:space="preserve">postprocess/README.md</w:t>
+      </w:r>
+      <w:r>
+        <w:t xml:space="preserve"> </w:t>
+      </w:r>
+      <w:r>
+        <w:t xml:space="preserve">needed more than new bullets – its</w:t>
+      </w:r>
+      <w:r>
+        <w:t xml:space="preserve"> </w:t>
+      </w:r>
+      <w:r>
+        <w:rPr>
+          <w:rStyle w:val="VerbatimChar"/>
+        </w:rPr>
+        <w:t xml:space="preserve">stage4</w:t>
+      </w:r>
+      <w:r>
+        <w:t xml:space="preserve"> </w:t>
+      </w:r>
+      <w:r>
+        <w:t xml:space="preserve">write-up had drifted out of</w:t>
+      </w:r>
+      <w:r>
+        <w:t xml:space="preserve"> </w:t>
+      </w:r>
+      <w:r>
+        <w:t xml:space="preserve">date on the architecture itself, still attributing</w:t>
+      </w:r>
+      <w:r>
+        <w:t xml:space="preserve"> </w:t>
+      </w:r>
+      <w:r>
+        <w:rPr>
+          <w:rStyle w:val="VerbatimChar"/>
+        </w:rPr>
+        <w:t xml:space="preserve">merge_rank_trees()</w:t>
+      </w:r>
+      <w:r>
+        <w:t xml:space="preserve"> </w:t>
+      </w:r>
+      <w:r>
+        <w:t xml:space="preserve">and the rest of the</w:t>
+      </w:r>
+      <w:r>
+        <w:t xml:space="preserve"> </w:t>
+      </w:r>
+      <w:r>
+        <w:t xml:space="preserve">generic tree-merge engine to</w:t>
+      </w:r>
+      <w:r>
+        <w:t xml:space="preserve"> </w:t>
+      </w:r>
+      <w:r>
+        <w:rPr>
+          <w:rStyle w:val="VerbatimChar"/>
+        </w:rPr>
+        <w:t xml:space="preserve">stage4_rocprofsys_sample_tree.py</w:t>
+      </w:r>
+      <w:r>
+        <w:t xml:space="preserve"> </w:t>
+      </w:r>
+      <w:r>
+        <w:t xml:space="preserve">after plan 3.5 had already split</w:t>
+      </w:r>
+      <w:r>
+        <w:t xml:space="preserve"> </w:t>
+      </w:r>
+      <w:r>
+        <w:t xml:space="preserve">them out into</w:t>
+      </w:r>
+      <w:r>
+        <w:t xml:space="preserve"> </w:t>
+      </w:r>
+      <w:r>
+        <w:rPr>
+          <w:rStyle w:val="VerbatimChar"/>
+        </w:rPr>
+        <w:t xml:space="preserve">stage4_rocprofsys_common.py</w:t>
+      </w:r>
+      <w:r>
+        <w:t xml:space="preserve"> </w:t>
+      </w:r>
+      <w:r>
+        <w:t xml:space="preserve">for both pipelines to share (the same common/specific</w:t>
+      </w:r>
+      <w:r>
+        <w:t xml:space="preserve"> </w:t>
+      </w:r>
+      <w:r>
+        <w:t xml:space="preserve">split</w:t>
+      </w:r>
+      <w:r>
+        <w:t xml:space="preserve"> </w:t>
+      </w:r>
+      <w:r>
+        <w:rPr>
+          <w:rStyle w:val="VerbatimChar"/>
+        </w:rPr>
+        <w:t xml:space="preserve">stage3</w:t>
+      </w:r>
+      <w:r>
+        <w:t xml:space="preserve">’s own write-up already documented correctly). Fixed that attribution everywhere it</w:t>
+      </w:r>
+      <w:r>
+        <w:t xml:space="preserve"> </w:t>
+      </w:r>
+      <w:r>
+        <w:t xml:space="preserve">appeared (the module list, the stage4→stage5 entry-contract shapes), added the trace-side modules</w:t>
+      </w:r>
+      <w:r>
+        <w:t xml:space="preserve"> </w:t>
+      </w:r>
+      <w:r>
+        <w:t xml:space="preserve">throughout, and added a</w:t>
+      </w:r>
+      <w:r>
+        <w:t xml:space="preserve"> </w:t>
+      </w:r>
+      <w:r>
+        <w:t xml:space="preserve">“</w:t>
+      </w:r>
+      <w:r>
+        <w:t xml:space="preserve">Trace pipeline</w:t>
+      </w:r>
+      <w:r>
+        <w:t xml:space="preserve">”</w:t>
+      </w:r>
+      <w:r>
+        <w:t xml:space="preserve"> </w:t>
+      </w:r>
+      <w:r>
+        <w:t xml:space="preserve">companion to the existing</w:t>
+      </w:r>
+      <w:r>
+        <w:t xml:space="preserve"> </w:t>
+      </w:r>
+      <w:r>
+        <w:t xml:space="preserve">“</w:t>
+      </w:r>
+      <w:r>
+        <w:t xml:space="preserve">Kernel-to-CPU attachment</w:t>
+      </w:r>
+      <w:r>
+        <w:t xml:space="preserve">”</w:t>
+      </w:r>
+      <w:r>
+        <w:t xml:space="preserve"> </w:t>
+      </w:r>
+      <w:r>
+        <w:t xml:space="preserve">section describing the</w:t>
+      </w:r>
+      <w:r>
+        <w:t xml:space="preserve"> </w:t>
+      </w:r>
+      <w:r>
+        <w:rPr>
+          <w:rStyle w:val="VerbatimChar"/>
+        </w:rPr>
+        <w:t xml:space="preserve">corr_id</w:t>
+      </w:r>
+      <w:r>
+        <w:t xml:space="preserve">-join-plus-reanchor mechanism plan 3.8 built, alongside the sample</w:t>
+      </w:r>
+      <w:r>
+        <w:t xml:space="preserve"> </w:t>
+      </w:r>
+      <w:r>
+        <w:t xml:space="preserve">pipeline’s own two-tier description.</w:t>
+      </w:r>
+    </w:p>
+    <w:p>
+      <w:pPr>
+        <w:pStyle w:val="BodyText"/>
+      </w:pPr>
+      <w:r>
+        <w:t xml:space="preserve">Verification: comment/doc-only changes, so the full suite stays unchanged at 622 passing; every</w:t>
+      </w:r>
+      <w:r>
+        <w:t xml:space="preserve"> </w:t>
+      </w:r>
+      <w:r>
+        <w:t xml:space="preserve">edited file re-imports cleanly. See</w:t>
+      </w:r>
+      <w:r>
+        <w:t xml:space="preserve"> </w:t>
+      </w:r>
+      <w:r>
+        <w:rPr>
+          <w:rStyle w:val="VerbatimChar"/>
+        </w:rPr>
+        <w:t xml:space="preserve">docs/plans/3.9-help-text-and-comment-audit.md</w:t>
+      </w:r>
+      <w:r>
+        <w:t xml:space="preserve"> </w:t>
+      </w:r>
+      <w:r>
+        <w:t xml:space="preserve">for the full</w:t>
+      </w:r>
+      <w:r>
+        <w:t xml:space="preserve"> </w:t>
+      </w:r>
+      <w:r>
+        <w:t xml:space="preserve">accounting.</w:t>
+      </w:r>
+    </w:p>
     <w:bookmarkEnd w:id="89"/>
+    <w:bookmarkEnd w:id="90"/>
     <w:sectPr/>
   </w:body>
 </w:document>

</xml_diff>

<commit_message>
Plan 3.10: Perfetto .proto -> trace-CSV converter, plus relocate Tests_parameters.txt
Adds convert_trace_to_csv.py, closing the ".proto conversion step deferred
to a later plan" gap every prior 3.x plan left open. Design grounded in
reading Perfetto's actual C++/SQL source directly rather than docs alone,
which surfaced a real correctness trap (trace_processor_shell prints SQL
NULL as the literal string "[NULL]", not a blank cell) and confirmed GPU
kernel-dispatch slices sit on a process_track, not a thread_track. Default
output is the -gpu/-mpi/-other partitioned trio (needed for exact
GPU-kernel-to-launch-site correlation); --unfiltered adds the plain
combined file. Both READMEs and the three extract_trace_*.py tools
updated to name this tool as the conversion step.

Also moves Tests_parameters.txt to docs/Tests_parameters.txt (no content
change).

Co-Authored-By: Claude Sonnet 5 <noreply@anthropic.com>
</commit_message>
<xml_diff>
--- a/docs/DEVELOPMENT_HISTORY.docx
+++ b/docs/DEVELOPMENT_HISTORY.docx
@@ -10,7 +10,7 @@
         <w:t xml:space="preserve">Development History</w:t>
       </w:r>
     </w:p>
-    <w:bookmarkStart w:id="90" w:name="development-history"/>
+    <w:bookmarkStart w:id="91" w:name="development-history"/>
     <w:p>
       <w:pPr>
         <w:pStyle w:val="Heading1"/>
@@ -4444,6 +4444,149 @@
           </w:p>
         </w:tc>
       </w:tr>
+      <w:tr>
+        <w:tc>
+          <w:tcPr/>
+          <w:p>
+            <w:pPr>
+              <w:pStyle w:val="Compact"/>
+              <w:jc w:val="left"/>
+            </w:pPr>
+            <w:r>
+              <w:t xml:space="preserve">2026-08-21</w:t>
+            </w:r>
+          </w:p>
+        </w:tc>
+        <w:tc>
+          <w:tcPr/>
+          <w:p>
+            <w:pPr>
+              <w:pStyle w:val="Compact"/>
+              <w:jc w:val="left"/>
+            </w:pPr>
+            <w:r>
+              <w:t xml:space="preserve">Plan 3.10: new</w:t>
+            </w:r>
+            <w:r>
+              <w:t xml:space="preserve"> </w:t>
+            </w:r>
+            <w:r>
+              <w:rPr>
+                <w:rStyle w:val="VerbatimChar"/>
+              </w:rPr>
+              <w:t xml:space="preserve">convert_trace_to_csv.py</w:t>
+            </w:r>
+            <w:r>
+              <w:t xml:space="preserve"> </w:t>
+            </w:r>
+            <w:r>
+              <w:t xml:space="preserve">– converts a rocprof-sys trace-mode run’s per-rank Perfetto</w:t>
+            </w:r>
+            <w:r>
+              <w:t xml:space="preserve"> </w:t>
+            </w:r>
+            <w:r>
+              <w:rPr>
+                <w:rStyle w:val="VerbatimChar"/>
+              </w:rPr>
+              <w:t xml:space="preserve">.proto</w:t>
+            </w:r>
+            <w:r>
+              <w:t xml:space="preserve"> </w:t>
+            </w:r>
+            <w:r>
+              <w:t xml:space="preserve">files into the trace-CSV format the</w:t>
+            </w:r>
+            <w:r>
+              <w:t xml:space="preserve"> </w:t>
+            </w:r>
+            <w:r>
+              <w:rPr>
+                <w:rStyle w:val="VerbatimChar"/>
+              </w:rPr>
+              <w:t xml:space="preserve">3.x</w:t>
+            </w:r>
+            <w:r>
+              <w:t xml:space="preserve"> </w:t>
+            </w:r>
+            <w:r>
+              <w:t xml:space="preserve">pipeline already consumes, closing the</w:t>
+            </w:r>
+            <w:r>
+              <w:t xml:space="preserve"> </w:t>
+            </w:r>
+            <w:r>
+              <w:t xml:space="preserve">“</w:t>
+            </w:r>
+            <w:r>
+              <w:t xml:space="preserve">conversion step deferred to a later plan</w:t>
+            </w:r>
+            <w:r>
+              <w:t xml:space="preserve">”</w:t>
+            </w:r>
+            <w:r>
+              <w:t xml:space="preserve"> </w:t>
+            </w:r>
+            <w:r>
+              <w:t xml:space="preserve">gap every prior</w:t>
+            </w:r>
+            <w:r>
+              <w:t xml:space="preserve"> </w:t>
+            </w:r>
+            <w:r>
+              <w:rPr>
+                <w:rStyle w:val="VerbatimChar"/>
+              </w:rPr>
+              <w:t xml:space="preserve">3.x</w:t>
+            </w:r>
+            <w:r>
+              <w:t xml:space="preserve"> </w:t>
+            </w:r>
+            <w:r>
+              <w:t xml:space="preserve">plan left open; design grounded in reading Perfetto’s actual C++/SQL source directly rather than docs alone, surfacing a real correctness trap (</w:t>
+            </w:r>
+            <w:r>
+              <w:rPr>
+                <w:rStyle w:val="VerbatimChar"/>
+              </w:rPr>
+              <w:t xml:space="preserve">trace_processor_shell</w:t>
+            </w:r>
+            <w:r>
+              <w:t xml:space="preserve"> </w:t>
+            </w:r>
+            <w:r>
+              <w:t xml:space="preserve">prints SQL</w:t>
+            </w:r>
+            <w:r>
+              <w:t xml:space="preserve"> </w:t>
+            </w:r>
+            <w:r>
+              <w:rPr>
+                <w:rStyle w:val="VerbatimChar"/>
+              </w:rPr>
+              <w:t xml:space="preserve">NULL</w:t>
+            </w:r>
+            <w:r>
+              <w:t xml:space="preserve"> </w:t>
+            </w:r>
+            <w:r>
+              <w:t xml:space="preserve">as the literal string</w:t>
+            </w:r>
+            <w:r>
+              <w:t xml:space="preserve"> </w:t>
+            </w:r>
+            <w:r>
+              <w:rPr>
+                <w:rStyle w:val="VerbatimChar"/>
+              </w:rPr>
+              <w:t xml:space="preserve">"[NULL]"</w:t>
+            </w:r>
+            <w:r>
+              <w:t xml:space="preserve">, not a blank cell) that would have silently corrupted this pipeline’s own blank-handling convention – see full accounting below</w:t>
+            </w:r>
+          </w:p>
+        </w:tc>
+      </w:tr>
     </w:tbl>
     <w:bookmarkStart w:id="20" w:name="project-scaffolding-and-rules"/>
     <w:p>
@@ -58133,7 +58276,969 @@
       </w:r>
     </w:p>
     <w:bookmarkEnd w:id="89"/>
+    <w:bookmarkStart w:id="90" w:name="X189bd7e642386518d36edab6aaf32ba7053a420"/>
+    <w:p>
+      <w:pPr>
+        <w:pStyle w:val="Heading2"/>
+      </w:pPr>
+      <w:r>
+        <w:t xml:space="preserve">2026-08-21 — Plan 3.10: rocprof-sys Perfetto</w:t>
+      </w:r>
+      <w:r>
+        <w:t xml:space="preserve"> </w:t>
+      </w:r>
+      <w:r>
+        <w:rPr>
+          <w:rStyle w:val="VerbatimChar"/>
+        </w:rPr>
+        <w:t xml:space="preserve">.proto</w:t>
+      </w:r>
+      <w:r>
+        <w:t xml:space="preserve"> </w:t>
+      </w:r>
+      <w:r>
+        <w:t xml:space="preserve">→ trace-CSV converter</w:t>
+      </w:r>
+    </w:p>
+    <w:p>
+      <w:pPr>
+        <w:pStyle w:val="FirstParagraph"/>
+      </w:pPr>
+      <w:r>
+        <w:t xml:space="preserve">Every</w:t>
+      </w:r>
+      <w:r>
+        <w:t xml:space="preserve"> </w:t>
+      </w:r>
+      <w:r>
+        <w:rPr>
+          <w:rStyle w:val="VerbatimChar"/>
+        </w:rPr>
+        <w:t xml:space="preserve">3.x</w:t>
+      </w:r>
+      <w:r>
+        <w:t xml:space="preserve"> </w:t>
+      </w:r>
+      <w:r>
+        <w:t xml:space="preserve">plan from 3.1 onward explicitly deferred the</w:t>
+      </w:r>
+      <w:r>
+        <w:t xml:space="preserve"> </w:t>
+      </w:r>
+      <w:r>
+        <w:rPr>
+          <w:rStyle w:val="VerbatimChar"/>
+        </w:rPr>
+        <w:t xml:space="preserve">.proto</w:t>
+      </w:r>
+      <w:r>
+        <w:t xml:space="preserve">→CSV conversion step as</w:t>
+      </w:r>
+      <w:r>
+        <w:t xml:space="preserve"> </w:t>
+      </w:r>
+      <w:r>
+        <w:t xml:space="preserve">“</w:t>
+      </w:r>
+      <w:r>
+        <w:t xml:space="preserve">a</w:t>
+      </w:r>
+      <w:r>
+        <w:t xml:space="preserve"> </w:t>
+      </w:r>
+      <w:r>
+        <w:t xml:space="preserve">separate, user-run tool, out of scope</w:t>
+      </w:r>
+      <w:r>
+        <w:t xml:space="preserve">”</w:t>
+      </w:r>
+      <w:r>
+        <w:t xml:space="preserve"> </w:t>
+      </w:r>
+      <w:r>
+        <w:t xml:space="preserve">– the real trace data this project tested against was</w:t>
+      </w:r>
+      <w:r>
+        <w:t xml:space="preserve"> </w:t>
+      </w:r>
+      <w:r>
+        <w:t xml:space="preserve">converted by hand, with no repeatable process. This plan closes that gap with a new</w:t>
+      </w:r>
+      <w:r>
+        <w:t xml:space="preserve"> </w:t>
+      </w:r>
+      <w:r>
+        <w:rPr>
+          <w:rStyle w:val="VerbatimChar"/>
+        </w:rPr>
+        <w:t xml:space="preserve">postprocess/tools/convert_trace_to_csv.py</w:t>
+      </w:r>
+      <w:r>
+        <w:t xml:space="preserve">.</w:t>
+      </w:r>
+    </w:p>
+    <w:p>
+      <w:pPr>
+        <w:pStyle w:val="BodyText"/>
+      </w:pPr>
+      <w:r>
+        <w:t xml:space="preserve">Design work leaned heavily on reading source directly rather than trusting documentation summaries:</w:t>
+      </w:r>
+      <w:r>
+        <w:t xml:space="preserve"> </w:t>
+      </w:r>
+      <w:r>
+        <w:t xml:space="preserve">a full Perfetto checkout happened to already exist locally, so the actual</w:t>
+      </w:r>
+      <w:r>
+        <w:t xml:space="preserve"> </w:t>
+      </w:r>
+      <w:r>
+        <w:rPr>
+          <w:rStyle w:val="VerbatimChar"/>
+        </w:rPr>
+        <w:t xml:space="preserve">trace_processor_shell</w:t>
+      </w:r>
+      <w:r>
+        <w:t xml:space="preserve"> </w:t>
+      </w:r>
+      <w:r>
+        <w:t xml:space="preserve">C++ source (</w:t>
+      </w:r>
+      <w:r>
+        <w:rPr>
+          <w:rStyle w:val="VerbatimChar"/>
+        </w:rPr>
+        <w:t xml:space="preserve">shell/query.cc</w:t>
+      </w:r>
+      <w:r>
+        <w:t xml:space="preserve">,</w:t>
+      </w:r>
+      <w:r>
+        <w:t xml:space="preserve"> </w:t>
+      </w:r>
+      <w:r>
+        <w:rPr>
+          <w:rStyle w:val="VerbatimChar"/>
+        </w:rPr>
+        <w:t xml:space="preserve">trace_processor_shell.cc</w:t>
+      </w:r>
+      <w:r>
+        <w:t xml:space="preserve">) and the actual PerfettoSQL stdlib source</w:t>
+      </w:r>
+      <w:r>
+        <w:t xml:space="preserve"> </w:t>
+      </w:r>
+      <w:r>
+        <w:t xml:space="preserve">(</w:t>
+      </w:r>
+      <w:r>
+        <w:rPr>
+          <w:rStyle w:val="VerbatimChar"/>
+        </w:rPr>
+        <w:t xml:space="preserve">prelude/after_eof/tracks.sql</w:t>
+      </w:r>
+      <w:r>
+        <w:t xml:space="preserve">) were read to confirm the exact CLI contract and SQL schema, rather</w:t>
+      </w:r>
+      <w:r>
+        <w:t xml:space="preserve"> </w:t>
+      </w:r>
+      <w:r>
+        <w:t xml:space="preserve">than relying on perfetto.dev’s docs (which turned out to have some genuine gaps – the docs didn’t</w:t>
+      </w:r>
+      <w:r>
+        <w:t xml:space="preserve"> </w:t>
+      </w:r>
+      <w:r>
+        <w:t xml:space="preserve">mention</w:t>
+      </w:r>
+      <w:r>
+        <w:t xml:space="preserve"> </w:t>
+      </w:r>
+      <w:r>
+        <w:rPr>
+          <w:rStyle w:val="VerbatimChar"/>
+        </w:rPr>
+        <w:t xml:space="preserve">process_track</w:t>
+      </w:r>
+      <w:r>
+        <w:t xml:space="preserve"> </w:t>
+      </w:r>
+      <w:r>
+        <w:t xml:space="preserve">at all, only</w:t>
+      </w:r>
+      <w:r>
+        <w:t xml:space="preserve"> </w:t>
+      </w:r>
+      <w:r>
+        <w:rPr>
+          <w:rStyle w:val="VerbatimChar"/>
+        </w:rPr>
+        <w:t xml:space="preserve">thread_track</w:t>
+      </w:r>
+      <w:r>
+        <w:t xml:space="preserve">). This surfaced two things a docs-only design</w:t>
+      </w:r>
+      <w:r>
+        <w:t xml:space="preserve"> </w:t>
+      </w:r>
+      <w:r>
+        <w:t xml:space="preserve">would have missed:</w:t>
+      </w:r>
+    </w:p>
+    <w:p>
+      <w:pPr>
+        <w:numPr>
+          <w:ilvl w:val="0"/>
+          <w:numId w:val="1018"/>
+        </w:numPr>
+        <w:pStyle w:val="Compact"/>
+      </w:pPr>
+      <w:r>
+        <w:rPr>
+          <w:bCs/>
+          <w:b/>
+        </w:rPr>
+        <w:t xml:space="preserve">A real correctness trap</w:t>
+      </w:r>
+      <w:r>
+        <w:t xml:space="preserve">: a SQL</w:t>
+      </w:r>
+      <w:r>
+        <w:t xml:space="preserve"> </w:t>
+      </w:r>
+      <w:r>
+        <w:rPr>
+          <w:rStyle w:val="VerbatimChar"/>
+        </w:rPr>
+        <w:t xml:space="preserve">NULL</w:t>
+      </w:r>
+      <w:r>
+        <w:t xml:space="preserve"> </w:t>
+      </w:r>
+      <w:r>
+        <w:t xml:space="preserve">prints from</w:t>
+      </w:r>
+      <w:r>
+        <w:t xml:space="preserve"> </w:t>
+      </w:r>
+      <w:r>
+        <w:rPr>
+          <w:rStyle w:val="VerbatimChar"/>
+        </w:rPr>
+        <w:t xml:space="preserve">trace_processor_shell</w:t>
+      </w:r>
+      <w:r>
+        <w:t xml:space="preserve"> </w:t>
+      </w:r>
+      <w:r>
+        <w:t xml:space="preserve">as the literal</w:t>
+      </w:r>
+      <w:r>
+        <w:t xml:space="preserve"> </w:t>
+      </w:r>
+      <w:r>
+        <w:t xml:space="preserve">7-character string</w:t>
+      </w:r>
+      <w:r>
+        <w:t xml:space="preserve"> </w:t>
+      </w:r>
+      <w:r>
+        <w:rPr>
+          <w:rStyle w:val="VerbatimChar"/>
+        </w:rPr>
+        <w:t xml:space="preserve">"[NULL]"</w:t>
+      </w:r>
+      <w:r>
+        <w:t xml:space="preserve">, not an empty cell. Copied naively, every genuinely-NULL cell</w:t>
+      </w:r>
+      <w:r>
+        <w:t xml:space="preserve"> </w:t>
+      </w:r>
+      <w:r>
+        <w:t xml:space="preserve">(e.g. </w:t>
+      </w:r>
+      <w:r>
+        <w:rPr>
+          <w:rStyle w:val="VerbatimChar"/>
+        </w:rPr>
+        <w:t xml:space="preserve">tid</w:t>
+      </w:r>
+      <w:r>
+        <w:t xml:space="preserve"> </w:t>
+      </w:r>
+      <w:r>
+        <w:t xml:space="preserve">on a GPU kernel-dispatch slice with no owning thread) would become the literal</w:t>
+      </w:r>
+      <w:r>
+        <w:t xml:space="preserve"> </w:t>
+      </w:r>
+      <w:r>
+        <w:t xml:space="preserve">string</w:t>
+      </w:r>
+      <w:r>
+        <w:t xml:space="preserve"> </w:t>
+      </w:r>
+      <w:r>
+        <w:rPr>
+          <w:rStyle w:val="VerbatimChar"/>
+        </w:rPr>
+        <w:t xml:space="preserve">[NULL]</w:t>
+      </w:r>
+      <w:r>
+        <w:t xml:space="preserve"> </w:t>
+      </w:r>
+      <w:r>
+        <w:t xml:space="preserve">– truthy in Python, silently breaking</w:t>
+      </w:r>
+      <w:r>
+        <w:t xml:space="preserve"> </w:t>
+      </w:r>
+      <w:r>
+        <w:rPr>
+          <w:rStyle w:val="VerbatimChar"/>
+        </w:rPr>
+        <w:t xml:space="preserve">stage1_rocprofsys_trace.py</w:t>
+      </w:r>
+      <w:r>
+        <w:t xml:space="preserve">’s</w:t>
+      </w:r>
+      <w:r>
+        <w:t xml:space="preserve"> </w:t>
+      </w:r>
+      <w:r>
+        <w:rPr>
+          <w:rStyle w:val="VerbatimChar"/>
+        </w:rPr>
+        <w:t xml:space="preserve">v if v    else None</w:t>
+      </w:r>
+      <w:r>
+        <w:t xml:space="preserve"> </w:t>
+      </w:r>
+      <w:r>
+        <w:t xml:space="preserve">blank-handling that the rest of the pipeline depends on. Fixed by a dedicated parsing</w:t>
+      </w:r>
+      <w:r>
+        <w:t xml:space="preserve"> </w:t>
+      </w:r>
+      <w:r>
+        <w:t xml:space="preserve">step that converts any cell exactly equal to</w:t>
+      </w:r>
+      <w:r>
+        <w:t xml:space="preserve"> </w:t>
+      </w:r>
+      <w:r>
+        <w:rPr>
+          <w:rStyle w:val="VerbatimChar"/>
+        </w:rPr>
+        <w:t xml:space="preserve">[NULL]</w:t>
+      </w:r>
+      <w:r>
+        <w:t xml:space="preserve"> </w:t>
+      </w:r>
+      <w:r>
+        <w:t xml:space="preserve">back to an empty string before this tool</w:t>
+      </w:r>
+      <w:r>
+        <w:t xml:space="preserve"> </w:t>
+      </w:r>
+      <w:r>
+        <w:t xml:space="preserve">writes its own CSV.</w:t>
+      </w:r>
+    </w:p>
+    <w:p>
+      <w:pPr>
+        <w:numPr>
+          <w:ilvl w:val="0"/>
+          <w:numId w:val="1018"/>
+        </w:numPr>
+        <w:pStyle w:val="Compact"/>
+      </w:pPr>
+      <w:r>
+        <w:rPr>
+          <w:bCs/>
+          <w:b/>
+        </w:rPr>
+        <w:t xml:space="preserve">GPU kernel-dispatch slices sit on a</w:t>
+      </w:r>
+      <w:r>
+        <w:rPr>
+          <w:bCs/>
+          <w:b/>
+        </w:rPr>
+        <w:t xml:space="preserve"> </w:t>
+      </w:r>
+      <w:r>
+        <w:rPr>
+          <w:rStyle w:val="VerbatimChar"/>
+          <w:bCs/>
+          <w:b/>
+        </w:rPr>
+        <w:t xml:space="preserve">process_track</w:t>
+      </w:r>
+      <w:r>
+        <w:rPr>
+          <w:bCs/>
+          <w:b/>
+        </w:rPr>
+        <w:t xml:space="preserve">, not a</w:t>
+      </w:r>
+      <w:r>
+        <w:rPr>
+          <w:bCs/>
+          <w:b/>
+        </w:rPr>
+        <w:t xml:space="preserve"> </w:t>
+      </w:r>
+      <w:r>
+        <w:rPr>
+          <w:rStyle w:val="VerbatimChar"/>
+          <w:bCs/>
+          <w:b/>
+        </w:rPr>
+        <w:t xml:space="preserve">thread_track</w:t>
+      </w:r>
+      <w:r>
+        <w:t xml:space="preserve"> </w:t>
+      </w:r>
+      <w:r>
+        <w:t xml:space="preserve">– confirmed</w:t>
+      </w:r>
+      <w:r>
+        <w:t xml:space="preserve"> </w:t>
+      </w:r>
+      <w:r>
+        <w:t xml:space="preserve">directly against the real production CSVs (kernel-dispatch rows have</w:t>
+      </w:r>
+      <w:r>
+        <w:t xml:space="preserve"> </w:t>
+      </w:r>
+      <w:r>
+        <w:rPr>
+          <w:rStyle w:val="VerbatimChar"/>
+        </w:rPr>
+        <w:t xml:space="preserve">pid</w:t>
+      </w:r>
+      <w:r>
+        <w:t xml:space="preserve">/</w:t>
+      </w:r>
+      <w:r>
+        <w:rPr>
+          <w:rStyle w:val="VerbatimChar"/>
+        </w:rPr>
+        <w:t xml:space="preserve">process_name</w:t>
+      </w:r>
+      <w:r>
+        <w:t xml:space="preserve"> </w:t>
+      </w:r>
+      <w:r>
+        <w:t xml:space="preserve">populated but blank</w:t>
+      </w:r>
+      <w:r>
+        <w:t xml:space="preserve"> </w:t>
+      </w:r>
+      <w:r>
+        <w:rPr>
+          <w:rStyle w:val="VerbatimChar"/>
+        </w:rPr>
+        <w:t xml:space="preserve">tid</w:t>
+      </w:r>
+      <w:r>
+        <w:t xml:space="preserve">/</w:t>
+      </w:r>
+      <w:r>
+        <w:rPr>
+          <w:rStyle w:val="VerbatimChar"/>
+        </w:rPr>
+        <w:t xml:space="preserve">thread_name</w:t>
+      </w:r>
+      <w:r>
+        <w:t xml:space="preserve">). The base-slice SQL query</w:t>
+      </w:r>
+      <w:r>
+        <w:t xml:space="preserve"> </w:t>
+      </w:r>
+      <w:r>
+        <w:rPr>
+          <w:rStyle w:val="VerbatimChar"/>
+        </w:rPr>
+        <w:t xml:space="preserve">LEFT JOIN</w:t>
+      </w:r>
+      <w:r>
+        <w:t xml:space="preserve">s both track kinds</w:t>
+      </w:r>
+      <w:r>
+        <w:t xml:space="preserve"> </w:t>
+      </w:r>
+      <w:r>
+        <w:t xml:space="preserve">and coalesces on</w:t>
+      </w:r>
+      <w:r>
+        <w:t xml:space="preserve"> </w:t>
+      </w:r>
+      <w:r>
+        <w:rPr>
+          <w:rStyle w:val="VerbatimChar"/>
+        </w:rPr>
+        <w:t xml:space="preserve">process.upid</w:t>
+      </w:r>
+      <w:r>
+        <w:t xml:space="preserve">, rather than assuming every slice has an owning thread.</w:t>
+      </w:r>
+    </w:p>
+    <w:p>
+      <w:pPr>
+        <w:pStyle w:val="FirstParagraph"/>
+      </w:pPr>
+      <w:r>
+        <w:t xml:space="preserve">A Plan agent cross-checked the design against this project’s own code before implementation and</w:t>
+      </w:r>
+      <w:r>
+        <w:t xml:space="preserve"> </w:t>
+      </w:r>
+      <w:r>
+        <w:t xml:space="preserve">confirmed the query design, refined the args-pivoting approach (per-file dynamic arg-column</w:t>
+      </w:r>
+      <w:r>
+        <w:t xml:space="preserve"> </w:t>
+      </w:r>
+      <w:r>
+        <w:t xml:space="preserve">headers, computed independently rather than assuming only the GPU partition ever carries args),</w:t>
+      </w:r>
+      <w:r>
+        <w:t xml:space="preserve"> </w:t>
+      </w:r>
+      <w:r>
+        <w:t xml:space="preserve">and confirmed the tool’s home:</w:t>
+      </w:r>
+      <w:r>
+        <w:t xml:space="preserve"> </w:t>
+      </w:r>
+      <w:r>
+        <w:rPr>
+          <w:rStyle w:val="VerbatimChar"/>
+        </w:rPr>
+        <w:t xml:space="preserve">postprocess/tools/</w:t>
+      </w:r>
+      <w:r>
+        <w:t xml:space="preserve">, not</w:t>
+      </w:r>
+      <w:r>
+        <w:t xml:space="preserve"> </w:t>
+      </w:r>
+      <w:r>
+        <w:rPr>
+          <w:rStyle w:val="VerbatimChar"/>
+        </w:rPr>
+        <w:t xml:space="preserve">scripts/</w:t>
+      </w:r>
+      <w:r>
+        <w:t xml:space="preserve">, specifically so it can</w:t>
+      </w:r>
+      <w:r>
+        <w:t xml:space="preserve"> </w:t>
+      </w:r>
+      <w:r>
+        <w:rPr>
+          <w:rStyle w:val="VerbatimChar"/>
+        </w:rPr>
+        <w:t xml:space="preserve">import stage3_rocprofsys_trace.tag_for_category()</w:t>
+      </w:r>
+      <w:r>
+        <w:t xml:space="preserve"> </w:t>
+      </w:r>
+      <w:r>
+        <w:t xml:space="preserve">directly for the</w:t>
+      </w:r>
+      <w:r>
+        <w:t xml:space="preserve"> </w:t>
+      </w:r>
+      <w:r>
+        <w:rPr>
+          <w:rStyle w:val="VerbatimChar"/>
+        </w:rPr>
+        <w:t xml:space="preserve">-gpu</w:t>
+      </w:r>
+      <w:r>
+        <w:t xml:space="preserve">/</w:t>
+      </w:r>
+      <w:r>
+        <w:rPr>
+          <w:rStyle w:val="VerbatimChar"/>
+        </w:rPr>
+        <w:t xml:space="preserve">-mpi</w:t>
+      </w:r>
+      <w:r>
+        <w:t xml:space="preserve">/</w:t>
+      </w:r>
+      <w:r>
+        <w:rPr>
+          <w:rStyle w:val="VerbatimChar"/>
+        </w:rPr>
+        <w:t xml:space="preserve">-other</w:t>
+      </w:r>
+      <w:r>
+        <w:t xml:space="preserve"> </w:t>
+      </w:r>
+      <w:r>
+        <w:t xml:space="preserve">partition-bin logic, with zero risk of that logic drifting out of sync with the real tag map (the</w:t>
+      </w:r>
+      <w:r>
+        <w:t xml:space="preserve"> </w:t>
+      </w:r>
+      <w:r>
+        <w:t xml:space="preserve">same reasoning that keeps this codebase’s noise-pattern logic in one place elsewhere). Confirmed</w:t>
+      </w:r>
+      <w:r>
+        <w:t xml:space="preserve"> </w:t>
+      </w:r>
+      <w:r>
+        <w:t xml:space="preserve">directly with the user: stays Python rather than bash, for that same reuse reason and because this</w:t>
+      </w:r>
+      <w:r>
+        <w:t xml:space="preserve"> </w:t>
+      </w:r>
+      <w:r>
+        <w:t xml:space="preserve">project’s own bash scripts are only ever syntax-checked, never unit-tested, while the subtle</w:t>
+      </w:r>
+      <w:r>
+        <w:t xml:space="preserve"> </w:t>
+      </w:r>
+      <w:r>
+        <w:t xml:space="preserve">correctness traps above are exactly the kind of thing a real test with hand-crafted fixtures can</w:t>
+      </w:r>
+      <w:r>
+        <w:t xml:space="preserve"> </w:t>
+      </w:r>
+      <w:r>
+        <w:t xml:space="preserve">pin down.</w:t>
+      </w:r>
+    </w:p>
+    <w:p>
+      <w:pPr>
+        <w:pStyle w:val="BodyText"/>
+      </w:pPr>
+      <w:r>
+        <w:t xml:space="preserve">The user also revised the tool’s default behavior mid-design: the default now writes the</w:t>
+      </w:r>
+      <w:r>
+        <w:t xml:space="preserve"> </w:t>
+      </w:r>
+      <w:r>
+        <w:rPr>
+          <w:rStyle w:val="VerbatimChar"/>
+        </w:rPr>
+        <w:t xml:space="preserve">-gpu</w:t>
+      </w:r>
+      <w:r>
+        <w:t xml:space="preserve">/</w:t>
+      </w:r>
+      <w:r>
+        <w:rPr>
+          <w:rStyle w:val="VerbatimChar"/>
+        </w:rPr>
+        <w:t xml:space="preserve">-mpi</w:t>
+      </w:r>
+      <w:r>
+        <w:t xml:space="preserve">/</w:t>
+      </w:r>
+      <w:r>
+        <w:rPr>
+          <w:rStyle w:val="VerbatimChar"/>
+        </w:rPr>
+        <w:t xml:space="preserve">-other</w:t>
+      </w:r>
+      <w:r>
+        <w:t xml:space="preserve"> </w:t>
+      </w:r>
+      <w:r>
+        <w:t xml:space="preserve">partitioned trio (not the single unfiltered file), once research showed the</w:t>
+      </w:r>
+      <w:r>
+        <w:t xml:space="preserve"> </w:t>
+      </w:r>
+      <w:r>
+        <w:t xml:space="preserve">real unfiltered file lacks</w:t>
+      </w:r>
+      <w:r>
+        <w:t xml:space="preserve"> </w:t>
+      </w:r>
+      <w:r>
+        <w:rPr>
+          <w:rStyle w:val="VerbatimChar"/>
+        </w:rPr>
+        <w:t xml:space="preserve">corr_id</w:t>
+      </w:r>
+      <w:r>
+        <w:t xml:space="preserve"> </w:t>
+      </w:r>
+      <w:r>
+        <w:t xml:space="preserve">and every GPU-arg column entirely – exactly the gap</w:t>
+      </w:r>
+      <w:r>
+        <w:t xml:space="preserve"> </w:t>
+      </w:r>
+      <w:r>
+        <w:rPr>
+          <w:rStyle w:val="VerbatimChar"/>
+        </w:rPr>
+        <w:t xml:space="preserve">discover_ranks()</w:t>
+      </w:r>
+      <w:r>
+        <w:t xml:space="preserve"> </w:t>
+      </w:r>
+      <w:r>
+        <w:t xml:space="preserve">already had to work around for the hand-converted real data (see plan 3.7’s own</w:t>
+      </w:r>
+      <w:r>
+        <w:t xml:space="preserve"> </w:t>
+      </w:r>
+      <w:r>
+        <w:t xml:space="preserve">entry above). The plain unfiltered file stays available as an opt-in</w:t>
+      </w:r>
+      <w:r>
+        <w:t xml:space="preserve"> </w:t>
+      </w:r>
+      <w:r>
+        <w:rPr>
+          <w:rStyle w:val="VerbatimChar"/>
+        </w:rPr>
+        <w:t xml:space="preserve">--unfiltered</w:t>
+      </w:r>
+      <w:r>
+        <w:t xml:space="preserve"> </w:t>
+      </w:r>
+      <w:r>
+        <w:t xml:space="preserve">extra.</w:t>
+      </w:r>
+    </w:p>
+    <w:p>
+      <w:pPr>
+        <w:pStyle w:val="BodyText"/>
+      </w:pPr>
+      <w:r>
+        <w:t xml:space="preserve">Verification: 20 new tests in</w:t>
+      </w:r>
+      <w:r>
+        <w:t xml:space="preserve"> </w:t>
+      </w:r>
+      <w:r>
+        <w:rPr>
+          <w:rStyle w:val="VerbatimChar"/>
+        </w:rPr>
+        <w:t xml:space="preserve">test_convert_trace_to_csv.py</w:t>
+      </w:r>
+      <w:r>
+        <w:t xml:space="preserve">, everything hung off mocking the one</w:t>
+      </w:r>
+      <w:r>
+        <w:t xml:space="preserve"> </w:t>
+      </w:r>
+      <w:r>
+        <w:rPr>
+          <w:rStyle w:val="VerbatimChar"/>
+        </w:rPr>
+        <w:t xml:space="preserve">_run_trace_processor()</w:t>
+      </w:r>
+      <w:r>
+        <w:t xml:space="preserve"> </w:t>
+      </w:r>
+      <w:r>
+        <w:t xml:space="preserve">subprocess call with hand-crafted, exact-format canned</w:t>
+      </w:r>
+      <w:r>
+        <w:t xml:space="preserve"> </w:t>
+      </w:r>
+      <w:r>
+        <w:rPr>
+          <w:rStyle w:val="VerbatimChar"/>
+        </w:rPr>
+        <w:t xml:space="preserve">trace_processor_shell</w:t>
+      </w:r>
+      <w:r>
+        <w:t xml:space="preserve"> </w:t>
+      </w:r>
+      <w:r>
+        <w:t xml:space="preserve">stdout (no real</w:t>
+      </w:r>
+      <w:r>
+        <w:t xml:space="preserve"> </w:t>
+      </w:r>
+      <w:r>
+        <w:rPr>
+          <w:rStyle w:val="VerbatimChar"/>
+        </w:rPr>
+        <w:t xml:space="preserve">.proto</w:t>
+      </w:r>
+      <w:r>
+        <w:t xml:space="preserve"> </w:t>
+      </w:r>
+      <w:r>
+        <w:t xml:space="preserve">file or</w:t>
+      </w:r>
+      <w:r>
+        <w:t xml:space="preserve"> </w:t>
+      </w:r>
+      <w:r>
+        <w:rPr>
+          <w:rStyle w:val="VerbatimChar"/>
+        </w:rPr>
+        <w:t xml:space="preserve">trace_processor_shell</w:t>
+      </w:r>
+      <w:r>
+        <w:t xml:space="preserve"> </w:t>
+      </w:r>
+      <w:r>
+        <w:t xml:space="preserve">binary is</w:t>
+      </w:r>
+      <w:r>
+        <w:t xml:space="preserve"> </w:t>
+      </w:r>
+      <w:r>
+        <w:t xml:space="preserve">obtainable in this dev sandbox – confirmed directly: even downloading the tool’s own native binary</w:t>
+      </w:r>
+      <w:r>
+        <w:t xml:space="preserve"> </w:t>
+      </w:r>
+      <w:r>
+        <w:t xml:space="preserve">is blocked by this session’s sandboxing).</w:t>
+      </w:r>
+      <w:r>
+        <w:t xml:space="preserve"> </w:t>
+      </w:r>
+      <w:r>
+        <w:rPr>
+          <w:rStyle w:val="VerbatimChar"/>
+        </w:rPr>
+        <w:t xml:space="preserve">write_unfiltered_csv()</w:t>
+      </w:r>
+      <w:r>
+        <w:t xml:space="preserve">‘</w:t>
+      </w:r>
+      <w:r>
+        <w:t xml:space="preserve">s output is round-tripped</w:t>
+      </w:r>
+      <w:r>
+        <w:t xml:space="preserve"> </w:t>
+      </w:r>
+      <w:r>
+        <w:t xml:space="preserve">through the real</w:t>
+      </w:r>
+      <w:r>
+        <w:t xml:space="preserve"> </w:t>
+      </w:r>
+      <w:r>
+        <w:rPr>
+          <w:rStyle w:val="VerbatimChar"/>
+        </w:rPr>
+        <w:t xml:space="preserve">stage1_rocprofsys_trace.parse_trace_csv()</w:t>
+      </w:r>
+      <w:r>
+        <w:t xml:space="preserve"> </w:t>
+      </w:r>
+      <w:r>
+        <w:t xml:space="preserve">as an integration check, and every</w:t>
+      </w:r>
+      <w:r>
+        <w:t xml:space="preserve"> </w:t>
+      </w:r>
+      <w:r>
+        <w:t xml:space="preserve">output filename is asserted against</w:t>
+      </w:r>
+      <w:r>
+        <w:t xml:space="preserve"> </w:t>
+      </w:r>
+      <w:r>
+        <w:rPr>
+          <w:rStyle w:val="VerbatimChar"/>
+        </w:rPr>
+        <w:t xml:space="preserve">stage4_rocprofsys_trace_ranks._RANK_FILE_RE</w:t>
+      </w:r>
+      <w:r>
+        <w:t xml:space="preserve"> </w:t>
+      </w:r>
+      <w:r>
+        <w:t xml:space="preserve">directly so the</w:t>
+      </w:r>
+      <w:r>
+        <w:t xml:space="preserve"> </w:t>
+      </w:r>
+      <w:r>
+        <w:t xml:space="preserve">two tools</w:t>
+      </w:r>
+      <w:r>
+        <w:t xml:space="preserve">’</w:t>
+      </w:r>
+      <w:r>
+        <w:t xml:space="preserve"> </w:t>
+      </w:r>
+      <w:r>
+        <w:t xml:space="preserve">naming conventions can never silently drift apart. Full suite 622 → 642 passing. Both</w:t>
+      </w:r>
+      <w:r>
+        <w:t xml:space="preserve"> </w:t>
+      </w:r>
+      <w:r>
+        <w:t xml:space="preserve">READMEs and the three</w:t>
+      </w:r>
+      <w:r>
+        <w:t xml:space="preserve"> </w:t>
+      </w:r>
+      <w:r>
+        <w:rPr>
+          <w:rStyle w:val="VerbatimChar"/>
+        </w:rPr>
+        <w:t xml:space="preserve">extract_trace_*.py</w:t>
+      </w:r>
+      <w:r>
+        <w:t xml:space="preserve"> </w:t>
+      </w:r>
+      <w:r>
+        <w:t xml:space="preserve">tools’ docstrings updated to name this tool as the</w:t>
+      </w:r>
+      <w:r>
+        <w:t xml:space="preserve"> </w:t>
+      </w:r>
+      <w:r>
+        <w:t xml:space="preserve">conversion step, replacing the</w:t>
+      </w:r>
+      <w:r>
+        <w:t xml:space="preserve"> </w:t>
+      </w:r>
+      <w:r>
+        <w:t xml:space="preserve">“</w:t>
+      </w:r>
+      <w:r>
+        <w:t xml:space="preserve">out of scope</w:t>
+      </w:r>
+      <w:r>
+        <w:t xml:space="preserve">”</w:t>
+      </w:r>
+      <w:r>
+        <w:t xml:space="preserve"> </w:t>
+      </w:r>
+      <w:r>
+        <w:t xml:space="preserve">language that’s now stale. See</w:t>
+      </w:r>
+      <w:r>
+        <w:t xml:space="preserve"> </w:t>
+      </w:r>
+      <w:r>
+        <w:rPr>
+          <w:rStyle w:val="VerbatimChar"/>
+        </w:rPr>
+        <w:t xml:space="preserve">docs/plans/3.10-proto-to-csv-converter.md</w:t>
+      </w:r>
+      <w:r>
+        <w:t xml:space="preserve"> </w:t>
+      </w:r>
+      <w:r>
+        <w:t xml:space="preserve">for the full accounting.</w:t>
+      </w:r>
+    </w:p>
     <w:bookmarkEnd w:id="90"/>
+    <w:bookmarkEnd w:id="91"/>
     <w:sectPr/>
   </w:body>
 </w:document>
@@ -58835,6 +59940,36 @@
     <w:abstractNumId w:val="991"/>
   </w:num>
   <w:num w:numId="1017">
+    <w:abstractNumId w:val="99411"/>
+    <w:lvlOverride w:ilvl="0">
+      <w:startOverride w:val="1"/>
+    </w:lvlOverride>
+    <w:lvlOverride w:ilvl="1">
+      <w:startOverride w:val="1"/>
+    </w:lvlOverride>
+    <w:lvlOverride w:ilvl="2">
+      <w:startOverride w:val="1"/>
+    </w:lvlOverride>
+    <w:lvlOverride w:ilvl="3">
+      <w:startOverride w:val="1"/>
+    </w:lvlOverride>
+    <w:lvlOverride w:ilvl="4">
+      <w:startOverride w:val="1"/>
+    </w:lvlOverride>
+    <w:lvlOverride w:ilvl="5">
+      <w:startOverride w:val="1"/>
+    </w:lvlOverride>
+    <w:lvlOverride w:ilvl="6">
+      <w:startOverride w:val="1"/>
+    </w:lvlOverride>
+    <w:lvlOverride w:ilvl="7">
+      <w:startOverride w:val="1"/>
+    </w:lvlOverride>
+    <w:lvlOverride w:ilvl="8">
+      <w:startOverride w:val="1"/>
+    </w:lvlOverride>
+  </w:num>
+  <w:num w:numId="1018">
     <w:abstractNumId w:val="99411"/>
     <w:lvlOverride w:ilvl="0">
       <w:startOverride w:val="1"/>

</xml_diff>

<commit_message>
Plan 3.11: profile_traced_hotspots.sh chaining trace -> CSV -> reports
Adds scripts/profile_traced_hotspots.sh, running instrument_hotspots.sh
trace, then convert_trace_to_csv.py, then extract_trace_hotspots.py/
extract_trace_calltree.py in one invocation. Splits instrumentation-
selection flags (--instrument-top/--instrument-threshold/--instrument-all/
--instrument-unfiltered) from final-report-selection flags (bare --top/
--threshold/--all/--unfiltered), which happened to collide in meaning
between instrument_hotspots.sh and extract_trace_hotspots.py. Adds
--trace-report DIR to resume straight from an existing trace directory,
skipping conversion when CSVs are already present.

Also fixes instrument_hotspots.sh: the instrumented binary is now copied
(with its .rocprof-sys-info sidecar) into the script's own output
directory instead of only being left next to the original executable.

Co-Authored-By: Claude Sonnet 5 <noreply@anthropic.com>
</commit_message>
<xml_diff>
--- a/docs/DEVELOPMENT_HISTORY.docx
+++ b/docs/DEVELOPMENT_HISTORY.docx
@@ -10,7 +10,7 @@
         <w:t xml:space="preserve">Development History</w:t>
       </w:r>
     </w:p>
-    <w:bookmarkStart w:id="91" w:name="development-history"/>
+    <w:bookmarkStart w:id="92" w:name="development-history"/>
     <w:p>
       <w:pPr>
         <w:pStyle w:val="Heading1"/>
@@ -4587,6 +4587,128 @@
           </w:p>
         </w:tc>
       </w:tr>
+      <w:tr>
+        <w:tc>
+          <w:tcPr/>
+          <w:p>
+            <w:pPr>
+              <w:pStyle w:val="Compact"/>
+              <w:jc w:val="left"/>
+            </w:pPr>
+            <w:r>
+              <w:t xml:space="preserve">2026-08-21</w:t>
+            </w:r>
+          </w:p>
+        </w:tc>
+        <w:tc>
+          <w:tcPr/>
+          <w:p>
+            <w:pPr>
+              <w:pStyle w:val="Compact"/>
+              <w:jc w:val="left"/>
+            </w:pPr>
+            <w:r>
+              <w:t xml:space="preserve">Plan 3.11: new</w:t>
+            </w:r>
+            <w:r>
+              <w:t xml:space="preserve"> </w:t>
+            </w:r>
+            <w:r>
+              <w:rPr>
+                <w:rStyle w:val="VerbatimChar"/>
+              </w:rPr>
+              <w:t xml:space="preserve">scripts/profile_traced_hotspots.sh</w:t>
+            </w:r>
+            <w:r>
+              <w:t xml:space="preserve"> </w:t>
+            </w:r>
+            <w:r>
+              <w:t xml:space="preserve">chains</w:t>
+            </w:r>
+            <w:r>
+              <w:t xml:space="preserve"> </w:t>
+            </w:r>
+            <w:r>
+              <w:rPr>
+                <w:rStyle w:val="VerbatimChar"/>
+              </w:rPr>
+              <w:t xml:space="preserve">instrument_hotspots.sh trace</w:t>
+            </w:r>
+            <w:r>
+              <w:t xml:space="preserve"> </w:t>
+            </w:r>
+            <w:r>
+              <w:t xml:space="preserve">-&gt;</w:t>
+            </w:r>
+            <w:r>
+              <w:t xml:space="preserve"> </w:t>
+            </w:r>
+            <w:r>
+              <w:rPr>
+                <w:rStyle w:val="VerbatimChar"/>
+              </w:rPr>
+              <w:t xml:space="preserve">convert_trace_to_csv.py</w:t>
+            </w:r>
+            <w:r>
+              <w:t xml:space="preserve"> </w:t>
+            </w:r>
+            <w:r>
+              <w:t xml:space="preserve">-&gt;</w:t>
+            </w:r>
+            <w:r>
+              <w:t xml:space="preserve"> </w:t>
+            </w:r>
+            <w:r>
+              <w:rPr>
+                <w:rStyle w:val="VerbatimChar"/>
+              </w:rPr>
+              <w:t xml:space="preserve">extract_trace_hotspots.py</w:t>
+            </w:r>
+            <w:r>
+              <w:t xml:space="preserve">/</w:t>
+            </w:r>
+            <w:r>
+              <w:rPr>
+                <w:rStyle w:val="VerbatimChar"/>
+              </w:rPr>
+              <w:t xml:space="preserve">extract_trace_calltree.py</w:t>
+            </w:r>
+            <w:r>
+              <w:t xml:space="preserve"> </w:t>
+            </w:r>
+            <w:r>
+              <w:t xml:space="preserve">into one invocation, resolving a real flag-namespace collision between instrumentation-selection and final-report-selection flags by splitting them into bare vs</w:t>
+            </w:r>
+            <w:r>
+              <w:t xml:space="preserve"> </w:t>
+            </w:r>
+            <w:r>
+              <w:rPr>
+                <w:rStyle w:val="VerbatimChar"/>
+              </w:rPr>
+              <w:t xml:space="preserve">--instrument-*</w:t>
+            </w:r>
+            <w:r>
+              <w:t xml:space="preserve">-prefixed sets; also fixes a real</w:t>
+            </w:r>
+            <w:r>
+              <w:t xml:space="preserve"> </w:t>
+            </w:r>
+            <w:r>
+              <w:rPr>
+                <w:rStyle w:val="VerbatimChar"/>
+              </w:rPr>
+              <w:t xml:space="preserve">instrument_hotspots.sh</w:t>
+            </w:r>
+            <w:r>
+              <w:t xml:space="preserve"> </w:t>
+            </w:r>
+            <w:r>
+              <w:t xml:space="preserve">bug (the instrumented binary was never copied into the script’s own output directory) – see full accounting below</w:t>
+            </w:r>
+          </w:p>
+        </w:tc>
+      </w:tr>
     </w:tbl>
     <w:bookmarkStart w:id="20" w:name="project-scaffolding-and-rules"/>
     <w:p>
@@ -59238,7 +59360,690 @@
       </w:r>
     </w:p>
     <w:bookmarkEnd w:id="90"/>
+    <w:bookmarkStart w:id="91" w:name="X3027e76ab89c4fb407c5fec610dc9c3dc4b6f3f"/>
+    <w:p>
+      <w:pPr>
+        <w:pStyle w:val="Heading2"/>
+      </w:pPr>
+      <w:r>
+        <w:t xml:space="preserve">2026-08-21 — Plan 3.11:</w:t>
+      </w:r>
+      <w:r>
+        <w:t xml:space="preserve"> </w:t>
+      </w:r>
+      <w:r>
+        <w:rPr>
+          <w:rStyle w:val="VerbatimChar"/>
+        </w:rPr>
+        <w:t xml:space="preserve">profile_traced_hotspots.sh</w:t>
+      </w:r>
+      <w:r>
+        <w:t xml:space="preserve"> </w:t>
+      </w:r>
+      <w:r>
+        <w:t xml:space="preserve">+ an</w:t>
+      </w:r>
+      <w:r>
+        <w:t xml:space="preserve"> </w:t>
+      </w:r>
+      <w:r>
+        <w:rPr>
+          <w:rStyle w:val="VerbatimChar"/>
+        </w:rPr>
+        <w:t xml:space="preserve">instrument_hotspots.sh</w:t>
+      </w:r>
+      <w:r>
+        <w:t xml:space="preserve"> </w:t>
+      </w:r>
+      <w:r>
+        <w:t xml:space="preserve">bug fix</w:t>
+      </w:r>
+    </w:p>
+    <w:p>
+      <w:pPr>
+        <w:pStyle w:val="FirstParagraph"/>
+      </w:pPr>
+      <w:r>
+        <w:t xml:space="preserve">New</w:t>
+      </w:r>
+      <w:r>
+        <w:t xml:space="preserve"> </w:t>
+      </w:r>
+      <w:r>
+        <w:rPr>
+          <w:rStyle w:val="VerbatimChar"/>
+        </w:rPr>
+        <w:t xml:space="preserve">scripts/profile_traced_hotspots.sh</w:t>
+      </w:r>
+      <w:r>
+        <w:t xml:space="preserve"> </w:t>
+      </w:r>
+      <w:r>
+        <w:t xml:space="preserve">chains everything plans 3.7-3.10 built: it runs</w:t>
+      </w:r>
+      <w:r>
+        <w:t xml:space="preserve"> </w:t>
+      </w:r>
+      <w:r>
+        <w:rPr>
+          <w:rStyle w:val="VerbatimChar"/>
+        </w:rPr>
+        <w:t xml:space="preserve">instrument_hotspots.sh trace</w:t>
+      </w:r>
+      <w:r>
+        <w:t xml:space="preserve"> </w:t>
+      </w:r>
+      <w:r>
+        <w:t xml:space="preserve">(unchanged, still the right tool for someone who only wants the raw</w:t>
+      </w:r>
+      <w:r>
+        <w:t xml:space="preserve"> </w:t>
+      </w:r>
+      <w:r>
+        <w:t xml:space="preserve">trace), then</w:t>
+      </w:r>
+      <w:r>
+        <w:t xml:space="preserve"> </w:t>
+      </w:r>
+      <w:r>
+        <w:rPr>
+          <w:rStyle w:val="VerbatimChar"/>
+        </w:rPr>
+        <w:t xml:space="preserve">convert_trace_to_csv.py</w:t>
+      </w:r>
+      <w:r>
+        <w:t xml:space="preserve">, then</w:t>
+      </w:r>
+      <w:r>
+        <w:t xml:space="preserve"> </w:t>
+      </w:r>
+      <w:r>
+        <w:rPr>
+          <w:rStyle w:val="VerbatimChar"/>
+        </w:rPr>
+        <w:t xml:space="preserve">extract_trace_hotspots.py</w:t>
+      </w:r>
+      <w:r>
+        <w:t xml:space="preserve">/</w:t>
+      </w:r>
+      <w:r>
+        <w:rPr>
+          <w:rStyle w:val="VerbatimChar"/>
+        </w:rPr>
+        <w:t xml:space="preserve">extract_trace_calltree.py</w:t>
+      </w:r>
+      <w:r>
+        <w:t xml:space="preserve"> </w:t>
+      </w:r>
+      <w:r>
+        <w:t xml:space="preserve">– one invocation instead of four. Designing its CLI surfaced a real flag-namespace collision:</w:t>
+      </w:r>
+      <w:r>
+        <w:t xml:space="preserve"> </w:t>
+      </w:r>
+      <w:r>
+        <w:rPr>
+          <w:rStyle w:val="VerbatimChar"/>
+        </w:rPr>
+        <w:t xml:space="preserve">instrument_hotspots.sh</w:t>
+      </w:r>
+      <w:r>
+        <w:t xml:space="preserve">’s own</w:t>
+      </w:r>
+      <w:r>
+        <w:t xml:space="preserve"> </w:t>
+      </w:r>
+      <w:r>
+        <w:rPr>
+          <w:rStyle w:val="VerbatimChar"/>
+        </w:rPr>
+        <w:t xml:space="preserve">--top</w:t>
+      </w:r>
+      <w:r>
+        <w:t xml:space="preserve">/</w:t>
+      </w:r>
+      <w:r>
+        <w:rPr>
+          <w:rStyle w:val="VerbatimChar"/>
+        </w:rPr>
+        <w:t xml:space="preserve">--threshold</w:t>
+      </w:r>
+      <w:r>
+        <w:t xml:space="preserve">/</w:t>
+      </w:r>
+      <w:r>
+        <w:rPr>
+          <w:rStyle w:val="VerbatimChar"/>
+        </w:rPr>
+        <w:t xml:space="preserve">--all</w:t>
+      </w:r>
+      <w:r>
+        <w:t xml:space="preserve">/</w:t>
+      </w:r>
+      <w:r>
+        <w:rPr>
+          <w:rStyle w:val="VerbatimChar"/>
+        </w:rPr>
+        <w:t xml:space="preserve">--unfiltered</w:t>
+      </w:r>
+      <w:r>
+        <w:t xml:space="preserve"> </w:t>
+      </w:r>
+      <w:r>
+        <w:t xml:space="preserve">select which functions</w:t>
+      </w:r>
+      <w:r>
+        <w:t xml:space="preserve"> </w:t>
+      </w:r>
+      <w:r>
+        <w:t xml:space="preserve">get</w:t>
+      </w:r>
+      <w:r>
+        <w:t xml:space="preserve"> </w:t>
+      </w:r>
+      <w:r>
+        <w:rPr>
+          <w:iCs/>
+          <w:i/>
+        </w:rPr>
+        <w:t xml:space="preserve">instrumented</w:t>
+      </w:r>
+      <w:r>
+        <w:t xml:space="preserve">, while</w:t>
+      </w:r>
+      <w:r>
+        <w:t xml:space="preserve"> </w:t>
+      </w:r>
+      <w:r>
+        <w:rPr>
+          <w:rStyle w:val="VerbatimChar"/>
+        </w:rPr>
+        <w:t xml:space="preserve">extract_trace_hotspots.py</w:t>
+      </w:r>
+      <w:r>
+        <w:t xml:space="preserve">’s flags of the same names select what</w:t>
+      </w:r>
+      <w:r>
+        <w:t xml:space="preserve"> </w:t>
+      </w:r>
+      <w:r>
+        <w:t xml:space="preserve">appears in the</w:t>
+      </w:r>
+      <w:r>
+        <w:t xml:space="preserve"> </w:t>
+      </w:r>
+      <w:r>
+        <w:rPr>
+          <w:iCs/>
+          <w:i/>
+        </w:rPr>
+        <w:t xml:space="preserve">final report</w:t>
+      </w:r>
+      <w:r>
+        <w:t xml:space="preserve"> </w:t>
+      </w:r>
+      <w:r>
+        <w:t xml:space="preserve">– two independent concerns sharing names. Resolved (per the user’s</w:t>
+      </w:r>
+      <w:r>
+        <w:t xml:space="preserve"> </w:t>
+      </w:r>
+      <w:r>
+        <w:t xml:space="preserve">own direction) by making the bare flags control the final report (the more common thing to want to</w:t>
+      </w:r>
+      <w:r>
+        <w:t xml:space="preserve"> </w:t>
+      </w:r>
+      <w:r>
+        <w:t xml:space="preserve">adjust) and adding a parallel</w:t>
+      </w:r>
+      <w:r>
+        <w:t xml:space="preserve"> </w:t>
+      </w:r>
+      <w:r>
+        <w:rPr>
+          <w:rStyle w:val="VerbatimChar"/>
+        </w:rPr>
+        <w:t xml:space="preserve">--instrument-*</w:t>
+      </w:r>
+      <w:r>
+        <w:t xml:space="preserve">-prefixed set for the rarer case of wanting</w:t>
+      </w:r>
+      <w:r>
+        <w:t xml:space="preserve"> </w:t>
+      </w:r>
+      <w:r>
+        <w:t xml:space="preserve">instrumentation selection to diverge from it. A second new flag,</w:t>
+      </w:r>
+      <w:r>
+        <w:t xml:space="preserve"> </w:t>
+      </w:r>
+      <w:r>
+        <w:rPr>
+          <w:rStyle w:val="VerbatimChar"/>
+        </w:rPr>
+        <w:t xml:space="preserve">--trace-report DIR</w:t>
+      </w:r>
+      <w:r>
+        <w:t xml:space="preserve">, skips the</w:t>
+      </w:r>
+      <w:r>
+        <w:t xml:space="preserve"> </w:t>
+      </w:r>
+      <w:r>
+        <w:t xml:space="preserve">sample/instrument/trace steps entirely and resumes from an existing trace directory, checking for</w:t>
+      </w:r>
+      <w:r>
+        <w:t xml:space="preserve"> </w:t>
+      </w:r>
+      <w:r>
+        <w:t xml:space="preserve">already-converted CSV files first so a repeat report-only run never redoes the conversion.</w:t>
+      </w:r>
+    </w:p>
+    <w:p>
+      <w:pPr>
+        <w:pStyle w:val="BodyText"/>
+      </w:pPr>
+      <w:r>
+        <w:t xml:space="preserve">Also fixed a real bug in</w:t>
+      </w:r>
+      <w:r>
+        <w:t xml:space="preserve"> </w:t>
+      </w:r>
+      <w:r>
+        <w:rPr>
+          <w:rStyle w:val="VerbatimChar"/>
+        </w:rPr>
+        <w:t xml:space="preserve">instrument_hotspots.sh</w:t>
+      </w:r>
+      <w:r>
+        <w:t xml:space="preserve"> </w:t>
+      </w:r>
+      <w:r>
+        <w:t xml:space="preserve">(found by the user, not deferred): the</w:t>
+      </w:r>
+      <w:r>
+        <w:t xml:space="preserve"> </w:t>
+      </w:r>
+      <w:r>
+        <w:t xml:space="preserve">instrumented binary it builds was left only next to the original executable</w:t>
+      </w:r>
+      <w:r>
+        <w:t xml:space="preserve"> </w:t>
+      </w:r>
+      <w:r>
+        <w:t xml:space="preserve">(</w:t>
+      </w:r>
+      <w:r>
+        <w:rPr>
+          <w:rStyle w:val="VerbatimChar"/>
+        </w:rPr>
+        <w:t xml:space="preserve">&lt;executable&gt;.inst</w:t>
+      </w:r>
+      <w:r>
+        <w:t xml:space="preserve">), never copied into the script’s own output directory – confirmed directly</w:t>
+      </w:r>
+      <w:r>
+        <w:t xml:space="preserve"> </w:t>
+      </w:r>
+      <w:r>
+        <w:t xml:space="preserve">by reading the script (</w:t>
+      </w:r>
+      <w:r>
+        <w:rPr>
+          <w:rStyle w:val="VerbatimChar"/>
+        </w:rPr>
+        <w:t xml:space="preserve">OUT_BINARY</w:t>
+      </w:r>
+      <w:r>
+        <w:t xml:space="preserve"> </w:t>
+      </w:r>
+      <w:r>
+        <w:t xml:space="preserve">defaulting to</w:t>
+      </w:r>
+      <w:r>
+        <w:t xml:space="preserve"> </w:t>
+      </w:r>
+      <w:r>
+        <w:rPr>
+          <w:rStyle w:val="VerbatimChar"/>
+        </w:rPr>
+        <w:t xml:space="preserve">"$BINARY.inst"</w:t>
+      </w:r>
+      <w:r>
+        <w:t xml:space="preserve">, nothing after the rewrite</w:t>
+      </w:r>
+      <w:r>
+        <w:t xml:space="preserve"> </w:t>
+      </w:r>
+      <w:r>
+        <w:t xml:space="preserve">copying it anywhere else). Now copied (with its</w:t>
+      </w:r>
+      <w:r>
+        <w:t xml:space="preserve"> </w:t>
+      </w:r>
+      <w:r>
+        <w:rPr>
+          <w:rStyle w:val="VerbatimChar"/>
+        </w:rPr>
+        <w:t xml:space="preserve">.rocprof-sys-info</w:t>
+      </w:r>
+      <w:r>
+        <w:t xml:space="preserve"> </w:t>
+      </w:r>
+      <w:r>
+        <w:t xml:space="preserve">sidecar) into</w:t>
+      </w:r>
+      <w:r>
+        <w:t xml:space="preserve"> </w:t>
+      </w:r>
+      <w:r>
+        <w:rPr>
+          <w:rStyle w:val="VerbatimChar"/>
+        </w:rPr>
+        <w:t xml:space="preserve">$OUTPUT_DIR</w:t>
+      </w:r>
+      <w:r>
+        <w:t xml:space="preserve"> </w:t>
+      </w:r>
+      <w:r>
+        <w:t xml:space="preserve">right after the rewrite succeeds, in both</w:t>
+      </w:r>
+      <w:r>
+        <w:t xml:space="preserve"> </w:t>
+      </w:r>
+      <w:r>
+        <w:rPr>
+          <w:rStyle w:val="VerbatimChar"/>
+        </w:rPr>
+        <w:t xml:space="preserve">instrument</w:t>
+      </w:r>
+      <w:r>
+        <w:t xml:space="preserve"> </w:t>
+      </w:r>
+      <w:r>
+        <w:t xml:space="preserve">and</w:t>
+      </w:r>
+      <w:r>
+        <w:t xml:space="preserve"> </w:t>
+      </w:r>
+      <w:r>
+        <w:rPr>
+          <w:rStyle w:val="VerbatimChar"/>
+        </w:rPr>
+        <w:t xml:space="preserve">trace</w:t>
+      </w:r>
+      <w:r>
+        <w:t xml:space="preserve"> </w:t>
+      </w:r>
+      <w:r>
+        <w:t xml:space="preserve">modes.</w:t>
+      </w:r>
+    </w:p>
+    <w:p>
+      <w:pPr>
+        <w:pStyle w:val="BodyText"/>
+      </w:pPr>
+      <w:r>
+        <w:t xml:space="preserve">Deferred, not part of this plan (the user’s own words,</w:t>
+      </w:r>
+      <w:r>
+        <w:t xml:space="preserve"> </w:t>
+      </w:r>
+      <w:r>
+        <w:t xml:space="preserve">“</w:t>
+      </w:r>
+      <w:r>
+        <w:t xml:space="preserve">probably deserves a dedicated plan</w:t>
+      </w:r>
+      <w:r>
+        <w:t xml:space="preserve">”</w:t>
+      </w:r>
+      <w:r>
+        <w:t xml:space="preserve">): CPU</w:t>
+      </w:r>
+      <w:r>
+        <w:t xml:space="preserve"> </w:t>
+      </w:r>
+      <w:r>
+        <w:t xml:space="preserve">(and possibly MPI) callers of a GPU kernel that made it into the hotspot table need to be</w:t>
+      </w:r>
+      <w:r>
+        <w:t xml:space="preserve"> </w:t>
+      </w:r>
+      <w:r>
+        <w:t xml:space="preserve">instrumented too, regardless of their own hotspot status – directly related to plan 3.8’s</w:t>
+      </w:r>
+      <w:r>
+        <w:t xml:space="preserve"> </w:t>
+      </w:r>
+      <w:r>
+        <w:t xml:space="preserve">kernel-owner-reanchoring work, since a kernel’s real CPU caller has to exist as an actual</w:t>
+      </w:r>
+      <w:r>
+        <w:t xml:space="preserve"> </w:t>
+      </w:r>
+      <w:r>
+        <w:t xml:space="preserve">instrumented frame for that mechanism to have anything to attach to. Noted as a forward pointer for</w:t>
+      </w:r>
+      <w:r>
+        <w:t xml:space="preserve"> </w:t>
+      </w:r>
+      <w:r>
+        <w:t xml:space="preserve">a future plan, not designed here.</w:t>
+      </w:r>
+    </w:p>
+    <w:p>
+      <w:pPr>
+        <w:pStyle w:val="BodyText"/>
+      </w:pPr>
+      <w:r>
+        <w:t xml:space="preserve">Verification: no real ROCm/Perfetto tooling is available in this dev sandbox (standing project</w:t>
+      </w:r>
+      <w:r>
+        <w:t xml:space="preserve"> </w:t>
+      </w:r>
+      <w:r>
+        <w:t xml:space="preserve">constraint), so verification here is</w:t>
+      </w:r>
+      <w:r>
+        <w:t xml:space="preserve"> </w:t>
+      </w:r>
+      <w:r>
+        <w:rPr>
+          <w:rStyle w:val="VerbatimChar"/>
+        </w:rPr>
+        <w:t xml:space="preserve">bash -n</w:t>
+      </w:r>
+      <w:r>
+        <w:t xml:space="preserve"> </w:t>
+      </w:r>
+      <w:r>
+        <w:t xml:space="preserve">on both scripts, and extensive manual</w:t>
+      </w:r>
+      <w:r>
+        <w:t xml:space="preserve"> </w:t>
+      </w:r>
+      <w:r>
+        <w:rPr>
+          <w:rStyle w:val="VerbatimChar"/>
+        </w:rPr>
+        <w:t xml:space="preserve">--dry-run</w:t>
+      </w:r>
+      <w:r>
+        <w:t xml:space="preserve"> </w:t>
+      </w:r>
+      <w:r>
+        <w:t xml:space="preserve">testing against a placeholder executable and fake</w:t>
+      </w:r>
+      <w:r>
+        <w:t xml:space="preserve"> </w:t>
+      </w:r>
+      <w:r>
+        <w:rPr>
+          <w:rStyle w:val="VerbatimChar"/>
+        </w:rPr>
+        <w:t xml:space="preserve">rocprof-sys-*</w:t>
+      </w:r>
+      <w:r>
+        <w:t xml:space="preserve"> </w:t>
+      </w:r>
+      <w:r>
+        <w:t xml:space="preserve">stub binaries on</w:t>
+      </w:r>
+      <w:r>
+        <w:t xml:space="preserve"> </w:t>
+      </w:r>
+      <w:r>
+        <w:rPr>
+          <w:rStyle w:val="VerbatimChar"/>
+        </w:rPr>
+        <w:t xml:space="preserve">PATH</w:t>
+      </w:r>
+      <w:r>
+        <w:t xml:space="preserve"> </w:t>
+      </w:r>
+      <w:r>
+        <w:t xml:space="preserve">–</w:t>
+      </w:r>
+      <w:r>
+        <w:t xml:space="preserve"> </w:t>
+      </w:r>
+      <w:r>
+        <w:t xml:space="preserve">this caught a real bug in the new script itself before it shipped: a</w:t>
+      </w:r>
+      <w:r>
+        <w:t xml:space="preserve"> </w:t>
+      </w:r>
+      <w:r>
+        <w:rPr>
+          <w:rStyle w:val="VerbatimChar"/>
+        </w:rPr>
+        <w:t xml:space="preserve">print_args</w:t>
+      </w:r>
+      <w:r>
+        <w:t xml:space="preserve"> </w:t>
+      </w:r>
+      <w:r>
+        <w:t xml:space="preserve">helper meant to</w:t>
+      </w:r>
+      <w:r>
+        <w:t xml:space="preserve"> </w:t>
+      </w:r>
+      <w:r>
+        <w:t xml:space="preserve">guard against</w:t>
+      </w:r>
+      <w:r>
+        <w:t xml:space="preserve"> </w:t>
+      </w:r>
+      <w:r>
+        <w:rPr>
+          <w:rStyle w:val="VerbatimChar"/>
+        </w:rPr>
+        <w:t xml:space="preserve">printf</w:t>
+      </w:r>
+      <w:r>
+        <w:t xml:space="preserve">’s own</w:t>
+      </w:r>
+      <w:r>
+        <w:t xml:space="preserve"> </w:t>
+      </w:r>
+      <w:r>
+        <w:t xml:space="preserve">“</w:t>
+      </w:r>
+      <w:r>
+        <w:t xml:space="preserve">still runs once even with zero arguments</w:t>
+      </w:r>
+      <w:r>
+        <w:t xml:space="preserve">”</w:t>
+      </w:r>
+      <w:r>
+        <w:t xml:space="preserve"> </w:t>
+      </w:r>
+      <w:r>
+        <w:t xml:space="preserve">quirk instead returned</w:t>
+      </w:r>
+      <w:r>
+        <w:t xml:space="preserve"> </w:t>
+      </w:r>
+      <w:r>
+        <w:t xml:space="preserve">non-zero on an empty array, which under this script’s own</w:t>
+      </w:r>
+      <w:r>
+        <w:t xml:space="preserve"> </w:t>
+      </w:r>
+      <w:r>
+        <w:rPr>
+          <w:rStyle w:val="VerbatimChar"/>
+        </w:rPr>
+        <w:t xml:space="preserve">set -e</w:t>
+      </w:r>
+      <w:r>
+        <w:t xml:space="preserve"> </w:t>
+      </w:r>
+      <w:r>
+        <w:t xml:space="preserve">silently killed the whole</w:t>
+      </w:r>
+      <w:r>
+        <w:t xml:space="preserve"> </w:t>
+      </w:r>
+      <w:r>
+        <w:t xml:space="preserve">script partway through a dry-run preview. One real end-to-end run (against an existing trace-CSV</w:t>
+      </w:r>
+      <w:r>
+        <w:t xml:space="preserve"> </w:t>
+      </w:r>
+      <w:r>
+        <w:t xml:space="preserve">test fixture, exercising the true</w:t>
+      </w:r>
+      <w:r>
+        <w:t xml:space="preserve"> </w:t>
+      </w:r>
+      <w:r>
+        <w:rPr>
+          <w:rStyle w:val="VerbatimChar"/>
+        </w:rPr>
+        <w:t xml:space="preserve">extract_trace_hotspots.py</w:t>
+      </w:r>
+      <w:r>
+        <w:t xml:space="preserve">/</w:t>
+      </w:r>
+      <w:r>
+        <w:rPr>
+          <w:rStyle w:val="VerbatimChar"/>
+        </w:rPr>
+        <w:t xml:space="preserve">extract_trace_calltree.py</w:t>
+      </w:r>
+      <w:r>
+        <w:t xml:space="preserve"> </w:t>
+      </w:r>
+      <w:r>
+        <w:t xml:space="preserve">tools for</w:t>
+      </w:r>
+      <w:r>
+        <w:t xml:space="preserve"> </w:t>
+      </w:r>
+      <w:r>
+        <w:t xml:space="preserve">real, not mocked) confirmed the whole chain produces a real, correct report. See</w:t>
+      </w:r>
+      <w:r>
+        <w:t xml:space="preserve"> </w:t>
+      </w:r>
+      <w:r>
+        <w:rPr>
+          <w:rStyle w:val="VerbatimChar"/>
+        </w:rPr>
+        <w:t xml:space="preserve">docs/plans/3.11-profile-traced-hotspots.md</w:t>
+      </w:r>
+      <w:r>
+        <w:t xml:space="preserve"> </w:t>
+      </w:r>
+      <w:r>
+        <w:t xml:space="preserve">for the full accounting.</w:t>
+      </w:r>
+    </w:p>
     <w:bookmarkEnd w:id="91"/>
+    <w:bookmarkEnd w:id="92"/>
     <w:sectPr/>
   </w:body>
 </w:document>

</xml_diff>

<commit_message>
Plan 3.12: ancestor- and GPU-owner-aware instrumentation selection
Rename select_hotspot_functions.py to select_instrumented_functions.py and
widen its selection so a hotspot's real ancestry stays connected in the
resulting trace: new --gpu-output-dir resolves hot GPU kernels into their
real CPU owner (stage4_rocprofsys_common.resolve_kernel_owners()), and
--ancestor-depth (default 1) pulls in each selected function's nearest
real callers (expand_labels_with_ancestors()) -- both built as generic,
reusable stage4/stage5 primitives rather than tool-specific logic. New
stage5_calltree_text_parser.py lets --report mode support the same
ancestor-pulling from a sibling calltree.txt. instrument_hotspots.sh wires
the new --gpu-output-dir through automatically from its own scan step.

Co-Authored-By: Claude Sonnet 5 <noreply@anthropic.com>
</commit_message>
<xml_diff>
--- a/docs/DEVELOPMENT_HISTORY.docx
+++ b/docs/DEVELOPMENT_HISTORY.docx
@@ -10,7 +10,7 @@
         <w:t xml:space="preserve">Development History</w:t>
       </w:r>
     </w:p>
-    <w:bookmarkStart w:id="92" w:name="development-history"/>
+    <w:bookmarkStart w:id="93" w:name="development-history"/>
     <w:p>
       <w:pPr>
         <w:pStyle w:val="Heading1"/>
@@ -4709,6 +4709,149 @@
           </w:p>
         </w:tc>
       </w:tr>
+      <w:tr>
+        <w:tc>
+          <w:tcPr/>
+          <w:p>
+            <w:pPr>
+              <w:pStyle w:val="Compact"/>
+              <w:jc w:val="left"/>
+            </w:pPr>
+            <w:r>
+              <w:t xml:space="preserve">2026-08-21</w:t>
+            </w:r>
+          </w:p>
+        </w:tc>
+        <w:tc>
+          <w:tcPr/>
+          <w:p>
+            <w:pPr>
+              <w:pStyle w:val="Compact"/>
+              <w:jc w:val="left"/>
+            </w:pPr>
+            <w:r>
+              <w:t xml:space="preserve">Plan 3.12:</w:t>
+            </w:r>
+            <w:r>
+              <w:t xml:space="preserve"> </w:t>
+            </w:r>
+            <w:r>
+              <w:rPr>
+                <w:rStyle w:val="VerbatimChar"/>
+              </w:rPr>
+              <w:t xml:space="preserve">select_hotspot_functions.py</w:t>
+            </w:r>
+            <w:r>
+              <w:t xml:space="preserve"> </w:t>
+            </w:r>
+            <w:r>
+              <w:t xml:space="preserve">renamed to</w:t>
+            </w:r>
+            <w:r>
+              <w:t xml:space="preserve"> </w:t>
+            </w:r>
+            <w:r>
+              <w:rPr>
+                <w:rStyle w:val="VerbatimChar"/>
+              </w:rPr>
+              <w:t xml:space="preserve">select_instrumented_functions.py</w:t>
+            </w:r>
+            <w:r>
+              <w:t xml:space="preserve"> </w:t>
+            </w:r>
+            <w:r>
+              <w:t xml:space="preserve">and widened – a selected hotspot’s immediate real caller is now pulled in by default (</w:t>
+            </w:r>
+            <w:r>
+              <w:rPr>
+                <w:rStyle w:val="VerbatimChar"/>
+              </w:rPr>
+              <w:t xml:space="preserve">--ancestor-depth</w:t>
+            </w:r>
+            <w:r>
+              <w:t xml:space="preserve">, via new generic</w:t>
+            </w:r>
+            <w:r>
+              <w:t xml:space="preserve"> </w:t>
+            </w:r>
+            <w:r>
+              <w:rPr>
+                <w:rStyle w:val="VerbatimChar"/>
+              </w:rPr>
+              <w:t xml:space="preserve">stage4_rocprofsys_common.expand_labels_with_ancestors()</w:t>
+            </w:r>
+            <w:r>
+              <w:t xml:space="preserve">), and a new</w:t>
+            </w:r>
+            <w:r>
+              <w:t xml:space="preserve"> </w:t>
+            </w:r>
+            <w:r>
+              <w:rPr>
+                <w:rStyle w:val="VerbatimChar"/>
+              </w:rPr>
+              <w:t xml:space="preserve">--gpu-output-dir</w:t>
+            </w:r>
+            <w:r>
+              <w:t xml:space="preserve"> </w:t>
+            </w:r>
+            <w:r>
+              <w:t xml:space="preserve">resolves hot GPU kernels into their real CPU owner (</w:t>
+            </w:r>
+            <w:r>
+              <w:rPr>
+                <w:rStyle w:val="VerbatimChar"/>
+              </w:rPr>
+              <w:t xml:space="preserve">resolve_kernel_owners()</w:t>
+            </w:r>
+            <w:r>
+              <w:t xml:space="preserve">), fixing GPU kernels/MPI calls losing their real caller’s instrumentation regardless of that caller’s own hotspot status; new</w:t>
+            </w:r>
+            <w:r>
+              <w:t xml:space="preserve"> </w:t>
+            </w:r>
+            <w:r>
+              <w:rPr>
+                <w:rStyle w:val="VerbatimChar"/>
+              </w:rPr>
+              <w:t xml:space="preserve">stage5_calltree_text_parser.py</w:t>
+            </w:r>
+            <w:r>
+              <w:t xml:space="preserve"> </w:t>
+            </w:r>
+            <w:r>
+              <w:t xml:space="preserve">lets</w:t>
+            </w:r>
+            <w:r>
+              <w:t xml:space="preserve"> </w:t>
+            </w:r>
+            <w:r>
+              <w:rPr>
+                <w:rStyle w:val="VerbatimChar"/>
+              </w:rPr>
+              <w:t xml:space="preserve">--report</w:t>
+            </w:r>
+            <w:r>
+              <w:t xml:space="preserve"> </w:t>
+            </w:r>
+            <w:r>
+              <w:t xml:space="preserve">mode support the same ancestor-pulling by reconstructing tree structure from a sibling</w:t>
+            </w:r>
+            <w:r>
+              <w:t xml:space="preserve"> </w:t>
+            </w:r>
+            <w:r>
+              <w:rPr>
+                <w:rStyle w:val="VerbatimChar"/>
+              </w:rPr>
+              <w:t xml:space="preserve">calltree.txt</w:t>
+            </w:r>
+            <w:r>
+              <w:t xml:space="preserve">’s rendered text – see full accounting below</w:t>
+            </w:r>
+          </w:p>
+        </w:tc>
+      </w:tr>
     </w:tbl>
     <w:bookmarkStart w:id="20" w:name="project-scaffolding-and-rules"/>
     <w:p>
@@ -60043,7 +60186,871 @@
       </w:r>
     </w:p>
     <w:bookmarkEnd w:id="91"/>
+    <w:bookmarkStart w:id="92" w:name="Xeea21c9d4a19678f2baad8702403140bbd4fdcc"/>
+    <w:p>
+      <w:pPr>
+        <w:pStyle w:val="Heading2"/>
+      </w:pPr>
+      <w:r>
+        <w:t xml:space="preserve">2026-08-21 — Plan 3.12: ancestor- and GPU-owner-aware instrumentation selection</w:t>
+      </w:r>
+    </w:p>
+    <w:p>
+      <w:pPr>
+        <w:pStyle w:val="FirstParagraph"/>
+      </w:pPr>
+      <w:r>
+        <w:t xml:space="preserve">Closes the gap plan 3.11 deferred: a hotspot’s raw self/inclusive-time selection could leave a GPU</w:t>
+      </w:r>
+      <w:r>
+        <w:t xml:space="preserve"> </w:t>
+      </w:r>
+      <w:r>
+        <w:t xml:space="preserve">kernel’s real CPU owner, or an MPI call’s real caller, uninstrumented even though the kernel/MPI</w:t>
+      </w:r>
+      <w:r>
+        <w:t xml:space="preserve"> </w:t>
+      </w:r>
+      <w:r>
+        <w:t xml:space="preserve">call itself was expensive – leaving it structurally disconnected in the resulting trace (nested</w:t>
+      </w:r>
+      <w:r>
+        <w:t xml:space="preserve"> </w:t>
+      </w:r>
+      <w:r>
+        <w:t xml:space="preserve">under a generic OMPT/launch-site node instead of its real, specific position). Two new generic</w:t>
+      </w:r>
+      <w:r>
+        <w:t xml:space="preserve"> </w:t>
+      </w:r>
+      <w:r>
+        <w:t xml:space="preserve">primitives in</w:t>
+      </w:r>
+      <w:r>
+        <w:t xml:space="preserve"> </w:t>
+      </w:r>
+      <w:r>
+        <w:rPr>
+          <w:rStyle w:val="VerbatimChar"/>
+        </w:rPr>
+        <w:t xml:space="preserve">stage4_rocprofsys_common.py</w:t>
+      </w:r>
+      <w:r>
+        <w:t xml:space="preserve"> </w:t>
+      </w:r>
+      <w:r>
+        <w:t xml:space="preserve">fix this:</w:t>
+      </w:r>
+      <w:r>
+        <w:t xml:space="preserve"> </w:t>
+      </w:r>
+      <w:r>
+        <w:rPr>
+          <w:rStyle w:val="VerbatimChar"/>
+        </w:rPr>
+        <w:t xml:space="preserve">expand_labels_with_ancestors(flat, labels, depth)</w:t>
+      </w:r>
+      <w:r>
+        <w:t xml:space="preserve"> </w:t>
+      </w:r>
+      <w:r>
+        <w:t xml:space="preserve">pulls in each selected label’s N nearest real callers by walking the existing</w:t>
+      </w:r>
+      <w:r>
+        <w:t xml:space="preserve"> </w:t>
+      </w:r>
+      <w:r>
+        <w:rPr>
+          <w:rStyle w:val="VerbatimChar"/>
+        </w:rPr>
+        <w:t xml:space="preserve">caller_chains_for_label()</w:t>
+      </w:r>
+      <w:r>
+        <w:t xml:space="preserve">’s own chains;</w:t>
+      </w:r>
+      <w:r>
+        <w:t xml:space="preserve"> </w:t>
+      </w:r>
+      <w:r>
+        <w:rPr>
+          <w:rStyle w:val="VerbatimChar"/>
+        </w:rPr>
+        <w:t xml:space="preserve">resolve_kernel_owners(kernel_labels)</w:t>
+      </w:r>
+      <w:r>
+        <w:t xml:space="preserve"> </w:t>
+      </w:r>
+      <w:r>
+        <w:t xml:space="preserve">decodes a set of</w:t>
+      </w:r>
+      <w:r>
+        <w:t xml:space="preserve"> </w:t>
+      </w:r>
+      <w:r>
+        <w:t xml:space="preserve">GPU kernel names into their real CPU owner names via the existing</w:t>
+      </w:r>
+      <w:r>
+        <w:t xml:space="preserve"> </w:t>
+      </w:r>
+      <w:r>
+        <w:rPr>
+          <w:rStyle w:val="VerbatimChar"/>
+        </w:rPr>
+        <w:t xml:space="preserve">kernel_owner_label()</w:t>
+      </w:r>
+      <w:r>
+        <w:t xml:space="preserve">. Both are</w:t>
+      </w:r>
+      <w:r>
+        <w:t xml:space="preserve"> </w:t>
+      </w:r>
+      <w:r>
+        <w:t xml:space="preserve">plain, tree-shape-agnostic functions – no hotspot/instrumentation concept baked in – reusable by</w:t>
+      </w:r>
+      <w:r>
+        <w:t xml:space="preserve"> </w:t>
+      </w:r>
+      <w:r>
+        <w:t xml:space="preserve">any future tool with a flat parent-linked row pool and a label set.</w:t>
+      </w:r>
+    </w:p>
+    <w:p>
+      <w:pPr>
+        <w:pStyle w:val="BodyText"/>
+      </w:pPr>
+      <w:r>
+        <w:t xml:space="preserve">Given how central this selection logic now is,</w:t>
+      </w:r>
+      <w:r>
+        <w:t xml:space="preserve"> </w:t>
+      </w:r>
+      <w:r>
+        <w:rPr>
+          <w:rStyle w:val="VerbatimChar"/>
+        </w:rPr>
+        <w:t xml:space="preserve">select_hotspot_functions.py</w:t>
+      </w:r>
+      <w:r>
+        <w:t xml:space="preserve"> </w:t>
+      </w:r>
+      <w:r>
+        <w:t xml:space="preserve">was renamed to</w:t>
+      </w:r>
+      <w:r>
+        <w:t xml:space="preserve"> </w:t>
+      </w:r>
+      <w:r>
+        <w:rPr>
+          <w:rStyle w:val="VerbatimChar"/>
+        </w:rPr>
+        <w:t xml:space="preserve">select_instrumented_functions.py</w:t>
+      </w:r>
+      <w:r>
+        <w:t xml:space="preserve"> </w:t>
+      </w:r>
+      <w:r>
+        <w:t xml:space="preserve">(per the user’s own explicit request) and rebuilt as a thin</w:t>
+      </w:r>
+      <w:r>
+        <w:t xml:space="preserve"> </w:t>
+      </w:r>
+      <w:r>
+        <w:t xml:space="preserve">composition over the new primitives: ancestor-pulling is on by default at depth 1 (no separate hard</w:t>
+      </w:r>
+      <w:r>
+        <w:t xml:space="preserve"> </w:t>
+      </w:r>
+      <w:r>
+        <w:t xml:space="preserve">cap – the depth limit plus a transparent stderr breakdown of how many functions were added by each</w:t>
+      </w:r>
+      <w:r>
+        <w:t xml:space="preserve"> </w:t>
+      </w:r>
+      <w:r>
+        <w:t xml:space="preserve">mechanism already answers</w:t>
+      </w:r>
+      <w:r>
+        <w:t xml:space="preserve"> </w:t>
+      </w:r>
+      <w:r>
+        <w:t xml:space="preserve">“</w:t>
+      </w:r>
+      <w:r>
+        <w:t xml:space="preserve">weighed against its overhead</w:t>
+      </w:r>
+      <w:r>
+        <w:t xml:space="preserve">”</w:t>
+      </w:r>
+      <w:r>
+        <w:t xml:space="preserve"> </w:t>
+      </w:r>
+      <w:r>
+        <w:t xml:space="preserve">without a second, harder-to-reason-about</w:t>
+      </w:r>
+      <w:r>
+        <w:t xml:space="preserve"> </w:t>
+      </w:r>
+      <w:r>
+        <w:t xml:space="preserve">knob); a new</w:t>
+      </w:r>
+      <w:r>
+        <w:t xml:space="preserve"> </w:t>
+      </w:r>
+      <w:r>
+        <w:rPr>
+          <w:rStyle w:val="VerbatimChar"/>
+        </w:rPr>
+        <w:t xml:space="preserve">--gpu-output-dir DIR</w:t>
+      </w:r>
+      <w:r>
+        <w:t xml:space="preserve"> </w:t>
+      </w:r>
+      <w:r>
+        <w:t xml:space="preserve">resolves GPU kernel hotspots from a paired rocprofv3 run into</w:t>
+      </w:r>
+      <w:r>
+        <w:t xml:space="preserve"> </w:t>
+      </w:r>
+      <w:r>
+        <w:t xml:space="preserve">their real owners automatically.</w:t>
+      </w:r>
+      <w:r>
+        <w:t xml:space="preserve"> </w:t>
+      </w:r>
+      <w:r>
+        <w:rPr>
+          <w:rStyle w:val="VerbatimChar"/>
+        </w:rPr>
+        <w:t xml:space="preserve">instrument_hotspots.sh</w:t>
+      </w:r>
+      <w:r>
+        <w:t xml:space="preserve"> </w:t>
+      </w:r>
+      <w:r>
+        <w:t xml:space="preserve">now points at the renamed tool and passes</w:t>
+      </w:r>
+      <w:r>
+        <w:t xml:space="preserve"> </w:t>
+      </w:r>
+      <w:r>
+        <w:rPr>
+          <w:rStyle w:val="VerbatimChar"/>
+        </w:rPr>
+        <w:t xml:space="preserve">$OUTPUT_DIR/rocprofv3</w:t>
+      </w:r>
+      <w:r>
+        <w:t xml:space="preserve"> </w:t>
+      </w:r>
+      <w:r>
+        <w:t xml:space="preserve">(already produced by its own auto-profiling scan step) as</w:t>
+      </w:r>
+      <w:r>
+        <w:t xml:space="preserve"> </w:t>
+      </w:r>
+      <w:r>
+        <w:rPr>
+          <w:rStyle w:val="VerbatimChar"/>
+        </w:rPr>
+        <w:t xml:space="preserve">--gpu-output-dir</w:t>
+      </w:r>
+      <w:r>
+        <w:t xml:space="preserve">, at zero extra profiling cost.</w:t>
+      </w:r>
+    </w:p>
+    <w:p>
+      <w:pPr>
+        <w:pStyle w:val="BodyText"/>
+      </w:pPr>
+      <w:r>
+        <w:rPr>
+          <w:rStyle w:val="VerbatimChar"/>
+        </w:rPr>
+        <w:t xml:space="preserve">--report FILE</w:t>
+      </w:r>
+      <w:r>
+        <w:t xml:space="preserve"> </w:t>
+      </w:r>
+      <w:r>
+        <w:t xml:space="preserve">mode needed its own path to the same ancestor data, since it never has the raw</w:t>
+      </w:r>
+      <w:r>
+        <w:t xml:space="preserve"> </w:t>
+      </w:r>
+      <w:r>
+        <w:t xml:space="preserve">rocprof-sys output directory a live tree can be built from. New module</w:t>
+      </w:r>
+      <w:r>
+        <w:t xml:space="preserve"> </w:t>
+      </w:r>
+      <w:r>
+        <w:rPr>
+          <w:rStyle w:val="VerbatimChar"/>
+        </w:rPr>
+        <w:t xml:space="preserve">stage5_calltree_text_parser.py</w:t>
+      </w:r>
+      <w:r>
+        <w:t xml:space="preserve"> </w:t>
+      </w:r>
+      <w:r>
+        <w:t xml:space="preserve">(</w:t>
+      </w:r>
+      <w:r>
+        <w:rPr>
+          <w:rStyle w:val="VerbatimChar"/>
+        </w:rPr>
+        <w:t xml:space="preserve">flat_rows_from_calltree_text()</w:t>
+      </w:r>
+      <w:r>
+        <w:t xml:space="preserve">) reconstructs the same flat,</w:t>
+      </w:r>
+      <w:r>
+        <w:t xml:space="preserve"> </w:t>
+      </w:r>
+      <w:r>
+        <w:t xml:space="preserve">parent-linked row shape directly from a</w:t>
+      </w:r>
+      <w:r>
+        <w:t xml:space="preserve"> </w:t>
+      </w:r>
+      <w:r>
+        <w:rPr>
+          <w:iCs/>
+          <w:i/>
+        </w:rPr>
+        <w:t xml:space="preserve">rendered</w:t>
+      </w:r>
+      <w:r>
+        <w:t xml:space="preserve"> </w:t>
+      </w:r>
+      <w:r>
+        <w:rPr>
+          <w:rStyle w:val="VerbatimChar"/>
+        </w:rPr>
+        <w:t xml:space="preserve">calltree.txt</w:t>
+      </w:r>
+      <w:r>
+        <w:t xml:space="preserve">’s text – the first parser in</w:t>
+      </w:r>
+      <w:r>
+        <w:t xml:space="preserve"> </w:t>
+      </w:r>
+      <w:r>
+        <w:t xml:space="preserve">this codebase to turn a hierarchical indented tree back into structured data, everything else here</w:t>
+      </w:r>
+      <w:r>
+        <w:t xml:space="preserve"> </w:t>
+      </w:r>
+      <w:r>
+        <w:t xml:space="preserve">only ever having parsed flat tables. Built by reading</w:t>
+      </w:r>
+      <w:r>
+        <w:t xml:space="preserve"> </w:t>
+      </w:r>
+      <w:r>
+        <w:rPr>
+          <w:rStyle w:val="VerbatimChar"/>
+        </w:rPr>
+        <w:t xml:space="preserve">stage5_tree_render.py</w:t>
+      </w:r>
+      <w:r>
+        <w:t xml:space="preserve">’s own exact rendering</w:t>
+      </w:r>
+      <w:r>
+        <w:t xml:space="preserve"> </w:t>
+      </w:r>
+      <w:r>
+        <w:t xml:space="preserve">rules (a data row’s fixed-width numeric suffix vs. a hard-wrapped label’s bare continuation lines;</w:t>
+      </w:r>
+      <w:r>
+        <w:t xml:space="preserve"> </w:t>
+      </w:r>
+      <w:r>
+        <w:t xml:space="preserve">tree-connector prefixes decoding directly to depth via a depth-tracked stack), so it stays exactly</w:t>
+      </w:r>
+      <w:r>
+        <w:t xml:space="preserve"> </w:t>
+      </w:r>
+      <w:r>
+        <w:t xml:space="preserve">as forgiving as that renderer’s real output, no more.</w:t>
+      </w:r>
+      <w:r>
+        <w:t xml:space="preserve"> </w:t>
+      </w:r>
+      <w:r>
+        <w:rPr>
+          <w:rStyle w:val="VerbatimChar"/>
+        </w:rPr>
+        <w:t xml:space="preserve">--report</w:t>
+      </w:r>
+      <w:r>
+        <w:t xml:space="preserve"> </w:t>
+      </w:r>
+      <w:r>
+        <w:t xml:space="preserve">mode requires a sibling</w:t>
+      </w:r>
+      <w:r>
+        <w:t xml:space="preserve"> </w:t>
+      </w:r>
+      <w:r>
+        <w:rPr>
+          <w:rStyle w:val="VerbatimChar"/>
+        </w:rPr>
+        <w:t xml:space="preserve">calltree.txt</w:t>
+      </w:r>
+      <w:r>
+        <w:t xml:space="preserve"> </w:t>
+      </w:r>
+      <w:r>
+        <w:t xml:space="preserve">next to the report when ancestor-pulling is active (the default) – every launcher</w:t>
+      </w:r>
+      <w:r>
+        <w:t xml:space="preserve"> </w:t>
+      </w:r>
+      <w:r>
+        <w:t xml:space="preserve">that writes a</w:t>
+      </w:r>
+      <w:r>
+        <w:t xml:space="preserve"> </w:t>
+      </w:r>
+      <w:r>
+        <w:rPr>
+          <w:rStyle w:val="VerbatimChar"/>
+        </w:rPr>
+        <w:t xml:space="preserve">hotspots.txt</w:t>
+      </w:r>
+      <w:r>
+        <w:t xml:space="preserve"> </w:t>
+      </w:r>
+      <w:r>
+        <w:t xml:space="preserve">already writes one alongside it – and fails with a clear, actionable</w:t>
+      </w:r>
+      <w:r>
+        <w:t xml:space="preserve"> </w:t>
+      </w:r>
+      <w:r>
+        <w:t xml:space="preserve">error rather than silently skipping ancestor expansion if it’s missing.</w:t>
+      </w:r>
+    </w:p>
+    <w:p>
+      <w:pPr>
+        <w:pStyle w:val="BodyText"/>
+      </w:pPr>
+      <w:r>
+        <w:t xml:space="preserve">The first</w:t>
+      </w:r>
+      <w:r>
+        <w:t xml:space="preserve"> </w:t>
+      </w:r>
+      <w:r>
+        <w:rPr>
+          <w:rStyle w:val="VerbatimChar"/>
+        </w:rPr>
+        <w:t xml:space="preserve">ExitPlanMode</w:t>
+      </w:r>
+      <w:r>
+        <w:t xml:space="preserve"> </w:t>
+      </w:r>
+      <w:r>
+        <w:t xml:space="preserve">attempt was sent back twice by the user, both times sharpening the plan</w:t>
+      </w:r>
+      <w:r>
+        <w:t xml:space="preserve"> </w:t>
+      </w:r>
+      <w:r>
+        <w:t xml:space="preserve">materially: first, a request to actually verify against this project’s own real profiling output</w:t>
+      </w:r>
+      <w:r>
+        <w:t xml:space="preserve"> </w:t>
+      </w:r>
+      <w:r>
+        <w:t xml:space="preserve">(</w:t>
+      </w:r>
+      <w:r>
+        <w:rPr>
+          <w:rStyle w:val="VerbatimChar"/>
+        </w:rPr>
+        <w:t xml:space="preserve">Heat_Convection_Solver/instrument_hotspots-scan-2026-08-10_12.55.53/</w:t>
+      </w:r>
+      <w:r>
+        <w:t xml:space="preserve">) rather than fixtures alone</w:t>
+      </w:r>
+      <w:r>
+        <w:t xml:space="preserve"> </w:t>
+      </w:r>
+      <w:r>
+        <w:t xml:space="preserve">– which surfaced a genuinely useful, unrelated discovery: the real</w:t>
+      </w:r>
+      <w:r>
+        <w:t xml:space="preserve"> </w:t>
+      </w:r>
+      <w:r>
+        <w:rPr>
+          <w:rStyle w:val="VerbatimChar"/>
+        </w:rPr>
+        <w:t xml:space="preserve">hotspots.txt</w:t>
+      </w:r>
+      <w:r>
+        <w:t xml:space="preserve">/</w:t>
+      </w:r>
+      <w:r>
+        <w:rPr>
+          <w:rStyle w:val="VerbatimChar"/>
+        </w:rPr>
+        <w:t xml:space="preserve">calltree.txt</w:t>
+      </w:r>
+      <w:r>
+        <w:t xml:space="preserve"> </w:t>
+      </w:r>
+      <w:r>
+        <w:t xml:space="preserve">already sitting in that directory were stale, written by an older code version with UPPERCASE</w:t>
+      </w:r>
+      <w:r>
+        <w:t xml:space="preserve"> </w:t>
+      </w:r>
+      <w:r>
+        <w:t xml:space="preserve">column headers (</w:t>
+      </w:r>
+      <w:r>
+        <w:t xml:space="preserve">“</w:t>
+      </w:r>
+      <w:r>
+        <w:t xml:space="preserve">CALLS</w:t>
+      </w:r>
+      <w:r>
+        <w:t xml:space="preserve">”</w:t>
+      </w:r>
+      <w:r>
+        <w:t xml:space="preserve">,</w:t>
+      </w:r>
+      <w:r>
+        <w:t xml:space="preserve"> </w:t>
+      </w:r>
+      <w:r>
+        <w:t xml:space="preserve">“</w:t>
+      </w:r>
+      <w:r>
+        <w:t xml:space="preserve">SELF-AVG(s)</w:t>
+      </w:r>
+      <w:r>
+        <w:t xml:space="preserve">”</w:t>
+      </w:r>
+      <w:r>
+        <w:t xml:space="preserve">) that no longer match current (lowercase) rendering at all,</w:t>
+      </w:r>
+      <w:r>
+        <w:t xml:space="preserve"> </w:t>
+      </w:r>
+      <w:r>
+        <w:t xml:space="preserve">confirmed by</w:t>
+      </w:r>
+      <w:r>
+        <w:t xml:space="preserve"> </w:t>
+      </w:r>
+      <w:r>
+        <w:rPr>
+          <w:rStyle w:val="VerbatimChar"/>
+        </w:rPr>
+        <w:t xml:space="preserve">grep</w:t>
+      </w:r>
+      <w:r>
+        <w:t xml:space="preserve">ing for</w:t>
+      </w:r>
+      <w:r>
+        <w:t xml:space="preserve"> </w:t>
+      </w:r>
+      <w:r>
+        <w:rPr>
+          <w:rStyle w:val="VerbatimChar"/>
+        </w:rPr>
+        <w:t xml:space="preserve">.upper()</w:t>
+      </w:r>
+      <w:r>
+        <w:t xml:space="preserve"> </w:t>
+      </w:r>
+      <w:r>
+        <w:t xml:space="preserve">and finding zero matches anywhere in current code. Both were</w:t>
+      </w:r>
+      <w:r>
+        <w:t xml:space="preserve"> </w:t>
+      </w:r>
+      <w:r>
+        <w:t xml:space="preserve">regenerated in place from the same underlying raw data using current tools before being used as</w:t>
+      </w:r>
+      <w:r>
+        <w:t xml:space="preserve"> </w:t>
+      </w:r>
+      <w:r>
+        <w:t xml:space="preserve">real fixtures. Second, a request that the new logic be built as generic, reusable primitives from</w:t>
+      </w:r>
+      <w:r>
+        <w:t xml:space="preserve"> </w:t>
+      </w:r>
+      <w:r>
+        <w:t xml:space="preserve">the start rather than tool-specific code – directly shaping the</w:t>
+      </w:r>
+      <w:r>
+        <w:t xml:space="preserve"> </w:t>
+      </w:r>
+      <w:r>
+        <w:rPr>
+          <w:rStyle w:val="VerbatimChar"/>
+        </w:rPr>
+        <w:t xml:space="preserve">stage4_rocprofsys_common.py</w:t>
+      </w:r>
+      <w:r>
+        <w:t xml:space="preserve"> </w:t>
+      </w:r>
+      <w:r>
+        <w:t xml:space="preserve">placement described above.</w:t>
+      </w:r>
+    </w:p>
+    <w:p>
+      <w:pPr>
+        <w:pStyle w:val="BodyText"/>
+      </w:pPr>
+      <w:r>
+        <w:t xml:space="preserve">Verification: full suite grew from 659 to 673 tests, all green, including hand-crafted fixtures for</w:t>
+      </w:r>
+      <w:r>
+        <w:t xml:space="preserve"> </w:t>
+      </w:r>
+      <w:r>
+        <w:rPr>
+          <w:rStyle w:val="VerbatimChar"/>
+        </w:rPr>
+        <w:t xml:space="preserve">stage5_calltree_text_parser.py</w:t>
+      </w:r>
+      <w:r>
+        <w:t xml:space="preserve"> </w:t>
+      </w:r>
+      <w:r>
+        <w:t xml:space="preserve">generated through the real</w:t>
+      </w:r>
+      <w:r>
+        <w:t xml:space="preserve"> </w:t>
+      </w:r>
+      <w:r>
+        <w:rPr>
+          <w:rStyle w:val="VerbatimChar"/>
+        </w:rPr>
+        <w:t xml:space="preserve">stage5_tree_render.py</w:t>
+      </w:r>
+      <w:r>
+        <w:t xml:space="preserve"> </w:t>
+      </w:r>
+      <w:r>
+        <w:t xml:space="preserve">rendering</w:t>
+      </w:r>
+      <w:r>
+        <w:t xml:space="preserve"> </w:t>
+      </w:r>
+      <w:r>
+        <w:t xml:space="preserve">functions themselves (not hand-typed column alignment, which proved fragile the first time it was</w:t>
+      </w:r>
+      <w:r>
+        <w:t xml:space="preserve"> </w:t>
+      </w:r>
+      <w:r>
+        <w:t xml:space="preserve">tried) so fixtures stay byte-exact to production output. Against the real, freshly-regenerated</w:t>
+      </w:r>
+      <w:r>
+        <w:t xml:space="preserve"> </w:t>
+      </w:r>
+      <w:r>
+        <w:t xml:space="preserve">Heat_Convection_Solver data:</w:t>
+      </w:r>
+      <w:r>
+        <w:t xml:space="preserve"> </w:t>
+      </w:r>
+      <w:r>
+        <w:rPr>
+          <w:rStyle w:val="VerbatimChar"/>
+        </w:rPr>
+        <w:t xml:space="preserve">--output-dir</w:t>
+      </w:r>
+      <w:r>
+        <w:t xml:space="preserve"> </w:t>
+      </w:r>
+      <w:r>
+        <w:t xml:space="preserve">+</w:t>
+      </w:r>
+      <w:r>
+        <w:t xml:space="preserve"> </w:t>
+      </w:r>
+      <w:r>
+        <w:rPr>
+          <w:rStyle w:val="VerbatimChar"/>
+        </w:rPr>
+        <w:t xml:space="preserve">--gpu-output-dir</w:t>
+      </w:r>
+      <w:r>
+        <w:t xml:space="preserve"> </w:t>
+      </w:r>
+      <w:r>
+        <w:t xml:space="preserve">correctly resolved real GPU kernel</w:t>
+      </w:r>
+      <w:r>
+        <w:t xml:space="preserve"> </w:t>
+      </w:r>
+      <w:r>
+        <w:t xml:space="preserve">owner names (including</w:t>
+      </w:r>
+      <w:r>
+        <w:t xml:space="preserve"> </w:t>
+      </w:r>
+      <w:r>
+        <w:rPr>
+          <w:rStyle w:val="VerbatimChar"/>
+        </w:rPr>
+        <w:t xml:space="preserve">convection_stable_dt$convection_time_integrator_mod_</w:t>
+      </w:r>
+      <w:r>
+        <w:t xml:space="preserve">, the exact owner</w:t>
+      </w:r>
+      <w:r>
+        <w:t xml:space="preserve"> </w:t>
+      </w:r>
+      <w:r>
+        <w:t xml:space="preserve">plan 3.8 already confirmed for this dataset);</w:t>
+      </w:r>
+      <w:r>
+        <w:t xml:space="preserve"> </w:t>
+      </w:r>
+      <w:r>
+        <w:rPr>
+          <w:rStyle w:val="VerbatimChar"/>
+        </w:rPr>
+        <w:t xml:space="preserve">--report</w:t>
+      </w:r>
+      <w:r>
+        <w:t xml:space="preserve"> </w:t>
+      </w:r>
+      <w:r>
+        <w:t xml:space="preserve">mode correctly used its sibling</w:t>
+      </w:r>
+      <w:r>
+        <w:t xml:space="preserve"> </w:t>
+      </w:r>
+      <w:r>
+        <w:rPr>
+          <w:rStyle w:val="VerbatimChar"/>
+        </w:rPr>
+        <w:t xml:space="preserve">calltree.txt</w:t>
+      </w:r>
+      <w:r>
+        <w:t xml:space="preserve">; temporarily removing that file confirmed the documented clear error fires instead</w:t>
+      </w:r>
+      <w:r>
+        <w:t xml:space="preserve"> </w:t>
+      </w:r>
+      <w:r>
+        <w:t xml:space="preserve">of silently skipping ancestor expansion.</w:t>
+      </w:r>
+      <w:r>
+        <w:t xml:space="preserve"> </w:t>
+      </w:r>
+      <w:r>
+        <w:rPr>
+          <w:rStyle w:val="VerbatimChar"/>
+        </w:rPr>
+        <w:t xml:space="preserve">bash -n</w:t>
+      </w:r>
+      <w:r>
+        <w:t xml:space="preserve"> </w:t>
+      </w:r>
+      <w:r>
+        <w:t xml:space="preserve">plus a manual</w:t>
+      </w:r>
+      <w:r>
+        <w:t xml:space="preserve"> </w:t>
+      </w:r>
+      <w:r>
+        <w:rPr>
+          <w:rStyle w:val="VerbatimChar"/>
+        </w:rPr>
+        <w:t xml:space="preserve">--dry-run</w:t>
+      </w:r>
+      <w:r>
+        <w:t xml:space="preserve"> </w:t>
+      </w:r>
+      <w:r>
+        <w:t xml:space="preserve">run of</w:t>
+      </w:r>
+      <w:r>
+        <w:t xml:space="preserve"> </w:t>
+      </w:r>
+      <w:r>
+        <w:rPr>
+          <w:rStyle w:val="VerbatimChar"/>
+        </w:rPr>
+        <w:t xml:space="preserve">instrument_hotspots.sh instrument --report</w:t>
+      </w:r>
+      <w:r>
+        <w:t xml:space="preserve"> </w:t>
+      </w:r>
+      <w:r>
+        <w:t xml:space="preserve">against the real regenerated report (with stub</w:t>
+      </w:r>
+      <w:r>
+        <w:t xml:space="preserve"> </w:t>
+      </w:r>
+      <w:r>
+        <w:rPr>
+          <w:rStyle w:val="VerbatimChar"/>
+        </w:rPr>
+        <w:t xml:space="preserve">rocprof-sys-instrument</w:t>
+      </w:r>
+      <w:r>
+        <w:t xml:space="preserve">/</w:t>
+      </w:r>
+      <w:r>
+        <w:rPr>
+          <w:rStyle w:val="VerbatimChar"/>
+        </w:rPr>
+        <w:t xml:space="preserve">rocprof-sys-run</w:t>
+      </w:r>
+      <w:r>
+        <w:t xml:space="preserve"> </w:t>
+      </w:r>
+      <w:r>
+        <w:t xml:space="preserve">on</w:t>
+      </w:r>
+      <w:r>
+        <w:t xml:space="preserve"> </w:t>
+      </w:r>
+      <w:r>
+        <w:rPr>
+          <w:rStyle w:val="VerbatimChar"/>
+        </w:rPr>
+        <w:t xml:space="preserve">PATH</w:t>
+      </w:r>
+      <w:r>
+        <w:t xml:space="preserve">, the standing technique for this sandbox)</w:t>
+      </w:r>
+      <w:r>
+        <w:t xml:space="preserve"> </w:t>
+      </w:r>
+      <w:r>
+        <w:t xml:space="preserve">confirmed the renamed selector wires in correctly end to end. See</w:t>
+      </w:r>
+      <w:r>
+        <w:t xml:space="preserve"> </w:t>
+      </w:r>
+      <w:r>
+        <w:rPr>
+          <w:rStyle w:val="VerbatimChar"/>
+        </w:rPr>
+        <w:t xml:space="preserve">docs/plans/3.12-ancestor-aware-instrumentation-selection.md</w:t>
+      </w:r>
+      <w:r>
+        <w:t xml:space="preserve"> </w:t>
+      </w:r>
+      <w:r>
+        <w:t xml:space="preserve">for the full accounting.</w:t>
+      </w:r>
+    </w:p>
     <w:bookmarkEnd w:id="92"/>
+    <w:bookmarkEnd w:id="93"/>
     <w:sectPr/>
   </w:body>
 </w:document>

</xml_diff>

<commit_message>
Plan 3.14: profile_traced_hotspot_kernels.sh, a rocprof-compute deep-dive from an existing trace
New scripts/profile_traced_hotspot_kernels.sh resolves hot GPU kernels straight from an existing
rocprof-sys trace directory instead of paying for a fresh rocprofv3 scan, then runs the same
rocprof-compute profile/analyze pipeline profile_hotspot_kernels.sh already uses.

select_hotspot_kernels.py gains a --trace-dir source (backed by new
stage4_rocprofsys_trace_flat.aggregate_gpu_kernels(), which filters by the gpu_kernel tag rather
than the coarser GPU/CPU domain field) since the trace tools' own CPU+GPU-fused report layout
isn't parseable by the existing --report source. Also gains --time-range, so kernel selection can
be scoped to a single steady-state iteration instead of the whole run.

Co-Authored-By: Claude Sonnet 5 <noreply@anthropic.com>
</commit_message>
<xml_diff>
--- a/docs/DEVELOPMENT_HISTORY.docx
+++ b/docs/DEVELOPMENT_HISTORY.docx
@@ -10,7 +10,7 @@
         <w:t xml:space="preserve">Development History</w:t>
       </w:r>
     </w:p>
-    <w:bookmarkStart w:id="94" w:name="development-history"/>
+    <w:bookmarkStart w:id="95" w:name="development-history"/>
     <w:p>
       <w:pPr>
         <w:pStyle w:val="Heading1"/>
@@ -4953,6 +4953,134 @@
           </w:p>
         </w:tc>
       </w:tr>
+      <w:tr>
+        <w:tc>
+          <w:tcPr/>
+          <w:p>
+            <w:pPr>
+              <w:pStyle w:val="Compact"/>
+              <w:jc w:val="left"/>
+            </w:pPr>
+            <w:r>
+              <w:t xml:space="preserve">2026-08-26</w:t>
+            </w:r>
+          </w:p>
+        </w:tc>
+        <w:tc>
+          <w:tcPr/>
+          <w:p>
+            <w:pPr>
+              <w:pStyle w:val="Compact"/>
+              <w:jc w:val="left"/>
+            </w:pPr>
+            <w:r>
+              <w:t xml:space="preserve">Plan 3.14: new</w:t>
+            </w:r>
+            <w:r>
+              <w:t xml:space="preserve"> </w:t>
+            </w:r>
+            <w:r>
+              <w:rPr>
+                <w:rStyle w:val="VerbatimChar"/>
+              </w:rPr>
+              <w:t xml:space="preserve">scripts/profile_traced_hotspot_kernels.sh</w:t>
+            </w:r>
+            <w:r>
+              <w:t xml:space="preserve"> </w:t>
+            </w:r>
+            <w:r>
+              <w:t xml:space="preserve">runs a</w:t>
+            </w:r>
+            <w:r>
+              <w:t xml:space="preserve"> </w:t>
+            </w:r>
+            <w:r>
+              <w:rPr>
+                <w:rStyle w:val="VerbatimChar"/>
+              </w:rPr>
+              <w:t xml:space="preserve">rocprof-compute</w:t>
+            </w:r>
+            <w:r>
+              <w:t xml:space="preserve"> </w:t>
+            </w:r>
+            <w:r>
+              <w:t xml:space="preserve">kernel deep-dive from a trace directory that already exists, instead of paying for a fresh</w:t>
+            </w:r>
+            <w:r>
+              <w:t xml:space="preserve"> </w:t>
+            </w:r>
+            <w:r>
+              <w:rPr>
+                <w:rStyle w:val="VerbatimChar"/>
+              </w:rPr>
+              <w:t xml:space="preserve">rocprofv3</w:t>
+            </w:r>
+            <w:r>
+              <w:t xml:space="preserve"> </w:t>
+            </w:r>
+            <w:r>
+              <w:t xml:space="preserve">scan – new</w:t>
+            </w:r>
+            <w:r>
+              <w:t xml:space="preserve"> </w:t>
+            </w:r>
+            <w:r>
+              <w:rPr>
+                <w:rStyle w:val="VerbatimChar"/>
+              </w:rPr>
+              <w:t xml:space="preserve">select_hotspot_kernels.py --trace-dir</w:t>
+            </w:r>
+            <w:r>
+              <w:t xml:space="preserve"> </w:t>
+            </w:r>
+            <w:r>
+              <w:t xml:space="preserve">source (backed by new</w:t>
+            </w:r>
+            <w:r>
+              <w:t xml:space="preserve"> </w:t>
+            </w:r>
+            <w:r>
+              <w:rPr>
+                <w:rStyle w:val="VerbatimChar"/>
+              </w:rPr>
+              <w:t xml:space="preserve">stage4_rocprofsys_trace_flat.aggregate_gpu_kernels()</w:t>
+            </w:r>
+            <w:r>
+              <w:t xml:space="preserve">) resolves hot kernel names straight from the trace-CSV pipeline, since the trace tools’ own CPU+GPU-fused report layout isn’t parseable by the existing</w:t>
+            </w:r>
+            <w:r>
+              <w:t xml:space="preserve"> </w:t>
+            </w:r>
+            <w:r>
+              <w:rPr>
+                <w:rStyle w:val="VerbatimChar"/>
+              </w:rPr>
+              <w:t xml:space="preserve">--report</w:t>
+            </w:r>
+            <w:r>
+              <w:t xml:space="preserve"> </w:t>
+            </w:r>
+            <w:r>
+              <w:t xml:space="preserve">source; also gains</w:t>
+            </w:r>
+            <w:r>
+              <w:t xml:space="preserve"> </w:t>
+            </w:r>
+            <w:r>
+              <w:rPr>
+                <w:rStyle w:val="VerbatimChar"/>
+              </w:rPr>
+              <w:t xml:space="preserve">--time-range</w:t>
+            </w:r>
+            <w:r>
+              <w:t xml:space="preserve"> </w:t>
+            </w:r>
+            <w:r>
+              <w:t xml:space="preserve">for scoping kernel selection to one window of the trace – see full accounting below</w:t>
+            </w:r>
+          </w:p>
+        </w:tc>
+      </w:tr>
     </w:tbl>
     <w:bookmarkStart w:id="20" w:name="project-scaffolding-and-rules"/>
     <w:p>
@@ -62010,7 +62138,1093 @@
       </w:r>
     </w:p>
     <w:bookmarkEnd w:id="93"/>
+    <w:bookmarkStart w:id="94" w:name="Xf46203f5a72917e9c0c5a7e15b69c94b3dca807"/>
+    <w:p>
+      <w:pPr>
+        <w:pStyle w:val="Heading2"/>
+      </w:pPr>
+      <w:r>
+        <w:t xml:space="preserve">2026-08-26 — Plan 3.14:</w:t>
+      </w:r>
+      <w:r>
+        <w:t xml:space="preserve"> </w:t>
+      </w:r>
+      <w:r>
+        <w:rPr>
+          <w:rStyle w:val="VerbatimChar"/>
+        </w:rPr>
+        <w:t xml:space="preserve">profile_traced_hotspot_kernels.sh</w:t>
+      </w:r>
+      <w:r>
+        <w:t xml:space="preserve">, a</w:t>
+      </w:r>
+      <w:r>
+        <w:t xml:space="preserve"> </w:t>
+      </w:r>
+      <w:r>
+        <w:rPr>
+          <w:rStyle w:val="VerbatimChar"/>
+        </w:rPr>
+        <w:t xml:space="preserve">rocprof-compute</w:t>
+      </w:r>
+      <w:r>
+        <w:t xml:space="preserve"> </w:t>
+      </w:r>
+      <w:r>
+        <w:t xml:space="preserve">deep-dive fed by an existing trace directory</w:t>
+      </w:r>
+    </w:p>
+    <w:p>
+      <w:pPr>
+        <w:pStyle w:val="FirstParagraph"/>
+      </w:pPr>
+      <w:r>
+        <w:rPr>
+          <w:rStyle w:val="VerbatimChar"/>
+        </w:rPr>
+        <w:t xml:space="preserve">scripts/profile_hotspot_kernels.sh</w:t>
+      </w:r>
+      <w:r>
+        <w:t xml:space="preserve"> </w:t>
+      </w:r>
+      <w:r>
+        <w:t xml:space="preserve">(plan 1.5) resolves hot GPU kernels by running its own fresh</w:t>
+      </w:r>
+      <w:r>
+        <w:t xml:space="preserve"> </w:t>
+      </w:r>
+      <w:r>
+        <w:rPr>
+          <w:rStyle w:val="VerbatimChar"/>
+        </w:rPr>
+        <w:t xml:space="preserve">rocprofv3</w:t>
+      </w:r>
+      <w:r>
+        <w:t xml:space="preserve"> </w:t>
+      </w:r>
+      <w:r>
+        <w:t xml:space="preserve">auto-profiling scan before handing them to</w:t>
+      </w:r>
+      <w:r>
+        <w:t xml:space="preserve"> </w:t>
+      </w:r>
+      <w:r>
+        <w:rPr>
+          <w:rStyle w:val="VerbatimChar"/>
+        </w:rPr>
+        <w:t xml:space="preserve">rocprof-compute</w:t>
+      </w:r>
+      <w:r>
+        <w:t xml:space="preserve"> </w:t>
+      </w:r>
+      <w:r>
+        <w:t xml:space="preserve">– redundant if a</w:t>
+      </w:r>
+      <w:r>
+        <w:t xml:space="preserve"> </w:t>
+      </w:r>
+      <w:r>
+        <w:rPr>
+          <w:rStyle w:val="VerbatimChar"/>
+        </w:rPr>
+        <w:t xml:space="preserve">rocprof-sys</w:t>
+      </w:r>
+      <w:r>
+        <w:t xml:space="preserve"> </w:t>
+      </w:r>
+      <w:r>
+        <w:t xml:space="preserve">trace directory (from</w:t>
+      </w:r>
+      <w:r>
+        <w:t xml:space="preserve"> </w:t>
+      </w:r>
+      <w:r>
+        <w:rPr>
+          <w:rStyle w:val="VerbatimChar"/>
+        </w:rPr>
+        <w:t xml:space="preserve">instrument_hotspots.sh trace</w:t>
+      </w:r>
+      <w:r>
+        <w:t xml:space="preserve"> </w:t>
+      </w:r>
+      <w:r>
+        <w:t xml:space="preserve">or</w:t>
+      </w:r>
+      <w:r>
+        <w:t xml:space="preserve"> </w:t>
+      </w:r>
+      <w:r>
+        <w:rPr>
+          <w:rStyle w:val="VerbatimChar"/>
+        </w:rPr>
+        <w:t xml:space="preserve">profile_traced_hotspots.sh</w:t>
+      </w:r>
+      <w:r>
+        <w:t xml:space="preserve">,</w:t>
+      </w:r>
+      <w:r>
+        <w:t xml:space="preserve"> </w:t>
+      </w:r>
+      <w:r>
+        <w:t xml:space="preserve">plan 3.11) already exists and already has everything needed to identify the same hot kernels. This</w:t>
+      </w:r>
+      <w:r>
+        <w:t xml:space="preserve"> </w:t>
+      </w:r>
+      <w:r>
+        <w:t xml:space="preserve">plan combines the two: a new</w:t>
+      </w:r>
+      <w:r>
+        <w:t xml:space="preserve"> </w:t>
+      </w:r>
+      <w:r>
+        <w:rPr>
+          <w:rStyle w:val="VerbatimChar"/>
+        </w:rPr>
+        <w:t xml:space="preserve">scripts/profile_traced_hotspot_kernels.sh</w:t>
+      </w:r>
+      <w:r>
+        <w:t xml:space="preserve"> </w:t>
+      </w:r>
+      <w:r>
+        <w:t xml:space="preserve">starts from an existing</w:t>
+      </w:r>
+      <w:r>
+        <w:t xml:space="preserve"> </w:t>
+      </w:r>
+      <w:r>
+        <w:t xml:space="preserve">trace directory, resolves its hottest kernels straight from the trace’s own recorded data, and runs</w:t>
+      </w:r>
+      <w:r>
+        <w:t xml:space="preserve"> </w:t>
+      </w:r>
+      <w:r>
+        <w:t xml:space="preserve">the same</w:t>
+      </w:r>
+      <w:r>
+        <w:t xml:space="preserve"> </w:t>
+      </w:r>
+      <w:r>
+        <w:rPr>
+          <w:rStyle w:val="VerbatimChar"/>
+        </w:rPr>
+        <w:t xml:space="preserve">rocprof-compute profile</w:t>
+      </w:r>
+      <w:r>
+        <w:t xml:space="preserve">/</w:t>
+      </w:r>
+      <w:r>
+        <w:rPr>
+          <w:rStyle w:val="VerbatimChar"/>
+        </w:rPr>
+        <w:t xml:space="preserve">analyze</w:t>
+      </w:r>
+      <w:r>
+        <w:t xml:space="preserve"> </w:t>
+      </w:r>
+      <w:r>
+        <w:t xml:space="preserve">pipeline</w:t>
+      </w:r>
+      <w:r>
+        <w:t xml:space="preserve"> </w:t>
+      </w:r>
+      <w:r>
+        <w:rPr>
+          <w:rStyle w:val="VerbatimChar"/>
+        </w:rPr>
+        <w:t xml:space="preserve">profile_hotspot_kernels.sh</w:t>
+      </w:r>
+      <w:r>
+        <w:t xml:space="preserve"> </w:t>
+      </w:r>
+      <w:r>
+        <w:t xml:space="preserve">already uses.</w:t>
+      </w:r>
+    </w:p>
+    <w:p>
+      <w:pPr>
+        <w:pStyle w:val="BodyText"/>
+      </w:pPr>
+      <w:r>
+        <w:t xml:space="preserve">The one real design gap:</w:t>
+      </w:r>
+      <w:r>
+        <w:t xml:space="preserve"> </w:t>
+      </w:r>
+      <w:r>
+        <w:rPr>
+          <w:rStyle w:val="VerbatimChar"/>
+        </w:rPr>
+        <w:t xml:space="preserve">select_hotspot_kernels.py</w:t>
+      </w:r>
+      <w:r>
+        <w:t xml:space="preserve"> </w:t>
+      </w:r>
+      <w:r>
+        <w:t xml:space="preserve">(the shared kernel-name resolver both scripts</w:t>
+      </w:r>
+      <w:r>
+        <w:t xml:space="preserve"> </w:t>
+      </w:r>
+      <w:r>
+        <w:t xml:space="preserve">use) only understood two sources going in – a</w:t>
+      </w:r>
+      <w:r>
+        <w:t xml:space="preserve"> </w:t>
+      </w:r>
+      <w:r>
+        <w:rPr>
+          <w:rStyle w:val="VerbatimChar"/>
+        </w:rPr>
+        <w:t xml:space="preserve">GPU_HOTSPOTS_COLUMNS</w:t>
+      </w:r>
+      <w:r>
+        <w:t xml:space="preserve">-format report or a raw</w:t>
+      </w:r>
+      <w:r>
+        <w:t xml:space="preserve"> </w:t>
+      </w:r>
+      <w:r>
+        <w:rPr>
+          <w:rStyle w:val="VerbatimChar"/>
+        </w:rPr>
+        <w:t xml:space="preserve">rocprofv3</w:t>
+      </w:r>
+      <w:r>
+        <w:t xml:space="preserve"> </w:t>
+      </w:r>
+      <w:r>
+        <w:t xml:space="preserve">output directory – and neither fits a trace directory.</w:t>
+      </w:r>
+      <w:r>
+        <w:t xml:space="preserve"> </w:t>
+      </w:r>
+      <w:r>
+        <w:rPr>
+          <w:rStyle w:val="VerbatimChar"/>
+        </w:rPr>
+        <w:t xml:space="preserve">extract_trace_hotspots.py</w:t>
+      </w:r>
+      <w:r>
+        <w:t xml:space="preserve">’s</w:t>
+      </w:r>
+      <w:r>
+        <w:t xml:space="preserve"> </w:t>
+      </w:r>
+      <w:r>
+        <w:t xml:space="preserve">own</w:t>
+      </w:r>
+      <w:r>
+        <w:t xml:space="preserve"> </w:t>
+      </w:r>
+      <w:r>
+        <w:rPr>
+          <w:rStyle w:val="VerbatimChar"/>
+        </w:rPr>
+        <w:t xml:space="preserve">hotspots.txt</w:t>
+      </w:r>
+      <w:r>
+        <w:t xml:space="preserve"> </w:t>
+      </w:r>
+      <w:r>
+        <w:t xml:space="preserve">uses a different, CPU+GPU-fused column layout (</w:t>
+      </w:r>
+      <w:r>
+        <w:rPr>
+          <w:rStyle w:val="VerbatimChar"/>
+        </w:rPr>
+        <w:t xml:space="preserve">FUSED_HOTSPOTS_COLUMNS</w:t>
+      </w:r>
+      <w:r>
+        <w:t xml:space="preserve">) with no</w:t>
+      </w:r>
+      <w:r>
+        <w:t xml:space="preserve"> </w:t>
+      </w:r>
+      <w:r>
+        <w:t xml:space="preserve">per-section</w:t>
+      </w:r>
+      <w:r>
+        <w:t xml:space="preserve"> </w:t>
+      </w:r>
+      <w:r>
+        <w:t xml:space="preserve">“</w:t>
+      </w:r>
+      <w:r>
+        <w:t xml:space="preserve">GPU kernel hotspots</w:t>
+      </w:r>
+      <w:r>
+        <w:t xml:space="preserve">”</w:t>
+      </w:r>
+      <w:r>
+        <w:t xml:space="preserve"> </w:t>
+      </w:r>
+      <w:r>
+        <w:t xml:space="preserve">header the existing report parser looks for, so it can’t just be</w:t>
+      </w:r>
+      <w:r>
+        <w:t xml:space="preserve"> </w:t>
+      </w:r>
+      <w:r>
+        <w:t xml:space="preserve">pointed at that report. The fix is a third source,</w:t>
+      </w:r>
+      <w:r>
+        <w:t xml:space="preserve"> </w:t>
+      </w:r>
+      <w:r>
+        <w:rPr>
+          <w:rStyle w:val="VerbatimChar"/>
+        </w:rPr>
+        <w:t xml:space="preserve">--trace-dir</w:t>
+      </w:r>
+      <w:r>
+        <w:t xml:space="preserve">, that reads kernel names directly</w:t>
+      </w:r>
+      <w:r>
+        <w:t xml:space="preserve"> </w:t>
+      </w:r>
+      <w:r>
+        <w:t xml:space="preserve">from the trace-CSV aggregation pipeline instead of any rendered report text: a new</w:t>
+      </w:r>
+      <w:r>
+        <w:t xml:space="preserve"> </w:t>
+      </w:r>
+      <w:r>
+        <w:rPr>
+          <w:rStyle w:val="VerbatimChar"/>
+        </w:rPr>
+        <w:t xml:space="preserve">stage4_rocprofsys_trace_flat.aggregate_gpu_kernels()</w:t>
+      </w:r>
+      <w:r>
+        <w:t xml:space="preserve"> </w:t>
+      </w:r>
+      <w:r>
+        <w:t xml:space="preserve">filters raw per-rank rows to</w:t>
+      </w:r>
+      <w:r>
+        <w:t xml:space="preserve"> </w:t>
+      </w:r>
+      <w:r>
+        <w:rPr>
+          <w:rStyle w:val="VerbatimChar"/>
+        </w:rPr>
+        <w:t xml:space="preserve">"gpu_kernel" in row["tags"]</w:t>
+      </w:r>
+      <w:r>
+        <w:t xml:space="preserve"> </w:t>
+      </w:r>
+      <w:r>
+        <w:rPr>
+          <w:iCs/>
+          <w:i/>
+        </w:rPr>
+        <w:t xml:space="preserve">before</w:t>
+      </w:r>
+      <w:r>
+        <w:t xml:space="preserve"> </w:t>
+      </w:r>
+      <w:r>
+        <w:t xml:space="preserve">accumulating into per-label totals – necessary because the</w:t>
+      </w:r>
+      <w:r>
+        <w:t xml:space="preserve"> </w:t>
+      </w:r>
+      <w:r>
+        <w:t xml:space="preserve">existing</w:t>
+      </w:r>
+      <w:r>
+        <w:t xml:space="preserve"> </w:t>
+      </w:r>
+      <w:r>
+        <w:rPr>
+          <w:rStyle w:val="VerbatimChar"/>
+        </w:rPr>
+        <w:t xml:space="preserve">aggregate()</w:t>
+      </w:r>
+      <w:r>
+        <w:t xml:space="preserve">’s own</w:t>
+      </w:r>
+      <w:r>
+        <w:t xml:space="preserve"> </w:t>
+      </w:r>
+      <w:r>
+        <w:rPr>
+          <w:rStyle w:val="VerbatimChar"/>
+        </w:rPr>
+        <w:t xml:space="preserve">"domain"</w:t>
+      </w:r>
+      <w:r>
+        <w:t xml:space="preserve"> </w:t>
+      </w:r>
+      <w:r>
+        <w:t xml:space="preserve">field collapses</w:t>
+      </w:r>
+      <w:r>
+        <w:t xml:space="preserve"> </w:t>
+      </w:r>
+      <w:r>
+        <w:rPr>
+          <w:rStyle w:val="VerbatimChar"/>
+        </w:rPr>
+        <w:t xml:space="preserve">gpu_kernel</w:t>
+      </w:r>
+      <w:r>
+        <w:t xml:space="preserve"> </w:t>
+      </w:r>
+      <w:r>
+        <w:t xml:space="preserve">together with</w:t>
+      </w:r>
+      <w:r>
+        <w:t xml:space="preserve"> </w:t>
+      </w:r>
+      <w:r>
+        <w:rPr>
+          <w:rStyle w:val="VerbatimChar"/>
+        </w:rPr>
+        <w:t xml:space="preserve">gpu_api</w:t>
+      </w:r>
+      <w:r>
+        <w:t xml:space="preserve">/</w:t>
+      </w:r>
+      <w:r>
+        <w:t xml:space="preserve"> </w:t>
+      </w:r>
+      <w:r>
+        <w:rPr>
+          <w:rStyle w:val="VerbatimChar"/>
+        </w:rPr>
+        <w:t xml:space="preserve">gpu_memcpy</w:t>
+      </w:r>
+      <w:r>
+        <w:t xml:space="preserve">, so a launch call like</w:t>
+      </w:r>
+      <w:r>
+        <w:t xml:space="preserve"> </w:t>
+      </w:r>
+      <w:r>
+        <w:rPr>
+          <w:rStyle w:val="VerbatimChar"/>
+        </w:rPr>
+        <w:t xml:space="preserve">hipLaunchKernel</w:t>
+      </w:r>
+      <w:r>
+        <w:t xml:space="preserve"> </w:t>
+      </w:r>
+      <w:r>
+        <w:t xml:space="preserve">would wrongly survive a</w:t>
+      </w:r>
+      <w:r>
+        <w:t xml:space="preserve"> </w:t>
+      </w:r>
+      <w:r>
+        <w:rPr>
+          <w:rStyle w:val="VerbatimChar"/>
+        </w:rPr>
+        <w:t xml:space="preserve">domain=="GPU"</w:t>
+      </w:r>
+      <w:r>
+        <w:t xml:space="preserve"> </w:t>
+      </w:r>
+      <w:r>
+        <w:t xml:space="preserve">post-filter.</w:t>
+      </w:r>
+      <w:r>
+        <w:t xml:space="preserve"> </w:t>
+      </w:r>
+      <w:r>
+        <w:rPr>
+          <w:rStyle w:val="VerbatimChar"/>
+        </w:rPr>
+        <w:t xml:space="preserve">pct_total</w:t>
+      </w:r>
+      <w:r>
+        <w:t xml:space="preserve"> </w:t>
+      </w:r>
+      <w:r>
+        <w:t xml:space="preserve">on these entries is computed against the kernel-only total, not total</w:t>
+      </w:r>
+      <w:r>
+        <w:t xml:space="preserve"> </w:t>
+      </w:r>
+      <w:r>
+        <w:t xml:space="preserve">application runtime, matching how the existing rocprofv3-based selector already ranks kernels</w:t>
+      </w:r>
+      <w:r>
+        <w:t xml:space="preserve"> </w:t>
+      </w:r>
+      <w:r>
+        <w:t xml:space="preserve">against total kernel-dispatch time. The new function feeds directly into the same</w:t>
+      </w:r>
+      <w:r>
+        <w:t xml:space="preserve"> </w:t>
+      </w:r>
+      <w:r>
+        <w:rPr>
+          <w:rStyle w:val="VerbatimChar"/>
+        </w:rPr>
+        <w:t xml:space="preserve">stage5_table_render.select_entries()</w:t>
+      </w:r>
+      <w:r>
+        <w:t xml:space="preserve"> </w:t>
+      </w:r>
+      <w:r>
+        <w:t xml:space="preserve">helper the rocprofv3 path already uses, since both shapes</w:t>
+      </w:r>
+      <w:r>
+        <w:t xml:space="preserve"> </w:t>
+      </w:r>
+      <w:r>
+        <w:t xml:space="preserve">match the same</w:t>
+      </w:r>
+      <w:r>
+        <w:t xml:space="preserve"> </w:t>
+      </w:r>
+      <w:r>
+        <w:rPr>
+          <w:rStyle w:val="VerbatimChar"/>
+        </w:rPr>
+        <w:t xml:space="preserve">{label, count, sum, self_sum, pct_self, pct_total}</w:t>
+      </w:r>
+      <w:r>
+        <w:t xml:space="preserve"> </w:t>
+      </w:r>
+      <w:r>
+        <w:t xml:space="preserve">flat-entry contract.</w:t>
+      </w:r>
+    </w:p>
+    <w:p>
+      <w:pPr>
+        <w:pStyle w:val="BodyText"/>
+      </w:pPr>
+      <w:r>
+        <w:t xml:space="preserve">Per the user’s explicit direction,</w:t>
+      </w:r>
+      <w:r>
+        <w:t xml:space="preserve"> </w:t>
+      </w:r>
+      <w:r>
+        <w:rPr>
+          <w:rStyle w:val="VerbatimChar"/>
+        </w:rPr>
+        <w:t xml:space="preserve">--time-range</w:t>
+      </w:r>
+      <w:r>
+        <w:t xml:space="preserve"> </w:t>
+      </w:r>
+      <w:r>
+        <w:t xml:space="preserve">(plan 3.13) is in scope here too: both the new</w:t>
+      </w:r>
+      <w:r>
+        <w:t xml:space="preserve"> </w:t>
+      </w:r>
+      <w:r>
+        <w:t xml:space="preserve">script and</w:t>
+      </w:r>
+      <w:r>
+        <w:t xml:space="preserve"> </w:t>
+      </w:r>
+      <w:r>
+        <w:rPr>
+          <w:rStyle w:val="VerbatimChar"/>
+        </w:rPr>
+        <w:t xml:space="preserve">select_hotspot_kernels.py --trace-dir</w:t>
+      </w:r>
+      <w:r>
+        <w:t xml:space="preserve"> </w:t>
+      </w:r>
+      <w:r>
+        <w:t xml:space="preserve">accept it, so kernel selection can be scoped to</w:t>
+      </w:r>
+      <w:r>
+        <w:t xml:space="preserve"> </w:t>
+      </w:r>
+      <w:r>
+        <w:t xml:space="preserve">e.g. a single steady-state iteration instead of diluting the ranking with init/teardown time. This</w:t>
+      </w:r>
+      <w:r>
+        <w:t xml:space="preserve"> </w:t>
+      </w:r>
+      <w:r>
+        <w:t xml:space="preserve">required no new plumbing beyond wiring</w:t>
+      </w:r>
+      <w:r>
+        <w:t xml:space="preserve"> </w:t>
+      </w:r>
+      <w:r>
+        <w:rPr>
+          <w:rStyle w:val="VerbatimChar"/>
+        </w:rPr>
+        <w:t xml:space="preserve">stage6_time_range_config.add_cli_argument()</w:t>
+      </w:r>
+      <w:r>
+        <w:t xml:space="preserve">/</w:t>
+      </w:r>
+      <w:r>
+        <w:t xml:space="preserve"> </w:t>
+      </w:r>
+      <w:r>
+        <w:rPr>
+          <w:rStyle w:val="VerbatimChar"/>
+        </w:rPr>
+        <w:t xml:space="preserve">configure_from_args()</w:t>
+      </w:r>
+      <w:r>
+        <w:t xml:space="preserve"> </w:t>
+      </w:r>
+      <w:r>
+        <w:t xml:space="preserve">into</w:t>
+      </w:r>
+      <w:r>
+        <w:t xml:space="preserve"> </w:t>
+      </w:r>
+      <w:r>
+        <w:rPr>
+          <w:rStyle w:val="VerbatimChar"/>
+        </w:rPr>
+        <w:t xml:space="preserve">select_hotspot_kernels.py</w:t>
+      </w:r>
+      <w:r>
+        <w:t xml:space="preserve">’s own</w:t>
+      </w:r>
+      <w:r>
+        <w:t xml:space="preserve"> </w:t>
+      </w:r>
+      <w:r>
+        <w:rPr>
+          <w:rStyle w:val="VerbatimChar"/>
+        </w:rPr>
+        <w:t xml:space="preserve">main()</w:t>
+      </w:r>
+      <w:r>
+        <w:t xml:space="preserve"> </w:t>
+      </w:r>
+      <w:r>
+        <w:t xml:space="preserve">– the process-wide global</w:t>
+      </w:r>
+      <w:r>
+        <w:t xml:space="preserve"> </w:t>
+      </w:r>
+      <w:r>
+        <w:t xml:space="preserve">config</w:t>
+      </w:r>
+      <w:r>
+        <w:t xml:space="preserve"> </w:t>
+      </w:r>
+      <w:r>
+        <w:rPr>
+          <w:rStyle w:val="VerbatimChar"/>
+        </w:rPr>
+        <w:t xml:space="preserve">get_rank_aggregate()</w:t>
+      </w:r>
+      <w:r>
+        <w:t xml:space="preserve"> </w:t>
+      </w:r>
+      <w:r>
+        <w:t xml:space="preserve">already reads (plan 3.13’s whole point) means</w:t>
+      </w:r>
+      <w:r>
+        <w:t xml:space="preserve"> </w:t>
+      </w:r>
+      <w:r>
+        <w:rPr>
+          <w:rStyle w:val="VerbatimChar"/>
+        </w:rPr>
+        <w:t xml:space="preserve">aggregate_gpu_kernels()</w:t>
+      </w:r>
+      <w:r>
+        <w:t xml:space="preserve"> </w:t>
+      </w:r>
+      <w:r>
+        <w:t xml:space="preserve">automatically respects whatever range is active, with no time-range-specific code of its own. The</w:t>
+      </w:r>
+      <w:r>
+        <w:t xml:space="preserve"> </w:t>
+      </w:r>
+      <w:r>
+        <w:t xml:space="preserve">on-disk</w:t>
+      </w:r>
+      <w:r>
+        <w:t xml:space="preserve"> </w:t>
+      </w:r>
+      <w:r>
+        <w:rPr>
+          <w:rStyle w:val="VerbatimChar"/>
+        </w:rPr>
+        <w:t xml:space="preserve">.agg.json</w:t>
+      </w:r>
+      <w:r>
+        <w:t xml:space="preserve"> </w:t>
+      </w:r>
+      <w:r>
+        <w:t xml:space="preserve">cache is shared safely across every consumer (</w:t>
+      </w:r>
+      <w:r>
+        <w:rPr>
+          <w:rStyle w:val="VerbatimChar"/>
+        </w:rPr>
+        <w:t xml:space="preserve">aggregate()</w:t>
+      </w:r>
+      <w:r>
+        <w:t xml:space="preserve">,</w:t>
+      </w:r>
+      <w:r>
+        <w:t xml:space="preserve"> </w:t>
+      </w:r>
+      <w:r>
+        <w:rPr>
+          <w:rStyle w:val="VerbatimChar"/>
+        </w:rPr>
+        <w:t xml:space="preserve">aggregate_per_rank()</w:t>
+      </w:r>
+      <w:r>
+        <w:t xml:space="preserve">,</w:t>
+      </w:r>
+      <w:r>
+        <w:t xml:space="preserve"> </w:t>
+      </w:r>
+      <w:r>
+        <w:rPr>
+          <w:rStyle w:val="VerbatimChar"/>
+        </w:rPr>
+        <w:t xml:space="preserve">gather_timing_summary_per_rank()</w:t>
+      </w:r>
+      <w:r>
+        <w:t xml:space="preserve">, and this new function): each reads the</w:t>
+      </w:r>
+      <w:r>
+        <w:t xml:space="preserve"> </w:t>
+      </w:r>
+      <w:r>
+        <w:t xml:space="preserve">same cached, unfiltered row set and applies its own in-memory filter afterward.</w:t>
+      </w:r>
+    </w:p>
+    <w:p>
+      <w:pPr>
+        <w:pStyle w:val="BodyText"/>
+      </w:pPr>
+      <w:r>
+        <w:t xml:space="preserve">The new script itself mirrors</w:t>
+      </w:r>
+      <w:r>
+        <w:t xml:space="preserve"> </w:t>
+      </w:r>
+      <w:r>
+        <w:rPr>
+          <w:rStyle w:val="VerbatimChar"/>
+        </w:rPr>
+        <w:t xml:space="preserve">profile_hotspot_kernels.sh</w:t>
+      </w:r>
+      <w:r>
+        <w:t xml:space="preserve">’s structure and MPI multi-rank safety</w:t>
+      </w:r>
+      <w:r>
+        <w:t xml:space="preserve"> </w:t>
+      </w:r>
+      <w:r>
+        <w:t xml:space="preserve">gate verbatim (rocprof-compute’s own multi-rank output isolation is confirmed absent through</w:t>
+      </w:r>
+      <w:r>
+        <w:t xml:space="preserve"> </w:t>
+      </w:r>
+      <w:r>
+        <w:t xml:space="preserve">rocprofiler-compute 3.4.0/ROCm 7.2.x, so the gate probes the installed tool’s own</w:t>
+      </w:r>
+      <w:r>
+        <w:t xml:space="preserve"> </w:t>
+      </w:r>
+      <w:r>
+        <w:rPr>
+          <w:rStyle w:val="VerbatimChar"/>
+        </w:rPr>
+        <w:t xml:space="preserve">--help</w:t>
+      </w:r>
+      <w:r>
+        <w:t xml:space="preserve"> </w:t>
+      </w:r>
+      <w:r>
+        <w:t xml:space="preserve">output</w:t>
+      </w:r>
+      <w:r>
+        <w:t xml:space="preserve"> </w:t>
+      </w:r>
+      <w:r>
+        <w:t xml:space="preserve">and the actual</w:t>
+      </w:r>
+      <w:r>
+        <w:t xml:space="preserve"> </w:t>
+      </w:r>
+      <w:r>
+        <w:rPr>
+          <w:rStyle w:val="VerbatimChar"/>
+        </w:rPr>
+        <w:t xml:space="preserve">--mpi</w:t>
+      </w:r>
+      <w:r>
+        <w:t xml:space="preserve"> </w:t>
+      </w:r>
+      <w:r>
+        <w:t xml:space="preserve">launch command’s rank count before proceeding), and reuses</w:t>
+      </w:r>
+      <w:r>
+        <w:t xml:space="preserve"> </w:t>
+      </w:r>
+      <w:r>
+        <w:rPr>
+          <w:rStyle w:val="VerbatimChar"/>
+        </w:rPr>
+        <w:t xml:space="preserve">profile_traced_hotspots.sh</w:t>
+      </w:r>
+      <w:r>
+        <w:t xml:space="preserve">’s</w:t>
+      </w:r>
+      <w:r>
+        <w:t xml:space="preserve"> </w:t>
+      </w:r>
+      <w:r>
+        <w:t xml:space="preserve">“</w:t>
+      </w:r>
+      <w:r>
+        <w:t xml:space="preserve">trace dir, convert CSVs if not already present</w:t>
+      </w:r>
+      <w:r>
+        <w:t xml:space="preserve">”</w:t>
+      </w:r>
+      <w:r>
+        <w:t xml:space="preserve"> </w:t>
+      </w:r>
+      <w:r>
+        <w:t xml:space="preserve">pattern for its</w:t>
+      </w:r>
+      <w:r>
+        <w:t xml:space="preserve"> </w:t>
+      </w:r>
+      <w:r>
+        <w:t xml:space="preserve">required</w:t>
+      </w:r>
+      <w:r>
+        <w:t xml:space="preserve"> </w:t>
+      </w:r>
+      <w:r>
+        <w:rPr>
+          <w:rStyle w:val="VerbatimChar"/>
+        </w:rPr>
+        <w:t xml:space="preserve">--trace-dir</w:t>
+      </w:r>
+      <w:r>
+        <w:t xml:space="preserve"> </w:t>
+      </w:r>
+      <w:r>
+        <w:t xml:space="preserve">argument – unlike that script’s own non-fatal report steps, a conversion</w:t>
+      </w:r>
+      <w:r>
+        <w:t xml:space="preserve"> </w:t>
+      </w:r>
+      <w:r>
+        <w:t xml:space="preserve">failure here is fatal, since kernel selection has nothing to read without it.</w:t>
+      </w:r>
+    </w:p>
+    <w:p>
+      <w:pPr>
+        <w:pStyle w:val="BodyText"/>
+      </w:pPr>
+      <w:r>
+        <w:t xml:space="preserve">Verification: full suite grew to 750 tests, all green, including a new hand-crafted</w:t>
+      </w:r>
+      <w:r>
+        <w:t xml:space="preserve"> </w:t>
+      </w:r>
+      <w:r>
+        <w:rPr>
+          <w:rStyle w:val="VerbatimChar"/>
+        </w:rPr>
+        <w:t xml:space="preserve">trace_gpu_kernel_selection</w:t>
+      </w:r>
+      <w:r>
+        <w:t xml:space="preserve"> </w:t>
+      </w:r>
+      <w:r>
+        <w:t xml:space="preserve">fixture with a CPU function whose self-time dwarfs every kernel’s (to</w:t>
+      </w:r>
+      <w:r>
+        <w:t xml:space="preserve"> </w:t>
+      </w:r>
+      <w:r>
+        <w:t xml:space="preserve">prove the tag filter, not a</w:t>
+      </w:r>
+      <w:r>
+        <w:t xml:space="preserve"> </w:t>
+      </w:r>
+      <w:r>
+        <w:rPr>
+          <w:rStyle w:val="VerbatimChar"/>
+        </w:rPr>
+        <w:t xml:space="preserve">domain</w:t>
+      </w:r>
+      <w:r>
+        <w:t xml:space="preserve">/magnitude heuristic, is what excludes it), a kernel dispatched</w:t>
+      </w:r>
+      <w:r>
+        <w:t xml:space="preserve"> </w:t>
+      </w:r>
+      <w:r>
+        <w:t xml:space="preserve">only once (default-exclusion /</w:t>
+      </w:r>
+      <w:r>
+        <w:t xml:space="preserve"> </w:t>
+      </w:r>
+      <w:r>
+        <w:rPr>
+          <w:rStyle w:val="VerbatimChar"/>
+        </w:rPr>
+        <w:t xml:space="preserve">--all-dispatches</w:t>
+      </w:r>
+      <w:r>
+        <w:t xml:space="preserve"> </w:t>
+      </w:r>
+      <w:r>
+        <w:t xml:space="preserve">case), and two more kernels at different self-time</w:t>
+      </w:r>
+      <w:r>
+        <w:t xml:space="preserve"> </w:t>
+      </w:r>
+      <w:r>
+        <w:t xml:space="preserve">weights (for</w:t>
+      </w:r>
+      <w:r>
+        <w:t xml:space="preserve"> </w:t>
+      </w:r>
+      <w:r>
+        <w:rPr>
+          <w:rStyle w:val="VerbatimChar"/>
+        </w:rPr>
+        <w:t xml:space="preserve">--top</w:t>
+      </w:r>
+      <w:r>
+        <w:t xml:space="preserve">/</w:t>
+      </w:r>
+      <w:r>
+        <w:rPr>
+          <w:rStyle w:val="VerbatimChar"/>
+        </w:rPr>
+        <w:t xml:space="preserve">--threshold</w:t>
+      </w:r>
+      <w:r>
+        <w:t xml:space="preserve"> </w:t>
+      </w:r>
+      <w:r>
+        <w:t xml:space="preserve">ranking). Real-data verification against the same 4-rank</w:t>
+      </w:r>
+      <w:r>
+        <w:t xml:space="preserve"> </w:t>
+      </w:r>
+      <w:r>
+        <w:rPr>
+          <w:rStyle w:val="VerbatimChar"/>
+        </w:rPr>
+        <w:t xml:space="preserve">Heat_Convection_Solver</w:t>
+      </w:r>
+      <w:r>
+        <w:t xml:space="preserve"> </w:t>
+      </w:r>
+      <w:r>
+        <w:t xml:space="preserve">trace plan 3.13 used:</w:t>
+      </w:r>
+      <w:r>
+        <w:t xml:space="preserve"> </w:t>
+      </w:r>
+      <w:r>
+        <w:rPr>
+          <w:rStyle w:val="VerbatimChar"/>
+        </w:rPr>
+        <w:t xml:space="preserve">select_hotspot_kernels.py --trace-dir</w:t>
+      </w:r>
+      <w:r>
+        <w:t xml:space="preserve"> </w:t>
+      </w:r>
+      <w:r>
+        <w:t xml:space="preserve">resolved real</w:t>
+      </w:r>
+      <w:r>
+        <w:t xml:space="preserve"> </w:t>
+      </w:r>
+      <w:r>
+        <w:t xml:space="preserve">kernel names (e.g. </w:t>
+      </w:r>
+      <w:r>
+        <w:rPr>
+          <w:rStyle w:val="VerbatimChar"/>
+        </w:rPr>
+        <w:t xml:space="preserve">jacobi_residual$pressure_solver_mod_$ck_L69_8.kd</w:t>
+      </w:r>
+      <w:r>
+        <w:t xml:space="preserve">) with no CPU-side labels ever</w:t>
+      </w:r>
+      <w:r>
+        <w:t xml:space="preserve"> </w:t>
+      </w:r>
+      <w:r>
+        <w:t xml:space="preserve">appearing, and a</w:t>
+      </w:r>
+      <w:r>
+        <w:t xml:space="preserve"> </w:t>
+      </w:r>
+      <w:r>
+        <w:rPr>
+          <w:rStyle w:val="VerbatimChar"/>
+        </w:rPr>
+        <w:t xml:space="preserve">--time-range</w:t>
+      </w:r>
+      <w:r>
+        <w:t xml:space="preserve"> </w:t>
+      </w:r>
+      <w:r>
+        <w:t xml:space="preserve">window covering roughly the middle third of the real trace’s</w:t>
+      </w:r>
+      <w:r>
+        <w:t xml:space="preserve"> </w:t>
+      </w:r>
+      <w:r>
+        <w:t xml:space="preserve">~92-second span visibly changed the top-5 ranking relative to the whole-run selection –</w:t>
+      </w:r>
+      <w:r>
+        <w:t xml:space="preserve"> </w:t>
+      </w:r>
+      <w:r>
+        <w:rPr>
+          <w:rStyle w:val="VerbatimChar"/>
+        </w:rPr>
+        <w:t xml:space="preserve">rocprof-compute profile</w:t>
+      </w:r>
+      <w:r>
+        <w:t xml:space="preserve">/</w:t>
+      </w:r>
+      <w:r>
+        <w:rPr>
+          <w:rStyle w:val="VerbatimChar"/>
+        </w:rPr>
+        <w:t xml:space="preserve">analyze</w:t>
+      </w:r>
+      <w:r>
+        <w:t xml:space="preserve"> </w:t>
+      </w:r>
+      <w:r>
+        <w:t xml:space="preserve">themselves remain unverifiable on this CPU-only dev machine, per</w:t>
+      </w:r>
+      <w:r>
+        <w:t xml:space="preserve"> </w:t>
+      </w:r>
+      <w:r>
+        <w:rPr>
+          <w:rStyle w:val="VerbatimChar"/>
+        </w:rPr>
+        <w:t xml:space="preserve">CLAUDE.md</w:t>
+      </w:r>
+      <w:r>
+        <w:t xml:space="preserve">’s standing environment-constraints note.</w:t>
+      </w:r>
+    </w:p>
     <w:bookmarkEnd w:id="94"/>
+    <w:bookmarkEnd w:id="95"/>
     <w:sectPr/>
   </w:body>
 </w:document>

</xml_diff>

<commit_message>
Plan 3.15, Phase 0: test comment policy
Extends postprocess/README.md's Tests section with a comment policy for
postprocess/tests/ (750 unittest tests, 45 files, zero docstrings today),
adapted from CLAUDE.md's existing Code comments policy: a per-class table
of contents in each file's top-of-file docstring, why-only inline
comments, and explicit arbitrary-vs-significant flagging for hard-coded
test values. Includes copy-paste templates instead of pointing at
specific test files, since later phases of this same cleanup will rename
or merge those. Full 8-phase roadmap in docs/plans/3.15-test-suite-cleanup.md.

Co-Authored-By: Claude Sonnet 5 <noreply@anthropic.com>
</commit_message>
<xml_diff>
--- a/docs/DEVELOPMENT_HISTORY.docx
+++ b/docs/DEVELOPMENT_HISTORY.docx
@@ -10,7 +10,7 @@
         <w:t xml:space="preserve">Development History</w:t>
       </w:r>
     </w:p>
-    <w:bookmarkStart w:id="95" w:name="development-history"/>
+    <w:bookmarkStart w:id="96" w:name="development-history"/>
     <w:p>
       <w:pPr>
         <w:pStyle w:val="Heading1"/>
@@ -5081,6 +5081,77 @@
           </w:p>
         </w:tc>
       </w:tr>
+      <w:tr>
+        <w:tc>
+          <w:tcPr/>
+          <w:p>
+            <w:pPr>
+              <w:pStyle w:val="Compact"/>
+              <w:jc w:val="left"/>
+            </w:pPr>
+            <w:r>
+              <w:t xml:space="preserve">2026-08-27</w:t>
+            </w:r>
+          </w:p>
+        </w:tc>
+        <w:tc>
+          <w:tcPr/>
+          <w:p>
+            <w:pPr>
+              <w:pStyle w:val="Compact"/>
+              <w:jc w:val="left"/>
+            </w:pPr>
+            <w:r>
+              <w:t xml:space="preserve">Plan 3.15 (Phase 0 of 8): test comment policy written into</w:t>
+            </w:r>
+            <w:r>
+              <w:t xml:space="preserve"> </w:t>
+            </w:r>
+            <w:r>
+              <w:rPr>
+                <w:rStyle w:val="VerbatimChar"/>
+              </w:rPr>
+              <w:t xml:space="preserve">postprocess/README.md</w:t>
+            </w:r>
+            <w:r>
+              <w:t xml:space="preserve">’s</w:t>
+            </w:r>
+            <w:r>
+              <w:t xml:space="preserve"> </w:t>
+            </w:r>
+            <w:r>
+              <w:t xml:space="preserve">“</w:t>
+            </w:r>
+            <w:r>
+              <w:t xml:space="preserve">Tests</w:t>
+            </w:r>
+            <w:r>
+              <w:t xml:space="preserve">”</w:t>
+            </w:r>
+            <w:r>
+              <w:t xml:space="preserve"> </w:t>
+            </w:r>
+            <w:r>
+              <w:t xml:space="preserve">section, ahead of a multi-phase</w:t>
+            </w:r>
+            <w:r>
+              <w:t xml:space="preserve"> </w:t>
+            </w:r>
+            <w:r>
+              <w:rPr>
+                <w:rStyle w:val="VerbatimChar"/>
+              </w:rPr>
+              <w:t xml:space="preserve">postprocess/tests/</w:t>
+            </w:r>
+            <w:r>
+              <w:t xml:space="preserve"> </w:t>
+            </w:r>
+            <w:r>
+              <w:t xml:space="preserve">maintainability cleanup – see full accounting below</w:t>
+            </w:r>
+          </w:p>
+        </w:tc>
+      </w:tr>
     </w:tbl>
     <w:bookmarkStart w:id="20" w:name="project-scaffolding-and-rules"/>
     <w:p>
@@ -63224,7 +63295,442 @@
       </w:r>
     </w:p>
     <w:bookmarkEnd w:id="94"/>
+    <w:bookmarkStart w:id="95" w:name="plan-3.15-phase-0-test-comment-policy"/>
+    <w:p>
+      <w:pPr>
+        <w:pStyle w:val="Heading2"/>
+      </w:pPr>
+      <w:r>
+        <w:t xml:space="preserve">2026-08-27 — Plan 3.15, Phase 0: test comment policy</w:t>
+      </w:r>
+    </w:p>
+    <w:p>
+      <w:pPr>
+        <w:pStyle w:val="FirstParagraph"/>
+      </w:pPr>
+      <w:r>
+        <w:t xml:space="preserve">A full audit of</w:t>
+      </w:r>
+      <w:r>
+        <w:t xml:space="preserve"> </w:t>
+      </w:r>
+      <w:r>
+        <w:rPr>
+          <w:rStyle w:val="VerbatimChar"/>
+        </w:rPr>
+        <w:t xml:space="preserve">postprocess/tests/</w:t>
+      </w:r>
+      <w:r>
+        <w:t xml:space="preserve"> </w:t>
+      </w:r>
+      <w:r>
+        <w:t xml:space="preserve">(750</w:t>
+      </w:r>
+      <w:r>
+        <w:t xml:space="preserve"> </w:t>
+      </w:r>
+      <w:r>
+        <w:rPr>
+          <w:rStyle w:val="VerbatimChar"/>
+        </w:rPr>
+        <w:t xml:space="preserve">unittest</w:t>
+      </w:r>
+      <w:r>
+        <w:t xml:space="preserve"> </w:t>
+      </w:r>
+      <w:r>
+        <w:t xml:space="preserve">tests across 45 files) found zero shared</w:t>
+      </w:r>
+      <w:r>
+        <w:t xml:space="preserve"> </w:t>
+      </w:r>
+      <w:r>
+        <w:t xml:space="preserve">helpers, zero docstrings, and heavy copy-paste – most notably the same</w:t>
+      </w:r>
+      <w:r>
+        <w:t xml:space="preserve"> </w:t>
+      </w:r>
+      <w:r>
+        <w:rPr>
+          <w:rStyle w:val="VerbatimChar"/>
+        </w:rPr>
+        <w:t xml:space="preserve">importlib.util</w:t>
+      </w:r>
+      <w:r>
+        <w:t xml:space="preserve"> </w:t>
+      </w:r>
+      <w:r>
+        <w:t xml:space="preserve">module-loading dance repeated in roughly 35 files, and at least four incompatible</w:t>
+      </w:r>
+      <w:r>
+        <w:t xml:space="preserve"> </w:t>
+      </w:r>
+      <w:r>
+        <w:rPr>
+          <w:rStyle w:val="VerbatimChar"/>
+        </w:rPr>
+        <w:t xml:space="preserve">make_row</w:t>
+      </w:r>
+      <w:r>
+        <w:t xml:space="preserve">/</w:t>
+      </w:r>
+      <w:r>
+        <w:t xml:space="preserve"> </w:t>
+      </w:r>
+      <w:r>
+        <w:rPr>
+          <w:rStyle w:val="VerbatimChar"/>
+        </w:rPr>
+        <w:t xml:space="preserve">make_raw_row</w:t>
+      </w:r>
+      <w:r>
+        <w:t xml:space="preserve">-family helpers sharing confusingly similar names across different files. Plan 3.15</w:t>
+      </w:r>
+      <w:r>
+        <w:t xml:space="preserve"> </w:t>
+      </w:r>
+      <w:r>
+        <w:t xml:space="preserve">(</w:t>
+      </w:r>
+      <w:r>
+        <w:rPr>
+          <w:rStyle w:val="VerbatimChar"/>
+        </w:rPr>
+        <w:t xml:space="preserve">docs/plans/3.15-test-suite-cleanup.md</w:t>
+      </w:r>
+      <w:r>
+        <w:t xml:space="preserve">) lays out an 8-phase cleanup: shared helpers, duplication</w:t>
+      </w:r>
+      <w:r>
+        <w:t xml:space="preserve"> </w:t>
+      </w:r>
+      <w:r>
+        <w:t xml:space="preserve">consolidation, a per-file test-scope audit, trivial-test cleanup, a comments pass, and a final</w:t>
+      </w:r>
+      <w:r>
+        <w:t xml:space="preserve"> </w:t>
+      </w:r>
+      <w:r>
+        <w:t xml:space="preserve">coverage check against the real codebase – executed one phase at a time, each manually verified</w:t>
+      </w:r>
+      <w:r>
+        <w:t xml:space="preserve"> </w:t>
+      </w:r>
+      <w:r>
+        <w:t xml:space="preserve">before the next starts.</w:t>
+      </w:r>
+    </w:p>
+    <w:p>
+      <w:pPr>
+        <w:pStyle w:val="BodyText"/>
+      </w:pPr>
+      <w:r>
+        <w:t xml:space="preserve">This is Phase 0: before touching any test file,</w:t>
+      </w:r>
+      <w:r>
+        <w:t xml:space="preserve"> </w:t>
+      </w:r>
+      <w:r>
+        <w:rPr>
+          <w:rStyle w:val="VerbatimChar"/>
+        </w:rPr>
+        <w:t xml:space="preserve">postprocess/README.md</w:t>
+      </w:r>
+      <w:r>
+        <w:t xml:space="preserve">’s existing</w:t>
+      </w:r>
+      <w:r>
+        <w:t xml:space="preserve"> </w:t>
+      </w:r>
+      <w:r>
+        <w:t xml:space="preserve">“</w:t>
+      </w:r>
+      <w:r>
+        <w:t xml:space="preserve">Tests</w:t>
+      </w:r>
+      <w:r>
+        <w:t xml:space="preserve">”</w:t>
+      </w:r>
+      <w:r>
+        <w:t xml:space="preserve"> </w:t>
+      </w:r>
+      <w:r>
+        <w:t xml:space="preserve">section</w:t>
+      </w:r>
+      <w:r>
+        <w:t xml:space="preserve"> </w:t>
+      </w:r>
+      <w:r>
+        <w:t xml:space="preserve">gained a new</w:t>
+      </w:r>
+      <w:r>
+        <w:t xml:space="preserve"> </w:t>
+      </w:r>
+      <w:r>
+        <w:t xml:space="preserve">“</w:t>
+      </w:r>
+      <w:r>
+        <w:t xml:space="preserve">Test comments</w:t>
+      </w:r>
+      <w:r>
+        <w:t xml:space="preserve">”</w:t>
+      </w:r>
+      <w:r>
+        <w:t xml:space="preserve"> </w:t>
+      </w:r>
+      <w:r>
+        <w:t xml:space="preserve">subsection, adapting</w:t>
+      </w:r>
+      <w:r>
+        <w:t xml:space="preserve"> </w:t>
+      </w:r>
+      <w:r>
+        <w:rPr>
+          <w:rStyle w:val="VerbatimChar"/>
+        </w:rPr>
+        <w:t xml:space="preserve">CLAUDE.md</w:t>
+      </w:r>
+      <w:r>
+        <w:t xml:space="preserve">’s existing</w:t>
+      </w:r>
+      <w:r>
+        <w:t xml:space="preserve"> </w:t>
+      </w:r>
+      <w:r>
+        <w:t xml:space="preserve">“</w:t>
+      </w:r>
+      <w:r>
+        <w:t xml:space="preserve">Code comments</w:t>
+      </w:r>
+      <w:r>
+        <w:t xml:space="preserve">”</w:t>
+      </w:r>
+      <w:r>
+        <w:t xml:space="preserve"> </w:t>
+      </w:r>
+      <w:r>
+        <w:t xml:space="preserve">policy</w:t>
+      </w:r>
+      <w:r>
+        <w:t xml:space="preserve"> </w:t>
+      </w:r>
+      <w:r>
+        <w:t xml:space="preserve">(current behavior not history, a top-of-file docstring per module, write for a new developer not a</w:t>
+      </w:r>
+      <w:r>
+        <w:t xml:space="preserve"> </w:t>
+      </w:r>
+      <w:r>
+        <w:t xml:space="preserve">project historian) to test files specifically, with two additions: the top-of-file docstring must</w:t>
+      </w:r>
+      <w:r>
+        <w:t xml:space="preserve"> </w:t>
+      </w:r>
+      <w:r>
+        <w:t xml:space="preserve">list each</w:t>
+      </w:r>
+      <w:r>
+        <w:t xml:space="preserve"> </w:t>
+      </w:r>
+      <w:r>
+        <w:rPr>
+          <w:rStyle w:val="VerbatimChar"/>
+        </w:rPr>
+        <w:t xml:space="preserve">TestCase</w:t>
+      </w:r>
+      <w:r>
+        <w:t xml:space="preserve"> </w:t>
+      </w:r>
+      <w:r>
+        <w:t xml:space="preserve">class in the file with a one-line description (a table of contents, given each</w:t>
+      </w:r>
+      <w:r>
+        <w:t xml:space="preserve"> </w:t>
+      </w:r>
+      <w:r>
+        <w:t xml:space="preserve">file has dozens of tests and zero navigation aids today), and every hard-coded value in a test must</w:t>
+      </w:r>
+      <w:r>
+        <w:t xml:space="preserve"> </w:t>
+      </w:r>
+      <w:r>
+        <w:t xml:space="preserve">make clear whether it’s arbitrary or tied to something real (a documented rocprof field, a module</w:t>
+      </w:r>
+      <w:r>
+        <w:t xml:space="preserve"> </w:t>
+      </w:r>
+      <w:r>
+        <w:t xml:space="preserve">constant, a specific fixture file’s content), so a reader never has to guess whether changing a</w:t>
+      </w:r>
+      <w:r>
+        <w:t xml:space="preserve"> </w:t>
+      </w:r>
+      <w:r>
+        <w:t xml:space="preserve">number would break something real or just be cosmetic. Rather than pointing at specific test files</w:t>
+      </w:r>
+      <w:r>
+        <w:t xml:space="preserve"> </w:t>
+      </w:r>
+      <w:r>
+        <w:t xml:space="preserve">as examples (which this same cleanup will go on to rename, merge, or delete in later phases), the</w:t>
+      </w:r>
+      <w:r>
+        <w:t xml:space="preserve"> </w:t>
+      </w:r>
+      <w:r>
+        <w:t xml:space="preserve">policy includes small self-contained copy-paste templates demonstrating both rules at once. Landing</w:t>
+      </w:r>
+      <w:r>
+        <w:t xml:space="preserve"> </w:t>
+      </w:r>
+      <w:r>
+        <w:t xml:space="preserve">the policy first means</w:t>
+      </w:r>
+      <w:r>
+        <w:t xml:space="preserve"> </w:t>
+      </w:r>
+      <w:r>
+        <w:t xml:space="preserve">every later phase’s new or touched code already has a standard to follow, rather than needing a</w:t>
+      </w:r>
+      <w:r>
+        <w:t xml:space="preserve"> </w:t>
+      </w:r>
+      <w:r>
+        <w:t xml:space="preserve">separate cleanup pass at the end for code written during the cleanup itself.</w:t>
+      </w:r>
+    </w:p>
+    <w:p>
+      <w:pPr>
+        <w:pStyle w:val="BodyText"/>
+      </w:pPr>
+      <w:r>
+        <w:t xml:space="preserve">One notable decision baked into the plan itself: the cleanup stays on plain</w:t>
+      </w:r>
+      <w:r>
+        <w:t xml:space="preserve"> </w:t>
+      </w:r>
+      <w:r>
+        <w:rPr>
+          <w:rStyle w:val="VerbatimChar"/>
+        </w:rPr>
+        <w:t xml:space="preserve">unittest</w:t>
+      </w:r>
+      <w:r>
+        <w:t xml:space="preserve"> </w:t>
+      </w:r>
+      <w:r>
+        <w:t xml:space="preserve">+</w:t>
+      </w:r>
+      <w:r>
+        <w:t xml:space="preserve"> </w:t>
+      </w:r>
+      <w:r>
+        <w:rPr>
+          <w:rStyle w:val="VerbatimChar"/>
+        </w:rPr>
+        <w:t xml:space="preserve">subTest()</w:t>
+      </w:r>
+      <w:r>
+        <w:t xml:space="preserve"> </w:t>
+      </w:r>
+      <w:r>
+        <w:t xml:space="preserve">rather than adopting pytest, since</w:t>
+      </w:r>
+      <w:r>
+        <w:t xml:space="preserve"> </w:t>
+      </w:r>
+      <w:r>
+        <w:rPr>
+          <w:rStyle w:val="VerbatimChar"/>
+        </w:rPr>
+        <w:t xml:space="preserve">docs/plans/1.11-pop-metrics-tool.md</w:t>
+      </w:r>
+      <w:r>
+        <w:t xml:space="preserve"> </w:t>
+      </w:r>
+      <w:r>
+        <w:t xml:space="preserve">already</w:t>
+      </w:r>
+      <w:r>
+        <w:t xml:space="preserve"> </w:t>
+      </w:r>
+      <w:r>
+        <w:t xml:space="preserve">documents</w:t>
+      </w:r>
+      <w:r>
+        <w:t xml:space="preserve"> </w:t>
+      </w:r>
+      <w:r>
+        <w:t xml:space="preserve">“</w:t>
+      </w:r>
+      <w:r>
+        <w:t xml:space="preserve">plain unittest… no pytest/CI config</w:t>
+      </w:r>
+      <w:r>
+        <w:t xml:space="preserve">”</w:t>
+      </w:r>
+      <w:r>
+        <w:t xml:space="preserve"> </w:t>
+      </w:r>
+      <w:r>
+        <w:t xml:space="preserve">as this project’s policy, and staying dependency-free</w:t>
+      </w:r>
+      <w:r>
+        <w:t xml:space="preserve"> </w:t>
+      </w:r>
+      <w:r>
+        <w:t xml:space="preserve">matters for HPC/offline environments this toolchain targets.</w:t>
+      </w:r>
+    </w:p>
+    <w:p>
+      <w:pPr>
+        <w:pStyle w:val="BodyText"/>
+      </w:pPr>
+      <w:r>
+        <w:t xml:space="preserve">Verification: no test files touched in this phase, so the suite is unchanged at</w:t>
+      </w:r>
+      <w:r>
+        <w:t xml:space="preserve"> </w:t>
+      </w:r>
+      <w:r>
+        <w:rPr>
+          <w:rStyle w:val="VerbatimChar"/>
+        </w:rPr>
+        <w:t xml:space="preserve">Ran 750 tests ... OK</w:t>
+      </w:r>
+      <w:r>
+        <w:t xml:space="preserve"> </w:t>
+      </w:r>
+      <w:r>
+        <w:t xml:space="preserve">(</w:t>
+      </w:r>
+      <w:r>
+        <w:rPr>
+          <w:rStyle w:val="VerbatimChar"/>
+        </w:rPr>
+        <w:t xml:space="preserve">python3 -m unittest discover -s tests -t .</w:t>
+      </w:r>
+      <w:r>
+        <w:t xml:space="preserve"> </w:t>
+      </w:r>
+      <w:r>
+        <w:t xml:space="preserve">from</w:t>
+      </w:r>
+      <w:r>
+        <w:t xml:space="preserve"> </w:t>
+      </w:r>
+      <w:r>
+        <w:rPr>
+          <w:rStyle w:val="VerbatimChar"/>
+        </w:rPr>
+        <w:t xml:space="preserve">postprocess/</w:t>
+      </w:r>
+      <w:r>
+        <w:t xml:space="preserve">).</w:t>
+      </w:r>
+    </w:p>
     <w:bookmarkEnd w:id="95"/>
+    <w:bookmarkEnd w:id="96"/>
     <w:sectPr/>
   </w:body>
 </w:document>

</xml_diff>

<commit_message>
Plan 3.15, Phase 1: shared test helper module
New postprocess/tests/_test_helpers.py replaces the copy-pasted
importlib.util module-loading dance in 41 test files with one
load_module_by_path() call each (net -298 lines); its isolated=True
path preserves test_stage6_noise_config.py's sys.modules save/restore
behavior. Also renames the colliding make_row/make_raw_row helpers
(different shapes, same name, across 7 files) to purpose-specific
names, and replaces test_stage4_rocprofsys_trace_tree.py's local
flatten() -- a byte-for-byte reimplementation -- with a real import of
stage4_rocprofsys_common.flatten_tree().

Suite unchanged at 750 tests, all green: this phase only relocates
loading mechanics, no consolidation yet.

Co-Authored-By: Claude Sonnet 5 <noreply@anthropic.com>
</commit_message>
<xml_diff>
--- a/docs/DEVELOPMENT_HISTORY.docx
+++ b/docs/DEVELOPMENT_HISTORY.docx
@@ -10,7 +10,7 @@
         <w:t xml:space="preserve">Development History</w:t>
       </w:r>
     </w:p>
-    <w:bookmarkStart w:id="96" w:name="development-history"/>
+    <w:bookmarkStart w:id="97" w:name="development-history"/>
     <w:p>
       <w:pPr>
         <w:pStyle w:val="Heading1"/>
@@ -5152,6 +5152,116 @@
           </w:p>
         </w:tc>
       </w:tr>
+      <w:tr>
+        <w:tc>
+          <w:tcPr/>
+          <w:p>
+            <w:pPr>
+              <w:pStyle w:val="Compact"/>
+              <w:jc w:val="left"/>
+            </w:pPr>
+            <w:r>
+              <w:t xml:space="preserve">2026-08-27</w:t>
+            </w:r>
+          </w:p>
+        </w:tc>
+        <w:tc>
+          <w:tcPr/>
+          <w:p>
+            <w:pPr>
+              <w:pStyle w:val="Compact"/>
+              <w:jc w:val="left"/>
+            </w:pPr>
+            <w:r>
+              <w:t xml:space="preserve">Plan 3.15 (Phase 1 of 8): new</w:t>
+            </w:r>
+            <w:r>
+              <w:t xml:space="preserve"> </w:t>
+            </w:r>
+            <w:r>
+              <w:rPr>
+                <w:rStyle w:val="VerbatimChar"/>
+              </w:rPr>
+              <w:t xml:space="preserve">postprocess/tests/_test_helpers.py</w:t>
+            </w:r>
+            <w:r>
+              <w:t xml:space="preserve"> </w:t>
+            </w:r>
+            <w:r>
+              <w:t xml:space="preserve">replaces the copy-pasted</w:t>
+            </w:r>
+            <w:r>
+              <w:t xml:space="preserve"> </w:t>
+            </w:r>
+            <w:r>
+              <w:rPr>
+                <w:rStyle w:val="VerbatimChar"/>
+              </w:rPr>
+              <w:t xml:space="preserve">importlib.util</w:t>
+            </w:r>
+            <w:r>
+              <w:t xml:space="preserve"> </w:t>
+            </w:r>
+            <w:r>
+              <w:t xml:space="preserve">module-loading dance in 41 test files; colliding</w:t>
+            </w:r>
+            <w:r>
+              <w:t xml:space="preserve"> </w:t>
+            </w:r>
+            <w:r>
+              <w:rPr>
+                <w:rStyle w:val="VerbatimChar"/>
+              </w:rPr>
+              <w:t xml:space="preserve">make_row</w:t>
+            </w:r>
+            <w:r>
+              <w:t xml:space="preserve">/</w:t>
+            </w:r>
+            <w:r>
+              <w:rPr>
+                <w:rStyle w:val="VerbatimChar"/>
+              </w:rPr>
+              <w:t xml:space="preserve">make_raw_row</w:t>
+            </w:r>
+            <w:r>
+              <w:t xml:space="preserve"> </w:t>
+            </w:r>
+            <w:r>
+              <w:t xml:space="preserve">helper names resolved to purpose-specific names; a reimplemented</w:t>
+            </w:r>
+            <w:r>
+              <w:t xml:space="preserve"> </w:t>
+            </w:r>
+            <w:r>
+              <w:rPr>
+                <w:rStyle w:val="VerbatimChar"/>
+              </w:rPr>
+              <w:t xml:space="preserve">flatten()</w:t>
+            </w:r>
+            <w:r>
+              <w:t xml:space="preserve"> </w:t>
+            </w:r>
+            <w:r>
+              <w:t xml:space="preserve">in one test file replaced with the real</w:t>
+            </w:r>
+            <w:r>
+              <w:t xml:space="preserve"> </w:t>
+            </w:r>
+            <w:r>
+              <w:rPr>
+                <w:rStyle w:val="VerbatimChar"/>
+              </w:rPr>
+              <w:t xml:space="preserve">flatten_tree()</w:t>
+            </w:r>
+            <w:r>
+              <w:t xml:space="preserve"> </w:t>
+            </w:r>
+            <w:r>
+              <w:t xml:space="preserve">– see full accounting below</w:t>
+            </w:r>
+          </w:p>
+        </w:tc>
+      </w:tr>
     </w:tbl>
     <w:bookmarkStart w:id="20" w:name="project-scaffolding-and-rules"/>
     <w:p>
@@ -63730,7 +63840,463 @@
       </w:r>
     </w:p>
     <w:bookmarkEnd w:id="95"/>
+    <w:bookmarkStart w:id="96" w:name="X9e17af1cb0cd2a5ca3686ab4bf2a34aa3093eb1"/>
+    <w:p>
+      <w:pPr>
+        <w:pStyle w:val="Heading2"/>
+      </w:pPr>
+      <w:r>
+        <w:t xml:space="preserve">2026-08-27 — Plan 3.15, Phase 1: shared test helper module</w:t>
+      </w:r>
+    </w:p>
+    <w:p>
+      <w:pPr>
+        <w:pStyle w:val="FirstParagraph"/>
+      </w:pPr>
+      <w:r>
+        <w:t xml:space="preserve">Mechanical follow-up to Phase 0, with the suite’s biggest single source of raw duplication as the</w:t>
+      </w:r>
+      <w:r>
+        <w:t xml:space="preserve"> </w:t>
+      </w:r>
+      <w:r>
+        <w:t xml:space="preserve">target: 41 of 45 test files independently repeated the same</w:t>
+      </w:r>
+      <w:r>
+        <w:t xml:space="preserve"> </w:t>
+      </w:r>
+      <w:r>
+        <w:rPr>
+          <w:rStyle w:val="VerbatimChar"/>
+        </w:rPr>
+        <w:t xml:space="preserve">importlib.util.spec_from_file_location</w:t>
+      </w:r>
+      <w:r>
+        <w:t xml:space="preserve"> </w:t>
+      </w:r>
+      <w:r>
+        <w:t xml:space="preserve">module-loading dance (roughly 7-15 lines each, depending on whether a</w:t>
+      </w:r>
+      <w:r>
+        <w:t xml:space="preserve"> </w:t>
+      </w:r>
+      <w:r>
+        <w:rPr>
+          <w:rStyle w:val="VerbatimChar"/>
+        </w:rPr>
+        <w:t xml:space="preserve">MODULE_PATH</w:t>
+      </w:r>
+      <w:r>
+        <w:t xml:space="preserve"> </w:t>
+      </w:r>
+      <w:r>
+        <w:t xml:space="preserve">variable or an</w:t>
+      </w:r>
+      <w:r>
+        <w:t xml:space="preserve"> </w:t>
+      </w:r>
+      <w:r>
+        <w:t xml:space="preserve">inline</w:t>
+      </w:r>
+      <w:r>
+        <w:t xml:space="preserve"> </w:t>
+      </w:r>
+      <w:r>
+        <w:rPr>
+          <w:rStyle w:val="VerbatimChar"/>
+        </w:rPr>
+        <w:t xml:space="preserve">os.path.join()</w:t>
+      </w:r>
+      <w:r>
+        <w:t xml:space="preserve"> </w:t>
+      </w:r>
+      <w:r>
+        <w:t xml:space="preserve">was used). New</w:t>
+      </w:r>
+      <w:r>
+        <w:t xml:space="preserve"> </w:t>
+      </w:r>
+      <w:r>
+        <w:rPr>
+          <w:rStyle w:val="VerbatimChar"/>
+        </w:rPr>
+        <w:t xml:space="preserve">postprocess/tests/_test_helpers.py</w:t>
+      </w:r>
+      <w:r>
+        <w:t xml:space="preserve"> </w:t>
+      </w:r>
+      <w:r>
+        <w:t xml:space="preserve">exposes one function,</w:t>
+      </w:r>
+      <w:r>
+        <w:t xml:space="preserve"> </w:t>
+      </w:r>
+      <w:r>
+        <w:rPr>
+          <w:rStyle w:val="VerbatimChar"/>
+        </w:rPr>
+        <w:t xml:space="preserve">load_module_by_path(name, *path_parts, isolated=False)</w:t>
+      </w:r>
+      <w:r>
+        <w:t xml:space="preserve">, that every one of those 41 files now calls</w:t>
+      </w:r>
+      <w:r>
+        <w:t xml:space="preserve"> </w:t>
+      </w:r>
+      <w:r>
+        <w:t xml:space="preserve">instead – net -298 lines across the suite. The</w:t>
+      </w:r>
+      <w:r>
+        <w:t xml:space="preserve"> </w:t>
+      </w:r>
+      <w:r>
+        <w:rPr>
+          <w:rStyle w:val="VerbatimChar"/>
+        </w:rPr>
+        <w:t xml:space="preserve">isolated=True</w:t>
+      </w:r>
+      <w:r>
+        <w:t xml:space="preserve"> </w:t>
+      </w:r>
+      <w:r>
+        <w:t xml:space="preserve">path preserves</w:t>
+      </w:r>
+      <w:r>
+        <w:t xml:space="preserve"> </w:t>
+      </w:r>
+      <w:r>
+        <w:rPr>
+          <w:rStyle w:val="VerbatimChar"/>
+        </w:rPr>
+        <w:t xml:space="preserve">test_stage6_noise_config.py</w:t>
+      </w:r>
+      <w:r>
+        <w:t xml:space="preserve">’s existing (and necessary) behavior of restoring the previous</w:t>
+      </w:r>
+      <w:r>
+        <w:t xml:space="preserve"> </w:t>
+      </w:r>
+      <w:r>
+        <w:rPr>
+          <w:rStyle w:val="VerbatimChar"/>
+        </w:rPr>
+        <w:t xml:space="preserve">sys.modules</w:t>
+      </w:r>
+      <w:r>
+        <w:t xml:space="preserve"> </w:t>
+      </w:r>
+      <w:r>
+        <w:t xml:space="preserve">entry after loading its own copy, rather than permanently clobbering the shared</w:t>
+      </w:r>
+      <w:r>
+        <w:t xml:space="preserve"> </w:t>
+      </w:r>
+      <w:r>
+        <w:t xml:space="preserve">instance</w:t>
+      </w:r>
+      <w:r>
+        <w:t xml:space="preserve"> </w:t>
+      </w:r>
+      <w:r>
+        <w:rPr>
+          <w:rStyle w:val="VerbatimChar"/>
+        </w:rPr>
+        <w:t xml:space="preserve">stage3_rocprofsys_common.py</w:t>
+      </w:r>
+      <w:r>
+        <w:t xml:space="preserve"> </w:t>
+      </w:r>
+      <w:r>
+        <w:t xml:space="preserve">captured a direct function reference from at import time –</w:t>
+      </w:r>
+      <w:r>
+        <w:t xml:space="preserve"> </w:t>
+      </w:r>
+      <w:r>
+        <w:t xml:space="preserve">that mechanism moved into the helper’s own docstring rather than being explained locally in every</w:t>
+      </w:r>
+      <w:r>
+        <w:t xml:space="preserve"> </w:t>
+      </w:r>
+      <w:r>
+        <w:t xml:space="preserve">file that doesn’t need it. The other module-loading style (</w:t>
+      </w:r>
+      <w:r>
+        <w:rPr>
+          <w:rStyle w:val="VerbatimChar"/>
+        </w:rPr>
+        <w:t xml:space="preserve">postprocess/README.md</w:t>
+      </w:r>
+      <w:r>
+        <w:t xml:space="preserve">’s documented</w:t>
+      </w:r>
+      <w:r>
+        <w:t xml:space="preserve"> </w:t>
+      </w:r>
+      <w:r>
+        <w:t xml:space="preserve">plain</w:t>
+      </w:r>
+      <w:r>
+        <w:t xml:space="preserve"> </w:t>
+      </w:r>
+      <w:r>
+        <w:rPr>
+          <w:rStyle w:val="VerbatimChar"/>
+        </w:rPr>
+        <w:t xml:space="preserve">from stageN_x import y</w:t>
+      </w:r>
+      <w:r>
+        <w:t xml:space="preserve">, used where a test doesn’t need a fresh isolated instance) was left</w:t>
+      </w:r>
+      <w:r>
+        <w:t xml:space="preserve"> </w:t>
+      </w:r>
+      <w:r>
+        <w:t xml:space="preserve">untouched, since the two styles are already intentional, not an inconsistency to unify away.</w:t>
+      </w:r>
+    </w:p>
+    <w:p>
+      <w:pPr>
+        <w:pStyle w:val="BodyText"/>
+      </w:pPr>
+      <w:r>
+        <w:t xml:space="preserve">Also in this phase, same</w:t>
+      </w:r>
+      <w:r>
+        <w:t xml:space="preserve"> </w:t>
+      </w:r>
+      <w:r>
+        <w:t xml:space="preserve">“</w:t>
+      </w:r>
+      <w:r>
+        <w:t xml:space="preserve">mechanical, no behavior change</w:t>
+      </w:r>
+      <w:r>
+        <w:t xml:space="preserve">”</w:t>
+      </w:r>
+      <w:r>
+        <w:t xml:space="preserve"> </w:t>
+      </w:r>
+      <w:r>
+        <w:t xml:space="preserve">theme: the four incompatible</w:t>
+      </w:r>
+      <w:r>
+        <w:t xml:space="preserve"> </w:t>
+      </w:r>
+      <w:r>
+        <w:rPr>
+          <w:rStyle w:val="VerbatimChar"/>
+        </w:rPr>
+        <w:t xml:space="preserve">make_row</w:t>
+      </w:r>
+      <w:r>
+        <w:t xml:space="preserve"> </w:t>
+      </w:r>
+      <w:r>
+        <w:t xml:space="preserve">helpers (and one</w:t>
+      </w:r>
+      <w:r>
+        <w:t xml:space="preserve"> </w:t>
+      </w:r>
+      <w:r>
+        <w:rPr>
+          <w:rStyle w:val="VerbatimChar"/>
+        </w:rPr>
+        <w:t xml:space="preserve">make_raw_row</w:t>
+      </w:r>
+      <w:r>
+        <w:t xml:space="preserve">) that shared confusingly similar names across different files –</w:t>
+      </w:r>
+      <w:r>
+        <w:t xml:space="preserve"> </w:t>
+      </w:r>
+      <w:r>
+        <w:t xml:space="preserve">each building a differently-shaped synthetic test row – were renamed to purpose-specific names</w:t>
+      </w:r>
+      <w:r>
+        <w:t xml:space="preserve"> </w:t>
+      </w:r>
+      <w:r>
+        <w:t xml:space="preserve">(</w:t>
+      </w:r>
+      <w:r>
+        <w:rPr>
+          <w:rStyle w:val="VerbatimChar"/>
+        </w:rPr>
+        <w:t xml:space="preserve">make_label_parent_row</w:t>
+      </w:r>
+      <w:r>
+        <w:t xml:space="preserve">,</w:t>
+      </w:r>
+      <w:r>
+        <w:t xml:space="preserve"> </w:t>
+      </w:r>
+      <w:r>
+        <w:rPr>
+          <w:rStyle w:val="VerbatimChar"/>
+        </w:rPr>
+        <w:t xml:space="preserve">make_merged_tree_node</w:t>
+      </w:r>
+      <w:r>
+        <w:t xml:space="preserve">,</w:t>
+      </w:r>
+      <w:r>
+        <w:t xml:space="preserve"> </w:t>
+      </w:r>
+      <w:r>
+        <w:rPr>
+          <w:rStyle w:val="VerbatimChar"/>
+        </w:rPr>
+        <w:t xml:space="preserve">make_taggable_row</w:t>
+      </w:r>
+      <w:r>
+        <w:t xml:space="preserve">,</w:t>
+      </w:r>
+      <w:r>
+        <w:t xml:space="preserve"> </w:t>
+      </w:r>
+      <w:r>
+        <w:rPr>
+          <w:rStyle w:val="VerbatimChar"/>
+        </w:rPr>
+        <w:t xml:space="preserve">make_category_row</w:t>
+      </w:r>
+      <w:r>
+        <w:t xml:space="preserve">,</w:t>
+      </w:r>
+      <w:r>
+        <w:t xml:space="preserve"> </w:t>
+      </w:r>
+      <w:r>
+        <w:rPr>
+          <w:rStyle w:val="VerbatimChar"/>
+        </w:rPr>
+        <w:t xml:space="preserve">make_raw_trace_row</w:t>
+      </w:r>
+      <w:r>
+        <w:t xml:space="preserve">) so the same name never means two different shapes across files anymore. And</w:t>
+      </w:r>
+      <w:r>
+        <w:t xml:space="preserve"> </w:t>
+      </w:r>
+      <w:r>
+        <w:rPr>
+          <w:rStyle w:val="VerbatimChar"/>
+        </w:rPr>
+        <w:t xml:space="preserve">test_stage4_rocprofsys_trace_tree.py</w:t>
+      </w:r>
+      <w:r>
+        <w:t xml:space="preserve">’s local</w:t>
+      </w:r>
+      <w:r>
+        <w:t xml:space="preserve"> </w:t>
+      </w:r>
+      <w:r>
+        <w:rPr>
+          <w:rStyle w:val="VerbatimChar"/>
+        </w:rPr>
+        <w:t xml:space="preserve">flatten()</w:t>
+      </w:r>
+      <w:r>
+        <w:t xml:space="preserve"> </w:t>
+      </w:r>
+      <w:r>
+        <w:t xml:space="preserve">helper, a byte-for-byte reimplementation</w:t>
+      </w:r>
+      <w:r>
+        <w:t xml:space="preserve"> </w:t>
+      </w:r>
+      <w:r>
+        <w:t xml:space="preserve">of</w:t>
+      </w:r>
+      <w:r>
+        <w:t xml:space="preserve"> </w:t>
+      </w:r>
+      <w:r>
+        <w:rPr>
+          <w:rStyle w:val="VerbatimChar"/>
+        </w:rPr>
+        <w:t xml:space="preserve">stage4_rocprofsys_common.flatten_tree()</w:t>
+      </w:r>
+      <w:r>
+        <w:t xml:space="preserve"> </w:t>
+      </w:r>
+      <w:r>
+        <w:t xml:space="preserve">(confirmed identical when compared directly), was</w:t>
+      </w:r>
+      <w:r>
+        <w:t xml:space="preserve"> </w:t>
+      </w:r>
+      <w:r>
+        <w:t xml:space="preserve">replaced with a real import of the function it was silently duplicating.</w:t>
+      </w:r>
+    </w:p>
+    <w:p>
+      <w:pPr>
+        <w:pStyle w:val="BodyText"/>
+      </w:pPr>
+      <w:r>
+        <w:t xml:space="preserve">Migration itself was scripted (not hand-edited file by file) given the scale, run in dry-run mode</w:t>
+      </w:r>
+      <w:r>
+        <w:t xml:space="preserve"> </w:t>
+      </w:r>
+      <w:r>
+        <w:t xml:space="preserve">first against every file’s exact existing shape (multi-line vs. single-line calls,</w:t>
+      </w:r>
+      <w:r>
+        <w:t xml:space="preserve"> </w:t>
+      </w:r>
+      <w:r>
+        <w:rPr>
+          <w:rStyle w:val="VerbatimChar"/>
+        </w:rPr>
+        <w:t xml:space="preserve">MODULE_PATH</w:t>
+      </w:r>
+      <w:r>
+        <w:t xml:space="preserve"> </w:t>
+      </w:r>
+      <w:r>
+        <w:t xml:space="preserve">variable vs. inline path, single vs. multiple modules loaded per file) until zero warnings remained,</w:t>
+      </w:r>
+      <w:r>
+        <w:t xml:space="preserve"> </w:t>
+      </w:r>
+      <w:r>
+        <w:t xml:space="preserve">then applied and manually diffed before committing.</w:t>
+      </w:r>
+    </w:p>
+    <w:p>
+      <w:pPr>
+        <w:pStyle w:val="BodyText"/>
+      </w:pPr>
+      <w:r>
+        <w:t xml:space="preserve">Verification: full suite unchanged at</w:t>
+      </w:r>
+      <w:r>
+        <w:t xml:space="preserve"> </w:t>
+      </w:r>
+      <w:r>
+        <w:rPr>
+          <w:rStyle w:val="VerbatimChar"/>
+        </w:rPr>
+        <w:t xml:space="preserve">Ran 750 tests ... OK</w:t>
+      </w:r>
+      <w:r>
+        <w:t xml:space="preserve"> </w:t>
+      </w:r>
+      <w:r>
+        <w:t xml:space="preserve">– expected, since this phase only</w:t>
+      </w:r>
+      <w:r>
+        <w:t xml:space="preserve"> </w:t>
+      </w:r>
+      <w:r>
+        <w:t xml:space="preserve">relocates loading mechanics and renames local helpers, it doesn’t consolidate or remove any test.</w:t>
+      </w:r>
+    </w:p>
     <w:bookmarkEnd w:id="96"/>
+    <w:bookmarkEnd w:id="97"/>
     <w:sectPr/>
   </w:body>
 </w:document>

</xml_diff>

<commit_message>
Plan 3.15, Phase 7: post-refactor coverage check against the real codebase
Closes plan 3.15's 8-phase roadmap. Adds -h/--help content coverage to all
13 postprocess/tools/*.py test files via a new shared
assert_help_leads_with_explanation() helper, plus a curated ~20-item
high-value subset of a 69-item coverage-gap audit (multi-file cache
staleness, SystemExit paths, CLI selection-flag wiring for several
extract_*/select_* tools). 671 -> 714 tests, still OK.

Co-Authored-By: Claude Sonnet 5 <noreply@anthropic.com>
</commit_message>
<xml_diff>
--- a/docs/DEVELOPMENT_HISTORY.docx
+++ b/docs/DEVELOPMENT_HISTORY.docx
@@ -10,7 +10,7 @@
         <w:t xml:space="preserve">Development History</w:t>
       </w:r>
     </w:p>
-    <w:bookmarkStart w:id="102" w:name="development-history"/>
+    <w:bookmarkStart w:id="103" w:name="development-history"/>
     <w:p>
       <w:pPr>
         <w:pStyle w:val="Heading1"/>
@@ -5416,6 +5416,56 @@
           </w:p>
         </w:tc>
       </w:tr>
+      <w:tr>
+        <w:tc>
+          <w:tcPr/>
+          <w:p>
+            <w:pPr>
+              <w:pStyle w:val="Compact"/>
+              <w:jc w:val="left"/>
+            </w:pPr>
+            <w:r>
+              <w:t xml:space="preserve">2026-08-28</w:t>
+            </w:r>
+          </w:p>
+        </w:tc>
+        <w:tc>
+          <w:tcPr/>
+          <w:p>
+            <w:pPr>
+              <w:pStyle w:val="Compact"/>
+              <w:jc w:val="left"/>
+            </w:pPr>
+            <w:r>
+              <w:t xml:space="preserve">Plan 3.15 (Phase 7 of 8): post-refactor coverage check against the real codebase –</w:t>
+            </w:r>
+            <w:r>
+              <w:t xml:space="preserve"> </w:t>
+            </w:r>
+            <w:r>
+              <w:rPr>
+                <w:rStyle w:val="VerbatimChar"/>
+              </w:rPr>
+              <w:t xml:space="preserve">-h</w:t>
+            </w:r>
+            <w:r>
+              <w:t xml:space="preserve">/</w:t>
+            </w:r>
+            <w:r>
+              <w:rPr>
+                <w:rStyle w:val="VerbatimChar"/>
+              </w:rPr>
+              <w:t xml:space="preserve">--help</w:t>
+            </w:r>
+            <w:r>
+              <w:t xml:space="preserve"> </w:t>
+            </w:r>
+            <w:r>
+              <w:t xml:space="preserve">content coverage (13 tools) plus a curated high-value subset of a 69-item coverage-gap audit (21 items); 671 -&gt; 714 tests – see full accounting below</w:t>
+            </w:r>
+          </w:p>
+        </w:tc>
+      </w:tr>
     </w:tbl>
     <w:bookmarkStart w:id="20" w:name="project-scaffolding-and-rules"/>
     <w:p>
@@ -69094,11 +69144,14 @@
         <w:t xml:space="preserve">6 groups run individually before the full-suite pass.</w:t>
       </w:r>
     </w:p>
+    <w:bookmarkEnd w:id="101"/>
+    <w:bookmarkStart w:id="102" w:name="X5b9ed9f471efbb6db9b3698eaacc8d88dc67e38"/>
     <w:p>
-      <w:r>
-        <w:pict>
-          <v:rect style="width:0;height:1.5pt" o:hralign="center" o:hrstd="t" o:hr="t"/>
-        </w:pict>
+      <w:pPr>
+        <w:pStyle w:val="Heading2"/>
+      </w:pPr>
+      <w:r>
+        <w:t xml:space="preserve">2026-08-28 — Plan 3.15, Phase 7: post-refactor coverage check against the real codebase</w:t>
       </w:r>
     </w:p>
     <w:p>
@@ -69106,38 +69159,1495 @@
         <w:pStyle w:val="FirstParagraph"/>
       </w:pPr>
       <w:r>
-        <w:t xml:space="preserve">This closes the active-editing phases of plan 3.15. Phase 7 (post-refactor coverage check against</w:t>
-      </w:r>
-      <w:r>
-        <w:t xml:space="preserve"> </w:t>
-      </w:r>
-      <w:r>
-        <w:t xml:space="preserve">the real codebase, including the known</w:t>
-      </w:r>
-      <w:r>
-        <w:t xml:space="preserve"> </w:t>
-      </w:r>
-      <w:r>
-        <w:rPr>
-          <w:rStyle w:val="VerbatimChar"/>
+        <w:t xml:space="preserve">The plan’s final phase: everything through Phase 6 only ever removed or reshaped existing tests,</w:t>
+      </w:r>
+      <w:r>
+        <w:t xml:space="preserve"> </w:t>
+      </w:r>
+      <w:r>
+        <w:t xml:space="preserve">so this closed the loop by cross-checking each cleaned-up module’s exposed functions/CLI flags</w:t>
+      </w:r>
+      <w:r>
+        <w:t xml:space="preserve"> </w:t>
+      </w:r>
+      <w:r>
+        <w:t xml:space="preserve">against what its test file actually exercises, and adding coverage for genuine gaps.</w:t>
+      </w:r>
+    </w:p>
+    <w:p>
+      <w:pPr>
+        <w:pStyle w:val="BodyText"/>
+      </w:pPr>
+      <w:r>
+        <w:rPr>
+          <w:rStyle w:val="VerbatimChar"/>
+          <w:bCs/>
+          <w:b/>
         </w:rPr>
         <w:t xml:space="preserve">-h</w:t>
       </w:r>
       <w:r>
+        <w:rPr>
+          <w:bCs/>
+          <w:b/>
+        </w:rPr>
         <w:t xml:space="preserve">/</w:t>
       </w:r>
       <w:r>
         <w:rPr>
           <w:rStyle w:val="VerbatimChar"/>
+          <w:bCs/>
+          <w:b/>
         </w:rPr>
         <w:t xml:space="preserve">--help</w:t>
       </w:r>
       <w:r>
-        <w:t xml:space="preserve">-content coverage gap) remains open.</w:t>
+        <w:rPr>
+          <w:bCs/>
+          <w:b/>
+        </w:rPr>
+        <w:t xml:space="preserve"> </w:t>
+      </w:r>
+      <w:r>
+        <w:rPr>
+          <w:bCs/>
+          <w:b/>
+        </w:rPr>
+        <w:t xml:space="preserve">content coverage</w:t>
+      </w:r>
+      <w:r>
+        <w:t xml:space="preserve"> </w:t>
+      </w:r>
+      <w:r>
+        <w:t xml:space="preserve">(the gap already known before this phase started): added a</w:t>
+      </w:r>
+      <w:r>
+        <w:t xml:space="preserve"> </w:t>
+      </w:r>
+      <w:r>
+        <w:t xml:space="preserve">shared</w:t>
+      </w:r>
+      <w:r>
+        <w:t xml:space="preserve"> </w:t>
+      </w:r>
+      <w:r>
+        <w:rPr>
+          <w:rStyle w:val="VerbatimChar"/>
+        </w:rPr>
+        <w:t xml:space="preserve">assert_help_leads_with_explanation(test_case, tool_module, docs_url_substring)</w:t>
+      </w:r>
+      <w:r>
+        <w:t xml:space="preserve"> </w:t>
+      </w:r>
+      <w:r>
+        <w:t xml:space="preserve">to</w:t>
+      </w:r>
+      <w:r>
+        <w:t xml:space="preserve"> </w:t>
+      </w:r>
+      <w:r>
+        <w:rPr>
+          <w:rStyle w:val="VerbatimChar"/>
+        </w:rPr>
+        <w:t xml:space="preserve">_tools_test_helpers.py</w:t>
+      </w:r>
+      <w:r>
+        <w:t xml:space="preserve">, confirming</w:t>
+      </w:r>
+      <w:r>
+        <w:t xml:space="preserve"> </w:t>
+      </w:r>
+      <w:r>
+        <w:rPr>
+          <w:rStyle w:val="VerbatimChar"/>
+        </w:rPr>
+        <w:t xml:space="preserve">main(["--help"])</w:t>
+      </w:r>
+      <w:r>
+        <w:t xml:space="preserve"> </w:t>
+      </w:r>
+      <w:r>
+        <w:t xml:space="preserve">exits 0, the tool’s</w:t>
+      </w:r>
+      <w:r>
+        <w:t xml:space="preserve"> </w:t>
+      </w:r>
+      <w:r>
+        <w:rPr>
+          <w:rStyle w:val="VerbatimChar"/>
+        </w:rPr>
+        <w:t xml:space="preserve">HELP_BLURB</w:t>
+      </w:r>
+      <w:r>
+        <w:t xml:space="preserve"> </w:t>
+      </w:r>
+      <w:r>
+        <w:t xml:space="preserve">explanation</w:t>
+      </w:r>
+      <w:r>
+        <w:t xml:space="preserve"> </w:t>
+      </w:r>
+      <w:r>
+        <w:t xml:space="preserve">text appears before argparse’s own</w:t>
+      </w:r>
+      <w:r>
+        <w:t xml:space="preserve"> </w:t>
+      </w:r>
+      <w:r>
+        <w:rPr>
+          <w:rStyle w:val="VerbatimChar"/>
+        </w:rPr>
+        <w:t xml:space="preserve">options:</w:t>
+      </w:r>
+      <w:r>
+        <w:t xml:space="preserve"> </w:t>
+      </w:r>
+      <w:r>
+        <w:t xml:space="preserve">section, and the tool’s own docs-link substring</w:t>
+      </w:r>
+      <w:r>
+        <w:t xml:space="preserve"> </w:t>
+      </w:r>
+      <w:r>
+        <w:t xml:space="preserve">appears –</w:t>
+      </w:r>
+      <w:r>
+        <w:t xml:space="preserve"> </w:t>
+      </w:r>
+      <w:r>
+        <w:rPr>
+          <w:rStyle w:val="VerbatimChar"/>
+        </w:rPr>
+        <w:t xml:space="preserve">docs_url_substring</w:t>
+      </w:r>
+      <w:r>
+        <w:t xml:space="preserve"> </w:t>
+      </w:r>
+      <w:r>
+        <w:t xml:space="preserve">is per-tool rather than hardcoded, since</w:t>
+      </w:r>
+      <w:r>
+        <w:t xml:space="preserve"> </w:t>
+      </w:r>
+      <w:r>
+        <w:rPr>
+          <w:rStyle w:val="VerbatimChar"/>
+        </w:rPr>
+        <w:t xml:space="preserve">convert_trace_to_csv.py</w:t>
+      </w:r>
+      <w:r>
+        <w:t xml:space="preserve">’s</w:t>
+      </w:r>
+      <w:r>
+        <w:t xml:space="preserve"> </w:t>
+      </w:r>
+      <w:r>
+        <w:t xml:space="preserve">real</w:t>
+      </w:r>
+      <w:r>
+        <w:t xml:space="preserve"> </w:t>
+      </w:r>
+      <w:r>
+        <w:t xml:space="preserve">“</w:t>
+      </w:r>
+      <w:r>
+        <w:t xml:space="preserve">under the hood</w:t>
+      </w:r>
+      <w:r>
+        <w:t xml:space="preserve">”</w:t>
+      </w:r>
+      <w:r>
+        <w:t xml:space="preserve"> </w:t>
+      </w:r>
+      <w:r>
+        <w:t xml:space="preserve">dependency is Perfetto’s</w:t>
+      </w:r>
+      <w:r>
+        <w:t xml:space="preserve"> </w:t>
+      </w:r>
+      <w:r>
+        <w:rPr>
+          <w:rStyle w:val="VerbatimChar"/>
+        </w:rPr>
+        <w:t xml:space="preserve">trace_processor_shell</w:t>
+      </w:r>
+      <w:r>
+        <w:t xml:space="preserve">, not an AMD tool (a</w:t>
+      </w:r>
+      <w:r>
+        <w:t xml:space="preserve"> </w:t>
+      </w:r>
+      <w:r>
+        <w:t xml:space="preserve">legitimate, deliberate technical accuracy, not a bug – left as-is). Added a</w:t>
+      </w:r>
+      <w:r>
+        <w:t xml:space="preserve"> </w:t>
+      </w:r>
+      <w:r>
+        <w:rPr>
+          <w:rStyle w:val="VerbatimChar"/>
+        </w:rPr>
+        <w:t xml:space="preserve">HelpTextTests</w:t>
+      </w:r>
+      <w:r>
+        <w:t xml:space="preserve"> </w:t>
+      </w:r>
+      <w:r>
+        <w:t xml:space="preserve">class</w:t>
+      </w:r>
+      <w:r>
+        <w:t xml:space="preserve"> </w:t>
+      </w:r>
+      <w:r>
+        <w:t xml:space="preserve">to all 13</w:t>
+      </w:r>
+      <w:r>
+        <w:t xml:space="preserve"> </w:t>
+      </w:r>
+      <w:r>
+        <w:rPr>
+          <w:rStyle w:val="VerbatimChar"/>
+        </w:rPr>
+        <w:t xml:space="preserve">postprocess/tools/*.py</w:t>
+      </w:r>
+      <w:r>
+        <w:t xml:space="preserve"> </w:t>
+      </w:r>
+      <w:r>
+        <w:t xml:space="preserve">files.</w:t>
       </w:r>
     </w:p>
-    <w:bookmarkEnd w:id="101"/>
+    <w:p>
+      <w:pPr>
+        <w:pStyle w:val="BodyText"/>
+      </w:pPr>
+      <w:r>
+        <w:rPr>
+          <w:bCs/>
+          <w:b/>
+        </w:rPr>
+        <w:t xml:space="preserve">Coverage-gap audit</w:t>
+      </w:r>
+      <w:r>
+        <w:t xml:space="preserve">: 6 parallel agents (one per stage/tools group) inventoried every module’s</w:t>
+      </w:r>
+      <w:r>
+        <w:t xml:space="preserve"> </w:t>
+      </w:r>
+      <w:r>
+        <w:t xml:space="preserve">public functions and every tool’s CLI flags against its own test file, surfacing 69 raw gaps. The</w:t>
+      </w:r>
+      <w:r>
+        <w:t xml:space="preserve"> </w:t>
+      </w:r>
+      <w:r>
+        <w:t xml:space="preserve">dominant pattern (~45 items) was near-identical None-fallback/zero-denominator edge cases judged</w:t>
+      </w:r>
+      <w:r>
+        <w:t xml:space="preserve"> </w:t>
+      </w:r>
+      <w:r>
+        <w:t xml:space="preserve">low-value; the remaining ~24 were curated into a higher-value shortlist and presented for a</w:t>
+      </w:r>
+      <w:r>
+        <w:t xml:space="preserve"> </w:t>
+      </w:r>
+      <w:r>
+        <w:t xml:space="preserve">scope decision – chose to implement a ~20-item high-value subset rather than all 69 or none,</w:t>
+      </w:r>
+      <w:r>
+        <w:t xml:space="preserve"> </w:t>
+      </w:r>
+      <w:r>
+        <w:t xml:space="preserve">explicitly deferring the None-fallback cluster as a documented backlog, not a silent gap.</w:t>
+      </w:r>
+    </w:p>
+    <w:p>
+      <w:pPr>
+        <w:pStyle w:val="BodyText"/>
+      </w:pPr>
+      <w:r>
+        <w:rPr>
+          <w:bCs/>
+          <w:b/>
+        </w:rPr>
+        <w:t xml:space="preserve">Implemented (21 items, 671 -&gt; 714 tests)</w:t>
+      </w:r>
+      <w:r>
+        <w:t xml:space="preserve">:</w:t>
+      </w:r>
+      <w:r>
+        <w:t xml:space="preserve"> </w:t>
+      </w:r>
+      <w:r>
+        <w:t xml:space="preserve">-</w:t>
+      </w:r>
+      <w:r>
+        <w:t xml:space="preserve"> </w:t>
+      </w:r>
+      <w:r>
+        <w:rPr>
+          <w:rStyle w:val="VerbatimChar"/>
+        </w:rPr>
+        <w:t xml:space="preserve">stage4_rocprofsys_trace_aggregate.py</w:t>
+      </w:r>
+      <w:r>
+        <w:t xml:space="preserve">: multi-file</w:t>
+      </w:r>
+      <w:r>
+        <w:t xml:space="preserve"> </w:t>
+      </w:r>
+      <w:r>
+        <w:rPr>
+          <w:rStyle w:val="VerbatimChar"/>
+        </w:rPr>
+        <w:t xml:space="preserve">csv_paths</w:t>
+      </w:r>
+      <w:r>
+        <w:t xml:space="preserve"> </w:t>
+      </w:r>
+      <w:r>
+        <w:t xml:space="preserve">list staleness (max-mtime across</w:t>
+      </w:r>
+      <w:r>
+        <w:t xml:space="preserve"> </w:t>
+      </w:r>
+      <w:r>
+        <w:t xml:space="preserve">every path, not just the first);</w:t>
+      </w:r>
+      <w:r>
+        <w:t xml:space="preserve"> </w:t>
+      </w:r>
+      <w:r>
+        <w:rPr>
+          <w:rStyle w:val="VerbatimChar"/>
+        </w:rPr>
+        <w:t xml:space="preserve">get_rank_time_extent()</w:t>
+      </w:r>
+      <w:r>
+        <w:t xml:space="preserve">’s fallback when the cache payload is</w:t>
+      </w:r>
+      <w:r>
+        <w:t xml:space="preserve"> </w:t>
+      </w:r>
+      <w:r>
+        <w:t xml:space="preserve">valid JSON but missing its</w:t>
+      </w:r>
+      <w:r>
+        <w:t xml:space="preserve"> </w:t>
+      </w:r>
+      <w:r>
+        <w:rPr>
+          <w:rStyle w:val="VerbatimChar"/>
+        </w:rPr>
+        <w:t xml:space="preserve">"extent"</w:t>
+      </w:r>
+      <w:r>
+        <w:t xml:space="preserve"> </w:t>
+      </w:r>
+      <w:r>
+        <w:t xml:space="preserve">key.</w:t>
+      </w:r>
+      <w:r>
+        <w:t xml:space="preserve"> </w:t>
+      </w:r>
+      <w:r>
+        <w:t xml:space="preserve">-</w:t>
+      </w:r>
+      <w:r>
+        <w:t xml:space="preserve"> </w:t>
+      </w:r>
+      <w:r>
+        <w:rPr>
+          <w:rStyle w:val="VerbatimChar"/>
+        </w:rPr>
+        <w:t xml:space="preserve">stage5_calltree_view.py</w:t>
+      </w:r>
+      <w:r>
+        <w:t xml:space="preserve">/</w:t>
+      </w:r>
+      <w:r>
+        <w:rPr>
+          <w:rStyle w:val="VerbatimChar"/>
+        </w:rPr>
+        <w:t xml:space="preserve">stage5_wallclock_calltree_view.py</w:t>
+      </w:r>
+      <w:r>
+        <w:t xml:space="preserve">: the</w:t>
+      </w:r>
+      <w:r>
+        <w:t xml:space="preserve"> </w:t>
+      </w:r>
+      <w:r>
+        <w:t xml:space="preserve">“</w:t>
+      </w:r>
+      <w:r>
+        <w:t xml:space="preserve">no rocprof-sys timemory text</w:t>
+      </w:r>
+      <w:r>
+        <w:t xml:space="preserve"> </w:t>
+      </w:r>
+      <w:r>
+        <w:t xml:space="preserve">table found</w:t>
+      </w:r>
+      <w:r>
+        <w:t xml:space="preserve">”</w:t>
+      </w:r>
+      <w:r>
+        <w:t xml:space="preserve"> </w:t>
+      </w:r>
+      <w:r>
+        <w:rPr>
+          <w:rStyle w:val="VerbatimChar"/>
+        </w:rPr>
+        <w:t xml:space="preserve">SystemExit</w:t>
+      </w:r>
+      <w:r>
+        <w:t xml:space="preserve"> </w:t>
+      </w:r>
+      <w:r>
+        <w:t xml:space="preserve">path, via an empty run directory.</w:t>
+      </w:r>
+      <w:r>
+        <w:t xml:space="preserve"> </w:t>
+      </w:r>
+      <w:r>
+        <w:t xml:space="preserve">-</w:t>
+      </w:r>
+      <w:r>
+        <w:t xml:space="preserve"> </w:t>
+      </w:r>
+      <w:r>
+        <w:rPr>
+          <w:rStyle w:val="VerbatimChar"/>
+        </w:rPr>
+        <w:t xml:space="preserve">stage6_time_range_config.py</w:t>
+      </w:r>
+      <w:r>
+        <w:t xml:space="preserve">: an open-ended segment (</w:t>
+      </w:r>
+      <w:r>
+        <w:rPr>
+          <w:rStyle w:val="VerbatimChar"/>
+        </w:rPr>
+        <w:t xml:space="preserve">"5:"</w:t>
+      </w:r>
+      <w:r>
+        <w:t xml:space="preserve">) absorbing a later overlapping</w:t>
+      </w:r>
+      <w:r>
+        <w:t xml:space="preserve"> </w:t>
+      </w:r>
+      <w:r>
+        <w:t xml:space="preserve">bounded segment (</w:t>
+      </w:r>
+      <w:r>
+        <w:rPr>
+          <w:rStyle w:val="VerbatimChar"/>
+        </w:rPr>
+        <w:t xml:space="preserve">"8:12"</w:t>
+      </w:r>
+      <w:r>
+        <w:t xml:space="preserve">) into itself rather than keeping it as a separate disjoint range.</w:t>
+      </w:r>
+      <w:r>
+        <w:t xml:space="preserve"> </w:t>
+      </w:r>
+      <w:r>
+        <w:t xml:space="preserve">-</w:t>
+      </w:r>
+      <w:r>
+        <w:t xml:space="preserve"> </w:t>
+      </w:r>
+      <w:r>
+        <w:rPr>
+          <w:rStyle w:val="VerbatimChar"/>
+        </w:rPr>
+        <w:t xml:space="preserve">extract_GPU_hotspots.py</w:t>
+      </w:r>
+      <w:r>
+        <w:t xml:space="preserve">: a new</w:t>
+      </w:r>
+      <w:r>
+        <w:t xml:space="preserve"> </w:t>
+      </w:r>
+      <w:r>
+        <w:rPr>
+          <w:rStyle w:val="VerbatimChar"/>
+        </w:rPr>
+        <w:t xml:space="preserve">MainCliTests</w:t>
+      </w:r>
+      <w:r>
+        <w:t xml:space="preserve"> </w:t>
+      </w:r>
+      <w:r>
+        <w:t xml:space="preserve">class (missing-dir error, end-to-end</w:t>
+      </w:r>
+      <w:r>
+        <w:t xml:space="preserve"> </w:t>
+      </w:r>
+      <w:r>
+        <w:rPr>
+          <w:rStyle w:val="VerbatimChar"/>
+        </w:rPr>
+        <w:t xml:space="preserve">-o</w:t>
+      </w:r>
+      <w:r>
+        <w:t xml:space="preserve"> </w:t>
+      </w:r>
+      <w:r>
+        <w:t xml:space="preserve">write,</w:t>
+      </w:r>
+      <w:r>
+        <w:t xml:space="preserve"> </w:t>
+      </w:r>
+      <w:r>
+        <w:rPr>
+          <w:rStyle w:val="VerbatimChar"/>
+        </w:rPr>
+        <w:t xml:space="preserve">--all</w:t>
+      </w:r>
+      <w:r>
+        <w:t xml:space="preserve"> </w:t>
+      </w:r>
+      <w:r>
+        <w:t xml:space="preserve">reaching</w:t>
+      </w:r>
+      <w:r>
+        <w:t xml:space="preserve"> </w:t>
+      </w:r>
+      <w:r>
+        <w:rPr>
+          <w:rStyle w:val="VerbatimChar"/>
+        </w:rPr>
+        <w:t xml:space="preserve">write_report()</w:t>
+      </w:r>
+      <w:r>
+        <w:t xml:space="preserve"> </w:t>
+      </w:r>
+      <w:r>
+        <w:t xml:space="preserve">through</w:t>
+      </w:r>
+      <w:r>
+        <w:t xml:space="preserve"> </w:t>
+      </w:r>
+      <w:r>
+        <w:rPr>
+          <w:rStyle w:val="VerbatimChar"/>
+        </w:rPr>
+        <w:t xml:space="preserve">main()</w:t>
+      </w:r>
+      <w:r>
+        <w:t xml:space="preserve">).</w:t>
+      </w:r>
+      <w:r>
+        <w:t xml:space="preserve"> </w:t>
+      </w:r>
+      <w:r>
+        <w:t xml:space="preserve">-</w:t>
+      </w:r>
+      <w:r>
+        <w:t xml:space="preserve"> </w:t>
+      </w:r>
+      <w:r>
+        <w:rPr>
+          <w:rStyle w:val="VerbatimChar"/>
+        </w:rPr>
+        <w:t xml:space="preserve">extract_calltree.py</w:t>
+      </w:r>
+      <w:r>
+        <w:t xml:space="preserve">: a real paired-</w:t>
+      </w:r>
+      <w:r>
+        <w:rPr>
+          <w:rStyle w:val="VerbatimChar"/>
+        </w:rPr>
+        <w:t xml:space="preserve">rocprofv3</w:t>
+      </w:r>
+      <w:r>
+        <w:t xml:space="preserve">-directory GPU-kernel-nesting test through</w:t>
+      </w:r>
+      <w:r>
+        <w:t xml:space="preserve"> </w:t>
+      </w:r>
+      <w:r>
+        <w:rPr>
+          <w:rStyle w:val="VerbatimChar"/>
+        </w:rPr>
+        <w:t xml:space="preserve">main()</w:t>
+      </w:r>
+      <w:r>
+        <w:t xml:space="preserve">/</w:t>
+      </w:r>
+      <w:r>
+        <w:rPr>
+          <w:rStyle w:val="VerbatimChar"/>
+        </w:rPr>
+        <w:t xml:space="preserve">write_report()</w:t>
+      </w:r>
+      <w:r>
+        <w:t xml:space="preserve"> </w:t>
+      </w:r>
+      <w:r>
+        <w:t xml:space="preserve">(previously only exercised at the</w:t>
+      </w:r>
+      <w:r>
+        <w:t xml:space="preserve"> </w:t>
+      </w:r>
+      <w:r>
+        <w:rPr>
+          <w:rStyle w:val="VerbatimChar"/>
+        </w:rPr>
+        <w:t xml:space="preserve">stage5_calltree_view.py</w:t>
+      </w:r>
+      <w:r>
+        <w:t xml:space="preserve"> </w:t>
+      </w:r>
+      <w:r>
+        <w:t xml:space="preserve">level, never</w:t>
+      </w:r>
+      <w:r>
+        <w:t xml:space="preserve"> </w:t>
+      </w:r>
+      <w:r>
+        <w:t xml:space="preserve">through this tool’s own CLI wiring); each of the four</w:t>
+      </w:r>
+      <w:r>
+        <w:t xml:space="preserve"> </w:t>
+      </w:r>
+      <w:r>
+        <w:rPr>
+          <w:rStyle w:val="VerbatimChar"/>
+        </w:rPr>
+        <w:t xml:space="preserve">--show-*</w:t>
+      </w:r>
+      <w:r>
+        <w:t xml:space="preserve"> </w:t>
+      </w:r>
+      <w:r>
+        <w:t xml:space="preserve">noise-tier flags tested alone</w:t>
+      </w:r>
+      <w:r>
+        <w:t xml:space="preserve"> </w:t>
+      </w:r>
+      <w:r>
+        <w:t xml:space="preserve">(not just bundled via</w:t>
+      </w:r>
+      <w:r>
+        <w:t xml:space="preserve"> </w:t>
+      </w:r>
+      <w:r>
+        <w:rPr>
+          <w:rStyle w:val="VerbatimChar"/>
+        </w:rPr>
+        <w:t xml:space="preserve">--show-all-internals</w:t>
+      </w:r>
+      <w:r>
+        <w:t xml:space="preserve">).</w:t>
+      </w:r>
+      <w:r>
+        <w:t xml:space="preserve"> </w:t>
+      </w:r>
+      <w:r>
+        <w:t xml:space="preserve">-</w:t>
+      </w:r>
+      <w:r>
+        <w:t xml:space="preserve"> </w:t>
+      </w:r>
+      <w:r>
+        <w:rPr>
+          <w:rStyle w:val="VerbatimChar"/>
+        </w:rPr>
+        <w:t xml:space="preserve">extract_trace_calltree.py</w:t>
+      </w:r>
+      <w:r>
+        <w:t xml:space="preserve">:</w:t>
+      </w:r>
+      <w:r>
+        <w:t xml:space="preserve"> </w:t>
+      </w:r>
+      <w:r>
+        <w:rPr>
+          <w:rStyle w:val="VerbatimChar"/>
+        </w:rPr>
+        <w:t xml:space="preserve">--max-depth</w:t>
+      </w:r>
+      <w:r>
+        <w:t xml:space="preserve"> </w:t>
+      </w:r>
+      <w:r>
+        <w:t xml:space="preserve">truncation asserted with a real</w:t>
+      </w:r>
+      <w:r>
+        <w:t xml:space="preserve"> </w:t>
+      </w:r>
+      <w:r>
+        <w:t xml:space="preserve">“</w:t>
+      </w:r>
+      <w:r>
+        <w:t xml:space="preserve">more node(s) hidden</w:t>
+      </w:r>
+      <w:r>
+        <w:t xml:space="preserve">”</w:t>
+      </w:r>
+      <w:r>
+        <w:t xml:space="preserve"> </w:t>
+      </w:r>
+      <w:r>
+        <w:t xml:space="preserve">check; each</w:t>
+      </w:r>
+      <w:r>
+        <w:t xml:space="preserve"> </w:t>
+      </w:r>
+      <w:r>
+        <w:rPr>
+          <w:rStyle w:val="VerbatimChar"/>
+        </w:rPr>
+        <w:t xml:space="preserve">--show-*</w:t>
+      </w:r>
+      <w:r>
+        <w:t xml:space="preserve"> </w:t>
+      </w:r>
+      <w:r>
+        <w:t xml:space="preserve">flag alone (</w:t>
+      </w:r>
+      <w:r>
+        <w:rPr>
+          <w:rStyle w:val="VerbatimChar"/>
+        </w:rPr>
+        <w:t xml:space="preserve">--show-mpi-internals</w:t>
+      </w:r>
+      <w:r>
+        <w:t xml:space="preserve"> </w:t>
+      </w:r>
+      <w:r>
+        <w:t xml:space="preserve">exercised for wiring/no-crash only –</w:t>
+      </w:r>
+      <w:r>
+        <w:t xml:space="preserve"> </w:t>
+      </w:r>
+      <w:r>
+        <w:t xml:space="preserve">the fixture has no label that distinguishes its effect, unlike the other three);</w:t>
+      </w:r>
+      <w:r>
+        <w:t xml:space="preserve"> </w:t>
+      </w:r>
+      <w:r>
+        <w:rPr>
+          <w:rStyle w:val="VerbatimChar"/>
+        </w:rPr>
+        <w:t xml:space="preserve">--extra-noise-config</w:t>
+      </w:r>
+      <w:r>
+        <w:t xml:space="preserve"> </w:t>
+      </w:r>
+      <w:r>
+        <w:t xml:space="preserve">end to end. This surfaced a real, deliberate design point worth recording: the trace pipeline’s</w:t>
+      </w:r>
+      <w:r>
+        <w:t xml:space="preserve"> </w:t>
+      </w:r>
+      <w:r>
+        <w:rPr>
+          <w:rStyle w:val="VerbatimChar"/>
+        </w:rPr>
+        <w:t xml:space="preserve">"other"</w:t>
+      </w:r>
+      <w:r>
+        <w:t xml:space="preserve"> </w:t>
+      </w:r>
+      <w:r>
+        <w:t xml:space="preserve">tag is purely category-derived (</w:t>
+      </w:r>
+      <w:r>
+        <w:rPr>
+          <w:rStyle w:val="VerbatimChar"/>
+        </w:rPr>
+        <w:t xml:space="preserve">stage3_rocprofsys_trace.tag_for_category()</w:t>
+      </w:r>
+      <w:r>
+        <w:t xml:space="preserve">), not</w:t>
+      </w:r>
+      <w:r>
+        <w:t xml:space="preserve"> </w:t>
+      </w:r>
+      <w:r>
+        <w:t xml:space="preserve">reachable via</w:t>
+      </w:r>
+      <w:r>
+        <w:t xml:space="preserve"> </w:t>
+      </w:r>
+      <w:r>
+        <w:rPr>
+          <w:rStyle w:val="VerbatimChar"/>
+        </w:rPr>
+        <w:t xml:space="preserve">--extra-noise-config</w:t>
+      </w:r>
+      <w:r>
+        <w:t xml:space="preserve">’s</w:t>
+      </w:r>
+      <w:r>
+        <w:t xml:space="preserve"> </w:t>
+      </w:r>
+      <w:r>
+        <w:rPr>
+          <w:rStyle w:val="VerbatimChar"/>
+        </w:rPr>
+        <w:t xml:space="preserve">add</w:t>
+      </w:r>
+      <w:r>
+        <w:t xml:space="preserve">/</w:t>
+      </w:r>
+      <w:r>
+        <w:rPr>
+          <w:rStyle w:val="VerbatimChar"/>
+        </w:rPr>
+        <w:t xml:space="preserve">remove</w:t>
+      </w:r>
+      <w:r>
+        <w:t xml:space="preserve"> </w:t>
+      </w:r>
+      <w:r>
+        <w:t xml:space="preserve">at all – only the three delegated</w:t>
+      </w:r>
+      <w:r>
+        <w:t xml:space="preserve"> </w:t>
+      </w:r>
+      <w:r>
+        <w:rPr>
+          <w:rStyle w:val="VerbatimChar"/>
+        </w:rPr>
+        <w:t xml:space="preserve">wrapper_noise</w:t>
+      </w:r>
+      <w:r>
+        <w:t xml:space="preserve">/</w:t>
+      </w:r>
+      <w:r>
+        <w:rPr>
+          <w:rStyle w:val="VerbatimChar"/>
+        </w:rPr>
+        <w:t xml:space="preserve">compiler_runtime_noise</w:t>
+      </w:r>
+      <w:r>
+        <w:t xml:space="preserve">/</w:t>
+      </w:r>
+      <w:r>
+        <w:rPr>
+          <w:rStyle w:val="VerbatimChar"/>
+        </w:rPr>
+        <w:t xml:space="preserve">wrapper_branch_noise</w:t>
+      </w:r>
+      <w:r>
+        <w:t xml:space="preserve"> </w:t>
+      </w:r>
+      <w:r>
+        <w:t xml:space="preserve">patterns are user-tunable for this</w:t>
+      </w:r>
+      <w:r>
+        <w:t xml:space="preserve"> </w:t>
+      </w:r>
+      <w:r>
+        <w:t xml:space="preserve">pipeline (see that module’s own docstring:</w:t>
+      </w:r>
+      <w:r>
+        <w:t xml:space="preserve"> </w:t>
+      </w:r>
+      <w:r>
+        <w:t xml:space="preserve">“</w:t>
+      </w:r>
+      <w:r>
+        <w:t xml:space="preserve">nothing here for a user to tune</w:t>
+      </w:r>
+      <w:r>
+        <w:t xml:space="preserve">”</w:t>
+      </w:r>
+      <w:r>
+        <w:t xml:space="preserve"> </w:t>
+      </w:r>
+      <w:r>
+        <w:t xml:space="preserve">for the category</w:t>
+      </w:r>
+      <w:r>
+        <w:t xml:space="preserve"> </w:t>
+      </w:r>
+      <w:r>
+        <w:t xml:space="preserve">map). The test was written against</w:t>
+      </w:r>
+      <w:r>
+        <w:t xml:space="preserve"> </w:t>
+      </w:r>
+      <w:r>
+        <w:rPr>
+          <w:rStyle w:val="VerbatimChar"/>
+        </w:rPr>
+        <w:t xml:space="preserve">wrapper_noise</w:t>
+      </w:r>
+      <w:r>
+        <w:t xml:space="preserve"> </w:t>
+      </w:r>
+      <w:r>
+        <w:t xml:space="preserve">instead of</w:t>
+      </w:r>
+      <w:r>
+        <w:t xml:space="preserve"> </w:t>
+      </w:r>
+      <w:r>
+        <w:rPr>
+          <w:rStyle w:val="VerbatimChar"/>
+        </w:rPr>
+        <w:t xml:space="preserve">other</w:t>
+      </w:r>
+      <w:r>
+        <w:t xml:space="preserve"> </w:t>
+      </w:r>
+      <w:r>
+        <w:t xml:space="preserve">once this was confirmed by</w:t>
+      </w:r>
+      <w:r>
+        <w:t xml:space="preserve"> </w:t>
+      </w:r>
+      <w:r>
+        <w:t xml:space="preserve">reading the source, not assumed from the sample pipeline’s different behavior.</w:t>
+      </w:r>
+      <w:r>
+        <w:t xml:space="preserve"> </w:t>
+      </w:r>
+      <w:r>
+        <w:t xml:space="preserve">-</w:t>
+      </w:r>
+      <w:r>
+        <w:t xml:space="preserve"> </w:t>
+      </w:r>
+      <w:r>
+        <w:rPr>
+          <w:rStyle w:val="VerbatimChar"/>
+        </w:rPr>
+        <w:t xml:space="preserve">extract_trace_hotspots.py</w:t>
+      </w:r>
+      <w:r>
+        <w:t xml:space="preserve">:</w:t>
+      </w:r>
+      <w:r>
+        <w:t xml:space="preserve"> </w:t>
+      </w:r>
+      <w:r>
+        <w:rPr>
+          <w:rStyle w:val="VerbatimChar"/>
+        </w:rPr>
+        <w:t xml:space="preserve">--top</w:t>
+      </w:r>
+      <w:r>
+        <w:t xml:space="preserve">,</w:t>
+      </w:r>
+      <w:r>
+        <w:t xml:space="preserve"> </w:t>
+      </w:r>
+      <w:r>
+        <w:rPr>
+          <w:rStyle w:val="VerbatimChar"/>
+        </w:rPr>
+        <w:t xml:space="preserve">--threshold</w:t>
+      </w:r>
+      <w:r>
+        <w:t xml:space="preserve">, and</w:t>
+      </w:r>
+      <w:r>
+        <w:t xml:space="preserve"> </w:t>
+      </w:r>
+      <w:r>
+        <w:rPr>
+          <w:rStyle w:val="VerbatimChar"/>
+        </w:rPr>
+        <w:t xml:space="preserve">--unfiltered</w:t>
+      </w:r>
+      <w:r>
+        <w:t xml:space="preserve"> </w:t>
+      </w:r>
+      <w:r>
+        <w:t xml:space="preserve">(ranking-field switch from</w:t>
+      </w:r>
+      <w:r>
+        <w:t xml:space="preserve"> </w:t>
+      </w:r>
+      <w:r>
+        <w:t xml:space="preserve">self-time to inclusive-time, changing which row survives</w:t>
+      </w:r>
+      <w:r>
+        <w:t xml:space="preserve"> </w:t>
+      </w:r>
+      <w:r>
+        <w:rPr>
+          <w:rStyle w:val="VerbatimChar"/>
+        </w:rPr>
+        <w:t xml:space="preserve">--top 1</w:t>
+      </w:r>
+      <w:r>
+        <w:t xml:space="preserve">) wired through</w:t>
+      </w:r>
+      <w:r>
+        <w:t xml:space="preserve"> </w:t>
+      </w:r>
+      <w:r>
+        <w:rPr>
+          <w:rStyle w:val="VerbatimChar"/>
+        </w:rPr>
+        <w:t xml:space="preserve">main()</w:t>
+      </w:r>
+      <w:r>
+        <w:t xml:space="preserve"> </w:t>
+      </w:r>
+      <w:r>
+        <w:t xml:space="preserve">with</w:t>
+      </w:r>
+      <w:r>
+        <w:t xml:space="preserve"> </w:t>
+      </w:r>
+      <w:r>
+        <w:t xml:space="preserve">real table-scoped assertions.</w:t>
+      </w:r>
+      <w:r>
+        <w:t xml:space="preserve"> </w:t>
+      </w:r>
+      <w:r>
+        <w:rPr>
+          <w:rStyle w:val="VerbatimChar"/>
+        </w:rPr>
+        <w:t xml:space="preserve">--extra-noise-config</w:t>
+      </w:r>
+      <w:r>
+        <w:t xml:space="preserve"> </w:t>
+      </w:r>
+      <w:r>
+        <w:t xml:space="preserve">was deliberately not tested here: reading</w:t>
+      </w:r>
+      <w:r>
+        <w:t xml:space="preserve"> </w:t>
+      </w:r>
+      <w:r>
+        <w:rPr>
+          <w:rStyle w:val="VerbatimChar"/>
+        </w:rPr>
+        <w:t xml:space="preserve">stage4_rocprofsys_trace_flat.aggregate()</w:t>
+      </w:r>
+      <w:r>
+        <w:t xml:space="preserve"> </w:t>
+      </w:r>
+      <w:r>
+        <w:t xml:space="preserve">confirmed it applies no tag-based filtering at all, so</w:t>
+      </w:r>
+      <w:r>
+        <w:t xml:space="preserve"> </w:t>
+      </w:r>
+      <w:r>
+        <w:t xml:space="preserve">the flag (present on this tool’s CLI for consistency) has zero observable effect on its report –</w:t>
+      </w:r>
+      <w:r>
+        <w:t xml:space="preserve"> </w:t>
+      </w:r>
+      <w:r>
+        <w:t xml:space="preserve">a test asserting an effect would be vacuous, so this sub-item was skipped rather than faked.</w:t>
+      </w:r>
+      <w:r>
+        <w:t xml:space="preserve"> </w:t>
+      </w:r>
+      <w:r>
+        <w:t xml:space="preserve">-</w:t>
+      </w:r>
+      <w:r>
+        <w:t xml:space="preserve"> </w:t>
+      </w:r>
+      <w:r>
+        <w:rPr>
+          <w:rStyle w:val="VerbatimChar"/>
+        </w:rPr>
+        <w:t xml:space="preserve">extract_wallclock_calltree.py</w:t>
+      </w:r>
+      <w:r>
+        <w:t xml:space="preserve">:</w:t>
+      </w:r>
+      <w:r>
+        <w:t xml:space="preserve"> </w:t>
+      </w:r>
+      <w:r>
+        <w:rPr>
+          <w:rStyle w:val="VerbatimChar"/>
+        </w:rPr>
+        <w:t xml:space="preserve">--show-gpu-api</w:t>
+      </w:r>
+      <w:r>
+        <w:t xml:space="preserve"> </w:t>
+      </w:r>
+      <w:r>
+        <w:t xml:space="preserve">tested through</w:t>
+      </w:r>
+      <w:r>
+        <w:t xml:space="preserve"> </w:t>
+      </w:r>
+      <w:r>
+        <w:rPr>
+          <w:rStyle w:val="VerbatimChar"/>
+        </w:rPr>
+        <w:t xml:space="preserve">main()</w:t>
+      </w:r>
+      <w:r>
+        <w:t xml:space="preserve">;</w:t>
+      </w:r>
+      <w:r>
+        <w:t xml:space="preserve"> </w:t>
+      </w:r>
+      <w:r>
+        <w:rPr>
+          <w:rStyle w:val="VerbatimChar"/>
+        </w:rPr>
+        <w:t xml:space="preserve">--max-depth</w:t>
+      </w:r>
+      <w:r>
+        <w:t xml:space="preserve"> </w:t>
+      </w:r>
+      <w:r>
+        <w:t xml:space="preserve">given a</w:t>
+      </w:r>
+      <w:r>
+        <w:t xml:space="preserve"> </w:t>
+      </w:r>
+      <w:r>
+        <w:t xml:space="preserve">real truncation assertion (the shared</w:t>
+      </w:r>
+      <w:r>
+        <w:t xml:space="preserve"> </w:t>
+      </w:r>
+      <w:r>
+        <w:rPr>
+          <w:rStyle w:val="VerbatimChar"/>
+        </w:rPr>
+        <w:t xml:space="preserve">assert_extract_tool_cli_contract()</w:t>
+      </w:r>
+      <w:r>
+        <w:t xml:space="preserve"> </w:t>
+      </w:r>
+      <w:r>
+        <w:t xml:space="preserve">helper’s own</w:t>
+      </w:r>
+      <w:r>
+        <w:t xml:space="preserve"> </w:t>
+      </w:r>
+      <w:r>
+        <w:rPr>
+          <w:rStyle w:val="VerbatimChar"/>
+        </w:rPr>
+        <w:t xml:space="preserve">--max-depth 1</w:t>
+      </w:r>
+      <w:r>
+        <w:t xml:space="preserve"> </w:t>
+      </w:r>
+      <w:r>
+        <w:t xml:space="preserve">check only confirmed the file was written, not that anything was actually cut).</w:t>
+      </w:r>
+      <w:r>
+        <w:t xml:space="preserve"> </w:t>
+      </w:r>
+      <w:r>
+        <w:t xml:space="preserve">-</w:t>
+      </w:r>
+      <w:r>
+        <w:t xml:space="preserve"> </w:t>
+      </w:r>
+      <w:r>
+        <w:rPr>
+          <w:rStyle w:val="VerbatimChar"/>
+        </w:rPr>
+        <w:t xml:space="preserve">select_hotspot_kernels.py</w:t>
+      </w:r>
+      <w:r>
+        <w:t xml:space="preserve">:</w:t>
+      </w:r>
+      <w:r>
+        <w:t xml:space="preserve"> </w:t>
+      </w:r>
+      <w:r>
+        <w:rPr>
+          <w:rStyle w:val="VerbatimChar"/>
+        </w:rPr>
+        <w:t xml:space="preserve">main()</w:t>
+      </w:r>
+      <w:r>
+        <w:t xml:space="preserve">’s</w:t>
+      </w:r>
+      <w:r>
+        <w:t xml:space="preserve"> </w:t>
+      </w:r>
+      <w:r>
+        <w:rPr>
+          <w:rStyle w:val="VerbatimChar"/>
+        </w:rPr>
+        <w:t xml:space="preserve">--report</w:t>
+      </w:r>
+      <w:r>
+        <w:t xml:space="preserve"> </w:t>
+      </w:r>
+      <w:r>
+        <w:t xml:space="preserve">and</w:t>
+      </w:r>
+      <w:r>
+        <w:t xml:space="preserve"> </w:t>
+      </w:r>
+      <w:r>
+        <w:rPr>
+          <w:rStyle w:val="VerbatimChar"/>
+        </w:rPr>
+        <w:t xml:space="preserve">--output-dir</w:t>
+      </w:r>
+      <w:r>
+        <w:t xml:space="preserve"> </w:t>
+      </w:r>
+      <w:r>
+        <w:t xml:space="preserve">success paths (previously</w:t>
+      </w:r>
+      <w:r>
+        <w:t xml:space="preserve"> </w:t>
+      </w:r>
+      <w:r>
+        <w:t xml:space="preserve">only their error cases were tested through</w:t>
+      </w:r>
+      <w:r>
+        <w:t xml:space="preserve"> </w:t>
+      </w:r>
+      <w:r>
+        <w:rPr>
+          <w:rStyle w:val="VerbatimChar"/>
+        </w:rPr>
+        <w:t xml:space="preserve">main()</w:t>
+      </w:r>
+      <w:r>
+        <w:t xml:space="preserve"> </w:t>
+      </w:r>
+      <w:r>
+        <w:t xml:space="preserve">– success was only exercised at the</w:t>
+      </w:r>
+      <w:r>
+        <w:t xml:space="preserve"> </w:t>
+      </w:r>
+      <w:r>
+        <w:rPr>
+          <w:rStyle w:val="VerbatimChar"/>
+        </w:rPr>
+        <w:t xml:space="preserve">labels_from_*()</w:t>
+      </w:r>
+      <w:r>
+        <w:t xml:space="preserve"> </w:t>
+      </w:r>
+      <w:r>
+        <w:t xml:space="preserve">function level).</w:t>
+      </w:r>
+      <w:r>
+        <w:t xml:space="preserve"> </w:t>
+      </w:r>
+      <w:r>
+        <w:t xml:space="preserve">-</w:t>
+      </w:r>
+      <w:r>
+        <w:t xml:space="preserve"> </w:t>
+      </w:r>
+      <w:r>
+        <w:rPr>
+          <w:rStyle w:val="VerbatimChar"/>
+        </w:rPr>
+        <w:t xml:space="preserve">select_instrumented_functions.py</w:t>
+      </w:r>
+      <w:r>
+        <w:t xml:space="preserve">: the no-flags-at-all default-threshold-fallback path</w:t>
+      </w:r>
+      <w:r>
+        <w:t xml:space="preserve"> </w:t>
+      </w:r>
+      <w:r>
+        <w:t xml:space="preserve">(</w:t>
+      </w:r>
+      <w:r>
+        <w:rPr>
+          <w:rStyle w:val="VerbatimChar"/>
+        </w:rPr>
+        <w:t xml:space="preserve">args.threshold = 1.0</w:t>
+      </w:r>
+      <w:r>
+        <w:t xml:space="preserve">) verified through</w:t>
+      </w:r>
+      <w:r>
+        <w:t xml:space="preserve"> </w:t>
+      </w:r>
+      <w:r>
+        <w:rPr>
+          <w:rStyle w:val="VerbatimChar"/>
+        </w:rPr>
+        <w:t xml:space="preserve">main()</w:t>
+      </w:r>
+      <w:r>
+        <w:t xml:space="preserve"> </w:t>
+      </w:r>
+      <w:r>
+        <w:t xml:space="preserve">against the same expected labels as the</w:t>
+      </w:r>
+      <w:r>
+        <w:t xml:space="preserve"> </w:t>
+      </w:r>
+      <w:r>
+        <w:t xml:space="preserve">equivalent direct</w:t>
+      </w:r>
+      <w:r>
+        <w:t xml:space="preserve"> </w:t>
+      </w:r>
+      <w:r>
+        <w:rPr>
+          <w:rStyle w:val="VerbatimChar"/>
+        </w:rPr>
+        <w:t xml:space="preserve">labels_from_output_dir(threshold=1.0)</w:t>
+      </w:r>
+      <w:r>
+        <w:t xml:space="preserve"> </w:t>
+      </w:r>
+      <w:r>
+        <w:t xml:space="preserve">call;</w:t>
+      </w:r>
+      <w:r>
+        <w:t xml:space="preserve"> </w:t>
+      </w:r>
+      <w:r>
+        <w:rPr>
+          <w:rStyle w:val="VerbatimChar"/>
+        </w:rPr>
+        <w:t xml:space="preserve">--threshold</w:t>
+      </w:r>
+      <w:r>
+        <w:t xml:space="preserve"> </w:t>
+      </w:r>
+      <w:r>
+        <w:t xml:space="preserve">itself changing the</w:t>
+      </w:r>
+      <w:r>
+        <w:t xml:space="preserve"> </w:t>
+      </w:r>
+      <w:r>
+        <w:t xml:space="preserve">selection through</w:t>
+      </w:r>
+      <w:r>
+        <w:t xml:space="preserve"> </w:t>
+      </w:r>
+      <w:r>
+        <w:rPr>
+          <w:rStyle w:val="VerbatimChar"/>
+        </w:rPr>
+        <w:t xml:space="preserve">main()</w:t>
+      </w:r>
+      <w:r>
+        <w:t xml:space="preserve">.</w:t>
+      </w:r>
+    </w:p>
+    <w:p>
+      <w:pPr>
+        <w:pStyle w:val="BodyText"/>
+      </w:pPr>
+      <w:r>
+        <w:t xml:space="preserve">Verification: full suite</w:t>
+      </w:r>
+      <w:r>
+        <w:t xml:space="preserve"> </w:t>
+      </w:r>
+      <w:r>
+        <w:rPr>
+          <w:rStyle w:val="VerbatimChar"/>
+        </w:rPr>
+        <w:t xml:space="preserve">python3 -m unittest discover -s tests -t .</w:t>
+      </w:r>
+      <w:r>
+        <w:t xml:space="preserve"> </w:t>
+      </w:r>
+      <w:r>
+        <w:t xml:space="preserve">-&gt;</w:t>
+      </w:r>
+      <w:r>
+        <w:t xml:space="preserve"> </w:t>
+      </w:r>
+      <w:r>
+        <w:rPr>
+          <w:rStyle w:val="VerbatimChar"/>
+        </w:rPr>
+        <w:t xml:space="preserve">Ran 714 tests ... OK</w:t>
+      </w:r>
+      <w:r>
+        <w:t xml:space="preserve"> </w:t>
+      </w:r>
+      <w:r>
+        <w:t xml:space="preserve">(671 -&gt; 714, +43: 13</w:t>
+      </w:r>
+      <w:r>
+        <w:t xml:space="preserve"> </w:t>
+      </w:r>
+      <w:r>
+        <w:rPr>
+          <w:rStyle w:val="VerbatimChar"/>
+        </w:rPr>
+        <w:t xml:space="preserve">--help</w:t>
+      </w:r>
+      <w:r>
+        <w:t xml:space="preserve"> </w:t>
+      </w:r>
+      <w:r>
+        <w:t xml:space="preserve">tests + 21 coverage-gap items, several of which added more than one</w:t>
+      </w:r>
+      <w:r>
+        <w:t xml:space="preserve"> </w:t>
+      </w:r>
+      <w:r>
+        <w:t xml:space="preserve">test method or a</w:t>
+      </w:r>
+      <w:r>
+        <w:t xml:space="preserve"> </w:t>
+      </w:r>
+      <w:r>
+        <w:rPr>
+          <w:rStyle w:val="VerbatimChar"/>
+        </w:rPr>
+        <w:t xml:space="preserve">subTest</w:t>
+      </w:r>
+      <w:r>
+        <w:t xml:space="preserve"> </w:t>
+      </w:r>
+      <w:r>
+        <w:t xml:space="preserve">loop).</w:t>
+      </w:r>
+      <w:r>
+        <w:t xml:space="preserve"> </w:t>
+      </w:r>
+      <w:r>
+        <w:rPr>
+          <w:rStyle w:val="VerbatimChar"/>
+        </w:rPr>
+        <w:t xml:space="preserve">.agg.json</w:t>
+      </w:r>
+      <w:r>
+        <w:t xml:space="preserve"> </w:t>
+      </w:r>
+      <w:r>
+        <w:t xml:space="preserve">cache artifacts cleaned after every run.</w:t>
+      </w:r>
+    </w:p>
+    <w:p>
+      <w:r>
+        <w:pict>
+          <v:rect style="width:0;height:1.5pt" o:hralign="center" o:hrstd="t" o:hr="t"/>
+        </w:pict>
+      </w:r>
+    </w:p>
+    <w:p>
+      <w:pPr>
+        <w:pStyle w:val="FirstParagraph"/>
+      </w:pPr>
+      <w:r>
+        <w:t xml:space="preserve">This closes plan 3.15’s full 8-phase roadmap.</w:t>
+      </w:r>
+    </w:p>
     <w:bookmarkEnd w:id="102"/>
+    <w:bookmarkEnd w:id="103"/>
     <w:sectPr/>
   </w:body>
 </w:document>

</xml_diff>

<commit_message>
Explicit mkdir -p before every launcher's profiling invocation
Some HPC systems don't auto-create rocprofv3/rocprof-sys/rocprof-compute's
own -o/-d/-p output directory, which segfaults the tool instead of failing
cleanly. All six scripts/*.sh launchers now mkdir -p their output directory
immediately before invoking the profiling tool, placed after each script's
own --dry-run early-exit so dry runs stay side-effect-free.

Co-Authored-By: Claude Sonnet 5 <noreply@anthropic.com>
</commit_message>
<xml_diff>
--- a/docs/DEVELOPMENT_HISTORY.docx
+++ b/docs/DEVELOPMENT_HISTORY.docx
@@ -10,7 +10,7 @@
         <w:t xml:space="preserve">Development History</w:t>
       </w:r>
     </w:p>
-    <w:bookmarkStart w:id="103" w:name="development-history"/>
+    <w:bookmarkStart w:id="104" w:name="development-history"/>
     <w:p>
       <w:pPr>
         <w:pStyle w:val="Heading1"/>
@@ -5466,6 +5466,95 @@
           </w:p>
         </w:tc>
       </w:tr>
+      <w:tr>
+        <w:tc>
+          <w:tcPr/>
+          <w:p>
+            <w:pPr>
+              <w:pStyle w:val="Compact"/>
+              <w:jc w:val="left"/>
+            </w:pPr>
+            <w:r>
+              <w:t xml:space="preserve">2026-08-28</w:t>
+            </w:r>
+          </w:p>
+        </w:tc>
+        <w:tc>
+          <w:tcPr/>
+          <w:p>
+            <w:pPr>
+              <w:pStyle w:val="Compact"/>
+              <w:jc w:val="left"/>
+            </w:pPr>
+            <w:r>
+              <w:t xml:space="preserve">Fixed a real-HPC-system bug: on systems where the underlying AMD tool doesn’t auto-create its own output directory,</w:t>
+            </w:r>
+            <w:r>
+              <w:t xml:space="preserve"> </w:t>
+            </w:r>
+            <w:r>
+              <w:rPr>
+                <w:rStyle w:val="VerbatimChar"/>
+              </w:rPr>
+              <w:t xml:space="preserve">rocprofv3</w:t>
+            </w:r>
+            <w:r>
+              <w:t xml:space="preserve">/</w:t>
+            </w:r>
+            <w:r>
+              <w:rPr>
+                <w:rStyle w:val="VerbatimChar"/>
+              </w:rPr>
+              <w:t xml:space="preserve">rocprof-sys</w:t>
+            </w:r>
+            <w:r>
+              <w:t xml:space="preserve">/</w:t>
+            </w:r>
+            <w:r>
+              <w:rPr>
+                <w:rStyle w:val="VerbatimChar"/>
+              </w:rPr>
+              <w:t xml:space="preserve">rocprof-compute</w:t>
+            </w:r>
+            <w:r>
+              <w:t xml:space="preserve"> </w:t>
+            </w:r>
+            <w:r>
+              <w:t xml:space="preserve">segfault instead of failing cleanly – all six</w:t>
+            </w:r>
+            <w:r>
+              <w:t xml:space="preserve"> </w:t>
+            </w:r>
+            <w:r>
+              <w:rPr>
+                <w:rStyle w:val="VerbatimChar"/>
+              </w:rPr>
+              <w:t xml:space="preserve">scripts/*.sh</w:t>
+            </w:r>
+            <w:r>
+              <w:t xml:space="preserve"> </w:t>
+            </w:r>
+            <w:r>
+              <w:t xml:space="preserve">launchers now explicitly</w:t>
+            </w:r>
+            <w:r>
+              <w:t xml:space="preserve"> </w:t>
+            </w:r>
+            <w:r>
+              <w:rPr>
+                <w:rStyle w:val="VerbatimChar"/>
+              </w:rPr>
+              <w:t xml:space="preserve">mkdir -p</w:t>
+            </w:r>
+            <w:r>
+              <w:t xml:space="preserve"> </w:t>
+            </w:r>
+            <w:r>
+              <w:t xml:space="preserve">their output directory right before invoking the profiling tool – see full accounting below</w:t>
+            </w:r>
+          </w:p>
+        </w:tc>
+      </w:tr>
     </w:tbl>
     <w:bookmarkStart w:id="20" w:name="project-scaffolding-and-rules"/>
     <w:p>
@@ -70647,7 +70736,707 @@
       </w:r>
     </w:p>
     <w:bookmarkEnd w:id="102"/>
+    <w:bookmarkStart w:id="103" w:name="Xce844223378dd151ebd9d85e83d3e0e1ba5d498"/>
+    <w:p>
+      <w:pPr>
+        <w:pStyle w:val="Heading2"/>
+      </w:pPr>
+      <w:r>
+        <w:t xml:space="preserve">2026-08-28 — Explicit</w:t>
+      </w:r>
+      <w:r>
+        <w:t xml:space="preserve"> </w:t>
+      </w:r>
+      <w:r>
+        <w:rPr>
+          <w:rStyle w:val="VerbatimChar"/>
+        </w:rPr>
+        <w:t xml:space="preserve">mkdir -p</w:t>
+      </w:r>
+      <w:r>
+        <w:t xml:space="preserve"> </w:t>
+      </w:r>
+      <w:r>
+        <w:t xml:space="preserve">before every launcher’s profiling invocation</w:t>
+      </w:r>
+    </w:p>
+    <w:p>
+      <w:pPr>
+        <w:pStyle w:val="FirstParagraph"/>
+      </w:pPr>
+      <w:r>
+        <w:t xml:space="preserve">Reported from a real HPC system:</w:t>
+      </w:r>
+      <w:r>
+        <w:t xml:space="preserve"> </w:t>
+      </w:r>
+      <w:r>
+        <w:rPr>
+          <w:rStyle w:val="VerbatimChar"/>
+        </w:rPr>
+        <w:t xml:space="preserve">rocprofv3</w:t>
+      </w:r>
+      <w:r>
+        <w:t xml:space="preserve">/</w:t>
+      </w:r>
+      <w:r>
+        <w:rPr>
+          <w:rStyle w:val="VerbatimChar"/>
+        </w:rPr>
+        <w:t xml:space="preserve">rocprof-sys</w:t>
+      </w:r>
+      <w:r>
+        <w:t xml:space="preserve">/</w:t>
+      </w:r>
+      <w:r>
+        <w:rPr>
+          <w:rStyle w:val="VerbatimChar"/>
+        </w:rPr>
+        <w:t xml:space="preserve">rocprof-compute</w:t>
+      </w:r>
+      <w:r>
+        <w:t xml:space="preserve"> </w:t>
+      </w:r>
+      <w:r>
+        <w:t xml:space="preserve">don’t reliably</w:t>
+      </w:r>
+      <w:r>
+        <w:t xml:space="preserve"> </w:t>
+      </w:r>
+      <w:r>
+        <w:t xml:space="preserve">auto-create their own</w:t>
+      </w:r>
+      <w:r>
+        <w:t xml:space="preserve"> </w:t>
+      </w:r>
+      <w:r>
+        <w:rPr>
+          <w:rStyle w:val="VerbatimChar"/>
+        </w:rPr>
+        <w:t xml:space="preserve">-o</w:t>
+      </w:r>
+      <w:r>
+        <w:t xml:space="preserve">/</w:t>
+      </w:r>
+      <w:r>
+        <w:rPr>
+          <w:rStyle w:val="VerbatimChar"/>
+        </w:rPr>
+        <w:t xml:space="preserve">-d</w:t>
+      </w:r>
+      <w:r>
+        <w:t xml:space="preserve">/</w:t>
+      </w:r>
+      <w:r>
+        <w:rPr>
+          <w:rStyle w:val="VerbatimChar"/>
+        </w:rPr>
+        <w:t xml:space="preserve">-p</w:t>
+      </w:r>
+      <w:r>
+        <w:t xml:space="preserve"> </w:t>
+      </w:r>
+      <w:r>
+        <w:t xml:space="preserve">output directory on every filesystem – on a system where</w:t>
+      </w:r>
+      <w:r>
+        <w:t xml:space="preserve"> </w:t>
+      </w:r>
+      <w:r>
+        <w:t xml:space="preserve">they don’t, the tool segfaults instead of failing with a clear error. None of the six</w:t>
+      </w:r>
+      <w:r>
+        <w:t xml:space="preserve"> </w:t>
+      </w:r>
+      <w:r>
+        <w:rPr>
+          <w:rStyle w:val="VerbatimChar"/>
+        </w:rPr>
+        <w:t xml:space="preserve">scripts/*.sh</w:t>
+      </w:r>
+      <w:r>
+        <w:t xml:space="preserve"> </w:t>
+      </w:r>
+      <w:r>
+        <w:t xml:space="preserve">launchers ever created their own output directory before this; each now calls</w:t>
+      </w:r>
+      <w:r>
+        <w:t xml:space="preserve"> </w:t>
+      </w:r>
+      <w:r>
+        <w:rPr>
+          <w:rStyle w:val="VerbatimChar"/>
+        </w:rPr>
+        <w:t xml:space="preserve">mkdir -p</w:t>
+      </w:r>
+      <w:r>
+        <w:t xml:space="preserve"> </w:t>
+      </w:r>
+      <w:r>
+        <w:t xml:space="preserve">on it explicitly, immediately before the line that actually invokes the AMD tool, so</w:t>
+      </w:r>
+      <w:r>
+        <w:t xml:space="preserve"> </w:t>
+      </w:r>
+      <w:r>
+        <w:t xml:space="preserve">the directory is always guaranteed to exist by the time that happens regardless of the underlying</w:t>
+      </w:r>
+      <w:r>
+        <w:t xml:space="preserve"> </w:t>
+      </w:r>
+      <w:r>
+        <w:t xml:space="preserve">tool’s own behavior.</w:t>
+      </w:r>
+    </w:p>
+    <w:p>
+      <w:pPr>
+        <w:pStyle w:val="BodyText"/>
+      </w:pPr>
+      <w:r>
+        <w:t xml:space="preserve">Placement follows each script’s own</w:t>
+      </w:r>
+      <w:r>
+        <w:t xml:space="preserve"> </w:t>
+      </w:r>
+      <w:r>
+        <w:rPr>
+          <w:rStyle w:val="VerbatimChar"/>
+        </w:rPr>
+        <w:t xml:space="preserve">--dry-run</w:t>
+      </w:r>
+      <w:r>
+        <w:t xml:space="preserve"> </w:t>
+      </w:r>
+      <w:r>
+        <w:t xml:space="preserve">convention: the</w:t>
+      </w:r>
+      <w:r>
+        <w:t xml:space="preserve"> </w:t>
+      </w:r>
+      <w:r>
+        <w:rPr>
+          <w:rStyle w:val="VerbatimChar"/>
+        </w:rPr>
+        <w:t xml:space="preserve">mkdir -p</w:t>
+      </w:r>
+      <w:r>
+        <w:t xml:space="preserve"> </w:t>
+      </w:r>
+      <w:r>
+        <w:t xml:space="preserve">sits right after that</w:t>
+      </w:r>
+      <w:r>
+        <w:t xml:space="preserve"> </w:t>
+      </w:r>
+      <w:r>
+        <w:t xml:space="preserve">script’s</w:t>
+      </w:r>
+      <w:r>
+        <w:t xml:space="preserve"> </w:t>
+      </w:r>
+      <w:r>
+        <w:rPr>
+          <w:rStyle w:val="VerbatimChar"/>
+        </w:rPr>
+        <w:t xml:space="preserve">--dry-run</w:t>
+      </w:r>
+      <w:r>
+        <w:t xml:space="preserve"> </w:t>
+      </w:r>
+      <w:r>
+        <w:t xml:space="preserve">early-exit, so a dry-run preview stays fully side-effect-free (no directory</w:t>
+      </w:r>
+      <w:r>
+        <w:t xml:space="preserve"> </w:t>
+      </w:r>
+      <w:r>
+        <w:t xml:space="preserve">created) and only a real invocation creates anything on disk.</w:t>
+      </w:r>
+    </w:p>
+    <w:p>
+      <w:pPr>
+        <w:numPr>
+          <w:ilvl w:val="0"/>
+          <w:numId w:val="1020"/>
+        </w:numPr>
+        <w:pStyle w:val="Compact"/>
+      </w:pPr>
+      <w:r>
+        <w:rPr>
+          <w:rStyle w:val="VerbatimChar"/>
+        </w:rPr>
+        <w:t xml:space="preserve">profile_CPU_hotspots.sh</w:t>
+      </w:r>
+      <w:r>
+        <w:t xml:space="preserve"> </w:t>
+      </w:r>
+      <w:r>
+        <w:t xml:space="preserve">/</w:t>
+      </w:r>
+      <w:r>
+        <w:t xml:space="preserve"> </w:t>
+      </w:r>
+      <w:r>
+        <w:rPr>
+          <w:rStyle w:val="VerbatimChar"/>
+        </w:rPr>
+        <w:t xml:space="preserve">profile_GPU_hotspots.sh</w:t>
+      </w:r>
+      <w:r>
+        <w:t xml:space="preserve">:</w:t>
+      </w:r>
+      <w:r>
+        <w:t xml:space="preserve"> </w:t>
+      </w:r>
+      <w:r>
+        <w:rPr>
+          <w:rStyle w:val="VerbatimChar"/>
+        </w:rPr>
+        <w:t xml:space="preserve">mkdir -p "$OUTPUT_DIR"</w:t>
+      </w:r>
+      <w:r>
+        <w:t xml:space="preserve"> </w:t>
+      </w:r>
+      <w:r>
+        <w:t xml:space="preserve">before</w:t>
+      </w:r>
+      <w:r>
+        <w:t xml:space="preserve"> </w:t>
+      </w:r>
+      <w:r>
+        <w:rPr>
+          <w:rStyle w:val="VerbatimChar"/>
+        </w:rPr>
+        <w:t xml:space="preserve">rocprof-sys-sample</w:t>
+      </w:r>
+      <w:r>
+        <w:t xml:space="preserve">/</w:t>
+      </w:r>
+      <w:r>
+        <w:rPr>
+          <w:rStyle w:val="VerbatimChar"/>
+        </w:rPr>
+        <w:t xml:space="preserve">rocprofv3</w:t>
+      </w:r>
+      <w:r>
+        <w:t xml:space="preserve"> </w:t>
+      </w:r>
+      <w:r>
+        <w:t xml:space="preserve">respectively.</w:t>
+      </w:r>
+    </w:p>
+    <w:p>
+      <w:pPr>
+        <w:numPr>
+          <w:ilvl w:val="0"/>
+          <w:numId w:val="1020"/>
+        </w:numPr>
+        <w:pStyle w:val="Compact"/>
+      </w:pPr>
+      <w:r>
+        <w:rPr>
+          <w:rStyle w:val="VerbatimChar"/>
+        </w:rPr>
+        <w:t xml:space="preserve">profile_hotspots.sh</w:t>
+      </w:r>
+      <w:r>
+        <w:t xml:space="preserve">:</w:t>
+      </w:r>
+      <w:r>
+        <w:t xml:space="preserve"> </w:t>
+      </w:r>
+      <w:r>
+        <w:rPr>
+          <w:rStyle w:val="VerbatimChar"/>
+        </w:rPr>
+        <w:t xml:space="preserve">mkdir -p "$CPU_DIR" "$GPU_DIR"</w:t>
+      </w:r>
+      <w:r>
+        <w:t xml:space="preserve"> </w:t>
+      </w:r>
+      <w:r>
+        <w:t xml:space="preserve">before delegating to the two sub-launchers</w:t>
+      </w:r>
+      <w:r>
+        <w:t xml:space="preserve"> </w:t>
+      </w:r>
+      <w:r>
+        <w:t xml:space="preserve">above (each of which also creates its own directory now – harmless double coverage, not relied</w:t>
+      </w:r>
+      <w:r>
+        <w:t xml:space="preserve"> </w:t>
+      </w:r>
+      <w:r>
+        <w:t xml:space="preserve">on alone, since this script’s own combined</w:t>
+      </w:r>
+      <w:r>
+        <w:t xml:space="preserve"> </w:t>
+      </w:r>
+      <w:r>
+        <w:rPr>
+          <w:rStyle w:val="VerbatimChar"/>
+        </w:rPr>
+        <w:t xml:space="preserve">hotspots.txt</w:t>
+      </w:r>
+      <w:r>
+        <w:t xml:space="preserve">/</w:t>
+      </w:r>
+      <w:r>
+        <w:rPr>
+          <w:rStyle w:val="VerbatimChar"/>
+        </w:rPr>
+        <w:t xml:space="preserve">calltree.txt</w:t>
+      </w:r>
+      <w:r>
+        <w:t xml:space="preserve"> </w:t>
+      </w:r>
+      <w:r>
+        <w:t xml:space="preserve">are written straight</w:t>
+      </w:r>
+      <w:r>
+        <w:t xml:space="preserve"> </w:t>
+      </w:r>
+      <w:r>
+        <w:t xml:space="preserve">into</w:t>
+      </w:r>
+      <w:r>
+        <w:t xml:space="preserve"> </w:t>
+      </w:r>
+      <w:r>
+        <w:rPr>
+          <w:rStyle w:val="VerbatimChar"/>
+        </w:rPr>
+        <w:t xml:space="preserve">$OUTPUT_DIR</w:t>
+      </w:r>
+      <w:r>
+        <w:t xml:space="preserve">, the parent of both).</w:t>
+      </w:r>
+    </w:p>
+    <w:p>
+      <w:pPr>
+        <w:numPr>
+          <w:ilvl w:val="0"/>
+          <w:numId w:val="1020"/>
+        </w:numPr>
+        <w:pStyle w:val="Compact"/>
+      </w:pPr>
+      <w:r>
+        <w:rPr>
+          <w:rStyle w:val="VerbatimChar"/>
+        </w:rPr>
+        <w:t xml:space="preserve">profile_hotspot_kernels.sh</w:t>
+      </w:r>
+      <w:r>
+        <w:t xml:space="preserve"> </w:t>
+      </w:r>
+      <w:r>
+        <w:t xml:space="preserve">/</w:t>
+      </w:r>
+      <w:r>
+        <w:t xml:space="preserve"> </w:t>
+      </w:r>
+      <w:r>
+        <w:rPr>
+          <w:rStyle w:val="VerbatimChar"/>
+        </w:rPr>
+        <w:t xml:space="preserve">profile_traced_hotspot_kernels.sh</w:t>
+      </w:r>
+      <w:r>
+        <w:t xml:space="preserve">:</w:t>
+      </w:r>
+      <w:r>
+        <w:t xml:space="preserve"> </w:t>
+      </w:r>
+      <w:r>
+        <w:rPr>
+          <w:rStyle w:val="VerbatimChar"/>
+        </w:rPr>
+        <w:t xml:space="preserve">mkdir -p</w:t>
+      </w:r>
+      <w:r>
+        <w:t xml:space="preserve"> </w:t>
+      </w:r>
+      <w:r>
+        <w:t xml:space="preserve">on the</w:t>
+      </w:r>
+      <w:r>
+        <w:t xml:space="preserve"> </w:t>
+      </w:r>
+      <w:r>
+        <w:rPr>
+          <w:rStyle w:val="VerbatimChar"/>
+        </w:rPr>
+        <w:t xml:space="preserve">rocprof-compute profile -p ...</w:t>
+      </w:r>
+      <w:r>
+        <w:t xml:space="preserve"> </w:t>
+      </w:r>
+      <w:r>
+        <w:t xml:space="preserve">output directory (</w:t>
+      </w:r>
+      <w:r>
+        <w:rPr>
+          <w:rStyle w:val="VerbatimChar"/>
+        </w:rPr>
+        <w:t xml:space="preserve">$WORKLOAD_DIR</w:t>
+      </w:r>
+      <w:r>
+        <w:t xml:space="preserve"> </w:t>
+      </w:r>
+      <w:r>
+        <w:t xml:space="preserve">/</w:t>
+      </w:r>
+      <w:r>
+        <w:t xml:space="preserve"> </w:t>
+      </w:r>
+      <w:r>
+        <w:rPr>
+          <w:rStyle w:val="VerbatimChar"/>
+        </w:rPr>
+        <w:t xml:space="preserve">$OUTPUT_DIR</w:t>
+      </w:r>
+      <w:r>
+        <w:t xml:space="preserve"> </w:t>
+      </w:r>
+      <w:r>
+        <w:t xml:space="preserve">respectively)</w:t>
+      </w:r>
+      <w:r>
+        <w:t xml:space="preserve"> </w:t>
+      </w:r>
+      <w:r>
+        <w:t xml:space="preserve">before that command.</w:t>
+      </w:r>
+    </w:p>
+    <w:p>
+      <w:pPr>
+        <w:numPr>
+          <w:ilvl w:val="0"/>
+          <w:numId w:val="1020"/>
+        </w:numPr>
+        <w:pStyle w:val="Compact"/>
+      </w:pPr>
+      <w:r>
+        <w:rPr>
+          <w:rStyle w:val="VerbatimChar"/>
+        </w:rPr>
+        <w:t xml:space="preserve">instrument_hotspots.sh</w:t>
+      </w:r>
+      <w:r>
+        <w:t xml:space="preserve">: gained</w:t>
+      </w:r>
+      <w:r>
+        <w:t xml:space="preserve"> </w:t>
+      </w:r>
+      <w:r>
+        <w:rPr>
+          <w:rStyle w:val="VerbatimChar"/>
+        </w:rPr>
+        <w:t xml:space="preserve">mkdir -p "$TRACE_OUTPUT_DIR"</w:t>
+      </w:r>
+      <w:r>
+        <w:t xml:space="preserve"> </w:t>
+      </w:r>
+      <w:r>
+        <w:t xml:space="preserve">before</w:t>
+      </w:r>
+      <w:r>
+        <w:t xml:space="preserve"> </w:t>
+      </w:r>
+      <w:r>
+        <w:rPr>
+          <w:rStyle w:val="VerbatimChar"/>
+        </w:rPr>
+        <w:t xml:space="preserve">rocprof-sys-run</w:t>
+      </w:r>
+      <w:r>
+        <w:t xml:space="preserve"> </w:t>
+      </w:r>
+      <w:r>
+        <w:t xml:space="preserve">(trace</w:t>
+      </w:r>
+      <w:r>
+        <w:t xml:space="preserve"> </w:t>
+      </w:r>
+      <w:r>
+        <w:t xml:space="preserve">mode’s own direct tool invocation) – its</w:t>
+      </w:r>
+      <w:r>
+        <w:t xml:space="preserve"> </w:t>
+      </w:r>
+      <w:r>
+        <w:rPr>
+          <w:rStyle w:val="VerbatimChar"/>
+        </w:rPr>
+        <w:t xml:space="preserve">$OUTPUT_DIR</w:t>
+      </w:r>
+      <w:r>
+        <w:t xml:space="preserve"> </w:t>
+      </w:r>
+      <w:r>
+        <w:t xml:space="preserve">(the auto-profiling scan directory) was</w:t>
+      </w:r>
+      <w:r>
+        <w:t xml:space="preserve"> </w:t>
+      </w:r>
+      <w:r>
+        <w:t xml:space="preserve">already covered by a pre-existing</w:t>
+      </w:r>
+      <w:r>
+        <w:t xml:space="preserve"> </w:t>
+      </w:r>
+      <w:r>
+        <w:rPr>
+          <w:rStyle w:val="VerbatimChar"/>
+        </w:rPr>
+        <w:t xml:space="preserve">mkdir -p</w:t>
+      </w:r>
+      <w:r>
+        <w:t xml:space="preserve"> </w:t>
+      </w:r>
+      <w:r>
+        <w:t xml:space="preserve">(added for the instrumented-binary-copy step, not</w:t>
+      </w:r>
+      <w:r>
+        <w:t xml:space="preserve"> </w:t>
+      </w:r>
+      <w:r>
+        <w:t xml:space="preserve">originally for this reason, but it already closed this same gap for that directory).</w:t>
+      </w:r>
+    </w:p>
+    <w:p>
+      <w:pPr>
+        <w:numPr>
+          <w:ilvl w:val="0"/>
+          <w:numId w:val="1020"/>
+        </w:numPr>
+        <w:pStyle w:val="Compact"/>
+      </w:pPr>
+      <w:r>
+        <w:rPr>
+          <w:rStyle w:val="VerbatimChar"/>
+        </w:rPr>
+        <w:t xml:space="preserve">profile_traced_hotspots.sh</w:t>
+      </w:r>
+      <w:r>
+        <w:t xml:space="preserve"> </w:t>
+      </w:r>
+      <w:r>
+        <w:t xml:space="preserve">needed no direct change: it never invokes an AMD tool itself, only</w:t>
+      </w:r>
+      <w:r>
+        <w:t xml:space="preserve"> </w:t>
+      </w:r>
+      <w:r>
+        <w:t xml:space="preserve">delegates its whole profiling step to</w:t>
+      </w:r>
+      <w:r>
+        <w:t xml:space="preserve"> </w:t>
+      </w:r>
+      <w:r>
+        <w:rPr>
+          <w:rStyle w:val="VerbatimChar"/>
+        </w:rPr>
+        <w:t xml:space="preserve">instrument_hotspots.sh</w:t>
+      </w:r>
+      <w:r>
+        <w:t xml:space="preserve"> </w:t>
+      </w:r>
+      <w:r>
+        <w:t xml:space="preserve">via</w:t>
+      </w:r>
+      <w:r>
+        <w:t xml:space="preserve"> </w:t>
+      </w:r>
+      <w:r>
+        <w:rPr>
+          <w:rStyle w:val="VerbatimChar"/>
+        </w:rPr>
+        <w:t xml:space="preserve">-o "$SCAN_DIR"   --trace-output-dir "$TRACE_DIR"</w:t>
+      </w:r>
+      <w:r>
+        <w:t xml:space="preserve">, both now covered by that script’s own two</w:t>
+      </w:r>
+      <w:r>
+        <w:t xml:space="preserve"> </w:t>
+      </w:r>
+      <w:r>
+        <w:rPr>
+          <w:rStyle w:val="VerbatimChar"/>
+        </w:rPr>
+        <w:t xml:space="preserve">mkdir -p</w:t>
+      </w:r>
+      <w:r>
+        <w:t xml:space="preserve"> </w:t>
+      </w:r>
+      <w:r>
+        <w:t xml:space="preserve">calls.</w:t>
+      </w:r>
+    </w:p>
+    <w:p>
+      <w:pPr>
+        <w:pStyle w:val="FirstParagraph"/>
+      </w:pPr>
+      <w:r>
+        <w:t xml:space="preserve">Verification:</w:t>
+      </w:r>
+      <w:r>
+        <w:t xml:space="preserve"> </w:t>
+      </w:r>
+      <w:r>
+        <w:rPr>
+          <w:rStyle w:val="VerbatimChar"/>
+        </w:rPr>
+        <w:t xml:space="preserve">bash -n</w:t>
+      </w:r>
+      <w:r>
+        <w:t xml:space="preserve"> </w:t>
+      </w:r>
+      <w:r>
+        <w:t xml:space="preserve">across all six edited scripts;</w:t>
+      </w:r>
+      <w:r>
+        <w:t xml:space="preserve"> </w:t>
+      </w:r>
+      <w:r>
+        <w:rPr>
+          <w:rStyle w:val="VerbatimChar"/>
+        </w:rPr>
+        <w:t xml:space="preserve">shellcheck</w:t>
+      </w:r>
+      <w:r>
+        <w:t xml:space="preserve"> </w:t>
+      </w:r>
+      <w:r>
+        <w:t xml:space="preserve">isn’t installed in this</w:t>
+      </w:r>
+      <w:r>
+        <w:t xml:space="preserve"> </w:t>
+      </w:r>
+      <w:r>
+        <w:t xml:space="preserve">environment so couldn’t be run (per</w:t>
+      </w:r>
+      <w:r>
+        <w:t xml:space="preserve"> </w:t>
+      </w:r>
+      <w:r>
+        <w:rPr>
+          <w:rStyle w:val="VerbatimChar"/>
+        </w:rPr>
+        <w:t xml:space="preserve">CLAUDE.md</w:t>
+      </w:r>
+      <w:r>
+        <w:t xml:space="preserve">’s own environment-constraints note, this can only</w:t>
+      </w:r>
+      <w:r>
+        <w:t xml:space="preserve"> </w:t>
+      </w:r>
+      <w:r>
+        <w:t xml:space="preserve">be confirmed working end-to-end on real HPC hardware by the user).</w:t>
+      </w:r>
+    </w:p>
     <w:bookmarkEnd w:id="103"/>
+    <w:bookmarkEnd w:id="104"/>
     <w:sectPr/>
   </w:body>
 </w:document>
@@ -71409,6 +72198,9 @@
     </w:lvlOverride>
   </w:num>
   <w:num w:numId="1019">
+    <w:abstractNumId w:val="991"/>
+  </w:num>
+  <w:num w:numId="1020">
     <w:abstractNumId w:val="991"/>
   </w:num>
 </w:numbering>

</xml_diff>